<commit_message>
Preprint: citation claims match their abstracts; deviation wording matches DEVIATIONS.md
Co-Authored-By: Claude Opus 5.5 <noreply@anthropic.com>
</commit_message>
<xml_diff>
--- a/paper.docx
+++ b/paper.docx
@@ -492,7 +492,7 @@
         <w:t xml:space="preserve"> </w:t>
       </w:r>
       <w:r>
-        <w:t xml:space="preserve">larger in physician-group ACOs,</w:t>
+        <w:t xml:space="preserve">larger in physician-group ACOs.</w:t>
       </w:r>
       <w:r>
         <w:t xml:space="preserve">[</w:t>
@@ -523,27 +523,74 @@
         <w:t xml:space="preserve"> </w:t>
       </w:r>
       <w:r>
-        <w:t xml:space="preserve">alongside concern that selection, of</w:t>
-      </w:r>
-      <w:r>
-        <w:t xml:space="preserve"> </w:t>
-      </w:r>
-      <w:r>
-        <w:t xml:space="preserve">clinicians, beneficiaries or whole ACOs, shapes both the estimates and who participates.</w:t>
+        <w:t xml:space="preserve">Whether selection, of clinicians,</w:t>
+      </w:r>
+      <w:r>
+        <w:t xml:space="preserve"> </w:t>
+      </w:r>
+      <w:r>
+        <w:t xml:space="preserve">beneficiaries or whole ACOs, shapes those estimates has been examined with differing results: one analysis found no</w:t>
+      </w:r>
+      <w:r>
+        <w:t xml:space="preserve"> </w:t>
+      </w:r>
+      <w:r>
+        <w:t xml:space="preserve">evidence of favorable risk selection in the original program,</w:t>
       </w:r>
       <w:r>
         <w:t xml:space="preserve">[</w:t>
       </w:r>
+      <w:hyperlink w:anchor="ref-mcwilliams2020">
+        <w:r>
+          <w:rPr>
+            <w:rStyle w:val="Hyperlink"/>
+          </w:rPr>
+          <w:t xml:space="preserve">6</w:t>
+        </w:r>
+      </w:hyperlink>
+      <w:r>
+        <w:t xml:space="preserve">]</w:t>
+      </w:r>
+      <w:r>
+        <w:t xml:space="preserve"> </w:t>
+      </w:r>
+      <w:r>
+        <w:t xml:space="preserve">while another found that accounting</w:t>
+      </w:r>
+      <w:r>
+        <w:t xml:space="preserve"> </w:t>
+      </w:r>
+      <w:r>
+        <w:t xml:space="preserve">for the nonrandom exit of high-cost clinicians removed the estimated savings,</w:t>
+      </w:r>
+      <w:r>
+        <w:t xml:space="preserve">[</w:t>
+      </w:r>
       <w:hyperlink w:anchor="ref-markovitz2019exit">
         <w:r>
           <w:rPr>
             <w:rStyle w:val="Hyperlink"/>
           </w:rPr>
-          <w:t xml:space="preserve">6</w:t>
-        </w:r>
-      </w:hyperlink>
-      <w:r>
-        <w:t xml:space="preserve">–</w:t>
+          <w:t xml:space="preserve">7</w:t>
+        </w:r>
+      </w:hyperlink>
+      <w:r>
+        <w:t xml:space="preserve">]</w:t>
+      </w:r>
+      <w:r>
+        <w:t xml:space="preserve"> </w:t>
+      </w:r>
+      <w:r>
+        <w:t xml:space="preserve">and risk-adjustment</w:t>
+      </w:r>
+      <w:r>
+        <w:t xml:space="preserve"> </w:t>
+      </w:r>
+      <w:r>
+        <w:t xml:space="preserve">rules may lead ACOs to drop high-risk beneficiaries.</w:t>
+      </w:r>
+      <w:r>
+        <w:t xml:space="preserve">[</w:t>
       </w:r>
       <w:hyperlink w:anchor="ref-markovitz2019risk">
         <w:r>
@@ -698,7 +745,7 @@
         <w:t xml:space="preserve"> </w:t>
       </w:r>
       <w:r>
-        <w:t xml:space="preserve">the program has been associated with earning bonuses, higher benchmarks and one-sided risk.</w:t>
+        <w:t xml:space="preserve">the program has been associated with earning bonuses, higher benchmarks and one-sided risk,</w:t>
       </w:r>
       <w:r>
         <w:t xml:space="preserve">[</w:t>
@@ -712,40 +759,146 @@
         </w:r>
       </w:hyperlink>
       <w:r>
+        <w:t xml:space="preserve">]</w:t>
+      </w:r>
+      <w:r>
+        <w:t xml:space="preserve"> </w:t>
+      </w:r>
+      <w:r>
+        <w:t xml:space="preserve">and larger</w:t>
+      </w:r>
+      <w:r>
+        <w:t xml:space="preserve"> </w:t>
+      </w:r>
+      <w:r>
+        <w:t xml:space="preserve">ACOs, those with supporting organizations and better performers were more likely to switch to two-sided</w:t>
+      </w:r>
+      <w:r>
+        <w:t xml:space="preserve"> </w:t>
+      </w:r>
+      <w:r>
+        <w:t xml:space="preserve">risk.</w:t>
+      </w:r>
+      <w:r>
+        <w:t xml:space="preserve">[</w:t>
+      </w:r>
+      <w:hyperlink w:anchor="ref-zhu2023">
+        <w:r>
+          <w:rPr>
+            <w:rStyle w:val="Hyperlink"/>
+          </w:rPr>
+          <w:t xml:space="preserve">15</w:t>
+        </w:r>
+      </w:hyperlink>
+      <w:r>
+        <w:t xml:space="preserve">]</w:t>
+      </w:r>
+      <w:r>
+        <w:t xml:space="preserve"> </w:t>
+      </w:r>
+      <w:r>
+        <w:t xml:space="preserve">The 2019 Pathways to Success rules, which shortened the time ACOs could stay in one-sided risk, were followed by more</w:t>
+      </w:r>
+      <w:r>
+        <w:t xml:space="preserve"> </w:t>
+      </w:r>
+      <w:r>
+        <w:t xml:space="preserve">exits than entries,</w:t>
+      </w:r>
+      <w:r>
+        <w:t xml:space="preserve">[</w:t>
+      </w:r>
+      <w:hyperlink w:anchor="ref-ying2023">
+        <w:r>
+          <w:rPr>
+            <w:rStyle w:val="Hyperlink"/>
+          </w:rPr>
+          <w:t xml:space="preserve">16</w:t>
+        </w:r>
+      </w:hyperlink>
+      <w:r>
+        <w:t xml:space="preserve">]</w:t>
+      </w:r>
+      <w:r>
+        <w:t xml:space="preserve"> </w:t>
+      </w:r>
+      <w:r>
+        <w:t xml:space="preserve">by ACO leaders reassessing potential savings against losses,</w:t>
+      </w:r>
+      <w:r>
+        <w:t xml:space="preserve">[</w:t>
+      </w:r>
+      <w:hyperlink w:anchor="ref-ying2024">
+        <w:r>
+          <w:rPr>
+            <w:rStyle w:val="Hyperlink"/>
+          </w:rPr>
+          <w:t xml:space="preserve">17</w:t>
+        </w:r>
+      </w:hyperlink>
+      <w:r>
+        <w:t xml:space="preserve">]</w:t>
+      </w:r>
+      <w:r>
+        <w:t xml:space="preserve"> </w:t>
+      </w:r>
+      <w:r>
+        <w:t xml:space="preserve">and by</w:t>
+      </w:r>
+      <w:r>
+        <w:t xml:space="preserve"> </w:t>
+      </w:r>
+      <w:r>
+        <w:t xml:space="preserve">departures with projected costs to Medicare.</w:t>
+      </w:r>
+      <w:r>
+        <w:t xml:space="preserve">[</w:t>
+      </w:r>
+      <w:hyperlink w:anchor="ref-moloci2021">
+        <w:r>
+          <w:rPr>
+            <w:rStyle w:val="Hyperlink"/>
+          </w:rPr>
+          <w:t xml:space="preserve">18</w:t>
+        </w:r>
+      </w:hyperlink>
+      <w:r>
         <w:t xml:space="preserve">,</w:t>
       </w:r>
-      <w:hyperlink w:anchor="ref-zhu2023">
-        <w:r>
-          <w:rPr>
-            <w:rStyle w:val="Hyperlink"/>
-          </w:rPr>
-          <w:t xml:space="preserve">15</w:t>
+      <w:hyperlink w:anchor="ref-trombley2022">
+        <w:r>
+          <w:rPr>
+            <w:rStyle w:val="Hyperlink"/>
+          </w:rPr>
+          <w:t xml:space="preserve">19</w:t>
         </w:r>
       </w:hyperlink>
       <w:r>
         <w:t xml:space="preserve">]</w:t>
       </w:r>
-      <w:r>
-        <w:t xml:space="preserve"> </w:t>
-      </w:r>
-      <w:r>
-        <w:t xml:space="preserve">The 2019 Pathways to Success rules, which shortened the time ACOs could stay in one-sided risk, were followed by more</w:t>
-      </w:r>
-      <w:r>
-        <w:t xml:space="preserve"> </w:t>
-      </w:r>
-      <w:r>
-        <w:t xml:space="preserve">exits than entries,</w:t>
+    </w:p>
+    <w:p>
+      <w:pPr>
+        <w:pStyle w:val="BodyText"/>
+      </w:pPr>
+      <w:r>
+        <w:t xml:space="preserve">The same rules allowed an ACO to end its agreement early and begin a new one, which resets the benchmark</w:t>
+      </w:r>
+      <w:r>
+        <w:t xml:space="preserve"> </w:t>
+      </w:r>
+      <w:r>
+        <w:t xml:space="preserve">early.</w:t>
       </w:r>
       <w:r>
         <w:t xml:space="preserve">[</w:t>
       </w:r>
-      <w:hyperlink w:anchor="ref-ying2023">
-        <w:r>
-          <w:rPr>
-            <w:rStyle w:val="Hyperlink"/>
-          </w:rPr>
-          <w:t xml:space="preserve">16</w:t>
+      <w:hyperlink w:anchor="ref-cfr425">
+        <w:r>
+          <w:rPr>
+            <w:rStyle w:val="Hyperlink"/>
+          </w:rPr>
+          <w:t xml:space="preserve">1</w:t>
         </w:r>
       </w:hyperlink>
       <w:r>
@@ -755,17 +908,23 @@
         <w:t xml:space="preserve"> </w:t>
       </w:r>
       <w:r>
-        <w:t xml:space="preserve">by ACO leaders reassessing potential savings against losses,</w:t>
+        <w:t xml:space="preserve">For an ACO in the BASIC track, renewal was also the only way into the ENHANCED track before its</w:t>
+      </w:r>
+      <w:r>
+        <w:t xml:space="preserve"> </w:t>
+      </w:r>
+      <w:r>
+        <w:t xml:space="preserve">agreement ended, because the 2018 rule bars moving from BASIC to ENHANCED within an agreement period;</w:t>
       </w:r>
       <w:r>
         <w:t xml:space="preserve">[</w:t>
       </w:r>
-      <w:hyperlink w:anchor="ref-ying2024">
-        <w:r>
-          <w:rPr>
-            <w:rStyle w:val="Hyperlink"/>
-          </w:rPr>
-          <w:t xml:space="preserve">17</w:t>
+      <w:hyperlink w:anchor="ref-frpathways">
+        <w:r>
+          <w:rPr>
+            <w:rStyle w:val="Hyperlink"/>
+          </w:rPr>
+          <w:t xml:space="preserve">20</w:t>
         </w:r>
       </w:hyperlink>
       <w:r>
@@ -775,62 +934,43 @@
         <w:t xml:space="preserve"> </w:t>
       </w:r>
       <w:r>
-        <w:t xml:space="preserve">and by</w:t>
-      </w:r>
-      <w:r>
-        <w:t xml:space="preserve"> </w:t>
-      </w:r>
-      <w:r>
-        <w:t xml:space="preserve">departures with projected costs to Medicare.</w:t>
+        <w:t xml:space="preserve">ENHANCED shares 75% of savings, against at most 50% in BASIC.</w:t>
       </w:r>
       <w:r>
         <w:t xml:space="preserve">[</w:t>
       </w:r>
-      <w:hyperlink w:anchor="ref-moloci2021">
-        <w:r>
-          <w:rPr>
-            <w:rStyle w:val="Hyperlink"/>
-          </w:rPr>
-          <w:t xml:space="preserve">18</w:t>
-        </w:r>
-      </w:hyperlink>
-      <w:r>
-        <w:t xml:space="preserve">,</w:t>
-      </w:r>
-      <w:hyperlink w:anchor="ref-trombley2022">
-        <w:r>
-          <w:rPr>
-            <w:rStyle w:val="Hyperlink"/>
-          </w:rPr>
-          <w:t xml:space="preserve">19</w:t>
+      <w:hyperlink w:anchor="ref-cfr425">
+        <w:r>
+          <w:rPr>
+            <w:rStyle w:val="Hyperlink"/>
+          </w:rPr>
+          <w:t xml:space="preserve">1</w:t>
         </w:r>
       </w:hyperlink>
       <w:r>
         <w:t xml:space="preserve">]</w:t>
       </w:r>
-    </w:p>
-    <w:p>
-      <w:pPr>
-        <w:pStyle w:val="BodyText"/>
-      </w:pPr>
-      <w:r>
-        <w:t xml:space="preserve">The same rules allowed an ACO to end its agreement early and begin a new one, which resets the benchmark</w:t>
-      </w:r>
-      <w:r>
-        <w:t xml:space="preserve"> </w:t>
-      </w:r>
-      <w:r>
-        <w:t xml:space="preserve">early.</w:t>
+      <w:r>
+        <w:t xml:space="preserve"> </w:t>
+      </w:r>
+      <w:r>
+        <w:t xml:space="preserve">Of the 334 ACOs whose agreements began July 1,</w:t>
+      </w:r>
+      <w:r>
+        <w:t xml:space="preserve"> </w:t>
+      </w:r>
+      <w:r>
+        <w:t xml:space="preserve">2019 or January 1, 2020, 29 ended them early and began new agreements on January 1, 2022.</w:t>
       </w:r>
       <w:r>
         <w:t xml:space="preserve">[</w:t>
       </w:r>
-      <w:hyperlink w:anchor="ref-cfr425">
-        <w:r>
-          <w:rPr>
-            <w:rStyle w:val="Hyperlink"/>
-          </w:rPr>
-          <w:t xml:space="preserve">1</w:t>
+      <w:hyperlink w:anchor="ref-dataacos">
+        <w:r>
+          <w:rPr>
+            <w:rStyle w:val="Hyperlink"/>
+          </w:rPr>
+          <w:t xml:space="preserve">21</w:t>
         </w:r>
       </w:hyperlink>
       <w:r>
@@ -840,85 +980,13 @@
         <w:t xml:space="preserve"> </w:t>
       </w:r>
       <w:r>
-        <w:t xml:space="preserve">For an ACO in the BASIC track, renewal was also the only way into the ENHANCED track before its</w:t>
-      </w:r>
-      <w:r>
-        <w:t xml:space="preserve"> </w:t>
-      </w:r>
-      <w:r>
-        <w:t xml:space="preserve">agreement ended, because the 2018 rule bars moving from BASIC to ENHANCED within an agreement period;</w:t>
-      </w:r>
-      <w:r>
-        <w:t xml:space="preserve">[</w:t>
-      </w:r>
-      <w:hyperlink w:anchor="ref-frpathways">
-        <w:r>
-          <w:rPr>
-            <w:rStyle w:val="Hyperlink"/>
-          </w:rPr>
-          <w:t xml:space="preserve">20</w:t>
-        </w:r>
-      </w:hyperlink>
-      <w:r>
-        <w:t xml:space="preserve">]</w:t>
-      </w:r>
-      <w:r>
-        <w:t xml:space="preserve"> </w:t>
-      </w:r>
-      <w:r>
-        <w:t xml:space="preserve">ENHANCED shares 75% of savings, against at most 50% in BASIC.</w:t>
-      </w:r>
-      <w:r>
-        <w:t xml:space="preserve">[</w:t>
-      </w:r>
-      <w:hyperlink w:anchor="ref-cfr425">
-        <w:r>
-          <w:rPr>
-            <w:rStyle w:val="Hyperlink"/>
-          </w:rPr>
-          <w:t xml:space="preserve">1</w:t>
-        </w:r>
-      </w:hyperlink>
-      <w:r>
-        <w:t xml:space="preserve">]</w:t>
-      </w:r>
-      <w:r>
-        <w:t xml:space="preserve"> </w:t>
-      </w:r>
-      <w:r>
-        <w:t xml:space="preserve">Of the 334 ACOs whose agreements began July 1,</w:t>
-      </w:r>
-      <w:r>
-        <w:t xml:space="preserve"> </w:t>
-      </w:r>
-      <w:r>
-        <w:t xml:space="preserve">2019 or January 1, 2020, 29 ended them early and began new agreements on January 1, 2022.</w:t>
-      </w:r>
-      <w:r>
-        <w:t xml:space="preserve">[</w:t>
-      </w:r>
-      <w:hyperlink w:anchor="ref-dataacos">
-        <w:r>
-          <w:rPr>
-            <w:rStyle w:val="Hyperlink"/>
-          </w:rPr>
-          <w:t xml:space="preserve">21</w:t>
-        </w:r>
-      </w:hyperlink>
-      <w:r>
-        <w:t xml:space="preserve">]</w:t>
-      </w:r>
-      <w:r>
-        <w:t xml:space="preserve"> </w:t>
-      </w:r>
-      <w:r>
         <w:t xml:space="preserve">Who used the</w:t>
       </w:r>
       <w:r>
         <w:t xml:space="preserve"> </w:t>
       </w:r>
       <w:r>
-        <w:t xml:space="preserve">option, and why, bears on how benchmark rules sort ACOs, but to our knowledge it has not been studied.</w:t>
+        <w:t xml:space="preserve">option, and why, bears on how benchmark rules sort ACOs, but to the author’s knowledge it has not been studied.</w:t>
       </w:r>
     </w:p>
     <w:p>
@@ -3356,7 +3424,7 @@
         <w:t xml:space="preserve"> </w:t>
       </w:r>
       <w:r>
-        <w:t xml:space="preserve">lockfile took security updates to 2 development dependencies; no result was produced with it, and it is logged as</w:t>
+        <w:t xml:space="preserve">lockfile took security updates to 2 packages (filelock and virtualenv); no result was produced with it, and it is logged as</w:t>
       </w:r>
       <w:r>
         <w:t xml:space="preserve"> </w:t>
@@ -7650,7 +7718,7 @@
         <w:t xml:space="preserve"> </w:t>
       </w:r>
       <w:r>
-        <w:t xml:space="preserve">earning bonuses were more likely to stay in the program,</w:t>
+        <w:t xml:space="preserve">earning bonuses survived longer in the program</w:t>
       </w:r>
       <w:r>
         <w:t xml:space="preserve">[</w:t>
@@ -7664,7 +7732,22 @@
         </w:r>
       </w:hyperlink>
       <w:r>
-        <w:t xml:space="preserve">,</w:t>
+        <w:t xml:space="preserve">]</w:t>
+      </w:r>
+      <w:r>
+        <w:t xml:space="preserve"> </w:t>
+      </w:r>
+      <w:r>
+        <w:t xml:space="preserve">and, with borderline precision, that ACOs that had</w:t>
+      </w:r>
+      <w:r>
+        <w:t xml:space="preserve"> </w:t>
+      </w:r>
+      <w:r>
+        <w:t xml:space="preserve">achieved savings were more likely to stay after the 2019 rules,</w:t>
+      </w:r>
+      <w:r>
+        <w:t xml:space="preserve">[</w:t>
       </w:r>
       <w:hyperlink w:anchor="ref-ying2023">
         <w:r>
@@ -8650,13 +8733,53 @@
       </w:hyperlink>
     </w:p>
     <w:bookmarkEnd w:id="55"/>
-    <w:bookmarkStart w:id="57" w:name="ref-markovitz2019exit"/>
+    <w:bookmarkStart w:id="57" w:name="ref-mcwilliams2020"/>
     <w:p>
       <w:pPr>
         <w:pStyle w:val="Bibliography"/>
       </w:pPr>
       <w:r>
         <w:t xml:space="preserve">6.</w:t>
+      </w:r>
+      <w:r>
+        <w:t xml:space="preserve"> </w:t>
+      </w:r>
+      <w:r>
+        <w:t xml:space="preserve">	</w:t>
+      </w:r>
+      <w:r>
+        <w:t xml:space="preserve">McWilliams JM, Hatfield LA, Landon BE, Chernew ME. Savings or Selection? Initial Spending Reductions in the Medicare Shared Savings Program and Considerations for Reform.</w:t>
+      </w:r>
+      <w:r>
+        <w:t xml:space="preserve"> </w:t>
+      </w:r>
+      <w:r>
+        <w:rPr>
+          <w:i/>
+          <w:iCs/>
+        </w:rPr>
+        <w:t xml:space="preserve">The Milbank Quarterly</w:t>
+      </w:r>
+      <w:r>
+        <w:t xml:space="preserve">. 2020;98(3):847-907. doi:</w:t>
+      </w:r>
+      <w:hyperlink r:id="rId56">
+        <w:r>
+          <w:rPr>
+            <w:rStyle w:val="Hyperlink"/>
+          </w:rPr>
+          <w:t xml:space="preserve">10.1111/1468-0009.12468</w:t>
+        </w:r>
+      </w:hyperlink>
+    </w:p>
+    <w:bookmarkEnd w:id="57"/>
+    <w:bookmarkStart w:id="59" w:name="ref-markovitz2019exit"/>
+    <w:p>
+      <w:pPr>
+        <w:pStyle w:val="Bibliography"/>
+      </w:pPr>
+      <w:r>
+        <w:t xml:space="preserve">7.</w:t>
       </w:r>
       <w:r>
         <w:t xml:space="preserve"> </w:t>
@@ -8680,52 +8803,12 @@
       <w:r>
         <w:t xml:space="preserve">. 2019;171(1):27-36. doi:</w:t>
       </w:r>
-      <w:hyperlink r:id="rId56">
+      <w:hyperlink r:id="rId58">
         <w:r>
           <w:rPr>
             <w:rStyle w:val="Hyperlink"/>
           </w:rPr>
           <w:t xml:space="preserve">10.7326/m18-2539</w:t>
-        </w:r>
-      </w:hyperlink>
-    </w:p>
-    <w:bookmarkEnd w:id="57"/>
-    <w:bookmarkStart w:id="59" w:name="ref-mcwilliams2020"/>
-    <w:p>
-      <w:pPr>
-        <w:pStyle w:val="Bibliography"/>
-      </w:pPr>
-      <w:r>
-        <w:t xml:space="preserve">7.</w:t>
-      </w:r>
-      <w:r>
-        <w:t xml:space="preserve"> </w:t>
-      </w:r>
-      <w:r>
-        <w:t xml:space="preserve">	</w:t>
-      </w:r>
-      <w:r>
-        <w:t xml:space="preserve">McWilliams JM, Hatfield LA, Landon BE, Chernew ME. Savings or Selection? Initial Spending Reductions in the Medicare Shared Savings Program and Considerations for Reform.</w:t>
-      </w:r>
-      <w:r>
-        <w:t xml:space="preserve"> </w:t>
-      </w:r>
-      <w:r>
-        <w:rPr>
-          <w:i/>
-          <w:iCs/>
-        </w:rPr>
-        <w:t xml:space="preserve">The Milbank Quarterly</w:t>
-      </w:r>
-      <w:r>
-        <w:t xml:space="preserve">. 2020;98(3):847-907. doi:</w:t>
-      </w:r>
-      <w:hyperlink r:id="rId58">
-        <w:r>
-          <w:rPr>
-            <w:rStyle w:val="Hyperlink"/>
-          </w:rPr>
-          <w:t xml:space="preserve">10.1111/1468-0009.12468</w:t>
         </w:r>
       </w:hyperlink>
     </w:p>

</xml_diff>

<commit_message>
Preprint: apply the critical assessment (units, abstract framing, plan-required reporting, caveats, PDF text layer)
Review and point-by-point response in reviews/.

Co-Authored-By: Claude Opus 5.5 <noreply@anthropic.com>
</commit_message>
<xml_diff>
--- a/paper.docx
+++ b/paper.docx
@@ -168,7 +168,7 @@
         <w:t xml:space="preserve"> </w:t>
       </w:r>
       <w:r>
-        <w:t xml:space="preserve">early to reset sooner, but who used that option, and why, has not been studied.</w:t>
+        <w:t xml:space="preserve">early to reset sooner; to the author’s knowledge, which ACOs did so has not been studied.</w:t>
       </w:r>
     </w:p>
     <w:p>
@@ -186,13 +186,13 @@
         <w:t xml:space="preserve"> </w:t>
       </w:r>
       <w:r>
-        <w:t xml:space="preserve">To test, under a preregistered plan, whether ACOs that renewed early stood to gain from the regional</w:t>
-      </w:r>
-      <w:r>
-        <w:t xml:space="preserve"> </w:t>
-      </w:r>
-      <w:r>
-        <w:t xml:space="preserve">part of a benchmark reset, and whether their spending changed afterward.</w:t>
+        <w:t xml:space="preserve">To test, under a preregistered plan, whether ACOs that renewed early stood to gain more than others</w:t>
+      </w:r>
+      <w:r>
+        <w:t xml:space="preserve"> </w:t>
+      </w:r>
+      <w:r>
+        <w:t xml:space="preserve">from the regional part of a benchmark reset, and whether their spending growth differed afterward.</w:t>
       </w:r>
     </w:p>
     <w:p>
@@ -216,19 +216,25 @@
         <w:t xml:space="preserve"> </w:t>
       </w:r>
       <w:r>
-        <w:t xml:space="preserve">began July 1, 2019 or January 1, 2020, using CMS public use files (2014-2026). The registration (OSF) preceded all</w:t>
-      </w:r>
-      <w:r>
-        <w:t xml:space="preserve"> </w:t>
-      </w:r>
-      <w:r>
-        <w:t xml:space="preserve">reading of outcome data, enforced by a hash-based lock in the analysis code. The reset benchmark was rebuilt from 42</w:t>
-      </w:r>
-      <w:r>
-        <w:t xml:space="preserve"> </w:t>
-      </w:r>
-      <w:r>
-        <w:t xml:space="preserve">CFR 425.601 and validated against benchmarks CMS published for 101 other ACOs before use.</w:t>
+        <w:t xml:space="preserve">began July 1, 2019 or January 1, 2020, using CMS public use files (2016-2024). The plan, decision rules and code were</w:t>
+      </w:r>
+      <w:r>
+        <w:t xml:space="preserve"> </w:t>
+      </w:r>
+      <w:r>
+        <w:t xml:space="preserve">registered on OSF before any outcome data were read, with a code-level lock on the outcome files. The benchmark a</w:t>
+      </w:r>
+      <w:r>
+        <w:t xml:space="preserve"> </w:t>
+      </w:r>
+      <w:r>
+        <w:t xml:space="preserve">reset would produce was rebuilt from the regulation (42 CFR 425.601) and validated against benchmarks CMS published</w:t>
+      </w:r>
+      <w:r>
+        <w:t xml:space="preserve"> </w:t>
+      </w:r>
+      <w:r>
+        <w:t xml:space="preserve">for 101 other ACOs before use.</w:t>
       </w:r>
     </w:p>
     <w:p>
@@ -246,13 +252,19 @@
         <w:t xml:space="preserve"> </w:t>
       </w:r>
       <w:r>
-        <w:t xml:space="preserve">Early renewal: ending the agreement to begin a new one on January 1, 2022 (29 ACOs), compared with</w:t>
-      </w:r>
-      <w:r>
-        <w:t xml:space="preserve"> </w:t>
-      </w:r>
-      <w:r>
-        <w:t xml:space="preserve">staying (277 ACOs).</w:t>
+        <w:t xml:space="preserve">For the choice analyses, pre-decision characteristics: the regional pull (case-mix-adjusted regional</w:t>
+      </w:r>
+      <w:r>
+        <w:t xml:space="preserve"> </w:t>
+      </w:r>
+      <w:r>
+        <w:t xml:space="preserve">spending relative to the ACO’s current benchmark; primary), the own-spending component of a reset and the BASIC</w:t>
+      </w:r>
+      <w:r>
+        <w:t xml:space="preserve"> </w:t>
+      </w:r>
+      <w:r>
+        <w:t xml:space="preserve">risk level. For the spending analysis, early renewal into a January 1, 2022 agreement.</w:t>
       </w:r>
     </w:p>
     <w:p>
@@ -270,31 +282,25 @@
         <w:t xml:space="preserve"> </w:t>
       </w:r>
       <w:r>
-        <w:t xml:space="preserve">Primary, the regional pull (case-mix-adjusted regional spending relative to the</w:t>
-      </w:r>
-      <w:r>
-        <w:t xml:space="preserve"> </w:t>
-      </w:r>
-      <w:r>
-        <w:t xml:space="preserve">current benchmark). Secondary, the own-spending component of the reset, savings rates, a Bayesian logistic decision</w:t>
-      </w:r>
-      <w:r>
-        <w:t xml:space="preserve"> </w:t>
-      </w:r>
-      <w:r>
-        <w:t xml:space="preserve">model with measurement error, and log per-capita spending in 2022-2024 (difference-in-differences with an</w:t>
-      </w:r>
-      <w:r>
-        <w:t xml:space="preserve"> </w:t>
-      </w:r>
-      <w:r>
-        <w:t xml:space="preserve">equivalence condition on pre-trends). Decision rules were fixed in advance; significance was by permutation and</w:t>
-      </w:r>
-      <w:r>
-        <w:t xml:space="preserve"> </w:t>
-      </w:r>
-      <w:r>
-        <w:t xml:space="preserve">direct simulation.</w:t>
+        <w:t xml:space="preserve">Early renewal (29 ACOs, compared with 277 that stayed), analyzed by group comparisons</w:t>
+      </w:r>
+      <w:r>
+        <w:t xml:space="preserve"> </w:t>
+      </w:r>
+      <w:r>
+        <w:t xml:space="preserve">with Bayesian bootstrap intervals and permutation tests and by a Bayesian logistic model with measurement error</w:t>
+      </w:r>
+      <w:r>
+        <w:t xml:space="preserve"> </w:t>
+      </w:r>
+      <w:r>
+        <w:t xml:space="preserve">tested by direct simulation; and per-capita spending growth in 2022-2024, by difference-in-differences with a</w:t>
+      </w:r>
+      <w:r>
+        <w:t xml:space="preserve"> </w:t>
+      </w:r>
+      <w:r>
+        <w:t xml:space="preserve">preregistered equivalence condition on pre-trends.</w:t>
       </w:r>
     </w:p>
     <w:p>
@@ -312,13 +318,33 @@
         <w:t xml:space="preserve"> </w:t>
       </w:r>
       <w:r>
-        <w:t xml:space="preserve">The rebuilt benchmark tracked CMS’s (Spearman ρ = 0.94; median absolute error 1.6%). Early renewers’</w:t>
-      </w:r>
-      <w:r>
-        <w:t xml:space="preserve"> </w:t>
-      </w:r>
-      <w:r>
-        <w:t xml:space="preserve">regions spent 3.4 percentage points of benchmark more than stayers’ (95% credible interval [CrI], 1.7 to 5.4;</w:t>
+        <w:t xml:space="preserve">The rebuilt benchmark tracked CMS’s (Spearman</w:t>
+      </w:r>
+      <w:r>
+        <w:t xml:space="preserve"> </w:t>
+      </w:r>
+      <m:oMath>
+        <m:r>
+          <m:t>ρ</m:t>
+        </m:r>
+      </m:oMath>
+      <w:r>
+        <w:t xml:space="preserve"> </w:t>
+      </w:r>
+      <w:r>
+        <w:t xml:space="preserve">= 0.94; median absolute error 1.6%). Relative to</w:t>
+      </w:r>
+      <w:r>
+        <w:t xml:space="preserve"> </w:t>
+      </w:r>
+      <w:r>
+        <w:t xml:space="preserve">their current benchmarks, early renewers’ case-mix-adjusted regional spending was 3.4 percentage points higher than</w:t>
+      </w:r>
+      <w:r>
+        <w:t xml:space="preserve"> </w:t>
+      </w:r>
+      <w:r>
+        <w:t xml:space="preserve">stayers’ (95% credible interval [CrI], 1.7 to 5.4;</w:t>
       </w:r>
       <w:r>
         <w:t xml:space="preserve"> </w:t>
@@ -334,25 +360,37 @@
         <w:t xml:space="preserve"> </w:t>
       </w:r>
       <w:r>
-        <w:t xml:space="preserve">&lt; .001). Early renewers were also beating their benchmarks by more (own-spending component −2.1 points; 95% CrI,</w:t>
-      </w:r>
-      <w:r>
-        <w:t xml:space="preserve"> </w:t>
-      </w:r>
-      <w:r>
-        <w:t xml:space="preserve">−3.8 to −0.5), so the total expected gain from a reset did not differ (−0.5 points; 95% CrI, −2.0 to 0.8). Among</w:t>
-      </w:r>
-      <w:r>
-        <w:t xml:space="preserve"> </w:t>
-      </w:r>
-      <w:r>
-        <w:t xml:space="preserve">206 BASIC-track ACOs, early renewal was associated with a higher regional pull and with higher (two-sided) BASIC</w:t>
-      </w:r>
-      <w:r>
-        <w:t xml:space="preserve"> </w:t>
-      </w:r>
-      <w:r>
-        <w:t xml:space="preserve">levels. Spending growth after renewal did not differ detectably (−0.4%; 95% CrI, −4.0% to 2.5%;</w:t>
+        <w:t xml:space="preserve">&lt; .001). Early renewers were also beating their benchmarks by</w:t>
+      </w:r>
+      <w:r>
+        <w:t xml:space="preserve"> </w:t>
+      </w:r>
+      <w:r>
+        <w:t xml:space="preserve">more (own-spending component, −2.1 points; 95% CrI, −3.8 to −0.5), and by the approximation the total expected</w:t>
+      </w:r>
+      <w:r>
+        <w:t xml:space="preserve"> </w:t>
+      </w:r>
+      <w:r>
+        <w:t xml:space="preserve">gain from a reset did not differ (−0.5 points; 95% CrI, −2.0 to 0.8). Among 206 BASIC-track ACOs, early renewal was</w:t>
+      </w:r>
+      <w:r>
+        <w:t xml:space="preserve"> </w:t>
+      </w:r>
+      <w:r>
+        <w:t xml:space="preserve">associated with a higher regional pull (log-odds difference per 2 SD, 1.34; 95% CrI, 0.44 to 2.30) and a higher,</w:t>
+      </w:r>
+      <w:r>
+        <w:t xml:space="preserve"> </w:t>
+      </w:r>
+      <w:r>
+        <w:t xml:space="preserve">two-sided BASIC level (1.34; 95% CrI, 0.38 to 2.31). Spending growth did not differ detectably (−0.4%; 95% CrI,</w:t>
+      </w:r>
+      <w:r>
+        <w:t xml:space="preserve"> </w:t>
+      </w:r>
+      <w:r>
+        <w:t xml:space="preserve">−4.0% to 2.5%;</w:t>
       </w:r>
       <w:r>
         <w:t xml:space="preserve"> </w:t>
@@ -368,13 +406,7 @@
         <w:t xml:space="preserve"> </w:t>
       </w:r>
       <w:r>
-        <w:t xml:space="preserve">= .78), but</w:t>
-      </w:r>
-      <w:r>
-        <w:t xml:space="preserve"> </w:t>
-      </w:r>
-      <w:r>
-        <w:t xml:space="preserve">the preregistered equivalence condition did not hold, so this is not read as an effect.</w:t>
+        <w:t xml:space="preserve">= .78); the equivalence condition did not hold, so this is not read as an effect.</w:t>
       </w:r>
     </w:p>
     <w:p>
@@ -392,25 +424,25 @@
         <w:t xml:space="preserve"> </w:t>
       </w:r>
       <w:r>
-        <w:t xml:space="preserve">ACOs that reset early were those whose regions spent more relative to their</w:t>
-      </w:r>
-      <w:r>
-        <w:t xml:space="preserve"> </w:t>
-      </w:r>
-      <w:r>
-        <w:t xml:space="preserve">benchmarks and those at higher BASIC levels, for whom renewal opened the 75% sharing rate. A reset was not, on</w:t>
-      </w:r>
-      <w:r>
-        <w:t xml:space="preserve"> </w:t>
-      </w:r>
-      <w:r>
-        <w:t xml:space="preserve">average, a route to a higher benchmark. These associations describe the 2022 rules; benchmarks set from 2024 credit</w:t>
-      </w:r>
-      <w:r>
-        <w:t xml:space="preserve"> </w:t>
-      </w:r>
-      <w:r>
-        <w:t xml:space="preserve">prior savings, which may change who renews early.</w:t>
+        <w:t xml:space="preserve">ACOs that renewed early more often had regions that spent more relative to their</w:t>
+      </w:r>
+      <w:r>
+        <w:t xml:space="preserve"> </w:t>
+      </w:r>
+      <w:r>
+        <w:t xml:space="preserve">benchmarks and were more often at higher BASIC levels, for which renewal opened a 75% sharing rate. By the study’s</w:t>
+      </w:r>
+      <w:r>
+        <w:t xml:space="preserve"> </w:t>
+      </w:r>
+      <w:r>
+        <w:t xml:space="preserve">approximation, a reset would not on average have raised their benchmarks. These are associations under the 2022</w:t>
+      </w:r>
+      <w:r>
+        <w:t xml:space="preserve"> </w:t>
+      </w:r>
+      <w:r>
+        <w:t xml:space="preserve">rules; benchmarks set from 2024 credit prior savings.</w:t>
       </w:r>
     </w:p>
     <w:bookmarkEnd w:id="12"/>
@@ -797,13 +829,13 @@
         <w:t xml:space="preserve"> </w:t>
       </w:r>
       <w:r>
-        <w:t xml:space="preserve">The 2019 Pathways to Success rules, which shortened the time ACOs could stay in one-sided risk, were followed by more</w:t>
-      </w:r>
-      <w:r>
-        <w:t xml:space="preserve"> </w:t>
-      </w:r>
-      <w:r>
-        <w:t xml:space="preserve">exits than entries,</w:t>
+        <w:t xml:space="preserve">The 2019 Pathways to Success rules, which shortened the time ACOs could stay in one-sided risk, were</w:t>
+      </w:r>
+      <w:r>
+        <w:t xml:space="preserve"> </w:t>
+      </w:r>
+      <w:r>
+        <w:t xml:space="preserve">followed by more exits than entries,</w:t>
       </w:r>
       <w:r>
         <w:t xml:space="preserve">[</w:t>
@@ -823,7 +855,13 @@
         <w:t xml:space="preserve"> </w:t>
       </w:r>
       <w:r>
-        <w:t xml:space="preserve">by ACO leaders reassessing potential savings against losses,</w:t>
+        <w:t xml:space="preserve">by ACO leaders reassessing potential savings against</w:t>
+      </w:r>
+      <w:r>
+        <w:t xml:space="preserve"> </w:t>
+      </w:r>
+      <w:r>
+        <w:t xml:space="preserve">losses,</w:t>
       </w:r>
       <w:r>
         <w:t xml:space="preserve">[</w:t>
@@ -843,13 +881,7 @@
         <w:t xml:space="preserve"> </w:t>
       </w:r>
       <w:r>
-        <w:t xml:space="preserve">and by</w:t>
-      </w:r>
-      <w:r>
-        <w:t xml:space="preserve"> </w:t>
-      </w:r>
-      <w:r>
-        <w:t xml:space="preserve">departures with projected costs to Medicare.</w:t>
+        <w:t xml:space="preserve">and by departures with projected costs to Medicare.</w:t>
       </w:r>
       <w:r>
         <w:t xml:space="preserve">[</w:t>
@@ -863,7 +895,22 @@
         </w:r>
       </w:hyperlink>
       <w:r>
-        <w:t xml:space="preserve">,</w:t>
+        <w:t xml:space="preserve">]</w:t>
+      </w:r>
+      <w:r>
+        <w:t xml:space="preserve"> </w:t>
+      </w:r>
+      <w:r>
+        <w:t xml:space="preserve">In a related model, most ACO</w:t>
+      </w:r>
+      <w:r>
+        <w:t xml:space="preserve"> </w:t>
+      </w:r>
+      <w:r>
+        <w:t xml:space="preserve">Investment Model ACOs exited once downside risk was required.</w:t>
+      </w:r>
+      <w:r>
+        <w:t xml:space="preserve">[</w:t>
       </w:r>
       <w:hyperlink w:anchor="ref-trombley2022">
         <w:r>
@@ -980,13 +1027,13 @@
         <w:t xml:space="preserve"> </w:t>
       </w:r>
       <w:r>
-        <w:t xml:space="preserve">Who used the</w:t>
-      </w:r>
-      <w:r>
-        <w:t xml:space="preserve"> </w:t>
-      </w:r>
-      <w:r>
-        <w:t xml:space="preserve">option, and why, bears on how benchmark rules sort ACOs, but to the author’s knowledge it has not been studied.</w:t>
+        <w:t xml:space="preserve">Which ACOs used</w:t>
+      </w:r>
+      <w:r>
+        <w:t xml:space="preserve"> </w:t>
+      </w:r>
+      <w:r>
+        <w:t xml:space="preserve">the option bears on how benchmark rules sort ACOs, but to the author’s knowledge it has not been studied.</w:t>
       </w:r>
     </w:p>
     <w:p>
@@ -1069,19 +1116,19 @@
         <w:t xml:space="preserve"> </w:t>
       </w:r>
       <w:r>
-        <w:t xml:space="preserve">reset than ACOs that stayed, which characteristics predicted early renewal, and whether early renewers’ spending</w:t>
-      </w:r>
-      <w:r>
-        <w:t xml:space="preserve"> </w:t>
-      </w:r>
-      <w:r>
-        <w:t xml:space="preserve">changed afterward. The analysis plan, hypotheses, decision rules and code were registered before any outcome value</w:t>
-      </w:r>
-      <w:r>
-        <w:t xml:space="preserve"> </w:t>
-      </w:r>
-      <w:r>
-        <w:t xml:space="preserve">was read.</w:t>
+        <w:t xml:space="preserve">reset than ACOs that stayed, which characteristics were associated with early renewal, and whether early renewers’</w:t>
+      </w:r>
+      <w:r>
+        <w:t xml:space="preserve"> </w:t>
+      </w:r>
+      <w:r>
+        <w:t xml:space="preserve">spending growth differed afterward. The analysis plan, hypotheses, decision rules and code were registered before</w:t>
+      </w:r>
+      <w:r>
+        <w:t xml:space="preserve"> </w:t>
+      </w:r>
+      <w:r>
+        <w:t xml:space="preserve">any outcome value was read.</w:t>
       </w:r>
       <w:r>
         <w:t xml:space="preserve">[</w:t>
@@ -1096,6 +1143,18 @@
       </w:hyperlink>
       <w:r>
         <w:t xml:space="preserve">]</w:t>
+      </w:r>
+      <w:r>
+        <w:t xml:space="preserve"> </w:t>
+      </w:r>
+      <w:r>
+        <w:t xml:space="preserve">Associations with pre-decision characteristics bear on the motives but</w:t>
+      </w:r>
+      <w:r>
+        <w:t xml:space="preserve"> </w:t>
+      </w:r>
+      <w:r>
+        <w:t xml:space="preserve">cannot establish them, and no test here can separate the two motives.</w:t>
       </w:r>
     </w:p>
     <w:bookmarkEnd w:id="13"/>
@@ -1203,37 +1262,49 @@
         <w:t xml:space="preserve"> </w:t>
       </w:r>
       <w:r>
-        <w:t xml:space="preserve">were used. The registry’s own timestamp, rather than the repository’s commit dates, establishes that order, and</w:t>
-      </w:r>
-      <w:r>
-        <w:t xml:space="preserve"> </w:t>
-      </w:r>
-      <w:r>
-        <w:t xml:space="preserve">the code enforces it: every data file is hashed before it is read, and any file whose hash matches a</w:t>
-      </w:r>
-      <w:r>
-        <w:t xml:space="preserve"> </w:t>
-      </w:r>
-      <w:r>
-        <w:t xml:space="preserve">performance-year results file or a county spending file could not be opened until the registration record existed.</w:t>
-      </w:r>
-      <w:r>
-        <w:t xml:space="preserve"> </w:t>
-      </w:r>
-      <w:r>
-        <w:t xml:space="preserve">The pipeline was written and tested on synthetic data with planted effects before registration. Analyses ran in</w:t>
-      </w:r>
-      <w:r>
-        <w:t xml:space="preserve"> </w:t>
-      </w:r>
-      <w:r>
-        <w:t xml:space="preserve">stages that each refused to start until the outputs they depend on existed, so the power analysis was committed</w:t>
-      </w:r>
-      <w:r>
-        <w:t xml:space="preserve"> </w:t>
-      </w:r>
-      <w:r>
-        <w:t xml:space="preserve">before any confirmatory estimate and every results file before its estimates were read.</w:t>
+        <w:t xml:space="preserve">were used. The registry’s own timestamp, rather than the repository’s commit dates, establishes that order. The code</w:t>
+      </w:r>
+      <w:r>
+        <w:t xml:space="preserve"> </w:t>
+      </w:r>
+      <w:r>
+        <w:t xml:space="preserve">also enforced it: every data file is hashed before it is read, and any file whose hash matches a performance-year</w:t>
+      </w:r>
+      <w:r>
+        <w:t xml:space="preserve"> </w:t>
+      </w:r>
+      <w:r>
+        <w:t xml:space="preserve">results file, a county spending file or the county assignment file could not be opened until the registration record</w:t>
+      </w:r>
+      <w:r>
+        <w:t xml:space="preserve"> </w:t>
+      </w:r>
+      <w:r>
+        <w:t xml:space="preserve">existed. The pipeline was written and tested on synthetic data with planted effects before registration. Analyses ran</w:t>
+      </w:r>
+      <w:r>
+        <w:t xml:space="preserve"> </w:t>
+      </w:r>
+      <w:r>
+        <w:t xml:space="preserve">in stages that each refused to start until the outputs they depend on existed: the power analysis was committed before</w:t>
+      </w:r>
+      <w:r>
+        <w:t xml:space="preserve"> </w:t>
+      </w:r>
+      <w:r>
+        <w:t xml:space="preserve">any confirmatory estimate, the robustness results (which depend only on validation and power) were committed before</w:t>
+      </w:r>
+      <w:r>
+        <w:t xml:space="preserve"> </w:t>
+      </w:r>
+      <w:r>
+        <w:t xml:space="preserve">the confirmatory results and read only together with them, and every results file was committed before its</w:t>
+      </w:r>
+      <w:r>
+        <w:t xml:space="preserve"> </w:t>
+      </w:r>
+      <w:r>
+        <w:t xml:space="preserve">estimates were read.</w:t>
       </w:r>
     </w:p>
     <w:bookmarkEnd w:id="14"/>
@@ -1293,25 +1364,31 @@
         <w:t xml:space="preserve"> </w:t>
       </w:r>
       <w:r>
-        <w:t xml:space="preserve">MSSP ACO enrollment files (one per year, 2014-2026), performance-year financial and quality results</w:t>
-      </w:r>
-      <w:r>
-        <w:t xml:space="preserve"> </w:t>
-      </w:r>
-      <w:r>
-        <w:t xml:space="preserve">(2013-2024), county-level expenditure and risk-score data on assignable beneficiaries, and counts of ACO-assigned</w:t>
-      </w:r>
-      <w:r>
-        <w:t xml:space="preserve"> </w:t>
-      </w:r>
-      <w:r>
-        <w:t xml:space="preserve">beneficiaries by county. Forty files were downloaded on October 22, 2026, and each file’s size, SHA-256 hash and URL</w:t>
-      </w:r>
-      <w:r>
-        <w:t xml:space="preserve"> </w:t>
-      </w:r>
-      <w:r>
-        <w:t xml:space="preserve">was recorded; an archived copy of the snapshot is on OSF.</w:t>
+        <w:t xml:space="preserve">MSSP ACO enrollment files for PY2016-PY2024, performance-year (PY) financial and quality results for</w:t>
+      </w:r>
+      <w:r>
+        <w:t xml:space="preserve"> </w:t>
+      </w:r>
+      <w:r>
+        <w:t xml:space="preserve">PY2016-PY2024 (PY2023 and PY2024 only for the spending analysis), county-level expenditure and risk-score data on</w:t>
+      </w:r>
+      <w:r>
+        <w:t xml:space="preserve"> </w:t>
+      </w:r>
+      <w:r>
+        <w:t xml:space="preserve">assignable beneficiaries for 2019-2021, and counts of ACO-assigned beneficiaries by county for 2021. The 40 files</w:t>
+      </w:r>
+      <w:r>
+        <w:t xml:space="preserve"> </w:t>
+      </w:r>
+      <w:r>
+        <w:t xml:space="preserve">downloaded on October 22, 2026, each recorded with its size, SHA-256 hash and URL, also include files kept from the</w:t>
+      </w:r>
+      <w:r>
+        <w:t xml:space="preserve"> </w:t>
+      </w:r>
+      <w:r>
+        <w:t xml:space="preserve">design stage that no analysis reads; an archived copy of the snapshot is on OSF.</w:t>
       </w:r>
       <w:r>
         <w:t xml:space="preserve">[</w:t>
@@ -1331,13 +1408,13 @@
         <w:t xml:space="preserve"> </w:t>
       </w:r>
       <w:r>
-        <w:t xml:space="preserve">Cells with counts of 1 to 10 are suppressed</w:t>
-      </w:r>
-      <w:r>
-        <w:t xml:space="preserve"> </w:t>
-      </w:r>
-      <w:r>
-        <w:t xml:space="preserve">in these files.</w:t>
+        <w:t xml:space="preserve">Cells with counts of 1</w:t>
+      </w:r>
+      <w:r>
+        <w:t xml:space="preserve"> </w:t>
+      </w:r>
+      <w:r>
+        <w:t xml:space="preserve">to 10 are suppressed in these files.</w:t>
       </w:r>
       <w:r>
         <w:t xml:space="preserve">[</w:t>
@@ -1369,19 +1446,19 @@
         <w:pStyle w:val="FirstParagraph"/>
       </w:pPr>
       <w:r>
-        <w:t xml:space="preserve">The base population was the 334 ACOs whose performance year (PY) 2021 enrollment record showed an agreement start of</w:t>
-      </w:r>
-      <w:r>
-        <w:t xml:space="preserve"> </w:t>
-      </w:r>
-      <w:r>
-        <w:t xml:space="preserve">July 1, 2019 (189 ACOs) or January 1, 2020 (145 ACOs). Both cohorts’ agreements end December 31, 2024, so an ACO from</w:t>
-      </w:r>
-      <w:r>
-        <w:t xml:space="preserve"> </w:t>
-      </w:r>
-      <w:r>
-        <w:t xml:space="preserve">either cohort with a January 1, 2022 agreement in the PY2022 enrollment file had renewed early.</w:t>
+        <w:t xml:space="preserve">The base population was the 334 ACOs whose PY2021 enrollment record showed an agreement start of July 1, 2019 (189</w:t>
+      </w:r>
+      <w:r>
+        <w:t xml:space="preserve"> </w:t>
+      </w:r>
+      <w:r>
+        <w:t xml:space="preserve">ACOs) or January 1, 2020 (145 ACOs). Both cohorts’ agreements end December 31, 2024, so an ACO from either cohort with</w:t>
+      </w:r>
+      <w:r>
+        <w:t xml:space="preserve"> </w:t>
+      </w:r>
+      <w:r>
+        <w:t xml:space="preserve">a January 1, 2022 agreement in the PY2022 enrollment file had renewed early.</w:t>
       </w:r>
       <w:r>
         <w:t xml:space="preserve">[</w:t>
@@ -1405,27 +1482,19 @@
           <w:b/>
           <w:bCs/>
         </w:rPr>
-        <w:t xml:space="preserve">Early</w:t>
-      </w:r>
-      <w:r>
-        <w:rPr>
-          <w:b/>
-          <w:bCs/>
-        </w:rPr>
-        <w:t xml:space="preserve"> </w:t>
-      </w:r>
-      <w:r>
-        <w:rPr>
-          <w:b/>
-          <w:bCs/>
-        </w:rPr>
-        <w:t xml:space="preserve">renewers</w:t>
-      </w:r>
-      <w:r>
-        <w:t xml:space="preserve"> </w:t>
-      </w:r>
-      <w:r>
-        <w:t xml:space="preserve">(29 ACOs) were compared with</w:t>
+        <w:t xml:space="preserve">Early renewers</w:t>
+      </w:r>
+      <w:r>
+        <w:t xml:space="preserve"> </w:t>
+      </w:r>
+      <w:r>
+        <w:t xml:space="preserve">(29 ACOs)</w:t>
+      </w:r>
+      <w:r>
+        <w:t xml:space="preserve"> </w:t>
+      </w:r>
+      <w:r>
+        <w:t xml:space="preserve">were compared with</w:t>
       </w:r>
       <w:r>
         <w:t xml:space="preserve"> </w:t>
@@ -1441,13 +1510,13 @@
         <w:t xml:space="preserve"> </w:t>
       </w:r>
       <w:r>
-        <w:t xml:space="preserve">(277 ACOs), those in the same agreement in PY2022. The 28 ACOs</w:t>
-      </w:r>
-      <w:r>
-        <w:t xml:space="preserve"> </w:t>
-      </w:r>
-      <w:r>
-        <w:t xml:space="preserve">absent from the PY2022 file (left after PY2021) were described but entered no registered test (Figure 1).</w:t>
+        <w:t xml:space="preserve">(277 ACOs), those in the same agreement in PY2022. The 28 ACOs absent from the PY2022</w:t>
+      </w:r>
+      <w:r>
+        <w:t xml:space="preserve"> </w:t>
+      </w:r>
+      <w:r>
+        <w:t xml:space="preserve">file (left after PY2021) were described but entered no registered test (Figure 1).</w:t>
       </w:r>
     </w:p>
     <w:bookmarkEnd w:id="16"/>
@@ -1531,7 +1600,7 @@
         <w:t xml:space="preserve"> </w:t>
       </w:r>
       <w:r>
-        <w:t xml:space="preserve">and adjusted to the ACO’s case mix;</w:t>
+        <w:t xml:space="preserve">(the published proxy for the benchmark year’s assignment) and adjusted to the ACO’s case mix;</w:t>
       </w:r>
       <w:r>
         <w:t xml:space="preserve">[</w:t>
@@ -1551,7 +1620,13 @@
         <w:t xml:space="preserve"> </w:t>
       </w:r>
       <w:r>
-        <w:t xml:space="preserve">(3) the regional adjustment,</w:t>
+        <w:t xml:space="preserve">(3) the</w:t>
+      </w:r>
+      <w:r>
+        <w:t xml:space="preserve"> </w:t>
+      </w:r>
+      <w:r>
+        <w:t xml:space="preserve">regional adjustment,</w:t>
       </w:r>
       <w:r>
         <w:t xml:space="preserve"> </w:t>
@@ -1614,13 +1689,19 @@
         <w:t xml:space="preserve"> </w:t>
       </w:r>
       <w:r>
-        <w:t xml:space="preserve">and the cap of 425.601; (4) the approximate new benchmark, combining</w:t>
-      </w:r>
-      <w:r>
-        <w:t xml:space="preserve"> </w:t>
-      </w:r>
-      <w:r>
-        <w:t xml:space="preserve">types by the ACO’s PY2021 person-year shares; and (5) the expected gain,</w:t>
+        <w:t xml:space="preserve">and the cap of</w:t>
+      </w:r>
+      <w:r>
+        <w:t xml:space="preserve"> </w:t>
+      </w:r>
+      <w:r>
+        <w:t xml:space="preserve">425.601; (4) the approximate new benchmark, combining types by the ACO’s PY2021 person-year shares; and (5) the</w:t>
+      </w:r>
+      <w:r>
+        <w:t xml:space="preserve"> </w:t>
+      </w:r>
+      <w:r>
+        <w:t xml:space="preserve">expected gain,</w:t>
       </w:r>
       <w:r>
         <w:t xml:space="preserve"> </w:t>
@@ -1657,13 +1738,13 @@
         <w:t xml:space="preserve"> </w:t>
       </w:r>
       <w:r>
-        <w:t xml:space="preserve">current) / current,</w:t>
-      </w:r>
-      <w:r>
-        <w:t xml:space="preserve"> </w:t>
-      </w:r>
-      <w:r>
-        <w:t xml:space="preserve">where the current benchmark is the PY2021 updated per-capita benchmark. The gain splits into an</w:t>
+        <w:t xml:space="preserve">current) / current, where the current benchmark is the PY2021 updated per-capita</w:t>
+      </w:r>
+      <w:r>
+        <w:t xml:space="preserve"> </w:t>
+      </w:r>
+      <w:r>
+        <w:t xml:space="preserve">benchmark. The gain splits into an</w:t>
       </w:r>
       <w:r>
         <w:t xml:space="preserve"> </w:t>
@@ -1673,33 +1754,19 @@
           <w:b/>
           <w:bCs/>
         </w:rPr>
-        <w:t xml:space="preserve">own-spending</w:t>
-      </w:r>
-      <w:r>
-        <w:rPr>
-          <w:b/>
-          <w:bCs/>
-        </w:rPr>
-        <w:t xml:space="preserve"> </w:t>
-      </w:r>
-      <w:r>
-        <w:rPr>
-          <w:b/>
-          <w:bCs/>
-        </w:rPr>
-        <w:t xml:space="preserve">component</w:t>
-      </w:r>
-      <w:r>
-        <w:t xml:space="preserve"> </w:t>
-      </w:r>
-      <w:r>
-        <w:t xml:space="preserve">(rebased spending relative to the current benchmark, which is close to a restatement of the savings</w:t>
-      </w:r>
-      <w:r>
-        <w:t xml:space="preserve"> </w:t>
-      </w:r>
-      <w:r>
-        <w:t xml:space="preserve">rate) and a</w:t>
+        <w:t xml:space="preserve">own-spending component</w:t>
+      </w:r>
+      <w:r>
+        <w:t xml:space="preserve"> </w:t>
+      </w:r>
+      <w:r>
+        <w:t xml:space="preserve">(rebased spending relative to the current benchmark,</w:t>
+      </w:r>
+      <w:r>
+        <w:t xml:space="preserve"> </w:t>
+      </w:r>
+      <w:r>
+        <w:t xml:space="preserve">which is close to a restatement of the savings rate) and a</w:t>
       </w:r>
       <w:r>
         <w:t xml:space="preserve"> </w:t>
@@ -1715,7 +1782,13 @@
         <w:t xml:space="preserve"> </w:t>
       </w:r>
       <w:r>
-        <w:t xml:space="preserve">(the adjustment). Writing the adjustment out shows that, before capping,</w:t>
+        <w:t xml:space="preserve">(the adjustment). Writing the</w:t>
+      </w:r>
+      <w:r>
+        <w:t xml:space="preserve"> </w:t>
+      </w:r>
+      <w:r>
+        <w:t xml:space="preserve">adjustment out shows that, before capping,</w:t>
       </w:r>
     </w:p>
     <w:p>
@@ -1795,7 +1868,7 @@
         <w:pStyle w:val="FirstParagraph"/>
       </w:pPr>
       <w:r>
-        <w:t xml:space="preserve">so the regional component is also tied to past savings. Step (6) is the primary exposure measure, the</w:t>
+        <w:t xml:space="preserve">so the regional component is also tied to past savings. Step (6) is the primary measure, the</w:t>
       </w:r>
       <w:r>
         <w:t xml:space="preserve"> </w:t>
@@ -1805,21 +1878,7 @@
           <w:b/>
           <w:bCs/>
         </w:rPr>
-        <w:t xml:space="preserve">regional</w:t>
-      </w:r>
-      <w:r>
-        <w:rPr>
-          <w:b/>
-          <w:bCs/>
-        </w:rPr>
-        <w:t xml:space="preserve"> </w:t>
-      </w:r>
-      <w:r>
-        <w:rPr>
-          <w:b/>
-          <w:bCs/>
-        </w:rPr>
-        <w:t xml:space="preserve">pull</w:t>
+        <w:t xml:space="preserve">regional pull</w:t>
       </w:r>
       <w:r>
         <w:t xml:space="preserve">,</w:t>
@@ -2018,7 +2077,13 @@
         <w:t xml:space="preserve"> </w:t>
       </w:r>
       <w:r>
-        <w:t xml:space="preserve">benchmark.</w:t>
+        <w:t xml:space="preserve">benchmark. They use final PY2021 data, published after the 2022 renewal decision was made during 2021, so they are</w:t>
+      </w:r>
+      <w:r>
+        <w:t xml:space="preserve"> </w:t>
+      </w:r>
+      <w:r>
+        <w:t xml:space="preserve">ex post measures of what ACOs could anticipate from CMS’s quarterly reports and their own earlier results.</w:t>
       </w:r>
     </w:p>
     <w:p>
@@ -2108,7 +2173,19 @@
         <w:t xml:space="preserve"> </w:t>
       </w:r>
       <w:r>
-        <w:t xml:space="preserve">cohort, PY2021 track and level, revenue category, assignment method and agreement number.</w:t>
+        <w:t xml:space="preserve">cohort, PY2021 track and BASIC level, revenue category, assignment method and agreement number. An ACO’s PY2021</w:t>
+      </w:r>
+      <w:r>
+        <w:t xml:space="preserve"> </w:t>
+      </w:r>
+      <w:r>
+        <w:t xml:space="preserve">BASIC level reflects both the glide path’s schedule and its own earlier choices: ACOs choose their entry level, can</w:t>
+      </w:r>
+      <w:r>
+        <w:t xml:space="preserve"> </w:t>
+      </w:r>
+      <w:r>
+        <w:t xml:space="preserve">advance faster, and could pause the advance for 2021.</w:t>
       </w:r>
     </w:p>
     <w:p>
@@ -2132,19 +2209,25 @@
         <w:t xml:space="preserve"> </w:t>
       </w:r>
       <w:r>
-        <w:t xml:space="preserve">recovery of a single hidden count from totals, the mean over years in which a value was shown, and a regional ratio.</w:t>
-      </w:r>
-      <w:r>
-        <w:t xml:space="preserve"> </w:t>
-      </w:r>
-      <w:r>
-        <w:t xml:space="preserve">ACOs still missing a variable were excluded from that analysis and counted; the plan required reporting as a</w:t>
-      </w:r>
-      <w:r>
-        <w:t xml:space="preserve"> </w:t>
-      </w:r>
-      <w:r>
-        <w:t xml:space="preserve">limitation any exclusion above 10% of either group.</w:t>
+        <w:t xml:space="preserve">recovery of a single hidden count from totals, the mean over years in which a value was shown, a regional ratio for</w:t>
+      </w:r>
+      <w:r>
+        <w:t xml:space="preserve"> </w:t>
+      </w:r>
+      <w:r>
+        <w:t xml:space="preserve">a type hidden in every year, and, for a hidden risk score, no restatement and the region’s mean risk score. ACOs</w:t>
+      </w:r>
+      <w:r>
+        <w:t xml:space="preserve"> </w:t>
+      </w:r>
+      <w:r>
+        <w:t xml:space="preserve">still missing a variable were excluded from that analysis and counted; the plan required reporting as a limitation</w:t>
+      </w:r>
+      <w:r>
+        <w:t xml:space="preserve"> </w:t>
+      </w:r>
+      <w:r>
+        <w:t xml:space="preserve">any exclusion above 10% of either group.</w:t>
       </w:r>
     </w:p>
     <w:bookmarkEnd w:id="17"/>
@@ -2345,13 +2428,13 @@
         <w:t xml:space="preserve"> </w:t>
       </w:r>
       <w:r>
-        <w:t xml:space="preserve">the posterior mean and 95% equal-tailed credible interval (CrI). Significance was by stratified permutation: labels</w:t>
-      </w:r>
-      <w:r>
-        <w:t xml:space="preserve"> </w:t>
-      </w:r>
-      <w:r>
-        <w:t xml:space="preserve">were shuffled within cohort 10,000 times, and the 2-sided</w:t>
+        <w:t xml:space="preserve">the posterior mean, 95% equal-tailed credible interval (CrI) and posterior probability of a positive value. Significance</w:t>
+      </w:r>
+      <w:r>
+        <w:t xml:space="preserve"> </w:t>
+      </w:r>
+      <w:r>
+        <w:t xml:space="preserve">was by stratified permutation: labels were shuffled within cohort 10,000 times, and the 2-sided</w:t>
       </w:r>
       <w:r>
         <w:t xml:space="preserve"> </w:t>
@@ -2545,6 +2628,34 @@
       <w:r>
         <w:t xml:space="preserve">]</w:t>
       </w:r>
+      <w:r>
+        <w:t xml:space="preserve"> </w:t>
+      </w:r>
+      <w:r>
+        <w:t xml:space="preserve">When the</w:t>
+      </w:r>
+      <w:r>
+        <w:t xml:space="preserve"> </w:t>
+      </w:r>
+      <w:r>
+        <w:rPr>
+          <w:i/>
+          <w:iCs/>
+        </w:rPr>
+        <w:t xml:space="preserve">P</w:t>
+      </w:r>
+      <w:r>
+        <w:t xml:space="preserve"> </w:t>
+      </w:r>
+      <w:r>
+        <w:t xml:space="preserve">value</w:t>
+      </w:r>
+      <w:r>
+        <w:t xml:space="preserve"> </w:t>
+      </w:r>
+      <w:r>
+        <w:t xml:space="preserve">and the CrI disagree, both are reported and the disagreement noted.</w:t>
+      </w:r>
     </w:p>
     <w:p>
       <w:pPr>
@@ -2613,13 +2724,13 @@
         <w:t xml:space="preserve"> </w:t>
       </w:r>
       <w:r>
-        <w:t xml:space="preserve">(4 chains of 2,000 draws).</w:t>
-      </w:r>
-      <w:r>
-        <w:t xml:space="preserve"> </w:t>
-      </w:r>
-      <w:r>
-        <w:t xml:space="preserve">Continuous predictors were scaled by 2 SD,</w:t>
+        <w:t xml:space="preserve">(4 chains of 2,000 tuning and 2,000</w:t>
+      </w:r>
+      <w:r>
+        <w:t xml:space="preserve"> </w:t>
+      </w:r>
+      <w:r>
+        <w:t xml:space="preserve">retained draws, target acceptance 0.95). Continuous predictors were centered and divided by 2 SD</w:t>
       </w:r>
       <w:r>
         <w:t xml:space="preserve">[</w:t>
@@ -2639,19 +2750,25 @@
         <w:t xml:space="preserve"> </w:t>
       </w:r>
       <w:r>
-        <w:t xml:space="preserve">so each coefficient is a log-odds difference per 2 SD;</w:t>
-      </w:r>
-      <w:r>
-        <w:t xml:space="preserve"> </w:t>
-      </w:r>
-      <w:r>
-        <w:t xml:space="preserve">coefficients had Normal(0, 1) priors. The own-spending component entered as a latent true value observed with</w:t>
-      </w:r>
-      <w:r>
-        <w:t xml:space="preserve"> </w:t>
-      </w:r>
-      <w:r>
-        <w:t xml:space="preserve">normal error, with the error SD fixed by the validation step. Convergence required</w:t>
+        <w:t xml:space="preserve">and binary</w:t>
+      </w:r>
+      <w:r>
+        <w:t xml:space="preserve"> </w:t>
+      </w:r>
+      <w:r>
+        <w:t xml:space="preserve">predictors centered, so each coefficient is a log-odds difference per 2 SD or per category; coefficients had Normal(0,</w:t>
+      </w:r>
+      <w:r>
+        <w:t xml:space="preserve"> </w:t>
+      </w:r>
+      <w:r>
+        <w:t xml:space="preserve">1) priors. The own-spending component entered as a latent true value observed with normal error, with the error SD</w:t>
+      </w:r>
+      <w:r>
+        <w:t xml:space="preserve"> </w:t>
+      </w:r>
+      <w:r>
+        <w:t xml:space="preserve">fixed by the validation step. Convergence required</w:t>
       </w:r>
       <w:r>
         <w:t xml:space="preserve"> </w:t>
@@ -2678,13 +2795,13 @@
         </m:r>
       </m:oMath>
       <w:r>
-        <w:t xml:space="preserve">, bulk and tail</w:t>
-      </w:r>
-      <w:r>
-        <w:t xml:space="preserve"> </w:t>
-      </w:r>
-      <w:r>
-        <w:t xml:space="preserve">effective sample sizes of at least 400 and no divergences,</w:t>
+        <w:t xml:space="preserve">, bulk and tail effective sample sizes of at</w:t>
+      </w:r>
+      <w:r>
+        <w:t xml:space="preserve"> </w:t>
+      </w:r>
+      <w:r>
+        <w:t xml:space="preserve">least 400 and no divergences,</w:t>
       </w:r>
       <w:r>
         <w:t xml:space="preserve">[</w:t>
@@ -2704,13 +2821,7 @@
         <w:t xml:space="preserve"> </w:t>
       </w:r>
       <w:r>
-        <w:t xml:space="preserve">with one registered rerun; a Firth</w:t>
-      </w:r>
-      <w:r>
-        <w:t xml:space="preserve"> </w:t>
-      </w:r>
-      <w:r>
-        <w:t xml:space="preserve">penalized regression</w:t>
+        <w:t xml:space="preserve">with one registered rerun; a Firth penalized regression</w:t>
       </w:r>
       <w:r>
         <w:t xml:space="preserve">[</w:t>
@@ -2741,31 +2852,31 @@
         <w:t xml:space="preserve"> </w:t>
       </w:r>
       <w:r>
-        <w:t xml:space="preserve">would have decided H3 had the model not converged. Because shuffling</w:t>
-      </w:r>
-      <w:r>
-        <w:t xml:space="preserve"> </w:t>
-      </w:r>
-      <w:r>
-        <w:t xml:space="preserve">labels in a multi-predictor model tests the joint null, each core predictor was tested by direct simulation under the</w:t>
-      </w:r>
-      <w:r>
-        <w:t xml:space="preserve"> </w:t>
-      </w:r>
-      <w:r>
-        <w:t xml:space="preserve">reduced model: the model without that predictor was fit, 10,000 outcome vectors were simulated from its posterior,</w:t>
-      </w:r>
-      <w:r>
-        <w:t xml:space="preserve"> </w:t>
-      </w:r>
-      <w:r>
-        <w:t xml:space="preserve">the full model was refit to each, and the observed coefficient was compared with that null distribution. A</w:t>
-      </w:r>
-      <w:r>
-        <w:t xml:space="preserve"> </w:t>
-      </w:r>
-      <w:r>
-        <w:t xml:space="preserve">Student-t(3, 0, 2.5) prior fit</w:t>
+        <w:t xml:space="preserve">would have decided H3 had the model not converged. Because shuffling labels in a multi-predictor model</w:t>
+      </w:r>
+      <w:r>
+        <w:t xml:space="preserve"> </w:t>
+      </w:r>
+      <w:r>
+        <w:t xml:space="preserve">tests the joint null, each core predictor was tested by direct simulation under the reduced model: the model without</w:t>
+      </w:r>
+      <w:r>
+        <w:t xml:space="preserve"> </w:t>
+      </w:r>
+      <w:r>
+        <w:t xml:space="preserve">that predictor was fit, 10,000 outcome vectors were simulated from its posterior, the full model was refit to each,</w:t>
+      </w:r>
+      <w:r>
+        <w:t xml:space="preserve"> </w:t>
+      </w:r>
+      <w:r>
+        <w:t xml:space="preserve">and the observed coefficient was compared with that null distribution. A fit with Student-t(3, 0, 2.5) priors, after</w:t>
+      </w:r>
+      <w:r>
+        <w:t xml:space="preserve"> </w:t>
+      </w:r>
+      <w:r>
+        <w:t xml:space="preserve">Gelman and colleagues,</w:t>
       </w:r>
       <w:r>
         <w:t xml:space="preserve">[</w:t>
@@ -2785,7 +2896,13 @@
         <w:t xml:space="preserve"> </w:t>
       </w:r>
       <w:r>
-        <w:t xml:space="preserve">was the registered sensitivity analysis.</w:t>
+        <w:t xml:space="preserve">was the registered sensitivity analysis, with any differing core conclusion to</w:t>
+      </w:r>
+      <w:r>
+        <w:t xml:space="preserve"> </w:t>
+      </w:r>
+      <w:r>
+        <w:t xml:space="preserve">be flagged.</w:t>
       </w:r>
     </w:p>
     <w:p>
@@ -2900,19 +3017,25 @@
         </m:r>
       </m:oMath>
       <w:r>
-        <w:t xml:space="preserve">, the percent difference in spending growth. The comparison group was ACOs</w:t>
-      </w:r>
-      <w:r>
-        <w:t xml:space="preserve"> </w:t>
-      </w:r>
-      <w:r>
-        <w:t xml:space="preserve">not yet renewed: a stayer’s years after it renewed into a 2023 or 2024 agreement were excluded, following the</w:t>
-      </w:r>
-      <w:r>
-        <w:t xml:space="preserve"> </w:t>
-      </w:r>
-      <w:r>
-        <w:t xml:space="preserve">not-yet-treated design of Callaway and Sant’Anna.</w:t>
+        <w:t xml:space="preserve">, the percent difference in spending growth. Log differences are also given in</w:t>
+      </w:r>
+      <w:r>
+        <w:t xml:space="preserve"> </w:t>
+      </w:r>
+      <w:r>
+        <w:t xml:space="preserve">log points (1 log point = 0.01 in log spending, about 1%). The comparison group was ACOs not yet renewed: a stayer’s</w:t>
+      </w:r>
+      <w:r>
+        <w:t xml:space="preserve"> </w:t>
+      </w:r>
+      <w:r>
+        <w:t xml:space="preserve">years after it renewed into a 2023 or 2024 agreement were excluded, following the not-yet-treated design of Callaway</w:t>
+      </w:r>
+      <w:r>
+        <w:t xml:space="preserve"> </w:t>
+      </w:r>
+      <w:r>
+        <w:t xml:space="preserve">and Sant’Anna.</w:t>
       </w:r>
       <w:r>
         <w:t xml:space="preserve">[</w:t>
@@ -2932,19 +3055,13 @@
         <w:t xml:space="preserve"> </w:t>
       </w:r>
       <w:r>
-        <w:t xml:space="preserve">With one pre-period change (PY2020 to PY2021, both</w:t>
-      </w:r>
-      <w:r>
-        <w:t xml:space="preserve"> </w:t>
-      </w:r>
-      <w:r>
-        <w:t xml:space="preserve">affected by COVID-19) and about 29 treated ACOs, a nonsignificant pre-trend test is weak evidence of parallel</w:t>
-      </w:r>
-      <w:r>
-        <w:t xml:space="preserve"> </w:t>
-      </w:r>
-      <w:r>
-        <w:t xml:space="preserve">trends,</w:t>
+        <w:t xml:space="preserve">With one pre-period change (PY2020 to PY2021, both affected by COVID-19) and about 29</w:t>
+      </w:r>
+      <w:r>
+        <w:t xml:space="preserve"> </w:t>
+      </w:r>
+      <w:r>
+        <w:t xml:space="preserve">treated ACOs, a nonsignificant pre-trend test is weak evidence of parallel trends,</w:t>
       </w:r>
       <w:r>
         <w:t xml:space="preserve">[</w:t>
@@ -2964,7 +3081,13 @@
         <w:t xml:space="preserve"> </w:t>
       </w:r>
       <w:r>
-        <w:t xml:space="preserve">so the plan replaced it with an equivalence condition:</w:t>
+        <w:t xml:space="preserve">so the plan replaced it</w:t>
+      </w:r>
+      <w:r>
+        <w:t xml:space="preserve"> </w:t>
+      </w:r>
+      <w:r>
+        <w:t xml:space="preserve">with an equivalence condition in the spirit of equivalence testing:</w:t>
       </w:r>
       <w:r>
         <w:t xml:space="preserve">[</w:t>
@@ -2984,19 +3107,25 @@
         <w:t xml:space="preserve"> </w:t>
       </w:r>
       <w:r>
-        <w:t xml:space="preserve">H4 would be read as an effect</w:t>
-      </w:r>
-      <w:r>
-        <w:t xml:space="preserve"> </w:t>
-      </w:r>
-      <w:r>
-        <w:t xml:space="preserve">only if the larger absolute bound of the pre-trend CrI, scaled by the mean distance between period midpoints, was</w:t>
-      </w:r>
-      <w:r>
-        <w:t xml:space="preserve"> </w:t>
-      </w:r>
-      <w:r>
-        <w:t xml:space="preserve">smaller than the absolute H4 estimate. A trend-adjusted estimate</w:t>
+        <w:t xml:space="preserve">H4 would be read as an effect only</w:t>
+      </w:r>
+      <w:r>
+        <w:t xml:space="preserve"> </w:t>
+      </w:r>
+      <w:r>
+        <w:t xml:space="preserve">if the larger absolute bound of the pre-trend CrI, scaled by the mean distance between period midpoints, was smaller</w:t>
+      </w:r>
+      <w:r>
+        <w:t xml:space="preserve"> </w:t>
+      </w:r>
+      <w:r>
+        <w:t xml:space="preserve">than the absolute H4 estimate. A trend-adjusted estimate (the pre-period slope carried forward, in the spirit of</w:t>
+      </w:r>
+      <w:r>
+        <w:t xml:space="preserve"> </w:t>
+      </w:r>
+      <w:r>
+        <w:t xml:space="preserve">Rambachan and Roth</w:t>
       </w:r>
       <w:r>
         <w:t xml:space="preserve">[</w:t>
@@ -3013,16 +3142,7 @@
         <w:t xml:space="preserve">]</w:t>
       </w:r>
       <w:r>
-        <w:t xml:space="preserve"> </w:t>
-      </w:r>
-      <w:r>
-        <w:t xml:space="preserve">and risk-adjusted, balanced-panel,</w:t>
-      </w:r>
-      <w:r>
-        <w:t xml:space="preserve"> </w:t>
-      </w:r>
-      <w:r>
-        <w:t xml:space="preserve">propensity-weighted</w:t>
+        <w:t xml:space="preserve">) and risk-adjusted, balanced-panel, propensity-weighted</w:t>
       </w:r>
       <w:r>
         <w:t xml:space="preserve">[</w:t>
@@ -3042,7 +3162,13 @@
         <w:t xml:space="preserve"> </w:t>
       </w:r>
       <w:r>
-        <w:t xml:space="preserve">and single-cohort estimates were reported beside it.</w:t>
+        <w:t xml:space="preserve">and</w:t>
+      </w:r>
+      <w:r>
+        <w:t xml:space="preserve"> </w:t>
+      </w:r>
+      <w:r>
+        <w:t xml:space="preserve">single-cohort estimates were reported beside it.</w:t>
       </w:r>
     </w:p>
     <w:p>
@@ -3074,19 +3200,25 @@
         <w:t xml:space="preserve"> </w:t>
       </w:r>
       <w:r>
-        <w:t xml:space="preserve">= .05 were computed after registration</w:t>
-      </w:r>
-      <w:r>
-        <w:t xml:space="preserve"> </w:t>
-      </w:r>
-      <w:r>
-        <w:t xml:space="preserve">from spreads in years or groups not used in the tests, and committed before any confirmatory estimate. For H3,</w:t>
-      </w:r>
-      <w:r>
-        <w:t xml:space="preserve"> </w:t>
-      </w:r>
-      <w:r>
-        <w:t xml:space="preserve">detection was simulated at a log-odds difference of 0.5.</w:t>
+        <w:t xml:space="preserve">= .05 for 29 vs 277 ACOs were</w:t>
+      </w:r>
+      <w:r>
+        <w:t xml:space="preserve"> </w:t>
+      </w:r>
+      <w:r>
+        <w:t xml:space="preserve">computed after registration and committed before any confirmatory estimate: from the cross-ACO SD of the savings rate</w:t>
+      </w:r>
+      <w:r>
+        <w:t xml:space="preserve"> </w:t>
+      </w:r>
+      <w:r>
+        <w:t xml:space="preserve">in PY2016-PY2018 (H1), the SD of each constructed variable among stayers, computed after validation (H2a, H2b), and</w:t>
+      </w:r>
+      <w:r>
+        <w:t xml:space="preserve"> </w:t>
+      </w:r>
+      <w:r>
+        <w:t xml:space="preserve">the SD of the pre-period spending change (H4). For H3, detection was simulated at a log-odds difference of 0.5.</w:t>
       </w:r>
     </w:p>
     <w:p>
@@ -3188,7 +3320,13 @@
         <w:t xml:space="preserve"> </w:t>
       </w:r>
       <w:r>
-        <w:t xml:space="preserve">effect only if the equivalence condition held. No test here could rule the sharing-rate motive in or out.</w:t>
+        <w:t xml:space="preserve">effect only if the equivalence condition held. No test here could rule the sharing-rate motive in or out. As</w:t>
+      </w:r>
+      <w:r>
+        <w:t xml:space="preserve"> </w:t>
+      </w:r>
+      <w:r>
+        <w:t xml:space="preserve">registered, there is one primary test, and the 3 H3 tests and the H4 test are not adjusted for multiplicity.</w:t>
       </w:r>
     </w:p>
     <w:p>
@@ -3200,13 +3338,31 @@
           <w:b/>
           <w:bCs/>
         </w:rPr>
-        <w:t xml:space="preserve">Conventional methods and robustness.</w:t>
-      </w:r>
-      <w:r>
-        <w:t xml:space="preserve"> </w:t>
-      </w:r>
-      <w:r>
-        <w:t xml:space="preserve">Reported beside the registered methods and not used for decisions: Welch</w:t>
+        <w:t xml:space="preserve">Covariate-adjusted estimates, conventional methods and robustness.</w:t>
+      </w:r>
+      <w:r>
+        <w:t xml:space="preserve"> </w:t>
+      </w:r>
+      <w:r>
+        <w:t xml:space="preserve">Reported beside the registered methods and not</w:t>
+      </w:r>
+      <w:r>
+        <w:t xml:space="preserve"> </w:t>
+      </w:r>
+      <w:r>
+        <w:t xml:space="preserve">used for decisions: covariate-adjusted estimates for H1, H2a and H2b from robust Bayesian linear regressions</w:t>
+      </w:r>
+      <w:r>
+        <w:t xml:space="preserve"> </w:t>
+      </w:r>
+      <w:r>
+        <w:t xml:space="preserve">(Student-t errors on the standardized variable, Normal(0, 1) priors) on early renewal and cohort, or cohort, track,</w:t>
+      </w:r>
+      <w:r>
+        <w:t xml:space="preserve"> </w:t>
+      </w:r>
+      <w:r>
+        <w:t xml:space="preserve">level and size; Welch</w:t>
       </w:r>
       <w:r>
         <w:t xml:space="preserve"> </w:t>
@@ -3262,13 +3418,13 @@
         <w:t xml:space="preserve"> </w:t>
       </w:r>
       <w:r>
-        <w:t xml:space="preserve">and maximum-likelihood logistic</w:t>
-      </w:r>
-      <w:r>
-        <w:t xml:space="preserve"> </w:t>
-      </w:r>
-      <w:r>
-        <w:t xml:space="preserve">regression in statsmodels,</w:t>
+        <w:t xml:space="preserve">and</w:t>
+      </w:r>
+      <w:r>
+        <w:t xml:space="preserve"> </w:t>
+      </w:r>
+      <w:r>
+        <w:t xml:space="preserve">maximum-likelihood logistic regression in statsmodels;</w:t>
       </w:r>
       <w:r>
         <w:t xml:space="preserve">[</w:t>
@@ -3288,19 +3444,25 @@
         <w:t xml:space="preserve"> </w:t>
       </w:r>
       <w:r>
-        <w:t xml:space="preserve">and 2-way fixed effects with an event study and errors clustered by</w:t>
-      </w:r>
-      <w:r>
-        <w:t xml:space="preserve"> </w:t>
-      </w:r>
-      <w:r>
-        <w:t xml:space="preserve">ACO for H4; and the registered robustness checks (medians, single cohort, adjusted regressions, complete cases,</w:t>
-      </w:r>
-      <w:r>
-        <w:t xml:space="preserve"> </w:t>
-      </w:r>
-      <w:r>
-        <w:t xml:space="preserve">unadjusted county spending, no measurement-error model). Variables were built in dbt</w:t>
+        <w:t xml:space="preserve">2-way fixed effects with an event study and</w:t>
+      </w:r>
+      <w:r>
+        <w:t xml:space="preserve"> </w:t>
+      </w:r>
+      <w:r>
+        <w:t xml:space="preserve">errors clustered by ACO for H4; and the registered robustness checks: differences in medians, the January 1, 2020</w:t>
+      </w:r>
+      <w:r>
+        <w:t xml:space="preserve"> </w:t>
+      </w:r>
+      <w:r>
+        <w:t xml:space="preserve">cohort alone, PY2021 savings rates, the Firth model, benchmark years 2-3 only, no measurement-error model, complete</w:t>
+      </w:r>
+      <w:r>
+        <w:t xml:space="preserve"> </w:t>
+      </w:r>
+      <w:r>
+        <w:t xml:space="preserve">cases and unadjusted county spending. Variables were built in dbt</w:t>
       </w:r>
       <w:r>
         <w:t xml:space="preserve">[</w:t>
@@ -3340,7 +3502,13 @@
         <w:t xml:space="preserve"> </w:t>
       </w:r>
       <w:r>
-        <w:t xml:space="preserve">the environment was locked with uv;</w:t>
+        <w:t xml:space="preserve">the environment was</w:t>
+      </w:r>
+      <w:r>
+        <w:t xml:space="preserve"> </w:t>
+      </w:r>
+      <w:r>
+        <w:t xml:space="preserve">locked with uv;</w:t>
       </w:r>
       <w:r>
         <w:t xml:space="preserve">[</w:t>
@@ -3380,13 +3548,13 @@
         <w:t xml:space="preserve"> </w:t>
       </w:r>
       <w:r>
-        <w:t xml:space="preserve">every refit had its own seed from</w:t>
-      </w:r>
-      <w:r>
-        <w:t xml:space="preserve"> </w:t>
-      </w:r>
-      <w:r>
-        <w:t xml:space="preserve">a fixed NumPy seed sequence.</w:t>
+        <w:t xml:space="preserve">every refit had its own seed from a fixed NumPy seed</w:t>
+      </w:r>
+      <w:r>
+        <w:t xml:space="preserve"> </w:t>
+      </w:r>
+      <w:r>
+        <w:t xml:space="preserve">sequence.</w:t>
       </w:r>
       <w:r>
         <w:t xml:space="preserve">[</w:t>
@@ -3424,19 +3592,19 @@
         <w:t xml:space="preserve"> </w:t>
       </w:r>
       <w:r>
-        <w:t xml:space="preserve">lockfile took security updates to 2 packages (filelock and virtualenv); no result was produced with it, and it is logged as</w:t>
-      </w:r>
-      <w:r>
-        <w:t xml:space="preserve"> </w:t>
-      </w:r>
-      <w:r>
-        <w:t xml:space="preserve">the one deviation. One sentence of the plan’s background is imprecise: it describes ENHANCED as sharing 75% of</w:t>
-      </w:r>
-      <w:r>
-        <w:t xml:space="preserve"> </w:t>
-      </w:r>
-      <w:r>
-        <w:t xml:space="preserve">savings and losses, whereas it shares 75% of savings and up to 75% of losses.</w:t>
+        <w:t xml:space="preserve">lockfile took security updates to 2 packages (filelock and virtualenv); no result was produced with it, and it is</w:t>
+      </w:r>
+      <w:r>
+        <w:t xml:space="preserve"> </w:t>
+      </w:r>
+      <w:r>
+        <w:t xml:space="preserve">logged as the one deviation. One sentence of the plan’s background is imprecise: it describes ENHANCED as sharing 75%</w:t>
+      </w:r>
+      <w:r>
+        <w:t xml:space="preserve"> </w:t>
+      </w:r>
+      <w:r>
+        <w:t xml:space="preserve">of savings and losses, whereas it shares 75% of savings and up to 75% of losses.</w:t>
       </w:r>
     </w:p>
     <w:bookmarkEnd w:id="19"/>
@@ -3518,25 +3686,37 @@
         <w:t xml:space="preserve"> </w:t>
       </w:r>
       <w:r>
-        <w:t xml:space="preserve">own-spending part agreed with CMS’s benchmark-year spending (Spearman 0.95; error 1.4%), and its error SD set the</w:t>
-      </w:r>
-      <w:r>
-        <w:t xml:space="preserve"> </w:t>
-      </w:r>
-      <w:r>
-        <w:t xml:space="preserve">measurement-error SD at 4.38 percentage points. That SD exceeds the own-spending component’s spread among stayers</w:t>
-      </w:r>
-      <w:r>
-        <w:t xml:space="preserve"> </w:t>
-      </w:r>
-      <w:r>
-        <w:t xml:space="preserve">(SD 3.3), so at the level of one ACO that component is mostly noise; the savings rates, which CMS reports directly,</w:t>
-      </w:r>
-      <w:r>
-        <w:t xml:space="preserve"> </w:t>
-      </w:r>
-      <w:r>
-        <w:t xml:space="preserve">are the firmer evidence of how far ACOs were beating their benchmarks.</w:t>
+        <w:t xml:space="preserve">own-spending part agreed with CMS’s benchmark-year spending (Spearman 0.95; median error 1.4%), and its error SD set</w:t>
+      </w:r>
+      <w:r>
+        <w:t xml:space="preserve"> </w:t>
+      </w:r>
+      <w:r>
+        <w:t xml:space="preserve">the measurement-error SD at 4.38 percentage points. That SD exceeds the own-spending component’s spread among stayers</w:t>
+      </w:r>
+      <w:r>
+        <w:t xml:space="preserve"> </w:t>
+      </w:r>
+      <w:r>
+        <w:t xml:space="preserve">(SD 3.3). Under a classical error model it could not, so the validation errors are probably heavy-tailed (a normal</w:t>
+      </w:r>
+      <w:r>
+        <w:t xml:space="preserve"> </w:t>
+      </w:r>
+      <w:r>
+        <w:t xml:space="preserve">error with that SD would have a median absolute value near 3, against the 1.4% observed) or do not transfer exactly</w:t>
+      </w:r>
+      <w:r>
+        <w:t xml:space="preserve"> </w:t>
+      </w:r>
+      <w:r>
+        <w:t xml:space="preserve">to the study sample. By the registered error model, the component is mostly noise at the level of one ACO; the savings</w:t>
+      </w:r>
+      <w:r>
+        <w:t xml:space="preserve"> </w:t>
+      </w:r>
+      <w:r>
+        <w:t xml:space="preserve">rates, which CMS reports directly, are the firmer evidence of how far ACOs were beating their benchmarks.</w:t>
       </w:r>
     </w:p>
     <w:p>
@@ -3556,13 +3736,19 @@
         <w:t xml:space="preserve"> </w:t>
       </w:r>
       <w:r>
-        <w:t xml:space="preserve">ENHANCED in their new agreements. The expected-gain variables could not be built for 3 early renewers (10.3%) and 36</w:t>
-      </w:r>
-      <w:r>
-        <w:t xml:space="preserve"> </w:t>
-      </w:r>
-      <w:r>
-        <w:t xml:space="preserve">stayers (13.0%), both above the plan’s 10% line. In every one of these 39 ACOs, CMS had suppressed the count of</w:t>
+        <w:t xml:space="preserve">ENHANCED in their new agreements, and no stayer moved to ENHANCED. The expected-gain variables could not be built for</w:t>
+      </w:r>
+      <w:r>
+        <w:t xml:space="preserve"> </w:t>
+      </w:r>
+      <w:r>
+        <w:t xml:space="preserve">3 early renewers (10.3%) and 36 stayers (13.0%), both above the plan’s 10% line. A diagnostic query run after the</w:t>
+      </w:r>
+      <w:r>
+        <w:t xml:space="preserve"> </w:t>
+      </w:r>
+      <w:r>
+        <w:t xml:space="preserve">results, outside the registered pipeline, found that in every one of these 39 ACOs CMS had suppressed the count of</w:t>
       </w:r>
       <w:r>
         <w:t xml:space="preserve"> </w:t>
@@ -3574,19 +3760,31 @@
         <w:t xml:space="preserve"> </w:t>
       </w:r>
       <w:r>
-        <w:t xml:space="preserve">county weights. A diagnostic query run after the results, outside the registered pipeline, showed them to be smaller</w:t>
-      </w:r>
-      <w:r>
-        <w:t xml:space="preserve"> </w:t>
-      </w:r>
-      <w:r>
-        <w:t xml:space="preserve">ACOs (median 6,702 and 8,578 assigned beneficiaries for excluded early renewers and stayers, against 10,757 and</w:t>
-      </w:r>
-      <w:r>
-        <w:t xml:space="preserve"> </w:t>
-      </w:r>
-      <w:r>
-        <w:t xml:space="preserve">15,649 for those included). One early renewer and 3 stayers had hidden values filled by the registered rules.</w:t>
+        <w:t xml:space="preserve">county weights (for 15, the aged/dual counts were hidden too). The plan’s fill rules cover hidden cells in the results</w:t>
+      </w:r>
+      <w:r>
+        <w:t xml:space="preserve"> </w:t>
+      </w:r>
+      <w:r>
+        <w:t xml:space="preserve">files, not fully hidden county weights, so these ACOs were excluded and counted, as registered. The same query showed</w:t>
+      </w:r>
+      <w:r>
+        <w:t xml:space="preserve"> </w:t>
+      </w:r>
+      <w:r>
+        <w:t xml:space="preserve">them to be smaller ACOs (median 6,702 and 8,578 assigned beneficiaries for excluded early renewers and stayers,</w:t>
+      </w:r>
+      <w:r>
+        <w:t xml:space="preserve"> </w:t>
+      </w:r>
+      <w:r>
+        <w:t xml:space="preserve">against 10,757 and 15,649 for those included). One early renewer and 3 stayers had hidden values filled by the</w:t>
+      </w:r>
+      <w:r>
+        <w:t xml:space="preserve"> </w:t>
+      </w:r>
+      <w:r>
+        <w:t xml:space="preserve">registered rules.</w:t>
       </w:r>
     </w:p>
     <w:p>
@@ -4914,7 +5112,7 @@
         <w:pStyle w:val="BodyText"/>
       </w:pPr>
       <w:r>
-        <w:t xml:space="preserve">Abbreviations: ACO, accountable care organization; pp, percentage points; PY, performance year. Early renewers ended their agreements and began new ones on January 1, 2022; stayers remained in their agreements; leavers left the program after PY2021. The savings rate is CMS’s reported savings as a share of the benchmark (positive when spending was below the benchmark). The expected-gain variables could not be built for ACOs whose county counts of assigned beneficiaries with end-stage renal disease were all suppressed (Methods). Leavers were not compared in any registered test.</w:t>
+        <w:t xml:space="preserve">Abbreviations: ACO, accountable care organization; pp, percentage points; PY, performance year. Early renewers ended their agreements and began new ones on January 1, 2022; stayers remained in their agreements; leavers left the program after PY2021. The savings rate is CMS’s reported savings as a share of the benchmark (positive when spending was below the benchmark). The expected-gain variables could not be built for every ACO; a diagnostic query run after the results, outside the registered pipeline, traced each exclusion to county counts of assigned beneficiaries with end-stage renal disease that were all suppressed (Results). Leavers were not compared in any registered test.</w:t>
       </w:r>
     </w:p>
     <w:p>
@@ -4926,7 +5124,7 @@
           <wp:inline>
             <wp:extent cx="5334000" cy="4174434"/>
             <wp:effectExtent b="0" l="0" r="0" t="0"/>
-            <wp:docPr descr="Figure 1. Flow of ACOs into each analysis. Counts are early renewers vs stayers. ACO, accountable care organization; ESRD, end-stage renal disease; PY, performance year." title="" id="23" name="Picture"/>
+            <wp:docPr descr="Figure 1. Flow of ACOs into each analysis. Counts are early renewers vs stayers. The reason for the expected-gain exclusions comes from a diagnostic query run after the results, outside the registered pipeline. ACO, accountable care organization; ESRD, end-stage renal disease; PY, performance year." title="" id="23" name="Picture"/>
             <a:graphic>
               <a:graphicData uri="http://schemas.openxmlformats.org/drawingml/2006/picture">
                 <pic:pic>
@@ -4979,7 +5177,7 @@
         <w:t xml:space="preserve"> </w:t>
       </w:r>
       <w:r>
-        <w:t xml:space="preserve">Flow of ACOs into each analysis. Counts are early renewers vs stayers. ACO, accountable care organization; ESRD, end-stage renal disease; PY, performance year.</w:t>
+        <w:t xml:space="preserve">Flow of ACOs into each analysis. Counts are early renewers vs stayers. The reason for the expected-gain exclusions comes from a diagnostic query run after the results, outside the registered pipeline. ACO, accountable care organization; ESRD, end-stage renal disease; PY, performance year.</w:t>
       </w:r>
     </w:p>
     <w:bookmarkEnd w:id="25"/>
@@ -4997,13 +5195,13 @@
         <w:pStyle w:val="FirstParagraph"/>
       </w:pPr>
       <w:r>
-        <w:t xml:space="preserve">Early renewers’ regions spent 3.4 percentage points of benchmark more than stayers’ regions, relative to their</w:t>
-      </w:r>
-      <w:r>
-        <w:t xml:space="preserve"> </w:t>
-      </w:r>
-      <w:r>
-        <w:t xml:space="preserve">current benchmarks (95% CrI, 1.7 to 5.4;</w:t>
+        <w:t xml:space="preserve">Relative to their current benchmarks, early renewers’ case-mix-adjusted regional spending was 3.4 percentage points</w:t>
+      </w:r>
+      <w:r>
+        <w:t xml:space="preserve"> </w:t>
+      </w:r>
+      <w:r>
+        <w:t xml:space="preserve">higher than stayers’ (95% CrI, 1.7 to 5.4;</w:t>
       </w:r>
       <w:r>
         <w:t xml:space="preserve"> </w:t>
@@ -5019,25 +5217,37 @@
         <w:t xml:space="preserve"> </w:t>
       </w:r>
       <w:r>
-        <w:t xml:space="preserve">&lt; .001), above the MDE of 2.5 (Table 2 and Figure 2). By the registered</w:t>
-      </w:r>
-      <w:r>
-        <w:t xml:space="preserve"> </w:t>
-      </w:r>
-      <w:r>
-        <w:t xml:space="preserve">rule, H2b was supported: early renewers’ regions spent more relative to their current benchmarks, evidence for the</w:t>
-      </w:r>
-      <w:r>
-        <w:t xml:space="preserve"> </w:t>
-      </w:r>
-      <w:r>
-        <w:t xml:space="preserve">reset motive beyond past savings. At the median PY2021 benchmark of the study’s ACOs, $11,312 per beneficiary per</w:t>
-      </w:r>
-      <w:r>
-        <w:t xml:space="preserve"> </w:t>
-      </w:r>
-      <w:r>
-        <w:t xml:space="preserve">year, 3.4 points is about $385.</w:t>
+        <w:t xml:space="preserve">&lt; .001), above the MDE of 2.5 computed for 29 vs 277 ACOs, which is</w:t>
+      </w:r>
+      <w:r>
+        <w:t xml:space="preserve"> </w:t>
+      </w:r>
+      <w:r>
+        <w:t xml:space="preserve">slightly understated for the 26 vs 241 compared (Table 2 and Figure 2). By the registered rule, H2b was supported:</w:t>
+      </w:r>
+      <w:r>
+        <w:t xml:space="preserve"> </w:t>
+      </w:r>
+      <w:r>
+        <w:t xml:space="preserve">early renewers’ regions spent more relative to their current benchmarks, evidence for the reset motive beyond past</w:t>
+      </w:r>
+      <w:r>
+        <w:t xml:space="preserve"> </w:t>
+      </w:r>
+      <w:r>
+        <w:t xml:space="preserve">savings. At the median PY2021 benchmark of the study’s ACOs, $11,312 per beneficiary per year, the difference of 3.35</w:t>
+      </w:r>
+      <w:r>
+        <w:t xml:space="preserve"> </w:t>
+      </w:r>
+      <w:r>
+        <w:t xml:space="preserve">points is about $379 per beneficiary-year of regional spending relative to the benchmark; the difference in the</w:t>
+      </w:r>
+      <w:r>
+        <w:t xml:space="preserve"> </w:t>
+      </w:r>
+      <w:r>
+        <w:t xml:space="preserve">regional component itself, what a reset would add, was 1.6 points, about $176.</w:t>
       </w:r>
     </w:p>
     <w:p>
@@ -5139,12 +5349,13 @@
         <w:tblCaption w:val="Table 2. Early renewers compared with stayers: regional pull (H2b), own-spending component (H2a), savings rates (H1) and the expected gain"/>
       </w:tblPr>
       <w:tblGrid>
-        <w:gridCol w:w="2751"/>
-        <w:gridCol w:w="1141"/>
-        <w:gridCol w:w="1677"/>
-        <w:gridCol w:w="604"/>
-        <w:gridCol w:w="604"/>
-        <w:gridCol w:w="1141"/>
+        <w:gridCol w:w="2556"/>
+        <w:gridCol w:w="1060"/>
+        <w:gridCol w:w="1559"/>
+        <w:gridCol w:w="561"/>
+        <w:gridCol w:w="561"/>
+        <w:gridCol w:w="561"/>
+        <w:gridCol w:w="1060"/>
       </w:tblGrid>
       <w:tr>
         <w:trPr>
@@ -5194,6 +5405,18 @@
               <w:jc w:val="right"/>
             </w:pPr>
             <w:r>
+              <w:t xml:space="preserve">Pr(&gt;0)</w:t>
+            </w:r>
+          </w:p>
+        </w:tc>
+        <w:tc>
+          <w:tcPr/>
+          <w:p>
+            <w:pPr>
+              <w:pStyle w:val="Compact"/>
+              <w:jc w:val="right"/>
+            </w:pPr>
+            <w:r>
               <w:rPr>
                 <w:i/>
                 <w:iCs/>
@@ -5288,6 +5511,22 @@
                 <w:b/>
                 <w:bCs/>
               </w:rPr>
+              <w:t xml:space="preserve">1.000</w:t>
+            </w:r>
+          </w:p>
+        </w:tc>
+        <w:tc>
+          <w:tcPr/>
+          <w:p>
+            <w:pPr>
+              <w:pStyle w:val="Compact"/>
+              <w:jc w:val="right"/>
+            </w:pPr>
+            <w:r>
+              <w:rPr>
+                <w:b/>
+                <w:bCs/>
+              </w:rPr>
               <w:t xml:space="preserve">&lt;.001</w:t>
             </w:r>
           </w:p>
@@ -5370,6 +5609,18 @@
               <w:jc w:val="right"/>
             </w:pPr>
             <w:r>
+              <w:t xml:space="preserve">0.006</w:t>
+            </w:r>
+          </w:p>
+        </w:tc>
+        <w:tc>
+          <w:tcPr/>
+          <w:p>
+            <w:pPr>
+              <w:pStyle w:val="Compact"/>
+              <w:jc w:val="right"/>
+            </w:pPr>
+            <w:r>
               <w:t xml:space="preserve">.003</w:t>
             </w:r>
           </w:p>
@@ -5444,6 +5695,18 @@
               <w:jc w:val="right"/>
             </w:pPr>
             <w:r>
+              <w:t xml:space="preserve">1.000</w:t>
+            </w:r>
+          </w:p>
+        </w:tc>
+        <w:tc>
+          <w:tcPr/>
+          <w:p>
+            <w:pPr>
+              <w:pStyle w:val="Compact"/>
+              <w:jc w:val="right"/>
+            </w:pPr>
+            <w:r>
               <w:t xml:space="preserve">.01</w:t>
             </w:r>
           </w:p>
@@ -5514,6 +5777,18 @@
               <w:jc w:val="right"/>
             </w:pPr>
             <w:r>
+              <w:t xml:space="preserve">0.988</w:t>
+            </w:r>
+          </w:p>
+        </w:tc>
+        <w:tc>
+          <w:tcPr/>
+          <w:p>
+            <w:pPr>
+              <w:pStyle w:val="Compact"/>
+              <w:jc w:val="right"/>
+            </w:pPr>
+            <w:r>
               <w:t xml:space="preserve">.03</w:t>
             </w:r>
           </w:p>
@@ -5584,6 +5859,18 @@
               <w:jc w:val="right"/>
             </w:pPr>
             <w:r>
+              <w:t xml:space="preserve">0.233</w:t>
+            </w:r>
+          </w:p>
+        </w:tc>
+        <w:tc>
+          <w:tcPr/>
+          <w:p>
+            <w:pPr>
+              <w:pStyle w:val="Compact"/>
+              <w:jc w:val="right"/>
+            </w:pPr>
+            <w:r>
               <w:t xml:space="preserve">.33</w:t>
             </w:r>
           </w:p>
@@ -5650,6 +5937,18 @@
               <w:jc w:val="right"/>
             </w:pPr>
             <w:r>
+              <w:t xml:space="preserve">1.000</w:t>
+            </w:r>
+          </w:p>
+        </w:tc>
+        <w:tc>
+          <w:tcPr/>
+          <w:p>
+            <w:pPr>
+              <w:pStyle w:val="Compact"/>
+              <w:jc w:val="right"/>
+            </w:pPr>
+            <w:r>
               <w:t xml:space="preserve">&lt;.001</w:t>
             </w:r>
           </w:p>
@@ -5677,7 +5976,21 @@
         <w:pStyle w:val="BodyText"/>
       </w:pPr>
       <w:r>
-        <w:t xml:space="preserve">Abbreviations: CrI, credible interval; MDE, minimum detectable effect at 80% power, two-sided α = .05, computed for 29 vs 277 ACOs; pp, percentage points; PY, performance year. Differences are early renewers minus stayers within agreement cohort, averaged with weights proportional to early renewers per cohort. Posterior means and 95% equal-tailed CrIs are from a Bayesian bootstrap (10,000 draws); P values are from stratified permutation (10,000 shuffles within cohort). Expected-gain variables are in percentage points of the current benchmark; savings rates in percentage points. Verdicts follow the registered decision rules; H1 and the two descriptive rows carry none.</w:t>
+        <w:t xml:space="preserve">Abbreviations: CrI, credible interval; MDE, minimum detectable effect at 80% power, two-sided</w:t>
+      </w:r>
+      <w:r>
+        <w:t xml:space="preserve"> </w:t>
+      </w:r>
+      <m:oMath>
+        <m:r>
+          <m:t>α</m:t>
+        </m:r>
+      </m:oMath>
+      <w:r>
+        <w:t xml:space="preserve"> </w:t>
+      </w:r>
+      <w:r>
+        <w:t xml:space="preserve">= .05, computed before the tests for 29 vs 277 ACOs (for the 26 vs 241 compared on the expected-gain variables it is 2.6 for H2b and 1.9 for H2a); Pr(&gt;0), posterior probability that the difference is positive; pp, percentage points; PY, performance year. Differences are early renewers minus stayers within agreement cohort, averaged with weights proportional to early renewers per cohort. Posterior means and 95% equal-tailed CrIs are from a Bayesian bootstrap (10,000 draws); P values are from stratified permutation (10,000 shuffles within cohort). Expected-gain variables are in percentage points of the current benchmark; savings rates in percentage points. Verdicts follow the registered decision rules; H1 and the two descriptive rows carry none.</w:t>
       </w:r>
     </w:p>
     <w:p>
@@ -5782,13 +6095,13 @@
         <w:t xml:space="preserve"> </w:t>
       </w:r>
       <w:r>
-        <w:t xml:space="preserve">= .002) and a higher BASIC level (1.34; 95%</w:t>
-      </w:r>
-      <w:r>
-        <w:t xml:space="preserve"> </w:t>
-      </w:r>
-      <w:r>
-        <w:t xml:space="preserve">CrI, 0.38 to 2.31;</w:t>
+        <w:t xml:space="preserve">= .002) and a higher BASIC level (log-odds</w:t>
+      </w:r>
+      <w:r>
+        <w:t xml:space="preserve"> </w:t>
+      </w:r>
+      <w:r>
+        <w:t xml:space="preserve">difference for levels C-E vs A-B, 1.34; 95% CrI, 0.38 to 2.31;</w:t>
       </w:r>
       <w:r>
         <w:t xml:space="preserve"> </w:t>
@@ -5804,19 +6117,19 @@
         <w:t xml:space="preserve"> </w:t>
       </w:r>
       <w:r>
-        <w:t xml:space="preserve">= .003); both predictions were supported (Table 3 and Figure 3). A log-odds difference of 1.34</w:t>
-      </w:r>
-      <w:r>
-        <w:t xml:space="preserve"> </w:t>
-      </w:r>
-      <w:r>
-        <w:t xml:space="preserve">multiplies the odds of renewing early by about 3.8. The own-spending component was undetermined (−0.05; 95% CrI,</w:t>
-      </w:r>
-      <w:r>
-        <w:t xml:space="preserve"> </w:t>
-      </w:r>
-      <w:r>
-        <w:t xml:space="preserve">−2.01 to 1.92;</w:t>
+        <w:t xml:space="preserve">= .003); both predictions were supported (Table 3</w:t>
+      </w:r>
+      <w:r>
+        <w:t xml:space="preserve"> </w:t>
+      </w:r>
+      <w:r>
+        <w:t xml:space="preserve">and Figure 3). A log-odds difference of 1.34 multiplies the odds of renewing early by about 3.8. The own-spending</w:t>
+      </w:r>
+      <w:r>
+        <w:t xml:space="preserve"> </w:t>
+      </w:r>
+      <w:r>
+        <w:t xml:space="preserve">component was undetermined (−0.05; 95% CrI, −2.01 to 1.92;</w:t>
       </w:r>
       <w:r>
         <w:t xml:space="preserve"> </w:t>
@@ -5832,19 +6145,19 @@
         <w:t xml:space="preserve"> </w:t>
       </w:r>
       <w:r>
-        <w:t xml:space="preserve">= .19); its interval is the prior’s 95% range, because its measurement error exceeds its spread</w:t>
-      </w:r>
-      <w:r>
-        <w:t xml:space="preserve"> </w:t>
-      </w:r>
-      <w:r>
-        <w:t xml:space="preserve">and the model could learn almost nothing about it. Without the measurement-error layer it was −0.64 (95% CrI, −1.51</w:t>
-      </w:r>
-      <w:r>
-        <w:t xml:space="preserve"> </w:t>
-      </w:r>
-      <w:r>
-        <w:t xml:space="preserve">to 0.23). The model converged on its first fit (largest</w:t>
+        <w:t xml:space="preserve">= .19); its interval is the prior’s 95% range,</w:t>
+      </w:r>
+      <w:r>
+        <w:t xml:space="preserve"> </w:t>
+      </w:r>
+      <w:r>
+        <w:t xml:space="preserve">because its measurement error exceeds its spread and the model could learn almost nothing about it. Without the</w:t>
+      </w:r>
+      <w:r>
+        <w:t xml:space="preserve"> </w:t>
+      </w:r>
+      <w:r>
+        <w:t xml:space="preserve">measurement-error layer it was −0.64 (95% CrI, −1.51 to 0.23). The model converged on its first fit (largest</w:t>
       </w:r>
       <w:r>
         <w:t xml:space="preserve"> </w:t>
@@ -5865,31 +6178,37 @@
         <w:t xml:space="preserve"> </w:t>
       </w:r>
       <w:r>
-        <w:t xml:space="preserve">1.001, no divergences), and the observed 24 early</w:t>
-      </w:r>
-      <w:r>
-        <w:t xml:space="preserve"> </w:t>
-      </w:r>
-      <w:r>
-        <w:t xml:space="preserve">renewers fell inside the posterior predictive 95% range of 14 to 37 (eTable 5 in Supplement 1). The Student-t prior</w:t>
-      </w:r>
-      <w:r>
-        <w:t xml:space="preserve"> </w:t>
-      </w:r>
-      <w:r>
-        <w:t xml:space="preserve">gave the same verdicts: regional pull 1.65 (95% CrI, 0.53 to 2.87) and BASIC level 1.63 (0.53 to 2.85). The power</w:t>
-      </w:r>
-      <w:r>
-        <w:t xml:space="preserve"> </w:t>
-      </w:r>
-      <w:r>
-        <w:t xml:space="preserve">analysis gave detection rates of only 17% (pull) and 14% (BASIC level) at a log-odds difference of 0.5, so estimates</w:t>
-      </w:r>
-      <w:r>
-        <w:t xml:space="preserve"> </w:t>
-      </w:r>
-      <w:r>
-        <w:t xml:space="preserve">that pass the test are likely to overstate the true effects;</w:t>
+        <w:t xml:space="preserve">1.001, no divergences), and the observed 24 early renewers fell inside the posterior predictive 95% range</w:t>
+      </w:r>
+      <w:r>
+        <w:t xml:space="preserve"> </w:t>
+      </w:r>
+      <w:r>
+        <w:t xml:space="preserve">of 14 to 37 (eTable 5 in Supplement 1). Under the Student-t prior, which converged on its registered rerun, the pull</w:t>
+      </w:r>
+      <w:r>
+        <w:t xml:space="preserve"> </w:t>
+      </w:r>
+      <w:r>
+        <w:t xml:space="preserve">(1.65; 95% CrI, 0.53 to 2.87) and BASIC-level (1.63; 95% CrI, 0.53 to 2.85) intervals also excluded zero, so no core</w:t>
+      </w:r>
+      <w:r>
+        <w:t xml:space="preserve"> </w:t>
+      </w:r>
+      <w:r>
+        <w:t xml:space="preserve">conclusion differs between priors. The power analysis gave detection rates of only 17% (pull) and 14% (BASIC level)</w:t>
+      </w:r>
+      <w:r>
+        <w:t xml:space="preserve"> </w:t>
+      </w:r>
+      <w:r>
+        <w:t xml:space="preserve">at a log-odds difference of 0.5, so estimates that pass the test are likely to overstate the true</w:t>
+      </w:r>
+      <w:r>
+        <w:t xml:space="preserve"> </w:t>
+      </w:r>
+      <w:r>
+        <w:t xml:space="preserve">effects;</w:t>
       </w:r>
       <w:r>
         <w:t xml:space="preserve">[</w:t>
@@ -5909,13 +6228,7 @@
         <w:t xml:space="preserve"> </w:t>
       </w:r>
       <w:r>
-        <w:t xml:space="preserve">the directions are the result, and</w:t>
-      </w:r>
-      <w:r>
-        <w:t xml:space="preserve"> </w:t>
-      </w:r>
-      <w:r>
-        <w:t xml:space="preserve">coefficients near 1.3 are probably too large.</w:t>
+        <w:t xml:space="preserve">the directions are the result, and coefficients near 1.3 are probably too large.</w:t>
       </w:r>
     </w:p>
     <w:p>
@@ -5935,12 +6248,13 @@
         <w:tblCaption w:val="Table 3. Decision model of early renewal among BASIC-track ACOs (H3)"/>
       </w:tblPr>
       <w:tblGrid>
-        <w:gridCol w:w="1766"/>
-        <w:gridCol w:w="1523"/>
-        <w:gridCol w:w="548"/>
-        <w:gridCol w:w="1035"/>
-        <w:gridCol w:w="1523"/>
-        <w:gridCol w:w="1523"/>
+        <w:gridCol w:w="1652"/>
+        <w:gridCol w:w="1424"/>
+        <w:gridCol w:w="512"/>
+        <w:gridCol w:w="512"/>
+        <w:gridCol w:w="968"/>
+        <w:gridCol w:w="1424"/>
+        <w:gridCol w:w="1424"/>
       </w:tblGrid>
       <w:tr>
         <w:trPr>
@@ -5978,6 +6292,18 @@
               <w:jc w:val="right"/>
             </w:pPr>
             <w:r>
+              <w:t xml:space="preserve">Pr(&gt;0)</w:t>
+            </w:r>
+          </w:p>
+        </w:tc>
+        <w:tc>
+          <w:tcPr/>
+          <w:p>
+            <w:pPr>
+              <w:pStyle w:val="Compact"/>
+              <w:jc w:val="right"/>
+            </w:pPr>
+            <w:r>
               <w:rPr>
                 <w:i/>
                 <w:iCs/>
@@ -6060,6 +6386,18 @@
               <w:jc w:val="right"/>
             </w:pPr>
             <w:r>
+              <w:t xml:space="preserve">0.999</w:t>
+            </w:r>
+          </w:p>
+        </w:tc>
+        <w:tc>
+          <w:tcPr/>
+          <w:p>
+            <w:pPr>
+              <w:pStyle w:val="Compact"/>
+              <w:jc w:val="right"/>
+            </w:pPr>
+            <w:r>
               <w:t xml:space="preserve">.002</w:t>
             </w:r>
           </w:p>
@@ -6138,6 +6476,18 @@
               <w:jc w:val="right"/>
             </w:pPr>
             <w:r>
+              <w:t xml:space="preserve">0.480</w:t>
+            </w:r>
+          </w:p>
+        </w:tc>
+        <w:tc>
+          <w:tcPr/>
+          <w:p>
+            <w:pPr>
+              <w:pStyle w:val="Compact"/>
+              <w:jc w:val="right"/>
+            </w:pPr>
+            <w:r>
               <w:t xml:space="preserve">.19</w:t>
             </w:r>
           </w:p>
@@ -6216,6 +6566,18 @@
               <w:jc w:val="right"/>
             </w:pPr>
             <w:r>
+              <w:t xml:space="preserve">0.998</w:t>
+            </w:r>
+          </w:p>
+        </w:tc>
+        <w:tc>
+          <w:tcPr/>
+          <w:p>
+            <w:pPr>
+              <w:pStyle w:val="Compact"/>
+              <w:jc w:val="right"/>
+            </w:pPr>
+            <w:r>
               <w:t xml:space="preserve">.003</w:t>
             </w:r>
           </w:p>
@@ -6287,6 +6649,18 @@
           <w:p>
             <w:pPr>
               <w:pStyle w:val="Compact"/>
+              <w:jc w:val="right"/>
+            </w:pPr>
+            <w:r>
+              <w:t xml:space="preserve">0.920</w:t>
+            </w:r>
+          </w:p>
+        </w:tc>
+        <w:tc>
+          <w:tcPr/>
+          <w:p>
+            <w:pPr>
+              <w:pStyle w:val="Compact"/>
             </w:pPr>
           </w:p>
         </w:tc>
@@ -6357,6 +6731,18 @@
           <w:p>
             <w:pPr>
               <w:pStyle w:val="Compact"/>
+              <w:jc w:val="right"/>
+            </w:pPr>
+            <w:r>
+              <w:t xml:space="preserve">0.827</w:t>
+            </w:r>
+          </w:p>
+        </w:tc>
+        <w:tc>
+          <w:tcPr/>
+          <w:p>
+            <w:pPr>
+              <w:pStyle w:val="Compact"/>
             </w:pPr>
           </w:p>
         </w:tc>
@@ -6427,6 +6813,18 @@
           <w:p>
             <w:pPr>
               <w:pStyle w:val="Compact"/>
+              <w:jc w:val="right"/>
+            </w:pPr>
+            <w:r>
+              <w:t xml:space="preserve">0.182</w:t>
+            </w:r>
+          </w:p>
+        </w:tc>
+        <w:tc>
+          <w:tcPr/>
+          <w:p>
+            <w:pPr>
+              <w:pStyle w:val="Compact"/>
             </w:pPr>
           </w:p>
         </w:tc>
@@ -6497,6 +6895,18 @@
           <w:p>
             <w:pPr>
               <w:pStyle w:val="Compact"/>
+              <w:jc w:val="right"/>
+            </w:pPr>
+            <w:r>
+              <w:t xml:space="preserve">0.058</w:t>
+            </w:r>
+          </w:p>
+        </w:tc>
+        <w:tc>
+          <w:tcPr/>
+          <w:p>
+            <w:pPr>
+              <w:pStyle w:val="Compact"/>
             </w:pPr>
           </w:p>
         </w:tc>
@@ -6567,6 +6977,18 @@
           <w:p>
             <w:pPr>
               <w:pStyle w:val="Compact"/>
+              <w:jc w:val="right"/>
+            </w:pPr>
+            <w:r>
+              <w:t xml:space="preserve">0.089</w:t>
+            </w:r>
+          </w:p>
+        </w:tc>
+        <w:tc>
+          <w:tcPr/>
+          <w:p>
+            <w:pPr>
+              <w:pStyle w:val="Compact"/>
             </w:pPr>
           </w:p>
         </w:tc>
@@ -6613,7 +7035,27 @@
         <w:pStyle w:val="BodyText"/>
       </w:pPr>
       <w:r>
-        <w:t xml:space="preserve">Abbreviations: CrI, credible interval; OR, odds ratio. Bayesian logistic regression of early renewal among 206 BASIC-track ACOs (24 early renewers; 3 early renewers and 27 stayers excluded for a missing predictor). Continuous predictors are scaled by 2 SD, so coefficients are log-odds differences per 2 SD; the BASIC level compares levels C-E with A-B. Core predictors (bold) are tested by direct simulation under the reduced model (10,000 simulated datasets); adjustment factors are estimates only. The own-spending component enters with a measurement-error model (σ = 4.38 pp). The Student-t column is the registered prior sensitivity analysis; the maximum-likelihood ORs are the conventional counterpart, reported only.</w:t>
+        <w:t xml:space="preserve">Abbreviations: CrI, credible interval; OR, odds ratio; Pr(&gt;0), posterior probability that the coefficient is positive. Bayesian logistic regression of early renewal among 206 BASIC-track ACOs (24 early renewers; 3 early renewers and 27 stayers excluded for a missing predictor). Continuous predictors are centered and divided by 2 SD, so their coefficients are log-odds differences per 2 SD; binary predictors are centered, so theirs are per category (the BASIC level compares levels C-E with A-B). Core predictors (bold) are tested by direct simulation under the reduced model (10,000 simulated datasets); adjustment factors are estimates only. The own-spending component enters with a measurement-error model (</w:t>
+      </w:r>
+      <m:oMath>
+        <m:sSub>
+          <m:e>
+            <m:r>
+              <m:t>σ</m:t>
+            </m:r>
+          </m:e>
+          <m:sub>
+            <m:r>
+              <m:t>v</m:t>
+            </m:r>
+          </m:sub>
+        </m:sSub>
+      </m:oMath>
+      <w:r>
+        <w:t xml:space="preserve"> </w:t>
+      </w:r>
+      <w:r>
+        <w:t xml:space="preserve">= 4.38 pp). The Student-t column is the registered prior sensitivity analysis; the maximum-likelihood ORs are the conventional counterpart, reported only.</w:t>
       </w:r>
     </w:p>
     <w:p>
@@ -6746,37 +7188,49 @@
         <w:t xml:space="preserve"> </w:t>
       </w:r>
       <w:r>
-        <w:t xml:space="preserve">the equivalence condition did not hold: the scaled pre-trend bound, 2.41 years times 0.048, was 0.115 log points,</w:t>
-      </w:r>
-      <w:r>
-        <w:t xml:space="preserve"> </w:t>
-      </w:r>
-      <w:r>
-        <w:t xml:space="preserve">far above the H4 estimate of 0.004. With a single pre-period, that threshold was a property of the design, so for</w:t>
-      </w:r>
-      <w:r>
-        <w:t xml:space="preserve"> </w:t>
-      </w:r>
-      <w:r>
-        <w:t xml:space="preserve">any estimate near zero the condition could only fail. H4 is therefore reported as a difference in spending changes</w:t>
-      </w:r>
-      <w:r>
-        <w:t xml:space="preserve"> </w:t>
-      </w:r>
-      <w:r>
-        <w:t xml:space="preserve">that cannot be told apart from a continuation of a pre-period difference in trends. Under parallel trends, the</w:t>
-      </w:r>
-      <w:r>
-        <w:t xml:space="preserve"> </w:t>
-      </w:r>
-      <w:r>
-        <w:t xml:space="preserve">interval rules out a drop in spending growth of more than about 4% or a rise of more than about 2.5%; the</w:t>
-      </w:r>
-      <w:r>
-        <w:t xml:space="preserve"> </w:t>
-      </w:r>
-      <w:r>
-        <w:t xml:space="preserve">trend-adjusted interval (−12.0% to 2.7%) is too wide to inform.</w:t>
+        <w:t xml:space="preserve">the equivalence condition did not hold: the scaled pre-trend bound, 2.41 years times 4.8 log points, was 11.5 log</w:t>
+      </w:r>
+      <w:r>
+        <w:t xml:space="preserve"> </w:t>
+      </w:r>
+      <w:r>
+        <w:t xml:space="preserve">points (about 12%), far above the absolute H4 estimate of 0.4 log points. The condition could have held only for an</w:t>
+      </w:r>
+      <w:r>
+        <w:t xml:space="preserve"> </w:t>
+      </w:r>
+      <w:r>
+        <w:t xml:space="preserve">estimate above about 12% in absolute value, 3 times the MDE, so with one pre-period it could not support reading an</w:t>
+      </w:r>
+      <w:r>
+        <w:t xml:space="preserve"> </w:t>
+      </w:r>
+      <w:r>
+        <w:t xml:space="preserve">estimate of plausible size as an effect, and a trend difference of the size the pre-period allows could hide an</w:t>
+      </w:r>
+      <w:r>
+        <w:t xml:space="preserve"> </w:t>
+      </w:r>
+      <w:r>
+        <w:t xml:space="preserve">effect in either direction. H4 is therefore reported as a difference in spending changes that cannot be told apart</w:t>
+      </w:r>
+      <w:r>
+        <w:t xml:space="preserve"> </w:t>
+      </w:r>
+      <w:r>
+        <w:t xml:space="preserve">from a continuation of a pre-period difference in trends. Under parallel trends, the interval rules out a drop in</w:t>
+      </w:r>
+      <w:r>
+        <w:t xml:space="preserve"> </w:t>
+      </w:r>
+      <w:r>
+        <w:t xml:space="preserve">spending growth of more than about 4% or a rise of more than about 2.5%; the trend-adjusted interval (−12.0% to</w:t>
+      </w:r>
+      <w:r>
+        <w:t xml:space="preserve"> </w:t>
+      </w:r>
+      <w:r>
+        <w:t xml:space="preserve">2.7%) is too wide to inform.</w:t>
       </w:r>
     </w:p>
     <w:p>
@@ -6784,19 +7238,19 @@
         <w:pStyle w:val="BodyText"/>
       </w:pPr>
       <w:r>
-        <w:t xml:space="preserve">Attrition from the comparison group was uneven: by PY2024, 115 of 277 stayers (42%) had left the comparison, to</w:t>
-      </w:r>
-      <w:r>
-        <w:t xml:space="preserve"> </w:t>
-      </w:r>
-      <w:r>
-        <w:t xml:space="preserve">exits or later renewals, against 4 of 29 early renewers (14%) (eTable 8 in Supplement 1). The balanced panel of ACOs</w:t>
-      </w:r>
-      <w:r>
-        <w:t xml:space="preserve"> </w:t>
-      </w:r>
-      <w:r>
-        <w:t xml:space="preserve">with all 5 years gave −1.6% (95% CrI, −5.6% to 1.6%;</w:t>
+        <w:t xml:space="preserve">Attrition was uneven: by PY2024, 115 of 277 stayers (42%) had left the spending panel (72 left the program, 42 renewed</w:t>
+      </w:r>
+      <w:r>
+        <w:t xml:space="preserve"> </w:t>
+      </w:r>
+      <w:r>
+        <w:t xml:space="preserve">and 1 had no spending value), against 4 of 29 early renewers (14%) (eTable 8 in Supplement 1). The balanced panel of</w:t>
+      </w:r>
+      <w:r>
+        <w:t xml:space="preserve"> </w:t>
+      </w:r>
+      <w:r>
+        <w:t xml:space="preserve">ACOs with all 5 years gave −1.6% (95% CrI, −5.6% to 1.6%;</w:t>
       </w:r>
       <w:r>
         <w:t xml:space="preserve"> </w:t>
@@ -7429,7 +7883,7 @@
         <w:pStyle w:val="BodyText"/>
       </w:pPr>
       <w:r>
-        <w:t xml:space="preserve">Abbreviations: CrI, credible interval; NA, not available (the propensity-weighted estimate has a permutation P value but no interval); PY, performance year. The outcome is the change in log per-capita spending from PY2020-PY2021 to PY2022-PY2024, shown as a percent difference in spending growth, early renewers minus ACOs not yet renewed. A stayer’s years after it renewed into a 2023 or 2024 agreement are excluded. Equivalence condition: the pre-trend bound scaled to the distance between period midpoints (2.41 years) is 0.115 log points, above the absolute H4 estimate of 0.004, so the condition does not hold and H4 is not read as an effect.</w:t>
+        <w:t xml:space="preserve">Abbreviations: CrI, credible interval; NA, not available (the propensity-weighted estimate has a permutation P value but no interval; its largest weight is 0.83); PY, performance year. The outcome is the change in log per-capita spending from PY2020-PY2021 to PY2022-PY2024, shown as a percent difference in spending growth, early renewers minus ACOs not yet renewed. A stayer’s years after it renewed into a 2023 or 2024 agreement are excluded. Equivalence condition: the pre-trend bound scaled to the distance between period midpoints (2.41 years) is 11.5 log points, above the absolute H4 estimate of 0.4 log points (1 log point = 0.01 in log spending, about 1%), so the condition does not hold and H4 is not read as an effect. The two-way fixed-effects model has one more ACO: the stayer with no post-period spending value keeps its pre-period years.</w:t>
       </w:r>
     </w:p>
     <w:p>
@@ -7439,9 +7893,9 @@
       <w:r>
         <w:drawing>
           <wp:inline>
-            <wp:extent cx="5334000" cy="2365887"/>
+            <wp:extent cx="5334000" cy="2103848"/>
             <wp:effectExtent b="0" l="0" r="0" t="0"/>
-            <wp:docPr descr="Figure 4. Spending after early renewal. A, Event study from the conventional 2-way fixed-effects model, relative to PY2021, with 95% CIs clustered by ACO. B, The registered H4 estimate and the robustness and conventional estimates, as the percent difference in spending growth with 95% intervals (the propensity-weighted estimate has no interval). TWFE, 2-way fixed effects." title="" id="35" name="Picture"/>
+            <wp:docPr descr="Figure 4. Spending after early renewal. A, Event study from the conventional 2-way fixed-effects model, in log points relative to PY2021, with 95% CIs clustered by ACO. B, The registered H4 estimate and the robustness and conventional estimates, as the percent difference in spending growth with 95% intervals (the propensity-weighted estimate has no interval); sample sizes are in Table 4. TWFE, 2-way fixed effects." title="" id="35" name="Picture"/>
             <a:graphic>
               <a:graphicData uri="http://schemas.openxmlformats.org/drawingml/2006/picture">
                 <pic:pic>
@@ -7460,7 +7914,7 @@
                   <pic:spPr bwMode="auto">
                     <a:xfrm>
                       <a:off x="0" y="0"/>
-                      <a:ext cx="5334000" cy="2365887"/>
+                      <a:ext cx="5334000" cy="2103848"/>
                     </a:xfrm>
                     <a:prstGeom prst="rect">
                       <a:avLst/>
@@ -7494,7 +7948,7 @@
         <w:t xml:space="preserve"> </w:t>
       </w:r>
       <w:r>
-        <w:t xml:space="preserve">Spending after early renewal. A, Event study from the conventional 2-way fixed-effects model, relative to PY2021, with 95% CIs clustered by ACO. B, The registered H4 estimate and the robustness and conventional estimates, as the percent difference in spending growth with 95% intervals (the propensity-weighted estimate has no interval). TWFE, 2-way fixed effects.</w:t>
+        <w:t xml:space="preserve">Spending after early renewal. A, Event study from the conventional 2-way fixed-effects model, in log points relative to PY2021, with 95% CIs clustered by ACO. B, The registered H4 estimate and the robustness and conventional estimates, as the percent difference in spending growth with 95% intervals (the propensity-weighted estimate has no interval); sample sizes are in Table 4. TWFE, 2-way fixed effects.</w:t>
       </w:r>
     </w:p>
     <w:bookmarkEnd w:id="37"/>
@@ -7552,37 +8006,113 @@
         <w:t xml:space="preserve"> </w:t>
       </w:r>
       <w:r>
-        <w:t xml:space="preserve">(eTable 3 in Supplement 1), but its size depended on the estimator: the difference in medians was 2.8 points and the</w:t>
-      </w:r>
-      <w:r>
-        <w:t xml:space="preserve"> </w:t>
-      </w:r>
-      <w:r>
-        <w:t xml:space="preserve">cohort-adjusted Bayesian regression 2.1 (95% CrI, 0.5 to 3.8), while without the case-mix adjustment of regional</w:t>
-      </w:r>
-      <w:r>
-        <w:t xml:space="preserve"> </w:t>
-      </w:r>
-      <w:r>
-        <w:t xml:space="preserve">spending the difference was 6.9. In H3 the BASIC-level interval stayed above zero in every check, while the pull</w:t>
-      </w:r>
-      <w:r>
-        <w:t xml:space="preserve"> </w:t>
-      </w:r>
-      <w:r>
-        <w:t xml:space="preserve">interval reached zero with the 2020 cohort alone (1.15; 95% CrI, −0.02 to 2.39) and with unadjusted county spending</w:t>
-      </w:r>
-      <w:r>
-        <w:t xml:space="preserve"> </w:t>
-      </w:r>
-      <w:r>
-        <w:t xml:space="preserve">(0.75; 95% CrI, −0.02 to 1.56) (eTable 4 in Supplement 1). The 28 ACOs that left after PY2021 had the lowest PY2020</w:t>
-      </w:r>
-      <w:r>
-        <w:t xml:space="preserve"> </w:t>
-      </w:r>
-      <w:r>
-        <w:t xml:space="preserve">savings rates (mean 2.7 points, against 6.4 for early renewers and 4.6 for stayers) (Table 1).</w:t>
+        <w:t xml:space="preserve">(eTable 3 in Supplement 1), but its size depended on the estimator: the difference in medians was 2.8 points, and the</w:t>
+      </w:r>
+      <w:r>
+        <w:t xml:space="preserve"> </w:t>
+      </w:r>
+      <w:r>
+        <w:t xml:space="preserve">robust (Student-t) regressions gave 2.1 (95% CrI, 0.5 to 3.8) with cohort and 2.2 (95% CrI, 0.7 to 3.8) with track,</w:t>
+      </w:r>
+      <w:r>
+        <w:t xml:space="preserve"> </w:t>
+      </w:r>
+      <w:r>
+        <w:t xml:space="preserve">level and size added, below the MDE of 2.5, so a few large values among early renewers carry part of the difference</w:t>
+      </w:r>
+      <w:r>
+        <w:t xml:space="preserve"> </w:t>
+      </w:r>
+      <w:r>
+        <w:t xml:space="preserve">in means; without the case-mix adjustment of regional spending the difference was 6.9. H2a and H1 kept their</w:t>
+      </w:r>
+      <w:r>
+        <w:t xml:space="preserve"> </w:t>
+      </w:r>
+      <w:r>
+        <w:t xml:space="preserve">direction but were weaker by medians (H2a,</w:t>
+      </w:r>
+      <w:r>
+        <w:t xml:space="preserve"> </w:t>
+      </w:r>
+      <w:r>
+        <w:rPr>
+          <w:i/>
+          <w:iCs/>
+        </w:rPr>
+        <w:t xml:space="preserve">P</w:t>
+      </w:r>
+      <w:r>
+        <w:t xml:space="preserve"> </w:t>
+      </w:r>
+      <w:r>
+        <w:t xml:space="preserve">= .09; H1,</w:t>
+      </w:r>
+      <w:r>
+        <w:t xml:space="preserve"> </w:t>
+      </w:r>
+      <w:r>
+        <w:rPr>
+          <w:i/>
+          <w:iCs/>
+        </w:rPr>
+        <w:t xml:space="preserve">P</w:t>
+      </w:r>
+      <w:r>
+        <w:t xml:space="preserve"> </w:t>
+      </w:r>
+      <w:r>
+        <w:t xml:space="preserve">= .06) and in the adjusted regressions, whose intervals</w:t>
+      </w:r>
+      <w:r>
+        <w:t xml:space="preserve"> </w:t>
+      </w:r>
+      <w:r>
+        <w:t xml:space="preserve">reached zero (H2a, −2.6 to 0.02; H1, −0.1 to 2.6). In H3 the BASIC-level interval stayed above zero in every check,</w:t>
+      </w:r>
+      <w:r>
+        <w:t xml:space="preserve"> </w:t>
+      </w:r>
+      <w:r>
+        <w:t xml:space="preserve">while the pull interval reached zero with the 2020 cohort alone (1.15; 95% CrI, −0.02 to 2.39) and with unadjusted</w:t>
+      </w:r>
+      <w:r>
+        <w:t xml:space="preserve"> </w:t>
+      </w:r>
+      <w:r>
+        <w:t xml:space="preserve">county spending (0.75; 95% CrI, −0.02 to 1.56) (eTable 4 in Supplement 1).</w:t>
+      </w:r>
+    </w:p>
+    <w:p>
+      <w:pPr>
+        <w:pStyle w:val="BodyText"/>
+      </w:pPr>
+      <w:r>
+        <w:t xml:space="preserve">Among the exploratory analyses (eTables 9-11 in Supplement 1), the 28 ACOs that left after PY2021 had the lowest</w:t>
+      </w:r>
+      <w:r>
+        <w:t xml:space="preserve"> </w:t>
+      </w:r>
+      <w:r>
+        <w:t xml:space="preserve">PY2020 savings rates (mean 2.7 points, against 6.4 for early renewers and 4.6 for stayers) and, for the 20 with the</w:t>
+      </w:r>
+      <w:r>
+        <w:t xml:space="preserve"> </w:t>
+      </w:r>
+      <w:r>
+        <w:t xml:space="preserve">variable, a mean regional pull similar to early renewers’ (4.8 vs 5.0; medians 2.0 vs 3.5) (Table 1). The 2 early</w:t>
+      </w:r>
+      <w:r>
+        <w:t xml:space="preserve"> </w:t>
+      </w:r>
+      <w:r>
+        <w:t xml:space="preserve">renewers already in ENHANCED, whose renewal could not raise the sharing rate, fell between the 26th and 68th</w:t>
+      </w:r>
+      <w:r>
+        <w:t xml:space="preserve"> </w:t>
+      </w:r>
+      <w:r>
+        <w:t xml:space="preserve">percentiles of stayers on every variable.</w:t>
       </w:r>
     </w:p>
     <w:bookmarkEnd w:id="38"/>
@@ -7601,19 +8131,19 @@
         <w:pStyle w:val="FirstParagraph"/>
       </w:pPr>
       <w:r>
-        <w:t xml:space="preserve">In this preregistered study of the 2019 and 2020 MSSP cohorts, the ACOs that ended their agreements early to reset</w:t>
-      </w:r>
-      <w:r>
-        <w:t xml:space="preserve"> </w:t>
-      </w:r>
-      <w:r>
-        <w:t xml:space="preserve">their benchmarks were those whose regions spent more relative to their current benchmarks, and, among BASIC-track</w:t>
-      </w:r>
-      <w:r>
-        <w:t xml:space="preserve"> </w:t>
-      </w:r>
-      <w:r>
-        <w:t xml:space="preserve">ACOs, those already at the higher, two-sided levels. They were also beating their benchmarks by more than ACOs that</w:t>
+        <w:t xml:space="preserve">In this preregistered study of the 2019 and 2020 MSSP cohorts, ACOs that ended their agreements early to begin new</w:t>
+      </w:r>
+      <w:r>
+        <w:t xml:space="preserve"> </w:t>
+      </w:r>
+      <w:r>
+        <w:t xml:space="preserve">ones on average had regions that spent more relative to their current benchmarks, and, among BASIC-track ACOs, were</w:t>
+      </w:r>
+      <w:r>
+        <w:t xml:space="preserve"> </w:t>
+      </w:r>
+      <w:r>
+        <w:t xml:space="preserve">more often already at the higher, two-sided levels. They were also beating their benchmarks by more than ACOs that</w:t>
       </w:r>
       <w:r>
         <w:t xml:space="preserve"> </w:t>
@@ -7654,19 +8184,19 @@
         <w:pStyle w:val="FirstParagraph"/>
       </w:pPr>
       <w:r>
-        <w:t xml:space="preserve">The primary result extends to a new decision the pattern that ACOs time their participation by the benchmark</w:t>
-      </w:r>
-      <w:r>
-        <w:t xml:space="preserve"> </w:t>
-      </w:r>
-      <w:r>
-        <w:t xml:space="preserve">formula. Participation shifted toward providers whose spending was low relative to their region once regional</w:t>
-      </w:r>
-      <w:r>
-        <w:t xml:space="preserve"> </w:t>
-      </w:r>
-      <w:r>
-        <w:t xml:space="preserve">spending entered benchmarks,</w:t>
+        <w:t xml:space="preserve">The primary result extends to a new decision the pattern that participation follows the benchmark formula.</w:t>
+      </w:r>
+      <w:r>
+        <w:t xml:space="preserve"> </w:t>
+      </w:r>
+      <w:r>
+        <w:t xml:space="preserve">Participation shifted toward providers whose spending was low relative to their region once regional spending entered</w:t>
+      </w:r>
+      <w:r>
+        <w:t xml:space="preserve"> </w:t>
+      </w:r>
+      <w:r>
+        <w:t xml:space="preserve">benchmarks,</w:t>
       </w:r>
       <w:r>
         <w:t xml:space="preserve">[</w:t>
@@ -7706,19 +8236,25 @@
         <w:t xml:space="preserve"> </w:t>
       </w:r>
       <w:r>
-        <w:t xml:space="preserve">Here the choice is when to reset rather than whether to join or leave, and the ACOs that reset early were those with</w:t>
-      </w:r>
-      <w:r>
-        <w:t xml:space="preserve"> </w:t>
-      </w:r>
-      <w:r>
-        <w:t xml:space="preserve">the most room under their regions’ spending. The finding that early renewers were savers fits reports that ACOs</w:t>
-      </w:r>
-      <w:r>
-        <w:t xml:space="preserve"> </w:t>
-      </w:r>
-      <w:r>
-        <w:t xml:space="preserve">earning bonuses survived longer in the program</w:t>
+        <w:t xml:space="preserve">Here the choice is</w:t>
+      </w:r>
+      <w:r>
+        <w:t xml:space="preserve"> </w:t>
+      </w:r>
+      <w:r>
+        <w:t xml:space="preserve">when to reset rather than whether to join or leave, and early renewers had, on average, more room under their regions’</w:t>
+      </w:r>
+      <w:r>
+        <w:t xml:space="preserve"> </w:t>
+      </w:r>
+      <w:r>
+        <w:t xml:space="preserve">spending. The finding that early renewers were savers fits reports that ACOs earning bonuses survived longer in the</w:t>
+      </w:r>
+      <w:r>
+        <w:t xml:space="preserve"> </w:t>
+      </w:r>
+      <w:r>
+        <w:t xml:space="preserve">program</w:t>
       </w:r>
       <w:r>
         <w:t xml:space="preserve">[</w:t>
@@ -7738,13 +8274,13 @@
         <w:t xml:space="preserve"> </w:t>
       </w:r>
       <w:r>
-        <w:t xml:space="preserve">and, with borderline precision, that ACOs that had</w:t>
-      </w:r>
-      <w:r>
-        <w:t xml:space="preserve"> </w:t>
-      </w:r>
-      <w:r>
-        <w:t xml:space="preserve">achieved savings were more likely to stay after the 2019 rules,</w:t>
+        <w:t xml:space="preserve">and, with borderline precision, that ACOs that had achieved savings were more likely to stay</w:t>
+      </w:r>
+      <w:r>
+        <w:t xml:space="preserve"> </w:t>
+      </w:r>
+      <w:r>
+        <w:t xml:space="preserve">after the 2019 rules,</w:t>
       </w:r>
       <w:r>
         <w:t xml:space="preserve">[</w:t>
@@ -7764,31 +8300,25 @@
         <w:t xml:space="preserve"> </w:t>
       </w:r>
       <w:r>
-        <w:t xml:space="preserve">but the same success meant that the</w:t>
-      </w:r>
-      <w:r>
-        <w:t xml:space="preserve"> </w:t>
-      </w:r>
-      <w:r>
-        <w:t xml:space="preserve">own-spending part of a reset would have cut their benchmarks, so the simple account that ACOs reset to get a higher</w:t>
-      </w:r>
-      <w:r>
-        <w:t xml:space="preserve"> </w:t>
-      </w:r>
-      <w:r>
-        <w:t xml:space="preserve">benchmark does not describe them on average. That the size of the regional difference doubled without case-mix</w:t>
-      </w:r>
-      <w:r>
-        <w:t xml:space="preserve"> </w:t>
-      </w:r>
-      <w:r>
-        <w:t xml:space="preserve">adjustment is consistent with evidence that comparisons of ACOs with their regions depend heavily on risk</w:t>
-      </w:r>
-      <w:r>
-        <w:t xml:space="preserve"> </w:t>
-      </w:r>
-      <w:r>
-        <w:t xml:space="preserve">adjustment.</w:t>
+        <w:t xml:space="preserve">but the same success meant that the own-spending part of a reset would have cut</w:t>
+      </w:r>
+      <w:r>
+        <w:t xml:space="preserve"> </w:t>
+      </w:r>
+      <w:r>
+        <w:t xml:space="preserve">their benchmarks, so the simple account that ACOs reset to get a higher benchmark does not describe them on average.</w:t>
+      </w:r>
+      <w:r>
+        <w:t xml:space="preserve"> </w:t>
+      </w:r>
+      <w:r>
+        <w:t xml:space="preserve">That the size of the regional difference doubled without case-mix adjustment is consistent with evidence that</w:t>
+      </w:r>
+      <w:r>
+        <w:t xml:space="preserve"> </w:t>
+      </w:r>
+      <w:r>
+        <w:t xml:space="preserve">comparisons of ACOs with their regions depend heavily on risk adjustment.</w:t>
       </w:r>
       <w:r>
         <w:t xml:space="preserve">[</w:t>
@@ -7808,7 +8338,13 @@
         <w:t xml:space="preserve"> </w:t>
       </w:r>
       <w:r>
-        <w:t xml:space="preserve">The concern that rebasing rewards higher spending before a new agreement</w:t>
+        <w:t xml:space="preserve">The concern that rebasing rewards</w:t>
+      </w:r>
+      <w:r>
+        <w:t xml:space="preserve"> </w:t>
+      </w:r>
+      <w:r>
+        <w:t xml:space="preserve">higher spending before a new agreement</w:t>
       </w:r>
       <w:r>
         <w:t xml:space="preserve">[</w:t>
@@ -7828,19 +8364,13 @@
         <w:t xml:space="preserve"> </w:t>
       </w:r>
       <w:r>
-        <w:t xml:space="preserve">could be</w:t>
-      </w:r>
-      <w:r>
-        <w:t xml:space="preserve"> </w:t>
-      </w:r>
-      <w:r>
-        <w:t xml:space="preserve">neither confirmed nor excluded here, and the costs to Medicare of early renewal, which earlier work estimated for</w:t>
-      </w:r>
-      <w:r>
-        <w:t xml:space="preserve"> </w:t>
-      </w:r>
-      <w:r>
-        <w:t xml:space="preserve">departures,</w:t>
+        <w:t xml:space="preserve">could be neither confirmed nor excluded here, and the costs to</w:t>
+      </w:r>
+      <w:r>
+        <w:t xml:space="preserve"> </w:t>
+      </w:r>
+      <w:r>
+        <w:t xml:space="preserve">Medicare of early renewal, which earlier work estimated for departures,</w:t>
       </w:r>
       <w:r>
         <w:t xml:space="preserve">[</w:t>
@@ -7880,19 +8410,37 @@
         <w:t xml:space="preserve"> </w:t>
       </w:r>
       <w:r>
-        <w:t xml:space="preserve">ENHANCED. ACOs already bearing two-sided risk at Level E faced a short step to ENHANCED’s 75% sharing rate. A high</w:t>
-      </w:r>
-      <w:r>
-        <w:t xml:space="preserve"> </w:t>
-      </w:r>
-      <w:r>
-        <w:t xml:space="preserve">regional pull is also a plausible reason to want that rate, because an ACO with room under its region’s spending</w:t>
-      </w:r>
-      <w:r>
-        <w:t xml:space="preserve"> </w:t>
-      </w:r>
-      <w:r>
-        <w:t xml:space="preserve">expects larger savings to share. No test here can rule either motive in or out.</w:t>
+        <w:t xml:space="preserve">ENHANCED, and no stayer did. ACOs already bearing two-sided risk at Level E faced a short step to ENHANCED’s 75%</w:t>
+      </w:r>
+      <w:r>
+        <w:t xml:space="preserve"> </w:t>
+      </w:r>
+      <w:r>
+        <w:t xml:space="preserve">sharing rate. Because ACOs partly choose their BASIC level, the association may also reflect an appetite for risk</w:t>
+      </w:r>
+      <w:r>
+        <w:t xml:space="preserve"> </w:t>
+      </w:r>
+      <w:r>
+        <w:t xml:space="preserve">rather than only proximity to ENHANCED. A high regional pull is also a plausible reason to want the higher rate,</w:t>
+      </w:r>
+      <w:r>
+        <w:t xml:space="preserve"> </w:t>
+      </w:r>
+      <w:r>
+        <w:t xml:space="preserve">because an ACO with room under its region’s spending may expect larger savings to share. The 2 early renewers</w:t>
+      </w:r>
+      <w:r>
+        <w:t xml:space="preserve"> </w:t>
+      </w:r>
+      <w:r>
+        <w:t xml:space="preserve">already in ENHANCED, for whom only the reset could change, looked like typical stayers on every variable, but 2 ACOs</w:t>
+      </w:r>
+      <w:r>
+        <w:t xml:space="preserve"> </w:t>
+      </w:r>
+      <w:r>
+        <w:t xml:space="preserve">cannot separate the motives. No test here can rule either motive in or out.</w:t>
       </w:r>
     </w:p>
     <w:bookmarkEnd w:id="40"/>
@@ -7916,37 +8464,37 @@
         <w:t xml:space="preserve"> </w:t>
       </w:r>
       <w:r>
-        <w:t xml:space="preserve">that used it were positioned to gain from the regional adjustment and the higher sharing rate rather than from a</w:t>
-      </w:r>
-      <w:r>
-        <w:t xml:space="preserve"> </w:t>
-      </w:r>
-      <w:r>
-        <w:t xml:space="preserve">higher benchmark overall. That is selection into an option the program created; it is not evidence that renewing</w:t>
-      </w:r>
-      <w:r>
-        <w:t xml:space="preserve"> </w:t>
-      </w:r>
-      <w:r>
-        <w:t xml:space="preserve">changed spending. The rules have since changed. For agreement periods beginning January 1, 2024 or later, an ACO that</w:t>
-      </w:r>
-      <w:r>
-        <w:t xml:space="preserve"> </w:t>
-      </w:r>
-      <w:r>
-        <w:t xml:space="preserve">saved in its benchmark years can receive a prior savings adjustment, and its benchmark gets the higher of that</w:t>
-      </w:r>
-      <w:r>
-        <w:t xml:space="preserve"> </w:t>
-      </w:r>
-      <w:r>
-        <w:t xml:space="preserve">adjustment and the regional adjustment; negative regional adjustments are partly offset; and the annual update blends</w:t>
-      </w:r>
-      <w:r>
-        <w:t xml:space="preserve"> </w:t>
-      </w:r>
-      <w:r>
-        <w:t xml:space="preserve">in a fixed projected trend.</w:t>
+        <w:t xml:space="preserve">that used it were, by the approximation, positioned to gain from the regional adjustment rather than from a higher</w:t>
+      </w:r>
+      <w:r>
+        <w:t xml:space="preserve"> </w:t>
+      </w:r>
+      <w:r>
+        <w:t xml:space="preserve">benchmark overall, with a higher sharing rate available to almost all of them. That is selection into an option the</w:t>
+      </w:r>
+      <w:r>
+        <w:t xml:space="preserve"> </w:t>
+      </w:r>
+      <w:r>
+        <w:t xml:space="preserve">program created; it is not evidence that renewing changed spending. The rules have since changed. For agreement</w:t>
+      </w:r>
+      <w:r>
+        <w:t xml:space="preserve"> </w:t>
+      </w:r>
+      <w:r>
+        <w:t xml:space="preserve">periods beginning January 1, 2024 or later, an ACO that saved in its benchmark years can receive a prior savings</w:t>
+      </w:r>
+      <w:r>
+        <w:t xml:space="preserve"> </w:t>
+      </w:r>
+      <w:r>
+        <w:t xml:space="preserve">adjustment, and its benchmark gets the higher of that adjustment and the regional adjustment; negative regional</w:t>
+      </w:r>
+      <w:r>
+        <w:t xml:space="preserve"> </w:t>
+      </w:r>
+      <w:r>
+        <w:t xml:space="preserve">adjustments are partly offset; and the annual update blends in a fixed projected trend.</w:t>
       </w:r>
       <w:r>
         <w:t xml:space="preserve">[</w:t>
@@ -7966,25 +8514,31 @@
         <w:t xml:space="preserve"> </w:t>
       </w:r>
       <w:r>
-        <w:t xml:space="preserve">Under these rules a reset costs an ACO that has been beating its benchmark less,</w:t>
-      </w:r>
-      <w:r>
-        <w:t xml:space="preserve"> </w:t>
-      </w:r>
-      <w:r>
-        <w:t xml:space="preserve">so the incentive to renew early, and which ACOs do so, may differ. Two questions remain open: what early renewal cost</w:t>
-      </w:r>
-      <w:r>
-        <w:t xml:space="preserve"> </w:t>
-      </w:r>
-      <w:r>
-        <w:t xml:space="preserve">Medicare, and how much of the choice reflected the sharing rate rather than the benchmark, which a period in which</w:t>
-      </w:r>
-      <w:r>
-        <w:t xml:space="preserve"> </w:t>
-      </w:r>
-      <w:r>
-        <w:t xml:space="preserve">ACOs could move to ENHANCED without resetting would separate.</w:t>
+        <w:t xml:space="preserve">Under these rules</w:t>
+      </w:r>
+      <w:r>
+        <w:t xml:space="preserve"> </w:t>
+      </w:r>
+      <w:r>
+        <w:t xml:space="preserve">a reset costs an ACO that has been beating its benchmark less, so the incentive to renew early, and which ACOs do so,</w:t>
+      </w:r>
+      <w:r>
+        <w:t xml:space="preserve"> </w:t>
+      </w:r>
+      <w:r>
+        <w:t xml:space="preserve">may differ. Two questions remain open: what early renewal cost Medicare, and how much of the choice reflected the</w:t>
+      </w:r>
+      <w:r>
+        <w:t xml:space="preserve"> </w:t>
+      </w:r>
+      <w:r>
+        <w:t xml:space="preserve">sharing rate rather than the benchmark, which a period in which ACOs could move to ENHANCED without resetting would</w:t>
+      </w:r>
+      <w:r>
+        <w:t xml:space="preserve"> </w:t>
+      </w:r>
+      <w:r>
+        <w:t xml:space="preserve">separate.</w:t>
       </w:r>
     </w:p>
     <w:bookmarkEnd w:id="41"/>
@@ -8020,111 +8574,97 @@
         <w:t xml:space="preserve"> </w:t>
       </w:r>
       <w:r>
-        <w:t xml:space="preserve">been relative to its region and carries a coding-intensity term.</w:t>
-      </w:r>
-      <w:r>
-        <w:t xml:space="preserve">[</w:t>
-      </w:r>
-      <w:hyperlink w:anchor="ref-markovitz2019risk">
-        <w:r>
-          <w:rPr>
-            <w:rStyle w:val="Hyperlink"/>
-          </w:rPr>
-          <w:t xml:space="preserve">8</w:t>
-        </w:r>
-      </w:hyperlink>
-      <w:r>
-        <w:t xml:space="preserve">]</w:t>
-      </w:r>
-      <w:r>
-        <w:t xml:space="preserve"> </w:t>
-      </w:r>
-      <w:r>
-        <w:t xml:space="preserve">The case-mix adjustment has no</w:t>
-      </w:r>
-      <w:r>
-        <w:t xml:space="preserve"> </w:t>
-      </w:r>
-      <w:r>
-        <w:t xml:space="preserve">published counterpart to validate it. Second, the expected gain is an approximation; validation bounds the error in</w:t>
-      </w:r>
-      <w:r>
-        <w:t xml:space="preserve"> </w:t>
-      </w:r>
-      <w:r>
-        <w:t xml:space="preserve">benchmark levels, but the own-spending component’s estimated error exceeds its spread, so H2a and the total gain are</w:t>
-      </w:r>
-      <w:r>
-        <w:t xml:space="preserve"> </w:t>
-      </w:r>
-      <w:r>
-        <w:t xml:space="preserve">weak evidence for any single ACO, and the regional part could not be checked. Third, with 29 early renewers, 24 in the</w:t>
-      </w:r>
-      <w:r>
-        <w:t xml:space="preserve"> </w:t>
-      </w:r>
-      <w:r>
-        <w:t xml:space="preserve">decision model, H3 was underpowered and its supported coefficients are probably overestimates. Fourth, exclusions</w:t>
-      </w:r>
-      <w:r>
-        <w:t xml:space="preserve"> </w:t>
-      </w:r>
-      <w:r>
-        <w:t xml:space="preserve">exceeded the plan’s 10% line in both groups, all from suppressed ESRD counts, and the excluded ACOs were smaller, so</w:t>
-      </w:r>
-      <w:r>
-        <w:t xml:space="preserve"> </w:t>
-      </w:r>
-      <w:r>
-        <w:t xml:space="preserve">H2a, H2b and H3 describe the larger ACOs. Fifth, H4 had one COVID-19-affected pre-period, uneven attrition that left</w:t>
-      </w:r>
-      <w:r>
-        <w:t xml:space="preserve"> </w:t>
-      </w:r>
-      <w:r>
-        <w:t xml:space="preserve">the comparison group’s later years increasingly selected, possible anticipation (the decision was made during 2021,</w:t>
-      </w:r>
-      <w:r>
-        <w:t xml:space="preserve"> </w:t>
-      </w:r>
-      <w:r>
-        <w:t xml:space="preserve">the last pre-period year and a benchmark year of the new agreement), and possible changes in assigned populations</w:t>
-      </w:r>
-      <w:r>
-        <w:t xml:space="preserve"> </w:t>
-      </w:r>
-      <w:r>
-        <w:t xml:space="preserve">through participant lists. Sixth, the base population required a PY2021 enrollment record, and leavers, a third</w:t>
-      </w:r>
-      <w:r>
-        <w:t xml:space="preserve"> </w:t>
-      </w:r>
-      <w:r>
-        <w:t xml:space="preserve">choice, were set aside by comparing early renewers only with stayers. Seventh, the results describe the rules for</w:t>
-      </w:r>
-      <w:r>
-        <w:t xml:space="preserve"> </w:t>
-      </w:r>
-      <w:r>
-        <w:t xml:space="preserve">agreements beginning in 2022. Finally, the analysis reads its table without a fixed row order, so a rerun reproduces</w:t>
-      </w:r>
-      <w:r>
-        <w:t xml:space="preserve"> </w:t>
-      </w:r>
-      <w:r>
-        <w:t xml:space="preserve">deterministic values exactly but resampled and simulated values only within simulation error (for example, H1’s</w:t>
-      </w:r>
-      <w:r>
-        <w:t xml:space="preserve"> </w:t>
-      </w:r>
-      <w:r>
-        <w:t xml:space="preserve">simulated power at the MDE was 80.4% as committed and 77.6% in a rerun from a fresh clone), far from changing any</w:t>
-      </w:r>
-      <w:r>
-        <w:t xml:space="preserve"> </w:t>
-      </w:r>
-      <w:r>
-        <w:t xml:space="preserve">verdict.</w:t>
+        <w:t xml:space="preserve">been relative to its region and may carry differences in coding intensity. The case-mix adjustment has no published</w:t>
+      </w:r>
+      <w:r>
+        <w:t xml:space="preserve"> </w:t>
+      </w:r>
+      <w:r>
+        <w:t xml:space="preserve">counterpart to validate it. Second, the expected gain is an approximation built from final PY2021 data that ACOs did</w:t>
+      </w:r>
+      <w:r>
+        <w:t xml:space="preserve"> </w:t>
+      </w:r>
+      <w:r>
+        <w:t xml:space="preserve">not have when they decided; validation bounds its error in benchmark levels, but the own-spending component’s</w:t>
+      </w:r>
+      <w:r>
+        <w:t xml:space="preserve"> </w:t>
+      </w:r>
+      <w:r>
+        <w:t xml:space="preserve">estimated error exceeds its spread, so H2a and the total gain are weak evidence for any single ACO, and the regional</w:t>
+      </w:r>
+      <w:r>
+        <w:t xml:space="preserve"> </w:t>
+      </w:r>
+      <w:r>
+        <w:t xml:space="preserve">part could not be checked. Third, with 29 early renewers, 24 in the decision model, H3 was underpowered and its</w:t>
+      </w:r>
+      <w:r>
+        <w:t xml:space="preserve"> </w:t>
+      </w:r>
+      <w:r>
+        <w:t xml:space="preserve">supported coefficients are probably overestimates. Fourth, exclusions exceeded the plan’s 10% line in both groups,</w:t>
+      </w:r>
+      <w:r>
+        <w:t xml:space="preserve"> </w:t>
+      </w:r>
+      <w:r>
+        <w:t xml:space="preserve">and the excluded ACOs were smaller, so H2a, H2b and H3 describe the larger ACOs. Fifth, H4 had one COVID-19-affected</w:t>
+      </w:r>
+      <w:r>
+        <w:t xml:space="preserve"> </w:t>
+      </w:r>
+      <w:r>
+        <w:t xml:space="preserve">pre-period; uneven attrition left the comparison group’s later years increasingly selected; the decision was made</w:t>
+      </w:r>
+      <w:r>
+        <w:t xml:space="preserve"> </w:t>
+      </w:r>
+      <w:r>
+        <w:t xml:space="preserve">during 2021, the last pre-period year and a benchmark year of the new agreement, so anticipation is possible; and</w:t>
+      </w:r>
+      <w:r>
+        <w:t xml:space="preserve"> </w:t>
+      </w:r>
+      <w:r>
+        <w:t xml:space="preserve">spending can move through changes in participant lists or assignment method (which changed at PY2022 for 2 of 29</w:t>
+      </w:r>
+      <w:r>
+        <w:t xml:space="preserve"> </w:t>
+      </w:r>
+      <w:r>
+        <w:t xml:space="preserve">early renewers and 14 of 277 stayers) rather than through behavior. Sixth, the base population required a PY2021</w:t>
+      </w:r>
+      <w:r>
+        <w:t xml:space="preserve"> </w:t>
+      </w:r>
+      <w:r>
+        <w:t xml:space="preserve">enrollment record, and leavers, a third choice with a mean pull similar to early renewers’, were set aside by</w:t>
+      </w:r>
+      <w:r>
+        <w:t xml:space="preserve"> </w:t>
+      </w:r>
+      <w:r>
+        <w:t xml:space="preserve">comparing early renewers only with stayers. Seventh, the results describe the rules for agreements beginning in 2022.</w:t>
+      </w:r>
+      <w:r>
+        <w:t xml:space="preserve"> </w:t>
+      </w:r>
+      <w:r>
+        <w:t xml:space="preserve">Finally, the analysis reads its table without a fixed row order, so a rerun reproduces deterministic values exactly</w:t>
+      </w:r>
+      <w:r>
+        <w:t xml:space="preserve"> </w:t>
+      </w:r>
+      <w:r>
+        <w:t xml:space="preserve">but resampled and simulated values only within simulation error (for example, H1’s simulated power at the MDE was</w:t>
+      </w:r>
+      <w:r>
+        <w:t xml:space="preserve"> </w:t>
+      </w:r>
+      <w:r>
+        <w:t xml:space="preserve">80.4% as committed and 77.6% in a rerun from a fresh clone), far from changing any verdict.</w:t>
       </w:r>
     </w:p>
     <w:bookmarkEnd w:id="42"/>
@@ -8142,25 +8682,31 @@
         <w:pStyle w:val="FirstParagraph"/>
       </w:pPr>
       <w:r>
-        <w:t xml:space="preserve">ACOs that renewed early into 2022 MSSP agreements were those whose regions spent more relative to their benchmarks</w:t>
-      </w:r>
-      <w:r>
-        <w:t xml:space="preserve"> </w:t>
-      </w:r>
-      <w:r>
-        <w:t xml:space="preserve">and those at higher BASIC levels, for whom renewal opened the ENHANCED track. A reset was not, on average, a route to</w:t>
-      </w:r>
-      <w:r>
-        <w:t xml:space="preserve"> </w:t>
-      </w:r>
-      <w:r>
-        <w:t xml:space="preserve">a higher benchmark, and spending growth afterward showed no detectable difference. These are associations under the</w:t>
-      </w:r>
-      <w:r>
-        <w:t xml:space="preserve"> </w:t>
-      </w:r>
-      <w:r>
-        <w:t xml:space="preserve">2022 rules, measured with public data under a preregistered plan.</w:t>
+        <w:t xml:space="preserve">ACOs that renewed early into 2022 MSSP agreements more often had regions that spent more relative to their benchmarks</w:t>
+      </w:r>
+      <w:r>
+        <w:t xml:space="preserve"> </w:t>
+      </w:r>
+      <w:r>
+        <w:t xml:space="preserve">and were more often at higher BASIC levels, for which renewal opened the ENHANCED track. By the study’s</w:t>
+      </w:r>
+      <w:r>
+        <w:t xml:space="preserve"> </w:t>
+      </w:r>
+      <w:r>
+        <w:t xml:space="preserve">approximation, a reset would not on average have raised their benchmarks, and spending growth afterward showed no</w:t>
+      </w:r>
+      <w:r>
+        <w:t xml:space="preserve"> </w:t>
+      </w:r>
+      <w:r>
+        <w:t xml:space="preserve">detectable difference. These are associations under the 2022 rules, measured with public data under a preregistered</w:t>
+      </w:r>
+      <w:r>
+        <w:t xml:space="preserve"> </w:t>
+      </w:r>
+      <w:r>
+        <w:t xml:space="preserve">plan.</w:t>
       </w:r>
     </w:p>
     <w:bookmarkEnd w:id="43"/>
@@ -8237,7 +8783,7 @@
         <w:t xml:space="preserve"> </w:t>
       </w:r>
       <w:r>
-        <w:t xml:space="preserve">the 40 files used, with sizes, SHA-256 hashes and URLs, and a script that downloads and verifies them are in the</w:t>
+        <w:t xml:space="preserve">the 40 files downloaded, with sizes, SHA-256 hashes and URLs, and a script that downloads and verifies them are in the</w:t>
       </w:r>
       <w:r>
         <w:t xml:space="preserve"> </w:t>
@@ -8948,7 +9494,7 @@
         <w:t xml:space="preserve">	</w:t>
       </w:r>
       <w:r>
-        <w:t xml:space="preserve">Lyu PF, Chernew ME, McWilliams JM. Benchmarking Changes And Selective Participation In The Medicare Shared Savings Program: Study examines changes in Medicare Share Savings Program participation patterns.</w:t>
+        <w:t xml:space="preserve">Lyu PF, Chernew ME, McWilliams JM. Benchmarking Changes And Selective Participation In The Medicare Shared Savings Program.</w:t>
       </w:r>
       <w:r>
         <w:t xml:space="preserve"> </w:t>
@@ -9268,7 +9814,7 @@
         <w:t xml:space="preserve">	</w:t>
       </w:r>
       <w:r>
-        <w:t xml:space="preserve">Trombley MJ, McWilliams JM, Fout B, Morefield B. ACO Investment Model Produced Savings, But The Majority Of Participants Exited When Faced With Downside Risk: Study examines Medicare’s Accountable Care Organization Investment Model which provided funds to small, rurally located ACOs.</w:t>
+        <w:t xml:space="preserve">Trombley MJ, McWilliams JM, Fout B, Morefield B. ACO Investment Model Produced Savings, But The Majority Of Participants Exited When Faced With Downside Risk.</w:t>
       </w:r>
       <w:r>
         <w:t xml:space="preserve"> </w:t>
@@ -9579,7 +10125,25 @@
         <w:t xml:space="preserve">	</w:t>
       </w:r>
       <w:r>
-        <w:t xml:space="preserve">Harrold ST. Analysis/mssp-benchmark-ratchet: Registered analysis code, commit a4064f5. Published online 2026.</w:t>
+        <w:t xml:space="preserve">Harrold ST. Registered analysis code for the</w:t>
+      </w:r>
+      <w:r>
+        <w:t xml:space="preserve"> </w:t>
+      </w:r>
+      <w:r>
+        <w:t xml:space="preserve">MSSP</w:t>
+      </w:r>
+      <w:r>
+        <w:t xml:space="preserve"> </w:t>
+      </w:r>
+      <w:r>
+        <w:t xml:space="preserve">early-renewal study (</w:t>
+      </w:r>
+      <w:r>
+        <w:t xml:space="preserve">analysis/mssp-benchmark-ratchet</w:t>
+      </w:r>
+      <w:r>
+        <w:t xml:space="preserve">), commit a4064f5. Published online 2026.</w:t>
       </w:r>
       <w:r>
         <w:t xml:space="preserve"> </w:t>

</xml_diff>

<commit_message>
Rename the repository to mssp-paper-2026; repository URLs in the manuscript are links
Co-Authored-By: Claude Opus 5.5 <noreply@anthropic.com>
</commit_message>
<xml_diff>
--- a/paper.docx
+++ b/paper.docx
@@ -8711,7 +8711,7 @@
     </w:p>
     <w:bookmarkEnd w:id="43"/>
     <w:bookmarkEnd w:id="44"/>
-    <w:bookmarkStart w:id="45" w:name="declarations"/>
+    <w:bookmarkStart w:id="47" w:name="declarations"/>
     <w:p>
       <w:pPr>
         <w:pStyle w:val="Heading1"/>
@@ -8841,7 +8841,18 @@
         <w:t xml:space="preserve"> </w:t>
       </w:r>
       <w:r>
-        <w:t xml:space="preserve">study repository and in this manuscript’s repository (https://github.com/stharrold/mssp-preprint-2026).</w:t>
+        <w:t xml:space="preserve">study repository and in this manuscript’s repository (</w:t>
+      </w:r>
+      <w:hyperlink r:id="rId45">
+        <w:r>
+          <w:rPr>
+            <w:rStyle w:val="Hyperlink"/>
+          </w:rPr>
+          <w:t xml:space="preserve">https://github.com/stharrold/mssp-paper-2026</w:t>
+        </w:r>
+      </w:hyperlink>
+      <w:r>
+        <w:t xml:space="preserve">).</w:t>
       </w:r>
     </w:p>
     <w:p>
@@ -8865,7 +8876,24 @@
         <w:t xml:space="preserve"> </w:t>
       </w:r>
       <w:r>
-        <w:t xml:space="preserve">rerun and adapt the analysis are at https://github.com/stharrold/stharrold.github.io (directory</w:t>
+        <w:t xml:space="preserve">rerun and adapt the analysis are at</w:t>
+      </w:r>
+      <w:r>
+        <w:t xml:space="preserve"> </w:t>
+      </w:r>
+      <w:hyperlink r:id="rId46">
+        <w:r>
+          <w:rPr>
+            <w:rStyle w:val="Hyperlink"/>
+          </w:rPr>
+          <w:t xml:space="preserve">https://github.com/stharrold/stharrold.github.io</w:t>
+        </w:r>
+      </w:hyperlink>
+      <w:r>
+        <w:t xml:space="preserve"> </w:t>
+      </w:r>
+      <w:r>
+        <w:t xml:space="preserve">(directory</w:t>
       </w:r>
       <w:r>
         <w:t xml:space="preserve"> </w:t>
@@ -9016,8 +9044,8 @@
         <w:t xml:space="preserve">manuscript. The author reviewed and edited all output and verified the numbers against the results files.</w:t>
       </w:r>
     </w:p>
-    <w:bookmarkEnd w:id="45"/>
-    <w:bookmarkStart w:id="156" w:name="references"/>
+    <w:bookmarkEnd w:id="47"/>
+    <w:bookmarkStart w:id="158" w:name="references"/>
     <w:p>
       <w:pPr>
         <w:pStyle w:val="Heading1"/>
@@ -9026,8 +9054,8 @@
         <w:t xml:space="preserve">References</w:t>
       </w:r>
     </w:p>
-    <w:bookmarkStart w:id="155" w:name="refs"/>
-    <w:bookmarkStart w:id="47" w:name="ref-cfr425"/>
+    <w:bookmarkStart w:id="157" w:name="refs"/>
+    <w:bookmarkStart w:id="49" w:name="ref-cfr425"/>
     <w:p>
       <w:pPr>
         <w:pStyle w:val="Bibliography"/>
@@ -9086,7 +9114,7 @@
       <w:r>
         <w:t xml:space="preserve"> </w:t>
       </w:r>
-      <w:hyperlink r:id="rId46">
+      <w:hyperlink r:id="rId48">
         <w:r>
           <w:rPr>
             <w:rStyle w:val="Hyperlink"/>
@@ -9095,8 +9123,8 @@
         </w:r>
       </w:hyperlink>
     </w:p>
-    <w:bookmarkEnd w:id="47"/>
-    <w:bookmarkStart w:id="49" w:name="ref-cfr425601"/>
+    <w:bookmarkEnd w:id="49"/>
+    <w:bookmarkStart w:id="51" w:name="ref-cfr425601"/>
     <w:p>
       <w:pPr>
         <w:pStyle w:val="Bibliography"/>
@@ -9149,7 +9177,7 @@
       <w:r>
         <w:t xml:space="preserve"> </w:t>
       </w:r>
-      <w:hyperlink r:id="rId48">
+      <w:hyperlink r:id="rId50">
         <w:r>
           <w:rPr>
             <w:rStyle w:val="Hyperlink"/>
@@ -9158,8 +9186,8 @@
         </w:r>
       </w:hyperlink>
     </w:p>
-    <w:bookmarkEnd w:id="49"/>
-    <w:bookmarkStart w:id="51" w:name="ref-mcwilliams2016"/>
+    <w:bookmarkEnd w:id="51"/>
+    <w:bookmarkStart w:id="53" w:name="ref-mcwilliams2016"/>
     <w:p>
       <w:pPr>
         <w:pStyle w:val="Bibliography"/>
@@ -9189,7 +9217,7 @@
       <w:r>
         <w:t xml:space="preserve">. 2016;374(24):2357-2366. doi:</w:t>
       </w:r>
-      <w:hyperlink r:id="rId50">
+      <w:hyperlink r:id="rId52">
         <w:r>
           <w:rPr>
             <w:rStyle w:val="Hyperlink"/>
@@ -9198,8 +9226,8 @@
         </w:r>
       </w:hyperlink>
     </w:p>
-    <w:bookmarkEnd w:id="51"/>
-    <w:bookmarkStart w:id="53" w:name="ref-mcwilliams2018"/>
+    <w:bookmarkEnd w:id="53"/>
+    <w:bookmarkStart w:id="55" w:name="ref-mcwilliams2018"/>
     <w:p>
       <w:pPr>
         <w:pStyle w:val="Bibliography"/>
@@ -9229,7 +9257,7 @@
       <w:r>
         <w:t xml:space="preserve">. 2018;379(12):1139-1149. doi:</w:t>
       </w:r>
-      <w:hyperlink r:id="rId52">
+      <w:hyperlink r:id="rId54">
         <w:r>
           <w:rPr>
             <w:rStyle w:val="Hyperlink"/>
@@ -9238,8 +9266,8 @@
         </w:r>
       </w:hyperlink>
     </w:p>
-    <w:bookmarkEnd w:id="53"/>
-    <w:bookmarkStart w:id="55" w:name="ref-bond2025"/>
+    <w:bookmarkEnd w:id="55"/>
+    <w:bookmarkStart w:id="57" w:name="ref-bond2025"/>
     <w:p>
       <w:pPr>
         <w:pStyle w:val="Bibliography"/>
@@ -9269,7 +9297,7 @@
       <w:r>
         <w:t xml:space="preserve">. 2025;333(21):1897-1905. doi:</w:t>
       </w:r>
-      <w:hyperlink r:id="rId54">
+      <w:hyperlink r:id="rId56">
         <w:r>
           <w:rPr>
             <w:rStyle w:val="Hyperlink"/>
@@ -9278,8 +9306,8 @@
         </w:r>
       </w:hyperlink>
     </w:p>
-    <w:bookmarkEnd w:id="55"/>
-    <w:bookmarkStart w:id="57" w:name="ref-mcwilliams2020"/>
+    <w:bookmarkEnd w:id="57"/>
+    <w:bookmarkStart w:id="59" w:name="ref-mcwilliams2020"/>
     <w:p>
       <w:pPr>
         <w:pStyle w:val="Bibliography"/>
@@ -9309,7 +9337,7 @@
       <w:r>
         <w:t xml:space="preserve">. 2020;98(3):847-907. doi:</w:t>
       </w:r>
-      <w:hyperlink r:id="rId56">
+      <w:hyperlink r:id="rId58">
         <w:r>
           <w:rPr>
             <w:rStyle w:val="Hyperlink"/>
@@ -9318,8 +9346,8 @@
         </w:r>
       </w:hyperlink>
     </w:p>
-    <w:bookmarkEnd w:id="57"/>
-    <w:bookmarkStart w:id="59" w:name="ref-markovitz2019exit"/>
+    <w:bookmarkEnd w:id="59"/>
+    <w:bookmarkStart w:id="61" w:name="ref-markovitz2019exit"/>
     <w:p>
       <w:pPr>
         <w:pStyle w:val="Bibliography"/>
@@ -9349,7 +9377,7 @@
       <w:r>
         <w:t xml:space="preserve">. 2019;171(1):27-36. doi:</w:t>
       </w:r>
-      <w:hyperlink r:id="rId58">
+      <w:hyperlink r:id="rId60">
         <w:r>
           <w:rPr>
             <w:rStyle w:val="Hyperlink"/>
@@ -9358,8 +9386,8 @@
         </w:r>
       </w:hyperlink>
     </w:p>
-    <w:bookmarkEnd w:id="59"/>
-    <w:bookmarkStart w:id="61" w:name="ref-markovitz2019risk"/>
+    <w:bookmarkEnd w:id="61"/>
+    <w:bookmarkStart w:id="63" w:name="ref-markovitz2019risk"/>
     <w:p>
       <w:pPr>
         <w:pStyle w:val="Bibliography"/>
@@ -9389,7 +9417,7 @@
       <w:r>
         <w:t xml:space="preserve">. 2019;38(2):253-261. doi:</w:t>
       </w:r>
-      <w:hyperlink r:id="rId60">
+      <w:hyperlink r:id="rId62">
         <w:r>
           <w:rPr>
             <w:rStyle w:val="Hyperlink"/>
@@ -9398,8 +9426,8 @@
         </w:r>
       </w:hyperlink>
     </w:p>
-    <w:bookmarkEnd w:id="61"/>
-    <w:bookmarkStart w:id="63" w:name="ref-douven2015"/>
+    <w:bookmarkEnd w:id="63"/>
+    <w:bookmarkStart w:id="65" w:name="ref-douven2015"/>
     <w:p>
       <w:pPr>
         <w:pStyle w:val="Bibliography"/>
@@ -9429,7 +9457,7 @@
       <w:r>
         <w:t xml:space="preserve">. 2015;34(1):143-149. doi:</w:t>
       </w:r>
-      <w:hyperlink r:id="rId62">
+      <w:hyperlink r:id="rId64">
         <w:r>
           <w:rPr>
             <w:rStyle w:val="Hyperlink"/>
@@ -9438,8 +9466,8 @@
         </w:r>
       </w:hyperlink>
     </w:p>
-    <w:bookmarkEnd w:id="63"/>
-    <w:bookmarkStart w:id="65" w:name="ref-rose2016"/>
+    <w:bookmarkEnd w:id="65"/>
+    <w:bookmarkStart w:id="67" w:name="ref-rose2016"/>
     <w:p>
       <w:pPr>
         <w:pStyle w:val="Bibliography"/>
@@ -9469,7 +9497,7 @@
       <w:r>
         <w:t xml:space="preserve">. 2016;35(3):440-448. doi:</w:t>
       </w:r>
-      <w:hyperlink r:id="rId64">
+      <w:hyperlink r:id="rId66">
         <w:r>
           <w:rPr>
             <w:rStyle w:val="Hyperlink"/>
@@ -9478,8 +9506,8 @@
         </w:r>
       </w:hyperlink>
     </w:p>
-    <w:bookmarkEnd w:id="65"/>
-    <w:bookmarkStart w:id="67" w:name="ref-lyu2023"/>
+    <w:bookmarkEnd w:id="67"/>
+    <w:bookmarkStart w:id="69" w:name="ref-lyu2023"/>
     <w:p>
       <w:pPr>
         <w:pStyle w:val="Bibliography"/>
@@ -9509,7 +9537,7 @@
       <w:r>
         <w:t xml:space="preserve">. 2023;42(5):622-631. doi:</w:t>
       </w:r>
-      <w:hyperlink r:id="rId66">
+      <w:hyperlink r:id="rId68">
         <w:r>
           <w:rPr>
             <w:rStyle w:val="Hyperlink"/>
@@ -9518,8 +9546,8 @@
         </w:r>
       </w:hyperlink>
     </w:p>
-    <w:bookmarkEnd w:id="67"/>
-    <w:bookmarkStart w:id="69" w:name="ref-chen2025"/>
+    <w:bookmarkEnd w:id="69"/>
+    <w:bookmarkStart w:id="71" w:name="ref-chen2025"/>
     <w:p>
       <w:pPr>
         <w:pStyle w:val="Bibliography"/>
@@ -9549,7 +9577,7 @@
       <w:r>
         <w:t xml:space="preserve">. 2025;11(1):38-62. doi:</w:t>
       </w:r>
-      <w:hyperlink r:id="rId68">
+      <w:hyperlink r:id="rId70">
         <w:r>
           <w:rPr>
             <w:rStyle w:val="Hyperlink"/>
@@ -9558,8 +9586,8 @@
         </w:r>
       </w:hyperlink>
     </w:p>
-    <w:bookmarkEnd w:id="69"/>
-    <w:bookmarkStart w:id="71" w:name="ref-srivastava2026"/>
+    <w:bookmarkEnd w:id="71"/>
+    <w:bookmarkStart w:id="73" w:name="ref-srivastava2026"/>
     <w:p>
       <w:pPr>
         <w:pStyle w:val="Bibliography"/>
@@ -9589,7 +9617,7 @@
       <w:r>
         <w:t xml:space="preserve">. 2026;9(2):e260166. doi:</w:t>
       </w:r>
-      <w:hyperlink r:id="rId70">
+      <w:hyperlink r:id="rId72">
         <w:r>
           <w:rPr>
             <w:rStyle w:val="Hyperlink"/>
@@ -9598,8 +9626,8 @@
         </w:r>
       </w:hyperlink>
     </w:p>
-    <w:bookmarkEnd w:id="71"/>
-    <w:bookmarkStart w:id="73" w:name="ref-bleser2019"/>
+    <w:bookmarkEnd w:id="73"/>
+    <w:bookmarkStart w:id="75" w:name="ref-bleser2019"/>
     <w:p>
       <w:pPr>
         <w:pStyle w:val="Bibliography"/>
@@ -9629,7 +9657,7 @@
       <w:r>
         <w:t xml:space="preserve">. 2019;38(5):794-803. doi:</w:t>
       </w:r>
-      <w:hyperlink r:id="rId72">
+      <w:hyperlink r:id="rId74">
         <w:r>
           <w:rPr>
             <w:rStyle w:val="Hyperlink"/>
@@ -9638,8 +9666,8 @@
         </w:r>
       </w:hyperlink>
     </w:p>
-    <w:bookmarkEnd w:id="73"/>
-    <w:bookmarkStart w:id="75" w:name="ref-zhu2023"/>
+    <w:bookmarkEnd w:id="75"/>
+    <w:bookmarkStart w:id="77" w:name="ref-zhu2023"/>
     <w:p>
       <w:pPr>
         <w:pStyle w:val="Bibliography"/>
@@ -9669,7 +9697,7 @@
       <w:r>
         <w:t xml:space="preserve">. 2023;39(1):302-308. doi:</w:t>
       </w:r>
-      <w:hyperlink r:id="rId74">
+      <w:hyperlink r:id="rId76">
         <w:r>
           <w:rPr>
             <w:rStyle w:val="Hyperlink"/>
@@ -9678,8 +9706,8 @@
         </w:r>
       </w:hyperlink>
     </w:p>
-    <w:bookmarkEnd w:id="75"/>
-    <w:bookmarkStart w:id="77" w:name="ref-ying2023"/>
+    <w:bookmarkEnd w:id="77"/>
+    <w:bookmarkStart w:id="79" w:name="ref-ying2023"/>
     <w:p>
       <w:pPr>
         <w:pStyle w:val="Bibliography"/>
@@ -9709,7 +9737,7 @@
       <w:r>
         <w:t xml:space="preserve">. 2023;38(7):1780-1782. doi:</w:t>
       </w:r>
-      <w:hyperlink r:id="rId76">
+      <w:hyperlink r:id="rId78">
         <w:r>
           <w:rPr>
             <w:rStyle w:val="Hyperlink"/>
@@ -9718,8 +9746,8 @@
         </w:r>
       </w:hyperlink>
     </w:p>
-    <w:bookmarkEnd w:id="77"/>
-    <w:bookmarkStart w:id="79" w:name="ref-ying2024"/>
+    <w:bookmarkEnd w:id="79"/>
+    <w:bookmarkStart w:id="81" w:name="ref-ying2024"/>
     <w:p>
       <w:pPr>
         <w:pStyle w:val="Bibliography"/>
@@ -9749,7 +9777,7 @@
       <w:r>
         <w:t xml:space="preserve">. 2024;2(1):qxad093. doi:</w:t>
       </w:r>
-      <w:hyperlink r:id="rId78">
+      <w:hyperlink r:id="rId80">
         <w:r>
           <w:rPr>
             <w:rStyle w:val="Hyperlink"/>
@@ -9758,8 +9786,8 @@
         </w:r>
       </w:hyperlink>
     </w:p>
-    <w:bookmarkEnd w:id="79"/>
-    <w:bookmarkStart w:id="81" w:name="ref-moloci2021"/>
+    <w:bookmarkEnd w:id="81"/>
+    <w:bookmarkStart w:id="83" w:name="ref-moloci2021"/>
     <w:p>
       <w:pPr>
         <w:pStyle w:val="Bibliography"/>
@@ -9789,7 +9817,7 @@
       <w:r>
         <w:t xml:space="preserve">. 2021;36(8):2490-2491. doi:</w:t>
       </w:r>
-      <w:hyperlink r:id="rId80">
+      <w:hyperlink r:id="rId82">
         <w:r>
           <w:rPr>
             <w:rStyle w:val="Hyperlink"/>
@@ -9798,8 +9826,8 @@
         </w:r>
       </w:hyperlink>
     </w:p>
-    <w:bookmarkEnd w:id="81"/>
-    <w:bookmarkStart w:id="83" w:name="ref-trombley2022"/>
+    <w:bookmarkEnd w:id="83"/>
+    <w:bookmarkStart w:id="85" w:name="ref-trombley2022"/>
     <w:p>
       <w:pPr>
         <w:pStyle w:val="Bibliography"/>
@@ -9829,7 +9857,7 @@
       <w:r>
         <w:t xml:space="preserve">. 2022;41(1):138-146. doi:</w:t>
       </w:r>
-      <w:hyperlink r:id="rId82">
+      <w:hyperlink r:id="rId84">
         <w:r>
           <w:rPr>
             <w:rStyle w:val="Hyperlink"/>
@@ -9838,8 +9866,8 @@
         </w:r>
       </w:hyperlink>
     </w:p>
-    <w:bookmarkEnd w:id="83"/>
-    <w:bookmarkStart w:id="85" w:name="ref-frpathways"/>
+    <w:bookmarkEnd w:id="85"/>
+    <w:bookmarkStart w:id="87" w:name="ref-frpathways"/>
     <w:p>
       <w:pPr>
         <w:pStyle w:val="Bibliography"/>
@@ -9922,7 +9950,7 @@
       <w:r>
         <w:t xml:space="preserve"> </w:t>
       </w:r>
-      <w:hyperlink r:id="rId84">
+      <w:hyperlink r:id="rId86">
         <w:r>
           <w:rPr>
             <w:rStyle w:val="Hyperlink"/>
@@ -9931,8 +9959,8 @@
         </w:r>
       </w:hyperlink>
     </w:p>
-    <w:bookmarkEnd w:id="85"/>
-    <w:bookmarkStart w:id="87" w:name="ref-dataacos"/>
+    <w:bookmarkEnd w:id="87"/>
+    <w:bookmarkStart w:id="89" w:name="ref-dataacos"/>
     <w:p>
       <w:pPr>
         <w:pStyle w:val="Bibliography"/>
@@ -9976,7 +10004,7 @@
       <w:r>
         <w:t xml:space="preserve"> </w:t>
       </w:r>
-      <w:hyperlink r:id="rId86">
+      <w:hyperlink r:id="rId88">
         <w:r>
           <w:rPr>
             <w:rStyle w:val="Hyperlink"/>
@@ -9985,8 +10013,8 @@
         </w:r>
       </w:hyperlink>
     </w:p>
-    <w:bookmarkEnd w:id="87"/>
-    <w:bookmarkStart w:id="88" w:name="ref-registration"/>
+    <w:bookmarkEnd w:id="89"/>
+    <w:bookmarkStart w:id="90" w:name="ref-registration"/>
     <w:p>
       <w:pPr>
         <w:pStyle w:val="Bibliography"/>
@@ -10069,8 +10097,8 @@
         </w:r>
       </w:hyperlink>
     </w:p>
-    <w:bookmarkEnd w:id="88"/>
-    <w:bookmarkStart w:id="90" w:name="ref-vonelm2007"/>
+    <w:bookmarkEnd w:id="90"/>
+    <w:bookmarkStart w:id="92" w:name="ref-vonelm2007"/>
     <w:p>
       <w:pPr>
         <w:pStyle w:val="Bibliography"/>
@@ -10100,7 +10128,7 @@
       <w:r>
         <w:t xml:space="preserve">. 2007;4(10):e296. doi:</w:t>
       </w:r>
-      <w:hyperlink r:id="rId89">
+      <w:hyperlink r:id="rId91">
         <w:r>
           <w:rPr>
             <w:rStyle w:val="Hyperlink"/>
@@ -10109,8 +10137,8 @@
         </w:r>
       </w:hyperlink>
     </w:p>
-    <w:bookmarkEnd w:id="90"/>
-    <w:bookmarkStart w:id="92" w:name="ref-code"/>
+    <w:bookmarkEnd w:id="92"/>
+    <w:bookmarkStart w:id="94" w:name="ref-code"/>
     <w:p>
       <w:pPr>
         <w:pStyle w:val="Bibliography"/>
@@ -10148,7 +10176,7 @@
       <w:r>
         <w:t xml:space="preserve"> </w:t>
       </w:r>
-      <w:hyperlink r:id="rId91">
+      <w:hyperlink r:id="rId93">
         <w:r>
           <w:rPr>
             <w:rStyle w:val="Hyperlink"/>
@@ -10157,8 +10185,8 @@
         </w:r>
       </w:hyperlink>
     </w:p>
-    <w:bookmarkEnd w:id="92"/>
-    <w:bookmarkStart w:id="94" w:name="ref-dataresults"/>
+    <w:bookmarkEnd w:id="94"/>
+    <w:bookmarkStart w:id="96" w:name="ref-dataresults"/>
     <w:p>
       <w:pPr>
         <w:pStyle w:val="Bibliography"/>
@@ -10178,7 +10206,7 @@
       <w:r>
         <w:t xml:space="preserve"> </w:t>
       </w:r>
-      <w:hyperlink r:id="rId93">
+      <w:hyperlink r:id="rId95">
         <w:r>
           <w:rPr>
             <w:rStyle w:val="Hyperlink"/>
@@ -10187,8 +10215,8 @@
         </w:r>
       </w:hyperlink>
     </w:p>
-    <w:bookmarkEnd w:id="94"/>
-    <w:bookmarkStart w:id="96" w:name="ref-datacounty"/>
+    <w:bookmarkEnd w:id="96"/>
+    <w:bookmarkStart w:id="98" w:name="ref-datacounty"/>
     <w:p>
       <w:pPr>
         <w:pStyle w:val="Bibliography"/>
@@ -10208,7 +10236,7 @@
       <w:r>
         <w:t xml:space="preserve"> </w:t>
       </w:r>
-      <w:hyperlink r:id="rId95">
+      <w:hyperlink r:id="rId97">
         <w:r>
           <w:rPr>
             <w:rStyle w:val="Hyperlink"/>
@@ -10217,8 +10245,8 @@
         </w:r>
       </w:hyperlink>
     </w:p>
-    <w:bookmarkEnd w:id="96"/>
-    <w:bookmarkStart w:id="98" w:name="ref-dataassigned"/>
+    <w:bookmarkEnd w:id="98"/>
+    <w:bookmarkStart w:id="100" w:name="ref-dataassigned"/>
     <w:p>
       <w:pPr>
         <w:pStyle w:val="Bibliography"/>
@@ -10238,7 +10266,7 @@
       <w:r>
         <w:t xml:space="preserve"> </w:t>
       </w:r>
-      <w:hyperlink r:id="rId97">
+      <w:hyperlink r:id="rId99">
         <w:r>
           <w:rPr>
             <w:rStyle w:val="Hyperlink"/>
@@ -10247,8 +10275,8 @@
         </w:r>
       </w:hyperlink>
     </w:p>
-    <w:bookmarkEnd w:id="98"/>
-    <w:bookmarkStart w:id="100" w:name="ref-osfproject"/>
+    <w:bookmarkEnd w:id="100"/>
+    <w:bookmarkStart w:id="102" w:name="ref-osfproject"/>
     <w:p>
       <w:pPr>
         <w:pStyle w:val="Bibliography"/>
@@ -10307,7 +10335,7 @@
       <w:r>
         <w:t xml:space="preserve">data snapshot. Published online 2026. doi:</w:t>
       </w:r>
-      <w:hyperlink r:id="rId99">
+      <w:hyperlink r:id="rId101">
         <w:r>
           <w:rPr>
             <w:rStyle w:val="Hyperlink"/>
@@ -10316,8 +10344,8 @@
         </w:r>
       </w:hyperlink>
     </w:p>
-    <w:bookmarkEnd w:id="100"/>
-    <w:bookmarkStart w:id="102" w:name="ref-suppression"/>
+    <w:bookmarkEnd w:id="102"/>
+    <w:bookmarkStart w:id="104" w:name="ref-suppression"/>
     <w:p>
       <w:pPr>
         <w:pStyle w:val="Bibliography"/>
@@ -10349,7 +10377,7 @@
       <w:r>
         <w:t xml:space="preserve"> </w:t>
       </w:r>
-      <w:hyperlink r:id="rId101">
+      <w:hyperlink r:id="rId103">
         <w:r>
           <w:rPr>
             <w:rStyle w:val="Hyperlink"/>
@@ -10358,8 +10386,8 @@
         </w:r>
       </w:hyperlink>
     </w:p>
-    <w:bookmarkEnd w:id="102"/>
-    <w:bookmarkStart w:id="104" w:name="ref-specv10"/>
+    <w:bookmarkEnd w:id="104"/>
+    <w:bookmarkStart w:id="106" w:name="ref-specv10"/>
     <w:p>
       <w:pPr>
         <w:pStyle w:val="Bibliography"/>
@@ -10400,7 +10428,7 @@
       <w:r>
         <w:t xml:space="preserve"> </w:t>
       </w:r>
-      <w:hyperlink r:id="rId103">
+      <w:hyperlink r:id="rId105">
         <w:r>
           <w:rPr>
             <w:rStyle w:val="Hyperlink"/>
@@ -10409,8 +10437,8 @@
         </w:r>
       </w:hyperlink>
     </w:p>
-    <w:bookmarkEnd w:id="104"/>
-    <w:bookmarkStart w:id="106" w:name="ref-rubin1981"/>
+    <w:bookmarkEnd w:id="106"/>
+    <w:bookmarkStart w:id="108" w:name="ref-rubin1981"/>
     <w:p>
       <w:pPr>
         <w:pStyle w:val="Bibliography"/>
@@ -10440,7 +10468,7 @@
       <w:r>
         <w:t xml:space="preserve">. 1981;9(1):130-134. doi:</w:t>
       </w:r>
-      <w:hyperlink r:id="rId105">
+      <w:hyperlink r:id="rId107">
         <w:r>
           <w:rPr>
             <w:rStyle w:val="Hyperlink"/>
@@ -10449,8 +10477,8 @@
         </w:r>
       </w:hyperlink>
     </w:p>
-    <w:bookmarkEnd w:id="106"/>
-    <w:bookmarkStart w:id="108" w:name="ref-phipson2010"/>
+    <w:bookmarkEnd w:id="108"/>
+    <w:bookmarkStart w:id="110" w:name="ref-phipson2010"/>
     <w:p>
       <w:pPr>
         <w:pStyle w:val="Bibliography"/>
@@ -10480,7 +10508,7 @@
       <w:r>
         <w:t xml:space="preserve">. 2010;9(1):39. doi:</w:t>
       </w:r>
-      <w:hyperlink r:id="rId107">
+      <w:hyperlink r:id="rId109">
         <w:r>
           <w:rPr>
             <w:rStyle w:val="Hyperlink"/>
@@ -10489,8 +10517,8 @@
         </w:r>
       </w:hyperlink>
     </w:p>
-    <w:bookmarkEnd w:id="108"/>
-    <w:bookmarkStart w:id="110" w:name="ref-pymc2023"/>
+    <w:bookmarkEnd w:id="110"/>
+    <w:bookmarkStart w:id="112" w:name="ref-pymc2023"/>
     <w:p>
       <w:pPr>
         <w:pStyle w:val="Bibliography"/>
@@ -10520,7 +10548,7 @@
       <w:r>
         <w:t xml:space="preserve">. 2023;9:e1516. doi:</w:t>
       </w:r>
-      <w:hyperlink r:id="rId109">
+      <w:hyperlink r:id="rId111">
         <w:r>
           <w:rPr>
             <w:rStyle w:val="Hyperlink"/>
@@ -10529,8 +10557,8 @@
         </w:r>
       </w:hyperlink>
     </w:p>
-    <w:bookmarkEnd w:id="110"/>
-    <w:bookmarkStart w:id="112" w:name="ref-hoffman2014"/>
+    <w:bookmarkEnd w:id="112"/>
+    <w:bookmarkStart w:id="114" w:name="ref-hoffman2014"/>
     <w:p>
       <w:pPr>
         <w:pStyle w:val="Bibliography"/>
@@ -10596,7 +10624,7 @@
       <w:r>
         <w:t xml:space="preserve"> </w:t>
       </w:r>
-      <w:hyperlink r:id="rId111">
+      <w:hyperlink r:id="rId113">
         <w:r>
           <w:rPr>
             <w:rStyle w:val="Hyperlink"/>
@@ -10605,8 +10633,8 @@
         </w:r>
       </w:hyperlink>
     </w:p>
-    <w:bookmarkEnd w:id="112"/>
-    <w:bookmarkStart w:id="114" w:name="ref-gelman2008"/>
+    <w:bookmarkEnd w:id="114"/>
+    <w:bookmarkStart w:id="116" w:name="ref-gelman2008"/>
     <w:p>
       <w:pPr>
         <w:pStyle w:val="Bibliography"/>
@@ -10636,7 +10664,7 @@
       <w:r>
         <w:t xml:space="preserve">. 2008;27(15):2865-2873. doi:</w:t>
       </w:r>
-      <w:hyperlink r:id="rId113">
+      <w:hyperlink r:id="rId115">
         <w:r>
           <w:rPr>
             <w:rStyle w:val="Hyperlink"/>
@@ -10645,8 +10673,8 @@
         </w:r>
       </w:hyperlink>
     </w:p>
-    <w:bookmarkEnd w:id="114"/>
-    <w:bookmarkStart w:id="116" w:name="ref-vehtari2021"/>
+    <w:bookmarkEnd w:id="116"/>
+    <w:bookmarkStart w:id="118" w:name="ref-vehtari2021"/>
     <w:p>
       <w:pPr>
         <w:pStyle w:val="Bibliography"/>
@@ -10676,7 +10704,7 @@
       <w:r>
         <w:t xml:space="preserve">. 2021;16(2):667-718. doi:</w:t>
       </w:r>
-      <w:hyperlink r:id="rId115">
+      <w:hyperlink r:id="rId117">
         <w:r>
           <w:rPr>
             <w:rStyle w:val="Hyperlink"/>
@@ -10685,8 +10713,8 @@
         </w:r>
       </w:hyperlink>
     </w:p>
-    <w:bookmarkEnd w:id="116"/>
-    <w:bookmarkStart w:id="118" w:name="ref-firth1993"/>
+    <w:bookmarkEnd w:id="118"/>
+    <w:bookmarkStart w:id="120" w:name="ref-firth1993"/>
     <w:p>
       <w:pPr>
         <w:pStyle w:val="Bibliography"/>
@@ -10716,7 +10744,7 @@
       <w:r>
         <w:t xml:space="preserve">. 1993;80(1):27-38. doi:</w:t>
       </w:r>
-      <w:hyperlink r:id="rId117">
+      <w:hyperlink r:id="rId119">
         <w:r>
           <w:rPr>
             <w:rStyle w:val="Hyperlink"/>
@@ -10725,8 +10753,8 @@
         </w:r>
       </w:hyperlink>
     </w:p>
-    <w:bookmarkEnd w:id="118"/>
-    <w:bookmarkStart w:id="120" w:name="ref-firthmodels"/>
+    <w:bookmarkEnd w:id="120"/>
+    <w:bookmarkStart w:id="122" w:name="ref-firthmodels"/>
     <w:p>
       <w:pPr>
         <w:pStyle w:val="Bibliography"/>
@@ -10776,7 +10804,7 @@
       <w:r>
         <w:t xml:space="preserve"> </w:t>
       </w:r>
-      <w:hyperlink r:id="rId119">
+      <w:hyperlink r:id="rId121">
         <w:r>
           <w:rPr>
             <w:rStyle w:val="Hyperlink"/>
@@ -10785,8 +10813,8 @@
         </w:r>
       </w:hyperlink>
     </w:p>
-    <w:bookmarkEnd w:id="120"/>
-    <w:bookmarkStart w:id="122" w:name="ref-gelmanprior2008"/>
+    <w:bookmarkEnd w:id="122"/>
+    <w:bookmarkStart w:id="124" w:name="ref-gelmanprior2008"/>
     <w:p>
       <w:pPr>
         <w:pStyle w:val="Bibliography"/>
@@ -10816,7 +10844,7 @@
       <w:r>
         <w:t xml:space="preserve">. 2008;2(4):1360-1383. doi:</w:t>
       </w:r>
-      <w:hyperlink r:id="rId121">
+      <w:hyperlink r:id="rId123">
         <w:r>
           <w:rPr>
             <w:rStyle w:val="Hyperlink"/>
@@ -10825,8 +10853,8 @@
         </w:r>
       </w:hyperlink>
     </w:p>
-    <w:bookmarkEnd w:id="122"/>
-    <w:bookmarkStart w:id="124" w:name="ref-callaway2021"/>
+    <w:bookmarkEnd w:id="124"/>
+    <w:bookmarkStart w:id="126" w:name="ref-callaway2021"/>
     <w:p>
       <w:pPr>
         <w:pStyle w:val="Bibliography"/>
@@ -10856,7 +10884,7 @@
       <w:r>
         <w:t xml:space="preserve">. 2021;225(2):200-230. doi:</w:t>
       </w:r>
-      <w:hyperlink r:id="rId123">
+      <w:hyperlink r:id="rId125">
         <w:r>
           <w:rPr>
             <w:rStyle w:val="Hyperlink"/>
@@ -10865,8 +10893,8 @@
         </w:r>
       </w:hyperlink>
     </w:p>
-    <w:bookmarkEnd w:id="124"/>
-    <w:bookmarkStart w:id="126" w:name="ref-roth2022"/>
+    <w:bookmarkEnd w:id="126"/>
+    <w:bookmarkStart w:id="128" w:name="ref-roth2022"/>
     <w:p>
       <w:pPr>
         <w:pStyle w:val="Bibliography"/>
@@ -10896,7 +10924,7 @@
       <w:r>
         <w:t xml:space="preserve">. 2022;4(3):305-322. doi:</w:t>
       </w:r>
-      <w:hyperlink r:id="rId125">
+      <w:hyperlink r:id="rId127">
         <w:r>
           <w:rPr>
             <w:rStyle w:val="Hyperlink"/>
@@ -10905,8 +10933,8 @@
         </w:r>
       </w:hyperlink>
     </w:p>
-    <w:bookmarkEnd w:id="126"/>
-    <w:bookmarkStart w:id="128" w:name="ref-lakens2017"/>
+    <w:bookmarkEnd w:id="128"/>
+    <w:bookmarkStart w:id="130" w:name="ref-lakens2017"/>
     <w:p>
       <w:pPr>
         <w:pStyle w:val="Bibliography"/>
@@ -10936,7 +10964,7 @@
       <w:r>
         <w:t xml:space="preserve">. 2017;8(4):355-362. doi:</w:t>
       </w:r>
-      <w:hyperlink r:id="rId127">
+      <w:hyperlink r:id="rId129">
         <w:r>
           <w:rPr>
             <w:rStyle w:val="Hyperlink"/>
@@ -10945,8 +10973,8 @@
         </w:r>
       </w:hyperlink>
     </w:p>
-    <w:bookmarkEnd w:id="128"/>
-    <w:bookmarkStart w:id="130" w:name="ref-rambachan2023"/>
+    <w:bookmarkEnd w:id="130"/>
+    <w:bookmarkStart w:id="132" w:name="ref-rambachan2023"/>
     <w:p>
       <w:pPr>
         <w:pStyle w:val="Bibliography"/>
@@ -10976,7 +11004,7 @@
       <w:r>
         <w:t xml:space="preserve">. 2023;90(5):2555-2591. doi:</w:t>
       </w:r>
-      <w:hyperlink r:id="rId129">
+      <w:hyperlink r:id="rId131">
         <w:r>
           <w:rPr>
             <w:rStyle w:val="Hyperlink"/>
@@ -10985,8 +11013,8 @@
         </w:r>
       </w:hyperlink>
     </w:p>
-    <w:bookmarkEnd w:id="130"/>
-    <w:bookmarkStart w:id="132" w:name="ref-rosenbaum1983"/>
+    <w:bookmarkEnd w:id="132"/>
+    <w:bookmarkStart w:id="134" w:name="ref-rosenbaum1983"/>
     <w:p>
       <w:pPr>
         <w:pStyle w:val="Bibliography"/>
@@ -11016,7 +11044,7 @@
       <w:r>
         <w:t xml:space="preserve">. 1983;70(1):41-55. doi:</w:t>
       </w:r>
-      <w:hyperlink r:id="rId131">
+      <w:hyperlink r:id="rId133">
         <w:r>
           <w:rPr>
             <w:rStyle w:val="Hyperlink"/>
@@ -11025,8 +11053,8 @@
         </w:r>
       </w:hyperlink>
     </w:p>
-    <w:bookmarkEnd w:id="132"/>
-    <w:bookmarkStart w:id="134" w:name="ref-welch1947"/>
+    <w:bookmarkEnd w:id="134"/>
+    <w:bookmarkStart w:id="136" w:name="ref-welch1947"/>
     <w:p>
       <w:pPr>
         <w:pStyle w:val="Bibliography"/>
@@ -11068,7 +11096,7 @@
       <w:r>
         <w:t xml:space="preserve">. 1947;34(1-2):28-35. doi:</w:t>
       </w:r>
-      <w:hyperlink r:id="rId133">
+      <w:hyperlink r:id="rId135">
         <w:r>
           <w:rPr>
             <w:rStyle w:val="Hyperlink"/>
@@ -11077,8 +11105,8 @@
         </w:r>
       </w:hyperlink>
     </w:p>
-    <w:bookmarkEnd w:id="134"/>
-    <w:bookmarkStart w:id="136" w:name="ref-mackinnon1985"/>
+    <w:bookmarkEnd w:id="136"/>
+    <w:bookmarkStart w:id="138" w:name="ref-mackinnon1985"/>
     <w:p>
       <w:pPr>
         <w:pStyle w:val="Bibliography"/>
@@ -11108,7 +11136,7 @@
       <w:r>
         <w:t xml:space="preserve">. 1985;29(3):305-325. doi:</w:t>
       </w:r>
-      <w:hyperlink r:id="rId135">
+      <w:hyperlink r:id="rId137">
         <w:r>
           <w:rPr>
             <w:rStyle w:val="Hyperlink"/>
@@ -11117,8 +11145,8 @@
         </w:r>
       </w:hyperlink>
     </w:p>
-    <w:bookmarkEnd w:id="136"/>
-    <w:bookmarkStart w:id="138" w:name="ref-statsmodels2010"/>
+    <w:bookmarkEnd w:id="138"/>
+    <w:bookmarkStart w:id="140" w:name="ref-statsmodels2010"/>
     <w:p>
       <w:pPr>
         <w:pStyle w:val="Bibliography"/>
@@ -11148,7 +11176,7 @@
       <w:r>
         <w:t xml:space="preserve">. Published online 2010:92-96. doi:</w:t>
       </w:r>
-      <w:hyperlink r:id="rId137">
+      <w:hyperlink r:id="rId139">
         <w:r>
           <w:rPr>
             <w:rStyle w:val="Hyperlink"/>
@@ -11157,8 +11185,8 @@
         </w:r>
       </w:hyperlink>
     </w:p>
-    <w:bookmarkEnd w:id="138"/>
-    <w:bookmarkStart w:id="140" w:name="ref-dbt"/>
+    <w:bookmarkEnd w:id="140"/>
+    <w:bookmarkStart w:id="142" w:name="ref-dbt"/>
     <w:p>
       <w:pPr>
         <w:pStyle w:val="Bibliography"/>
@@ -11205,7 +11233,7 @@
       <w:r>
         <w:t xml:space="preserve"> </w:t>
       </w:r>
-      <w:hyperlink r:id="rId139">
+      <w:hyperlink r:id="rId141">
         <w:r>
           <w:rPr>
             <w:rStyle w:val="Hyperlink"/>
@@ -11214,8 +11242,8 @@
         </w:r>
       </w:hyperlink>
     </w:p>
-    <w:bookmarkEnd w:id="140"/>
-    <w:bookmarkStart w:id="142" w:name="ref-duckdb2019"/>
+    <w:bookmarkEnd w:id="142"/>
+    <w:bookmarkStart w:id="144" w:name="ref-duckdb2019"/>
     <w:p>
       <w:pPr>
         <w:pStyle w:val="Bibliography"/>
@@ -11245,7 +11273,7 @@
       <w:r>
         <w:t xml:space="preserve">. Published online June 25, 2019:1981-1984. doi:</w:t>
       </w:r>
-      <w:hyperlink r:id="rId141">
+      <w:hyperlink r:id="rId143">
         <w:r>
           <w:rPr>
             <w:rStyle w:val="Hyperlink"/>
@@ -11254,8 +11282,8 @@
         </w:r>
       </w:hyperlink>
     </w:p>
-    <w:bookmarkEnd w:id="142"/>
-    <w:bookmarkStart w:id="144" w:name="ref-uv"/>
+    <w:bookmarkEnd w:id="144"/>
+    <w:bookmarkStart w:id="146" w:name="ref-uv"/>
     <w:p>
       <w:pPr>
         <w:pStyle w:val="Bibliography"/>
@@ -11296,7 +11324,7 @@
       <w:r>
         <w:t xml:space="preserve"> </w:t>
       </w:r>
-      <w:hyperlink r:id="rId143">
+      <w:hyperlink r:id="rId145">
         <w:r>
           <w:rPr>
             <w:rStyle w:val="Hyperlink"/>
@@ -11305,8 +11333,8 @@
         </w:r>
       </w:hyperlink>
     </w:p>
-    <w:bookmarkEnd w:id="144"/>
-    <w:bookmarkStart w:id="146" w:name="ref-arviz2019"/>
+    <w:bookmarkEnd w:id="146"/>
+    <w:bookmarkStart w:id="148" w:name="ref-arviz2019"/>
     <w:p>
       <w:pPr>
         <w:pStyle w:val="Bibliography"/>
@@ -11336,7 +11364,7 @@
       <w:r>
         <w:t xml:space="preserve">. 2019;4(33):1143. doi:</w:t>
       </w:r>
-      <w:hyperlink r:id="rId145">
+      <w:hyperlink r:id="rId147">
         <w:r>
           <w:rPr>
             <w:rStyle w:val="Hyperlink"/>
@@ -11345,8 +11373,8 @@
         </w:r>
       </w:hyperlink>
     </w:p>
-    <w:bookmarkEnd w:id="146"/>
-    <w:bookmarkStart w:id="148" w:name="ref-numpy2020"/>
+    <w:bookmarkEnd w:id="148"/>
+    <w:bookmarkStart w:id="150" w:name="ref-numpy2020"/>
     <w:p>
       <w:pPr>
         <w:pStyle w:val="Bibliography"/>
@@ -11376,7 +11404,7 @@
       <w:r>
         <w:t xml:space="preserve">. 2020;585(7825):357-362. doi:</w:t>
       </w:r>
-      <w:hyperlink r:id="rId147">
+      <w:hyperlink r:id="rId149">
         <w:r>
           <w:rPr>
             <w:rStyle w:val="Hyperlink"/>
@@ -11385,8 +11413,8 @@
         </w:r>
       </w:hyperlink>
     </w:p>
-    <w:bookmarkEnd w:id="148"/>
-    <w:bookmarkStart w:id="150" w:name="ref-gelmancarlin2014"/>
+    <w:bookmarkEnd w:id="150"/>
+    <w:bookmarkStart w:id="152" w:name="ref-gelmancarlin2014"/>
     <w:p>
       <w:pPr>
         <w:pStyle w:val="Bibliography"/>
@@ -11416,7 +11444,7 @@
       <w:r>
         <w:t xml:space="preserve">. 2014;9(6):641-651. doi:</w:t>
       </w:r>
-      <w:hyperlink r:id="rId149">
+      <w:hyperlink r:id="rId151">
         <w:r>
           <w:rPr>
             <w:rStyle w:val="Hyperlink"/>
@@ -11425,8 +11453,8 @@
         </w:r>
       </w:hyperlink>
     </w:p>
-    <w:bookmarkEnd w:id="150"/>
-    <w:bookmarkStart w:id="152" w:name="ref-cfr2024"/>
+    <w:bookmarkEnd w:id="152"/>
+    <w:bookmarkStart w:id="154" w:name="ref-cfr2024"/>
     <w:p>
       <w:pPr>
         <w:pStyle w:val="Bibliography"/>
@@ -11470,7 +11498,7 @@
       <w:r>
         <w:t xml:space="preserve"> </w:t>
       </w:r>
-      <w:hyperlink r:id="rId151">
+      <w:hyperlink r:id="rId153">
         <w:r>
           <w:rPr>
             <w:rStyle w:val="Hyperlink"/>
@@ -11479,8 +11507,8 @@
         </w:r>
       </w:hyperlink>
     </w:p>
-    <w:bookmarkEnd w:id="152"/>
-    <w:bookmarkStart w:id="154" w:name="ref-post"/>
+    <w:bookmarkEnd w:id="154"/>
+    <w:bookmarkStart w:id="156" w:name="ref-post"/>
     <w:p>
       <w:pPr>
         <w:pStyle w:val="Bibliography"/>
@@ -11530,7 +11558,7 @@
       <w:r>
         <w:t xml:space="preserve"> </w:t>
       </w:r>
-      <w:hyperlink r:id="rId153">
+      <w:hyperlink r:id="rId155">
         <w:r>
           <w:rPr>
             <w:rStyle w:val="Hyperlink"/>
@@ -11539,9 +11567,9 @@
         </w:r>
       </w:hyperlink>
     </w:p>
-    <w:bookmarkEnd w:id="154"/>
-    <w:bookmarkEnd w:id="155"/>
     <w:bookmarkEnd w:id="156"/>
+    <w:bookmarkEnd w:id="157"/>
+    <w:bookmarkEnd w:id="158"/>
     <w:sectPr>
       <w:footnotePr>
         <w:numRestart w:val="eachSect"/>

</xml_diff>

<commit_message>
Preprint: employment disclosure; second assessment's text corrections (decomposition reading of H2b, BASIC level not blind, later renewers, Level E rule, Milliman reports, limitations)
Co-Authored-By: Claude Opus 5.5 <noreply@anthropic.com>
</commit_message>
<xml_diff>
--- a/paper.docx
+++ b/paper.docx
@@ -168,7 +168,13 @@
         <w:t xml:space="preserve"> </w:t>
       </w:r>
       <w:r>
-        <w:t xml:space="preserve">early to reset sooner; to the author’s knowledge, which ACOs did so has not been studied.</w:t>
+        <w:t xml:space="preserve">early to reset sooner; industry reports have described these ACOs’ savings, but which ACOs did so has not been</w:t>
+      </w:r>
+      <w:r>
+        <w:t xml:space="preserve"> </w:t>
+      </w:r>
+      <w:r>
+        <w:t xml:space="preserve">studied in the peer-reviewed literature.</w:t>
       </w:r>
     </w:p>
     <w:p>
@@ -1027,13 +1033,71 @@
         <w:t xml:space="preserve"> </w:t>
       </w:r>
       <w:r>
-        <w:t xml:space="preserve">Which ACOs used</w:t>
-      </w:r>
-      <w:r>
-        <w:t xml:space="preserve"> </w:t>
-      </w:r>
-      <w:r>
-        <w:t xml:space="preserve">the option bears on how benchmark rules sort ACOs, but to the author’s knowledge it has not been studied.</w:t>
+        <w:t xml:space="preserve">An industry</w:t>
+      </w:r>
+      <w:r>
+        <w:t xml:space="preserve"> </w:t>
+      </w:r>
+      <w:r>
+        <w:t xml:space="preserve">report found that ACOs rebasing early in 2022 had higher gross savings rates beforehand than ACOs that did not, and</w:t>
+      </w:r>
+      <w:r>
+        <w:t xml:space="preserve"> </w:t>
+      </w:r>
+      <w:r>
+        <w:t xml:space="preserve">that the earlier incumbents among them moved from BASIC to ENHANCED,</w:t>
+      </w:r>
+      <w:r>
+        <w:t xml:space="preserve">[</w:t>
+      </w:r>
+      <w:hyperlink w:anchor="ref-milliman2024">
+        <w:r>
+          <w:rPr>
+            <w:rStyle w:val="Hyperlink"/>
+          </w:rPr>
+          <w:t xml:space="preserve">22</w:t>
+        </w:r>
+      </w:hyperlink>
+      <w:r>
+        <w:t xml:space="preserve">]</w:t>
+      </w:r>
+      <w:r>
+        <w:t xml:space="preserve"> </w:t>
+      </w:r>
+      <w:r>
+        <w:t xml:space="preserve">and consulting analyses model the</w:t>
+      </w:r>
+      <w:r>
+        <w:t xml:space="preserve"> </w:t>
+      </w:r>
+      <w:r>
+        <w:t xml:space="preserve">choice for individual ACOs.</w:t>
+      </w:r>
+      <w:r>
+        <w:t xml:space="preserve">[</w:t>
+      </w:r>
+      <w:hyperlink w:anchor="ref-milliman2025">
+        <w:r>
+          <w:rPr>
+            <w:rStyle w:val="Hyperlink"/>
+          </w:rPr>
+          <w:t xml:space="preserve">23</w:t>
+        </w:r>
+      </w:hyperlink>
+      <w:r>
+        <w:t xml:space="preserve">]</w:t>
+      </w:r>
+      <w:r>
+        <w:t xml:space="preserve"> </w:t>
+      </w:r>
+      <w:r>
+        <w:t xml:space="preserve">Which ACOs used the option bears on how benchmark rules sort ACOs, but to</w:t>
+      </w:r>
+      <w:r>
+        <w:t xml:space="preserve"> </w:t>
+      </w:r>
+      <w:r>
+        <w:t xml:space="preserve">the author’s knowledge it has not been studied in the peer-reviewed literature.</w:t>
       </w:r>
     </w:p>
     <w:p>
@@ -1138,7 +1202,7 @@
           <w:rPr>
             <w:rStyle w:val="Hyperlink"/>
           </w:rPr>
-          <w:t xml:space="preserve">22</w:t>
+          <w:t xml:space="preserve">24</w:t>
         </w:r>
       </w:hyperlink>
       <w:r>
@@ -1197,7 +1261,7 @@
           <w:rPr>
             <w:rStyle w:val="Hyperlink"/>
           </w:rPr>
-          <w:t xml:space="preserve">23</w:t>
+          <w:t xml:space="preserve">25</w:t>
         </w:r>
       </w:hyperlink>
       <w:r>
@@ -1229,7 +1293,7 @@
           <w:rPr>
             <w:rStyle w:val="Hyperlink"/>
           </w:rPr>
-          <w:t xml:space="preserve">22</w:t>
+          <w:t xml:space="preserve">24</w:t>
         </w:r>
       </w:hyperlink>
       <w:r>
@@ -1240,7 +1304,7 @@
           <w:rPr>
             <w:rStyle w:val="Hyperlink"/>
           </w:rPr>
-          <w:t xml:space="preserve">24</w:t>
+          <w:t xml:space="preserve">26</w:t>
         </w:r>
       </w:hyperlink>
       <w:r>
@@ -1262,7 +1326,25 @@
         <w:t xml:space="preserve"> </w:t>
       </w:r>
       <w:r>
-        <w:t xml:space="preserve">were used. The registry’s own timestamp, rather than the repository’s commit dates, establishes that order. The code</w:t>
+        <w:t xml:space="preserve">were used. The enrollment files include each ACO’s track and BASIC level, so the H3 prediction for the BASIC level</w:t>
+      </w:r>
+      <w:r>
+        <w:t xml:space="preserve"> </w:t>
+      </w:r>
+      <w:r>
+        <w:t xml:space="preserve">was made with those data available: it is preregistered but not blind to them. No savings rate, spending value,</w:t>
+      </w:r>
+      <w:r>
+        <w:t xml:space="preserve"> </w:t>
+      </w:r>
+      <w:r>
+        <w:t xml:space="preserve">benchmark or constructed variable was seen. The registry’s own timestamp, rather than the repository’s commit dates,</w:t>
+      </w:r>
+      <w:r>
+        <w:t xml:space="preserve"> </w:t>
+      </w:r>
+      <w:r>
+        <w:t xml:space="preserve">establishes that order. The code</w:t>
       </w:r>
       <w:r>
         <w:t xml:space="preserve"> </w:t>
@@ -1343,7 +1425,7 @@
           <w:rPr>
             <w:rStyle w:val="Hyperlink"/>
           </w:rPr>
-          <w:t xml:space="preserve">25</w:t>
+          <w:t xml:space="preserve">27</w:t>
         </w:r>
       </w:hyperlink>
       <w:r>
@@ -1354,7 +1436,7 @@
           <w:rPr>
             <w:rStyle w:val="Hyperlink"/>
           </w:rPr>
-          <w:t xml:space="preserve">27</w:t>
+          <w:t xml:space="preserve">29</w:t>
         </w:r>
       </w:hyperlink>
       <w:r>
@@ -1398,7 +1480,7 @@
           <w:rPr>
             <w:rStyle w:val="Hyperlink"/>
           </w:rPr>
-          <w:t xml:space="preserve">28</w:t>
+          <w:t xml:space="preserve">30</w:t>
         </w:r>
       </w:hyperlink>
       <w:r>
@@ -1424,7 +1506,7 @@
           <w:rPr>
             <w:rStyle w:val="Hyperlink"/>
           </w:rPr>
-          <w:t xml:space="preserve">29</w:t>
+          <w:t xml:space="preserve">31</w:t>
         </w:r>
       </w:hyperlink>
       <w:r>
@@ -1510,13 +1592,25 @@
         <w:t xml:space="preserve"> </w:t>
       </w:r>
       <w:r>
-        <w:t xml:space="preserve">(277 ACOs), those in the same agreement in PY2022. The 28 ACOs absent from the PY2022</w:t>
-      </w:r>
-      <w:r>
-        <w:t xml:space="preserve"> </w:t>
-      </w:r>
-      <w:r>
-        <w:t xml:space="preserve">file (left after PY2021) were described but entered no registered test (Figure 1).</w:t>
+        <w:t xml:space="preserve">(277 ACOs), those in the same agreement in PY2022; 42 stayers later renewed early into</w:t>
+      </w:r>
+      <w:r>
+        <w:t xml:space="preserve"> </w:t>
+      </w:r>
+      <w:r>
+        <w:t xml:space="preserve">2023 or 2024 agreements, so the comparison concerns the 2022 decision. The 28 ACOs absent from the PY2022 file (left</w:t>
+      </w:r>
+      <w:r>
+        <w:t xml:space="preserve"> </w:t>
+      </w:r>
+      <w:r>
+        <w:t xml:space="preserve">after PY2021) were described but entered no registered test (Figure 1). Of the 356 ACOs from these cohorts in the</w:t>
+      </w:r>
+      <w:r>
+        <w:t xml:space="preserve"> </w:t>
+      </w:r>
+      <w:r>
+        <w:t xml:space="preserve">PY2020 enrollment file, 22 were absent from the PY2021 file, and none had renewed into a 2021 agreement.</w:t>
       </w:r>
     </w:p>
     <w:bookmarkEnd w:id="16"/>
@@ -1610,7 +1704,7 @@
           <w:rPr>
             <w:rStyle w:val="Hyperlink"/>
           </w:rPr>
-          <w:t xml:space="preserve">30</w:t>
+          <w:t xml:space="preserve">32</w:t>
         </w:r>
       </w:hyperlink>
       <w:r>
@@ -2179,13 +2273,27 @@
         <w:t xml:space="preserve"> </w:t>
       </w:r>
       <w:r>
-        <w:t xml:space="preserve">BASIC level reflects both the glide path’s schedule and its own earlier choices: ACOs choose their entry level, can</w:t>
-      </w:r>
-      <w:r>
-        <w:t xml:space="preserve"> </w:t>
-      </w:r>
-      <w:r>
-        <w:t xml:space="preserve">advance faster, and could pause the advance for 2021.</w:t>
+        <w:t xml:space="preserve">BASIC level reflects both the glide path’s schedule and its own earlier choices: ACOs choose their entry level, can advance faster, and could pause the advance for 2021; ACOs experienced with performance-based risk could enter</w:t>
+      </w:r>
+      <w:r>
+        <w:t xml:space="preserve"> </w:t>
+      </w:r>
+      <w:r>
+        <w:t xml:space="preserve">only Level E or ENHANCED.</w:t>
+      </w:r>
+      <w:r>
+        <w:t xml:space="preserve">[</w:t>
+      </w:r>
+      <w:hyperlink w:anchor="ref-cfr425600">
+        <w:r>
+          <w:rPr>
+            <w:rStyle w:val="Hyperlink"/>
+          </w:rPr>
+          <w:t xml:space="preserve">33</w:t>
+        </w:r>
+      </w:hyperlink>
+      <w:r>
+        <w:t xml:space="preserve">]</w:t>
       </w:r>
     </w:p>
     <w:p>
@@ -2412,7 +2520,7 @@
           <w:rPr>
             <w:rStyle w:val="Hyperlink"/>
           </w:rPr>
-          <w:t xml:space="preserve">31</w:t>
+          <w:t xml:space="preserve">34</w:t>
         </w:r>
       </w:hyperlink>
       <w:r>
@@ -2622,7 +2730,7 @@
           <w:rPr>
             <w:rStyle w:val="Hyperlink"/>
           </w:rPr>
-          <w:t xml:space="preserve">32</w:t>
+          <w:t xml:space="preserve">35</w:t>
         </w:r>
       </w:hyperlink>
       <w:r>
@@ -2694,7 +2802,7 @@
           <w:rPr>
             <w:rStyle w:val="Hyperlink"/>
           </w:rPr>
-          <w:t xml:space="preserve">33</w:t>
+          <w:t xml:space="preserve">36</w:t>
         </w:r>
       </w:hyperlink>
       <w:r>
@@ -2714,7 +2822,7 @@
           <w:rPr>
             <w:rStyle w:val="Hyperlink"/>
           </w:rPr>
-          <w:t xml:space="preserve">34</w:t>
+          <w:t xml:space="preserve">37</w:t>
         </w:r>
       </w:hyperlink>
       <w:r>
@@ -2740,7 +2848,7 @@
           <w:rPr>
             <w:rStyle w:val="Hyperlink"/>
           </w:rPr>
-          <w:t xml:space="preserve">35</w:t>
+          <w:t xml:space="preserve">38</w:t>
         </w:r>
       </w:hyperlink>
       <w:r>
@@ -2811,7 +2919,7 @@
           <w:rPr>
             <w:rStyle w:val="Hyperlink"/>
           </w:rPr>
-          <w:t xml:space="preserve">36</w:t>
+          <w:t xml:space="preserve">39</w:t>
         </w:r>
       </w:hyperlink>
       <w:r>
@@ -2831,7 +2939,7 @@
           <w:rPr>
             <w:rStyle w:val="Hyperlink"/>
           </w:rPr>
-          <w:t xml:space="preserve">37</w:t>
+          <w:t xml:space="preserve">40</w:t>
         </w:r>
       </w:hyperlink>
       <w:r>
@@ -2842,7 +2950,7 @@
           <w:rPr>
             <w:rStyle w:val="Hyperlink"/>
           </w:rPr>
-          <w:t xml:space="preserve">38</w:t>
+          <w:t xml:space="preserve">41</w:t>
         </w:r>
       </w:hyperlink>
       <w:r>
@@ -2886,7 +2994,7 @@
           <w:rPr>
             <w:rStyle w:val="Hyperlink"/>
           </w:rPr>
-          <w:t xml:space="preserve">39</w:t>
+          <w:t xml:space="preserve">42</w:t>
         </w:r>
       </w:hyperlink>
       <w:r>
@@ -3045,7 +3153,7 @@
           <w:rPr>
             <w:rStyle w:val="Hyperlink"/>
           </w:rPr>
-          <w:t xml:space="preserve">40</w:t>
+          <w:t xml:space="preserve">43</w:t>
         </w:r>
       </w:hyperlink>
       <w:r>
@@ -3071,7 +3179,7 @@
           <w:rPr>
             <w:rStyle w:val="Hyperlink"/>
           </w:rPr>
-          <w:t xml:space="preserve">41</w:t>
+          <w:t xml:space="preserve">44</w:t>
         </w:r>
       </w:hyperlink>
       <w:r>
@@ -3097,7 +3205,7 @@
           <w:rPr>
             <w:rStyle w:val="Hyperlink"/>
           </w:rPr>
-          <w:t xml:space="preserve">42</w:t>
+          <w:t xml:space="preserve">45</w:t>
         </w:r>
       </w:hyperlink>
       <w:r>
@@ -3135,7 +3243,7 @@
           <w:rPr>
             <w:rStyle w:val="Hyperlink"/>
           </w:rPr>
-          <w:t xml:space="preserve">43</w:t>
+          <w:t xml:space="preserve">46</w:t>
         </w:r>
       </w:hyperlink>
       <w:r>
@@ -3152,7 +3260,7 @@
           <w:rPr>
             <w:rStyle w:val="Hyperlink"/>
           </w:rPr>
-          <w:t xml:space="preserve">44</w:t>
+          <w:t xml:space="preserve">47</w:t>
         </w:r>
       </w:hyperlink>
       <w:r>
@@ -3388,7 +3496,7 @@
           <w:rPr>
             <w:rStyle w:val="Hyperlink"/>
           </w:rPr>
-          <w:t xml:space="preserve">45</w:t>
+          <w:t xml:space="preserve">48</w:t>
         </w:r>
       </w:hyperlink>
       <w:r>
@@ -3408,7 +3516,7 @@
           <w:rPr>
             <w:rStyle w:val="Hyperlink"/>
           </w:rPr>
-          <w:t xml:space="preserve">46</w:t>
+          <w:t xml:space="preserve">49</w:t>
         </w:r>
       </w:hyperlink>
       <w:r>
@@ -3434,7 +3542,7 @@
           <w:rPr>
             <w:rStyle w:val="Hyperlink"/>
           </w:rPr>
-          <w:t xml:space="preserve">47</w:t>
+          <w:t xml:space="preserve">50</w:t>
         </w:r>
       </w:hyperlink>
       <w:r>
@@ -3472,7 +3580,7 @@
           <w:rPr>
             <w:rStyle w:val="Hyperlink"/>
           </w:rPr>
-          <w:t xml:space="preserve">48</w:t>
+          <w:t xml:space="preserve">51</w:t>
         </w:r>
       </w:hyperlink>
       <w:r>
@@ -3492,7 +3600,7 @@
           <w:rPr>
             <w:rStyle w:val="Hyperlink"/>
           </w:rPr>
-          <w:t xml:space="preserve">49</w:t>
+          <w:t xml:space="preserve">52</w:t>
         </w:r>
       </w:hyperlink>
       <w:r>
@@ -3518,7 +3626,7 @@
           <w:rPr>
             <w:rStyle w:val="Hyperlink"/>
           </w:rPr>
-          <w:t xml:space="preserve">50</w:t>
+          <w:t xml:space="preserve">53</w:t>
         </w:r>
       </w:hyperlink>
       <w:r>
@@ -3538,7 +3646,7 @@
           <w:rPr>
             <w:rStyle w:val="Hyperlink"/>
           </w:rPr>
-          <w:t xml:space="preserve">51</w:t>
+          <w:t xml:space="preserve">54</w:t>
         </w:r>
       </w:hyperlink>
       <w:r>
@@ -3564,7 +3672,7 @@
           <w:rPr>
             <w:rStyle w:val="Hyperlink"/>
           </w:rPr>
-          <w:t xml:space="preserve">52</w:t>
+          <w:t xml:space="preserve">55</w:t>
         </w:r>
       </w:hyperlink>
       <w:r>
@@ -3710,7 +3818,13 @@
         <w:t xml:space="preserve"> </w:t>
       </w:r>
       <w:r>
-        <w:t xml:space="preserve">to the study sample. By the registered error model, the component is mostly noise at the level of one ACO; the savings</w:t>
+        <w:t xml:space="preserve">to the study sample; a scale estimate from the median error (1.4826 × 1.4 ≈ 2.1) would be below the stayers’ SD.</w:t>
+      </w:r>
+      <w:r>
+        <w:t xml:space="preserve"> </w:t>
+      </w:r>
+      <w:r>
+        <w:t xml:space="preserve">By the registered error model, the component is mostly noise at the level of one ACO; the savings</w:t>
       </w:r>
       <w:r>
         <w:t xml:space="preserve"> </w:t>
@@ -3736,7 +3850,7 @@
         <w:t xml:space="preserve"> </w:t>
       </w:r>
       <w:r>
-        <w:t xml:space="preserve">ENHANCED in their new agreements, and no stayer moved to ENHANCED. The expected-gain variables could not be built for</w:t>
+        <w:t xml:space="preserve">ENHANCED in their new agreements; stayers could not, because the rules bar that move within an agreement period. The expected-gain variables could not be built for</w:t>
       </w:r>
       <w:r>
         <w:t xml:space="preserve"> </w:t>
@@ -5229,13 +5343,31 @@
         <w:t xml:space="preserve"> </w:t>
       </w:r>
       <w:r>
-        <w:t xml:space="preserve">early renewers’ regions spent more relative to their current benchmarks, evidence for the reset motive beyond past</w:t>
-      </w:r>
-      <w:r>
-        <w:t xml:space="preserve"> </w:t>
-      </w:r>
-      <w:r>
-        <w:t xml:space="preserve">savings. At the median PY2021 benchmark of the study’s ACOs, $11,312 per beneficiary per year, the difference of 3.35</w:t>
+        <w:t xml:space="preserve">early renewers’ regions spent more relative to their current benchmarks, evidence for the reset motive beyond past savings. The decomposition qualifies that reading. Weighted by the phase-in</w:t>
+      </w:r>
+      <w:r>
+        <w:t xml:space="preserve"> </w:t>
+      </w:r>
+      <w:r>
+        <w:t xml:space="preserve">weight, the pull difference was 1.6 points (eTable 9), and the regional component differed by the same 1.6 points</w:t>
+      </w:r>
+      <w:r>
+        <w:t xml:space="preserve"> </w:t>
+      </w:r>
+      <w:r>
+        <w:t xml:space="preserve">partly because a lower own-spending component also raises it; the total expected gain did not differ. The pull</w:t>
+      </w:r>
+      <w:r>
+        <w:t xml:space="preserve"> </w:t>
+      </w:r>
+      <w:r>
+        <w:t xml:space="preserve">difference therefore indicates that early renewers were low-cost relative to their regions more than that they stood</w:t>
+      </w:r>
+      <w:r>
+        <w:t xml:space="preserve"> </w:t>
+      </w:r>
+      <w:r>
+        <w:t xml:space="preserve">to gain a higher benchmark. At the median PY2021 benchmark of the study’s ACOs, $11,312 per beneficiary per year, the difference of 3.35</w:t>
       </w:r>
       <w:r>
         <w:t xml:space="preserve"> </w:t>
@@ -5511,7 +5643,7 @@
                 <w:b/>
                 <w:bCs/>
               </w:rPr>
-              <w:t xml:space="preserve">1.000</w:t>
+              <w:t xml:space="preserve">&gt;0.999</w:t>
             </w:r>
           </w:p>
         </w:tc>
@@ -5695,7 +5827,7 @@
               <w:jc w:val="right"/>
             </w:pPr>
             <w:r>
-              <w:t xml:space="preserve">1.000</w:t>
+              <w:t xml:space="preserve">&gt;0.999</w:t>
             </w:r>
           </w:p>
         </w:tc>
@@ -5937,7 +6069,7 @@
               <w:jc w:val="right"/>
             </w:pPr>
             <w:r>
-              <w:t xml:space="preserve">1.000</w:t>
+              <w:t xml:space="preserve">&gt;0.999</w:t>
             </w:r>
           </w:p>
         </w:tc>
@@ -6218,7 +6350,7 @@
           <w:rPr>
             <w:rStyle w:val="Hyperlink"/>
           </w:rPr>
-          <w:t xml:space="preserve">53</w:t>
+          <w:t xml:space="preserve">56</w:t>
         </w:r>
       </w:hyperlink>
       <w:r>
@@ -8248,7 +8380,39 @@
         <w:t xml:space="preserve"> </w:t>
       </w:r>
       <w:r>
-        <w:t xml:space="preserve">spending. The finding that early renewers were savers fits reports that ACOs earning bonuses survived longer in the</w:t>
+        <w:t xml:space="preserve">spending. An industry analysis of the same rebasing cohort found that ACOs rebasing early in 2022 had higher gross</w:t>
+      </w:r>
+      <w:r>
+        <w:t xml:space="preserve"> </w:t>
+      </w:r>
+      <w:r>
+        <w:t xml:space="preserve">savings rates beforehand and that the earlier incumbents among them moved to ENHANCED,</w:t>
+      </w:r>
+      <w:r>
+        <w:t xml:space="preserve">[</w:t>
+      </w:r>
+      <w:hyperlink w:anchor="ref-milliman2024">
+        <w:r>
+          <w:rPr>
+            <w:rStyle w:val="Hyperlink"/>
+          </w:rPr>
+          <w:t xml:space="preserve">22</w:t>
+        </w:r>
+      </w:hyperlink>
+      <w:r>
+        <w:t xml:space="preserve">]</w:t>
+      </w:r>
+      <w:r>
+        <w:t xml:space="preserve"> </w:t>
+      </w:r>
+      <w:r>
+        <w:t xml:space="preserve">consistent with</w:t>
+      </w:r>
+      <w:r>
+        <w:t xml:space="preserve"> </w:t>
+      </w:r>
+      <w:r>
+        <w:t xml:space="preserve">H1 and the BASIC-level association here. The finding that early renewers were savers also fits reports that ACOs earning bonuses survived longer in the</w:t>
       </w:r>
       <w:r>
         <w:t xml:space="preserve"> </w:t>
@@ -8404,25 +8568,45 @@
         <w:t xml:space="preserve"> </w:t>
       </w:r>
       <w:r>
-        <w:t xml:space="preserve">In these data renewing early and moving to ENHANCED were one choice: 26 of the 27 BASIC-track early renewers moved to</w:t>
-      </w:r>
-      <w:r>
-        <w:t xml:space="preserve"> </w:t>
-      </w:r>
-      <w:r>
-        <w:t xml:space="preserve">ENHANCED, and no stayer did. ACOs already bearing two-sided risk at Level E faced a short step to ENHANCED’s 75%</w:t>
-      </w:r>
-      <w:r>
-        <w:t xml:space="preserve"> </w:t>
-      </w:r>
-      <w:r>
-        <w:t xml:space="preserve">sharing rate. Because ACOs partly choose their BASIC level, the association may also reflect an appetite for risk</w:t>
-      </w:r>
-      <w:r>
-        <w:t xml:space="preserve"> </w:t>
-      </w:r>
-      <w:r>
-        <w:t xml:space="preserve">rather than only proximity to ENHANCED. A high regional pull is also a plausible reason to want the higher rate,</w:t>
+        <w:t xml:space="preserve">In these data renewing early and moving to ENHANCED were one choice: 26 of the 27 BASIC-track early renewers moved to ENHANCED, and the rules let no stayer do so. ACOs already bearing two-sided risk at Level E faced a short step to ENHANCED’s 75%</w:t>
+      </w:r>
+      <w:r>
+        <w:t xml:space="preserve"> </w:t>
+      </w:r>
+      <w:r>
+        <w:t xml:space="preserve">sharing rate. Because ACOs partly choose their BASIC level, and ACOs experienced with performance-based risk could</w:t>
+      </w:r>
+      <w:r>
+        <w:t xml:space="preserve"> </w:t>
+      </w:r>
+      <w:r>
+        <w:t xml:space="preserve">enter only Level E or ENHANCED,</w:t>
+      </w:r>
+      <w:r>
+        <w:t xml:space="preserve">[</w:t>
+      </w:r>
+      <w:hyperlink w:anchor="ref-cfr425600">
+        <w:r>
+          <w:rPr>
+            <w:rStyle w:val="Hyperlink"/>
+          </w:rPr>
+          <w:t xml:space="preserve">33</w:t>
+        </w:r>
+      </w:hyperlink>
+      <w:r>
+        <w:t xml:space="preserve">]</w:t>
+      </w:r>
+      <w:r>
+        <w:t xml:space="preserve"> </w:t>
+      </w:r>
+      <w:r>
+        <w:t xml:space="preserve">the association may also reflect earlier risk experience or appetite rather</w:t>
+      </w:r>
+      <w:r>
+        <w:t xml:space="preserve"> </w:t>
+      </w:r>
+      <w:r>
+        <w:t xml:space="preserve">than only proximity to ENHANCED. A high regional pull is also a plausible reason to want the higher rate,</w:t>
       </w:r>
       <w:r>
         <w:t xml:space="preserve"> </w:t>
@@ -8470,7 +8654,13 @@
         <w:t xml:space="preserve"> </w:t>
       </w:r>
       <w:r>
-        <w:t xml:space="preserve">benchmark overall, with a higher sharing rate available to almost all of them. That is selection into an option the</w:t>
+        <w:t xml:space="preserve">benchmark overall, with a higher sharing rate available to almost all of them. The 2024 rules also offer a test: 34</w:t>
+      </w:r>
+      <w:r>
+        <w:t xml:space="preserve"> </w:t>
+      </w:r>
+      <w:r>
+        <w:t xml:space="preserve">stayers renewed early into 2024 agreements under them. That is selection into an option the</w:t>
       </w:r>
       <w:r>
         <w:t xml:space="preserve"> </w:t>
@@ -8504,7 +8694,7 @@
           <w:rPr>
             <w:rStyle w:val="Hyperlink"/>
           </w:rPr>
-          <w:t xml:space="preserve">54</w:t>
+          <w:t xml:space="preserve">57</w:t>
         </w:r>
       </w:hyperlink>
       <w:r>
@@ -8586,13 +8776,19 @@
         <w:t xml:space="preserve"> </w:t>
       </w:r>
       <w:r>
-        <w:t xml:space="preserve">not have when they decided; validation bounds its error in benchmark levels, but the own-spending component’s</w:t>
-      </w:r>
-      <w:r>
-        <w:t xml:space="preserve"> </w:t>
-      </w:r>
-      <w:r>
-        <w:t xml:space="preserve">estimated error exceeds its spread, so H2a and the total gain are weak evidence for any single ACO, and the regional</w:t>
+        <w:t xml:space="preserve">not have when they decided. Validation was on benchmark levels, which vary widely across ACOs, while the hypotheses</w:t>
+      </w:r>
+      <w:r>
+        <w:t xml:space="preserve"> </w:t>
+      </w:r>
+      <w:r>
+        <w:t xml:space="preserve">concern differences of a few points of the benchmark, so it says less about the accuracy of the gain than its</w:t>
+      </w:r>
+      <w:r>
+        <w:t xml:space="preserve"> </w:t>
+      </w:r>
+      <w:r>
+        <w:t xml:space="preserve">correlation suggests; the own-spending component’s estimated error exceeds its spread, so H2a and the total gain are weak evidence for any single ACO, and the regional</w:t>
       </w:r>
       <w:r>
         <w:t xml:space="preserve"> </w:t>
@@ -8604,7 +8800,19 @@
         <w:t xml:space="preserve"> </w:t>
       </w:r>
       <w:r>
-        <w:t xml:space="preserve">supported coefficients are probably overestimates. Fourth, exclusions exceeded the plan’s 10% line in both groups,</w:t>
+        <w:t xml:space="preserve">supported coefficients are probably overestimates. ACOs under common ownership may decide together, and ACOs in the</w:t>
+      </w:r>
+      <w:r>
+        <w:t xml:space="preserve"> </w:t>
+      </w:r>
+      <w:r>
+        <w:t xml:space="preserve">same market share regional spending, so the effective sample is smaller than the ACO count, and the permutation tests,</w:t>
+      </w:r>
+      <w:r>
+        <w:t xml:space="preserve"> </w:t>
+      </w:r>
+      <w:r>
+        <w:t xml:space="preserve">which treat ACOs as exchangeable within cohort, may overstate precision. Fourth, exclusions exceeded the plan’s 10% line in both groups,</w:t>
       </w:r>
       <w:r>
         <w:t xml:space="preserve"> </w:t>
@@ -8622,7 +8830,33 @@
         <w:t xml:space="preserve"> </w:t>
       </w:r>
       <w:r>
-        <w:t xml:space="preserve">during 2021, the last pre-period year and a benchmark year of the new agreement, so anticipation is possible; and</w:t>
+        <w:t xml:space="preserve">during 2021, the last pre-period year and a benchmark year of the new agreement, while trade groups were asking CMS to allow</w:t>
+      </w:r>
+      <w:r>
+        <w:t xml:space="preserve"> </w:t>
+      </w:r>
+      <w:r>
+        <w:t xml:space="preserve">pre-pandemic benchmark years,</w:t>
+      </w:r>
+      <w:r>
+        <w:t xml:space="preserve">[</w:t>
+      </w:r>
+      <w:hyperlink w:anchor="ref-aha2021">
+        <w:r>
+          <w:rPr>
+            <w:rStyle w:val="Hyperlink"/>
+          </w:rPr>
+          <w:t xml:space="preserve">58</w:t>
+        </w:r>
+      </w:hyperlink>
+      <w:r>
+        <w:t xml:space="preserve">]</w:t>
+      </w:r>
+      <w:r>
+        <w:t xml:space="preserve"> </w:t>
+      </w:r>
+      <w:r>
+        <w:t xml:space="preserve">so anticipation and timing effects are possible; and</w:t>
       </w:r>
       <w:r>
         <w:t xml:space="preserve"> </w:t>
@@ -8634,13 +8868,19 @@
         <w:t xml:space="preserve"> </w:t>
       </w:r>
       <w:r>
-        <w:t xml:space="preserve">early renewers and 14 of 277 stayers) rather than through behavior. Sixth, the base population required a PY2021</w:t>
-      </w:r>
-      <w:r>
-        <w:t xml:space="preserve"> </w:t>
-      </w:r>
-      <w:r>
-        <w:t xml:space="preserve">enrollment record, and leavers, a third choice with a mean pull similar to early renewers’, were set aside by</w:t>
+        <w:t xml:space="preserve">early renewers and 14 of 277 stayers) rather than through behavior. Sixth, the base population required a PY2021 enrollment record (22 cohort ACOs left before then); stayers include</w:t>
+      </w:r>
+      <w:r>
+        <w:t xml:space="preserve"> </w:t>
+      </w:r>
+      <w:r>
+        <w:t xml:space="preserve">42 ACOs that renewed early in 2023 or 2024, so H2 and H3 describe the 2022 decision rather than early renewal at any</w:t>
+      </w:r>
+      <w:r>
+        <w:t xml:space="preserve"> </w:t>
+      </w:r>
+      <w:r>
+        <w:t xml:space="preserve">time; and leavers, a third choice with a mean pull similar to early renewers’, were set aside by</w:t>
       </w:r>
       <w:r>
         <w:t xml:space="preserve"> </w:t>
@@ -8756,7 +8996,7 @@
           <w:rPr>
             <w:rStyle w:val="Hyperlink"/>
           </w:rPr>
-          <w:t xml:space="preserve">25</w:t>
+          <w:t xml:space="preserve">27</w:t>
         </w:r>
       </w:hyperlink>
       <w:r>
@@ -8767,7 +9007,7 @@
           <w:rPr>
             <w:rStyle w:val="Hyperlink"/>
           </w:rPr>
-          <w:t xml:space="preserve">27</w:t>
+          <w:t xml:space="preserve">29</w:t>
         </w:r>
       </w:hyperlink>
       <w:r>
@@ -8799,7 +9039,7 @@
           <w:rPr>
             <w:rStyle w:val="Hyperlink"/>
           </w:rPr>
-          <w:t xml:space="preserve">24</w:t>
+          <w:t xml:space="preserve">26</w:t>
         </w:r>
       </w:hyperlink>
       <w:r>
@@ -8825,7 +9065,7 @@
           <w:rPr>
             <w:rStyle w:val="Hyperlink"/>
           </w:rPr>
-          <w:t xml:space="preserve">28</w:t>
+          <w:t xml:space="preserve">30</w:t>
         </w:r>
       </w:hyperlink>
       <w:r>
@@ -8909,7 +9149,7 @@
           <w:rPr>
             <w:rStyle w:val="Hyperlink"/>
           </w:rPr>
-          <w:t xml:space="preserve">24</w:t>
+          <w:t xml:space="preserve">26</w:t>
         </w:r>
       </w:hyperlink>
       <w:r>
@@ -8935,7 +9175,7 @@
           <w:rPr>
             <w:rStyle w:val="Hyperlink"/>
           </w:rPr>
-          <w:t xml:space="preserve">55</w:t>
+          <w:t xml:space="preserve">59</w:t>
         </w:r>
       </w:hyperlink>
       <w:r>
@@ -8975,7 +9215,49 @@
         <w:t xml:space="preserve"> </w:t>
       </w:r>
       <w:r>
-        <w:t xml:space="preserve">The author declares no competing interests.</w:t>
+        <w:t xml:space="preserve">The author is employed as a data scientist at Indiana University Health. This study was</w:t>
+      </w:r>
+      <w:r>
+        <w:t xml:space="preserve"> </w:t>
+      </w:r>
+      <w:r>
+        <w:t xml:space="preserve">conducted independently of that employment, using only public data, and Indiana University Health had no role in its</w:t>
+      </w:r>
+      <w:r>
+        <w:t xml:space="preserve"> </w:t>
+      </w:r>
+      <w:r>
+        <w:t xml:space="preserve">design, analysis, interpretation or reporting. Indiana University Health’s ACO participated in the Shared Savings</w:t>
+      </w:r>
+      <w:r>
+        <w:t xml:space="preserve"> </w:t>
+      </w:r>
+      <w:r>
+        <w:t xml:space="preserve">Program only in 2014-2016 and is not in the study cohorts. The author declares no other competing interests.</w:t>
+      </w:r>
+    </w:p>
+    <w:p>
+      <w:pPr>
+        <w:pStyle w:val="BodyText"/>
+      </w:pPr>
+      <w:r>
+        <w:rPr>
+          <w:b/>
+          <w:bCs/>
+        </w:rPr>
+        <w:t xml:space="preserve">Disclaimer:</w:t>
+      </w:r>
+      <w:r>
+        <w:t xml:space="preserve"> </w:t>
+      </w:r>
+      <w:r>
+        <w:t xml:space="preserve">The views expressed are the author’s own and do not represent the official positions of Indiana</w:t>
+      </w:r>
+      <w:r>
+        <w:t xml:space="preserve"> </w:t>
+      </w:r>
+      <w:r>
+        <w:t xml:space="preserve">University Health.</w:t>
       </w:r>
     </w:p>
     <w:p>
@@ -9045,7 +9327,7 @@
       </w:r>
     </w:p>
     <w:bookmarkEnd w:id="47"/>
-    <w:bookmarkStart w:id="158" w:name="references"/>
+    <w:bookmarkStart w:id="166" w:name="references"/>
     <w:p>
       <w:pPr>
         <w:pStyle w:val="Heading1"/>
@@ -9054,7 +9336,7 @@
         <w:t xml:space="preserve">References</w:t>
       </w:r>
     </w:p>
-    <w:bookmarkStart w:id="157" w:name="refs"/>
+    <w:bookmarkStart w:id="165" w:name="refs"/>
     <w:bookmarkStart w:id="49" w:name="ref-cfr425"/>
     <w:p>
       <w:pPr>
@@ -10014,7 +10296,7 @@
       </w:hyperlink>
     </w:p>
     <w:bookmarkEnd w:id="89"/>
-    <w:bookmarkStart w:id="90" w:name="ref-registration"/>
+    <w:bookmarkStart w:id="91" w:name="ref-milliman2024"/>
     <w:p>
       <w:pPr>
         <w:pStyle w:val="Bibliography"/>
@@ -10029,6 +10311,253 @@
         <w:t xml:space="preserve">	</w:t>
       </w:r>
       <w:r>
+        <w:t xml:space="preserve">Smith M, Jensen B, Anderson J, Lockett K.</w:t>
+      </w:r>
+      <w:r>
+        <w:t xml:space="preserve"> </w:t>
+      </w:r>
+      <w:r>
+        <w:rPr>
+          <w:i/>
+          <w:iCs/>
+        </w:rPr>
+        <w:t xml:space="preserve">Medicare</w:t>
+      </w:r>
+      <w:r>
+        <w:rPr>
+          <w:i/>
+          <w:iCs/>
+        </w:rPr>
+        <w:t xml:space="preserve"> </w:t>
+      </w:r>
+      <w:r>
+        <w:rPr>
+          <w:i/>
+          <w:iCs/>
+        </w:rPr>
+        <w:t xml:space="preserve">Shared</w:t>
+      </w:r>
+      <w:r>
+        <w:rPr>
+          <w:i/>
+          <w:iCs/>
+        </w:rPr>
+        <w:t xml:space="preserve"> </w:t>
+      </w:r>
+      <w:r>
+        <w:rPr>
+          <w:i/>
+          <w:iCs/>
+        </w:rPr>
+        <w:t xml:space="preserve">Savings</w:t>
+      </w:r>
+      <w:r>
+        <w:rPr>
+          <w:i/>
+          <w:iCs/>
+        </w:rPr>
+        <w:t xml:space="preserve"> </w:t>
+      </w:r>
+      <w:r>
+        <w:rPr>
+          <w:i/>
+          <w:iCs/>
+        </w:rPr>
+        <w:t xml:space="preserve">Program</w:t>
+      </w:r>
+      <w:r>
+        <w:rPr>
+          <w:i/>
+          <w:iCs/>
+        </w:rPr>
+        <w:t xml:space="preserve">:</w:t>
+      </w:r>
+      <w:r>
+        <w:rPr>
+          <w:i/>
+          <w:iCs/>
+        </w:rPr>
+        <w:t xml:space="preserve"> </w:t>
+      </w:r>
+      <w:r>
+        <w:rPr>
+          <w:i/>
+          <w:iCs/>
+        </w:rPr>
+        <w:t xml:space="preserve">ACO</w:t>
+      </w:r>
+      <w:r>
+        <w:rPr>
+          <w:i/>
+          <w:iCs/>
+        </w:rPr>
+        <w:t xml:space="preserve"> </w:t>
+      </w:r>
+      <w:r>
+        <w:rPr>
+          <w:i/>
+          <w:iCs/>
+        </w:rPr>
+        <w:t xml:space="preserve">Financial Results for 2022</w:t>
+      </w:r>
+      <w:r>
+        <w:t xml:space="preserve">. Milliman; 2024.</w:t>
+      </w:r>
+      <w:r>
+        <w:t xml:space="preserve"> </w:t>
+      </w:r>
+      <w:hyperlink r:id="rId90">
+        <w:r>
+          <w:rPr>
+            <w:rStyle w:val="Hyperlink"/>
+          </w:rPr>
+          <w:t xml:space="preserve">https://www.milliman.com/-/media/milliman/pdfs/2024-articles/4-2-24_medicare_shared_savings_program_aco_financial_results_for_2022.ashx</w:t>
+        </w:r>
+      </w:hyperlink>
+    </w:p>
+    <w:bookmarkEnd w:id="91"/>
+    <w:bookmarkStart w:id="93" w:name="ref-milliman2025"/>
+    <w:p>
+      <w:pPr>
+        <w:pStyle w:val="Bibliography"/>
+      </w:pPr>
+      <w:r>
+        <w:t xml:space="preserve">23.</w:t>
+      </w:r>
+      <w:r>
+        <w:t xml:space="preserve"> </w:t>
+      </w:r>
+      <w:r>
+        <w:t xml:space="preserve">	</w:t>
+      </w:r>
+      <w:r>
+        <w:t xml:space="preserve">Milliman.</w:t>
+      </w:r>
+      <w:r>
+        <w:t xml:space="preserve"> </w:t>
+      </w:r>
+      <w:r>
+        <w:rPr>
+          <w:i/>
+          <w:iCs/>
+        </w:rPr>
+        <w:t xml:space="preserve">Annual Renewal Considerations in the</w:t>
+      </w:r>
+      <w:r>
+        <w:rPr>
+          <w:i/>
+          <w:iCs/>
+        </w:rPr>
+        <w:t xml:space="preserve"> </w:t>
+      </w:r>
+      <w:r>
+        <w:rPr>
+          <w:i/>
+          <w:iCs/>
+        </w:rPr>
+        <w:t xml:space="preserve">Medicare</w:t>
+      </w:r>
+      <w:r>
+        <w:rPr>
+          <w:i/>
+          <w:iCs/>
+        </w:rPr>
+        <w:t xml:space="preserve"> </w:t>
+      </w:r>
+      <w:r>
+        <w:rPr>
+          <w:i/>
+          <w:iCs/>
+        </w:rPr>
+        <w:t xml:space="preserve">Shared</w:t>
+      </w:r>
+      <w:r>
+        <w:rPr>
+          <w:i/>
+          <w:iCs/>
+        </w:rPr>
+        <w:t xml:space="preserve"> </w:t>
+      </w:r>
+      <w:r>
+        <w:rPr>
+          <w:i/>
+          <w:iCs/>
+        </w:rPr>
+        <w:t xml:space="preserve">Savings</w:t>
+      </w:r>
+      <w:r>
+        <w:rPr>
+          <w:i/>
+          <w:iCs/>
+        </w:rPr>
+        <w:t xml:space="preserve"> </w:t>
+      </w:r>
+      <w:r>
+        <w:rPr>
+          <w:i/>
+          <w:iCs/>
+        </w:rPr>
+        <w:t xml:space="preserve">Program</w:t>
+      </w:r>
+      <w:r>
+        <w:rPr>
+          <w:i/>
+          <w:iCs/>
+        </w:rPr>
+        <w:t xml:space="preserve"> </w:t>
+      </w:r>
+      <w:r>
+        <w:rPr>
+          <w:i/>
+          <w:iCs/>
+        </w:rPr>
+        <w:t xml:space="preserve">(</w:t>
+      </w:r>
+      <w:r>
+        <w:rPr>
+          <w:i/>
+          <w:iCs/>
+        </w:rPr>
+        <w:t xml:space="preserve">MSSP</w:t>
+      </w:r>
+      <w:r>
+        <w:rPr>
+          <w:i/>
+          <w:iCs/>
+        </w:rPr>
+        <w:t xml:space="preserve">)</w:t>
+      </w:r>
+      <w:r>
+        <w:t xml:space="preserve">. Milliman; 2025.</w:t>
+      </w:r>
+      <w:r>
+        <w:t xml:space="preserve"> </w:t>
+      </w:r>
+      <w:hyperlink r:id="rId92">
+        <w:r>
+          <w:rPr>
+            <w:rStyle w:val="Hyperlink"/>
+          </w:rPr>
+          <w:t xml:space="preserve">https://edge.sitecorecloud.io/millimaninc5660-milliman6442-prod27d5-0001/media/Milliman/PDFs/2025-Articles/4-7-25_MSSP-annual-renewal-considerations.pdf</w:t>
+        </w:r>
+      </w:hyperlink>
+    </w:p>
+    <w:bookmarkEnd w:id="93"/>
+    <w:bookmarkStart w:id="94" w:name="ref-registration"/>
+    <w:p>
+      <w:pPr>
+        <w:pStyle w:val="Bibliography"/>
+      </w:pPr>
+      <w:r>
+        <w:t xml:space="preserve">24.</w:t>
+      </w:r>
+      <w:r>
+        <w:t xml:space="preserve"> </w:t>
+      </w:r>
+      <w:r>
+        <w:t xml:space="preserve">	</w:t>
+      </w:r>
+      <w:r>
         <w:t xml:space="preserve">Harrold ST. Why did</w:t>
       </w:r>
       <w:r>
@@ -10097,14 +10626,14 @@
         </w:r>
       </w:hyperlink>
     </w:p>
-    <w:bookmarkEnd w:id="90"/>
-    <w:bookmarkStart w:id="92" w:name="ref-vonelm2007"/>
+    <w:bookmarkEnd w:id="94"/>
+    <w:bookmarkStart w:id="96" w:name="ref-vonelm2007"/>
     <w:p>
       <w:pPr>
         <w:pStyle w:val="Bibliography"/>
       </w:pPr>
       <w:r>
-        <w:t xml:space="preserve">23.</w:t>
+        <w:t xml:space="preserve">25.</w:t>
       </w:r>
       <w:r>
         <w:t xml:space="preserve"> </w:t>
@@ -10128,7 +10657,7 @@
       <w:r>
         <w:t xml:space="preserve">. 2007;4(10):e296. doi:</w:t>
       </w:r>
-      <w:hyperlink r:id="rId91">
+      <w:hyperlink r:id="rId95">
         <w:r>
           <w:rPr>
             <w:rStyle w:val="Hyperlink"/>
@@ -10137,14 +10666,14 @@
         </w:r>
       </w:hyperlink>
     </w:p>
-    <w:bookmarkEnd w:id="92"/>
-    <w:bookmarkStart w:id="94" w:name="ref-code"/>
+    <w:bookmarkEnd w:id="96"/>
+    <w:bookmarkStart w:id="98" w:name="ref-code"/>
     <w:p>
       <w:pPr>
         <w:pStyle w:val="Bibliography"/>
       </w:pPr>
       <w:r>
-        <w:t xml:space="preserve">24.</w:t>
+        <w:t xml:space="preserve">26.</w:t>
       </w:r>
       <w:r>
         <w:t xml:space="preserve"> </w:t>
@@ -10176,7 +10705,7 @@
       <w:r>
         <w:t xml:space="preserve"> </w:t>
       </w:r>
-      <w:hyperlink r:id="rId93">
+      <w:hyperlink r:id="rId97">
         <w:r>
           <w:rPr>
             <w:rStyle w:val="Hyperlink"/>
@@ -10185,14 +10714,14 @@
         </w:r>
       </w:hyperlink>
     </w:p>
-    <w:bookmarkEnd w:id="94"/>
-    <w:bookmarkStart w:id="96" w:name="ref-dataresults"/>
+    <w:bookmarkEnd w:id="98"/>
+    <w:bookmarkStart w:id="100" w:name="ref-dataresults"/>
     <w:p>
       <w:pPr>
         <w:pStyle w:val="Bibliography"/>
       </w:pPr>
       <w:r>
-        <w:t xml:space="preserve">25.</w:t>
+        <w:t xml:space="preserve">27.</w:t>
       </w:r>
       <w:r>
         <w:t xml:space="preserve"> </w:t>
@@ -10206,7 +10735,7 @@
       <w:r>
         <w:t xml:space="preserve"> </w:t>
       </w:r>
-      <w:hyperlink r:id="rId95">
+      <w:hyperlink r:id="rId99">
         <w:r>
           <w:rPr>
             <w:rStyle w:val="Hyperlink"/>
@@ -10215,14 +10744,14 @@
         </w:r>
       </w:hyperlink>
     </w:p>
-    <w:bookmarkEnd w:id="96"/>
-    <w:bookmarkStart w:id="98" w:name="ref-datacounty"/>
+    <w:bookmarkEnd w:id="100"/>
+    <w:bookmarkStart w:id="102" w:name="ref-datacounty"/>
     <w:p>
       <w:pPr>
         <w:pStyle w:val="Bibliography"/>
       </w:pPr>
       <w:r>
-        <w:t xml:space="preserve">26.</w:t>
+        <w:t xml:space="preserve">28.</w:t>
       </w:r>
       <w:r>
         <w:t xml:space="preserve"> </w:t>
@@ -10236,7 +10765,7 @@
       <w:r>
         <w:t xml:space="preserve"> </w:t>
       </w:r>
-      <w:hyperlink r:id="rId97">
+      <w:hyperlink r:id="rId101">
         <w:r>
           <w:rPr>
             <w:rStyle w:val="Hyperlink"/>
@@ -10245,14 +10774,14 @@
         </w:r>
       </w:hyperlink>
     </w:p>
-    <w:bookmarkEnd w:id="98"/>
-    <w:bookmarkStart w:id="100" w:name="ref-dataassigned"/>
+    <w:bookmarkEnd w:id="102"/>
+    <w:bookmarkStart w:id="104" w:name="ref-dataassigned"/>
     <w:p>
       <w:pPr>
         <w:pStyle w:val="Bibliography"/>
       </w:pPr>
       <w:r>
-        <w:t xml:space="preserve">27.</w:t>
+        <w:t xml:space="preserve">29.</w:t>
       </w:r>
       <w:r>
         <w:t xml:space="preserve"> </w:t>
@@ -10266,7 +10795,7 @@
       <w:r>
         <w:t xml:space="preserve"> </w:t>
       </w:r>
-      <w:hyperlink r:id="rId99">
+      <w:hyperlink r:id="rId103">
         <w:r>
           <w:rPr>
             <w:rStyle w:val="Hyperlink"/>
@@ -10275,14 +10804,14 @@
         </w:r>
       </w:hyperlink>
     </w:p>
-    <w:bookmarkEnd w:id="100"/>
-    <w:bookmarkStart w:id="102" w:name="ref-osfproject"/>
+    <w:bookmarkEnd w:id="104"/>
+    <w:bookmarkStart w:id="106" w:name="ref-osfproject"/>
     <w:p>
       <w:pPr>
         <w:pStyle w:val="Bibliography"/>
       </w:pPr>
       <w:r>
-        <w:t xml:space="preserve">28.</w:t>
+        <w:t xml:space="preserve">30.</w:t>
       </w:r>
       <w:r>
         <w:t xml:space="preserve"> </w:t>
@@ -10335,7 +10864,7 @@
       <w:r>
         <w:t xml:space="preserve">data snapshot. Published online 2026. doi:</w:t>
       </w:r>
-      <w:hyperlink r:id="rId101">
+      <w:hyperlink r:id="rId105">
         <w:r>
           <w:rPr>
             <w:rStyle w:val="Hyperlink"/>
@@ -10344,14 +10873,14 @@
         </w:r>
       </w:hyperlink>
     </w:p>
-    <w:bookmarkEnd w:id="102"/>
-    <w:bookmarkStart w:id="104" w:name="ref-suppression"/>
+    <w:bookmarkEnd w:id="106"/>
+    <w:bookmarkStart w:id="108" w:name="ref-suppression"/>
     <w:p>
       <w:pPr>
         <w:pStyle w:val="Bibliography"/>
       </w:pPr>
       <w:r>
-        <w:t xml:space="preserve">29.</w:t>
+        <w:t xml:space="preserve">31.</w:t>
       </w:r>
       <w:r>
         <w:t xml:space="preserve"> </w:t>
@@ -10377,7 +10906,7 @@
       <w:r>
         <w:t xml:space="preserve"> </w:t>
       </w:r>
-      <w:hyperlink r:id="rId103">
+      <w:hyperlink r:id="rId107">
         <w:r>
           <w:rPr>
             <w:rStyle w:val="Hyperlink"/>
@@ -10386,14 +10915,14 @@
         </w:r>
       </w:hyperlink>
     </w:p>
-    <w:bookmarkEnd w:id="104"/>
-    <w:bookmarkStart w:id="106" w:name="ref-specv10"/>
+    <w:bookmarkEnd w:id="108"/>
+    <w:bookmarkStart w:id="110" w:name="ref-specv10"/>
     <w:p>
       <w:pPr>
         <w:pStyle w:val="Bibliography"/>
       </w:pPr>
       <w:r>
-        <w:t xml:space="preserve">30.</w:t>
+        <w:t xml:space="preserve">32.</w:t>
       </w:r>
       <w:r>
         <w:t xml:space="preserve"> </w:t>
@@ -10428,7 +10957,7 @@
       <w:r>
         <w:t xml:space="preserve"> </w:t>
       </w:r>
-      <w:hyperlink r:id="rId105">
+      <w:hyperlink r:id="rId109">
         <w:r>
           <w:rPr>
             <w:rStyle w:val="Hyperlink"/>
@@ -10437,14 +10966,68 @@
         </w:r>
       </w:hyperlink>
     </w:p>
-    <w:bookmarkEnd w:id="106"/>
-    <w:bookmarkStart w:id="108" w:name="ref-rubin1981"/>
+    <w:bookmarkEnd w:id="110"/>
+    <w:bookmarkStart w:id="112" w:name="ref-cfr425600"/>
     <w:p>
       <w:pPr>
         <w:pStyle w:val="Bibliography"/>
       </w:pPr>
       <w:r>
-        <w:t xml:space="preserve">31.</w:t>
+        <w:t xml:space="preserve">33.</w:t>
+      </w:r>
+      <w:r>
+        <w:t xml:space="preserve"> </w:t>
+      </w:r>
+      <w:r>
+        <w:t xml:space="preserve">	</w:t>
+      </w:r>
+      <w:r>
+        <w:t xml:space="preserve">Centers for Medicare &amp; Medicaid Services. 42</w:t>
+      </w:r>
+      <w:r>
+        <w:t xml:space="preserve"> </w:t>
+      </w:r>
+      <w:r>
+        <w:t xml:space="preserve">CFR</w:t>
+      </w:r>
+      <w:r>
+        <w:t xml:space="preserve"> </w:t>
+      </w:r>
+      <w:r>
+        <w:t xml:space="preserve">425.600:</w:t>
+      </w:r>
+      <w:r>
+        <w:t xml:space="preserve"> </w:t>
+      </w:r>
+      <w:r>
+        <w:t xml:space="preserve">Selection</w:t>
+      </w:r>
+      <w:r>
+        <w:t xml:space="preserve"> </w:t>
+      </w:r>
+      <w:r>
+        <w:t xml:space="preserve">of risk model. Published online 2022.</w:t>
+      </w:r>
+      <w:r>
+        <w:t xml:space="preserve"> </w:t>
+      </w:r>
+      <w:hyperlink r:id="rId111">
+        <w:r>
+          <w:rPr>
+            <w:rStyle w:val="Hyperlink"/>
+          </w:rPr>
+          <w:t xml:space="preserve">https://www.ecfr.gov/on/2022-01-01/title-42/chapter-IV/subchapter-B/part-425/subpart-G/section-425.600#p-425.600%28d%29</w:t>
+        </w:r>
+      </w:hyperlink>
+    </w:p>
+    <w:bookmarkEnd w:id="112"/>
+    <w:bookmarkStart w:id="114" w:name="ref-rubin1981"/>
+    <w:p>
+      <w:pPr>
+        <w:pStyle w:val="Bibliography"/>
+      </w:pPr>
+      <w:r>
+        <w:t xml:space="preserve">34.</w:t>
       </w:r>
       <w:r>
         <w:t xml:space="preserve"> </w:t>
@@ -10468,7 +11051,7 @@
       <w:r>
         <w:t xml:space="preserve">. 1981;9(1):130-134. doi:</w:t>
       </w:r>
-      <w:hyperlink r:id="rId107">
+      <w:hyperlink r:id="rId113">
         <w:r>
           <w:rPr>
             <w:rStyle w:val="Hyperlink"/>
@@ -10477,14 +11060,14 @@
         </w:r>
       </w:hyperlink>
     </w:p>
-    <w:bookmarkEnd w:id="108"/>
-    <w:bookmarkStart w:id="110" w:name="ref-phipson2010"/>
+    <w:bookmarkEnd w:id="114"/>
+    <w:bookmarkStart w:id="116" w:name="ref-phipson2010"/>
     <w:p>
       <w:pPr>
         <w:pStyle w:val="Bibliography"/>
       </w:pPr>
       <w:r>
-        <w:t xml:space="preserve">32.</w:t>
+        <w:t xml:space="preserve">35.</w:t>
       </w:r>
       <w:r>
         <w:t xml:space="preserve"> </w:t>
@@ -10508,7 +11091,7 @@
       <w:r>
         <w:t xml:space="preserve">. 2010;9(1):39. doi:</w:t>
       </w:r>
-      <w:hyperlink r:id="rId109">
+      <w:hyperlink r:id="rId115">
         <w:r>
           <w:rPr>
             <w:rStyle w:val="Hyperlink"/>
@@ -10517,14 +11100,14 @@
         </w:r>
       </w:hyperlink>
     </w:p>
-    <w:bookmarkEnd w:id="110"/>
-    <w:bookmarkStart w:id="112" w:name="ref-pymc2023"/>
+    <w:bookmarkEnd w:id="116"/>
+    <w:bookmarkStart w:id="118" w:name="ref-pymc2023"/>
     <w:p>
       <w:pPr>
         <w:pStyle w:val="Bibliography"/>
       </w:pPr>
       <w:r>
-        <w:t xml:space="preserve">33.</w:t>
+        <w:t xml:space="preserve">36.</w:t>
       </w:r>
       <w:r>
         <w:t xml:space="preserve"> </w:t>
@@ -10548,7 +11131,7 @@
       <w:r>
         <w:t xml:space="preserve">. 2023;9:e1516. doi:</w:t>
       </w:r>
-      <w:hyperlink r:id="rId111">
+      <w:hyperlink r:id="rId117">
         <w:r>
           <w:rPr>
             <w:rStyle w:val="Hyperlink"/>
@@ -10557,14 +11140,14 @@
         </w:r>
       </w:hyperlink>
     </w:p>
-    <w:bookmarkEnd w:id="112"/>
-    <w:bookmarkStart w:id="114" w:name="ref-hoffman2014"/>
+    <w:bookmarkEnd w:id="118"/>
+    <w:bookmarkStart w:id="120" w:name="ref-hoffman2014"/>
     <w:p>
       <w:pPr>
         <w:pStyle w:val="Bibliography"/>
       </w:pPr>
       <w:r>
-        <w:t xml:space="preserve">34.</w:t>
+        <w:t xml:space="preserve">37.</w:t>
       </w:r>
       <w:r>
         <w:t xml:space="preserve"> </w:t>
@@ -10624,7 +11207,7 @@
       <w:r>
         <w:t xml:space="preserve"> </w:t>
       </w:r>
-      <w:hyperlink r:id="rId113">
+      <w:hyperlink r:id="rId119">
         <w:r>
           <w:rPr>
             <w:rStyle w:val="Hyperlink"/>
@@ -10633,14 +11216,14 @@
         </w:r>
       </w:hyperlink>
     </w:p>
-    <w:bookmarkEnd w:id="114"/>
-    <w:bookmarkStart w:id="116" w:name="ref-gelman2008"/>
+    <w:bookmarkEnd w:id="120"/>
+    <w:bookmarkStart w:id="122" w:name="ref-gelman2008"/>
     <w:p>
       <w:pPr>
         <w:pStyle w:val="Bibliography"/>
       </w:pPr>
       <w:r>
-        <w:t xml:space="preserve">35.</w:t>
+        <w:t xml:space="preserve">38.</w:t>
       </w:r>
       <w:r>
         <w:t xml:space="preserve"> </w:t>
@@ -10664,7 +11247,7 @@
       <w:r>
         <w:t xml:space="preserve">. 2008;27(15):2865-2873. doi:</w:t>
       </w:r>
-      <w:hyperlink r:id="rId115">
+      <w:hyperlink r:id="rId121">
         <w:r>
           <w:rPr>
             <w:rStyle w:val="Hyperlink"/>
@@ -10673,14 +11256,14 @@
         </w:r>
       </w:hyperlink>
     </w:p>
-    <w:bookmarkEnd w:id="116"/>
-    <w:bookmarkStart w:id="118" w:name="ref-vehtari2021"/>
+    <w:bookmarkEnd w:id="122"/>
+    <w:bookmarkStart w:id="124" w:name="ref-vehtari2021"/>
     <w:p>
       <w:pPr>
         <w:pStyle w:val="Bibliography"/>
       </w:pPr>
       <w:r>
-        <w:t xml:space="preserve">36.</w:t>
+        <w:t xml:space="preserve">39.</w:t>
       </w:r>
       <w:r>
         <w:t xml:space="preserve"> </w:t>
@@ -10704,7 +11287,7 @@
       <w:r>
         <w:t xml:space="preserve">. 2021;16(2):667-718. doi:</w:t>
       </w:r>
-      <w:hyperlink r:id="rId117">
+      <w:hyperlink r:id="rId123">
         <w:r>
           <w:rPr>
             <w:rStyle w:val="Hyperlink"/>
@@ -10713,14 +11296,14 @@
         </w:r>
       </w:hyperlink>
     </w:p>
-    <w:bookmarkEnd w:id="118"/>
-    <w:bookmarkStart w:id="120" w:name="ref-firth1993"/>
+    <w:bookmarkEnd w:id="124"/>
+    <w:bookmarkStart w:id="126" w:name="ref-firth1993"/>
     <w:p>
       <w:pPr>
         <w:pStyle w:val="Bibliography"/>
       </w:pPr>
       <w:r>
-        <w:t xml:space="preserve">37.</w:t>
+        <w:t xml:space="preserve">40.</w:t>
       </w:r>
       <w:r>
         <w:t xml:space="preserve"> </w:t>
@@ -10744,7 +11327,7 @@
       <w:r>
         <w:t xml:space="preserve">. 1993;80(1):27-38. doi:</w:t>
       </w:r>
-      <w:hyperlink r:id="rId119">
+      <w:hyperlink r:id="rId125">
         <w:r>
           <w:rPr>
             <w:rStyle w:val="Hyperlink"/>
@@ -10753,14 +11336,14 @@
         </w:r>
       </w:hyperlink>
     </w:p>
-    <w:bookmarkEnd w:id="120"/>
-    <w:bookmarkStart w:id="122" w:name="ref-firthmodels"/>
+    <w:bookmarkEnd w:id="126"/>
+    <w:bookmarkStart w:id="128" w:name="ref-firthmodels"/>
     <w:p>
       <w:pPr>
         <w:pStyle w:val="Bibliography"/>
       </w:pPr>
       <w:r>
-        <w:t xml:space="preserve">38.</w:t>
+        <w:t xml:space="preserve">41.</w:t>
       </w:r>
       <w:r>
         <w:t xml:space="preserve"> </w:t>
@@ -10804,7 +11387,7 @@
       <w:r>
         <w:t xml:space="preserve"> </w:t>
       </w:r>
-      <w:hyperlink r:id="rId121">
+      <w:hyperlink r:id="rId127">
         <w:r>
           <w:rPr>
             <w:rStyle w:val="Hyperlink"/>
@@ -10813,14 +11396,14 @@
         </w:r>
       </w:hyperlink>
     </w:p>
-    <w:bookmarkEnd w:id="122"/>
-    <w:bookmarkStart w:id="124" w:name="ref-gelmanprior2008"/>
+    <w:bookmarkEnd w:id="128"/>
+    <w:bookmarkStart w:id="130" w:name="ref-gelmanprior2008"/>
     <w:p>
       <w:pPr>
         <w:pStyle w:val="Bibliography"/>
       </w:pPr>
       <w:r>
-        <w:t xml:space="preserve">39.</w:t>
+        <w:t xml:space="preserve">42.</w:t>
       </w:r>
       <w:r>
         <w:t xml:space="preserve"> </w:t>
@@ -10844,7 +11427,7 @@
       <w:r>
         <w:t xml:space="preserve">. 2008;2(4):1360-1383. doi:</w:t>
       </w:r>
-      <w:hyperlink r:id="rId123">
+      <w:hyperlink r:id="rId129">
         <w:r>
           <w:rPr>
             <w:rStyle w:val="Hyperlink"/>
@@ -10853,14 +11436,14 @@
         </w:r>
       </w:hyperlink>
     </w:p>
-    <w:bookmarkEnd w:id="124"/>
-    <w:bookmarkStart w:id="126" w:name="ref-callaway2021"/>
+    <w:bookmarkEnd w:id="130"/>
+    <w:bookmarkStart w:id="132" w:name="ref-callaway2021"/>
     <w:p>
       <w:pPr>
         <w:pStyle w:val="Bibliography"/>
       </w:pPr>
       <w:r>
-        <w:t xml:space="preserve">40.</w:t>
+        <w:t xml:space="preserve">43.</w:t>
       </w:r>
       <w:r>
         <w:t xml:space="preserve"> </w:t>
@@ -10884,7 +11467,7 @@
       <w:r>
         <w:t xml:space="preserve">. 2021;225(2):200-230. doi:</w:t>
       </w:r>
-      <w:hyperlink r:id="rId125">
+      <w:hyperlink r:id="rId131">
         <w:r>
           <w:rPr>
             <w:rStyle w:val="Hyperlink"/>
@@ -10893,14 +11476,14 @@
         </w:r>
       </w:hyperlink>
     </w:p>
-    <w:bookmarkEnd w:id="126"/>
-    <w:bookmarkStart w:id="128" w:name="ref-roth2022"/>
+    <w:bookmarkEnd w:id="132"/>
+    <w:bookmarkStart w:id="134" w:name="ref-roth2022"/>
     <w:p>
       <w:pPr>
         <w:pStyle w:val="Bibliography"/>
       </w:pPr>
       <w:r>
-        <w:t xml:space="preserve">41.</w:t>
+        <w:t xml:space="preserve">44.</w:t>
       </w:r>
       <w:r>
         <w:t xml:space="preserve"> </w:t>
@@ -10924,7 +11507,7 @@
       <w:r>
         <w:t xml:space="preserve">. 2022;4(3):305-322. doi:</w:t>
       </w:r>
-      <w:hyperlink r:id="rId127">
+      <w:hyperlink r:id="rId133">
         <w:r>
           <w:rPr>
             <w:rStyle w:val="Hyperlink"/>
@@ -10933,14 +11516,14 @@
         </w:r>
       </w:hyperlink>
     </w:p>
-    <w:bookmarkEnd w:id="128"/>
-    <w:bookmarkStart w:id="130" w:name="ref-lakens2017"/>
+    <w:bookmarkEnd w:id="134"/>
+    <w:bookmarkStart w:id="136" w:name="ref-lakens2017"/>
     <w:p>
       <w:pPr>
         <w:pStyle w:val="Bibliography"/>
       </w:pPr>
       <w:r>
-        <w:t xml:space="preserve">42.</w:t>
+        <w:t xml:space="preserve">45.</w:t>
       </w:r>
       <w:r>
         <w:t xml:space="preserve"> </w:t>
@@ -10964,7 +11547,7 @@
       <w:r>
         <w:t xml:space="preserve">. 2017;8(4):355-362. doi:</w:t>
       </w:r>
-      <w:hyperlink r:id="rId129">
+      <w:hyperlink r:id="rId135">
         <w:r>
           <w:rPr>
             <w:rStyle w:val="Hyperlink"/>
@@ -10973,14 +11556,14 @@
         </w:r>
       </w:hyperlink>
     </w:p>
-    <w:bookmarkEnd w:id="130"/>
-    <w:bookmarkStart w:id="132" w:name="ref-rambachan2023"/>
+    <w:bookmarkEnd w:id="136"/>
+    <w:bookmarkStart w:id="138" w:name="ref-rambachan2023"/>
     <w:p>
       <w:pPr>
         <w:pStyle w:val="Bibliography"/>
       </w:pPr>
       <w:r>
-        <w:t xml:space="preserve">43.</w:t>
+        <w:t xml:space="preserve">46.</w:t>
       </w:r>
       <w:r>
         <w:t xml:space="preserve"> </w:t>
@@ -11004,7 +11587,7 @@
       <w:r>
         <w:t xml:space="preserve">. 2023;90(5):2555-2591. doi:</w:t>
       </w:r>
-      <w:hyperlink r:id="rId131">
+      <w:hyperlink r:id="rId137">
         <w:r>
           <w:rPr>
             <w:rStyle w:val="Hyperlink"/>
@@ -11013,14 +11596,14 @@
         </w:r>
       </w:hyperlink>
     </w:p>
-    <w:bookmarkEnd w:id="132"/>
-    <w:bookmarkStart w:id="134" w:name="ref-rosenbaum1983"/>
+    <w:bookmarkEnd w:id="138"/>
+    <w:bookmarkStart w:id="140" w:name="ref-rosenbaum1983"/>
     <w:p>
       <w:pPr>
         <w:pStyle w:val="Bibliography"/>
       </w:pPr>
       <w:r>
-        <w:t xml:space="preserve">44.</w:t>
+        <w:t xml:space="preserve">47.</w:t>
       </w:r>
       <w:r>
         <w:t xml:space="preserve"> </w:t>
@@ -11044,7 +11627,7 @@
       <w:r>
         <w:t xml:space="preserve">. 1983;70(1):41-55. doi:</w:t>
       </w:r>
-      <w:hyperlink r:id="rId133">
+      <w:hyperlink r:id="rId139">
         <w:r>
           <w:rPr>
             <w:rStyle w:val="Hyperlink"/>
@@ -11053,14 +11636,14 @@
         </w:r>
       </w:hyperlink>
     </w:p>
-    <w:bookmarkEnd w:id="134"/>
-    <w:bookmarkStart w:id="136" w:name="ref-welch1947"/>
+    <w:bookmarkEnd w:id="140"/>
+    <w:bookmarkStart w:id="142" w:name="ref-welch1947"/>
     <w:p>
       <w:pPr>
         <w:pStyle w:val="Bibliography"/>
       </w:pPr>
       <w:r>
-        <w:t xml:space="preserve">45.</w:t>
+        <w:t xml:space="preserve">48.</w:t>
       </w:r>
       <w:r>
         <w:t xml:space="preserve"> </w:t>
@@ -11096,7 +11679,7 @@
       <w:r>
         <w:t xml:space="preserve">. 1947;34(1-2):28-35. doi:</w:t>
       </w:r>
-      <w:hyperlink r:id="rId135">
+      <w:hyperlink r:id="rId141">
         <w:r>
           <w:rPr>
             <w:rStyle w:val="Hyperlink"/>
@@ -11105,14 +11688,14 @@
         </w:r>
       </w:hyperlink>
     </w:p>
-    <w:bookmarkEnd w:id="136"/>
-    <w:bookmarkStart w:id="138" w:name="ref-mackinnon1985"/>
+    <w:bookmarkEnd w:id="142"/>
+    <w:bookmarkStart w:id="144" w:name="ref-mackinnon1985"/>
     <w:p>
       <w:pPr>
         <w:pStyle w:val="Bibliography"/>
       </w:pPr>
       <w:r>
-        <w:t xml:space="preserve">46.</w:t>
+        <w:t xml:space="preserve">49.</w:t>
       </w:r>
       <w:r>
         <w:t xml:space="preserve"> </w:t>
@@ -11136,7 +11719,7 @@
       <w:r>
         <w:t xml:space="preserve">. 1985;29(3):305-325. doi:</w:t>
       </w:r>
-      <w:hyperlink r:id="rId137">
+      <w:hyperlink r:id="rId143">
         <w:r>
           <w:rPr>
             <w:rStyle w:val="Hyperlink"/>
@@ -11145,14 +11728,14 @@
         </w:r>
       </w:hyperlink>
     </w:p>
-    <w:bookmarkEnd w:id="138"/>
-    <w:bookmarkStart w:id="140" w:name="ref-statsmodels2010"/>
+    <w:bookmarkEnd w:id="144"/>
+    <w:bookmarkStart w:id="146" w:name="ref-statsmodels2010"/>
     <w:p>
       <w:pPr>
         <w:pStyle w:val="Bibliography"/>
       </w:pPr>
       <w:r>
-        <w:t xml:space="preserve">47.</w:t>
+        <w:t xml:space="preserve">50.</w:t>
       </w:r>
       <w:r>
         <w:t xml:space="preserve"> </w:t>
@@ -11176,7 +11759,7 @@
       <w:r>
         <w:t xml:space="preserve">. Published online 2010:92-96. doi:</w:t>
       </w:r>
-      <w:hyperlink r:id="rId139">
+      <w:hyperlink r:id="rId145">
         <w:r>
           <w:rPr>
             <w:rStyle w:val="Hyperlink"/>
@@ -11185,14 +11768,14 @@
         </w:r>
       </w:hyperlink>
     </w:p>
-    <w:bookmarkEnd w:id="140"/>
-    <w:bookmarkStart w:id="142" w:name="ref-dbt"/>
+    <w:bookmarkEnd w:id="146"/>
+    <w:bookmarkStart w:id="148" w:name="ref-dbt"/>
     <w:p>
       <w:pPr>
         <w:pStyle w:val="Bibliography"/>
       </w:pPr>
       <w:r>
-        <w:t xml:space="preserve">48.</w:t>
+        <w:t xml:space="preserve">51.</w:t>
       </w:r>
       <w:r>
         <w:t xml:space="preserve"> </w:t>
@@ -11233,7 +11816,7 @@
       <w:r>
         <w:t xml:space="preserve"> </w:t>
       </w:r>
-      <w:hyperlink r:id="rId141">
+      <w:hyperlink r:id="rId147">
         <w:r>
           <w:rPr>
             <w:rStyle w:val="Hyperlink"/>
@@ -11242,14 +11825,14 @@
         </w:r>
       </w:hyperlink>
     </w:p>
-    <w:bookmarkEnd w:id="142"/>
-    <w:bookmarkStart w:id="144" w:name="ref-duckdb2019"/>
+    <w:bookmarkEnd w:id="148"/>
+    <w:bookmarkStart w:id="150" w:name="ref-duckdb2019"/>
     <w:p>
       <w:pPr>
         <w:pStyle w:val="Bibliography"/>
       </w:pPr>
       <w:r>
-        <w:t xml:space="preserve">49.</w:t>
+        <w:t xml:space="preserve">52.</w:t>
       </w:r>
       <w:r>
         <w:t xml:space="preserve"> </w:t>
@@ -11273,7 +11856,7 @@
       <w:r>
         <w:t xml:space="preserve">. Published online June 25, 2019:1981-1984. doi:</w:t>
       </w:r>
-      <w:hyperlink r:id="rId143">
+      <w:hyperlink r:id="rId149">
         <w:r>
           <w:rPr>
             <w:rStyle w:val="Hyperlink"/>
@@ -11282,14 +11865,14 @@
         </w:r>
       </w:hyperlink>
     </w:p>
-    <w:bookmarkEnd w:id="144"/>
-    <w:bookmarkStart w:id="146" w:name="ref-uv"/>
+    <w:bookmarkEnd w:id="150"/>
+    <w:bookmarkStart w:id="152" w:name="ref-uv"/>
     <w:p>
       <w:pPr>
         <w:pStyle w:val="Bibliography"/>
       </w:pPr>
       <w:r>
-        <w:t xml:space="preserve">50.</w:t>
+        <w:t xml:space="preserve">53.</w:t>
       </w:r>
       <w:r>
         <w:t xml:space="preserve"> </w:t>
@@ -11324,7 +11907,7 @@
       <w:r>
         <w:t xml:space="preserve"> </w:t>
       </w:r>
-      <w:hyperlink r:id="rId145">
+      <w:hyperlink r:id="rId151">
         <w:r>
           <w:rPr>
             <w:rStyle w:val="Hyperlink"/>
@@ -11333,14 +11916,14 @@
         </w:r>
       </w:hyperlink>
     </w:p>
-    <w:bookmarkEnd w:id="146"/>
-    <w:bookmarkStart w:id="148" w:name="ref-arviz2019"/>
+    <w:bookmarkEnd w:id="152"/>
+    <w:bookmarkStart w:id="154" w:name="ref-arviz2019"/>
     <w:p>
       <w:pPr>
         <w:pStyle w:val="Bibliography"/>
       </w:pPr>
       <w:r>
-        <w:t xml:space="preserve">51.</w:t>
+        <w:t xml:space="preserve">54.</w:t>
       </w:r>
       <w:r>
         <w:t xml:space="preserve"> </w:t>
@@ -11364,7 +11947,7 @@
       <w:r>
         <w:t xml:space="preserve">. 2019;4(33):1143. doi:</w:t>
       </w:r>
-      <w:hyperlink r:id="rId147">
+      <w:hyperlink r:id="rId153">
         <w:r>
           <w:rPr>
             <w:rStyle w:val="Hyperlink"/>
@@ -11373,14 +11956,14 @@
         </w:r>
       </w:hyperlink>
     </w:p>
-    <w:bookmarkEnd w:id="148"/>
-    <w:bookmarkStart w:id="150" w:name="ref-numpy2020"/>
+    <w:bookmarkEnd w:id="154"/>
+    <w:bookmarkStart w:id="156" w:name="ref-numpy2020"/>
     <w:p>
       <w:pPr>
         <w:pStyle w:val="Bibliography"/>
       </w:pPr>
       <w:r>
-        <w:t xml:space="preserve">52.</w:t>
+        <w:t xml:space="preserve">55.</w:t>
       </w:r>
       <w:r>
         <w:t xml:space="preserve"> </w:t>
@@ -11404,7 +11987,7 @@
       <w:r>
         <w:t xml:space="preserve">. 2020;585(7825):357-362. doi:</w:t>
       </w:r>
-      <w:hyperlink r:id="rId149">
+      <w:hyperlink r:id="rId155">
         <w:r>
           <w:rPr>
             <w:rStyle w:val="Hyperlink"/>
@@ -11413,14 +11996,14 @@
         </w:r>
       </w:hyperlink>
     </w:p>
-    <w:bookmarkEnd w:id="150"/>
-    <w:bookmarkStart w:id="152" w:name="ref-gelmancarlin2014"/>
+    <w:bookmarkEnd w:id="156"/>
+    <w:bookmarkStart w:id="158" w:name="ref-gelmancarlin2014"/>
     <w:p>
       <w:pPr>
         <w:pStyle w:val="Bibliography"/>
       </w:pPr>
       <w:r>
-        <w:t xml:space="preserve">53.</w:t>
+        <w:t xml:space="preserve">56.</w:t>
       </w:r>
       <w:r>
         <w:t xml:space="preserve"> </w:t>
@@ -11444,7 +12027,7 @@
       <w:r>
         <w:t xml:space="preserve">. 2014;9(6):641-651. doi:</w:t>
       </w:r>
-      <w:hyperlink r:id="rId151">
+      <w:hyperlink r:id="rId157">
         <w:r>
           <w:rPr>
             <w:rStyle w:val="Hyperlink"/>
@@ -11453,14 +12036,14 @@
         </w:r>
       </w:hyperlink>
     </w:p>
-    <w:bookmarkEnd w:id="152"/>
-    <w:bookmarkStart w:id="154" w:name="ref-cfr2024"/>
+    <w:bookmarkEnd w:id="158"/>
+    <w:bookmarkStart w:id="160" w:name="ref-cfr2024"/>
     <w:p>
       <w:pPr>
         <w:pStyle w:val="Bibliography"/>
       </w:pPr>
       <w:r>
-        <w:t xml:space="preserve">54.</w:t>
+        <w:t xml:space="preserve">57.</w:t>
       </w:r>
       <w:r>
         <w:t xml:space="preserve"> </w:t>
@@ -11498,7 +12081,7 @@
       <w:r>
         <w:t xml:space="preserve"> </w:t>
       </w:r>
-      <w:hyperlink r:id="rId153">
+      <w:hyperlink r:id="rId159">
         <w:r>
           <w:rPr>
             <w:rStyle w:val="Hyperlink"/>
@@ -11507,14 +12090,14 @@
         </w:r>
       </w:hyperlink>
     </w:p>
-    <w:bookmarkEnd w:id="154"/>
-    <w:bookmarkStart w:id="156" w:name="ref-post"/>
+    <w:bookmarkEnd w:id="160"/>
+    <w:bookmarkStart w:id="162" w:name="ref-aha2021"/>
     <w:p>
       <w:pPr>
         <w:pStyle w:val="Bibliography"/>
       </w:pPr>
       <w:r>
-        <w:t xml:space="preserve">55.</w:t>
+        <w:t xml:space="preserve">58.</w:t>
       </w:r>
       <w:r>
         <w:t xml:space="preserve"> </w:t>
@@ -11523,6 +12106,66 @@
         <w:t xml:space="preserve">	</w:t>
       </w:r>
       <w:r>
+        <w:t xml:space="preserve">American Hospital Association, National Association of ACOs, et al.</w:t>
+      </w:r>
+      <w:r>
+        <w:t xml:space="preserve"> Letter to</w:t>
+      </w:r>
+      <w:r>
+        <w:t xml:space="preserve"> </w:t>
+      </w:r>
+      <w:r>
+        <w:t xml:space="preserve">CMS</w:t>
+      </w:r>
+      <w:r>
+        <w:t xml:space="preserve">: Request to provide</w:t>
+      </w:r>
+      <w:r>
+        <w:t xml:space="preserve"> </w:t>
+      </w:r>
+      <w:r>
+        <w:t xml:space="preserve">MSSP</w:t>
+      </w:r>
+      <w:r>
+        <w:t xml:space="preserve"> </w:t>
+      </w:r>
+      <w:r>
+        <w:t xml:space="preserve">ACOs</w:t>
+      </w:r>
+      <w:r>
+        <w:t xml:space="preserve"> </w:t>
+      </w:r>
+      <w:r>
+        <w:t xml:space="preserve">an option to use pre-pandemic years to set benchmarks. Published online 2021.</w:t>
+      </w:r>
+      <w:r>
+        <w:t xml:space="preserve"> </w:t>
+      </w:r>
+      <w:hyperlink r:id="rId161">
+        <w:r>
+          <w:rPr>
+            <w:rStyle w:val="Hyperlink"/>
+          </w:rPr>
+          <w:t xml:space="preserve">https://www.aha.org/lettercomment/2021-10-14-aha-others-cms-re-request-provide-mssp-acos-option-use-pre-pandemic-years</w:t>
+        </w:r>
+      </w:hyperlink>
+    </w:p>
+    <w:bookmarkEnd w:id="162"/>
+    <w:bookmarkStart w:id="164" w:name="ref-post"/>
+    <w:p>
+      <w:pPr>
+        <w:pStyle w:val="Bibliography"/>
+      </w:pPr>
+      <w:r>
+        <w:t xml:space="preserve">59.</w:t>
+      </w:r>
+      <w:r>
+        <w:t xml:space="preserve"> </w:t>
+      </w:r>
+      <w:r>
+        <w:t xml:space="preserve">	</w:t>
+      </w:r>
+      <w:r>
         <w:t xml:space="preserve">Harrold ST. Why did</w:t>
       </w:r>
       <w:r>
@@ -11558,7 +12201,7 @@
       <w:r>
         <w:t xml:space="preserve"> </w:t>
       </w:r>
-      <w:hyperlink r:id="rId155">
+      <w:hyperlink r:id="rId163">
         <w:r>
           <w:rPr>
             <w:rStyle w:val="Hyperlink"/>
@@ -11567,9 +12210,9 @@
         </w:r>
       </w:hyperlink>
     </w:p>
-    <w:bookmarkEnd w:id="156"/>
-    <w:bookmarkEnd w:id="157"/>
-    <w:bookmarkEnd w:id="158"/>
+    <w:bookmarkEnd w:id="164"/>
+    <w:bookmarkEnd w:id="165"/>
+    <w:bookmarkEnd w:id="166"/>
     <w:sectPr>
       <w:footnotePr>
         <w:numRestart w:val="eachSect"/>

</xml_diff>

<commit_message>
Preprint: post hoc checks against CMS's published 2022 benchmarks (eTable 12; not registered)
Change-scale validation for the 101 regular renewers, early renewers' realized 2022 reset, and the PY2021-PY2022
benchmark update vs stayers, from stharrold.github.io analysis/mssp-benchmark-ratchet/posthoc (bf91e5c).

Co-Authored-By: Claude Opus 5.5 <noreply@anthropic.com>
</commit_message>
<xml_diff>
--- a/paper.docx
+++ b/paper.docx
@@ -378,7 +378,13 @@
         <w:t xml:space="preserve"> </w:t>
       </w:r>
       <w:r>
-        <w:t xml:space="preserve">gain from a reset did not differ (−0.5 points; 95% CrI, −2.0 to 0.8). Among 206 BASIC-track ACOs, early renewal was</w:t>
+        <w:t xml:space="preserve">gain from a reset did not differ (−0.5 points; 95% CrI, −2.0 to 0.8). In a post hoc check, CMS’s published 2022</w:t>
+      </w:r>
+      <w:r>
+        <w:t xml:space="preserve"> </w:t>
+      </w:r>
+      <w:r>
+        <w:t xml:space="preserve">benchmarks for early renewers averaged 1.3% below their 2021 benchmarks. Among 206 BASIC-track ACOs, early renewal was</w:t>
       </w:r>
       <w:r>
         <w:t xml:space="preserve"> </w:t>
@@ -442,7 +448,13 @@
         <w:t xml:space="preserve"> </w:t>
       </w:r>
       <w:r>
-        <w:t xml:space="preserve">approximation, a reset would not on average have raised their benchmarks. These are associations under the 2022</w:t>
+        <w:t xml:space="preserve">approximation, and in CMS’s published benchmarks examined post hoc, the reset did not on average raise their</w:t>
+      </w:r>
+      <w:r>
+        <w:t xml:space="preserve"> </w:t>
+      </w:r>
+      <w:r>
+        <w:t xml:space="preserve">benchmarks. These are associations under the 2022</w:t>
       </w:r>
       <w:r>
         <w:t xml:space="preserve"> </w:t>
@@ -1222,7 +1234,7 @@
       </w:r>
     </w:p>
     <w:bookmarkEnd w:id="13"/>
-    <w:bookmarkStart w:id="21" w:name="methods"/>
+    <w:bookmarkStart w:id="22" w:name="methods"/>
     <w:p>
       <w:pPr>
         <w:pStyle w:val="Heading1"/>
@@ -3716,12 +3728,66 @@
       </w:r>
     </w:p>
     <w:bookmarkEnd w:id="19"/>
-    <w:bookmarkStart w:id="20" w:name="ethics"/>
+    <w:bookmarkStart w:id="20" w:name="post-hoc-checks-not-registered"/>
     <w:p>
       <w:pPr>
         <w:pStyle w:val="Heading2"/>
       </w:pPr>
       <w:r>
+        <w:t xml:space="preserve">Post hoc checks (not registered)</w:t>
+      </w:r>
+    </w:p>
+    <w:p>
+      <w:pPr>
+        <w:pStyle w:val="FirstParagraph"/>
+      </w:pPr>
+      <w:r>
+        <w:t xml:space="preserve">After all registered results had been read, and in response to critical review of the draft, two checks of the</w:t>
+      </w:r>
+      <w:r>
+        <w:t xml:space="preserve"> </w:t>
+      </w:r>
+      <w:r>
+        <w:t xml:space="preserve">expected gain were added (eTable 12 in Supplement 1). They reuse the registered pipeline’s tables and estimator,</w:t>
+      </w:r>
+      <w:r>
+        <w:t xml:space="preserve"> </w:t>
+      </w:r>
+      <w:r>
+        <w:t xml:space="preserve">change no registered file, and decide nothing. First, the validation was repeated on the change scale, the rebuilt</w:t>
+      </w:r>
+      <w:r>
+        <w:t xml:space="preserve"> </w:t>
+      </w:r>
+      <w:r>
+        <w:t xml:space="preserve">against the actual change from the PY2021 benchmark, for the same 101 regular renewers. Second, early renewers’</w:t>
+      </w:r>
+      <w:r>
+        <w:t xml:space="preserve"> </w:t>
+      </w:r>
+      <w:r>
+        <w:t xml:space="preserve">realized reset, their 2022 historical benchmark as CMS published it relative to their PY2021 benchmark, was compared</w:t>
+      </w:r>
+      <w:r>
+        <w:t xml:space="preserve"> </w:t>
+      </w:r>
+      <w:r>
+        <w:t xml:space="preserve">with the rebuilt gain, and their PY2021-to-PY2022 change in updated benchmark was compared with stayers’ with the</w:t>
+      </w:r>
+      <w:r>
+        <w:t xml:space="preserve"> </w:t>
+      </w:r>
+      <w:r>
+        <w:t xml:space="preserve">group-comparison estimator above.</w:t>
+      </w:r>
+    </w:p>
+    <w:bookmarkEnd w:id="20"/>
+    <w:bookmarkStart w:id="21" w:name="ethics"/>
+    <w:p>
+      <w:pPr>
+        <w:pStyle w:val="Heading2"/>
+      </w:pPr>
+      <w:r>
         <w:t xml:space="preserve">Ethics</w:t>
       </w:r>
     </w:p>
@@ -3751,9 +3817,9 @@
         <w:t xml:space="preserve">required.</w:t>
       </w:r>
     </w:p>
-    <w:bookmarkEnd w:id="20"/>
     <w:bookmarkEnd w:id="21"/>
-    <w:bookmarkStart w:id="39" w:name="results"/>
+    <w:bookmarkEnd w:id="22"/>
+    <w:bookmarkStart w:id="40" w:name="results"/>
     <w:p>
       <w:pPr>
         <w:pStyle w:val="Heading1"/>
@@ -3762,7 +3828,7 @@
         <w:t xml:space="preserve">Results</w:t>
       </w:r>
     </w:p>
-    <w:bookmarkStart w:id="25" w:name="validation-and-sample"/>
+    <w:bookmarkStart w:id="26" w:name="validation-and-sample"/>
     <w:p>
       <w:pPr>
         <w:pStyle w:val="Heading2"/>
@@ -5238,18 +5304,18 @@
           <wp:inline>
             <wp:extent cx="5334000" cy="4174434"/>
             <wp:effectExtent b="0" l="0" r="0" t="0"/>
-            <wp:docPr descr="Figure 1. Flow of ACOs into each analysis. Counts are early renewers vs stayers. The reason for the expected-gain exclusions comes from a diagnostic query run after the results, outside the registered pipeline. ACO, accountable care organization; ESRD, end-stage renal disease; PY, performance year." title="" id="23" name="Picture"/>
+            <wp:docPr descr="Figure 1. Flow of ACOs into each analysis. Counts are early renewers vs stayers. The reason for the expected-gain exclusions comes from a diagnostic query run after the results, outside the registered pipeline. ACO, accountable care organization; ESRD, end-stage renal disease; PY, performance year." title="" id="24" name="Picture"/>
             <a:graphic>
               <a:graphicData uri="http://schemas.openxmlformats.org/drawingml/2006/picture">
                 <pic:pic>
                   <pic:nvPicPr>
-                    <pic:cNvPr descr="figures/figure1-flow.png" id="24" name="Picture"/>
+                    <pic:cNvPr descr="figures/figure1-flow.png" id="25" name="Picture"/>
                     <pic:cNvPicPr>
                       <a:picLocks noChangeArrowheads="1" noChangeAspect="1"/>
                     </pic:cNvPicPr>
                   </pic:nvPicPr>
                   <pic:blipFill>
-                    <a:blip r:embed="rId22"/>
+                    <a:blip r:embed="rId23"/>
                     <a:stretch>
                       <a:fillRect/>
                     </a:stretch>
@@ -5294,8 +5360,8 @@
         <w:t xml:space="preserve">Flow of ACOs into each analysis. Counts are early renewers vs stayers. The reason for the expected-gain exclusions comes from a diagnostic query run after the results, outside the registered pipeline. ACO, accountable care organization; ESRD, end-stage renal disease; PY, performance year.</w:t>
       </w:r>
     </w:p>
-    <w:bookmarkEnd w:id="25"/>
-    <w:bookmarkStart w:id="29" w:name="who-renewed-early"/>
+    <w:bookmarkEnd w:id="26"/>
+    <w:bookmarkStart w:id="30" w:name="who-renewed-early"/>
     <w:p>
       <w:pPr>
         <w:pStyle w:val="Heading2"/>
@@ -5461,7 +5527,31 @@
         <w:t xml:space="preserve"> </w:t>
       </w:r>
       <w:r>
-        <w:t xml:space="preserve">lowered both groups’ benchmarks.</w:t>
+        <w:t xml:space="preserve">lowered both groups’ benchmarks. Post hoc, CMS’s published 2022 benchmarks bear this out for early renewers: their</w:t>
+      </w:r>
+      <w:r>
+        <w:t xml:space="preserve"> </w:t>
+      </w:r>
+      <w:r>
+        <w:t xml:space="preserve">reset historical benchmarks averaged 1.3% below their PY2021 benchmarks (median −1.5%; 66% of the 29 were lower), the</w:t>
+      </w:r>
+      <w:r>
+        <w:t xml:space="preserve"> </w:t>
+      </w:r>
+      <w:r>
+        <w:t xml:space="preserve">rebuilt gain had predicted −1.6 points on average against −1.4 realized for the 26 with both values, and their</w:t>
+      </w:r>
+      <w:r>
+        <w:t xml:space="preserve"> </w:t>
+      </w:r>
+      <w:r>
+        <w:t xml:space="preserve">updated benchmarks rose from PY2021 to PY2022 no more than stayers’ (difference 0.0 points; 95% CrI, −2.0 to 2.2)</w:t>
+      </w:r>
+      <w:r>
+        <w:t xml:space="preserve"> </w:t>
+      </w:r>
+      <w:r>
+        <w:t xml:space="preserve">(eTable 12 in Supplement 1).</w:t>
       </w:r>
     </w:p>
     <w:p>
@@ -6134,18 +6224,18 @@
           <wp:inline>
             <wp:extent cx="5334000" cy="2215692"/>
             <wp:effectExtent b="0" l="0" r="0" t="0"/>
-            <wp:docPr descr="Figure 2. Early renewers minus stayers. A, Expected-gain variables, in percentage points of the current benchmark. B, Savings rates, in percentage points. Points are posterior means and lines 95% credible intervals from the Bayesian bootstrap." title="" id="27" name="Picture"/>
+            <wp:docPr descr="Figure 2. Early renewers minus stayers. A, Expected-gain variables, in percentage points of the current benchmark. B, Savings rates, in percentage points. Points are posterior means and lines 95% credible intervals from the Bayesian bootstrap." title="" id="28" name="Picture"/>
             <a:graphic>
               <a:graphicData uri="http://schemas.openxmlformats.org/drawingml/2006/picture">
                 <pic:pic>
                   <pic:nvPicPr>
-                    <pic:cNvPr descr="figures/figure2-comparisons.png" id="28" name="Picture"/>
+                    <pic:cNvPr descr="figures/figure2-comparisons.png" id="29" name="Picture"/>
                     <pic:cNvPicPr>
                       <a:picLocks noChangeArrowheads="1" noChangeAspect="1"/>
                     </pic:cNvPicPr>
                   </pic:nvPicPr>
                   <pic:blipFill>
-                    <a:blip r:embed="rId26"/>
+                    <a:blip r:embed="rId27"/>
                     <a:stretch>
                       <a:fillRect/>
                     </a:stretch>
@@ -6190,8 +6280,8 @@
         <w:t xml:space="preserve">Early renewers minus stayers. A, Expected-gain variables, in percentage points of the current benchmark. B, Savings rates, in percentage points. Points are posterior means and lines 95% credible intervals from the Bayesian bootstrap.</w:t>
       </w:r>
     </w:p>
-    <w:bookmarkEnd w:id="29"/>
-    <w:bookmarkStart w:id="33" w:name="decision-model"/>
+    <w:bookmarkEnd w:id="30"/>
+    <w:bookmarkStart w:id="34" w:name="decision-model"/>
     <w:p>
       <w:pPr>
         <w:pStyle w:val="Heading2"/>
@@ -7199,18 +7289,18 @@
           <wp:inline>
             <wp:extent cx="5334000" cy="1942358"/>
             <wp:effectExtent b="0" l="0" r="0" t="0"/>
-            <wp:docPr descr="Figure 3. Decision model of early renewal among BASIC-track ACOs (H3). Points are posterior means and lines 95% credible intervals; the shaded band is the Normal(0, 1) prior’s central 95%. Bold labels mark the core predictors." title="" id="31" name="Picture"/>
+            <wp:docPr descr="Figure 3. Decision model of early renewal among BASIC-track ACOs (H3). Points are posterior means and lines 95% credible intervals; the shaded band is the Normal(0, 1) prior’s central 95%. Bold labels mark the core predictors." title="" id="32" name="Picture"/>
             <a:graphic>
               <a:graphicData uri="http://schemas.openxmlformats.org/drawingml/2006/picture">
                 <pic:pic>
                   <pic:nvPicPr>
-                    <pic:cNvPr descr="figures/figure3-decision-model.png" id="32" name="Picture"/>
+                    <pic:cNvPr descr="figures/figure3-decision-model.png" id="33" name="Picture"/>
                     <pic:cNvPicPr>
                       <a:picLocks noChangeArrowheads="1" noChangeAspect="1"/>
                     </pic:cNvPicPr>
                   </pic:nvPicPr>
                   <pic:blipFill>
-                    <a:blip r:embed="rId30"/>
+                    <a:blip r:embed="rId31"/>
                     <a:stretch>
                       <a:fillRect/>
                     </a:stretch>
@@ -7255,8 +7345,8 @@
         <w:t xml:space="preserve">Decision model of early renewal among BASIC-track ACOs (H3). Points are posterior means and lines 95% credible intervals; the shaded band is the Normal(0, 1) prior’s central 95%. Bold labels mark the core predictors.</w:t>
       </w:r>
     </w:p>
-    <w:bookmarkEnd w:id="33"/>
-    <w:bookmarkStart w:id="37" w:name="spending-after-renewal"/>
+    <w:bookmarkEnd w:id="34"/>
+    <w:bookmarkStart w:id="38" w:name="spending-after-renewal"/>
     <w:p>
       <w:pPr>
         <w:pStyle w:val="Heading2"/>
@@ -8027,18 +8117,18 @@
           <wp:inline>
             <wp:extent cx="5334000" cy="2103848"/>
             <wp:effectExtent b="0" l="0" r="0" t="0"/>
-            <wp:docPr descr="Figure 4. Spending after early renewal. A, Event study from the conventional 2-way fixed-effects model, in log points relative to PY2021, with 95% CIs clustered by ACO. B, The registered H4 estimate and the robustness and conventional estimates, as the percent difference in spending growth with 95% intervals (the propensity-weighted estimate has no interval); sample sizes are in Table 4. TWFE, 2-way fixed effects." title="" id="35" name="Picture"/>
+            <wp:docPr descr="Figure 4. Spending after early renewal. A, Event study from the conventional 2-way fixed-effects model, in log points relative to PY2021, with 95% CIs clustered by ACO. B, The registered H4 estimate and the robustness and conventional estimates, as the percent difference in spending growth with 95% intervals (the propensity-weighted estimate has no interval); sample sizes are in Table 4. TWFE, 2-way fixed effects." title="" id="36" name="Picture"/>
             <a:graphic>
               <a:graphicData uri="http://schemas.openxmlformats.org/drawingml/2006/picture">
                 <pic:pic>
                   <pic:nvPicPr>
-                    <pic:cNvPr descr="figures/figure4-spending.png" id="36" name="Picture"/>
+                    <pic:cNvPr descr="figures/figure4-spending.png" id="37" name="Picture"/>
                     <pic:cNvPicPr>
                       <a:picLocks noChangeArrowheads="1" noChangeAspect="1"/>
                     </pic:cNvPicPr>
                   </pic:nvPicPr>
                   <pic:blipFill>
-                    <a:blip r:embed="rId34"/>
+                    <a:blip r:embed="rId35"/>
                     <a:stretch>
                       <a:fillRect/>
                     </a:stretch>
@@ -8083,8 +8173,8 @@
         <w:t xml:space="preserve">Spending after early renewal. A, Event study from the conventional 2-way fixed-effects model, in log points relative to PY2021, with 95% CIs clustered by ACO. B, The registered H4 estimate and the robustness and conventional estimates, as the percent difference in spending growth with 95% intervals (the propensity-weighted estimate has no interval); sample sizes are in Table 4. TWFE, 2-way fixed effects.</w:t>
       </w:r>
     </w:p>
-    <w:bookmarkEnd w:id="37"/>
-    <w:bookmarkStart w:id="38" w:name="robustness-and-conventional-methods"/>
+    <w:bookmarkEnd w:id="38"/>
+    <w:bookmarkStart w:id="39" w:name="robustness-and-conventional-methods"/>
     <w:p>
       <w:pPr>
         <w:pStyle w:val="Heading2"/>
@@ -8247,9 +8337,9 @@
         <w:t xml:space="preserve">percentiles of stayers on every variable.</w:t>
       </w:r>
     </w:p>
-    <w:bookmarkEnd w:id="38"/>
     <w:bookmarkEnd w:id="39"/>
-    <w:bookmarkStart w:id="44" w:name="discussion"/>
+    <w:bookmarkEnd w:id="40"/>
+    <w:bookmarkStart w:id="45" w:name="discussion"/>
     <w:p>
       <w:pPr>
         <w:pStyle w:val="Heading1"/>
@@ -8287,7 +8377,7 @@
         <w:t xml:space="preserve"> </w:t>
       </w:r>
       <w:r>
-        <w:t xml:space="preserve">and the own-spending loss roughly offset. Spending growth in the 3 years after renewal did not differ detectably from</w:t>
+        <w:t xml:space="preserve">and the own-spending loss roughly offset. CMS’s published 2022 benchmarks, examined post hoc, agree. Spending growth in the 3 years after renewal did not differ detectably from</w:t>
       </w:r>
       <w:r>
         <w:t xml:space="preserve"> </w:t>
@@ -8302,7 +8392,7 @@
         <w:t xml:space="preserve">trends.</w:t>
       </w:r>
     </w:p>
-    <w:bookmarkStart w:id="40" w:name="comparison-with-earlier-work"/>
+    <w:bookmarkStart w:id="41" w:name="comparison-with-earlier-work"/>
     <w:p>
       <w:pPr>
         <w:pStyle w:val="Heading2"/>
@@ -8627,8 +8717,8 @@
         <w:t xml:space="preserve">cannot separate the motives. No test here can rule either motive in or out.</w:t>
       </w:r>
     </w:p>
-    <w:bookmarkEnd w:id="40"/>
-    <w:bookmarkStart w:id="41" w:name="implications"/>
+    <w:bookmarkEnd w:id="41"/>
+    <w:bookmarkStart w:id="42" w:name="implications"/>
     <w:p>
       <w:pPr>
         <w:pStyle w:val="Heading2"/>
@@ -8731,8 +8821,8 @@
         <w:t xml:space="preserve">separate.</w:t>
       </w:r>
     </w:p>
-    <w:bookmarkEnd w:id="41"/>
-    <w:bookmarkStart w:id="42" w:name="limitations"/>
+    <w:bookmarkEnd w:id="42"/>
+    <w:bookmarkStart w:id="43" w:name="limitations"/>
     <w:p>
       <w:pPr>
         <w:pStyle w:val="Heading2"/>
@@ -8788,7 +8878,19 @@
         <w:t xml:space="preserve"> </w:t>
       </w:r>
       <w:r>
-        <w:t xml:space="preserve">correlation suggests; the own-spending component’s estimated error exceeds its spread, so H2a and the total gain are weak evidence for any single ACO, and the regional</w:t>
+        <w:t xml:space="preserve">correlation suggests: repeated post hoc on the change scale, it gave a Spearman correlation of 0.61 and a median</w:t>
+      </w:r>
+      <w:r>
+        <w:t xml:space="preserve"> </w:t>
+      </w:r>
+      <w:r>
+        <w:t xml:space="preserve">absolute error of 1.7 points with little mean bias (−0.3), so group means are better supported than any one ACO’s</w:t>
+      </w:r>
+      <w:r>
+        <w:t xml:space="preserve"> </w:t>
+      </w:r>
+      <w:r>
+        <w:t xml:space="preserve">value; the own-spending component’s estimated error exceeds its spread, so H2a and the total gain are weak evidence for any single ACO, and the regional</w:t>
       </w:r>
       <w:r>
         <w:t xml:space="preserve"> </w:t>
@@ -8907,8 +9009,8 @@
         <w:t xml:space="preserve">80.4% as committed and 77.6% in a rerun from a fresh clone), far from changing any verdict.</w:t>
       </w:r>
     </w:p>
-    <w:bookmarkEnd w:id="42"/>
-    <w:bookmarkStart w:id="43" w:name="conclusions"/>
+    <w:bookmarkEnd w:id="43"/>
+    <w:bookmarkStart w:id="44" w:name="conclusions"/>
     <w:p>
       <w:pPr>
         <w:pStyle w:val="Heading2"/>
@@ -8934,7 +9036,13 @@
         <w:t xml:space="preserve"> </w:t>
       </w:r>
       <w:r>
-        <w:t xml:space="preserve">approximation, a reset would not on average have raised their benchmarks, and spending growth afterward showed no</w:t>
+        <w:t xml:space="preserve">approximation, and in CMS’s published 2022 benchmarks examined post hoc, the reset did not on average raise their</w:t>
+      </w:r>
+      <w:r>
+        <w:t xml:space="preserve"> </w:t>
+      </w:r>
+      <w:r>
+        <w:t xml:space="preserve">benchmarks, and spending growth afterward showed no</w:t>
       </w:r>
       <w:r>
         <w:t xml:space="preserve"> </w:t>
@@ -8949,9 +9057,9 @@
         <w:t xml:space="preserve">plan.</w:t>
       </w:r>
     </w:p>
-    <w:bookmarkEnd w:id="43"/>
     <w:bookmarkEnd w:id="44"/>
-    <w:bookmarkStart w:id="47" w:name="declarations"/>
+    <w:bookmarkEnd w:id="45"/>
+    <w:bookmarkStart w:id="48" w:name="declarations"/>
     <w:p>
       <w:pPr>
         <w:pStyle w:val="Heading1"/>
@@ -9083,7 +9191,7 @@
       <w:r>
         <w:t xml:space="preserve">study repository and in this manuscript’s repository (</w:t>
       </w:r>
-      <w:hyperlink r:id="rId45">
+      <w:hyperlink r:id="rId46">
         <w:r>
           <w:rPr>
             <w:rStyle w:val="Hyperlink"/>
@@ -9121,7 +9229,7 @@
       <w:r>
         <w:t xml:space="preserve"> </w:t>
       </w:r>
-      <w:hyperlink r:id="rId46">
+      <w:hyperlink r:id="rId47">
         <w:r>
           <w:rPr>
             <w:rStyle w:val="Hyperlink"/>
@@ -9326,8 +9434,8 @@
         <w:t xml:space="preserve">manuscript. The author reviewed and edited all output and verified the numbers against the results files.</w:t>
       </w:r>
     </w:p>
-    <w:bookmarkEnd w:id="47"/>
-    <w:bookmarkStart w:id="166" w:name="references"/>
+    <w:bookmarkEnd w:id="48"/>
+    <w:bookmarkStart w:id="167" w:name="references"/>
     <w:p>
       <w:pPr>
         <w:pStyle w:val="Heading1"/>
@@ -9336,8 +9444,8 @@
         <w:t xml:space="preserve">References</w:t>
       </w:r>
     </w:p>
-    <w:bookmarkStart w:id="165" w:name="refs"/>
-    <w:bookmarkStart w:id="49" w:name="ref-cfr425"/>
+    <w:bookmarkStart w:id="166" w:name="refs"/>
+    <w:bookmarkStart w:id="50" w:name="ref-cfr425"/>
     <w:p>
       <w:pPr>
         <w:pStyle w:val="Bibliography"/>
@@ -9396,7 +9504,7 @@
       <w:r>
         <w:t xml:space="preserve"> </w:t>
       </w:r>
-      <w:hyperlink r:id="rId48">
+      <w:hyperlink r:id="rId49">
         <w:r>
           <w:rPr>
             <w:rStyle w:val="Hyperlink"/>
@@ -9405,8 +9513,8 @@
         </w:r>
       </w:hyperlink>
     </w:p>
-    <w:bookmarkEnd w:id="49"/>
-    <w:bookmarkStart w:id="51" w:name="ref-cfr425601"/>
+    <w:bookmarkEnd w:id="50"/>
+    <w:bookmarkStart w:id="52" w:name="ref-cfr425601"/>
     <w:p>
       <w:pPr>
         <w:pStyle w:val="Bibliography"/>
@@ -9459,7 +9567,7 @@
       <w:r>
         <w:t xml:space="preserve"> </w:t>
       </w:r>
-      <w:hyperlink r:id="rId50">
+      <w:hyperlink r:id="rId51">
         <w:r>
           <w:rPr>
             <w:rStyle w:val="Hyperlink"/>
@@ -9468,8 +9576,8 @@
         </w:r>
       </w:hyperlink>
     </w:p>
-    <w:bookmarkEnd w:id="51"/>
-    <w:bookmarkStart w:id="53" w:name="ref-mcwilliams2016"/>
+    <w:bookmarkEnd w:id="52"/>
+    <w:bookmarkStart w:id="54" w:name="ref-mcwilliams2016"/>
     <w:p>
       <w:pPr>
         <w:pStyle w:val="Bibliography"/>
@@ -9499,7 +9607,7 @@
       <w:r>
         <w:t xml:space="preserve">. 2016;374(24):2357-2366. doi:</w:t>
       </w:r>
-      <w:hyperlink r:id="rId52">
+      <w:hyperlink r:id="rId53">
         <w:r>
           <w:rPr>
             <w:rStyle w:val="Hyperlink"/>
@@ -9508,8 +9616,8 @@
         </w:r>
       </w:hyperlink>
     </w:p>
-    <w:bookmarkEnd w:id="53"/>
-    <w:bookmarkStart w:id="55" w:name="ref-mcwilliams2018"/>
+    <w:bookmarkEnd w:id="54"/>
+    <w:bookmarkStart w:id="56" w:name="ref-mcwilliams2018"/>
     <w:p>
       <w:pPr>
         <w:pStyle w:val="Bibliography"/>
@@ -9539,7 +9647,7 @@
       <w:r>
         <w:t xml:space="preserve">. 2018;379(12):1139-1149. doi:</w:t>
       </w:r>
-      <w:hyperlink r:id="rId54">
+      <w:hyperlink r:id="rId55">
         <w:r>
           <w:rPr>
             <w:rStyle w:val="Hyperlink"/>
@@ -9548,8 +9656,8 @@
         </w:r>
       </w:hyperlink>
     </w:p>
-    <w:bookmarkEnd w:id="55"/>
-    <w:bookmarkStart w:id="57" w:name="ref-bond2025"/>
+    <w:bookmarkEnd w:id="56"/>
+    <w:bookmarkStart w:id="58" w:name="ref-bond2025"/>
     <w:p>
       <w:pPr>
         <w:pStyle w:val="Bibliography"/>
@@ -9579,7 +9687,7 @@
       <w:r>
         <w:t xml:space="preserve">. 2025;333(21):1897-1905. doi:</w:t>
       </w:r>
-      <w:hyperlink r:id="rId56">
+      <w:hyperlink r:id="rId57">
         <w:r>
           <w:rPr>
             <w:rStyle w:val="Hyperlink"/>
@@ -9588,8 +9696,8 @@
         </w:r>
       </w:hyperlink>
     </w:p>
-    <w:bookmarkEnd w:id="57"/>
-    <w:bookmarkStart w:id="59" w:name="ref-mcwilliams2020"/>
+    <w:bookmarkEnd w:id="58"/>
+    <w:bookmarkStart w:id="60" w:name="ref-mcwilliams2020"/>
     <w:p>
       <w:pPr>
         <w:pStyle w:val="Bibliography"/>
@@ -9619,7 +9727,7 @@
       <w:r>
         <w:t xml:space="preserve">. 2020;98(3):847-907. doi:</w:t>
       </w:r>
-      <w:hyperlink r:id="rId58">
+      <w:hyperlink r:id="rId59">
         <w:r>
           <w:rPr>
             <w:rStyle w:val="Hyperlink"/>
@@ -9628,8 +9736,8 @@
         </w:r>
       </w:hyperlink>
     </w:p>
-    <w:bookmarkEnd w:id="59"/>
-    <w:bookmarkStart w:id="61" w:name="ref-markovitz2019exit"/>
+    <w:bookmarkEnd w:id="60"/>
+    <w:bookmarkStart w:id="62" w:name="ref-markovitz2019exit"/>
     <w:p>
       <w:pPr>
         <w:pStyle w:val="Bibliography"/>
@@ -9659,7 +9767,7 @@
       <w:r>
         <w:t xml:space="preserve">. 2019;171(1):27-36. doi:</w:t>
       </w:r>
-      <w:hyperlink r:id="rId60">
+      <w:hyperlink r:id="rId61">
         <w:r>
           <w:rPr>
             <w:rStyle w:val="Hyperlink"/>
@@ -9668,8 +9776,8 @@
         </w:r>
       </w:hyperlink>
     </w:p>
-    <w:bookmarkEnd w:id="61"/>
-    <w:bookmarkStart w:id="63" w:name="ref-markovitz2019risk"/>
+    <w:bookmarkEnd w:id="62"/>
+    <w:bookmarkStart w:id="64" w:name="ref-markovitz2019risk"/>
     <w:p>
       <w:pPr>
         <w:pStyle w:val="Bibliography"/>
@@ -9699,7 +9807,7 @@
       <w:r>
         <w:t xml:space="preserve">. 2019;38(2):253-261. doi:</w:t>
       </w:r>
-      <w:hyperlink r:id="rId62">
+      <w:hyperlink r:id="rId63">
         <w:r>
           <w:rPr>
             <w:rStyle w:val="Hyperlink"/>
@@ -9708,8 +9816,8 @@
         </w:r>
       </w:hyperlink>
     </w:p>
-    <w:bookmarkEnd w:id="63"/>
-    <w:bookmarkStart w:id="65" w:name="ref-douven2015"/>
+    <w:bookmarkEnd w:id="64"/>
+    <w:bookmarkStart w:id="66" w:name="ref-douven2015"/>
     <w:p>
       <w:pPr>
         <w:pStyle w:val="Bibliography"/>
@@ -9739,7 +9847,7 @@
       <w:r>
         <w:t xml:space="preserve">. 2015;34(1):143-149. doi:</w:t>
       </w:r>
-      <w:hyperlink r:id="rId64">
+      <w:hyperlink r:id="rId65">
         <w:r>
           <w:rPr>
             <w:rStyle w:val="Hyperlink"/>
@@ -9748,8 +9856,8 @@
         </w:r>
       </w:hyperlink>
     </w:p>
-    <w:bookmarkEnd w:id="65"/>
-    <w:bookmarkStart w:id="67" w:name="ref-rose2016"/>
+    <w:bookmarkEnd w:id="66"/>
+    <w:bookmarkStart w:id="68" w:name="ref-rose2016"/>
     <w:p>
       <w:pPr>
         <w:pStyle w:val="Bibliography"/>
@@ -9779,7 +9887,7 @@
       <w:r>
         <w:t xml:space="preserve">. 2016;35(3):440-448. doi:</w:t>
       </w:r>
-      <w:hyperlink r:id="rId66">
+      <w:hyperlink r:id="rId67">
         <w:r>
           <w:rPr>
             <w:rStyle w:val="Hyperlink"/>
@@ -9788,8 +9896,8 @@
         </w:r>
       </w:hyperlink>
     </w:p>
-    <w:bookmarkEnd w:id="67"/>
-    <w:bookmarkStart w:id="69" w:name="ref-lyu2023"/>
+    <w:bookmarkEnd w:id="68"/>
+    <w:bookmarkStart w:id="70" w:name="ref-lyu2023"/>
     <w:p>
       <w:pPr>
         <w:pStyle w:val="Bibliography"/>
@@ -9819,7 +9927,7 @@
       <w:r>
         <w:t xml:space="preserve">. 2023;42(5):622-631. doi:</w:t>
       </w:r>
-      <w:hyperlink r:id="rId68">
+      <w:hyperlink r:id="rId69">
         <w:r>
           <w:rPr>
             <w:rStyle w:val="Hyperlink"/>
@@ -9828,8 +9936,8 @@
         </w:r>
       </w:hyperlink>
     </w:p>
-    <w:bookmarkEnd w:id="69"/>
-    <w:bookmarkStart w:id="71" w:name="ref-chen2025"/>
+    <w:bookmarkEnd w:id="70"/>
+    <w:bookmarkStart w:id="72" w:name="ref-chen2025"/>
     <w:p>
       <w:pPr>
         <w:pStyle w:val="Bibliography"/>
@@ -9859,7 +9967,7 @@
       <w:r>
         <w:t xml:space="preserve">. 2025;11(1):38-62. doi:</w:t>
       </w:r>
-      <w:hyperlink r:id="rId70">
+      <w:hyperlink r:id="rId71">
         <w:r>
           <w:rPr>
             <w:rStyle w:val="Hyperlink"/>
@@ -9868,8 +9976,8 @@
         </w:r>
       </w:hyperlink>
     </w:p>
-    <w:bookmarkEnd w:id="71"/>
-    <w:bookmarkStart w:id="73" w:name="ref-srivastava2026"/>
+    <w:bookmarkEnd w:id="72"/>
+    <w:bookmarkStart w:id="74" w:name="ref-srivastava2026"/>
     <w:p>
       <w:pPr>
         <w:pStyle w:val="Bibliography"/>
@@ -9899,7 +10007,7 @@
       <w:r>
         <w:t xml:space="preserve">. 2026;9(2):e260166. doi:</w:t>
       </w:r>
-      <w:hyperlink r:id="rId72">
+      <w:hyperlink r:id="rId73">
         <w:r>
           <w:rPr>
             <w:rStyle w:val="Hyperlink"/>
@@ -9908,8 +10016,8 @@
         </w:r>
       </w:hyperlink>
     </w:p>
-    <w:bookmarkEnd w:id="73"/>
-    <w:bookmarkStart w:id="75" w:name="ref-bleser2019"/>
+    <w:bookmarkEnd w:id="74"/>
+    <w:bookmarkStart w:id="76" w:name="ref-bleser2019"/>
     <w:p>
       <w:pPr>
         <w:pStyle w:val="Bibliography"/>
@@ -9939,7 +10047,7 @@
       <w:r>
         <w:t xml:space="preserve">. 2019;38(5):794-803. doi:</w:t>
       </w:r>
-      <w:hyperlink r:id="rId74">
+      <w:hyperlink r:id="rId75">
         <w:r>
           <w:rPr>
             <w:rStyle w:val="Hyperlink"/>
@@ -9948,8 +10056,8 @@
         </w:r>
       </w:hyperlink>
     </w:p>
-    <w:bookmarkEnd w:id="75"/>
-    <w:bookmarkStart w:id="77" w:name="ref-zhu2023"/>
+    <w:bookmarkEnd w:id="76"/>
+    <w:bookmarkStart w:id="78" w:name="ref-zhu2023"/>
     <w:p>
       <w:pPr>
         <w:pStyle w:val="Bibliography"/>
@@ -9979,7 +10087,7 @@
       <w:r>
         <w:t xml:space="preserve">. 2023;39(1):302-308. doi:</w:t>
       </w:r>
-      <w:hyperlink r:id="rId76">
+      <w:hyperlink r:id="rId77">
         <w:r>
           <w:rPr>
             <w:rStyle w:val="Hyperlink"/>
@@ -9988,8 +10096,8 @@
         </w:r>
       </w:hyperlink>
     </w:p>
-    <w:bookmarkEnd w:id="77"/>
-    <w:bookmarkStart w:id="79" w:name="ref-ying2023"/>
+    <w:bookmarkEnd w:id="78"/>
+    <w:bookmarkStart w:id="80" w:name="ref-ying2023"/>
     <w:p>
       <w:pPr>
         <w:pStyle w:val="Bibliography"/>
@@ -10019,7 +10127,7 @@
       <w:r>
         <w:t xml:space="preserve">. 2023;38(7):1780-1782. doi:</w:t>
       </w:r>
-      <w:hyperlink r:id="rId78">
+      <w:hyperlink r:id="rId79">
         <w:r>
           <w:rPr>
             <w:rStyle w:val="Hyperlink"/>
@@ -10028,8 +10136,8 @@
         </w:r>
       </w:hyperlink>
     </w:p>
-    <w:bookmarkEnd w:id="79"/>
-    <w:bookmarkStart w:id="81" w:name="ref-ying2024"/>
+    <w:bookmarkEnd w:id="80"/>
+    <w:bookmarkStart w:id="82" w:name="ref-ying2024"/>
     <w:p>
       <w:pPr>
         <w:pStyle w:val="Bibliography"/>
@@ -10059,7 +10167,7 @@
       <w:r>
         <w:t xml:space="preserve">. 2024;2(1):qxad093. doi:</w:t>
       </w:r>
-      <w:hyperlink r:id="rId80">
+      <w:hyperlink r:id="rId81">
         <w:r>
           <w:rPr>
             <w:rStyle w:val="Hyperlink"/>
@@ -10068,8 +10176,8 @@
         </w:r>
       </w:hyperlink>
     </w:p>
-    <w:bookmarkEnd w:id="81"/>
-    <w:bookmarkStart w:id="83" w:name="ref-moloci2021"/>
+    <w:bookmarkEnd w:id="82"/>
+    <w:bookmarkStart w:id="84" w:name="ref-moloci2021"/>
     <w:p>
       <w:pPr>
         <w:pStyle w:val="Bibliography"/>
@@ -10099,7 +10207,7 @@
       <w:r>
         <w:t xml:space="preserve">. 2021;36(8):2490-2491. doi:</w:t>
       </w:r>
-      <w:hyperlink r:id="rId82">
+      <w:hyperlink r:id="rId83">
         <w:r>
           <w:rPr>
             <w:rStyle w:val="Hyperlink"/>
@@ -10108,8 +10216,8 @@
         </w:r>
       </w:hyperlink>
     </w:p>
-    <w:bookmarkEnd w:id="83"/>
-    <w:bookmarkStart w:id="85" w:name="ref-trombley2022"/>
+    <w:bookmarkEnd w:id="84"/>
+    <w:bookmarkStart w:id="86" w:name="ref-trombley2022"/>
     <w:p>
       <w:pPr>
         <w:pStyle w:val="Bibliography"/>
@@ -10139,7 +10247,7 @@
       <w:r>
         <w:t xml:space="preserve">. 2022;41(1):138-146. doi:</w:t>
       </w:r>
-      <w:hyperlink r:id="rId84">
+      <w:hyperlink r:id="rId85">
         <w:r>
           <w:rPr>
             <w:rStyle w:val="Hyperlink"/>
@@ -10148,8 +10256,8 @@
         </w:r>
       </w:hyperlink>
     </w:p>
-    <w:bookmarkEnd w:id="85"/>
-    <w:bookmarkStart w:id="87" w:name="ref-frpathways"/>
+    <w:bookmarkEnd w:id="86"/>
+    <w:bookmarkStart w:id="88" w:name="ref-frpathways"/>
     <w:p>
       <w:pPr>
         <w:pStyle w:val="Bibliography"/>
@@ -10232,7 +10340,7 @@
       <w:r>
         <w:t xml:space="preserve"> </w:t>
       </w:r>
-      <w:hyperlink r:id="rId86">
+      <w:hyperlink r:id="rId87">
         <w:r>
           <w:rPr>
             <w:rStyle w:val="Hyperlink"/>
@@ -10241,8 +10349,8 @@
         </w:r>
       </w:hyperlink>
     </w:p>
-    <w:bookmarkEnd w:id="87"/>
-    <w:bookmarkStart w:id="89" w:name="ref-dataacos"/>
+    <w:bookmarkEnd w:id="88"/>
+    <w:bookmarkStart w:id="90" w:name="ref-dataacos"/>
     <w:p>
       <w:pPr>
         <w:pStyle w:val="Bibliography"/>
@@ -10286,7 +10394,7 @@
       <w:r>
         <w:t xml:space="preserve"> </w:t>
       </w:r>
-      <w:hyperlink r:id="rId88">
+      <w:hyperlink r:id="rId89">
         <w:r>
           <w:rPr>
             <w:rStyle w:val="Hyperlink"/>
@@ -10295,8 +10403,8 @@
         </w:r>
       </w:hyperlink>
     </w:p>
-    <w:bookmarkEnd w:id="89"/>
-    <w:bookmarkStart w:id="91" w:name="ref-milliman2024"/>
+    <w:bookmarkEnd w:id="90"/>
+    <w:bookmarkStart w:id="92" w:name="ref-milliman2024"/>
     <w:p>
       <w:pPr>
         <w:pStyle w:val="Bibliography"/>
@@ -10406,7 +10514,7 @@
       <w:r>
         <w:t xml:space="preserve"> </w:t>
       </w:r>
-      <w:hyperlink r:id="rId90">
+      <w:hyperlink r:id="rId91">
         <w:r>
           <w:rPr>
             <w:rStyle w:val="Hyperlink"/>
@@ -10415,8 +10523,8 @@
         </w:r>
       </w:hyperlink>
     </w:p>
-    <w:bookmarkEnd w:id="91"/>
-    <w:bookmarkStart w:id="93" w:name="ref-milliman2025"/>
+    <w:bookmarkEnd w:id="92"/>
+    <w:bookmarkStart w:id="94" w:name="ref-milliman2025"/>
     <w:p>
       <w:pPr>
         <w:pStyle w:val="Bibliography"/>
@@ -10533,7 +10641,7 @@
       <w:r>
         <w:t xml:space="preserve"> </w:t>
       </w:r>
-      <w:hyperlink r:id="rId92">
+      <w:hyperlink r:id="rId93">
         <w:r>
           <w:rPr>
             <w:rStyle w:val="Hyperlink"/>
@@ -10542,8 +10650,8 @@
         </w:r>
       </w:hyperlink>
     </w:p>
-    <w:bookmarkEnd w:id="93"/>
-    <w:bookmarkStart w:id="94" w:name="ref-registration"/>
+    <w:bookmarkEnd w:id="94"/>
+    <w:bookmarkStart w:id="95" w:name="ref-registration"/>
     <w:p>
       <w:pPr>
         <w:pStyle w:val="Bibliography"/>
@@ -10626,8 +10734,8 @@
         </w:r>
       </w:hyperlink>
     </w:p>
-    <w:bookmarkEnd w:id="94"/>
-    <w:bookmarkStart w:id="96" w:name="ref-vonelm2007"/>
+    <w:bookmarkEnd w:id="95"/>
+    <w:bookmarkStart w:id="97" w:name="ref-vonelm2007"/>
     <w:p>
       <w:pPr>
         <w:pStyle w:val="Bibliography"/>
@@ -10657,7 +10765,7 @@
       <w:r>
         <w:t xml:space="preserve">. 2007;4(10):e296. doi:</w:t>
       </w:r>
-      <w:hyperlink r:id="rId95">
+      <w:hyperlink r:id="rId96">
         <w:r>
           <w:rPr>
             <w:rStyle w:val="Hyperlink"/>
@@ -10666,8 +10774,8 @@
         </w:r>
       </w:hyperlink>
     </w:p>
-    <w:bookmarkEnd w:id="96"/>
-    <w:bookmarkStart w:id="98" w:name="ref-code"/>
+    <w:bookmarkEnd w:id="97"/>
+    <w:bookmarkStart w:id="99" w:name="ref-code"/>
     <w:p>
       <w:pPr>
         <w:pStyle w:val="Bibliography"/>
@@ -10705,7 +10813,7 @@
       <w:r>
         <w:t xml:space="preserve"> </w:t>
       </w:r>
-      <w:hyperlink r:id="rId97">
+      <w:hyperlink r:id="rId98">
         <w:r>
           <w:rPr>
             <w:rStyle w:val="Hyperlink"/>
@@ -10714,8 +10822,8 @@
         </w:r>
       </w:hyperlink>
     </w:p>
-    <w:bookmarkEnd w:id="98"/>
-    <w:bookmarkStart w:id="100" w:name="ref-dataresults"/>
+    <w:bookmarkEnd w:id="99"/>
+    <w:bookmarkStart w:id="101" w:name="ref-dataresults"/>
     <w:p>
       <w:pPr>
         <w:pStyle w:val="Bibliography"/>
@@ -10735,7 +10843,7 @@
       <w:r>
         <w:t xml:space="preserve"> </w:t>
       </w:r>
-      <w:hyperlink r:id="rId99">
+      <w:hyperlink r:id="rId100">
         <w:r>
           <w:rPr>
             <w:rStyle w:val="Hyperlink"/>
@@ -10744,8 +10852,8 @@
         </w:r>
       </w:hyperlink>
     </w:p>
-    <w:bookmarkEnd w:id="100"/>
-    <w:bookmarkStart w:id="102" w:name="ref-datacounty"/>
+    <w:bookmarkEnd w:id="101"/>
+    <w:bookmarkStart w:id="103" w:name="ref-datacounty"/>
     <w:p>
       <w:pPr>
         <w:pStyle w:val="Bibliography"/>
@@ -10765,7 +10873,7 @@
       <w:r>
         <w:t xml:space="preserve"> </w:t>
       </w:r>
-      <w:hyperlink r:id="rId101">
+      <w:hyperlink r:id="rId102">
         <w:r>
           <w:rPr>
             <w:rStyle w:val="Hyperlink"/>
@@ -10774,8 +10882,8 @@
         </w:r>
       </w:hyperlink>
     </w:p>
-    <w:bookmarkEnd w:id="102"/>
-    <w:bookmarkStart w:id="104" w:name="ref-dataassigned"/>
+    <w:bookmarkEnd w:id="103"/>
+    <w:bookmarkStart w:id="105" w:name="ref-dataassigned"/>
     <w:p>
       <w:pPr>
         <w:pStyle w:val="Bibliography"/>
@@ -10795,7 +10903,7 @@
       <w:r>
         <w:t xml:space="preserve"> </w:t>
       </w:r>
-      <w:hyperlink r:id="rId103">
+      <w:hyperlink r:id="rId104">
         <w:r>
           <w:rPr>
             <w:rStyle w:val="Hyperlink"/>
@@ -10804,8 +10912,8 @@
         </w:r>
       </w:hyperlink>
     </w:p>
-    <w:bookmarkEnd w:id="104"/>
-    <w:bookmarkStart w:id="106" w:name="ref-osfproject"/>
+    <w:bookmarkEnd w:id="105"/>
+    <w:bookmarkStart w:id="107" w:name="ref-osfproject"/>
     <w:p>
       <w:pPr>
         <w:pStyle w:val="Bibliography"/>
@@ -10864,7 +10972,7 @@
       <w:r>
         <w:t xml:space="preserve">data snapshot. Published online 2026. doi:</w:t>
       </w:r>
-      <w:hyperlink r:id="rId105">
+      <w:hyperlink r:id="rId106">
         <w:r>
           <w:rPr>
             <w:rStyle w:val="Hyperlink"/>
@@ -10873,8 +10981,8 @@
         </w:r>
       </w:hyperlink>
     </w:p>
-    <w:bookmarkEnd w:id="106"/>
-    <w:bookmarkStart w:id="108" w:name="ref-suppression"/>
+    <w:bookmarkEnd w:id="107"/>
+    <w:bookmarkStart w:id="109" w:name="ref-suppression"/>
     <w:p>
       <w:pPr>
         <w:pStyle w:val="Bibliography"/>
@@ -10906,7 +11014,7 @@
       <w:r>
         <w:t xml:space="preserve"> </w:t>
       </w:r>
-      <w:hyperlink r:id="rId107">
+      <w:hyperlink r:id="rId108">
         <w:r>
           <w:rPr>
             <w:rStyle w:val="Hyperlink"/>
@@ -10915,8 +11023,8 @@
         </w:r>
       </w:hyperlink>
     </w:p>
-    <w:bookmarkEnd w:id="108"/>
-    <w:bookmarkStart w:id="110" w:name="ref-specv10"/>
+    <w:bookmarkEnd w:id="109"/>
+    <w:bookmarkStart w:id="111" w:name="ref-specv10"/>
     <w:p>
       <w:pPr>
         <w:pStyle w:val="Bibliography"/>
@@ -10957,7 +11065,7 @@
       <w:r>
         <w:t xml:space="preserve"> </w:t>
       </w:r>
-      <w:hyperlink r:id="rId109">
+      <w:hyperlink r:id="rId110">
         <w:r>
           <w:rPr>
             <w:rStyle w:val="Hyperlink"/>
@@ -10966,8 +11074,8 @@
         </w:r>
       </w:hyperlink>
     </w:p>
-    <w:bookmarkEnd w:id="110"/>
-    <w:bookmarkStart w:id="112" w:name="ref-cfr425600"/>
+    <w:bookmarkEnd w:id="111"/>
+    <w:bookmarkStart w:id="113" w:name="ref-cfr425600"/>
     <w:p>
       <w:pPr>
         <w:pStyle w:val="Bibliography"/>
@@ -11011,7 +11119,7 @@
       <w:r>
         <w:t xml:space="preserve"> </w:t>
       </w:r>
-      <w:hyperlink r:id="rId111">
+      <w:hyperlink r:id="rId112">
         <w:r>
           <w:rPr>
             <w:rStyle w:val="Hyperlink"/>
@@ -11020,8 +11128,8 @@
         </w:r>
       </w:hyperlink>
     </w:p>
-    <w:bookmarkEnd w:id="112"/>
-    <w:bookmarkStart w:id="114" w:name="ref-rubin1981"/>
+    <w:bookmarkEnd w:id="113"/>
+    <w:bookmarkStart w:id="115" w:name="ref-rubin1981"/>
     <w:p>
       <w:pPr>
         <w:pStyle w:val="Bibliography"/>
@@ -11051,7 +11159,7 @@
       <w:r>
         <w:t xml:space="preserve">. 1981;9(1):130-134. doi:</w:t>
       </w:r>
-      <w:hyperlink r:id="rId113">
+      <w:hyperlink r:id="rId114">
         <w:r>
           <w:rPr>
             <w:rStyle w:val="Hyperlink"/>
@@ -11060,8 +11168,8 @@
         </w:r>
       </w:hyperlink>
     </w:p>
-    <w:bookmarkEnd w:id="114"/>
-    <w:bookmarkStart w:id="116" w:name="ref-phipson2010"/>
+    <w:bookmarkEnd w:id="115"/>
+    <w:bookmarkStart w:id="117" w:name="ref-phipson2010"/>
     <w:p>
       <w:pPr>
         <w:pStyle w:val="Bibliography"/>
@@ -11091,7 +11199,7 @@
       <w:r>
         <w:t xml:space="preserve">. 2010;9(1):39. doi:</w:t>
       </w:r>
-      <w:hyperlink r:id="rId115">
+      <w:hyperlink r:id="rId116">
         <w:r>
           <w:rPr>
             <w:rStyle w:val="Hyperlink"/>
@@ -11100,8 +11208,8 @@
         </w:r>
       </w:hyperlink>
     </w:p>
-    <w:bookmarkEnd w:id="116"/>
-    <w:bookmarkStart w:id="118" w:name="ref-pymc2023"/>
+    <w:bookmarkEnd w:id="117"/>
+    <w:bookmarkStart w:id="119" w:name="ref-pymc2023"/>
     <w:p>
       <w:pPr>
         <w:pStyle w:val="Bibliography"/>
@@ -11131,7 +11239,7 @@
       <w:r>
         <w:t xml:space="preserve">. 2023;9:e1516. doi:</w:t>
       </w:r>
-      <w:hyperlink r:id="rId117">
+      <w:hyperlink r:id="rId118">
         <w:r>
           <w:rPr>
             <w:rStyle w:val="Hyperlink"/>
@@ -11140,8 +11248,8 @@
         </w:r>
       </w:hyperlink>
     </w:p>
-    <w:bookmarkEnd w:id="118"/>
-    <w:bookmarkStart w:id="120" w:name="ref-hoffman2014"/>
+    <w:bookmarkEnd w:id="119"/>
+    <w:bookmarkStart w:id="121" w:name="ref-hoffman2014"/>
     <w:p>
       <w:pPr>
         <w:pStyle w:val="Bibliography"/>
@@ -11207,7 +11315,7 @@
       <w:r>
         <w:t xml:space="preserve"> </w:t>
       </w:r>
-      <w:hyperlink r:id="rId119">
+      <w:hyperlink r:id="rId120">
         <w:r>
           <w:rPr>
             <w:rStyle w:val="Hyperlink"/>
@@ -11216,8 +11324,8 @@
         </w:r>
       </w:hyperlink>
     </w:p>
-    <w:bookmarkEnd w:id="120"/>
-    <w:bookmarkStart w:id="122" w:name="ref-gelman2008"/>
+    <w:bookmarkEnd w:id="121"/>
+    <w:bookmarkStart w:id="123" w:name="ref-gelman2008"/>
     <w:p>
       <w:pPr>
         <w:pStyle w:val="Bibliography"/>
@@ -11247,7 +11355,7 @@
       <w:r>
         <w:t xml:space="preserve">. 2008;27(15):2865-2873. doi:</w:t>
       </w:r>
-      <w:hyperlink r:id="rId121">
+      <w:hyperlink r:id="rId122">
         <w:r>
           <w:rPr>
             <w:rStyle w:val="Hyperlink"/>
@@ -11256,8 +11364,8 @@
         </w:r>
       </w:hyperlink>
     </w:p>
-    <w:bookmarkEnd w:id="122"/>
-    <w:bookmarkStart w:id="124" w:name="ref-vehtari2021"/>
+    <w:bookmarkEnd w:id="123"/>
+    <w:bookmarkStart w:id="125" w:name="ref-vehtari2021"/>
     <w:p>
       <w:pPr>
         <w:pStyle w:val="Bibliography"/>
@@ -11287,7 +11395,7 @@
       <w:r>
         <w:t xml:space="preserve">. 2021;16(2):667-718. doi:</w:t>
       </w:r>
-      <w:hyperlink r:id="rId123">
+      <w:hyperlink r:id="rId124">
         <w:r>
           <w:rPr>
             <w:rStyle w:val="Hyperlink"/>
@@ -11296,8 +11404,8 @@
         </w:r>
       </w:hyperlink>
     </w:p>
-    <w:bookmarkEnd w:id="124"/>
-    <w:bookmarkStart w:id="126" w:name="ref-firth1993"/>
+    <w:bookmarkEnd w:id="125"/>
+    <w:bookmarkStart w:id="127" w:name="ref-firth1993"/>
     <w:p>
       <w:pPr>
         <w:pStyle w:val="Bibliography"/>
@@ -11327,7 +11435,7 @@
       <w:r>
         <w:t xml:space="preserve">. 1993;80(1):27-38. doi:</w:t>
       </w:r>
-      <w:hyperlink r:id="rId125">
+      <w:hyperlink r:id="rId126">
         <w:r>
           <w:rPr>
             <w:rStyle w:val="Hyperlink"/>
@@ -11336,8 +11444,8 @@
         </w:r>
       </w:hyperlink>
     </w:p>
-    <w:bookmarkEnd w:id="126"/>
-    <w:bookmarkStart w:id="128" w:name="ref-firthmodels"/>
+    <w:bookmarkEnd w:id="127"/>
+    <w:bookmarkStart w:id="129" w:name="ref-firthmodels"/>
     <w:p>
       <w:pPr>
         <w:pStyle w:val="Bibliography"/>
@@ -11387,7 +11495,7 @@
       <w:r>
         <w:t xml:space="preserve"> </w:t>
       </w:r>
-      <w:hyperlink r:id="rId127">
+      <w:hyperlink r:id="rId128">
         <w:r>
           <w:rPr>
             <w:rStyle w:val="Hyperlink"/>
@@ -11396,8 +11504,8 @@
         </w:r>
       </w:hyperlink>
     </w:p>
-    <w:bookmarkEnd w:id="128"/>
-    <w:bookmarkStart w:id="130" w:name="ref-gelmanprior2008"/>
+    <w:bookmarkEnd w:id="129"/>
+    <w:bookmarkStart w:id="131" w:name="ref-gelmanprior2008"/>
     <w:p>
       <w:pPr>
         <w:pStyle w:val="Bibliography"/>
@@ -11427,7 +11535,7 @@
       <w:r>
         <w:t xml:space="preserve">. 2008;2(4):1360-1383. doi:</w:t>
       </w:r>
-      <w:hyperlink r:id="rId129">
+      <w:hyperlink r:id="rId130">
         <w:r>
           <w:rPr>
             <w:rStyle w:val="Hyperlink"/>
@@ -11436,8 +11544,8 @@
         </w:r>
       </w:hyperlink>
     </w:p>
-    <w:bookmarkEnd w:id="130"/>
-    <w:bookmarkStart w:id="132" w:name="ref-callaway2021"/>
+    <w:bookmarkEnd w:id="131"/>
+    <w:bookmarkStart w:id="133" w:name="ref-callaway2021"/>
     <w:p>
       <w:pPr>
         <w:pStyle w:val="Bibliography"/>
@@ -11467,7 +11575,7 @@
       <w:r>
         <w:t xml:space="preserve">. 2021;225(2):200-230. doi:</w:t>
       </w:r>
-      <w:hyperlink r:id="rId131">
+      <w:hyperlink r:id="rId132">
         <w:r>
           <w:rPr>
             <w:rStyle w:val="Hyperlink"/>
@@ -11476,8 +11584,8 @@
         </w:r>
       </w:hyperlink>
     </w:p>
-    <w:bookmarkEnd w:id="132"/>
-    <w:bookmarkStart w:id="134" w:name="ref-roth2022"/>
+    <w:bookmarkEnd w:id="133"/>
+    <w:bookmarkStart w:id="135" w:name="ref-roth2022"/>
     <w:p>
       <w:pPr>
         <w:pStyle w:val="Bibliography"/>
@@ -11507,7 +11615,7 @@
       <w:r>
         <w:t xml:space="preserve">. 2022;4(3):305-322. doi:</w:t>
       </w:r>
-      <w:hyperlink r:id="rId133">
+      <w:hyperlink r:id="rId134">
         <w:r>
           <w:rPr>
             <w:rStyle w:val="Hyperlink"/>
@@ -11516,8 +11624,8 @@
         </w:r>
       </w:hyperlink>
     </w:p>
-    <w:bookmarkEnd w:id="134"/>
-    <w:bookmarkStart w:id="136" w:name="ref-lakens2017"/>
+    <w:bookmarkEnd w:id="135"/>
+    <w:bookmarkStart w:id="137" w:name="ref-lakens2017"/>
     <w:p>
       <w:pPr>
         <w:pStyle w:val="Bibliography"/>
@@ -11547,7 +11655,7 @@
       <w:r>
         <w:t xml:space="preserve">. 2017;8(4):355-362. doi:</w:t>
       </w:r>
-      <w:hyperlink r:id="rId135">
+      <w:hyperlink r:id="rId136">
         <w:r>
           <w:rPr>
             <w:rStyle w:val="Hyperlink"/>
@@ -11556,8 +11664,8 @@
         </w:r>
       </w:hyperlink>
     </w:p>
-    <w:bookmarkEnd w:id="136"/>
-    <w:bookmarkStart w:id="138" w:name="ref-rambachan2023"/>
+    <w:bookmarkEnd w:id="137"/>
+    <w:bookmarkStart w:id="139" w:name="ref-rambachan2023"/>
     <w:p>
       <w:pPr>
         <w:pStyle w:val="Bibliography"/>
@@ -11587,7 +11695,7 @@
       <w:r>
         <w:t xml:space="preserve">. 2023;90(5):2555-2591. doi:</w:t>
       </w:r>
-      <w:hyperlink r:id="rId137">
+      <w:hyperlink r:id="rId138">
         <w:r>
           <w:rPr>
             <w:rStyle w:val="Hyperlink"/>
@@ -11596,8 +11704,8 @@
         </w:r>
       </w:hyperlink>
     </w:p>
-    <w:bookmarkEnd w:id="138"/>
-    <w:bookmarkStart w:id="140" w:name="ref-rosenbaum1983"/>
+    <w:bookmarkEnd w:id="139"/>
+    <w:bookmarkStart w:id="141" w:name="ref-rosenbaum1983"/>
     <w:p>
       <w:pPr>
         <w:pStyle w:val="Bibliography"/>
@@ -11627,7 +11735,7 @@
       <w:r>
         <w:t xml:space="preserve">. 1983;70(1):41-55. doi:</w:t>
       </w:r>
-      <w:hyperlink r:id="rId139">
+      <w:hyperlink r:id="rId140">
         <w:r>
           <w:rPr>
             <w:rStyle w:val="Hyperlink"/>
@@ -11636,8 +11744,8 @@
         </w:r>
       </w:hyperlink>
     </w:p>
-    <w:bookmarkEnd w:id="140"/>
-    <w:bookmarkStart w:id="142" w:name="ref-welch1947"/>
+    <w:bookmarkEnd w:id="141"/>
+    <w:bookmarkStart w:id="143" w:name="ref-welch1947"/>
     <w:p>
       <w:pPr>
         <w:pStyle w:val="Bibliography"/>
@@ -11679,7 +11787,7 @@
       <w:r>
         <w:t xml:space="preserve">. 1947;34(1-2):28-35. doi:</w:t>
       </w:r>
-      <w:hyperlink r:id="rId141">
+      <w:hyperlink r:id="rId142">
         <w:r>
           <w:rPr>
             <w:rStyle w:val="Hyperlink"/>
@@ -11688,8 +11796,8 @@
         </w:r>
       </w:hyperlink>
     </w:p>
-    <w:bookmarkEnd w:id="142"/>
-    <w:bookmarkStart w:id="144" w:name="ref-mackinnon1985"/>
+    <w:bookmarkEnd w:id="143"/>
+    <w:bookmarkStart w:id="145" w:name="ref-mackinnon1985"/>
     <w:p>
       <w:pPr>
         <w:pStyle w:val="Bibliography"/>
@@ -11719,7 +11827,7 @@
       <w:r>
         <w:t xml:space="preserve">. 1985;29(3):305-325. doi:</w:t>
       </w:r>
-      <w:hyperlink r:id="rId143">
+      <w:hyperlink r:id="rId144">
         <w:r>
           <w:rPr>
             <w:rStyle w:val="Hyperlink"/>
@@ -11728,8 +11836,8 @@
         </w:r>
       </w:hyperlink>
     </w:p>
-    <w:bookmarkEnd w:id="144"/>
-    <w:bookmarkStart w:id="146" w:name="ref-statsmodels2010"/>
+    <w:bookmarkEnd w:id="145"/>
+    <w:bookmarkStart w:id="147" w:name="ref-statsmodels2010"/>
     <w:p>
       <w:pPr>
         <w:pStyle w:val="Bibliography"/>
@@ -11759,7 +11867,7 @@
       <w:r>
         <w:t xml:space="preserve">. Published online 2010:92-96. doi:</w:t>
       </w:r>
-      <w:hyperlink r:id="rId145">
+      <w:hyperlink r:id="rId146">
         <w:r>
           <w:rPr>
             <w:rStyle w:val="Hyperlink"/>
@@ -11768,8 +11876,8 @@
         </w:r>
       </w:hyperlink>
     </w:p>
-    <w:bookmarkEnd w:id="146"/>
-    <w:bookmarkStart w:id="148" w:name="ref-dbt"/>
+    <w:bookmarkEnd w:id="147"/>
+    <w:bookmarkStart w:id="149" w:name="ref-dbt"/>
     <w:p>
       <w:pPr>
         <w:pStyle w:val="Bibliography"/>
@@ -11816,7 +11924,7 @@
       <w:r>
         <w:t xml:space="preserve"> </w:t>
       </w:r>
-      <w:hyperlink r:id="rId147">
+      <w:hyperlink r:id="rId148">
         <w:r>
           <w:rPr>
             <w:rStyle w:val="Hyperlink"/>
@@ -11825,8 +11933,8 @@
         </w:r>
       </w:hyperlink>
     </w:p>
-    <w:bookmarkEnd w:id="148"/>
-    <w:bookmarkStart w:id="150" w:name="ref-duckdb2019"/>
+    <w:bookmarkEnd w:id="149"/>
+    <w:bookmarkStart w:id="151" w:name="ref-duckdb2019"/>
     <w:p>
       <w:pPr>
         <w:pStyle w:val="Bibliography"/>
@@ -11856,7 +11964,7 @@
       <w:r>
         <w:t xml:space="preserve">. Published online June 25, 2019:1981-1984. doi:</w:t>
       </w:r>
-      <w:hyperlink r:id="rId149">
+      <w:hyperlink r:id="rId150">
         <w:r>
           <w:rPr>
             <w:rStyle w:val="Hyperlink"/>
@@ -11865,8 +11973,8 @@
         </w:r>
       </w:hyperlink>
     </w:p>
-    <w:bookmarkEnd w:id="150"/>
-    <w:bookmarkStart w:id="152" w:name="ref-uv"/>
+    <w:bookmarkEnd w:id="151"/>
+    <w:bookmarkStart w:id="153" w:name="ref-uv"/>
     <w:p>
       <w:pPr>
         <w:pStyle w:val="Bibliography"/>
@@ -11907,7 +12015,7 @@
       <w:r>
         <w:t xml:space="preserve"> </w:t>
       </w:r>
-      <w:hyperlink r:id="rId151">
+      <w:hyperlink r:id="rId152">
         <w:r>
           <w:rPr>
             <w:rStyle w:val="Hyperlink"/>
@@ -11916,8 +12024,8 @@
         </w:r>
       </w:hyperlink>
     </w:p>
-    <w:bookmarkEnd w:id="152"/>
-    <w:bookmarkStart w:id="154" w:name="ref-arviz2019"/>
+    <w:bookmarkEnd w:id="153"/>
+    <w:bookmarkStart w:id="155" w:name="ref-arviz2019"/>
     <w:p>
       <w:pPr>
         <w:pStyle w:val="Bibliography"/>
@@ -11947,7 +12055,7 @@
       <w:r>
         <w:t xml:space="preserve">. 2019;4(33):1143. doi:</w:t>
       </w:r>
-      <w:hyperlink r:id="rId153">
+      <w:hyperlink r:id="rId154">
         <w:r>
           <w:rPr>
             <w:rStyle w:val="Hyperlink"/>
@@ -11956,8 +12064,8 @@
         </w:r>
       </w:hyperlink>
     </w:p>
-    <w:bookmarkEnd w:id="154"/>
-    <w:bookmarkStart w:id="156" w:name="ref-numpy2020"/>
+    <w:bookmarkEnd w:id="155"/>
+    <w:bookmarkStart w:id="157" w:name="ref-numpy2020"/>
     <w:p>
       <w:pPr>
         <w:pStyle w:val="Bibliography"/>
@@ -11987,7 +12095,7 @@
       <w:r>
         <w:t xml:space="preserve">. 2020;585(7825):357-362. doi:</w:t>
       </w:r>
-      <w:hyperlink r:id="rId155">
+      <w:hyperlink r:id="rId156">
         <w:r>
           <w:rPr>
             <w:rStyle w:val="Hyperlink"/>
@@ -11996,8 +12104,8 @@
         </w:r>
       </w:hyperlink>
     </w:p>
-    <w:bookmarkEnd w:id="156"/>
-    <w:bookmarkStart w:id="158" w:name="ref-gelmancarlin2014"/>
+    <w:bookmarkEnd w:id="157"/>
+    <w:bookmarkStart w:id="159" w:name="ref-gelmancarlin2014"/>
     <w:p>
       <w:pPr>
         <w:pStyle w:val="Bibliography"/>
@@ -12027,7 +12135,7 @@
       <w:r>
         <w:t xml:space="preserve">. 2014;9(6):641-651. doi:</w:t>
       </w:r>
-      <w:hyperlink r:id="rId157">
+      <w:hyperlink r:id="rId158">
         <w:r>
           <w:rPr>
             <w:rStyle w:val="Hyperlink"/>
@@ -12036,8 +12144,8 @@
         </w:r>
       </w:hyperlink>
     </w:p>
-    <w:bookmarkEnd w:id="158"/>
-    <w:bookmarkStart w:id="160" w:name="ref-cfr2024"/>
+    <w:bookmarkEnd w:id="159"/>
+    <w:bookmarkStart w:id="161" w:name="ref-cfr2024"/>
     <w:p>
       <w:pPr>
         <w:pStyle w:val="Bibliography"/>
@@ -12081,7 +12189,7 @@
       <w:r>
         <w:t xml:space="preserve"> </w:t>
       </w:r>
-      <w:hyperlink r:id="rId159">
+      <w:hyperlink r:id="rId160">
         <w:r>
           <w:rPr>
             <w:rStyle w:val="Hyperlink"/>
@@ -12090,8 +12198,8 @@
         </w:r>
       </w:hyperlink>
     </w:p>
-    <w:bookmarkEnd w:id="160"/>
-    <w:bookmarkStart w:id="162" w:name="ref-aha2021"/>
+    <w:bookmarkEnd w:id="161"/>
+    <w:bookmarkStart w:id="163" w:name="ref-aha2021"/>
     <w:p>
       <w:pPr>
         <w:pStyle w:val="Bibliography"/>
@@ -12141,7 +12249,7 @@
       <w:r>
         <w:t xml:space="preserve"> </w:t>
       </w:r>
-      <w:hyperlink r:id="rId161">
+      <w:hyperlink r:id="rId162">
         <w:r>
           <w:rPr>
             <w:rStyle w:val="Hyperlink"/>
@@ -12150,8 +12258,8 @@
         </w:r>
       </w:hyperlink>
     </w:p>
-    <w:bookmarkEnd w:id="162"/>
-    <w:bookmarkStart w:id="164" w:name="ref-post"/>
+    <w:bookmarkEnd w:id="163"/>
+    <w:bookmarkStart w:id="165" w:name="ref-post"/>
     <w:p>
       <w:pPr>
         <w:pStyle w:val="Bibliography"/>
@@ -12201,7 +12309,7 @@
       <w:r>
         <w:t xml:space="preserve"> </w:t>
       </w:r>
-      <w:hyperlink r:id="rId163">
+      <w:hyperlink r:id="rId164">
         <w:r>
           <w:rPr>
             <w:rStyle w:val="Hyperlink"/>
@@ -12210,9 +12318,9 @@
         </w:r>
       </w:hyperlink>
     </w:p>
-    <w:bookmarkEnd w:id="164"/>
     <w:bookmarkEnd w:id="165"/>
     <w:bookmarkEnd w:id="166"/>
+    <w:bookmarkEnd w:id="167"/>
     <w:sectPr>
       <w:footnotePr>
         <w:numRestart w:val="eachSect"/>

</xml_diff>

<commit_message>
Preprint: tighten the structured abstract
Co-Authored-By: Claude Opus 5.5 <noreply@anthropic.com>
</commit_message>
<xml_diff>
--- a/paper.docx
+++ b/paper.docx
@@ -168,13 +168,7 @@
         <w:t xml:space="preserve"> </w:t>
       </w:r>
       <w:r>
-        <w:t xml:space="preserve">early to reset sooner; industry reports have described these ACOs’ savings, but which ACOs did so has not been</w:t>
-      </w:r>
-      <w:r>
-        <w:t xml:space="preserve"> </w:t>
-      </w:r>
-      <w:r>
-        <w:t xml:space="preserve">studied in the peer-reviewed literature.</w:t>
+        <w:t xml:space="preserve">early to reset sooner; which ACOs did so has not been studied in the peer-reviewed literature.</w:t>
       </w:r>
     </w:p>
     <w:p>
@@ -192,13 +186,13 @@
         <w:t xml:space="preserve"> </w:t>
       </w:r>
       <w:r>
-        <w:t xml:space="preserve">To test, under a preregistered plan, whether ACOs that renewed early stood to gain more than others</w:t>
-      </w:r>
-      <w:r>
-        <w:t xml:space="preserve"> </w:t>
-      </w:r>
-      <w:r>
-        <w:t xml:space="preserve">from the regional part of a benchmark reset, and whether their spending growth differed afterward.</w:t>
+        <w:t xml:space="preserve">To test whether ACOs that renewed early stood to gain more from the regional part of a reset, and</w:t>
+      </w:r>
+      <w:r>
+        <w:t xml:space="preserve"> </w:t>
+      </w:r>
+      <w:r>
+        <w:t xml:space="preserve">whether their spending growth differed afterward.</w:t>
       </w:r>
     </w:p>
     <w:p>
@@ -222,25 +216,19 @@
         <w:t xml:space="preserve"> </w:t>
       </w:r>
       <w:r>
-        <w:t xml:space="preserve">began July 1, 2019 or January 1, 2020, using CMS public use files (2016-2024). The plan, decision rules and code were</w:t>
-      </w:r>
-      <w:r>
-        <w:t xml:space="preserve"> </w:t>
-      </w:r>
-      <w:r>
-        <w:t xml:space="preserve">registered on OSF before any outcome data were read, with a code-level lock on the outcome files. The benchmark a</w:t>
-      </w:r>
-      <w:r>
-        <w:t xml:space="preserve"> </w:t>
-      </w:r>
-      <w:r>
-        <w:t xml:space="preserve">reset would produce was rebuilt from the regulation (42 CFR 425.601) and validated against benchmarks CMS published</w:t>
-      </w:r>
-      <w:r>
-        <w:t xml:space="preserve"> </w:t>
-      </w:r>
-      <w:r>
-        <w:t xml:space="preserve">for 101 other ACOs before use.</w:t>
+        <w:t xml:space="preserve">began July 1, 2019 or January 1, 2020, using CMS public use files (2016-2024). Plan, decision rules and code were</w:t>
+      </w:r>
+      <w:r>
+        <w:t xml:space="preserve"> </w:t>
+      </w:r>
+      <w:r>
+        <w:t xml:space="preserve">registered on OSF before any outcome data were read. The reset benchmark was rebuilt from 42 CFR 425.601 and</w:t>
+      </w:r>
+      <w:r>
+        <w:t xml:space="preserve"> </w:t>
+      </w:r>
+      <w:r>
+        <w:t xml:space="preserve">validated against CMS’s published benchmarks for 101 other ACOs before use.</w:t>
       </w:r>
     </w:p>
     <w:p>
@@ -258,19 +246,19 @@
         <w:t xml:space="preserve"> </w:t>
       </w:r>
       <w:r>
-        <w:t xml:space="preserve">For the choice analyses, pre-decision characteristics: the regional pull (case-mix-adjusted regional</w:t>
-      </w:r>
-      <w:r>
-        <w:t xml:space="preserve"> </w:t>
-      </w:r>
-      <w:r>
-        <w:t xml:space="preserve">spending relative to the ACO’s current benchmark; primary), the own-spending component of a reset and the BASIC</w:t>
-      </w:r>
-      <w:r>
-        <w:t xml:space="preserve"> </w:t>
-      </w:r>
-      <w:r>
-        <w:t xml:space="preserve">risk level. For the spending analysis, early renewal into a January 1, 2022 agreement.</w:t>
+        <w:t xml:space="preserve">For the choice of early renewal into a January 1, 2022 agreement (29 ACOs vs 277 that stayed):</w:t>
+      </w:r>
+      <w:r>
+        <w:t xml:space="preserve"> </w:t>
+      </w:r>
+      <w:r>
+        <w:t xml:space="preserve">the regional pull (case-mix-adjusted regional spending relative to the current benchmark; primary), the own-spending</w:t>
+      </w:r>
+      <w:r>
+        <w:t xml:space="preserve"> </w:t>
+      </w:r>
+      <w:r>
+        <w:t xml:space="preserve">component of a reset and the BASIC risk level. For spending, early renewal itself.</w:t>
       </w:r>
     </w:p>
     <w:p>
@@ -288,25 +276,19 @@
         <w:t xml:space="preserve"> </w:t>
       </w:r>
       <w:r>
-        <w:t xml:space="preserve">Early renewal (29 ACOs, compared with 277 that stayed), analyzed by group comparisons</w:t>
-      </w:r>
-      <w:r>
-        <w:t xml:space="preserve"> </w:t>
-      </w:r>
-      <w:r>
-        <w:t xml:space="preserve">with Bayesian bootstrap intervals and permutation tests and by a Bayesian logistic model with measurement error</w:t>
-      </w:r>
-      <w:r>
-        <w:t xml:space="preserve"> </w:t>
-      </w:r>
-      <w:r>
-        <w:t xml:space="preserve">tested by direct simulation; and per-capita spending growth in 2022-2024, by difference-in-differences with a</w:t>
-      </w:r>
-      <w:r>
-        <w:t xml:space="preserve"> </w:t>
-      </w:r>
-      <w:r>
-        <w:t xml:space="preserve">preregistered equivalence condition on pre-trends.</w:t>
+        <w:t xml:space="preserve">Early renewal, by group comparisons (Bayesian bootstrap, permutation tests) and a</w:t>
+      </w:r>
+      <w:r>
+        <w:t xml:space="preserve"> </w:t>
+      </w:r>
+      <w:r>
+        <w:t xml:space="preserve">Bayesian logistic model with measurement error tested by direct simulation; per-capita spending growth in 2022-2024,</w:t>
+      </w:r>
+      <w:r>
+        <w:t xml:space="preserve"> </w:t>
+      </w:r>
+      <w:r>
+        <w:t xml:space="preserve">by difference-in-differences with a preregistered equivalence condition on pre-trends.</w:t>
       </w:r>
     </w:p>
     <w:p>
@@ -338,19 +320,19 @@
         <w:t xml:space="preserve"> </w:t>
       </w:r>
       <w:r>
-        <w:t xml:space="preserve">= 0.94; median absolute error 1.6%). Relative to</w:t>
-      </w:r>
-      <w:r>
-        <w:t xml:space="preserve"> </w:t>
-      </w:r>
-      <w:r>
-        <w:t xml:space="preserve">their current benchmarks, early renewers’ case-mix-adjusted regional spending was 3.4 percentage points higher than</w:t>
-      </w:r>
-      <w:r>
-        <w:t xml:space="preserve"> </w:t>
-      </w:r>
-      <w:r>
-        <w:t xml:space="preserve">stayers’ (95% credible interval [CrI], 1.7 to 5.4;</w:t>
+        <w:t xml:space="preserve">= 0.94). Relative to their current benchmarks,</w:t>
+      </w:r>
+      <w:r>
+        <w:t xml:space="preserve"> </w:t>
+      </w:r>
+      <w:r>
+        <w:t xml:space="preserve">early renewers’ regional spending was 3.4 percentage points higher than stayers’ (95% credible interval [CrI], 1.7</w:t>
+      </w:r>
+      <w:r>
+        <w:t xml:space="preserve"> </w:t>
+      </w:r>
+      <w:r>
+        <w:t xml:space="preserve">to 5.4;</w:t>
       </w:r>
       <w:r>
         <w:t xml:space="preserve"> </w:t>
@@ -366,59 +348,37 @@
         <w:t xml:space="preserve"> </w:t>
       </w:r>
       <w:r>
-        <w:t xml:space="preserve">&lt; .001). Early renewers were also beating their benchmarks by</w:t>
-      </w:r>
-      <w:r>
-        <w:t xml:space="preserve"> </w:t>
-      </w:r>
-      <w:r>
-        <w:t xml:space="preserve">more (own-spending component, −2.1 points; 95% CrI, −3.8 to −0.5), and by the approximation the total expected</w:t>
-      </w:r>
-      <w:r>
-        <w:t xml:space="preserve"> </w:t>
-      </w:r>
-      <w:r>
-        <w:t xml:space="preserve">gain from a reset did not differ (−0.5 points; 95% CrI, −2.0 to 0.8). In a post hoc check, CMS’s published 2022</w:t>
-      </w:r>
-      <w:r>
-        <w:t xml:space="preserve"> </w:t>
-      </w:r>
-      <w:r>
-        <w:t xml:space="preserve">benchmarks for early renewers averaged 1.3% below their 2021 benchmarks. Among 206 BASIC-track ACOs, early renewal was</w:t>
-      </w:r>
-      <w:r>
-        <w:t xml:space="preserve"> </w:t>
-      </w:r>
-      <w:r>
-        <w:t xml:space="preserve">associated with a higher regional pull (log-odds difference per 2 SD, 1.34; 95% CrI, 0.44 to 2.30) and a higher,</w:t>
-      </w:r>
-      <w:r>
-        <w:t xml:space="preserve"> </w:t>
-      </w:r>
-      <w:r>
-        <w:t xml:space="preserve">two-sided BASIC level (1.34; 95% CrI, 0.38 to 2.31). Spending growth did not differ detectably (−0.4%; 95% CrI,</w:t>
-      </w:r>
-      <w:r>
-        <w:t xml:space="preserve"> </w:t>
-      </w:r>
-      <w:r>
-        <w:t xml:space="preserve">−4.0% to 2.5%;</w:t>
-      </w:r>
-      <w:r>
-        <w:t xml:space="preserve"> </w:t>
-      </w:r>
-      <w:r>
-        <w:rPr>
-          <w:i/>
-          <w:iCs/>
-        </w:rPr>
-        <w:t xml:space="preserve">P</w:t>
-      </w:r>
-      <w:r>
-        <w:t xml:space="preserve"> </w:t>
-      </w:r>
-      <w:r>
-        <w:t xml:space="preserve">= .78); the equivalence condition did not hold, so this is not read as an effect.</w:t>
+        <w:t xml:space="preserve">&lt; .001), but they were also beating their benchmarks by more (own-spending component, −2.1 points; 95%</w:t>
+      </w:r>
+      <w:r>
+        <w:t xml:space="preserve"> </w:t>
+      </w:r>
+      <w:r>
+        <w:t xml:space="preserve">CrI, −3.8 to −0.5), and the total expected gain did not differ (−0.5 points; 95% CrI, −2.0 to 0.8). Post hoc, CMS’s</w:t>
+      </w:r>
+      <w:r>
+        <w:t xml:space="preserve"> </w:t>
+      </w:r>
+      <w:r>
+        <w:t xml:space="preserve">published 2022 benchmarks for early renewers averaged 1.3% below their 2021 benchmarks. Among 206 BASIC-track ACOs,</w:t>
+      </w:r>
+      <w:r>
+        <w:t xml:space="preserve"> </w:t>
+      </w:r>
+      <w:r>
+        <w:t xml:space="preserve">early renewal was associated with a higher regional pull (log-odds difference per 2 SD, 1.34; 95% CrI, 0.44 to 2.30)</w:t>
+      </w:r>
+      <w:r>
+        <w:t xml:space="preserve"> </w:t>
+      </w:r>
+      <w:r>
+        <w:t xml:space="preserve">and a higher, two-sided BASIC level (1.34; 95% CrI, 0.38 to 2.31). Spending growth did not differ detectably</w:t>
+      </w:r>
+      <w:r>
+        <w:t xml:space="preserve"> </w:t>
+      </w:r>
+      <w:r>
+        <w:t xml:space="preserve">(−0.4%; 95% CrI, −4.0% to 2.5%); the equivalence condition did not hold, so this is not read as an effect.</w:t>
       </w:r>
     </w:p>
     <w:p>
@@ -442,25 +402,19 @@
         <w:t xml:space="preserve"> </w:t>
       </w:r>
       <w:r>
-        <w:t xml:space="preserve">benchmarks and were more often at higher BASIC levels, for which renewal opened a 75% sharing rate. By the study’s</w:t>
-      </w:r>
-      <w:r>
-        <w:t xml:space="preserve"> </w:t>
-      </w:r>
-      <w:r>
-        <w:t xml:space="preserve">approximation, and in CMS’s published benchmarks examined post hoc, the reset did not on average raise their</w:t>
-      </w:r>
-      <w:r>
-        <w:t xml:space="preserve"> </w:t>
-      </w:r>
-      <w:r>
-        <w:t xml:space="preserve">benchmarks. These are associations under the 2022</w:t>
-      </w:r>
-      <w:r>
-        <w:t xml:space="preserve"> </w:t>
-      </w:r>
-      <w:r>
-        <w:t xml:space="preserve">rules; benchmarks set from 2024 credit prior savings.</w:t>
+        <w:t xml:space="preserve">benchmarks and were more often at higher BASIC levels, for which renewal opened a 75% sharing rate; the reset did</w:t>
+      </w:r>
+      <w:r>
+        <w:t xml:space="preserve"> </w:t>
+      </w:r>
+      <w:r>
+        <w:t xml:space="preserve">not on average raise their benchmarks. These are associations under the 2022 rules; benchmarks set from 2024 credit</w:t>
+      </w:r>
+      <w:r>
+        <w:t xml:space="preserve"> </w:t>
+      </w:r>
+      <w:r>
+        <w:t xml:space="preserve">prior savings.</w:t>
       </w:r>
     </w:p>
     <w:bookmarkEnd w:id="12"/>

</xml_diff>

<commit_message>
Preprint: competing-interests statement without the ACO-history sentence
Co-Authored-By: Claude Opus 5.5 <noreply@anthropic.com>
</commit_message>
<xml_diff>
--- a/paper.docx
+++ b/paper.docx
@@ -9289,13 +9289,7 @@
         <w:t xml:space="preserve"> </w:t>
       </w:r>
       <w:r>
-        <w:t xml:space="preserve">design, analysis, interpretation or reporting. Indiana University Health’s ACO participated in the Shared Savings</w:t>
-      </w:r>
-      <w:r>
-        <w:t xml:space="preserve"> </w:t>
-      </w:r>
-      <w:r>
-        <w:t xml:space="preserve">Program only in 2014-2016 and is not in the study cohorts. The author declares no other competing interests.</w:t>
+        <w:t xml:space="preserve">design, analysis, interpretation or reporting. The author declares no other competing interests.</w:t>
       </w:r>
     </w:p>
     <w:p>

</xml_diff>

<commit_message>
Manuscript: state the contribution to the literature (Principal Findings, Comparison With Prior Work, a strengths paragraph, Conclusions, abstract)
No new numbers; check_numbers and the JMIR validator pass (abstract 439/450, 8,253 words).

Co-Authored-By: Claude Opus 5.5 <noreply@anthropic.com>
</commit_message>
<xml_diff>
--- a/paper.docx
+++ b/paper.docx
@@ -369,13 +369,13 @@
         <w:t xml:space="preserve"> </w:t>
       </w:r>
       <w:r>
-        <w:t xml:space="preserve">not on average raise their benchmarks. These are associations under the 2022 rules; benchmarks set from 2024 credit</w:t>
-      </w:r>
-      <w:r>
-        <w:t xml:space="preserve"> </w:t>
-      </w:r>
-      <w:r>
-        <w:t xml:space="preserve">prior savings.</w:t>
+        <w:t xml:space="preserve">not on average raise their benchmarks. These are associations under the 2022 rules; benchmarks set from 2024 credit prior savings. These findings extend</w:t>
+      </w:r>
+      <w:r>
+        <w:t xml:space="preserve"> </w:t>
+      </w:r>
+      <w:r>
+        <w:t xml:space="preserve">evidence that benchmark rules sort ACOs to the timing of resets.</w:t>
       </w:r>
     </w:p>
     <w:p>
@@ -8174,6 +8174,32 @@
         <w:t xml:space="preserve">trends.</w:t>
       </w:r>
     </w:p>
+    <w:p>
+      <w:pPr>
+        <w:pStyle w:val="BodyText"/>
+      </w:pPr>
+      <w:r>
+        <w:t xml:space="preserve">To the author’s knowledge, this is the first peer-reviewed study of which ACOs used the early-renewal option. It adds</w:t>
+      </w:r>
+      <w:r>
+        <w:t xml:space="preserve"> </w:t>
+      </w:r>
+      <w:r>
+        <w:t xml:space="preserve">3 things to the literature on how benchmark rules sort ACOs: evidence that the sorting extends from whether ACOs join</w:t>
+      </w:r>
+      <w:r>
+        <w:t xml:space="preserve"> </w:t>
+      </w:r>
+      <w:r>
+        <w:t xml:space="preserve">or leave to when they reset; evidence against the intuitive account that ACOs renewed early to raise their</w:t>
+      </w:r>
+      <w:r>
+        <w:t xml:space="preserve"> </w:t>
+      </w:r>
+      <w:r>
+        <w:t xml:space="preserve">benchmarks; and a preregistered estimate of spending after renewal, under rules that have since changed.</w:t>
+      </w:r>
+    </w:p>
     <w:bookmarkEnd w:id="52"/>
     <w:bookmarkStart w:id="53" w:name="comparison-with-prior-work"/>
     <w:p>
@@ -8285,7 +8311,19 @@
         <w:t xml:space="preserve"> </w:t>
       </w:r>
       <w:r>
-        <w:t xml:space="preserve">H1 and the BASIC-level association here. The finding that early renewers were savers also fits reports that ACOs earning bonuses survived longer in the</w:t>
+        <w:t xml:space="preserve">H1 and the BASIC-level association here. Beyond that analysis, this study rebuilt the reset benchmark and validated it</w:t>
+      </w:r>
+      <w:r>
+        <w:t xml:space="preserve"> </w:t>
+      </w:r>
+      <w:r>
+        <w:t xml:space="preserve">against CMS’s, separated its own-spending and regional parts, modeled the decision within the BASIC track and followed</w:t>
+      </w:r>
+      <w:r>
+        <w:t xml:space="preserve"> </w:t>
+      </w:r>
+      <w:r>
+        <w:t xml:space="preserve">spending afterward, under a preregistered plan. The finding that early renewers were savers also fits reports that ACOs earning bonuses survived longer in the</w:t>
       </w:r>
       <w:r>
         <w:t xml:space="preserve"> </w:t>
@@ -8317,7 +8355,7 @@
         <w:t xml:space="preserve"> </w:t>
       </w:r>
       <w:r>
-        <w:t xml:space="preserve">after the 2019 rules,</w:t>
+        <w:t xml:space="preserve">after the 2019 rules.</w:t>
       </w:r>
       <w:r>
         <w:t xml:space="preserve">[</w:t>
@@ -8337,13 +8375,19 @@
         <w:t xml:space="preserve"> </w:t>
       </w:r>
       <w:r>
-        <w:t xml:space="preserve">but the same success meant that the own-spending part of a reset would have cut</w:t>
-      </w:r>
-      <w:r>
-        <w:t xml:space="preserve"> </w:t>
-      </w:r>
-      <w:r>
-        <w:t xml:space="preserve">their benchmarks, so the simple account that ACOs reset to get a higher benchmark does not describe them on average.</w:t>
+        <w:t xml:space="preserve">The same success, however, meant that the own-spending part of a reset would</w:t>
+      </w:r>
+      <w:r>
+        <w:t xml:space="preserve"> </w:t>
+      </w:r>
+      <w:r>
+        <w:t xml:space="preserve">have cut their benchmarks. The intuitive account that ACOs renewed early to get a higher benchmark therefore does not</w:t>
+      </w:r>
+      <w:r>
+        <w:t xml:space="preserve"> </w:t>
+      </w:r>
+      <w:r>
+        <w:t xml:space="preserve">describe them on average, and CMS’s published 2022 benchmarks, examined post hoc, agree.</w:t>
       </w:r>
       <w:r>
         <w:t xml:space="preserve"> </w:t>
@@ -8605,13 +8649,13 @@
       </w:r>
     </w:p>
     <w:bookmarkEnd w:id="54"/>
-    <w:bookmarkStart w:id="55" w:name="limitations"/>
+    <w:bookmarkStart w:id="55" w:name="strengths-and-limitations"/>
     <w:p>
       <w:pPr>
         <w:pStyle w:val="Heading2"/>
       </w:pPr>
       <w:r>
-        <w:t xml:space="preserve">Limitations</w:t>
+        <w:t xml:space="preserve">Strengths and Limitations</w:t>
       </w:r>
     </w:p>
     <w:p>
@@ -8619,7 +8663,39 @@
         <w:pStyle w:val="FirstParagraph"/>
       </w:pPr>
       <w:r>
-        <w:t xml:space="preserve">This study has limitations. First, the motives are bundled, and the regional pull, though it has no term for</w:t>
+        <w:t xml:space="preserve">The study’s strengths are in its design. The plan, decision rules and code were registered before any outcome data</w:t>
+      </w:r>
+      <w:r>
+        <w:t xml:space="preserve"> </w:t>
+      </w:r>
+      <w:r>
+        <w:t xml:space="preserve">were read, and the code enforced that order; the benchmark CMS does not publish was rebuilt from the regulation and</w:t>
+      </w:r>
+      <w:r>
+        <w:t xml:space="preserve"> </w:t>
+      </w:r>
+      <w:r>
+        <w:t xml:space="preserve">validated before use; the measurement error found in validation was carried into the decision model; and every</w:t>
+      </w:r>
+      <w:r>
+        <w:t xml:space="preserve"> </w:t>
+      </w:r>
+      <w:r>
+        <w:t xml:space="preserve">registered verdict agreed with its conventional frequentist counterpart. The code, data snapshot and results are</w:t>
+      </w:r>
+      <w:r>
+        <w:t xml:space="preserve"> </w:t>
+      </w:r>
+      <w:r>
+        <w:t xml:space="preserve">public, so every estimate can be rerun.</w:t>
+      </w:r>
+    </w:p>
+    <w:p>
+      <w:pPr>
+        <w:pStyle w:val="BodyText"/>
+      </w:pPr>
+      <w:r>
+        <w:t xml:space="preserve">It also has limitations. First, the motives are bundled, and the regional pull, though it has no term for</w:t>
       </w:r>
       <w:r>
         <w:t xml:space="preserve"> </w:t>
@@ -8837,7 +8913,13 @@
         <w:t xml:space="preserve"> </w:t>
       </w:r>
       <w:r>
-        <w:t xml:space="preserve">plan.</w:t>
+        <w:t xml:space="preserve">plan. They extend the evidence that ACOs sort on benchmark rules to the timing of resets and give a baseline for the</w:t>
+      </w:r>
+      <w:r>
+        <w:t xml:space="preserve"> </w:t>
+      </w:r>
+      <w:r>
+        <w:t xml:space="preserve">rules in force since 2024.</w:t>
       </w:r>
     </w:p>
     <w:bookmarkEnd w:id="56"/>

</xml_diff>

<commit_message>
Manuscript: state the literature and the gap explicitly; cite Cappello 2026 (ratchet effect and regional selection)
Introduction: the dissertation's evidence on rebasing and the regional adjustment, a sentence on what the literature
covers (joining, staying, leaving, risk; the within-agreement ratchet) and what it has not examined (when ACOs reset),
and the gap stated against both strands. Comparison With Prior Work: the dissertation's estimates (40% and 70%,
allowlisted as cited figures) and how early renewers relate to them. Checks pass: numbers, JMIR validator (8,416
words), tests.

Co-Authored-By: Claude Opus 5.5 <noreply@anthropic.com>
</commit_message>
<xml_diff>
--- a/paper.docx
+++ b/paper.docx
@@ -650,6 +650,38 @@
         <w:t xml:space="preserve"> </w:t>
       </w:r>
       <w:r>
+        <w:t xml:space="preserve">A structural analysis of the program found evidence of both forces: savings rates</w:t>
+      </w:r>
+      <w:r>
+        <w:t xml:space="preserve"> </w:t>
+      </w:r>
+      <w:r>
+        <w:t xml:space="preserve">were higher in years whose spending did not enter a future benchmark, and ACOs with a positive regional adjustment</w:t>
+      </w:r>
+      <w:r>
+        <w:t xml:space="preserve"> </w:t>
+      </w:r>
+      <w:r>
+        <w:t xml:space="preserve">were less likely to exit.</w:t>
+      </w:r>
+      <w:r>
+        <w:t xml:space="preserve">[</w:t>
+      </w:r>
+      <w:hyperlink w:anchor="ref-cappello2026">
+        <w:r>
+          <w:rPr>
+            <w:rStyle w:val="Hyperlink"/>
+          </w:rPr>
+          <w:t xml:space="preserve">11</w:t>
+        </w:r>
+      </w:hyperlink>
+      <w:r>
+        <w:t xml:space="preserve">]</w:t>
+      </w:r>
+      <w:r>
+        <w:t xml:space="preserve"> </w:t>
+      </w:r>
+      <w:r>
         <w:t xml:space="preserve">After regional spending entered benchmarks in 2017, participation shifted toward</w:t>
       </w:r>
       <w:r>
@@ -666,7 +698,7 @@
           <w:rPr>
             <w:rStyle w:val="Hyperlink"/>
           </w:rPr>
-          <w:t xml:space="preserve">11</w:t>
+          <w:t xml:space="preserve">12</w:t>
         </w:r>
       </w:hyperlink>
       <w:r>
@@ -692,7 +724,7 @@
           <w:rPr>
             <w:rStyle w:val="Hyperlink"/>
           </w:rPr>
-          <w:t xml:space="preserve">12</w:t>
+          <w:t xml:space="preserve">13</w:t>
         </w:r>
       </w:hyperlink>
       <w:r>
@@ -712,7 +744,7 @@
           <w:rPr>
             <w:rStyle w:val="Hyperlink"/>
           </w:rPr>
-          <w:t xml:space="preserve">13</w:t>
+          <w:t xml:space="preserve">14</w:t>
         </w:r>
       </w:hyperlink>
       <w:r>
@@ -738,7 +770,7 @@
           <w:rPr>
             <w:rStyle w:val="Hyperlink"/>
           </w:rPr>
-          <w:t xml:space="preserve">14</w:t>
+          <w:t xml:space="preserve">15</w:t>
         </w:r>
       </w:hyperlink>
       <w:r>
@@ -770,7 +802,7 @@
           <w:rPr>
             <w:rStyle w:val="Hyperlink"/>
           </w:rPr>
-          <w:t xml:space="preserve">15</w:t>
+          <w:t xml:space="preserve">16</w:t>
         </w:r>
       </w:hyperlink>
       <w:r>
@@ -796,7 +828,7 @@
           <w:rPr>
             <w:rStyle w:val="Hyperlink"/>
           </w:rPr>
-          <w:t xml:space="preserve">16</w:t>
+          <w:t xml:space="preserve">17</w:t>
         </w:r>
       </w:hyperlink>
       <w:r>
@@ -822,7 +854,7 @@
           <w:rPr>
             <w:rStyle w:val="Hyperlink"/>
           </w:rPr>
-          <w:t xml:space="preserve">17</w:t>
+          <w:t xml:space="preserve">18</w:t>
         </w:r>
       </w:hyperlink>
       <w:r>
@@ -842,7 +874,7 @@
           <w:rPr>
             <w:rStyle w:val="Hyperlink"/>
           </w:rPr>
-          <w:t xml:space="preserve">18</w:t>
+          <w:t xml:space="preserve">19</w:t>
         </w:r>
       </w:hyperlink>
       <w:r>
@@ -868,12 +900,30 @@
           <w:rPr>
             <w:rStyle w:val="Hyperlink"/>
           </w:rPr>
-          <w:t xml:space="preserve">19</w:t>
+          <w:t xml:space="preserve">20</w:t>
         </w:r>
       </w:hyperlink>
       <w:r>
         <w:t xml:space="preserve">]</w:t>
       </w:r>
+      <w:r>
+        <w:t xml:space="preserve"> </w:t>
+      </w:r>
+      <w:r>
+        <w:t xml:space="preserve">This literature describes how benchmark</w:t>
+      </w:r>
+      <w:r>
+        <w:t xml:space="preserve"> </w:t>
+      </w:r>
+      <w:r>
+        <w:t xml:space="preserve">rules sort ACOs into joining, staying, leaving and taking on risk, and how rebasing weakens the incentive to save</w:t>
+      </w:r>
+      <w:r>
+        <w:t xml:space="preserve"> </w:t>
+      </w:r>
+      <w:r>
+        <w:t xml:space="preserve">within an agreement; it has not examined when ACOs choose to reset.</w:t>
+      </w:r>
     </w:p>
     <w:p>
       <w:pPr>
@@ -922,7 +972,7 @@
           <w:rPr>
             <w:rStyle w:val="Hyperlink"/>
           </w:rPr>
-          <w:t xml:space="preserve">20</w:t>
+          <w:t xml:space="preserve">21</w:t>
         </w:r>
       </w:hyperlink>
       <w:r>
@@ -968,7 +1018,7 @@
           <w:rPr>
             <w:rStyle w:val="Hyperlink"/>
           </w:rPr>
-          <w:t xml:space="preserve">21</w:t>
+          <w:t xml:space="preserve">22</w:t>
         </w:r>
       </w:hyperlink>
       <w:r>
@@ -1000,7 +1050,7 @@
           <w:rPr>
             <w:rStyle w:val="Hyperlink"/>
           </w:rPr>
-          <w:t xml:space="preserve">22</w:t>
+          <w:t xml:space="preserve">23</w:t>
         </w:r>
       </w:hyperlink>
       <w:r>
@@ -1026,7 +1076,7 @@
           <w:rPr>
             <w:rStyle w:val="Hyperlink"/>
           </w:rPr>
-          <w:t xml:space="preserve">23</w:t>
+          <w:t xml:space="preserve">24</w:t>
         </w:r>
       </w:hyperlink>
       <w:r>
@@ -1036,13 +1086,25 @@
         <w:t xml:space="preserve"> </w:t>
       </w:r>
       <w:r>
-        <w:t xml:space="preserve">Which ACOs used the option bears on how benchmark rules sort ACOs, but to</w:t>
-      </w:r>
-      <w:r>
-        <w:t xml:space="preserve"> </w:t>
-      </w:r>
-      <w:r>
-        <w:t xml:space="preserve">the author’s knowledge it has not been studied in the peer-reviewed literature.</w:t>
+        <w:t xml:space="preserve">These sources describe the early renewers but do not test why they</w:t>
+      </w:r>
+      <w:r>
+        <w:t xml:space="preserve"> </w:t>
+      </w:r>
+      <w:r>
+        <w:t xml:space="preserve">renewed. Early renewal joins the two strands above: it is a choice of when rebasing happens, made under rules that</w:t>
+      </w:r>
+      <w:r>
+        <w:t xml:space="preserve"> </w:t>
+      </w:r>
+      <w:r>
+        <w:t xml:space="preserve">reward ACOs whose regions spend more. To the author’s knowledge, which ACOs used the option has not been studied in</w:t>
+      </w:r>
+      <w:r>
+        <w:t xml:space="preserve"> </w:t>
+      </w:r>
+      <w:r>
+        <w:t xml:space="preserve">the peer-reviewed literature.</w:t>
       </w:r>
     </w:p>
     <w:p>
@@ -1147,7 +1209,7 @@
           <w:rPr>
             <w:rStyle w:val="Hyperlink"/>
           </w:rPr>
-          <w:t xml:space="preserve">24</w:t>
+          <w:t xml:space="preserve">25</w:t>
         </w:r>
       </w:hyperlink>
       <w:r>
@@ -1206,36 +1268,36 @@
           <w:rPr>
             <w:rStyle w:val="Hyperlink"/>
           </w:rPr>
+          <w:t xml:space="preserve">26</w:t>
+        </w:r>
+      </w:hyperlink>
+      <w:r>
+        <w:t xml:space="preserve">]</w:t>
+      </w:r>
+      <w:r>
+        <w:t xml:space="preserve"> </w:t>
+      </w:r>
+      <w:r>
+        <w:t xml:space="preserve">(checklist in Multimedia Appendix 2). The analysis plan and the code commit that implements it were registered on OSF (Open Science Framework) Registries on October 26, 2026,</w:t>
+      </w:r>
+      <w:r>
+        <w:t xml:space="preserve"> </w:t>
+      </w:r>
+      <w:r>
+        <w:t xml:space="preserve">13:22 UTC, with the plan’s SHA-256 hash recorded.</w:t>
+      </w:r>
+      <w:r>
+        <w:t xml:space="preserve">[</w:t>
+      </w:r>
+      <w:hyperlink w:anchor="ref-registration">
+        <w:r>
+          <w:rPr>
+            <w:rStyle w:val="Hyperlink"/>
+          </w:rPr>
           <w:t xml:space="preserve">25</w:t>
         </w:r>
       </w:hyperlink>
       <w:r>
-        <w:t xml:space="preserve">]</w:t>
-      </w:r>
-      <w:r>
-        <w:t xml:space="preserve"> </w:t>
-      </w:r>
-      <w:r>
-        <w:t xml:space="preserve">(checklist in Multimedia Appendix 2). The analysis plan and the code commit that implements it were registered on OSF (Open Science Framework) Registries on October 26, 2026,</w:t>
-      </w:r>
-      <w:r>
-        <w:t xml:space="preserve"> </w:t>
-      </w:r>
-      <w:r>
-        <w:t xml:space="preserve">13:22 UTC, with the plan’s SHA-256 hash recorded.</w:t>
-      </w:r>
-      <w:r>
-        <w:t xml:space="preserve">[</w:t>
-      </w:r>
-      <w:hyperlink w:anchor="ref-registration">
-        <w:r>
-          <w:rPr>
-            <w:rStyle w:val="Hyperlink"/>
-          </w:rPr>
-          <w:t xml:space="preserve">24</w:t>
-        </w:r>
-      </w:hyperlink>
-      <w:r>
         <w:t xml:space="preserve">,</w:t>
       </w:r>
       <w:hyperlink w:anchor="ref-code">
@@ -1243,7 +1305,7 @@
           <w:rPr>
             <w:rStyle w:val="Hyperlink"/>
           </w:rPr>
-          <w:t xml:space="preserve">26</w:t>
+          <w:t xml:space="preserve">27</w:t>
         </w:r>
       </w:hyperlink>
       <w:r>
@@ -1353,7 +1415,7 @@
           <w:rPr>
             <w:rStyle w:val="Hyperlink"/>
           </w:rPr>
-          <w:t xml:space="preserve">21</w:t>
+          <w:t xml:space="preserve">22</w:t>
         </w:r>
       </w:hyperlink>
       <w:r>
@@ -1364,7 +1426,7 @@
           <w:rPr>
             <w:rStyle w:val="Hyperlink"/>
           </w:rPr>
-          <w:t xml:space="preserve">27</w:t>
+          <w:t xml:space="preserve">28</w:t>
         </w:r>
       </w:hyperlink>
       <w:r>
@@ -1375,7 +1437,7 @@
           <w:rPr>
             <w:rStyle w:val="Hyperlink"/>
           </w:rPr>
-          <w:t xml:space="preserve">29</w:t>
+          <w:t xml:space="preserve">30</w:t>
         </w:r>
       </w:hyperlink>
       <w:r>
@@ -1419,7 +1481,7 @@
           <w:rPr>
             <w:rStyle w:val="Hyperlink"/>
           </w:rPr>
-          <w:t xml:space="preserve">30</w:t>
+          <w:t xml:space="preserve">31</w:t>
         </w:r>
       </w:hyperlink>
       <w:r>
@@ -1445,7 +1507,7 @@
           <w:rPr>
             <w:rStyle w:val="Hyperlink"/>
           </w:rPr>
-          <w:t xml:space="preserve">31</w:t>
+          <w:t xml:space="preserve">32</w:t>
         </w:r>
       </w:hyperlink>
       <w:r>
@@ -1642,7 +1704,7 @@
           <w:rPr>
             <w:rStyle w:val="Hyperlink"/>
           </w:rPr>
-          <w:t xml:space="preserve">32</w:t>
+          <w:t xml:space="preserve">33</w:t>
         </w:r>
       </w:hyperlink>
       <w:r>
@@ -2194,7 +2256,7 @@
           <w:rPr>
             <w:rStyle w:val="Hyperlink"/>
           </w:rPr>
-          <w:t xml:space="preserve">33</w:t>
+          <w:t xml:space="preserve">34</w:t>
         </w:r>
       </w:hyperlink>
       <w:r>
@@ -2425,7 +2487,7 @@
           <w:rPr>
             <w:rStyle w:val="Hyperlink"/>
           </w:rPr>
-          <w:t xml:space="preserve">34</w:t>
+          <w:t xml:space="preserve">35</w:t>
         </w:r>
       </w:hyperlink>
       <w:r>
@@ -2635,7 +2697,7 @@
           <w:rPr>
             <w:rStyle w:val="Hyperlink"/>
           </w:rPr>
-          <w:t xml:space="preserve">35</w:t>
+          <w:t xml:space="preserve">36</w:t>
         </w:r>
       </w:hyperlink>
       <w:r>
@@ -2707,7 +2769,7 @@
           <w:rPr>
             <w:rStyle w:val="Hyperlink"/>
           </w:rPr>
-          <w:t xml:space="preserve">36</w:t>
+          <w:t xml:space="preserve">37</w:t>
         </w:r>
       </w:hyperlink>
       <w:r>
@@ -2727,7 +2789,7 @@
           <w:rPr>
             <w:rStyle w:val="Hyperlink"/>
           </w:rPr>
-          <w:t xml:space="preserve">37</w:t>
+          <w:t xml:space="preserve">38</w:t>
         </w:r>
       </w:hyperlink>
       <w:r>
@@ -2753,7 +2815,7 @@
           <w:rPr>
             <w:rStyle w:val="Hyperlink"/>
           </w:rPr>
-          <w:t xml:space="preserve">38</w:t>
+          <w:t xml:space="preserve">39</w:t>
         </w:r>
       </w:hyperlink>
       <w:r>
@@ -2824,7 +2886,7 @@
           <w:rPr>
             <w:rStyle w:val="Hyperlink"/>
           </w:rPr>
-          <w:t xml:space="preserve">39</w:t>
+          <w:t xml:space="preserve">40</w:t>
         </w:r>
       </w:hyperlink>
       <w:r>
@@ -2844,7 +2906,7 @@
           <w:rPr>
             <w:rStyle w:val="Hyperlink"/>
           </w:rPr>
-          <w:t xml:space="preserve">40</w:t>
+          <w:t xml:space="preserve">41</w:t>
         </w:r>
       </w:hyperlink>
       <w:r>
@@ -2855,7 +2917,7 @@
           <w:rPr>
             <w:rStyle w:val="Hyperlink"/>
           </w:rPr>
-          <w:t xml:space="preserve">41</w:t>
+          <w:t xml:space="preserve">42</w:t>
         </w:r>
       </w:hyperlink>
       <w:r>
@@ -2899,7 +2961,7 @@
           <w:rPr>
             <w:rStyle w:val="Hyperlink"/>
           </w:rPr>
-          <w:t xml:space="preserve">42</w:t>
+          <w:t xml:space="preserve">43</w:t>
         </w:r>
       </w:hyperlink>
       <w:r>
@@ -3027,7 +3089,7 @@
           <w:rPr>
             <w:rStyle w:val="Hyperlink"/>
           </w:rPr>
-          <w:t xml:space="preserve">43</w:t>
+          <w:t xml:space="preserve">44</w:t>
         </w:r>
       </w:hyperlink>
       <w:r>
@@ -3053,7 +3115,7 @@
           <w:rPr>
             <w:rStyle w:val="Hyperlink"/>
           </w:rPr>
-          <w:t xml:space="preserve">44</w:t>
+          <w:t xml:space="preserve">45</w:t>
         </w:r>
       </w:hyperlink>
       <w:r>
@@ -3079,7 +3141,7 @@
           <w:rPr>
             <w:rStyle w:val="Hyperlink"/>
           </w:rPr>
-          <w:t xml:space="preserve">45</w:t>
+          <w:t xml:space="preserve">46</w:t>
         </w:r>
       </w:hyperlink>
       <w:r>
@@ -3117,7 +3179,7 @@
           <w:rPr>
             <w:rStyle w:val="Hyperlink"/>
           </w:rPr>
-          <w:t xml:space="preserve">46</w:t>
+          <w:t xml:space="preserve">47</w:t>
         </w:r>
       </w:hyperlink>
       <w:r>
@@ -3134,7 +3196,7 @@
           <w:rPr>
             <w:rStyle w:val="Hyperlink"/>
           </w:rPr>
-          <w:t xml:space="preserve">47</w:t>
+          <w:t xml:space="preserve">48</w:t>
         </w:r>
       </w:hyperlink>
       <w:r>
@@ -3350,7 +3412,7 @@
           <w:rPr>
             <w:rStyle w:val="Hyperlink"/>
           </w:rPr>
-          <w:t xml:space="preserve">48</w:t>
+          <w:t xml:space="preserve">49</w:t>
         </w:r>
       </w:hyperlink>
       <w:r>
@@ -3370,7 +3432,7 @@
           <w:rPr>
             <w:rStyle w:val="Hyperlink"/>
           </w:rPr>
-          <w:t xml:space="preserve">49</w:t>
+          <w:t xml:space="preserve">50</w:t>
         </w:r>
       </w:hyperlink>
       <w:r>
@@ -3396,7 +3458,7 @@
           <w:rPr>
             <w:rStyle w:val="Hyperlink"/>
           </w:rPr>
-          <w:t xml:space="preserve">50</w:t>
+          <w:t xml:space="preserve">51</w:t>
         </w:r>
       </w:hyperlink>
       <w:r>
@@ -3434,7 +3496,7 @@
           <w:rPr>
             <w:rStyle w:val="Hyperlink"/>
           </w:rPr>
-          <w:t xml:space="preserve">51</w:t>
+          <w:t xml:space="preserve">52</w:t>
         </w:r>
       </w:hyperlink>
       <w:r>
@@ -3454,7 +3516,7 @@
           <w:rPr>
             <w:rStyle w:val="Hyperlink"/>
           </w:rPr>
-          <w:t xml:space="preserve">52</w:t>
+          <w:t xml:space="preserve">53</w:t>
         </w:r>
       </w:hyperlink>
       <w:r>
@@ -3480,7 +3542,7 @@
           <w:rPr>
             <w:rStyle w:val="Hyperlink"/>
           </w:rPr>
-          <w:t xml:space="preserve">53</w:t>
+          <w:t xml:space="preserve">54</w:t>
         </w:r>
       </w:hyperlink>
       <w:r>
@@ -3500,7 +3562,7 @@
           <w:rPr>
             <w:rStyle w:val="Hyperlink"/>
           </w:rPr>
-          <w:t xml:space="preserve">54</w:t>
+          <w:t xml:space="preserve">55</w:t>
         </w:r>
       </w:hyperlink>
       <w:r>
@@ -3526,7 +3588,7 @@
           <w:rPr>
             <w:rStyle w:val="Hyperlink"/>
           </w:rPr>
-          <w:t xml:space="preserve">55</w:t>
+          <w:t xml:space="preserve">56</w:t>
         </w:r>
       </w:hyperlink>
       <w:r>
@@ -3661,7 +3723,7 @@
           <w:rPr>
             <w:rStyle w:val="Hyperlink"/>
           </w:rPr>
-          <w:t xml:space="preserve">56</w:t>
+          <w:t xml:space="preserve">57</w:t>
         </w:r>
       </w:hyperlink>
       <w:r>
@@ -6251,7 +6313,7 @@
           <w:rPr>
             <w:rStyle w:val="Hyperlink"/>
           </w:rPr>
-          <w:t xml:space="preserve">57</w:t>
+          <w:t xml:space="preserve">58</w:t>
         </w:r>
       </w:hyperlink>
       <w:r>
@@ -8237,6 +8299,64 @@
           <w:rPr>
             <w:rStyle w:val="Hyperlink"/>
           </w:rPr>
+          <w:t xml:space="preserve">12</w:t>
+        </w:r>
+      </w:hyperlink>
+      <w:r>
+        <w:t xml:space="preserve">]</w:t>
+      </w:r>
+      <w:r>
+        <w:t xml:space="preserve"> </w:t>
+      </w:r>
+      <w:r>
+        <w:t xml:space="preserve">and ACOs whose effective benchmarks fell were more likely to leave.</w:t>
+      </w:r>
+      <w:r>
+        <w:t xml:space="preserve">[</w:t>
+      </w:r>
+      <w:hyperlink w:anchor="ref-chen2025">
+        <w:r>
+          <w:rPr>
+            <w:rStyle w:val="Hyperlink"/>
+          </w:rPr>
+          <w:t xml:space="preserve">13</w:t>
+        </w:r>
+      </w:hyperlink>
+      <w:r>
+        <w:t xml:space="preserve">]</w:t>
+      </w:r>
+      <w:r>
+        <w:t xml:space="preserve"> </w:t>
+      </w:r>
+      <w:r>
+        <w:t xml:space="preserve">A dissertation modeling MSSP</w:t>
+      </w:r>
+      <w:r>
+        <w:t xml:space="preserve"> </w:t>
+      </w:r>
+      <w:r>
+        <w:t xml:space="preserve">participation found both effects of the benchmark rules: savings rates were 40% higher in years whose spending did</w:t>
+      </w:r>
+      <w:r>
+        <w:t xml:space="preserve"> </w:t>
+      </w:r>
+      <w:r>
+        <w:t xml:space="preserve">not enter rebasing, a ratchet effect, and ACOs with a positive regional adjustment were about 70% less likely to exit</w:t>
+      </w:r>
+      <w:r>
+        <w:t xml:space="preserve"> </w:t>
+      </w:r>
+      <w:r>
+        <w:t xml:space="preserve">than those with a negative one.</w:t>
+      </w:r>
+      <w:r>
+        <w:t xml:space="preserve">[</w:t>
+      </w:r>
+      <w:hyperlink w:anchor="ref-cappello2026">
+        <w:r>
+          <w:rPr>
+            <w:rStyle w:val="Hyperlink"/>
+          </w:rPr>
           <w:t xml:space="preserve">11</w:t>
         </w:r>
       </w:hyperlink>
@@ -8247,17 +8367,35 @@
         <w:t xml:space="preserve"> </w:t>
       </w:r>
       <w:r>
-        <w:t xml:space="preserve">and ACOs whose effective benchmarks fell were more likely to leave.</w:t>
+        <w:t xml:space="preserve">Here the choice is when to reset rather than whether to join or leave,</w:t>
+      </w:r>
+      <w:r>
+        <w:t xml:space="preserve"> </w:t>
+      </w:r>
+      <w:r>
+        <w:t xml:space="preserve">and early renewers had, on average, more room under their regions’ spending: the ACOs that chose an early reset were</w:t>
+      </w:r>
+      <w:r>
+        <w:t xml:space="preserve"> </w:t>
+      </w:r>
+      <w:r>
+        <w:t xml:space="preserve">those the regional adjustment favored. An industry analysis of the same rebasing cohort found that ACOs rebasing early in 2022 had higher gross</w:t>
+      </w:r>
+      <w:r>
+        <w:t xml:space="preserve"> </w:t>
+      </w:r>
+      <w:r>
+        <w:t xml:space="preserve">savings rates beforehand and that the earlier incumbents among them moved to ENHANCED,</w:t>
       </w:r>
       <w:r>
         <w:t xml:space="preserve">[</w:t>
       </w:r>
-      <w:hyperlink w:anchor="ref-chen2025">
-        <w:r>
-          <w:rPr>
-            <w:rStyle w:val="Hyperlink"/>
-          </w:rPr>
-          <w:t xml:space="preserve">12</w:t>
+      <w:hyperlink w:anchor="ref-milliman2024">
+        <w:r>
+          <w:rPr>
+            <w:rStyle w:val="Hyperlink"/>
+          </w:rPr>
+          <w:t xml:space="preserve">23</w:t>
         </w:r>
       </w:hyperlink>
       <w:r>
@@ -8267,35 +8405,41 @@
         <w:t xml:space="preserve"> </w:t>
       </w:r>
       <w:r>
-        <w:t xml:space="preserve">Here the choice is</w:t>
-      </w:r>
-      <w:r>
-        <w:t xml:space="preserve"> </w:t>
-      </w:r>
-      <w:r>
-        <w:t xml:space="preserve">when to reset rather than whether to join or leave, and early renewers had, on average, more room under their regions’</w:t>
-      </w:r>
-      <w:r>
-        <w:t xml:space="preserve"> </w:t>
-      </w:r>
-      <w:r>
-        <w:t xml:space="preserve">spending. An industry analysis of the same rebasing cohort found that ACOs rebasing early in 2022 had higher gross</w:t>
-      </w:r>
-      <w:r>
-        <w:t xml:space="preserve"> </w:t>
-      </w:r>
-      <w:r>
-        <w:t xml:space="preserve">savings rates beforehand and that the earlier incumbents among them moved to ENHANCED,</w:t>
+        <w:t xml:space="preserve">consistent with</w:t>
+      </w:r>
+      <w:r>
+        <w:t xml:space="preserve"> </w:t>
+      </w:r>
+      <w:r>
+        <w:t xml:space="preserve">H1 and the BASIC-level association here. Beyond that analysis, this study rebuilt the reset benchmark and validated it</w:t>
+      </w:r>
+      <w:r>
+        <w:t xml:space="preserve"> </w:t>
+      </w:r>
+      <w:r>
+        <w:t xml:space="preserve">against CMS’s, separated its own-spending and regional parts, modeled the decision within the BASIC track and followed</w:t>
+      </w:r>
+      <w:r>
+        <w:t xml:space="preserve"> </w:t>
+      </w:r>
+      <w:r>
+        <w:t xml:space="preserve">spending afterward, under a preregistered plan. The finding that early renewers were savers also fits reports that ACOs earning bonuses survived longer in the</w:t>
+      </w:r>
+      <w:r>
+        <w:t xml:space="preserve"> </w:t>
+      </w:r>
+      <w:r>
+        <w:t xml:space="preserve">program</w:t>
       </w:r>
       <w:r>
         <w:t xml:space="preserve">[</w:t>
       </w:r>
-      <w:hyperlink w:anchor="ref-milliman2024">
-        <w:r>
-          <w:rPr>
-            <w:rStyle w:val="Hyperlink"/>
-          </w:rPr>
-          <w:t xml:space="preserve">22</w:t>
+      <w:hyperlink w:anchor="ref-bleser2019">
+        <w:r>
+          <w:rPr>
+            <w:rStyle w:val="Hyperlink"/>
+          </w:rPr>
+          <w:t xml:space="preserve">15</w:t>
         </w:r>
       </w:hyperlink>
       <w:r>
@@ -8305,41 +8449,23 @@
         <w:t xml:space="preserve"> </w:t>
       </w:r>
       <w:r>
-        <w:t xml:space="preserve">consistent with</w:t>
-      </w:r>
-      <w:r>
-        <w:t xml:space="preserve"> </w:t>
-      </w:r>
-      <w:r>
-        <w:t xml:space="preserve">H1 and the BASIC-level association here. Beyond that analysis, this study rebuilt the reset benchmark and validated it</w:t>
-      </w:r>
-      <w:r>
-        <w:t xml:space="preserve"> </w:t>
-      </w:r>
-      <w:r>
-        <w:t xml:space="preserve">against CMS’s, separated its own-spending and regional parts, modeled the decision within the BASIC track and followed</w:t>
-      </w:r>
-      <w:r>
-        <w:t xml:space="preserve"> </w:t>
-      </w:r>
-      <w:r>
-        <w:t xml:space="preserve">spending afterward, under a preregistered plan. The finding that early renewers were savers also fits reports that ACOs earning bonuses survived longer in the</w:t>
-      </w:r>
-      <w:r>
-        <w:t xml:space="preserve"> </w:t>
-      </w:r>
-      <w:r>
-        <w:t xml:space="preserve">program</w:t>
+        <w:t xml:space="preserve">and, with borderline precision, that ACOs that had achieved savings were more likely to stay</w:t>
+      </w:r>
+      <w:r>
+        <w:t xml:space="preserve"> </w:t>
+      </w:r>
+      <w:r>
+        <w:t xml:space="preserve">after the 2019 rules.</w:t>
       </w:r>
       <w:r>
         <w:t xml:space="preserve">[</w:t>
       </w:r>
-      <w:hyperlink w:anchor="ref-bleser2019">
-        <w:r>
-          <w:rPr>
-            <w:rStyle w:val="Hyperlink"/>
-          </w:rPr>
-          <w:t xml:space="preserve">14</w:t>
+      <w:hyperlink w:anchor="ref-ying2023">
+        <w:r>
+          <w:rPr>
+            <w:rStyle w:val="Hyperlink"/>
+          </w:rPr>
+          <w:t xml:space="preserve">17</w:t>
         </w:r>
       </w:hyperlink>
       <w:r>
@@ -8349,23 +8475,41 @@
         <w:t xml:space="preserve"> </w:t>
       </w:r>
       <w:r>
-        <w:t xml:space="preserve">and, with borderline precision, that ACOs that had achieved savings were more likely to stay</w:t>
-      </w:r>
-      <w:r>
-        <w:t xml:space="preserve"> </w:t>
-      </w:r>
-      <w:r>
-        <w:t xml:space="preserve">after the 2019 rules.</w:t>
+        <w:t xml:space="preserve">The same success, however, meant that the own-spending part of a reset would</w:t>
+      </w:r>
+      <w:r>
+        <w:t xml:space="preserve"> </w:t>
+      </w:r>
+      <w:r>
+        <w:t xml:space="preserve">have cut their benchmarks. The intuitive account that ACOs renewed early to get a higher benchmark therefore does not</w:t>
+      </w:r>
+      <w:r>
+        <w:t xml:space="preserve"> </w:t>
+      </w:r>
+      <w:r>
+        <w:t xml:space="preserve">describe them on average, and CMS’s published 2022 benchmarks, examined post hoc, agree.</w:t>
+      </w:r>
+      <w:r>
+        <w:t xml:space="preserve"> </w:t>
+      </w:r>
+      <w:r>
+        <w:t xml:space="preserve">That the size of the regional difference doubled without case-mix adjustment is consistent with evidence that</w:t>
+      </w:r>
+      <w:r>
+        <w:t xml:space="preserve"> </w:t>
+      </w:r>
+      <w:r>
+        <w:t xml:space="preserve">comparisons of ACOs with their regions depend heavily on risk adjustment.</w:t>
       </w:r>
       <w:r>
         <w:t xml:space="preserve">[</w:t>
       </w:r>
-      <w:hyperlink w:anchor="ref-ying2023">
-        <w:r>
-          <w:rPr>
-            <w:rStyle w:val="Hyperlink"/>
-          </w:rPr>
-          <w:t xml:space="preserve">16</w:t>
+      <w:hyperlink w:anchor="ref-rose2016">
+        <w:r>
+          <w:rPr>
+            <w:rStyle w:val="Hyperlink"/>
+          </w:rPr>
+          <w:t xml:space="preserve">10</w:t>
         </w:r>
       </w:hyperlink>
       <w:r>
@@ -8375,41 +8519,23 @@
         <w:t xml:space="preserve"> </w:t>
       </w:r>
       <w:r>
-        <w:t xml:space="preserve">The same success, however, meant that the own-spending part of a reset would</w:t>
-      </w:r>
-      <w:r>
-        <w:t xml:space="preserve"> </w:t>
-      </w:r>
-      <w:r>
-        <w:t xml:space="preserve">have cut their benchmarks. The intuitive account that ACOs renewed early to get a higher benchmark therefore does not</w:t>
-      </w:r>
-      <w:r>
-        <w:t xml:space="preserve"> </w:t>
-      </w:r>
-      <w:r>
-        <w:t xml:space="preserve">describe them on average, and CMS’s published 2022 benchmarks, examined post hoc, agree.</w:t>
-      </w:r>
-      <w:r>
-        <w:t xml:space="preserve"> </w:t>
-      </w:r>
-      <w:r>
-        <w:t xml:space="preserve">That the size of the regional difference doubled without case-mix adjustment is consistent with evidence that</w:t>
-      </w:r>
-      <w:r>
-        <w:t xml:space="preserve"> </w:t>
-      </w:r>
-      <w:r>
-        <w:t xml:space="preserve">comparisons of ACOs with their regions depend heavily on risk adjustment.</w:t>
+        <w:t xml:space="preserve">The concern that rebasing rewards</w:t>
+      </w:r>
+      <w:r>
+        <w:t xml:space="preserve"> </w:t>
+      </w:r>
+      <w:r>
+        <w:t xml:space="preserve">higher spending before a new agreement</w:t>
       </w:r>
       <w:r>
         <w:t xml:space="preserve">[</w:t>
       </w:r>
-      <w:hyperlink w:anchor="ref-rose2016">
-        <w:r>
-          <w:rPr>
-            <w:rStyle w:val="Hyperlink"/>
-          </w:rPr>
-          <w:t xml:space="preserve">10</w:t>
+      <w:hyperlink w:anchor="ref-douven2015">
+        <w:r>
+          <w:rPr>
+            <w:rStyle w:val="Hyperlink"/>
+          </w:rPr>
+          <w:t xml:space="preserve">9</w:t>
         </w:r>
       </w:hyperlink>
       <w:r>
@@ -8419,23 +8545,23 @@
         <w:t xml:space="preserve"> </w:t>
       </w:r>
       <w:r>
-        <w:t xml:space="preserve">The concern that rebasing rewards</w:t>
-      </w:r>
-      <w:r>
-        <w:t xml:space="preserve"> </w:t>
-      </w:r>
-      <w:r>
-        <w:t xml:space="preserve">higher spending before a new agreement</w:t>
+        <w:t xml:space="preserve">could be neither confirmed nor excluded here, and the costs to</w:t>
+      </w:r>
+      <w:r>
+        <w:t xml:space="preserve"> </w:t>
+      </w:r>
+      <w:r>
+        <w:t xml:space="preserve">Medicare of early renewal, which earlier work estimated for departures,</w:t>
       </w:r>
       <w:r>
         <w:t xml:space="preserve">[</w:t>
       </w:r>
-      <w:hyperlink w:anchor="ref-douven2015">
-        <w:r>
-          <w:rPr>
-            <w:rStyle w:val="Hyperlink"/>
-          </w:rPr>
-          <w:t xml:space="preserve">9</w:t>
+      <w:hyperlink w:anchor="ref-moloci2021">
+        <w:r>
+          <w:rPr>
+            <w:rStyle w:val="Hyperlink"/>
+          </w:rPr>
+          <w:t xml:space="preserve">19</w:t>
         </w:r>
       </w:hyperlink>
       <w:r>
@@ -8445,69 +8571,43 @@
         <w:t xml:space="preserve"> </w:t>
       </w:r>
       <w:r>
-        <w:t xml:space="preserve">could be neither confirmed nor excluded here, and the costs to</w:t>
-      </w:r>
-      <w:r>
-        <w:t xml:space="preserve"> </w:t>
-      </w:r>
-      <w:r>
-        <w:t xml:space="preserve">Medicare of early renewal, which earlier work estimated for departures,</w:t>
+        <w:t xml:space="preserve">were not estimated.</w:t>
+      </w:r>
+    </w:p>
+    <w:p>
+      <w:pPr>
+        <w:pStyle w:val="BodyText"/>
+      </w:pPr>
+      <w:r>
+        <w:t xml:space="preserve">The association with a higher BASIC level bears on the sharing-rate motive at least as much as on the reset motive.</w:t>
+      </w:r>
+      <w:r>
+        <w:t xml:space="preserve"> </w:t>
+      </w:r>
+      <w:r>
+        <w:t xml:space="preserve">In these data renewing early and moving to ENHANCED were one choice: 26 of the 27 BASIC-track early renewers moved to ENHANCED, and the rules let no stayer do so. ACOs already bearing two-sided risk at Level E faced a short step to ENHANCED’s 75%</w:t>
+      </w:r>
+      <w:r>
+        <w:t xml:space="preserve"> </w:t>
+      </w:r>
+      <w:r>
+        <w:t xml:space="preserve">sharing rate. Because ACOs partly choose their BASIC level, and ACOs experienced with performance-based risk could</w:t>
+      </w:r>
+      <w:r>
+        <w:t xml:space="preserve"> </w:t>
+      </w:r>
+      <w:r>
+        <w:t xml:space="preserve">enter only Level E or ENHANCED,</w:t>
       </w:r>
       <w:r>
         <w:t xml:space="preserve">[</w:t>
       </w:r>
-      <w:hyperlink w:anchor="ref-moloci2021">
-        <w:r>
-          <w:rPr>
-            <w:rStyle w:val="Hyperlink"/>
-          </w:rPr>
-          <w:t xml:space="preserve">18</w:t>
-        </w:r>
-      </w:hyperlink>
-      <w:r>
-        <w:t xml:space="preserve">]</w:t>
-      </w:r>
-      <w:r>
-        <w:t xml:space="preserve"> </w:t>
-      </w:r>
-      <w:r>
-        <w:t xml:space="preserve">were not estimated.</w:t>
-      </w:r>
-    </w:p>
-    <w:p>
-      <w:pPr>
-        <w:pStyle w:val="BodyText"/>
-      </w:pPr>
-      <w:r>
-        <w:t xml:space="preserve">The association with a higher BASIC level bears on the sharing-rate motive at least as much as on the reset motive.</w:t>
-      </w:r>
-      <w:r>
-        <w:t xml:space="preserve"> </w:t>
-      </w:r>
-      <w:r>
-        <w:t xml:space="preserve">In these data renewing early and moving to ENHANCED were one choice: 26 of the 27 BASIC-track early renewers moved to ENHANCED, and the rules let no stayer do so. ACOs already bearing two-sided risk at Level E faced a short step to ENHANCED’s 75%</w:t>
-      </w:r>
-      <w:r>
-        <w:t xml:space="preserve"> </w:t>
-      </w:r>
-      <w:r>
-        <w:t xml:space="preserve">sharing rate. Because ACOs partly choose their BASIC level, and ACOs experienced with performance-based risk could</w:t>
-      </w:r>
-      <w:r>
-        <w:t xml:space="preserve"> </w:t>
-      </w:r>
-      <w:r>
-        <w:t xml:space="preserve">enter only Level E or ENHANCED,</w:t>
-      </w:r>
-      <w:r>
-        <w:t xml:space="preserve">[</w:t>
-      </w:r>
       <w:hyperlink w:anchor="ref-cfr425600">
         <w:r>
           <w:rPr>
             <w:rStyle w:val="Hyperlink"/>
           </w:rPr>
-          <w:t xml:space="preserve">33</w:t>
+          <w:t xml:space="preserve">34</w:t>
         </w:r>
       </w:hyperlink>
       <w:r>
@@ -8611,7 +8711,7 @@
           <w:rPr>
             <w:rStyle w:val="Hyperlink"/>
           </w:rPr>
-          <w:t xml:space="preserve">58</w:t>
+          <w:t xml:space="preserve">59</w:t>
         </w:r>
       </w:hyperlink>
       <w:r>
@@ -8807,7 +8907,7 @@
           <w:rPr>
             <w:rStyle w:val="Hyperlink"/>
           </w:rPr>
-          <w:t xml:space="preserve">59</w:t>
+          <w:t xml:space="preserve">60</w:t>
         </w:r>
       </w:hyperlink>
       <w:r>
@@ -9002,7 +9102,7 @@
           <w:rPr>
             <w:rStyle w:val="Hyperlink"/>
           </w:rPr>
-          <w:t xml:space="preserve">21</w:t>
+          <w:t xml:space="preserve">22</w:t>
         </w:r>
       </w:hyperlink>
       <w:r>
@@ -9013,50 +9113,128 @@
           <w:rPr>
             <w:rStyle w:val="Hyperlink"/>
           </w:rPr>
+          <w:t xml:space="preserve">28</w:t>
+        </w:r>
+      </w:hyperlink>
+      <w:r>
+        <w:t xml:space="preserve">–</w:t>
+      </w:r>
+      <w:hyperlink w:anchor="ref-dataassigned">
+        <w:r>
+          <w:rPr>
+            <w:rStyle w:val="Hyperlink"/>
+          </w:rPr>
+          <w:t xml:space="preserve">30</w:t>
+        </w:r>
+      </w:hyperlink>
+      <w:r>
+        <w:t xml:space="preserve">]</w:t>
+      </w:r>
+      <w:r>
+        <w:t xml:space="preserve"> </w:t>
+      </w:r>
+      <w:r>
+        <w:t xml:space="preserve">The list of the 40 files</w:t>
+      </w:r>
+      <w:r>
+        <w:t xml:space="preserve"> </w:t>
+      </w:r>
+      <w:r>
+        <w:t xml:space="preserve">downloaded, with sizes, SHA-256 hashes and URLs, and a script that downloads and verifies them are in the study</w:t>
+      </w:r>
+      <w:r>
+        <w:t xml:space="preserve"> </w:t>
+      </w:r>
+      <w:r>
+        <w:t xml:space="preserve">repository;</w:t>
+      </w:r>
+      <w:r>
+        <w:t xml:space="preserve">[</w:t>
+      </w:r>
+      <w:hyperlink w:anchor="ref-code">
+        <w:r>
+          <w:rPr>
+            <w:rStyle w:val="Hyperlink"/>
+          </w:rPr>
           <w:t xml:space="preserve">27</w:t>
         </w:r>
       </w:hyperlink>
       <w:r>
-        <w:t xml:space="preserve">–</w:t>
-      </w:r>
-      <w:hyperlink w:anchor="ref-dataassigned">
-        <w:r>
-          <w:rPr>
-            <w:rStyle w:val="Hyperlink"/>
-          </w:rPr>
-          <w:t xml:space="preserve">29</w:t>
-        </w:r>
-      </w:hyperlink>
-      <w:r>
         <w:t xml:space="preserve">]</w:t>
       </w:r>
       <w:r>
         <w:t xml:space="preserve"> </w:t>
       </w:r>
       <w:r>
-        <w:t xml:space="preserve">The list of the 40 files</w:t>
-      </w:r>
-      <w:r>
-        <w:t xml:space="preserve"> </w:t>
-      </w:r>
-      <w:r>
-        <w:t xml:space="preserve">downloaded, with sizes, SHA-256 hashes and URLs, and a script that downloads and verifies them are in the study</w:t>
-      </w:r>
-      <w:r>
-        <w:t xml:space="preserve"> </w:t>
-      </w:r>
-      <w:r>
-        <w:t xml:space="preserve">repository;</w:t>
+        <w:t xml:space="preserve">an archived copy of the snapshot and the results notebook exports are in the OSF</w:t>
+      </w:r>
+      <w:r>
+        <w:t xml:space="preserve"> </w:t>
+      </w:r>
+      <w:r>
+        <w:t xml:space="preserve">project.</w:t>
       </w:r>
       <w:r>
         <w:t xml:space="preserve">[</w:t>
       </w:r>
+      <w:hyperlink w:anchor="ref-osfproject">
+        <w:r>
+          <w:rPr>
+            <w:rStyle w:val="Hyperlink"/>
+          </w:rPr>
+          <w:t xml:space="preserve">31</w:t>
+        </w:r>
+      </w:hyperlink>
+      <w:r>
+        <w:t xml:space="preserve">]</w:t>
+      </w:r>
+      <w:r>
+        <w:t xml:space="preserve"> </w:t>
+      </w:r>
+      <w:r>
+        <w:t xml:space="preserve">The committed results files, from which every table and figure here is generated, are in the</w:t>
+      </w:r>
+      <w:r>
+        <w:t xml:space="preserve"> </w:t>
+      </w:r>
+      <w:r>
+        <w:t xml:space="preserve">study repository and in this manuscript’s repository.</w:t>
+      </w:r>
+      <w:r>
+        <w:t xml:space="preserve">[</w:t>
+      </w:r>
+      <w:hyperlink w:anchor="ref-paperrepo">
+        <w:r>
+          <w:rPr>
+            <w:rStyle w:val="Hyperlink"/>
+          </w:rPr>
+          <w:t xml:space="preserve">61</w:t>
+        </w:r>
+      </w:hyperlink>
+      <w:r>
+        <w:t xml:space="preserve">]</w:t>
+      </w:r>
+      <w:r>
+        <w:t xml:space="preserve"> </w:t>
+      </w:r>
+      <w:r>
+        <w:t xml:space="preserve">The registered</w:t>
+      </w:r>
+      <w:r>
+        <w:t xml:space="preserve"> </w:t>
+      </w:r>
+      <w:r>
+        <w:t xml:space="preserve">analysis code (commit a4064f5), its tests and step-by-step instructions to rerun and adapt the analysis are in the study repository.</w:t>
+      </w:r>
+      <w:r>
+        <w:t xml:space="preserve">[</w:t>
+      </w:r>
       <w:hyperlink w:anchor="ref-code">
         <w:r>
           <w:rPr>
             <w:rStyle w:val="Hyperlink"/>
           </w:rPr>
-          <w:t xml:space="preserve">26</w:t>
+          <w:t xml:space="preserve">27</w:t>
         </w:r>
       </w:hyperlink>
       <w:r>
@@ -9066,101 +9244,23 @@
         <w:t xml:space="preserve"> </w:t>
       </w:r>
       <w:r>
-        <w:t xml:space="preserve">an archived copy of the snapshot and the results notebook exports are in the OSF</w:t>
-      </w:r>
-      <w:r>
-        <w:t xml:space="preserve"> </w:t>
-      </w:r>
-      <w:r>
-        <w:t xml:space="preserve">project.</w:t>
+        <w:t xml:space="preserve">A longer account</w:t>
+      </w:r>
+      <w:r>
+        <w:t xml:space="preserve"> </w:t>
+      </w:r>
+      <w:r>
+        <w:t xml:space="preserve">of the study for a general audience was published online.</w:t>
       </w:r>
       <w:r>
         <w:t xml:space="preserve">[</w:t>
       </w:r>
-      <w:hyperlink w:anchor="ref-osfproject">
-        <w:r>
-          <w:rPr>
-            <w:rStyle w:val="Hyperlink"/>
-          </w:rPr>
-          <w:t xml:space="preserve">30</w:t>
-        </w:r>
-      </w:hyperlink>
-      <w:r>
-        <w:t xml:space="preserve">]</w:t>
-      </w:r>
-      <w:r>
-        <w:t xml:space="preserve"> </w:t>
-      </w:r>
-      <w:r>
-        <w:t xml:space="preserve">The committed results files, from which every table and figure here is generated, are in the</w:t>
-      </w:r>
-      <w:r>
-        <w:t xml:space="preserve"> </w:t>
-      </w:r>
-      <w:r>
-        <w:t xml:space="preserve">study repository and in this manuscript’s repository.</w:t>
-      </w:r>
-      <w:r>
-        <w:t xml:space="preserve">[</w:t>
-      </w:r>
-      <w:hyperlink w:anchor="ref-paperrepo">
-        <w:r>
-          <w:rPr>
-            <w:rStyle w:val="Hyperlink"/>
-          </w:rPr>
-          <w:t xml:space="preserve">60</w:t>
-        </w:r>
-      </w:hyperlink>
-      <w:r>
-        <w:t xml:space="preserve">]</w:t>
-      </w:r>
-      <w:r>
-        <w:t xml:space="preserve"> </w:t>
-      </w:r>
-      <w:r>
-        <w:t xml:space="preserve">The registered</w:t>
-      </w:r>
-      <w:r>
-        <w:t xml:space="preserve"> </w:t>
-      </w:r>
-      <w:r>
-        <w:t xml:space="preserve">analysis code (commit a4064f5), its tests and step-by-step instructions to rerun and adapt the analysis are in the study repository.</w:t>
-      </w:r>
-      <w:r>
-        <w:t xml:space="preserve">[</w:t>
-      </w:r>
-      <w:hyperlink w:anchor="ref-code">
-        <w:r>
-          <w:rPr>
-            <w:rStyle w:val="Hyperlink"/>
-          </w:rPr>
-          <w:t xml:space="preserve">26</w:t>
-        </w:r>
-      </w:hyperlink>
-      <w:r>
-        <w:t xml:space="preserve">]</w:t>
-      </w:r>
-      <w:r>
-        <w:t xml:space="preserve"> </w:t>
-      </w:r>
-      <w:r>
-        <w:t xml:space="preserve">A longer account</w:t>
-      </w:r>
-      <w:r>
-        <w:t xml:space="preserve"> </w:t>
-      </w:r>
-      <w:r>
-        <w:t xml:space="preserve">of the study for a general audience was published online.</w:t>
-      </w:r>
-      <w:r>
-        <w:t xml:space="preserve">[</w:t>
-      </w:r>
       <w:hyperlink w:anchor="ref-post">
         <w:r>
           <w:rPr>
             <w:rStyle w:val="Hyperlink"/>
           </w:rPr>
-          <w:t xml:space="preserve">61</w:t>
+          <w:t xml:space="preserve">62</w:t>
         </w:r>
       </w:hyperlink>
       <w:r>
@@ -9264,7 +9364,7 @@
       </w:r>
     </w:p>
     <w:bookmarkEnd w:id="62"/>
-    <w:bookmarkStart w:id="185" w:name="references"/>
+    <w:bookmarkStart w:id="187" w:name="references"/>
     <w:p>
       <w:pPr>
         <w:pStyle w:val="Heading1"/>
@@ -9273,7 +9373,7 @@
         <w:t xml:space="preserve">References</w:t>
       </w:r>
     </w:p>
-    <w:bookmarkStart w:id="184" w:name="refs"/>
+    <w:bookmarkStart w:id="186" w:name="refs"/>
     <w:bookmarkStart w:id="64" w:name="ref-cfr425"/>
     <w:p>
       <w:pPr>
@@ -9726,13 +9826,126 @@
       </w:hyperlink>
     </w:p>
     <w:bookmarkEnd w:id="82"/>
-    <w:bookmarkStart w:id="84" w:name="ref-lyu2023"/>
+    <w:bookmarkStart w:id="84" w:name="ref-cappello2026"/>
     <w:p>
       <w:pPr>
         <w:pStyle w:val="Bibliography"/>
       </w:pPr>
       <w:r>
         <w:t xml:space="preserve">11.</w:t>
+      </w:r>
+      <w:r>
+        <w:t xml:space="preserve"> </w:t>
+      </w:r>
+      <w:r>
+        <w:t xml:space="preserve">	</w:t>
+      </w:r>
+      <w:r>
+        <w:t xml:space="preserve">Cappello A.</w:t>
+      </w:r>
+      <w:r>
+        <w:t xml:space="preserve"> </w:t>
+      </w:r>
+      <w:r>
+        <w:rPr>
+          <w:i/>
+          <w:iCs/>
+        </w:rPr>
+        <w:t xml:space="preserve">Essays in</w:t>
+      </w:r>
+      <w:r>
+        <w:rPr>
+          <w:i/>
+          <w:iCs/>
+        </w:rPr>
+        <w:t xml:space="preserve"> </w:t>
+      </w:r>
+      <w:r>
+        <w:rPr>
+          <w:i/>
+          <w:iCs/>
+        </w:rPr>
+        <w:t xml:space="preserve">Industrial</w:t>
+      </w:r>
+      <w:r>
+        <w:rPr>
+          <w:i/>
+          <w:iCs/>
+        </w:rPr>
+        <w:t xml:space="preserve"> </w:t>
+      </w:r>
+      <w:r>
+        <w:rPr>
+          <w:i/>
+          <w:iCs/>
+        </w:rPr>
+        <w:t xml:space="preserve">Organization</w:t>
+      </w:r>
+      <w:r>
+        <w:rPr>
+          <w:i/>
+          <w:iCs/>
+        </w:rPr>
+        <w:t xml:space="preserve"> </w:t>
+      </w:r>
+      <w:r>
+        <w:rPr>
+          <w:i/>
+          <w:iCs/>
+        </w:rPr>
+        <w:t xml:space="preserve">and</w:t>
+      </w:r>
+      <w:r>
+        <w:rPr>
+          <w:i/>
+          <w:iCs/>
+        </w:rPr>
+        <w:t xml:space="preserve"> </w:t>
+      </w:r>
+      <w:r>
+        <w:rPr>
+          <w:i/>
+          <w:iCs/>
+        </w:rPr>
+        <w:t xml:space="preserve">Health</w:t>
+      </w:r>
+      <w:r>
+        <w:rPr>
+          <w:i/>
+          <w:iCs/>
+        </w:rPr>
+        <w:t xml:space="preserve"> </w:t>
+      </w:r>
+      <w:r>
+        <w:rPr>
+          <w:i/>
+          <w:iCs/>
+        </w:rPr>
+        <w:t xml:space="preserve">Economics</w:t>
+      </w:r>
+      <w:r>
+        <w:t xml:space="preserve">. PhD dissertation. Boston College; 2026.</w:t>
+      </w:r>
+      <w:r>
+        <w:t xml:space="preserve"> </w:t>
+      </w:r>
+      <w:hyperlink r:id="rId83">
+        <w:r>
+          <w:rPr>
+            <w:rStyle w:val="Hyperlink"/>
+          </w:rPr>
+          <w:t xml:space="preserve">https://www.proquest.com/openview/92b6e8f86c7ba39e2ba879d91063898b/1</w:t>
+        </w:r>
+      </w:hyperlink>
+    </w:p>
+    <w:bookmarkEnd w:id="84"/>
+    <w:bookmarkStart w:id="86" w:name="ref-lyu2023"/>
+    <w:p>
+      <w:pPr>
+        <w:pStyle w:val="Bibliography"/>
+      </w:pPr>
+      <w:r>
+        <w:t xml:space="preserve">12.</w:t>
       </w:r>
       <w:r>
         <w:t xml:space="preserve"> </w:t>
@@ -9756,7 +9969,7 @@
       <w:r>
         <w:t xml:space="preserve">. 2023;42(5):622-631. doi:</w:t>
       </w:r>
-      <w:hyperlink r:id="rId83">
+      <w:hyperlink r:id="rId85">
         <w:r>
           <w:rPr>
             <w:rStyle w:val="Hyperlink"/>
@@ -9765,14 +9978,14 @@
         </w:r>
       </w:hyperlink>
     </w:p>
-    <w:bookmarkEnd w:id="84"/>
-    <w:bookmarkStart w:id="86" w:name="ref-chen2025"/>
+    <w:bookmarkEnd w:id="86"/>
+    <w:bookmarkStart w:id="88" w:name="ref-chen2025"/>
     <w:p>
       <w:pPr>
         <w:pStyle w:val="Bibliography"/>
       </w:pPr>
       <w:r>
-        <w:t xml:space="preserve">12.</w:t>
+        <w:t xml:space="preserve">13.</w:t>
       </w:r>
       <w:r>
         <w:t xml:space="preserve"> </w:t>
@@ -9796,7 +10009,7 @@
       <w:r>
         <w:t xml:space="preserve">. 2025;11(1):38-62. doi:</w:t>
       </w:r>
-      <w:hyperlink r:id="rId85">
+      <w:hyperlink r:id="rId87">
         <w:r>
           <w:rPr>
             <w:rStyle w:val="Hyperlink"/>
@@ -9805,14 +10018,14 @@
         </w:r>
       </w:hyperlink>
     </w:p>
-    <w:bookmarkEnd w:id="86"/>
-    <w:bookmarkStart w:id="88" w:name="ref-srivastava2026"/>
+    <w:bookmarkEnd w:id="88"/>
+    <w:bookmarkStart w:id="90" w:name="ref-srivastava2026"/>
     <w:p>
       <w:pPr>
         <w:pStyle w:val="Bibliography"/>
       </w:pPr>
       <w:r>
-        <w:t xml:space="preserve">13.</w:t>
+        <w:t xml:space="preserve">14.</w:t>
       </w:r>
       <w:r>
         <w:t xml:space="preserve"> </w:t>
@@ -9836,7 +10049,7 @@
       <w:r>
         <w:t xml:space="preserve">. 2026;9(2):e260166. doi:</w:t>
       </w:r>
-      <w:hyperlink r:id="rId87">
+      <w:hyperlink r:id="rId89">
         <w:r>
           <w:rPr>
             <w:rStyle w:val="Hyperlink"/>
@@ -9845,14 +10058,14 @@
         </w:r>
       </w:hyperlink>
     </w:p>
-    <w:bookmarkEnd w:id="88"/>
-    <w:bookmarkStart w:id="90" w:name="ref-bleser2019"/>
+    <w:bookmarkEnd w:id="90"/>
+    <w:bookmarkStart w:id="92" w:name="ref-bleser2019"/>
     <w:p>
       <w:pPr>
         <w:pStyle w:val="Bibliography"/>
       </w:pPr>
       <w:r>
-        <w:t xml:space="preserve">14.</w:t>
+        <w:t xml:space="preserve">15.</w:t>
       </w:r>
       <w:r>
         <w:t xml:space="preserve"> </w:t>
@@ -9876,7 +10089,7 @@
       <w:r>
         <w:t xml:space="preserve">. 2019;38(5):794-803. doi:</w:t>
       </w:r>
-      <w:hyperlink r:id="rId89">
+      <w:hyperlink r:id="rId91">
         <w:r>
           <w:rPr>
             <w:rStyle w:val="Hyperlink"/>
@@ -9885,14 +10098,14 @@
         </w:r>
       </w:hyperlink>
     </w:p>
-    <w:bookmarkEnd w:id="90"/>
-    <w:bookmarkStart w:id="92" w:name="ref-zhu2023"/>
+    <w:bookmarkEnd w:id="92"/>
+    <w:bookmarkStart w:id="94" w:name="ref-zhu2023"/>
     <w:p>
       <w:pPr>
         <w:pStyle w:val="Bibliography"/>
       </w:pPr>
       <w:r>
-        <w:t xml:space="preserve">15.</w:t>
+        <w:t xml:space="preserve">16.</w:t>
       </w:r>
       <w:r>
         <w:t xml:space="preserve"> </w:t>
@@ -9916,7 +10129,7 @@
       <w:r>
         <w:t xml:space="preserve">. 2023;39(1):302-308. doi:</w:t>
       </w:r>
-      <w:hyperlink r:id="rId91">
+      <w:hyperlink r:id="rId93">
         <w:r>
           <w:rPr>
             <w:rStyle w:val="Hyperlink"/>
@@ -9925,14 +10138,14 @@
         </w:r>
       </w:hyperlink>
     </w:p>
-    <w:bookmarkEnd w:id="92"/>
-    <w:bookmarkStart w:id="94" w:name="ref-ying2023"/>
+    <w:bookmarkEnd w:id="94"/>
+    <w:bookmarkStart w:id="96" w:name="ref-ying2023"/>
     <w:p>
       <w:pPr>
         <w:pStyle w:val="Bibliography"/>
       </w:pPr>
       <w:r>
-        <w:t xml:space="preserve">16.</w:t>
+        <w:t xml:space="preserve">17.</w:t>
       </w:r>
       <w:r>
         <w:t xml:space="preserve"> </w:t>
@@ -9956,7 +10169,7 @@
       <w:r>
         <w:t xml:space="preserve">. 2023;38(7):1780-1782. doi:</w:t>
       </w:r>
-      <w:hyperlink r:id="rId93">
+      <w:hyperlink r:id="rId95">
         <w:r>
           <w:rPr>
             <w:rStyle w:val="Hyperlink"/>
@@ -9965,14 +10178,14 @@
         </w:r>
       </w:hyperlink>
     </w:p>
-    <w:bookmarkEnd w:id="94"/>
-    <w:bookmarkStart w:id="96" w:name="ref-ying2024"/>
+    <w:bookmarkEnd w:id="96"/>
+    <w:bookmarkStart w:id="98" w:name="ref-ying2024"/>
     <w:p>
       <w:pPr>
         <w:pStyle w:val="Bibliography"/>
       </w:pPr>
       <w:r>
-        <w:t xml:space="preserve">17.</w:t>
+        <w:t xml:space="preserve">18.</w:t>
       </w:r>
       <w:r>
         <w:t xml:space="preserve"> </w:t>
@@ -9996,7 +10209,7 @@
       <w:r>
         <w:t xml:space="preserve">. 2024;2(1):qxad093. doi:</w:t>
       </w:r>
-      <w:hyperlink r:id="rId95">
+      <w:hyperlink r:id="rId97">
         <w:r>
           <w:rPr>
             <w:rStyle w:val="Hyperlink"/>
@@ -10005,14 +10218,14 @@
         </w:r>
       </w:hyperlink>
     </w:p>
-    <w:bookmarkEnd w:id="96"/>
-    <w:bookmarkStart w:id="98" w:name="ref-moloci2021"/>
+    <w:bookmarkEnd w:id="98"/>
+    <w:bookmarkStart w:id="100" w:name="ref-moloci2021"/>
     <w:p>
       <w:pPr>
         <w:pStyle w:val="Bibliography"/>
       </w:pPr>
       <w:r>
-        <w:t xml:space="preserve">18.</w:t>
+        <w:t xml:space="preserve">19.</w:t>
       </w:r>
       <w:r>
         <w:t xml:space="preserve"> </w:t>
@@ -10036,7 +10249,7 @@
       <w:r>
         <w:t xml:space="preserve">. 2021;36(8):2490-2491. doi:</w:t>
       </w:r>
-      <w:hyperlink r:id="rId97">
+      <w:hyperlink r:id="rId99">
         <w:r>
           <w:rPr>
             <w:rStyle w:val="Hyperlink"/>
@@ -10045,14 +10258,14 @@
         </w:r>
       </w:hyperlink>
     </w:p>
-    <w:bookmarkEnd w:id="98"/>
-    <w:bookmarkStart w:id="100" w:name="ref-trombley2022"/>
+    <w:bookmarkEnd w:id="100"/>
+    <w:bookmarkStart w:id="102" w:name="ref-trombley2022"/>
     <w:p>
       <w:pPr>
         <w:pStyle w:val="Bibliography"/>
       </w:pPr>
       <w:r>
-        <w:t xml:space="preserve">19.</w:t>
+        <w:t xml:space="preserve">20.</w:t>
       </w:r>
       <w:r>
         <w:t xml:space="preserve"> </w:t>
@@ -10076,7 +10289,7 @@
       <w:r>
         <w:t xml:space="preserve">. 2022;41(1):138-146. doi:</w:t>
       </w:r>
-      <w:hyperlink r:id="rId99">
+      <w:hyperlink r:id="rId101">
         <w:r>
           <w:rPr>
             <w:rStyle w:val="Hyperlink"/>
@@ -10085,14 +10298,14 @@
         </w:r>
       </w:hyperlink>
     </w:p>
-    <w:bookmarkEnd w:id="100"/>
-    <w:bookmarkStart w:id="102" w:name="ref-frpathways"/>
+    <w:bookmarkEnd w:id="102"/>
+    <w:bookmarkStart w:id="104" w:name="ref-frpathways"/>
     <w:p>
       <w:pPr>
         <w:pStyle w:val="Bibliography"/>
       </w:pPr>
       <w:r>
-        <w:t xml:space="preserve">20.</w:t>
+        <w:t xml:space="preserve">21.</w:t>
       </w:r>
       <w:r>
         <w:t xml:space="preserve"> </w:t>
@@ -10169,7 +10382,7 @@
       <w:r>
         <w:t xml:space="preserve"> </w:t>
       </w:r>
-      <w:hyperlink r:id="rId101">
+      <w:hyperlink r:id="rId103">
         <w:r>
           <w:rPr>
             <w:rStyle w:val="Hyperlink"/>
@@ -10178,14 +10391,14 @@
         </w:r>
       </w:hyperlink>
     </w:p>
-    <w:bookmarkEnd w:id="102"/>
-    <w:bookmarkStart w:id="104" w:name="ref-dataacos"/>
+    <w:bookmarkEnd w:id="104"/>
+    <w:bookmarkStart w:id="106" w:name="ref-dataacos"/>
     <w:p>
       <w:pPr>
         <w:pStyle w:val="Bibliography"/>
       </w:pPr>
       <w:r>
-        <w:t xml:space="preserve">21.</w:t>
+        <w:t xml:space="preserve">22.</w:t>
       </w:r>
       <w:r>
         <w:t xml:space="preserve"> </w:t>
@@ -10223,7 +10436,7 @@
       <w:r>
         <w:t xml:space="preserve"> </w:t>
       </w:r>
-      <w:hyperlink r:id="rId103">
+      <w:hyperlink r:id="rId105">
         <w:r>
           <w:rPr>
             <w:rStyle w:val="Hyperlink"/>
@@ -10232,14 +10445,14 @@
         </w:r>
       </w:hyperlink>
     </w:p>
-    <w:bookmarkEnd w:id="104"/>
-    <w:bookmarkStart w:id="106" w:name="ref-milliman2024"/>
+    <w:bookmarkEnd w:id="106"/>
+    <w:bookmarkStart w:id="108" w:name="ref-milliman2024"/>
     <w:p>
       <w:pPr>
         <w:pStyle w:val="Bibliography"/>
       </w:pPr>
       <w:r>
-        <w:t xml:space="preserve">22.</w:t>
+        <w:t xml:space="preserve">23.</w:t>
       </w:r>
       <w:r>
         <w:t xml:space="preserve"> </w:t>
@@ -10343,7 +10556,7 @@
       <w:r>
         <w:t xml:space="preserve"> </w:t>
       </w:r>
-      <w:hyperlink r:id="rId105">
+      <w:hyperlink r:id="rId107">
         <w:r>
           <w:rPr>
             <w:rStyle w:val="Hyperlink"/>
@@ -10352,14 +10565,14 @@
         </w:r>
       </w:hyperlink>
     </w:p>
-    <w:bookmarkEnd w:id="106"/>
-    <w:bookmarkStart w:id="108" w:name="ref-milliman2025"/>
+    <w:bookmarkEnd w:id="108"/>
+    <w:bookmarkStart w:id="110" w:name="ref-milliman2025"/>
     <w:p>
       <w:pPr>
         <w:pStyle w:val="Bibliography"/>
       </w:pPr>
       <w:r>
-        <w:t xml:space="preserve">23.</w:t>
+        <w:t xml:space="preserve">24.</w:t>
       </w:r>
       <w:r>
         <w:t xml:space="preserve"> </w:t>
@@ -10470,7 +10683,7 @@
       <w:r>
         <w:t xml:space="preserve"> </w:t>
       </w:r>
-      <w:hyperlink r:id="rId107">
+      <w:hyperlink r:id="rId109">
         <w:r>
           <w:rPr>
             <w:rStyle w:val="Hyperlink"/>
@@ -10479,14 +10692,14 @@
         </w:r>
       </w:hyperlink>
     </w:p>
-    <w:bookmarkEnd w:id="108"/>
-    <w:bookmarkStart w:id="109" w:name="ref-registration"/>
+    <w:bookmarkEnd w:id="110"/>
+    <w:bookmarkStart w:id="111" w:name="ref-registration"/>
     <w:p>
       <w:pPr>
         <w:pStyle w:val="Bibliography"/>
       </w:pPr>
       <w:r>
-        <w:t xml:space="preserve">24.</w:t>
+        <w:t xml:space="preserve">25.</w:t>
       </w:r>
       <w:r>
         <w:t xml:space="preserve"> </w:t>
@@ -10563,14 +10776,14 @@
         </w:r>
       </w:hyperlink>
     </w:p>
-    <w:bookmarkEnd w:id="109"/>
-    <w:bookmarkStart w:id="111" w:name="ref-vonelm2007"/>
+    <w:bookmarkEnd w:id="111"/>
+    <w:bookmarkStart w:id="113" w:name="ref-vonelm2007"/>
     <w:p>
       <w:pPr>
         <w:pStyle w:val="Bibliography"/>
       </w:pPr>
       <w:r>
-        <w:t xml:space="preserve">25.</w:t>
+        <w:t xml:space="preserve">26.</w:t>
       </w:r>
       <w:r>
         <w:t xml:space="preserve"> </w:t>
@@ -10594,7 +10807,7 @@
       <w:r>
         <w:t xml:space="preserve">. 2007;4(10):e296. doi:</w:t>
       </w:r>
-      <w:hyperlink r:id="rId110">
+      <w:hyperlink r:id="rId112">
         <w:r>
           <w:rPr>
             <w:rStyle w:val="Hyperlink"/>
@@ -10603,14 +10816,14 @@
         </w:r>
       </w:hyperlink>
     </w:p>
-    <w:bookmarkEnd w:id="111"/>
-    <w:bookmarkStart w:id="113" w:name="ref-code"/>
+    <w:bookmarkEnd w:id="113"/>
+    <w:bookmarkStart w:id="115" w:name="ref-code"/>
     <w:p>
       <w:pPr>
         <w:pStyle w:val="Bibliography"/>
       </w:pPr>
       <w:r>
-        <w:t xml:space="preserve">26.</w:t>
+        <w:t xml:space="preserve">27.</w:t>
       </w:r>
       <w:r>
         <w:t xml:space="preserve"> </w:t>
@@ -10642,7 +10855,7 @@
       <w:r>
         <w:t xml:space="preserve"> </w:t>
       </w:r>
-      <w:hyperlink r:id="rId112">
+      <w:hyperlink r:id="rId114">
         <w:r>
           <w:rPr>
             <w:rStyle w:val="Hyperlink"/>
@@ -10651,14 +10864,14 @@
         </w:r>
       </w:hyperlink>
     </w:p>
-    <w:bookmarkEnd w:id="113"/>
-    <w:bookmarkStart w:id="115" w:name="ref-dataresults"/>
+    <w:bookmarkEnd w:id="115"/>
+    <w:bookmarkStart w:id="117" w:name="ref-dataresults"/>
     <w:p>
       <w:pPr>
         <w:pStyle w:val="Bibliography"/>
       </w:pPr>
       <w:r>
-        <w:t xml:space="preserve">27.</w:t>
+        <w:t xml:space="preserve">28.</w:t>
       </w:r>
       <w:r>
         <w:t xml:space="preserve"> </w:t>
@@ -10672,7 +10885,7 @@
       <w:r>
         <w:t xml:space="preserve"> </w:t>
       </w:r>
-      <w:hyperlink r:id="rId114">
+      <w:hyperlink r:id="rId116">
         <w:r>
           <w:rPr>
             <w:rStyle w:val="Hyperlink"/>
@@ -10681,14 +10894,14 @@
         </w:r>
       </w:hyperlink>
     </w:p>
-    <w:bookmarkEnd w:id="115"/>
-    <w:bookmarkStart w:id="117" w:name="ref-datacounty"/>
+    <w:bookmarkEnd w:id="117"/>
+    <w:bookmarkStart w:id="119" w:name="ref-datacounty"/>
     <w:p>
       <w:pPr>
         <w:pStyle w:val="Bibliography"/>
       </w:pPr>
       <w:r>
-        <w:t xml:space="preserve">28.</w:t>
+        <w:t xml:space="preserve">29.</w:t>
       </w:r>
       <w:r>
         <w:t xml:space="preserve"> </w:t>
@@ -10702,7 +10915,7 @@
       <w:r>
         <w:t xml:space="preserve"> </w:t>
       </w:r>
-      <w:hyperlink r:id="rId116">
+      <w:hyperlink r:id="rId118">
         <w:r>
           <w:rPr>
             <w:rStyle w:val="Hyperlink"/>
@@ -10711,14 +10924,14 @@
         </w:r>
       </w:hyperlink>
     </w:p>
-    <w:bookmarkEnd w:id="117"/>
-    <w:bookmarkStart w:id="119" w:name="ref-dataassigned"/>
+    <w:bookmarkEnd w:id="119"/>
+    <w:bookmarkStart w:id="121" w:name="ref-dataassigned"/>
     <w:p>
       <w:pPr>
         <w:pStyle w:val="Bibliography"/>
       </w:pPr>
       <w:r>
-        <w:t xml:space="preserve">29.</w:t>
+        <w:t xml:space="preserve">30.</w:t>
       </w:r>
       <w:r>
         <w:t xml:space="preserve"> </w:t>
@@ -10732,7 +10945,7 @@
       <w:r>
         <w:t xml:space="preserve"> </w:t>
       </w:r>
-      <w:hyperlink r:id="rId118">
+      <w:hyperlink r:id="rId120">
         <w:r>
           <w:rPr>
             <w:rStyle w:val="Hyperlink"/>
@@ -10741,14 +10954,14 @@
         </w:r>
       </w:hyperlink>
     </w:p>
-    <w:bookmarkEnd w:id="119"/>
-    <w:bookmarkStart w:id="121" w:name="ref-osfproject"/>
+    <w:bookmarkEnd w:id="121"/>
+    <w:bookmarkStart w:id="123" w:name="ref-osfproject"/>
     <w:p>
       <w:pPr>
         <w:pStyle w:val="Bibliography"/>
       </w:pPr>
       <w:r>
-        <w:t xml:space="preserve">30.</w:t>
+        <w:t xml:space="preserve">31.</w:t>
       </w:r>
       <w:r>
         <w:t xml:space="preserve"> </w:t>
@@ -10801,7 +11014,7 @@
       <w:r>
         <w:t xml:space="preserve">data snapshot. Published online 2026. doi:</w:t>
       </w:r>
-      <w:hyperlink r:id="rId120">
+      <w:hyperlink r:id="rId122">
         <w:r>
           <w:rPr>
             <w:rStyle w:val="Hyperlink"/>
@@ -10810,14 +11023,14 @@
         </w:r>
       </w:hyperlink>
     </w:p>
-    <w:bookmarkEnd w:id="121"/>
-    <w:bookmarkStart w:id="123" w:name="ref-suppression"/>
+    <w:bookmarkEnd w:id="123"/>
+    <w:bookmarkStart w:id="125" w:name="ref-suppression"/>
     <w:p>
       <w:pPr>
         <w:pStyle w:val="Bibliography"/>
       </w:pPr>
       <w:r>
-        <w:t xml:space="preserve">31.</w:t>
+        <w:t xml:space="preserve">32.</w:t>
       </w:r>
       <w:r>
         <w:t xml:space="preserve"> </w:t>
@@ -10843,7 +11056,7 @@
       <w:r>
         <w:t xml:space="preserve"> </w:t>
       </w:r>
-      <w:hyperlink r:id="rId122">
+      <w:hyperlink r:id="rId124">
         <w:r>
           <w:rPr>
             <w:rStyle w:val="Hyperlink"/>
@@ -10852,14 +11065,14 @@
         </w:r>
       </w:hyperlink>
     </w:p>
-    <w:bookmarkEnd w:id="123"/>
-    <w:bookmarkStart w:id="125" w:name="ref-specv10"/>
+    <w:bookmarkEnd w:id="125"/>
+    <w:bookmarkStart w:id="127" w:name="ref-specv10"/>
     <w:p>
       <w:pPr>
         <w:pStyle w:val="Bibliography"/>
       </w:pPr>
       <w:r>
-        <w:t xml:space="preserve">32.</w:t>
+        <w:t xml:space="preserve">33.</w:t>
       </w:r>
       <w:r>
         <w:t xml:space="preserve"> </w:t>
@@ -10894,7 +11107,7 @@
       <w:r>
         <w:t xml:space="preserve"> </w:t>
       </w:r>
-      <w:hyperlink r:id="rId124">
+      <w:hyperlink r:id="rId126">
         <w:r>
           <w:rPr>
             <w:rStyle w:val="Hyperlink"/>
@@ -10903,14 +11116,14 @@
         </w:r>
       </w:hyperlink>
     </w:p>
-    <w:bookmarkEnd w:id="125"/>
-    <w:bookmarkStart w:id="127" w:name="ref-cfr425600"/>
+    <w:bookmarkEnd w:id="127"/>
+    <w:bookmarkStart w:id="129" w:name="ref-cfr425600"/>
     <w:p>
       <w:pPr>
         <w:pStyle w:val="Bibliography"/>
       </w:pPr>
       <w:r>
-        <w:t xml:space="preserve">33.</w:t>
+        <w:t xml:space="preserve">34.</w:t>
       </w:r>
       <w:r>
         <w:t xml:space="preserve"> </w:t>
@@ -10948,7 +11161,7 @@
       <w:r>
         <w:t xml:space="preserve"> </w:t>
       </w:r>
-      <w:hyperlink r:id="rId126">
+      <w:hyperlink r:id="rId128">
         <w:r>
           <w:rPr>
             <w:rStyle w:val="Hyperlink"/>
@@ -10957,14 +11170,14 @@
         </w:r>
       </w:hyperlink>
     </w:p>
-    <w:bookmarkEnd w:id="127"/>
-    <w:bookmarkStart w:id="129" w:name="ref-rubin1981"/>
+    <w:bookmarkEnd w:id="129"/>
+    <w:bookmarkStart w:id="131" w:name="ref-rubin1981"/>
     <w:p>
       <w:pPr>
         <w:pStyle w:val="Bibliography"/>
       </w:pPr>
       <w:r>
-        <w:t xml:space="preserve">34.</w:t>
+        <w:t xml:space="preserve">35.</w:t>
       </w:r>
       <w:r>
         <w:t xml:space="preserve"> </w:t>
@@ -10988,7 +11201,7 @@
       <w:r>
         <w:t xml:space="preserve">. 1981;9(1):130-134. doi:</w:t>
       </w:r>
-      <w:hyperlink r:id="rId128">
+      <w:hyperlink r:id="rId130">
         <w:r>
           <w:rPr>
             <w:rStyle w:val="Hyperlink"/>
@@ -10997,14 +11210,14 @@
         </w:r>
       </w:hyperlink>
     </w:p>
-    <w:bookmarkEnd w:id="129"/>
-    <w:bookmarkStart w:id="131" w:name="ref-phipson2010"/>
+    <w:bookmarkEnd w:id="131"/>
+    <w:bookmarkStart w:id="133" w:name="ref-phipson2010"/>
     <w:p>
       <w:pPr>
         <w:pStyle w:val="Bibliography"/>
       </w:pPr>
       <w:r>
-        <w:t xml:space="preserve">35.</w:t>
+        <w:t xml:space="preserve">36.</w:t>
       </w:r>
       <w:r>
         <w:t xml:space="preserve"> </w:t>
@@ -11028,7 +11241,7 @@
       <w:r>
         <w:t xml:space="preserve">. 2010;9(1):39. doi:</w:t>
       </w:r>
-      <w:hyperlink r:id="rId130">
+      <w:hyperlink r:id="rId132">
         <w:r>
           <w:rPr>
             <w:rStyle w:val="Hyperlink"/>
@@ -11037,14 +11250,14 @@
         </w:r>
       </w:hyperlink>
     </w:p>
-    <w:bookmarkEnd w:id="131"/>
-    <w:bookmarkStart w:id="133" w:name="ref-pymc2023"/>
+    <w:bookmarkEnd w:id="133"/>
+    <w:bookmarkStart w:id="135" w:name="ref-pymc2023"/>
     <w:p>
       <w:pPr>
         <w:pStyle w:val="Bibliography"/>
       </w:pPr>
       <w:r>
-        <w:t xml:space="preserve">36.</w:t>
+        <w:t xml:space="preserve">37.</w:t>
       </w:r>
       <w:r>
         <w:t xml:space="preserve"> </w:t>
@@ -11068,7 +11281,7 @@
       <w:r>
         <w:t xml:space="preserve">. 2023;9:e1516. doi:</w:t>
       </w:r>
-      <w:hyperlink r:id="rId132">
+      <w:hyperlink r:id="rId134">
         <w:r>
           <w:rPr>
             <w:rStyle w:val="Hyperlink"/>
@@ -11077,14 +11290,14 @@
         </w:r>
       </w:hyperlink>
     </w:p>
-    <w:bookmarkEnd w:id="133"/>
-    <w:bookmarkStart w:id="135" w:name="ref-hoffman2014"/>
+    <w:bookmarkEnd w:id="135"/>
+    <w:bookmarkStart w:id="137" w:name="ref-hoffman2014"/>
     <w:p>
       <w:pPr>
         <w:pStyle w:val="Bibliography"/>
       </w:pPr>
       <w:r>
-        <w:t xml:space="preserve">37.</w:t>
+        <w:t xml:space="preserve">38.</w:t>
       </w:r>
       <w:r>
         <w:t xml:space="preserve"> </w:t>
@@ -11144,7 +11357,7 @@
       <w:r>
         <w:t xml:space="preserve"> </w:t>
       </w:r>
-      <w:hyperlink r:id="rId134">
+      <w:hyperlink r:id="rId136">
         <w:r>
           <w:rPr>
             <w:rStyle w:val="Hyperlink"/>
@@ -11153,14 +11366,14 @@
         </w:r>
       </w:hyperlink>
     </w:p>
-    <w:bookmarkEnd w:id="135"/>
-    <w:bookmarkStart w:id="137" w:name="ref-gelman2008"/>
+    <w:bookmarkEnd w:id="137"/>
+    <w:bookmarkStart w:id="139" w:name="ref-gelman2008"/>
     <w:p>
       <w:pPr>
         <w:pStyle w:val="Bibliography"/>
       </w:pPr>
       <w:r>
-        <w:t xml:space="preserve">38.</w:t>
+        <w:t xml:space="preserve">39.</w:t>
       </w:r>
       <w:r>
         <w:t xml:space="preserve"> </w:t>
@@ -11184,7 +11397,7 @@
       <w:r>
         <w:t xml:space="preserve">. 2008;27(15):2865-2873. doi:</w:t>
       </w:r>
-      <w:hyperlink r:id="rId136">
+      <w:hyperlink r:id="rId138">
         <w:r>
           <w:rPr>
             <w:rStyle w:val="Hyperlink"/>
@@ -11193,14 +11406,14 @@
         </w:r>
       </w:hyperlink>
     </w:p>
-    <w:bookmarkEnd w:id="137"/>
-    <w:bookmarkStart w:id="139" w:name="ref-vehtari2021"/>
+    <w:bookmarkEnd w:id="139"/>
+    <w:bookmarkStart w:id="141" w:name="ref-vehtari2021"/>
     <w:p>
       <w:pPr>
         <w:pStyle w:val="Bibliography"/>
       </w:pPr>
       <w:r>
-        <w:t xml:space="preserve">39.</w:t>
+        <w:t xml:space="preserve">40.</w:t>
       </w:r>
       <w:r>
         <w:t xml:space="preserve"> </w:t>
@@ -11224,7 +11437,7 @@
       <w:r>
         <w:t xml:space="preserve">. 2021;16(2):667-718. doi:</w:t>
       </w:r>
-      <w:hyperlink r:id="rId138">
+      <w:hyperlink r:id="rId140">
         <w:r>
           <w:rPr>
             <w:rStyle w:val="Hyperlink"/>
@@ -11233,14 +11446,14 @@
         </w:r>
       </w:hyperlink>
     </w:p>
-    <w:bookmarkEnd w:id="139"/>
-    <w:bookmarkStart w:id="141" w:name="ref-firth1993"/>
+    <w:bookmarkEnd w:id="141"/>
+    <w:bookmarkStart w:id="143" w:name="ref-firth1993"/>
     <w:p>
       <w:pPr>
         <w:pStyle w:val="Bibliography"/>
       </w:pPr>
       <w:r>
-        <w:t xml:space="preserve">40.</w:t>
+        <w:t xml:space="preserve">41.</w:t>
       </w:r>
       <w:r>
         <w:t xml:space="preserve"> </w:t>
@@ -11264,7 +11477,7 @@
       <w:r>
         <w:t xml:space="preserve">. 1993;80(1):27-38. doi:</w:t>
       </w:r>
-      <w:hyperlink r:id="rId140">
+      <w:hyperlink r:id="rId142">
         <w:r>
           <w:rPr>
             <w:rStyle w:val="Hyperlink"/>
@@ -11273,14 +11486,14 @@
         </w:r>
       </w:hyperlink>
     </w:p>
-    <w:bookmarkEnd w:id="141"/>
-    <w:bookmarkStart w:id="143" w:name="ref-firthmodels"/>
+    <w:bookmarkEnd w:id="143"/>
+    <w:bookmarkStart w:id="145" w:name="ref-firthmodels"/>
     <w:p>
       <w:pPr>
         <w:pStyle w:val="Bibliography"/>
       </w:pPr>
       <w:r>
-        <w:t xml:space="preserve">41.</w:t>
+        <w:t xml:space="preserve">42.</w:t>
       </w:r>
       <w:r>
         <w:t xml:space="preserve"> </w:t>
@@ -11324,7 +11537,7 @@
       <w:r>
         <w:t xml:space="preserve"> </w:t>
       </w:r>
-      <w:hyperlink r:id="rId142">
+      <w:hyperlink r:id="rId144">
         <w:r>
           <w:rPr>
             <w:rStyle w:val="Hyperlink"/>
@@ -11333,14 +11546,14 @@
         </w:r>
       </w:hyperlink>
     </w:p>
-    <w:bookmarkEnd w:id="143"/>
-    <w:bookmarkStart w:id="145" w:name="ref-gelmanprior2008"/>
+    <w:bookmarkEnd w:id="145"/>
+    <w:bookmarkStart w:id="147" w:name="ref-gelmanprior2008"/>
     <w:p>
       <w:pPr>
         <w:pStyle w:val="Bibliography"/>
       </w:pPr>
       <w:r>
-        <w:t xml:space="preserve">42.</w:t>
+        <w:t xml:space="preserve">43.</w:t>
       </w:r>
       <w:r>
         <w:t xml:space="preserve"> </w:t>
@@ -11364,7 +11577,7 @@
       <w:r>
         <w:t xml:space="preserve">. 2008;2(4):1360-1383. doi:</w:t>
       </w:r>
-      <w:hyperlink r:id="rId144">
+      <w:hyperlink r:id="rId146">
         <w:r>
           <w:rPr>
             <w:rStyle w:val="Hyperlink"/>
@@ -11373,14 +11586,14 @@
         </w:r>
       </w:hyperlink>
     </w:p>
-    <w:bookmarkEnd w:id="145"/>
-    <w:bookmarkStart w:id="147" w:name="ref-callaway2021"/>
+    <w:bookmarkEnd w:id="147"/>
+    <w:bookmarkStart w:id="149" w:name="ref-callaway2021"/>
     <w:p>
       <w:pPr>
         <w:pStyle w:val="Bibliography"/>
       </w:pPr>
       <w:r>
-        <w:t xml:space="preserve">43.</w:t>
+        <w:t xml:space="preserve">44.</w:t>
       </w:r>
       <w:r>
         <w:t xml:space="preserve"> </w:t>
@@ -11404,7 +11617,7 @@
       <w:r>
         <w:t xml:space="preserve">. 2021;225(2):200-230. doi:</w:t>
       </w:r>
-      <w:hyperlink r:id="rId146">
+      <w:hyperlink r:id="rId148">
         <w:r>
           <w:rPr>
             <w:rStyle w:val="Hyperlink"/>
@@ -11413,14 +11626,14 @@
         </w:r>
       </w:hyperlink>
     </w:p>
-    <w:bookmarkEnd w:id="147"/>
-    <w:bookmarkStart w:id="149" w:name="ref-roth2022"/>
+    <w:bookmarkEnd w:id="149"/>
+    <w:bookmarkStart w:id="151" w:name="ref-roth2022"/>
     <w:p>
       <w:pPr>
         <w:pStyle w:val="Bibliography"/>
       </w:pPr>
       <w:r>
-        <w:t xml:space="preserve">44.</w:t>
+        <w:t xml:space="preserve">45.</w:t>
       </w:r>
       <w:r>
         <w:t xml:space="preserve"> </w:t>
@@ -11444,7 +11657,7 @@
       <w:r>
         <w:t xml:space="preserve">. 2022;4(3):305-322. doi:</w:t>
       </w:r>
-      <w:hyperlink r:id="rId148">
+      <w:hyperlink r:id="rId150">
         <w:r>
           <w:rPr>
             <w:rStyle w:val="Hyperlink"/>
@@ -11453,14 +11666,14 @@
         </w:r>
       </w:hyperlink>
     </w:p>
-    <w:bookmarkEnd w:id="149"/>
-    <w:bookmarkStart w:id="151" w:name="ref-lakens2017"/>
+    <w:bookmarkEnd w:id="151"/>
+    <w:bookmarkStart w:id="153" w:name="ref-lakens2017"/>
     <w:p>
       <w:pPr>
         <w:pStyle w:val="Bibliography"/>
       </w:pPr>
       <w:r>
-        <w:t xml:space="preserve">45.</w:t>
+        <w:t xml:space="preserve">46.</w:t>
       </w:r>
       <w:r>
         <w:t xml:space="preserve"> </w:t>
@@ -11484,7 +11697,7 @@
       <w:r>
         <w:t xml:space="preserve">. 2017;8(4):355-362. doi:</w:t>
       </w:r>
-      <w:hyperlink r:id="rId150">
+      <w:hyperlink r:id="rId152">
         <w:r>
           <w:rPr>
             <w:rStyle w:val="Hyperlink"/>
@@ -11493,14 +11706,14 @@
         </w:r>
       </w:hyperlink>
     </w:p>
-    <w:bookmarkEnd w:id="151"/>
-    <w:bookmarkStart w:id="153" w:name="ref-rambachan2023"/>
+    <w:bookmarkEnd w:id="153"/>
+    <w:bookmarkStart w:id="155" w:name="ref-rambachan2023"/>
     <w:p>
       <w:pPr>
         <w:pStyle w:val="Bibliography"/>
       </w:pPr>
       <w:r>
-        <w:t xml:space="preserve">46.</w:t>
+        <w:t xml:space="preserve">47.</w:t>
       </w:r>
       <w:r>
         <w:t xml:space="preserve"> </w:t>
@@ -11524,7 +11737,7 @@
       <w:r>
         <w:t xml:space="preserve">. 2023;90(5):2555-2591. doi:</w:t>
       </w:r>
-      <w:hyperlink r:id="rId152">
+      <w:hyperlink r:id="rId154">
         <w:r>
           <w:rPr>
             <w:rStyle w:val="Hyperlink"/>
@@ -11533,14 +11746,14 @@
         </w:r>
       </w:hyperlink>
     </w:p>
-    <w:bookmarkEnd w:id="153"/>
-    <w:bookmarkStart w:id="155" w:name="ref-rosenbaum1983"/>
+    <w:bookmarkEnd w:id="155"/>
+    <w:bookmarkStart w:id="157" w:name="ref-rosenbaum1983"/>
     <w:p>
       <w:pPr>
         <w:pStyle w:val="Bibliography"/>
       </w:pPr>
       <w:r>
-        <w:t xml:space="preserve">47.</w:t>
+        <w:t xml:space="preserve">48.</w:t>
       </w:r>
       <w:r>
         <w:t xml:space="preserve"> </w:t>
@@ -11564,7 +11777,7 @@
       <w:r>
         <w:t xml:space="preserve">. 1983;70(1):41-55. doi:</w:t>
       </w:r>
-      <w:hyperlink r:id="rId154">
+      <w:hyperlink r:id="rId156">
         <w:r>
           <w:rPr>
             <w:rStyle w:val="Hyperlink"/>
@@ -11573,14 +11786,14 @@
         </w:r>
       </w:hyperlink>
     </w:p>
-    <w:bookmarkEnd w:id="155"/>
-    <w:bookmarkStart w:id="157" w:name="ref-welch1947"/>
+    <w:bookmarkEnd w:id="157"/>
+    <w:bookmarkStart w:id="159" w:name="ref-welch1947"/>
     <w:p>
       <w:pPr>
         <w:pStyle w:val="Bibliography"/>
       </w:pPr>
       <w:r>
-        <w:t xml:space="preserve">48.</w:t>
+        <w:t xml:space="preserve">49.</w:t>
       </w:r>
       <w:r>
         <w:t xml:space="preserve"> </w:t>
@@ -11616,7 +11829,7 @@
       <w:r>
         <w:t xml:space="preserve">. 1947;34(1-2):28-35. doi:</w:t>
       </w:r>
-      <w:hyperlink r:id="rId156">
+      <w:hyperlink r:id="rId158">
         <w:r>
           <w:rPr>
             <w:rStyle w:val="Hyperlink"/>
@@ -11625,14 +11838,14 @@
         </w:r>
       </w:hyperlink>
     </w:p>
-    <w:bookmarkEnd w:id="157"/>
-    <w:bookmarkStart w:id="159" w:name="ref-mackinnon1985"/>
+    <w:bookmarkEnd w:id="159"/>
+    <w:bookmarkStart w:id="161" w:name="ref-mackinnon1985"/>
     <w:p>
       <w:pPr>
         <w:pStyle w:val="Bibliography"/>
       </w:pPr>
       <w:r>
-        <w:t xml:space="preserve">49.</w:t>
+        <w:t xml:space="preserve">50.</w:t>
       </w:r>
       <w:r>
         <w:t xml:space="preserve"> </w:t>
@@ -11656,7 +11869,7 @@
       <w:r>
         <w:t xml:space="preserve">. 1985;29(3):305-325. doi:</w:t>
       </w:r>
-      <w:hyperlink r:id="rId158">
+      <w:hyperlink r:id="rId160">
         <w:r>
           <w:rPr>
             <w:rStyle w:val="Hyperlink"/>
@@ -11665,14 +11878,14 @@
         </w:r>
       </w:hyperlink>
     </w:p>
-    <w:bookmarkEnd w:id="159"/>
-    <w:bookmarkStart w:id="161" w:name="ref-statsmodels2010"/>
+    <w:bookmarkEnd w:id="161"/>
+    <w:bookmarkStart w:id="163" w:name="ref-statsmodels2010"/>
     <w:p>
       <w:pPr>
         <w:pStyle w:val="Bibliography"/>
       </w:pPr>
       <w:r>
-        <w:t xml:space="preserve">50.</w:t>
+        <w:t xml:space="preserve">51.</w:t>
       </w:r>
       <w:r>
         <w:t xml:space="preserve"> </w:t>
@@ -11696,7 +11909,7 @@
       <w:r>
         <w:t xml:space="preserve">. Published online 2010:92-96. doi:</w:t>
       </w:r>
-      <w:hyperlink r:id="rId160">
+      <w:hyperlink r:id="rId162">
         <w:r>
           <w:rPr>
             <w:rStyle w:val="Hyperlink"/>
@@ -11705,14 +11918,14 @@
         </w:r>
       </w:hyperlink>
     </w:p>
-    <w:bookmarkEnd w:id="161"/>
-    <w:bookmarkStart w:id="163" w:name="ref-dbt"/>
+    <w:bookmarkEnd w:id="163"/>
+    <w:bookmarkStart w:id="165" w:name="ref-dbt"/>
     <w:p>
       <w:pPr>
         <w:pStyle w:val="Bibliography"/>
       </w:pPr>
       <w:r>
-        <w:t xml:space="preserve">51.</w:t>
+        <w:t xml:space="preserve">52.</w:t>
       </w:r>
       <w:r>
         <w:t xml:space="preserve"> </w:t>
@@ -11753,7 +11966,7 @@
       <w:r>
         <w:t xml:space="preserve"> </w:t>
       </w:r>
-      <w:hyperlink r:id="rId162">
+      <w:hyperlink r:id="rId164">
         <w:r>
           <w:rPr>
             <w:rStyle w:val="Hyperlink"/>
@@ -11762,14 +11975,14 @@
         </w:r>
       </w:hyperlink>
     </w:p>
-    <w:bookmarkEnd w:id="163"/>
-    <w:bookmarkStart w:id="165" w:name="ref-duckdb2019"/>
+    <w:bookmarkEnd w:id="165"/>
+    <w:bookmarkStart w:id="167" w:name="ref-duckdb2019"/>
     <w:p>
       <w:pPr>
         <w:pStyle w:val="Bibliography"/>
       </w:pPr>
       <w:r>
-        <w:t xml:space="preserve">52.</w:t>
+        <w:t xml:space="preserve">53.</w:t>
       </w:r>
       <w:r>
         <w:t xml:space="preserve"> </w:t>
@@ -11793,7 +12006,7 @@
       <w:r>
         <w:t xml:space="preserve">. Published online June 25, 2019:1981-1984. doi:</w:t>
       </w:r>
-      <w:hyperlink r:id="rId164">
+      <w:hyperlink r:id="rId166">
         <w:r>
           <w:rPr>
             <w:rStyle w:val="Hyperlink"/>
@@ -11802,14 +12015,14 @@
         </w:r>
       </w:hyperlink>
     </w:p>
-    <w:bookmarkEnd w:id="165"/>
-    <w:bookmarkStart w:id="167" w:name="ref-uv"/>
+    <w:bookmarkEnd w:id="167"/>
+    <w:bookmarkStart w:id="169" w:name="ref-uv"/>
     <w:p>
       <w:pPr>
         <w:pStyle w:val="Bibliography"/>
       </w:pPr>
       <w:r>
-        <w:t xml:space="preserve">53.</w:t>
+        <w:t xml:space="preserve">54.</w:t>
       </w:r>
       <w:r>
         <w:t xml:space="preserve"> </w:t>
@@ -11844,7 +12057,7 @@
       <w:r>
         <w:t xml:space="preserve"> </w:t>
       </w:r>
-      <w:hyperlink r:id="rId166">
+      <w:hyperlink r:id="rId168">
         <w:r>
           <w:rPr>
             <w:rStyle w:val="Hyperlink"/>
@@ -11853,14 +12066,14 @@
         </w:r>
       </w:hyperlink>
     </w:p>
-    <w:bookmarkEnd w:id="167"/>
-    <w:bookmarkStart w:id="169" w:name="ref-arviz2019"/>
+    <w:bookmarkEnd w:id="169"/>
+    <w:bookmarkStart w:id="171" w:name="ref-arviz2019"/>
     <w:p>
       <w:pPr>
         <w:pStyle w:val="Bibliography"/>
       </w:pPr>
       <w:r>
-        <w:t xml:space="preserve">54.</w:t>
+        <w:t xml:space="preserve">55.</w:t>
       </w:r>
       <w:r>
         <w:t xml:space="preserve"> </w:t>
@@ -11884,7 +12097,7 @@
       <w:r>
         <w:t xml:space="preserve">. 2019;4(33):1143. doi:</w:t>
       </w:r>
-      <w:hyperlink r:id="rId168">
+      <w:hyperlink r:id="rId170">
         <w:r>
           <w:rPr>
             <w:rStyle w:val="Hyperlink"/>
@@ -11893,14 +12106,14 @@
         </w:r>
       </w:hyperlink>
     </w:p>
-    <w:bookmarkEnd w:id="169"/>
-    <w:bookmarkStart w:id="171" w:name="ref-numpy2020"/>
+    <w:bookmarkEnd w:id="171"/>
+    <w:bookmarkStart w:id="173" w:name="ref-numpy2020"/>
     <w:p>
       <w:pPr>
         <w:pStyle w:val="Bibliography"/>
       </w:pPr>
       <w:r>
-        <w:t xml:space="preserve">55.</w:t>
+        <w:t xml:space="preserve">56.</w:t>
       </w:r>
       <w:r>
         <w:t xml:space="preserve"> </w:t>
@@ -11924,7 +12137,7 @@
       <w:r>
         <w:t xml:space="preserve">. 2020;585(7825):357-362. doi:</w:t>
       </w:r>
-      <w:hyperlink r:id="rId170">
+      <w:hyperlink r:id="rId172">
         <w:r>
           <w:rPr>
             <w:rStyle w:val="Hyperlink"/>
@@ -11933,14 +12146,14 @@
         </w:r>
       </w:hyperlink>
     </w:p>
-    <w:bookmarkEnd w:id="171"/>
-    <w:bookmarkStart w:id="173" w:name="ref-cfr46102"/>
+    <w:bookmarkEnd w:id="173"/>
+    <w:bookmarkStart w:id="175" w:name="ref-cfr46102"/>
     <w:p>
       <w:pPr>
         <w:pStyle w:val="Bibliography"/>
       </w:pPr>
       <w:r>
-        <w:t xml:space="preserve">56.</w:t>
+        <w:t xml:space="preserve">57.</w:t>
       </w:r>
       <w:r>
         <w:t xml:space="preserve"> </w:t>
@@ -11978,7 +12191,7 @@
       <w:r>
         <w:t xml:space="preserve"> </w:t>
       </w:r>
-      <w:hyperlink r:id="rId172">
+      <w:hyperlink r:id="rId174">
         <w:r>
           <w:rPr>
             <w:rStyle w:val="Hyperlink"/>
@@ -11987,14 +12200,14 @@
         </w:r>
       </w:hyperlink>
     </w:p>
-    <w:bookmarkEnd w:id="173"/>
-    <w:bookmarkStart w:id="175" w:name="ref-gelmancarlin2014"/>
+    <w:bookmarkEnd w:id="175"/>
+    <w:bookmarkStart w:id="177" w:name="ref-gelmancarlin2014"/>
     <w:p>
       <w:pPr>
         <w:pStyle w:val="Bibliography"/>
       </w:pPr>
       <w:r>
-        <w:t xml:space="preserve">57.</w:t>
+        <w:t xml:space="preserve">58.</w:t>
       </w:r>
       <w:r>
         <w:t xml:space="preserve"> </w:t>
@@ -12018,7 +12231,7 @@
       <w:r>
         <w:t xml:space="preserve">. 2014;9(6):641-651. doi:</w:t>
       </w:r>
-      <w:hyperlink r:id="rId174">
+      <w:hyperlink r:id="rId176">
         <w:r>
           <w:rPr>
             <w:rStyle w:val="Hyperlink"/>
@@ -12027,14 +12240,14 @@
         </w:r>
       </w:hyperlink>
     </w:p>
-    <w:bookmarkEnd w:id="175"/>
-    <w:bookmarkStart w:id="177" w:name="ref-cfr2024"/>
+    <w:bookmarkEnd w:id="177"/>
+    <w:bookmarkStart w:id="179" w:name="ref-cfr2024"/>
     <w:p>
       <w:pPr>
         <w:pStyle w:val="Bibliography"/>
       </w:pPr>
       <w:r>
-        <w:t xml:space="preserve">58.</w:t>
+        <w:t xml:space="preserve">59.</w:t>
       </w:r>
       <w:r>
         <w:t xml:space="preserve"> </w:t>
@@ -12072,7 +12285,7 @@
       <w:r>
         <w:t xml:space="preserve"> </w:t>
       </w:r>
-      <w:hyperlink r:id="rId176">
+      <w:hyperlink r:id="rId178">
         <w:r>
           <w:rPr>
             <w:rStyle w:val="Hyperlink"/>
@@ -12081,14 +12294,14 @@
         </w:r>
       </w:hyperlink>
     </w:p>
-    <w:bookmarkEnd w:id="177"/>
-    <w:bookmarkStart w:id="179" w:name="ref-aha2021"/>
+    <w:bookmarkEnd w:id="179"/>
+    <w:bookmarkStart w:id="181" w:name="ref-aha2021"/>
     <w:p>
       <w:pPr>
         <w:pStyle w:val="Bibliography"/>
       </w:pPr>
       <w:r>
-        <w:t xml:space="preserve">59.</w:t>
+        <w:t xml:space="preserve">60.</w:t>
       </w:r>
       <w:r>
         <w:t xml:space="preserve"> </w:t>
@@ -12132,7 +12345,7 @@
       <w:r>
         <w:t xml:space="preserve"> </w:t>
       </w:r>
-      <w:hyperlink r:id="rId178">
+      <w:hyperlink r:id="rId180">
         <w:r>
           <w:rPr>
             <w:rStyle w:val="Hyperlink"/>
@@ -12141,14 +12354,14 @@
         </w:r>
       </w:hyperlink>
     </w:p>
-    <w:bookmarkEnd w:id="179"/>
-    <w:bookmarkStart w:id="181" w:name="ref-paperrepo"/>
+    <w:bookmarkEnd w:id="181"/>
+    <w:bookmarkStart w:id="183" w:name="ref-paperrepo"/>
     <w:p>
       <w:pPr>
         <w:pStyle w:val="Bibliography"/>
       </w:pPr>
       <w:r>
-        <w:t xml:space="preserve">60.</w:t>
+        <w:t xml:space="preserve">61.</w:t>
       </w:r>
       <w:r>
         <w:t xml:space="preserve"> </w:t>
@@ -12174,7 +12387,7 @@
       <w:r>
         <w:t xml:space="preserve"> </w:t>
       </w:r>
-      <w:hyperlink r:id="rId180">
+      <w:hyperlink r:id="rId182">
         <w:r>
           <w:rPr>
             <w:rStyle w:val="Hyperlink"/>
@@ -12183,14 +12396,14 @@
         </w:r>
       </w:hyperlink>
     </w:p>
-    <w:bookmarkEnd w:id="181"/>
-    <w:bookmarkStart w:id="183" w:name="ref-post"/>
+    <w:bookmarkEnd w:id="183"/>
+    <w:bookmarkStart w:id="185" w:name="ref-post"/>
     <w:p>
       <w:pPr>
         <w:pStyle w:val="Bibliography"/>
       </w:pPr>
       <w:r>
-        <w:t xml:space="preserve">61.</w:t>
+        <w:t xml:space="preserve">62.</w:t>
       </w:r>
       <w:r>
         <w:t xml:space="preserve"> </w:t>
@@ -12234,7 +12447,7 @@
       <w:r>
         <w:t xml:space="preserve"> </w:t>
       </w:r>
-      <w:hyperlink r:id="rId182">
+      <w:hyperlink r:id="rId184">
         <w:r>
           <w:rPr>
             <w:rStyle w:val="Hyperlink"/>
@@ -12243,9 +12456,9 @@
         </w:r>
       </w:hyperlink>
     </w:p>
-    <w:bookmarkEnd w:id="183"/>
-    <w:bookmarkEnd w:id="184"/>
     <w:bookmarkEnd w:id="185"/>
+    <w:bookmarkEnd w:id="186"/>
+    <w:bookmarkEnd w:id="187"/>
     <w:sectPr>
       <w:footnotePr>
         <w:numRestart w:val="eachSect"/>

</xml_diff>

<commit_message>
Manuscript: program size (CMS 2026 fast facts), literature in 2 strands (incentive, selection), Weitzman 1980 for the ratchet, contribution previewed in the aims
Co-Authored-By: Claude Opus 5.5 <noreply@anthropic.com>
</commit_message>
<xml_diff>
--- a/paper.docx
+++ b/paper.docx
@@ -437,7 +437,39 @@
         <w:t xml:space="preserve"> </w:t>
       </w:r>
       <w:r>
-        <w:t xml:space="preserve">At the start of each agreement period the</w:t>
+        <w:t xml:space="preserve">As of January 1, 2026, 511 ACOs served 12.6</w:t>
+      </w:r>
+      <w:r>
+        <w:t xml:space="preserve"> </w:t>
+      </w:r>
+      <w:r>
+        <w:t xml:space="preserve">million assigned Medicare beneficiaries, and ACOs earned $4.1 billion in shared savings for 2024.</w:t>
+      </w:r>
+      <w:r>
+        <w:t xml:space="preserve">[</w:t>
+      </w:r>
+      <w:hyperlink w:anchor="ref-sspfastfacts2026">
+        <w:r>
+          <w:rPr>
+            <w:rStyle w:val="Hyperlink"/>
+          </w:rPr>
+          <w:t xml:space="preserve">2</w:t>
+        </w:r>
+      </w:hyperlink>
+      <w:r>
+        <w:t xml:space="preserve">]</w:t>
+      </w:r>
+      <w:r>
+        <w:t xml:space="preserve"> </w:t>
+      </w:r>
+      <w:r>
+        <w:t xml:space="preserve">How benchmarks are set therefore determines both what Medicare pays and which provider organizations take part. At</w:t>
+      </w:r>
+      <w:r>
+        <w:t xml:space="preserve"> </w:t>
+      </w:r>
+      <w:r>
+        <w:t xml:space="preserve">the start of each agreement period the</w:t>
       </w:r>
       <w:r>
         <w:t xml:space="preserve"> </w:t>
@@ -459,7 +491,7 @@
           <w:rPr>
             <w:rStyle w:val="Hyperlink"/>
           </w:rPr>
-          <w:t xml:space="preserve">2</w:t>
+          <w:t xml:space="preserve">3</w:t>
         </w:r>
       </w:hyperlink>
       <w:r>
@@ -485,7 +517,7 @@
           <w:rPr>
             <w:rStyle w:val="Hyperlink"/>
           </w:rPr>
-          <w:t xml:space="preserve">3</w:t>
+          <w:t xml:space="preserve">4</w:t>
         </w:r>
       </w:hyperlink>
       <w:r>
@@ -496,7 +528,7 @@
           <w:rPr>
             <w:rStyle w:val="Hyperlink"/>
           </w:rPr>
-          <w:t xml:space="preserve">5</w:t>
+          <w:t xml:space="preserve">6</w:t>
         </w:r>
       </w:hyperlink>
       <w:r>
@@ -528,7 +560,7 @@
           <w:rPr>
             <w:rStyle w:val="Hyperlink"/>
           </w:rPr>
-          <w:t xml:space="preserve">6</w:t>
+          <w:t xml:space="preserve">7</w:t>
         </w:r>
       </w:hyperlink>
       <w:r>
@@ -554,7 +586,7 @@
           <w:rPr>
             <w:rStyle w:val="Hyperlink"/>
           </w:rPr>
-          <w:t xml:space="preserve">7</w:t>
+          <w:t xml:space="preserve">8</w:t>
         </w:r>
       </w:hyperlink>
       <w:r>
@@ -580,7 +612,7 @@
           <w:rPr>
             <w:rStyle w:val="Hyperlink"/>
           </w:rPr>
-          <w:t xml:space="preserve">8</w:t>
+          <w:t xml:space="preserve">9</w:t>
         </w:r>
       </w:hyperlink>
       <w:r>
@@ -592,13 +624,19 @@
         <w:pStyle w:val="BodyText"/>
       </w:pPr>
       <w:r>
-        <w:t xml:space="preserve">Benchmarks are central to that selection. Rebasing to an ACO’s own recent spending weakens its incentive to save,</w:t>
-      </w:r>
-      <w:r>
-        <w:t xml:space="preserve"> </w:t>
-      </w:r>
-      <w:r>
-        <w:t xml:space="preserve">and under earlier weights it rewarded higher spending just before a new agreement.</w:t>
+        <w:t xml:space="preserve">Benchmarks shape the program through 2 channels. The first is the incentive to save. Rebasing to an ACO’s own</w:t>
+      </w:r>
+      <w:r>
+        <w:t xml:space="preserve"> </w:t>
+      </w:r>
+      <w:r>
+        <w:t xml:space="preserve">recent spending weakens its incentive to save, and under earlier weights it rewarded higher spending just before a</w:t>
+      </w:r>
+      <w:r>
+        <w:t xml:space="preserve"> </w:t>
+      </w:r>
+      <w:r>
+        <w:t xml:space="preserve">new agreement;</w:t>
       </w:r>
       <w:r>
         <w:t xml:space="preserve">[</w:t>
@@ -608,7 +646,7 @@
           <w:rPr>
             <w:rStyle w:val="Hyperlink"/>
           </w:rPr>
-          <w:t xml:space="preserve">9</w:t>
+          <w:t xml:space="preserve">10</w:t>
         </w:r>
       </w:hyperlink>
       <w:r>
@@ -618,29 +656,83 @@
         <w:t xml:space="preserve"> </w:t>
       </w:r>
       <w:r>
-        <w:t xml:space="preserve">ACOs’ spending</w:t>
-      </w:r>
-      <w:r>
-        <w:t xml:space="preserve"> </w:t>
-      </w:r>
-      <w:r>
-        <w:t xml:space="preserve">varies widely relative to their regions even after risk adjustment, so moving benchmarks toward regional averages</w:t>
-      </w:r>
-      <w:r>
-        <w:t xml:space="preserve"> </w:t>
-      </w:r>
-      <w:r>
-        <w:t xml:space="preserve">shifts them unevenly.</w:t>
+        <w:t xml:space="preserve">this is the ratchet effect that arises whenever targets are set from past</w:t>
+      </w:r>
+      <w:r>
+        <w:t xml:space="preserve"> </w:t>
+      </w:r>
+      <w:r>
+        <w:t xml:space="preserve">performance.</w:t>
       </w:r>
       <w:r>
         <w:t xml:space="preserve">[</w:t>
       </w:r>
+      <w:hyperlink w:anchor="ref-weitzman1980">
+        <w:r>
+          <w:rPr>
+            <w:rStyle w:val="Hyperlink"/>
+          </w:rPr>
+          <w:t xml:space="preserve">11</w:t>
+        </w:r>
+      </w:hyperlink>
+      <w:r>
+        <w:t xml:space="preserve">]</w:t>
+      </w:r>
+      <w:r>
+        <w:t xml:space="preserve"> </w:t>
+      </w:r>
+      <w:r>
+        <w:t xml:space="preserve">In the MSSP, savings rates were higher in years whose spending did not enter a future</w:t>
+      </w:r>
+      <w:r>
+        <w:t xml:space="preserve"> </w:t>
+      </w:r>
+      <w:r>
+        <w:t xml:space="preserve">benchmark.</w:t>
+      </w:r>
+      <w:r>
+        <w:t xml:space="preserve">[</w:t>
+      </w:r>
+      <w:hyperlink w:anchor="ref-cappello2026">
+        <w:r>
+          <w:rPr>
+            <w:rStyle w:val="Hyperlink"/>
+          </w:rPr>
+          <w:t xml:space="preserve">12</w:t>
+        </w:r>
+      </w:hyperlink>
+      <w:r>
+        <w:t xml:space="preserve">]</w:t>
+      </w:r>
+    </w:p>
+    <w:p>
+      <w:pPr>
+        <w:pStyle w:val="BodyText"/>
+      </w:pPr>
+      <w:r>
+        <w:t xml:space="preserve">The second channel is selection: benchmark rules change which ACOs join, stay and take on risk. ACOs’ spending varies</w:t>
+      </w:r>
+      <w:r>
+        <w:t xml:space="preserve"> </w:t>
+      </w:r>
+      <w:r>
+        <w:t xml:space="preserve">widely relative to their regions even after risk adjustment, so moving benchmarks toward regional averages shifts them</w:t>
+      </w:r>
+      <w:r>
+        <w:t xml:space="preserve"> </w:t>
+      </w:r>
+      <w:r>
+        <w:t xml:space="preserve">unevenly.</w:t>
+      </w:r>
+      <w:r>
+        <w:t xml:space="preserve">[</w:t>
+      </w:r>
       <w:hyperlink w:anchor="ref-rose2016">
         <w:r>
           <w:rPr>
             <w:rStyle w:val="Hyperlink"/>
           </w:rPr>
-          <w:t xml:space="preserve">10</w:t>
+          <w:t xml:space="preserve">13</w:t>
         </w:r>
       </w:hyperlink>
       <w:r>
@@ -650,29 +742,69 @@
         <w:t xml:space="preserve"> </w:t>
       </w:r>
       <w:r>
-        <w:t xml:space="preserve">A structural analysis of the program found evidence of both forces: savings rates</w:t>
-      </w:r>
-      <w:r>
-        <w:t xml:space="preserve"> </w:t>
-      </w:r>
-      <w:r>
-        <w:t xml:space="preserve">were higher in years whose spending did not enter a future benchmark, and ACOs with a positive regional adjustment</w:t>
-      </w:r>
-      <w:r>
-        <w:t xml:space="preserve"> </w:t>
-      </w:r>
-      <w:r>
-        <w:t xml:space="preserve">were less likely to exit.</w:t>
+        <w:t xml:space="preserve">After regional spending entered benchmarks in 2017, participation shifted toward</w:t>
+      </w:r>
+      <w:r>
+        <w:t xml:space="preserve"> </w:t>
+      </w:r>
+      <w:r>
+        <w:t xml:space="preserve">providers whose spending was low relative to their region,</w:t>
       </w:r>
       <w:r>
         <w:t xml:space="preserve">[</w:t>
       </w:r>
+      <w:hyperlink w:anchor="ref-lyu2023">
+        <w:r>
+          <w:rPr>
+            <w:rStyle w:val="Hyperlink"/>
+          </w:rPr>
+          <w:t xml:space="preserve">14</w:t>
+        </w:r>
+      </w:hyperlink>
+      <w:r>
+        <w:t xml:space="preserve">]</w:t>
+      </w:r>
+      <w:r>
+        <w:t xml:space="preserve"> </w:t>
+      </w:r>
+      <w:r>
+        <w:t xml:space="preserve">ACOs whose effective benchmarks fell became</w:t>
+      </w:r>
+      <w:r>
+        <w:t xml:space="preserve"> </w:t>
+      </w:r>
+      <w:r>
+        <w:t xml:space="preserve">more likely to leave,</w:t>
+      </w:r>
+      <w:r>
+        <w:t xml:space="preserve">[</w:t>
+      </w:r>
+      <w:hyperlink w:anchor="ref-chen2025">
+        <w:r>
+          <w:rPr>
+            <w:rStyle w:val="Hyperlink"/>
+          </w:rPr>
+          <w:t xml:space="preserve">15</w:t>
+        </w:r>
+      </w:hyperlink>
+      <w:r>
+        <w:t xml:space="preserve">]</w:t>
+      </w:r>
+      <w:r>
+        <w:t xml:space="preserve"> </w:t>
+      </w:r>
+      <w:r>
+        <w:t xml:space="preserve">ACOs with a positive regional adjustment were less likely to exit,</w:t>
+      </w:r>
+      <w:r>
+        <w:t xml:space="preserve">[</w:t>
+      </w:r>
       <w:hyperlink w:anchor="ref-cappello2026">
         <w:r>
           <w:rPr>
             <w:rStyle w:val="Hyperlink"/>
           </w:rPr>
-          <w:t xml:space="preserve">11</w:t>
+          <w:t xml:space="preserve">12</w:t>
         </w:r>
       </w:hyperlink>
       <w:r>
@@ -682,23 +814,17 @@
         <w:t xml:space="preserve"> </w:t>
       </w:r>
       <w:r>
-        <w:t xml:space="preserve">After regional spending entered benchmarks in 2017, participation shifted toward</w:t>
-      </w:r>
-      <w:r>
-        <w:t xml:space="preserve"> </w:t>
-      </w:r>
-      <w:r>
-        <w:t xml:space="preserve">providers whose spending was low relative to their region,</w:t>
+        <w:t xml:space="preserve">and bonuses rose for ACOs across the efficiency spectrum.</w:t>
       </w:r>
       <w:r>
         <w:t xml:space="preserve">[</w:t>
       </w:r>
-      <w:hyperlink w:anchor="ref-lyu2023">
-        <w:r>
-          <w:rPr>
-            <w:rStyle w:val="Hyperlink"/>
-          </w:rPr>
-          <w:t xml:space="preserve">12</w:t>
+      <w:hyperlink w:anchor="ref-srivastava2026">
+        <w:r>
+          <w:rPr>
+            <w:rStyle w:val="Hyperlink"/>
+          </w:rPr>
+          <w:t xml:space="preserve">16</w:t>
         </w:r>
       </w:hyperlink>
       <w:r>
@@ -708,23 +834,23 @@
         <w:t xml:space="preserve"> </w:t>
       </w:r>
       <w:r>
-        <w:t xml:space="preserve">ACOs whose effective benchmarks fell became</w:t>
-      </w:r>
-      <w:r>
-        <w:t xml:space="preserve"> </w:t>
-      </w:r>
-      <w:r>
-        <w:t xml:space="preserve">more likely to leave,</w:t>
+        <w:t xml:space="preserve">Survival in</w:t>
+      </w:r>
+      <w:r>
+        <w:t xml:space="preserve"> </w:t>
+      </w:r>
+      <w:r>
+        <w:t xml:space="preserve">the program has been associated with earning bonuses, higher benchmarks and one-sided risk,</w:t>
       </w:r>
       <w:r>
         <w:t xml:space="preserve">[</w:t>
       </w:r>
-      <w:hyperlink w:anchor="ref-chen2025">
-        <w:r>
-          <w:rPr>
-            <w:rStyle w:val="Hyperlink"/>
-          </w:rPr>
-          <w:t xml:space="preserve">13</w:t>
+      <w:hyperlink w:anchor="ref-bleser2019">
+        <w:r>
+          <w:rPr>
+            <w:rStyle w:val="Hyperlink"/>
+          </w:rPr>
+          <w:t xml:space="preserve">17</w:t>
         </w:r>
       </w:hyperlink>
       <w:r>
@@ -734,17 +860,29 @@
         <w:t xml:space="preserve"> </w:t>
       </w:r>
       <w:r>
-        <w:t xml:space="preserve">and bonuses rose for ACOs across the efficiency spectrum.</w:t>
+        <w:t xml:space="preserve">and larger</w:t>
+      </w:r>
+      <w:r>
+        <w:t xml:space="preserve"> </w:t>
+      </w:r>
+      <w:r>
+        <w:t xml:space="preserve">ACOs, those with supporting organizations and better performers were more likely to switch to two-sided</w:t>
+      </w:r>
+      <w:r>
+        <w:t xml:space="preserve"> </w:t>
+      </w:r>
+      <w:r>
+        <w:t xml:space="preserve">risk.</w:t>
       </w:r>
       <w:r>
         <w:t xml:space="preserve">[</w:t>
       </w:r>
-      <w:hyperlink w:anchor="ref-srivastava2026">
-        <w:r>
-          <w:rPr>
-            <w:rStyle w:val="Hyperlink"/>
-          </w:rPr>
-          <w:t xml:space="preserve">14</w:t>
+      <w:hyperlink w:anchor="ref-zhu2023">
+        <w:r>
+          <w:rPr>
+            <w:rStyle w:val="Hyperlink"/>
+          </w:rPr>
+          <w:t xml:space="preserve">18</w:t>
         </w:r>
       </w:hyperlink>
       <w:r>
@@ -754,23 +892,23 @@
         <w:t xml:space="preserve"> </w:t>
       </w:r>
       <w:r>
-        <w:t xml:space="preserve">Survival in</w:t>
-      </w:r>
-      <w:r>
-        <w:t xml:space="preserve"> </w:t>
-      </w:r>
-      <w:r>
-        <w:t xml:space="preserve">the program has been associated with earning bonuses, higher benchmarks and one-sided risk,</w:t>
+        <w:t xml:space="preserve">The 2019 Pathways to Success rules, which shortened the time ACOs could stay in one-sided risk, were</w:t>
+      </w:r>
+      <w:r>
+        <w:t xml:space="preserve"> </w:t>
+      </w:r>
+      <w:r>
+        <w:t xml:space="preserve">followed by more exits than entries,</w:t>
       </w:r>
       <w:r>
         <w:t xml:space="preserve">[</w:t>
       </w:r>
-      <w:hyperlink w:anchor="ref-bleser2019">
-        <w:r>
-          <w:rPr>
-            <w:rStyle w:val="Hyperlink"/>
-          </w:rPr>
-          <w:t xml:space="preserve">15</w:t>
+      <w:hyperlink w:anchor="ref-ying2023">
+        <w:r>
+          <w:rPr>
+            <w:rStyle w:val="Hyperlink"/>
+          </w:rPr>
+          <w:t xml:space="preserve">19</w:t>
         </w:r>
       </w:hyperlink>
       <w:r>
@@ -780,29 +918,23 @@
         <w:t xml:space="preserve"> </w:t>
       </w:r>
       <w:r>
-        <w:t xml:space="preserve">and larger</w:t>
-      </w:r>
-      <w:r>
-        <w:t xml:space="preserve"> </w:t>
-      </w:r>
-      <w:r>
-        <w:t xml:space="preserve">ACOs, those with supporting organizations and better performers were more likely to switch to two-sided</w:t>
-      </w:r>
-      <w:r>
-        <w:t xml:space="preserve"> </w:t>
-      </w:r>
-      <w:r>
-        <w:t xml:space="preserve">risk.</w:t>
+        <w:t xml:space="preserve">by ACO leaders reassessing potential savings against</w:t>
+      </w:r>
+      <w:r>
+        <w:t xml:space="preserve"> </w:t>
+      </w:r>
+      <w:r>
+        <w:t xml:space="preserve">losses,</w:t>
       </w:r>
       <w:r>
         <w:t xml:space="preserve">[</w:t>
       </w:r>
-      <w:hyperlink w:anchor="ref-zhu2023">
-        <w:r>
-          <w:rPr>
-            <w:rStyle w:val="Hyperlink"/>
-          </w:rPr>
-          <w:t xml:space="preserve">16</w:t>
+      <w:hyperlink w:anchor="ref-ying2024">
+        <w:r>
+          <w:rPr>
+            <w:rStyle w:val="Hyperlink"/>
+          </w:rPr>
+          <w:t xml:space="preserve">20</w:t>
         </w:r>
       </w:hyperlink>
       <w:r>
@@ -812,23 +944,17 @@
         <w:t xml:space="preserve"> </w:t>
       </w:r>
       <w:r>
-        <w:t xml:space="preserve">The 2019 Pathways to Success rules, which shortened the time ACOs could stay in one-sided risk, were</w:t>
-      </w:r>
-      <w:r>
-        <w:t xml:space="preserve"> </w:t>
-      </w:r>
-      <w:r>
-        <w:t xml:space="preserve">followed by more exits than entries,</w:t>
+        <w:t xml:space="preserve">and by departures with projected costs to Medicare.</w:t>
       </w:r>
       <w:r>
         <w:t xml:space="preserve">[</w:t>
       </w:r>
-      <w:hyperlink w:anchor="ref-ying2023">
-        <w:r>
-          <w:rPr>
-            <w:rStyle w:val="Hyperlink"/>
-          </w:rPr>
-          <w:t xml:space="preserve">17</w:t>
+      <w:hyperlink w:anchor="ref-moloci2021">
+        <w:r>
+          <w:rPr>
+            <w:rStyle w:val="Hyperlink"/>
+          </w:rPr>
+          <w:t xml:space="preserve">21</w:t>
         </w:r>
       </w:hyperlink>
       <w:r>
@@ -838,23 +964,23 @@
         <w:t xml:space="preserve"> </w:t>
       </w:r>
       <w:r>
-        <w:t xml:space="preserve">by ACO leaders reassessing potential savings against</w:t>
-      </w:r>
-      <w:r>
-        <w:t xml:space="preserve"> </w:t>
-      </w:r>
-      <w:r>
-        <w:t xml:space="preserve">losses,</w:t>
+        <w:t xml:space="preserve">In a related model, most ACO</w:t>
+      </w:r>
+      <w:r>
+        <w:t xml:space="preserve"> </w:t>
+      </w:r>
+      <w:r>
+        <w:t xml:space="preserve">Investment Model ACOs exited once downside risk was required.</w:t>
       </w:r>
       <w:r>
         <w:t xml:space="preserve">[</w:t>
       </w:r>
-      <w:hyperlink w:anchor="ref-ying2024">
-        <w:r>
-          <w:rPr>
-            <w:rStyle w:val="Hyperlink"/>
-          </w:rPr>
-          <w:t xml:space="preserve">18</w:t>
+      <w:hyperlink w:anchor="ref-trombley2022">
+        <w:r>
+          <w:rPr>
+            <w:rStyle w:val="Hyperlink"/>
+          </w:rPr>
+          <w:t xml:space="preserve">22</w:t>
         </w:r>
       </w:hyperlink>
       <w:r>
@@ -864,17 +990,43 @@
         <w:t xml:space="preserve"> </w:t>
       </w:r>
       <w:r>
-        <w:t xml:space="preserve">and by departures with projected costs to Medicare.</w:t>
+        <w:t xml:space="preserve">This literature describes how benchmark</w:t>
+      </w:r>
+      <w:r>
+        <w:t xml:space="preserve"> </w:t>
+      </w:r>
+      <w:r>
+        <w:t xml:space="preserve">rules sort ACOs into joining, staying, leaving and taking on risk, and how rebasing weakens the incentive to save</w:t>
+      </w:r>
+      <w:r>
+        <w:t xml:space="preserve"> </w:t>
+      </w:r>
+      <w:r>
+        <w:t xml:space="preserve">within an agreement; it has not examined when ACOs choose to reset.</w:t>
+      </w:r>
+    </w:p>
+    <w:p>
+      <w:pPr>
+        <w:pStyle w:val="BodyText"/>
+      </w:pPr>
+      <w:r>
+        <w:t xml:space="preserve">The same rules allowed an ACO to end its agreement early and begin a new one, which resets the benchmark</w:t>
+      </w:r>
+      <w:r>
+        <w:t xml:space="preserve"> </w:t>
+      </w:r>
+      <w:r>
+        <w:t xml:space="preserve">early.</w:t>
       </w:r>
       <w:r>
         <w:t xml:space="preserve">[</w:t>
       </w:r>
-      <w:hyperlink w:anchor="ref-moloci2021">
-        <w:r>
-          <w:rPr>
-            <w:rStyle w:val="Hyperlink"/>
-          </w:rPr>
-          <w:t xml:space="preserve">19</w:t>
+      <w:hyperlink w:anchor="ref-cfr425">
+        <w:r>
+          <w:rPr>
+            <w:rStyle w:val="Hyperlink"/>
+          </w:rPr>
+          <w:t xml:space="preserve">1</w:t>
         </w:r>
       </w:hyperlink>
       <w:r>
@@ -884,23 +1036,23 @@
         <w:t xml:space="preserve"> </w:t>
       </w:r>
       <w:r>
-        <w:t xml:space="preserve">In a related model, most ACO</w:t>
-      </w:r>
-      <w:r>
-        <w:t xml:space="preserve"> </w:t>
-      </w:r>
-      <w:r>
-        <w:t xml:space="preserve">Investment Model ACOs exited once downside risk was required.</w:t>
+        <w:t xml:space="preserve">For an ACO in the BASIC track, renewal was also the only way into the ENHANCED track before its</w:t>
+      </w:r>
+      <w:r>
+        <w:t xml:space="preserve"> </w:t>
+      </w:r>
+      <w:r>
+        <w:t xml:space="preserve">agreement ended, because the 2018 rule bars moving from BASIC to ENHANCED within an agreement period;</w:t>
       </w:r>
       <w:r>
         <w:t xml:space="preserve">[</w:t>
       </w:r>
-      <w:hyperlink w:anchor="ref-trombley2022">
-        <w:r>
-          <w:rPr>
-            <w:rStyle w:val="Hyperlink"/>
-          </w:rPr>
-          <w:t xml:space="preserve">20</w:t>
+      <w:hyperlink w:anchor="ref-frpathways">
+        <w:r>
+          <w:rPr>
+            <w:rStyle w:val="Hyperlink"/>
+          </w:rPr>
+          <w:t xml:space="preserve">23</w:t>
         </w:r>
       </w:hyperlink>
       <w:r>
@@ -910,33 +1062,7 @@
         <w:t xml:space="preserve"> </w:t>
       </w:r>
       <w:r>
-        <w:t xml:space="preserve">This literature describes how benchmark</w:t>
-      </w:r>
-      <w:r>
-        <w:t xml:space="preserve"> </w:t>
-      </w:r>
-      <w:r>
-        <w:t xml:space="preserve">rules sort ACOs into joining, staying, leaving and taking on risk, and how rebasing weakens the incentive to save</w:t>
-      </w:r>
-      <w:r>
-        <w:t xml:space="preserve"> </w:t>
-      </w:r>
-      <w:r>
-        <w:t xml:space="preserve">within an agreement; it has not examined when ACOs choose to reset.</w:t>
-      </w:r>
-    </w:p>
-    <w:p>
-      <w:pPr>
-        <w:pStyle w:val="BodyText"/>
-      </w:pPr>
-      <w:r>
-        <w:t xml:space="preserve">The same rules allowed an ACO to end its agreement early and begin a new one, which resets the benchmark</w:t>
-      </w:r>
-      <w:r>
-        <w:t xml:space="preserve"> </w:t>
-      </w:r>
-      <w:r>
-        <w:t xml:space="preserve">early.</w:t>
+        <w:t xml:space="preserve">ENHANCED shares 75% of savings, against at most 50% in BASIC.</w:t>
       </w:r>
       <w:r>
         <w:t xml:space="preserve">[</w:t>
@@ -956,23 +1082,23 @@
         <w:t xml:space="preserve"> </w:t>
       </w:r>
       <w:r>
-        <w:t xml:space="preserve">For an ACO in the BASIC track, renewal was also the only way into the ENHANCED track before its</w:t>
-      </w:r>
-      <w:r>
-        <w:t xml:space="preserve"> </w:t>
-      </w:r>
-      <w:r>
-        <w:t xml:space="preserve">agreement ended, because the 2018 rule bars moving from BASIC to ENHANCED within an agreement period;</w:t>
+        <w:t xml:space="preserve">Of the 334 ACOs whose agreements began July 1,</w:t>
+      </w:r>
+      <w:r>
+        <w:t xml:space="preserve"> </w:t>
+      </w:r>
+      <w:r>
+        <w:t xml:space="preserve">2019 or January 1, 2020, 29 ended them early and began new agreements on January 1, 2022.</w:t>
       </w:r>
       <w:r>
         <w:t xml:space="preserve">[</w:t>
       </w:r>
-      <w:hyperlink w:anchor="ref-frpathways">
-        <w:r>
-          <w:rPr>
-            <w:rStyle w:val="Hyperlink"/>
-          </w:rPr>
-          <w:t xml:space="preserve">21</w:t>
+      <w:hyperlink w:anchor="ref-dataacos">
+        <w:r>
+          <w:rPr>
+            <w:rStyle w:val="Hyperlink"/>
+          </w:rPr>
+          <w:t xml:space="preserve">24</w:t>
         </w:r>
       </w:hyperlink>
       <w:r>
@@ -982,17 +1108,29 @@
         <w:t xml:space="preserve"> </w:t>
       </w:r>
       <w:r>
-        <w:t xml:space="preserve">ENHANCED shares 75% of savings, against at most 50% in BASIC.</w:t>
+        <w:t xml:space="preserve">An industry</w:t>
+      </w:r>
+      <w:r>
+        <w:t xml:space="preserve"> </w:t>
+      </w:r>
+      <w:r>
+        <w:t xml:space="preserve">report found that ACOs rebasing early in 2022 had higher gross savings rates beforehand than ACOs that did not, and</w:t>
+      </w:r>
+      <w:r>
+        <w:t xml:space="preserve"> </w:t>
+      </w:r>
+      <w:r>
+        <w:t xml:space="preserve">that the earlier incumbents among them moved from BASIC to ENHANCED,</w:t>
       </w:r>
       <w:r>
         <w:t xml:space="preserve">[</w:t>
       </w:r>
-      <w:hyperlink w:anchor="ref-cfr425">
-        <w:r>
-          <w:rPr>
-            <w:rStyle w:val="Hyperlink"/>
-          </w:rPr>
-          <w:t xml:space="preserve">1</w:t>
+      <w:hyperlink w:anchor="ref-milliman2024">
+        <w:r>
+          <w:rPr>
+            <w:rStyle w:val="Hyperlink"/>
+          </w:rPr>
+          <w:t xml:space="preserve">25</w:t>
         </w:r>
       </w:hyperlink>
       <w:r>
@@ -1002,81 +1140,23 @@
         <w:t xml:space="preserve"> </w:t>
       </w:r>
       <w:r>
-        <w:t xml:space="preserve">Of the 334 ACOs whose agreements began July 1,</w:t>
-      </w:r>
-      <w:r>
-        <w:t xml:space="preserve"> </w:t>
-      </w:r>
-      <w:r>
-        <w:t xml:space="preserve">2019 or January 1, 2020, 29 ended them early and began new agreements on January 1, 2022.</w:t>
+        <w:t xml:space="preserve">and consulting analyses model the</w:t>
+      </w:r>
+      <w:r>
+        <w:t xml:space="preserve"> </w:t>
+      </w:r>
+      <w:r>
+        <w:t xml:space="preserve">choice for individual ACOs.</w:t>
       </w:r>
       <w:r>
         <w:t xml:space="preserve">[</w:t>
       </w:r>
-      <w:hyperlink w:anchor="ref-dataacos">
-        <w:r>
-          <w:rPr>
-            <w:rStyle w:val="Hyperlink"/>
-          </w:rPr>
-          <w:t xml:space="preserve">22</w:t>
-        </w:r>
-      </w:hyperlink>
-      <w:r>
-        <w:t xml:space="preserve">]</w:t>
-      </w:r>
-      <w:r>
-        <w:t xml:space="preserve"> </w:t>
-      </w:r>
-      <w:r>
-        <w:t xml:space="preserve">An industry</w:t>
-      </w:r>
-      <w:r>
-        <w:t xml:space="preserve"> </w:t>
-      </w:r>
-      <w:r>
-        <w:t xml:space="preserve">report found that ACOs rebasing early in 2022 had higher gross savings rates beforehand than ACOs that did not, and</w:t>
-      </w:r>
-      <w:r>
-        <w:t xml:space="preserve"> </w:t>
-      </w:r>
-      <w:r>
-        <w:t xml:space="preserve">that the earlier incumbents among them moved from BASIC to ENHANCED,</w:t>
-      </w:r>
-      <w:r>
-        <w:t xml:space="preserve">[</w:t>
-      </w:r>
-      <w:hyperlink w:anchor="ref-milliman2024">
-        <w:r>
-          <w:rPr>
-            <w:rStyle w:val="Hyperlink"/>
-          </w:rPr>
-          <w:t xml:space="preserve">23</w:t>
-        </w:r>
-      </w:hyperlink>
-      <w:r>
-        <w:t xml:space="preserve">]</w:t>
-      </w:r>
-      <w:r>
-        <w:t xml:space="preserve"> </w:t>
-      </w:r>
-      <w:r>
-        <w:t xml:space="preserve">and consulting analyses model the</w:t>
-      </w:r>
-      <w:r>
-        <w:t xml:space="preserve"> </w:t>
-      </w:r>
-      <w:r>
-        <w:t xml:space="preserve">choice for individual ACOs.</w:t>
-      </w:r>
-      <w:r>
-        <w:t xml:space="preserve">[</w:t>
-      </w:r>
       <w:hyperlink w:anchor="ref-milliman2025">
         <w:r>
           <w:rPr>
             <w:rStyle w:val="Hyperlink"/>
           </w:rPr>
-          <w:t xml:space="preserve">24</w:t>
+          <w:t xml:space="preserve">26</w:t>
         </w:r>
       </w:hyperlink>
       <w:r>
@@ -1193,7 +1273,19 @@
         <w:t xml:space="preserve"> </w:t>
       </w:r>
       <w:r>
-        <w:t xml:space="preserve">spending growth differed afterward. The analysis plan, hypotheses, decision rules and code were registered before</w:t>
+        <w:t xml:space="preserve">spending growth differed afterward. In doing so it tests whether the selection found for joining and leaving extends</w:t>
+      </w:r>
+      <w:r>
+        <w:t xml:space="preserve"> </w:t>
+      </w:r>
+      <w:r>
+        <w:t xml:space="preserve">to when ACOs reset, and whether the intuitive account of early renewal, resetting to raise the benchmark, holds on</w:t>
+      </w:r>
+      <w:r>
+        <w:t xml:space="preserve"> </w:t>
+      </w:r>
+      <w:r>
+        <w:t xml:space="preserve">average. The analysis plan, hypotheses, decision rules and code were registered before</w:t>
       </w:r>
       <w:r>
         <w:t xml:space="preserve"> </w:t>
@@ -1209,7 +1301,7 @@
           <w:rPr>
             <w:rStyle w:val="Hyperlink"/>
           </w:rPr>
-          <w:t xml:space="preserve">25</w:t>
+          <w:t xml:space="preserve">27</w:t>
         </w:r>
       </w:hyperlink>
       <w:r>
@@ -1268,7 +1360,7 @@
           <w:rPr>
             <w:rStyle w:val="Hyperlink"/>
           </w:rPr>
-          <w:t xml:space="preserve">26</w:t>
+          <w:t xml:space="preserve">28</w:t>
         </w:r>
       </w:hyperlink>
       <w:r>
@@ -1294,7 +1386,7 @@
           <w:rPr>
             <w:rStyle w:val="Hyperlink"/>
           </w:rPr>
-          <w:t xml:space="preserve">25</w:t>
+          <w:t xml:space="preserve">27</w:t>
         </w:r>
       </w:hyperlink>
       <w:r>
@@ -1305,7 +1397,7 @@
           <w:rPr>
             <w:rStyle w:val="Hyperlink"/>
           </w:rPr>
-          <w:t xml:space="preserve">27</w:t>
+          <w:t xml:space="preserve">29</w:t>
         </w:r>
       </w:hyperlink>
       <w:r>
@@ -1415,7 +1507,7 @@
           <w:rPr>
             <w:rStyle w:val="Hyperlink"/>
           </w:rPr>
-          <w:t xml:space="preserve">22</w:t>
+          <w:t xml:space="preserve">24</w:t>
         </w:r>
       </w:hyperlink>
       <w:r>
@@ -1426,7 +1518,7 @@
           <w:rPr>
             <w:rStyle w:val="Hyperlink"/>
           </w:rPr>
-          <w:t xml:space="preserve">28</w:t>
+          <w:t xml:space="preserve">30</w:t>
         </w:r>
       </w:hyperlink>
       <w:r>
@@ -1437,7 +1529,7 @@
           <w:rPr>
             <w:rStyle w:val="Hyperlink"/>
           </w:rPr>
-          <w:t xml:space="preserve">30</w:t>
+          <w:t xml:space="preserve">32</w:t>
         </w:r>
       </w:hyperlink>
       <w:r>
@@ -1481,7 +1573,7 @@
           <w:rPr>
             <w:rStyle w:val="Hyperlink"/>
           </w:rPr>
-          <w:t xml:space="preserve">31</w:t>
+          <w:t xml:space="preserve">33</w:t>
         </w:r>
       </w:hyperlink>
       <w:r>
@@ -1507,7 +1599,7 @@
           <w:rPr>
             <w:rStyle w:val="Hyperlink"/>
           </w:rPr>
-          <w:t xml:space="preserve">32</w:t>
+          <w:t xml:space="preserve">34</w:t>
         </w:r>
       </w:hyperlink>
       <w:r>
@@ -1654,7 +1746,7 @@
           <w:rPr>
             <w:rStyle w:val="Hyperlink"/>
           </w:rPr>
-          <w:t xml:space="preserve">2</w:t>
+          <w:t xml:space="preserve">3</w:t>
         </w:r>
       </w:hyperlink>
       <w:r>
@@ -1704,7 +1796,7 @@
           <w:rPr>
             <w:rStyle w:val="Hyperlink"/>
           </w:rPr>
-          <w:t xml:space="preserve">33</w:t>
+          <w:t xml:space="preserve">35</w:t>
         </w:r>
       </w:hyperlink>
       <w:r>
@@ -2256,7 +2348,7 @@
           <w:rPr>
             <w:rStyle w:val="Hyperlink"/>
           </w:rPr>
-          <w:t xml:space="preserve">34</w:t>
+          <w:t xml:space="preserve">36</w:t>
         </w:r>
       </w:hyperlink>
       <w:r>
@@ -2487,7 +2579,7 @@
           <w:rPr>
             <w:rStyle w:val="Hyperlink"/>
           </w:rPr>
-          <w:t xml:space="preserve">35</w:t>
+          <w:t xml:space="preserve">37</w:t>
         </w:r>
       </w:hyperlink>
       <w:r>
@@ -2697,7 +2789,7 @@
           <w:rPr>
             <w:rStyle w:val="Hyperlink"/>
           </w:rPr>
-          <w:t xml:space="preserve">36</w:t>
+          <w:t xml:space="preserve">38</w:t>
         </w:r>
       </w:hyperlink>
       <w:r>
@@ -2769,7 +2861,7 @@
           <w:rPr>
             <w:rStyle w:val="Hyperlink"/>
           </w:rPr>
-          <w:t xml:space="preserve">37</w:t>
+          <w:t xml:space="preserve">39</w:t>
         </w:r>
       </w:hyperlink>
       <w:r>
@@ -2789,7 +2881,7 @@
           <w:rPr>
             <w:rStyle w:val="Hyperlink"/>
           </w:rPr>
-          <w:t xml:space="preserve">38</w:t>
+          <w:t xml:space="preserve">40</w:t>
         </w:r>
       </w:hyperlink>
       <w:r>
@@ -2815,7 +2907,7 @@
           <w:rPr>
             <w:rStyle w:val="Hyperlink"/>
           </w:rPr>
-          <w:t xml:space="preserve">39</w:t>
+          <w:t xml:space="preserve">41</w:t>
         </w:r>
       </w:hyperlink>
       <w:r>
@@ -2886,7 +2978,7 @@
           <w:rPr>
             <w:rStyle w:val="Hyperlink"/>
           </w:rPr>
-          <w:t xml:space="preserve">40</w:t>
+          <w:t xml:space="preserve">42</w:t>
         </w:r>
       </w:hyperlink>
       <w:r>
@@ -2906,7 +2998,7 @@
           <w:rPr>
             <w:rStyle w:val="Hyperlink"/>
           </w:rPr>
-          <w:t xml:space="preserve">41</w:t>
+          <w:t xml:space="preserve">43</w:t>
         </w:r>
       </w:hyperlink>
       <w:r>
@@ -2917,7 +3009,7 @@
           <w:rPr>
             <w:rStyle w:val="Hyperlink"/>
           </w:rPr>
-          <w:t xml:space="preserve">42</w:t>
+          <w:t xml:space="preserve">44</w:t>
         </w:r>
       </w:hyperlink>
       <w:r>
@@ -2961,7 +3053,7 @@
           <w:rPr>
             <w:rStyle w:val="Hyperlink"/>
           </w:rPr>
-          <w:t xml:space="preserve">43</w:t>
+          <w:t xml:space="preserve">45</w:t>
         </w:r>
       </w:hyperlink>
       <w:r>
@@ -3089,7 +3181,7 @@
           <w:rPr>
             <w:rStyle w:val="Hyperlink"/>
           </w:rPr>
-          <w:t xml:space="preserve">44</w:t>
+          <w:t xml:space="preserve">46</w:t>
         </w:r>
       </w:hyperlink>
       <w:r>
@@ -3115,7 +3207,7 @@
           <w:rPr>
             <w:rStyle w:val="Hyperlink"/>
           </w:rPr>
-          <w:t xml:space="preserve">45</w:t>
+          <w:t xml:space="preserve">47</w:t>
         </w:r>
       </w:hyperlink>
       <w:r>
@@ -3141,7 +3233,7 @@
           <w:rPr>
             <w:rStyle w:val="Hyperlink"/>
           </w:rPr>
-          <w:t xml:space="preserve">46</w:t>
+          <w:t xml:space="preserve">48</w:t>
         </w:r>
       </w:hyperlink>
       <w:r>
@@ -3179,7 +3271,7 @@
           <w:rPr>
             <w:rStyle w:val="Hyperlink"/>
           </w:rPr>
-          <w:t xml:space="preserve">47</w:t>
+          <w:t xml:space="preserve">49</w:t>
         </w:r>
       </w:hyperlink>
       <w:r>
@@ -3196,7 +3288,7 @@
           <w:rPr>
             <w:rStyle w:val="Hyperlink"/>
           </w:rPr>
-          <w:t xml:space="preserve">48</w:t>
+          <w:t xml:space="preserve">50</w:t>
         </w:r>
       </w:hyperlink>
       <w:r>
@@ -3412,7 +3504,7 @@
           <w:rPr>
             <w:rStyle w:val="Hyperlink"/>
           </w:rPr>
-          <w:t xml:space="preserve">49</w:t>
+          <w:t xml:space="preserve">51</w:t>
         </w:r>
       </w:hyperlink>
       <w:r>
@@ -3432,7 +3524,7 @@
           <w:rPr>
             <w:rStyle w:val="Hyperlink"/>
           </w:rPr>
-          <w:t xml:space="preserve">50</w:t>
+          <w:t xml:space="preserve">52</w:t>
         </w:r>
       </w:hyperlink>
       <w:r>
@@ -3458,7 +3550,7 @@
           <w:rPr>
             <w:rStyle w:val="Hyperlink"/>
           </w:rPr>
-          <w:t xml:space="preserve">51</w:t>
+          <w:t xml:space="preserve">53</w:t>
         </w:r>
       </w:hyperlink>
       <w:r>
@@ -3496,7 +3588,7 @@
           <w:rPr>
             <w:rStyle w:val="Hyperlink"/>
           </w:rPr>
-          <w:t xml:space="preserve">52</w:t>
+          <w:t xml:space="preserve">54</w:t>
         </w:r>
       </w:hyperlink>
       <w:r>
@@ -3516,7 +3608,7 @@
           <w:rPr>
             <w:rStyle w:val="Hyperlink"/>
           </w:rPr>
-          <w:t xml:space="preserve">53</w:t>
+          <w:t xml:space="preserve">55</w:t>
         </w:r>
       </w:hyperlink>
       <w:r>
@@ -3542,7 +3634,7 @@
           <w:rPr>
             <w:rStyle w:val="Hyperlink"/>
           </w:rPr>
-          <w:t xml:space="preserve">54</w:t>
+          <w:t xml:space="preserve">56</w:t>
         </w:r>
       </w:hyperlink>
       <w:r>
@@ -3562,7 +3654,7 @@
           <w:rPr>
             <w:rStyle w:val="Hyperlink"/>
           </w:rPr>
-          <w:t xml:space="preserve">55</w:t>
+          <w:t xml:space="preserve">57</w:t>
         </w:r>
       </w:hyperlink>
       <w:r>
@@ -3588,7 +3680,7 @@
           <w:rPr>
             <w:rStyle w:val="Hyperlink"/>
           </w:rPr>
-          <w:t xml:space="preserve">56</w:t>
+          <w:t xml:space="preserve">58</w:t>
         </w:r>
       </w:hyperlink>
       <w:r>
@@ -3723,7 +3815,7 @@
           <w:rPr>
             <w:rStyle w:val="Hyperlink"/>
           </w:rPr>
-          <w:t xml:space="preserve">57</w:t>
+          <w:t xml:space="preserve">59</w:t>
         </w:r>
       </w:hyperlink>
       <w:r>
@@ -6313,7 +6405,7 @@
           <w:rPr>
             <w:rStyle w:val="Hyperlink"/>
           </w:rPr>
-          <w:t xml:space="preserve">58</w:t>
+          <w:t xml:space="preserve">60</w:t>
         </w:r>
       </w:hyperlink>
       <w:r>
@@ -8299,6 +8391,64 @@
           <w:rPr>
             <w:rStyle w:val="Hyperlink"/>
           </w:rPr>
+          <w:t xml:space="preserve">14</w:t>
+        </w:r>
+      </w:hyperlink>
+      <w:r>
+        <w:t xml:space="preserve">]</w:t>
+      </w:r>
+      <w:r>
+        <w:t xml:space="preserve"> </w:t>
+      </w:r>
+      <w:r>
+        <w:t xml:space="preserve">and ACOs whose effective benchmarks fell were more likely to leave.</w:t>
+      </w:r>
+      <w:r>
+        <w:t xml:space="preserve">[</w:t>
+      </w:r>
+      <w:hyperlink w:anchor="ref-chen2025">
+        <w:r>
+          <w:rPr>
+            <w:rStyle w:val="Hyperlink"/>
+          </w:rPr>
+          <w:t xml:space="preserve">15</w:t>
+        </w:r>
+      </w:hyperlink>
+      <w:r>
+        <w:t xml:space="preserve">]</w:t>
+      </w:r>
+      <w:r>
+        <w:t xml:space="preserve"> </w:t>
+      </w:r>
+      <w:r>
+        <w:t xml:space="preserve">A dissertation modeling MSSP</w:t>
+      </w:r>
+      <w:r>
+        <w:t xml:space="preserve"> </w:t>
+      </w:r>
+      <w:r>
+        <w:t xml:space="preserve">participation found both effects of the benchmark rules: savings rates were 40% higher in years whose spending did</w:t>
+      </w:r>
+      <w:r>
+        <w:t xml:space="preserve"> </w:t>
+      </w:r>
+      <w:r>
+        <w:t xml:space="preserve">not enter rebasing, a ratchet effect, and ACOs with a positive regional adjustment were about 70% less likely to exit</w:t>
+      </w:r>
+      <w:r>
+        <w:t xml:space="preserve"> </w:t>
+      </w:r>
+      <w:r>
+        <w:t xml:space="preserve">than those with a negative one.</w:t>
+      </w:r>
+      <w:r>
+        <w:t xml:space="preserve">[</w:t>
+      </w:r>
+      <w:hyperlink w:anchor="ref-cappello2026">
+        <w:r>
+          <w:rPr>
+            <w:rStyle w:val="Hyperlink"/>
+          </w:rPr>
           <w:t xml:space="preserve">12</w:t>
         </w:r>
       </w:hyperlink>
@@ -8309,12 +8459,144 @@
         <w:t xml:space="preserve"> </w:t>
       </w:r>
       <w:r>
-        <w:t xml:space="preserve">and ACOs whose effective benchmarks fell were more likely to leave.</w:t>
+        <w:t xml:space="preserve">Here the choice is when to reset rather than whether to join or leave,</w:t>
+      </w:r>
+      <w:r>
+        <w:t xml:space="preserve"> </w:t>
+      </w:r>
+      <w:r>
+        <w:t xml:space="preserve">and early renewers had, on average, more room under their regions’ spending: the ACOs that chose an early reset were</w:t>
+      </w:r>
+      <w:r>
+        <w:t xml:space="preserve"> </w:t>
+      </w:r>
+      <w:r>
+        <w:t xml:space="preserve">those the regional adjustment favored. An industry analysis of the same rebasing cohort found that ACOs rebasing early in 2022 had higher gross</w:t>
+      </w:r>
+      <w:r>
+        <w:t xml:space="preserve"> </w:t>
+      </w:r>
+      <w:r>
+        <w:t xml:space="preserve">savings rates beforehand and that the earlier incumbents among them moved to ENHANCED,</w:t>
       </w:r>
       <w:r>
         <w:t xml:space="preserve">[</w:t>
       </w:r>
-      <w:hyperlink w:anchor="ref-chen2025">
+      <w:hyperlink w:anchor="ref-milliman2024">
+        <w:r>
+          <w:rPr>
+            <w:rStyle w:val="Hyperlink"/>
+          </w:rPr>
+          <w:t xml:space="preserve">25</w:t>
+        </w:r>
+      </w:hyperlink>
+      <w:r>
+        <w:t xml:space="preserve">]</w:t>
+      </w:r>
+      <w:r>
+        <w:t xml:space="preserve"> </w:t>
+      </w:r>
+      <w:r>
+        <w:t xml:space="preserve">consistent with</w:t>
+      </w:r>
+      <w:r>
+        <w:t xml:space="preserve"> </w:t>
+      </w:r>
+      <w:r>
+        <w:t xml:space="preserve">H1 and the BASIC-level association here. Beyond that analysis, this study rebuilt the reset benchmark and validated it</w:t>
+      </w:r>
+      <w:r>
+        <w:t xml:space="preserve"> </w:t>
+      </w:r>
+      <w:r>
+        <w:t xml:space="preserve">against CMS’s, separated its own-spending and regional parts, modeled the decision within the BASIC track and followed</w:t>
+      </w:r>
+      <w:r>
+        <w:t xml:space="preserve"> </w:t>
+      </w:r>
+      <w:r>
+        <w:t xml:space="preserve">spending afterward, under a preregistered plan. The finding that early renewers were savers also fits reports that ACOs earning bonuses survived longer in the</w:t>
+      </w:r>
+      <w:r>
+        <w:t xml:space="preserve"> </w:t>
+      </w:r>
+      <w:r>
+        <w:t xml:space="preserve">program</w:t>
+      </w:r>
+      <w:r>
+        <w:t xml:space="preserve">[</w:t>
+      </w:r>
+      <w:hyperlink w:anchor="ref-bleser2019">
+        <w:r>
+          <w:rPr>
+            <w:rStyle w:val="Hyperlink"/>
+          </w:rPr>
+          <w:t xml:space="preserve">17</w:t>
+        </w:r>
+      </w:hyperlink>
+      <w:r>
+        <w:t xml:space="preserve">]</w:t>
+      </w:r>
+      <w:r>
+        <w:t xml:space="preserve"> </w:t>
+      </w:r>
+      <w:r>
+        <w:t xml:space="preserve">and, with borderline precision, that ACOs that had achieved savings were more likely to stay</w:t>
+      </w:r>
+      <w:r>
+        <w:t xml:space="preserve"> </w:t>
+      </w:r>
+      <w:r>
+        <w:t xml:space="preserve">after the 2019 rules.</w:t>
+      </w:r>
+      <w:r>
+        <w:t xml:space="preserve">[</w:t>
+      </w:r>
+      <w:hyperlink w:anchor="ref-ying2023">
+        <w:r>
+          <w:rPr>
+            <w:rStyle w:val="Hyperlink"/>
+          </w:rPr>
+          <w:t xml:space="preserve">19</w:t>
+        </w:r>
+      </w:hyperlink>
+      <w:r>
+        <w:t xml:space="preserve">]</w:t>
+      </w:r>
+      <w:r>
+        <w:t xml:space="preserve"> </w:t>
+      </w:r>
+      <w:r>
+        <w:t xml:space="preserve">The same success, however, meant that the own-spending part of a reset would</w:t>
+      </w:r>
+      <w:r>
+        <w:t xml:space="preserve"> </w:t>
+      </w:r>
+      <w:r>
+        <w:t xml:space="preserve">have cut their benchmarks. The intuitive account that ACOs renewed early to get a higher benchmark therefore does not</w:t>
+      </w:r>
+      <w:r>
+        <w:t xml:space="preserve"> </w:t>
+      </w:r>
+      <w:r>
+        <w:t xml:space="preserve">describe them on average, and CMS’s published 2022 benchmarks, examined post hoc, agree.</w:t>
+      </w:r>
+      <w:r>
+        <w:t xml:space="preserve"> </w:t>
+      </w:r>
+      <w:r>
+        <w:t xml:space="preserve">That the size of the regional difference doubled without case-mix adjustment is consistent with evidence that</w:t>
+      </w:r>
+      <w:r>
+        <w:t xml:space="preserve"> </w:t>
+      </w:r>
+      <w:r>
+        <w:t xml:space="preserve">comparisons of ACOs with their regions depend heavily on risk adjustment.</w:t>
+      </w:r>
+      <w:r>
+        <w:t xml:space="preserve">[</w:t>
+      </w:r>
+      <w:hyperlink w:anchor="ref-rose2016">
         <w:r>
           <w:rPr>
             <w:rStyle w:val="Hyperlink"/>
@@ -8329,35 +8611,23 @@
         <w:t xml:space="preserve"> </w:t>
       </w:r>
       <w:r>
-        <w:t xml:space="preserve">A dissertation modeling MSSP</w:t>
-      </w:r>
-      <w:r>
-        <w:t xml:space="preserve"> </w:t>
-      </w:r>
-      <w:r>
-        <w:t xml:space="preserve">participation found both effects of the benchmark rules: savings rates were 40% higher in years whose spending did</w:t>
-      </w:r>
-      <w:r>
-        <w:t xml:space="preserve"> </w:t>
-      </w:r>
-      <w:r>
-        <w:t xml:space="preserve">not enter rebasing, a ratchet effect, and ACOs with a positive regional adjustment were about 70% less likely to exit</w:t>
-      </w:r>
-      <w:r>
-        <w:t xml:space="preserve"> </w:t>
-      </w:r>
-      <w:r>
-        <w:t xml:space="preserve">than those with a negative one.</w:t>
+        <w:t xml:space="preserve">The concern that rebasing rewards</w:t>
+      </w:r>
+      <w:r>
+        <w:t xml:space="preserve"> </w:t>
+      </w:r>
+      <w:r>
+        <w:t xml:space="preserve">higher spending before a new agreement</w:t>
       </w:r>
       <w:r>
         <w:t xml:space="preserve">[</w:t>
       </w:r>
-      <w:hyperlink w:anchor="ref-cappello2026">
-        <w:r>
-          <w:rPr>
-            <w:rStyle w:val="Hyperlink"/>
-          </w:rPr>
-          <w:t xml:space="preserve">11</w:t>
+      <w:hyperlink w:anchor="ref-douven2015">
+        <w:r>
+          <w:rPr>
+            <w:rStyle w:val="Hyperlink"/>
+          </w:rPr>
+          <w:t xml:space="preserve">10</w:t>
         </w:r>
       </w:hyperlink>
       <w:r>
@@ -8367,35 +8637,23 @@
         <w:t xml:space="preserve"> </w:t>
       </w:r>
       <w:r>
-        <w:t xml:space="preserve">Here the choice is when to reset rather than whether to join or leave,</w:t>
-      </w:r>
-      <w:r>
-        <w:t xml:space="preserve"> </w:t>
-      </w:r>
-      <w:r>
-        <w:t xml:space="preserve">and early renewers had, on average, more room under their regions’ spending: the ACOs that chose an early reset were</w:t>
-      </w:r>
-      <w:r>
-        <w:t xml:space="preserve"> </w:t>
-      </w:r>
-      <w:r>
-        <w:t xml:space="preserve">those the regional adjustment favored. An industry analysis of the same rebasing cohort found that ACOs rebasing early in 2022 had higher gross</w:t>
-      </w:r>
-      <w:r>
-        <w:t xml:space="preserve"> </w:t>
-      </w:r>
-      <w:r>
-        <w:t xml:space="preserve">savings rates beforehand and that the earlier incumbents among them moved to ENHANCED,</w:t>
+        <w:t xml:space="preserve">could be neither confirmed nor excluded here, and the costs to</w:t>
+      </w:r>
+      <w:r>
+        <w:t xml:space="preserve"> </w:t>
+      </w:r>
+      <w:r>
+        <w:t xml:space="preserve">Medicare of early renewal, which earlier work estimated for departures,</w:t>
       </w:r>
       <w:r>
         <w:t xml:space="preserve">[</w:t>
       </w:r>
-      <w:hyperlink w:anchor="ref-milliman2024">
-        <w:r>
-          <w:rPr>
-            <w:rStyle w:val="Hyperlink"/>
-          </w:rPr>
-          <w:t xml:space="preserve">23</w:t>
+      <w:hyperlink w:anchor="ref-moloci2021">
+        <w:r>
+          <w:rPr>
+            <w:rStyle w:val="Hyperlink"/>
+          </w:rPr>
+          <w:t xml:space="preserve">21</w:t>
         </w:r>
       </w:hyperlink>
       <w:r>
@@ -8405,209 +8663,43 @@
         <w:t xml:space="preserve"> </w:t>
       </w:r>
       <w:r>
-        <w:t xml:space="preserve">consistent with</w:t>
-      </w:r>
-      <w:r>
-        <w:t xml:space="preserve"> </w:t>
-      </w:r>
-      <w:r>
-        <w:t xml:space="preserve">H1 and the BASIC-level association here. Beyond that analysis, this study rebuilt the reset benchmark and validated it</w:t>
-      </w:r>
-      <w:r>
-        <w:t xml:space="preserve"> </w:t>
-      </w:r>
-      <w:r>
-        <w:t xml:space="preserve">against CMS’s, separated its own-spending and regional parts, modeled the decision within the BASIC track and followed</w:t>
-      </w:r>
-      <w:r>
-        <w:t xml:space="preserve"> </w:t>
-      </w:r>
-      <w:r>
-        <w:t xml:space="preserve">spending afterward, under a preregistered plan. The finding that early renewers were savers also fits reports that ACOs earning bonuses survived longer in the</w:t>
-      </w:r>
-      <w:r>
-        <w:t xml:space="preserve"> </w:t>
-      </w:r>
-      <w:r>
-        <w:t xml:space="preserve">program</w:t>
+        <w:t xml:space="preserve">were not estimated.</w:t>
+      </w:r>
+    </w:p>
+    <w:p>
+      <w:pPr>
+        <w:pStyle w:val="BodyText"/>
+      </w:pPr>
+      <w:r>
+        <w:t xml:space="preserve">The association with a higher BASIC level bears on the sharing-rate motive at least as much as on the reset motive.</w:t>
+      </w:r>
+      <w:r>
+        <w:t xml:space="preserve"> </w:t>
+      </w:r>
+      <w:r>
+        <w:t xml:space="preserve">In these data renewing early and moving to ENHANCED were one choice: 26 of the 27 BASIC-track early renewers moved to ENHANCED, and the rules let no stayer do so. ACOs already bearing two-sided risk at Level E faced a short step to ENHANCED’s 75%</w:t>
+      </w:r>
+      <w:r>
+        <w:t xml:space="preserve"> </w:t>
+      </w:r>
+      <w:r>
+        <w:t xml:space="preserve">sharing rate. Because ACOs partly choose their BASIC level, and ACOs experienced with performance-based risk could</w:t>
+      </w:r>
+      <w:r>
+        <w:t xml:space="preserve"> </w:t>
+      </w:r>
+      <w:r>
+        <w:t xml:space="preserve">enter only Level E or ENHANCED,</w:t>
       </w:r>
       <w:r>
         <w:t xml:space="preserve">[</w:t>
       </w:r>
-      <w:hyperlink w:anchor="ref-bleser2019">
-        <w:r>
-          <w:rPr>
-            <w:rStyle w:val="Hyperlink"/>
-          </w:rPr>
-          <w:t xml:space="preserve">15</w:t>
-        </w:r>
-      </w:hyperlink>
-      <w:r>
-        <w:t xml:space="preserve">]</w:t>
-      </w:r>
-      <w:r>
-        <w:t xml:space="preserve"> </w:t>
-      </w:r>
-      <w:r>
-        <w:t xml:space="preserve">and, with borderline precision, that ACOs that had achieved savings were more likely to stay</w:t>
-      </w:r>
-      <w:r>
-        <w:t xml:space="preserve"> </w:t>
-      </w:r>
-      <w:r>
-        <w:t xml:space="preserve">after the 2019 rules.</w:t>
-      </w:r>
-      <w:r>
-        <w:t xml:space="preserve">[</w:t>
-      </w:r>
-      <w:hyperlink w:anchor="ref-ying2023">
-        <w:r>
-          <w:rPr>
-            <w:rStyle w:val="Hyperlink"/>
-          </w:rPr>
-          <w:t xml:space="preserve">17</w:t>
-        </w:r>
-      </w:hyperlink>
-      <w:r>
-        <w:t xml:space="preserve">]</w:t>
-      </w:r>
-      <w:r>
-        <w:t xml:space="preserve"> </w:t>
-      </w:r>
-      <w:r>
-        <w:t xml:space="preserve">The same success, however, meant that the own-spending part of a reset would</w:t>
-      </w:r>
-      <w:r>
-        <w:t xml:space="preserve"> </w:t>
-      </w:r>
-      <w:r>
-        <w:t xml:space="preserve">have cut their benchmarks. The intuitive account that ACOs renewed early to get a higher benchmark therefore does not</w:t>
-      </w:r>
-      <w:r>
-        <w:t xml:space="preserve"> </w:t>
-      </w:r>
-      <w:r>
-        <w:t xml:space="preserve">describe them on average, and CMS’s published 2022 benchmarks, examined post hoc, agree.</w:t>
-      </w:r>
-      <w:r>
-        <w:t xml:space="preserve"> </w:t>
-      </w:r>
-      <w:r>
-        <w:t xml:space="preserve">That the size of the regional difference doubled without case-mix adjustment is consistent with evidence that</w:t>
-      </w:r>
-      <w:r>
-        <w:t xml:space="preserve"> </w:t>
-      </w:r>
-      <w:r>
-        <w:t xml:space="preserve">comparisons of ACOs with their regions depend heavily on risk adjustment.</w:t>
-      </w:r>
-      <w:r>
-        <w:t xml:space="preserve">[</w:t>
-      </w:r>
-      <w:hyperlink w:anchor="ref-rose2016">
-        <w:r>
-          <w:rPr>
-            <w:rStyle w:val="Hyperlink"/>
-          </w:rPr>
-          <w:t xml:space="preserve">10</w:t>
-        </w:r>
-      </w:hyperlink>
-      <w:r>
-        <w:t xml:space="preserve">]</w:t>
-      </w:r>
-      <w:r>
-        <w:t xml:space="preserve"> </w:t>
-      </w:r>
-      <w:r>
-        <w:t xml:space="preserve">The concern that rebasing rewards</w:t>
-      </w:r>
-      <w:r>
-        <w:t xml:space="preserve"> </w:t>
-      </w:r>
-      <w:r>
-        <w:t xml:space="preserve">higher spending before a new agreement</w:t>
-      </w:r>
-      <w:r>
-        <w:t xml:space="preserve">[</w:t>
-      </w:r>
-      <w:hyperlink w:anchor="ref-douven2015">
-        <w:r>
-          <w:rPr>
-            <w:rStyle w:val="Hyperlink"/>
-          </w:rPr>
-          <w:t xml:space="preserve">9</w:t>
-        </w:r>
-      </w:hyperlink>
-      <w:r>
-        <w:t xml:space="preserve">]</w:t>
-      </w:r>
-      <w:r>
-        <w:t xml:space="preserve"> </w:t>
-      </w:r>
-      <w:r>
-        <w:t xml:space="preserve">could be neither confirmed nor excluded here, and the costs to</w:t>
-      </w:r>
-      <w:r>
-        <w:t xml:space="preserve"> </w:t>
-      </w:r>
-      <w:r>
-        <w:t xml:space="preserve">Medicare of early renewal, which earlier work estimated for departures,</w:t>
-      </w:r>
-      <w:r>
-        <w:t xml:space="preserve">[</w:t>
-      </w:r>
-      <w:hyperlink w:anchor="ref-moloci2021">
-        <w:r>
-          <w:rPr>
-            <w:rStyle w:val="Hyperlink"/>
-          </w:rPr>
-          <w:t xml:space="preserve">19</w:t>
-        </w:r>
-      </w:hyperlink>
-      <w:r>
-        <w:t xml:space="preserve">]</w:t>
-      </w:r>
-      <w:r>
-        <w:t xml:space="preserve"> </w:t>
-      </w:r>
-      <w:r>
-        <w:t xml:space="preserve">were not estimated.</w:t>
-      </w:r>
-    </w:p>
-    <w:p>
-      <w:pPr>
-        <w:pStyle w:val="BodyText"/>
-      </w:pPr>
-      <w:r>
-        <w:t xml:space="preserve">The association with a higher BASIC level bears on the sharing-rate motive at least as much as on the reset motive.</w:t>
-      </w:r>
-      <w:r>
-        <w:t xml:space="preserve"> </w:t>
-      </w:r>
-      <w:r>
-        <w:t xml:space="preserve">In these data renewing early and moving to ENHANCED were one choice: 26 of the 27 BASIC-track early renewers moved to ENHANCED, and the rules let no stayer do so. ACOs already bearing two-sided risk at Level E faced a short step to ENHANCED’s 75%</w:t>
-      </w:r>
-      <w:r>
-        <w:t xml:space="preserve"> </w:t>
-      </w:r>
-      <w:r>
-        <w:t xml:space="preserve">sharing rate. Because ACOs partly choose their BASIC level, and ACOs experienced with performance-based risk could</w:t>
-      </w:r>
-      <w:r>
-        <w:t xml:space="preserve"> </w:t>
-      </w:r>
-      <w:r>
-        <w:t xml:space="preserve">enter only Level E or ENHANCED,</w:t>
-      </w:r>
-      <w:r>
-        <w:t xml:space="preserve">[</w:t>
-      </w:r>
       <w:hyperlink w:anchor="ref-cfr425600">
         <w:r>
           <w:rPr>
             <w:rStyle w:val="Hyperlink"/>
           </w:rPr>
-          <w:t xml:space="preserve">34</w:t>
+          <w:t xml:space="preserve">36</w:t>
         </w:r>
       </w:hyperlink>
       <w:r>
@@ -8711,7 +8803,7 @@
           <w:rPr>
             <w:rStyle w:val="Hyperlink"/>
           </w:rPr>
-          <w:t xml:space="preserve">59</w:t>
+          <w:t xml:space="preserve">61</w:t>
         </w:r>
       </w:hyperlink>
       <w:r>
@@ -8907,7 +8999,7 @@
           <w:rPr>
             <w:rStyle w:val="Hyperlink"/>
           </w:rPr>
-          <w:t xml:space="preserve">60</w:t>
+          <w:t xml:space="preserve">62</w:t>
         </w:r>
       </w:hyperlink>
       <w:r>
@@ -9102,7 +9194,7 @@
           <w:rPr>
             <w:rStyle w:val="Hyperlink"/>
           </w:rPr>
-          <w:t xml:space="preserve">22</w:t>
+          <w:t xml:space="preserve">24</w:t>
         </w:r>
       </w:hyperlink>
       <w:r>
@@ -9113,7 +9205,7 @@
           <w:rPr>
             <w:rStyle w:val="Hyperlink"/>
           </w:rPr>
-          <w:t xml:space="preserve">28</w:t>
+          <w:t xml:space="preserve">30</w:t>
         </w:r>
       </w:hyperlink>
       <w:r>
@@ -9124,7 +9216,7 @@
           <w:rPr>
             <w:rStyle w:val="Hyperlink"/>
           </w:rPr>
-          <w:t xml:space="preserve">30</w:t>
+          <w:t xml:space="preserve">32</w:t>
         </w:r>
       </w:hyperlink>
       <w:r>
@@ -9156,7 +9248,7 @@
           <w:rPr>
             <w:rStyle w:val="Hyperlink"/>
           </w:rPr>
-          <w:t xml:space="preserve">27</w:t>
+          <w:t xml:space="preserve">29</w:t>
         </w:r>
       </w:hyperlink>
       <w:r>
@@ -9182,7 +9274,7 @@
           <w:rPr>
             <w:rStyle w:val="Hyperlink"/>
           </w:rPr>
-          <w:t xml:space="preserve">31</w:t>
+          <w:t xml:space="preserve">33</w:t>
         </w:r>
       </w:hyperlink>
       <w:r>
@@ -9208,7 +9300,7 @@
           <w:rPr>
             <w:rStyle w:val="Hyperlink"/>
           </w:rPr>
-          <w:t xml:space="preserve">61</w:t>
+          <w:t xml:space="preserve">63</w:t>
         </w:r>
       </w:hyperlink>
       <w:r>
@@ -9234,7 +9326,7 @@
           <w:rPr>
             <w:rStyle w:val="Hyperlink"/>
           </w:rPr>
-          <w:t xml:space="preserve">27</w:t>
+          <w:t xml:space="preserve">29</w:t>
         </w:r>
       </w:hyperlink>
       <w:r>
@@ -9260,7 +9352,7 @@
           <w:rPr>
             <w:rStyle w:val="Hyperlink"/>
           </w:rPr>
-          <w:t xml:space="preserve">62</w:t>
+          <w:t xml:space="preserve">64</w:t>
         </w:r>
       </w:hyperlink>
       <w:r>
@@ -9364,7 +9456,7 @@
       </w:r>
     </w:p>
     <w:bookmarkEnd w:id="62"/>
-    <w:bookmarkStart w:id="187" w:name="references"/>
+    <w:bookmarkStart w:id="191" w:name="references"/>
     <w:p>
       <w:pPr>
         <w:pStyle w:val="Heading1"/>
@@ -9373,7 +9465,7 @@
         <w:t xml:space="preserve">References</w:t>
       </w:r>
     </w:p>
-    <w:bookmarkStart w:id="186" w:name="refs"/>
+    <w:bookmarkStart w:id="190" w:name="refs"/>
     <w:bookmarkStart w:id="64" w:name="ref-cfr425"/>
     <w:p>
       <w:pPr>
@@ -9443,7 +9535,7 @@
       </w:hyperlink>
     </w:p>
     <w:bookmarkEnd w:id="64"/>
-    <w:bookmarkStart w:id="66" w:name="ref-cfr425601"/>
+    <w:bookmarkStart w:id="66" w:name="ref-sspfastfacts2026"/>
     <w:p>
       <w:pPr>
         <w:pStyle w:val="Bibliography"/>
@@ -9458,6 +9550,66 @@
         <w:t xml:space="preserve">	</w:t>
       </w:r>
       <w:r>
+        <w:t xml:space="preserve">Centers for Medicare &amp; Medicaid Services. Shared</w:t>
+      </w:r>
+      <w:r>
+        <w:t xml:space="preserve"> </w:t>
+      </w:r>
+      <w:r>
+        <w:t xml:space="preserve">Savings</w:t>
+      </w:r>
+      <w:r>
+        <w:t xml:space="preserve"> </w:t>
+      </w:r>
+      <w:r>
+        <w:t xml:space="preserve">Program</w:t>
+      </w:r>
+      <w:r>
+        <w:t xml:space="preserve"> </w:t>
+      </w:r>
+      <w:r>
+        <w:t xml:space="preserve">fast facts: As of</w:t>
+      </w:r>
+      <w:r>
+        <w:t xml:space="preserve"> </w:t>
+      </w:r>
+      <w:r>
+        <w:t xml:space="preserve">January</w:t>
+      </w:r>
+      <w:r>
+        <w:t xml:space="preserve"> </w:t>
+      </w:r>
+      <w:r>
+        <w:t xml:space="preserve">1, 2026. Published online 2026.</w:t>
+      </w:r>
+      <w:r>
+        <w:t xml:space="preserve"> </w:t>
+      </w:r>
+      <w:hyperlink r:id="rId65">
+        <w:r>
+          <w:rPr>
+            <w:rStyle w:val="Hyperlink"/>
+          </w:rPr>
+          <w:t xml:space="preserve">https://www.cms.gov/files/document/2026-shared-savings-program-fast-facts.pdf</w:t>
+        </w:r>
+      </w:hyperlink>
+    </w:p>
+    <w:bookmarkEnd w:id="66"/>
+    <w:bookmarkStart w:id="68" w:name="ref-cfr425601"/>
+    <w:p>
+      <w:pPr>
+        <w:pStyle w:val="Bibliography"/>
+      </w:pPr>
+      <w:r>
+        <w:t xml:space="preserve">3.</w:t>
+      </w:r>
+      <w:r>
+        <w:t xml:space="preserve"> </w:t>
+      </w:r>
+      <w:r>
+        <w:t xml:space="preserve">	</w:t>
+      </w:r>
+      <w:r>
         <w:t xml:space="preserve">Centers for Medicare &amp; Medicaid Services. 42</w:t>
       </w:r>
       <w:r>
@@ -9496,7 +9648,7 @@
       <w:r>
         <w:t xml:space="preserve"> </w:t>
       </w:r>
-      <w:hyperlink r:id="rId65">
+      <w:hyperlink r:id="rId67">
         <w:r>
           <w:rPr>
             <w:rStyle w:val="Hyperlink"/>
@@ -9505,14 +9657,14 @@
         </w:r>
       </w:hyperlink>
     </w:p>
-    <w:bookmarkEnd w:id="66"/>
-    <w:bookmarkStart w:id="68" w:name="ref-mcwilliams2016"/>
+    <w:bookmarkEnd w:id="68"/>
+    <w:bookmarkStart w:id="70" w:name="ref-mcwilliams2016"/>
     <w:p>
       <w:pPr>
         <w:pStyle w:val="Bibliography"/>
       </w:pPr>
       <w:r>
-        <w:t xml:space="preserve">3.</w:t>
+        <w:t xml:space="preserve">4.</w:t>
       </w:r>
       <w:r>
         <w:t xml:space="preserve"> </w:t>
@@ -9536,7 +9688,7 @@
       <w:r>
         <w:t xml:space="preserve">. 2016;374(24):2357-2366. doi:</w:t>
       </w:r>
-      <w:hyperlink r:id="rId67">
+      <w:hyperlink r:id="rId69">
         <w:r>
           <w:rPr>
             <w:rStyle w:val="Hyperlink"/>
@@ -9545,14 +9697,14 @@
         </w:r>
       </w:hyperlink>
     </w:p>
-    <w:bookmarkEnd w:id="68"/>
-    <w:bookmarkStart w:id="70" w:name="ref-mcwilliams2018"/>
+    <w:bookmarkEnd w:id="70"/>
+    <w:bookmarkStart w:id="72" w:name="ref-mcwilliams2018"/>
     <w:p>
       <w:pPr>
         <w:pStyle w:val="Bibliography"/>
       </w:pPr>
       <w:r>
-        <w:t xml:space="preserve">4.</w:t>
+        <w:t xml:space="preserve">5.</w:t>
       </w:r>
       <w:r>
         <w:t xml:space="preserve"> </w:t>
@@ -9576,7 +9728,7 @@
       <w:r>
         <w:t xml:space="preserve">. 2018;379(12):1139-1149. doi:</w:t>
       </w:r>
-      <w:hyperlink r:id="rId69">
+      <w:hyperlink r:id="rId71">
         <w:r>
           <w:rPr>
             <w:rStyle w:val="Hyperlink"/>
@@ -9585,14 +9737,14 @@
         </w:r>
       </w:hyperlink>
     </w:p>
-    <w:bookmarkEnd w:id="70"/>
-    <w:bookmarkStart w:id="72" w:name="ref-bond2025"/>
+    <w:bookmarkEnd w:id="72"/>
+    <w:bookmarkStart w:id="74" w:name="ref-bond2025"/>
     <w:p>
       <w:pPr>
         <w:pStyle w:val="Bibliography"/>
       </w:pPr>
       <w:r>
-        <w:t xml:space="preserve">5.</w:t>
+        <w:t xml:space="preserve">6.</w:t>
       </w:r>
       <w:r>
         <w:t xml:space="preserve"> </w:t>
@@ -9616,7 +9768,7 @@
       <w:r>
         <w:t xml:space="preserve">. 2025;333(21):1897-1905. doi:</w:t>
       </w:r>
-      <w:hyperlink r:id="rId71">
+      <w:hyperlink r:id="rId73">
         <w:r>
           <w:rPr>
             <w:rStyle w:val="Hyperlink"/>
@@ -9625,14 +9777,14 @@
         </w:r>
       </w:hyperlink>
     </w:p>
-    <w:bookmarkEnd w:id="72"/>
-    <w:bookmarkStart w:id="74" w:name="ref-mcwilliams2020"/>
+    <w:bookmarkEnd w:id="74"/>
+    <w:bookmarkStart w:id="76" w:name="ref-mcwilliams2020"/>
     <w:p>
       <w:pPr>
         <w:pStyle w:val="Bibliography"/>
       </w:pPr>
       <w:r>
-        <w:t xml:space="preserve">6.</w:t>
+        <w:t xml:space="preserve">7.</w:t>
       </w:r>
       <w:r>
         <w:t xml:space="preserve"> </w:t>
@@ -9656,7 +9808,7 @@
       <w:r>
         <w:t xml:space="preserve">. 2020;98(3):847-907. doi:</w:t>
       </w:r>
-      <w:hyperlink r:id="rId73">
+      <w:hyperlink r:id="rId75">
         <w:r>
           <w:rPr>
             <w:rStyle w:val="Hyperlink"/>
@@ -9665,14 +9817,14 @@
         </w:r>
       </w:hyperlink>
     </w:p>
-    <w:bookmarkEnd w:id="74"/>
-    <w:bookmarkStart w:id="76" w:name="ref-markovitz2019exit"/>
+    <w:bookmarkEnd w:id="76"/>
+    <w:bookmarkStart w:id="78" w:name="ref-markovitz2019exit"/>
     <w:p>
       <w:pPr>
         <w:pStyle w:val="Bibliography"/>
       </w:pPr>
       <w:r>
-        <w:t xml:space="preserve">7.</w:t>
+        <w:t xml:space="preserve">8.</w:t>
       </w:r>
       <w:r>
         <w:t xml:space="preserve"> </w:t>
@@ -9696,7 +9848,7 @@
       <w:r>
         <w:t xml:space="preserve">. 2019;171(1):27-36. doi:</w:t>
       </w:r>
-      <w:hyperlink r:id="rId75">
+      <w:hyperlink r:id="rId77">
         <w:r>
           <w:rPr>
             <w:rStyle w:val="Hyperlink"/>
@@ -9705,14 +9857,14 @@
         </w:r>
       </w:hyperlink>
     </w:p>
-    <w:bookmarkEnd w:id="76"/>
-    <w:bookmarkStart w:id="78" w:name="ref-markovitz2019risk"/>
+    <w:bookmarkEnd w:id="78"/>
+    <w:bookmarkStart w:id="80" w:name="ref-markovitz2019risk"/>
     <w:p>
       <w:pPr>
         <w:pStyle w:val="Bibliography"/>
       </w:pPr>
       <w:r>
-        <w:t xml:space="preserve">8.</w:t>
+        <w:t xml:space="preserve">9.</w:t>
       </w:r>
       <w:r>
         <w:t xml:space="preserve"> </w:t>
@@ -9736,7 +9888,7 @@
       <w:r>
         <w:t xml:space="preserve">. 2019;38(2):253-261. doi:</w:t>
       </w:r>
-      <w:hyperlink r:id="rId77">
+      <w:hyperlink r:id="rId79">
         <w:r>
           <w:rPr>
             <w:rStyle w:val="Hyperlink"/>
@@ -9745,14 +9897,14 @@
         </w:r>
       </w:hyperlink>
     </w:p>
-    <w:bookmarkEnd w:id="78"/>
-    <w:bookmarkStart w:id="80" w:name="ref-douven2015"/>
+    <w:bookmarkEnd w:id="80"/>
+    <w:bookmarkStart w:id="82" w:name="ref-douven2015"/>
     <w:p>
       <w:pPr>
         <w:pStyle w:val="Bibliography"/>
       </w:pPr>
       <w:r>
-        <w:t xml:space="preserve">9.</w:t>
+        <w:t xml:space="preserve">10.</w:t>
       </w:r>
       <w:r>
         <w:t xml:space="preserve"> </w:t>
@@ -9776,7 +9928,7 @@
       <w:r>
         <w:t xml:space="preserve">. 2015;34(1):143-149. doi:</w:t>
       </w:r>
-      <w:hyperlink r:id="rId79">
+      <w:hyperlink r:id="rId81">
         <w:r>
           <w:rPr>
             <w:rStyle w:val="Hyperlink"/>
@@ -9785,14 +9937,179 @@
         </w:r>
       </w:hyperlink>
     </w:p>
-    <w:bookmarkEnd w:id="80"/>
-    <w:bookmarkStart w:id="82" w:name="ref-rose2016"/>
+    <w:bookmarkEnd w:id="82"/>
+    <w:bookmarkStart w:id="84" w:name="ref-weitzman1980"/>
     <w:p>
       <w:pPr>
         <w:pStyle w:val="Bibliography"/>
       </w:pPr>
       <w:r>
-        <w:t xml:space="preserve">10.</w:t>
+        <w:t xml:space="preserve">11.</w:t>
+      </w:r>
+      <w:r>
+        <w:t xml:space="preserve"> </w:t>
+      </w:r>
+      <w:r>
+        <w:t xml:space="preserve">	</w:t>
+      </w:r>
+      <w:r>
+        <w:t xml:space="preserve">Weitzman ML. The</w:t>
+      </w:r>
+      <w:r>
+        <w:t xml:space="preserve"> </w:t>
+      </w:r>
+      <w:r>
+        <w:t xml:space="preserve">“Ratchet Principle”</w:t>
+      </w:r>
+      <w:r>
+        <w:t xml:space="preserve"> </w:t>
+      </w:r>
+      <w:r>
+        <w:t xml:space="preserve">and Performance Incentives.</w:t>
+      </w:r>
+      <w:r>
+        <w:t xml:space="preserve"> </w:t>
+      </w:r>
+      <w:r>
+        <w:rPr>
+          <w:i/>
+          <w:iCs/>
+        </w:rPr>
+        <w:t xml:space="preserve">The Bell Journal of Economics</w:t>
+      </w:r>
+      <w:r>
+        <w:t xml:space="preserve">. 1980;11(1):302. doi:</w:t>
+      </w:r>
+      <w:hyperlink r:id="rId83">
+        <w:r>
+          <w:rPr>
+            <w:rStyle w:val="Hyperlink"/>
+          </w:rPr>
+          <w:t xml:space="preserve">10.2307/3003414</w:t>
+        </w:r>
+      </w:hyperlink>
+    </w:p>
+    <w:bookmarkEnd w:id="84"/>
+    <w:bookmarkStart w:id="86" w:name="ref-cappello2026"/>
+    <w:p>
+      <w:pPr>
+        <w:pStyle w:val="Bibliography"/>
+      </w:pPr>
+      <w:r>
+        <w:t xml:space="preserve">12.</w:t>
+      </w:r>
+      <w:r>
+        <w:t xml:space="preserve"> </w:t>
+      </w:r>
+      <w:r>
+        <w:t xml:space="preserve">	</w:t>
+      </w:r>
+      <w:r>
+        <w:t xml:space="preserve">Cappello A.</w:t>
+      </w:r>
+      <w:r>
+        <w:t xml:space="preserve"> </w:t>
+      </w:r>
+      <w:r>
+        <w:rPr>
+          <w:i/>
+          <w:iCs/>
+        </w:rPr>
+        <w:t xml:space="preserve">Essays in</w:t>
+      </w:r>
+      <w:r>
+        <w:rPr>
+          <w:i/>
+          <w:iCs/>
+        </w:rPr>
+        <w:t xml:space="preserve"> </w:t>
+      </w:r>
+      <w:r>
+        <w:rPr>
+          <w:i/>
+          <w:iCs/>
+        </w:rPr>
+        <w:t xml:space="preserve">Industrial</w:t>
+      </w:r>
+      <w:r>
+        <w:rPr>
+          <w:i/>
+          <w:iCs/>
+        </w:rPr>
+        <w:t xml:space="preserve"> </w:t>
+      </w:r>
+      <w:r>
+        <w:rPr>
+          <w:i/>
+          <w:iCs/>
+        </w:rPr>
+        <w:t xml:space="preserve">Organization</w:t>
+      </w:r>
+      <w:r>
+        <w:rPr>
+          <w:i/>
+          <w:iCs/>
+        </w:rPr>
+        <w:t xml:space="preserve"> </w:t>
+      </w:r>
+      <w:r>
+        <w:rPr>
+          <w:i/>
+          <w:iCs/>
+        </w:rPr>
+        <w:t xml:space="preserve">and</w:t>
+      </w:r>
+      <w:r>
+        <w:rPr>
+          <w:i/>
+          <w:iCs/>
+        </w:rPr>
+        <w:t xml:space="preserve"> </w:t>
+      </w:r>
+      <w:r>
+        <w:rPr>
+          <w:i/>
+          <w:iCs/>
+        </w:rPr>
+        <w:t xml:space="preserve">Health</w:t>
+      </w:r>
+      <w:r>
+        <w:rPr>
+          <w:i/>
+          <w:iCs/>
+        </w:rPr>
+        <w:t xml:space="preserve"> </w:t>
+      </w:r>
+      <w:r>
+        <w:rPr>
+          <w:i/>
+          <w:iCs/>
+        </w:rPr>
+        <w:t xml:space="preserve">Economics</w:t>
+      </w:r>
+      <w:r>
+        <w:t xml:space="preserve">. PhD dissertation. Boston College; 2026.</w:t>
+      </w:r>
+      <w:r>
+        <w:t xml:space="preserve"> </w:t>
+      </w:r>
+      <w:hyperlink r:id="rId85">
+        <w:r>
+          <w:rPr>
+            <w:rStyle w:val="Hyperlink"/>
+          </w:rPr>
+          <w:t xml:space="preserve">https://www.proquest.com/openview/92b6e8f86c7ba39e2ba879d91063898b/1</w:t>
+        </w:r>
+      </w:hyperlink>
+    </w:p>
+    <w:bookmarkEnd w:id="86"/>
+    <w:bookmarkStart w:id="88" w:name="ref-rose2016"/>
+    <w:p>
+      <w:pPr>
+        <w:pStyle w:val="Bibliography"/>
+      </w:pPr>
+      <w:r>
+        <w:t xml:space="preserve">13.</w:t>
       </w:r>
       <w:r>
         <w:t xml:space="preserve"> </w:t>
@@ -9816,7 +10133,7 @@
       <w:r>
         <w:t xml:space="preserve">. 2016;35(3):440-448. doi:</w:t>
       </w:r>
-      <w:hyperlink r:id="rId81">
+      <w:hyperlink r:id="rId87">
         <w:r>
           <w:rPr>
             <w:rStyle w:val="Hyperlink"/>
@@ -9825,127 +10142,14 @@
         </w:r>
       </w:hyperlink>
     </w:p>
-    <w:bookmarkEnd w:id="82"/>
-    <w:bookmarkStart w:id="84" w:name="ref-cappello2026"/>
+    <w:bookmarkEnd w:id="88"/>
+    <w:bookmarkStart w:id="90" w:name="ref-lyu2023"/>
     <w:p>
       <w:pPr>
         <w:pStyle w:val="Bibliography"/>
       </w:pPr>
       <w:r>
-        <w:t xml:space="preserve">11.</w:t>
-      </w:r>
-      <w:r>
-        <w:t xml:space="preserve"> </w:t>
-      </w:r>
-      <w:r>
-        <w:t xml:space="preserve">	</w:t>
-      </w:r>
-      <w:r>
-        <w:t xml:space="preserve">Cappello A.</w:t>
-      </w:r>
-      <w:r>
-        <w:t xml:space="preserve"> </w:t>
-      </w:r>
-      <w:r>
-        <w:rPr>
-          <w:i/>
-          <w:iCs/>
-        </w:rPr>
-        <w:t xml:space="preserve">Essays in</w:t>
-      </w:r>
-      <w:r>
-        <w:rPr>
-          <w:i/>
-          <w:iCs/>
-        </w:rPr>
-        <w:t xml:space="preserve"> </w:t>
-      </w:r>
-      <w:r>
-        <w:rPr>
-          <w:i/>
-          <w:iCs/>
-        </w:rPr>
-        <w:t xml:space="preserve">Industrial</w:t>
-      </w:r>
-      <w:r>
-        <w:rPr>
-          <w:i/>
-          <w:iCs/>
-        </w:rPr>
-        <w:t xml:space="preserve"> </w:t>
-      </w:r>
-      <w:r>
-        <w:rPr>
-          <w:i/>
-          <w:iCs/>
-        </w:rPr>
-        <w:t xml:space="preserve">Organization</w:t>
-      </w:r>
-      <w:r>
-        <w:rPr>
-          <w:i/>
-          <w:iCs/>
-        </w:rPr>
-        <w:t xml:space="preserve"> </w:t>
-      </w:r>
-      <w:r>
-        <w:rPr>
-          <w:i/>
-          <w:iCs/>
-        </w:rPr>
-        <w:t xml:space="preserve">and</w:t>
-      </w:r>
-      <w:r>
-        <w:rPr>
-          <w:i/>
-          <w:iCs/>
-        </w:rPr>
-        <w:t xml:space="preserve"> </w:t>
-      </w:r>
-      <w:r>
-        <w:rPr>
-          <w:i/>
-          <w:iCs/>
-        </w:rPr>
-        <w:t xml:space="preserve">Health</w:t>
-      </w:r>
-      <w:r>
-        <w:rPr>
-          <w:i/>
-          <w:iCs/>
-        </w:rPr>
-        <w:t xml:space="preserve"> </w:t>
-      </w:r>
-      <w:r>
-        <w:rPr>
-          <w:i/>
-          <w:iCs/>
-        </w:rPr>
-        <w:t xml:space="preserve">Economics</w:t>
-      </w:r>
-      <w:r>
-        <w:t xml:space="preserve">. PhD dissertation. Boston College; 2026.</w:t>
-      </w:r>
-      <w:r>
-        <w:t xml:space="preserve"> </w:t>
-      </w:r>
-      <w:hyperlink r:id="rId83">
-        <w:r>
-          <w:rPr>
-            <w:rStyle w:val="Hyperlink"/>
-          </w:rPr>
-          <w:t xml:space="preserve">https://www.proquest.com/openview/92b6e8f86c7ba39e2ba879d91063898b/1</w:t>
-        </w:r>
-      </w:hyperlink>
-    </w:p>
-    <w:bookmarkEnd w:id="84"/>
-    <w:bookmarkStart w:id="86" w:name="ref-lyu2023"/>
-    <w:p>
-      <w:pPr>
-        <w:pStyle w:val="Bibliography"/>
-      </w:pPr>
-      <w:r>
-        <w:t xml:space="preserve">12.</w:t>
+        <w:t xml:space="preserve">14.</w:t>
       </w:r>
       <w:r>
         <w:t xml:space="preserve"> </w:t>
@@ -9969,7 +10173,7 @@
       <w:r>
         <w:t xml:space="preserve">. 2023;42(5):622-631. doi:</w:t>
       </w:r>
-      <w:hyperlink r:id="rId85">
+      <w:hyperlink r:id="rId89">
         <w:r>
           <w:rPr>
             <w:rStyle w:val="Hyperlink"/>
@@ -9978,14 +10182,14 @@
         </w:r>
       </w:hyperlink>
     </w:p>
-    <w:bookmarkEnd w:id="86"/>
-    <w:bookmarkStart w:id="88" w:name="ref-chen2025"/>
+    <w:bookmarkEnd w:id="90"/>
+    <w:bookmarkStart w:id="92" w:name="ref-chen2025"/>
     <w:p>
       <w:pPr>
         <w:pStyle w:val="Bibliography"/>
       </w:pPr>
       <w:r>
-        <w:t xml:space="preserve">13.</w:t>
+        <w:t xml:space="preserve">15.</w:t>
       </w:r>
       <w:r>
         <w:t xml:space="preserve"> </w:t>
@@ -10009,7 +10213,7 @@
       <w:r>
         <w:t xml:space="preserve">. 2025;11(1):38-62. doi:</w:t>
       </w:r>
-      <w:hyperlink r:id="rId87">
+      <w:hyperlink r:id="rId91">
         <w:r>
           <w:rPr>
             <w:rStyle w:val="Hyperlink"/>
@@ -10018,14 +10222,14 @@
         </w:r>
       </w:hyperlink>
     </w:p>
-    <w:bookmarkEnd w:id="88"/>
-    <w:bookmarkStart w:id="90" w:name="ref-srivastava2026"/>
+    <w:bookmarkEnd w:id="92"/>
+    <w:bookmarkStart w:id="94" w:name="ref-srivastava2026"/>
     <w:p>
       <w:pPr>
         <w:pStyle w:val="Bibliography"/>
       </w:pPr>
       <w:r>
-        <w:t xml:space="preserve">14.</w:t>
+        <w:t xml:space="preserve">16.</w:t>
       </w:r>
       <w:r>
         <w:t xml:space="preserve"> </w:t>
@@ -10049,7 +10253,7 @@
       <w:r>
         <w:t xml:space="preserve">. 2026;9(2):e260166. doi:</w:t>
       </w:r>
-      <w:hyperlink r:id="rId89">
+      <w:hyperlink r:id="rId93">
         <w:r>
           <w:rPr>
             <w:rStyle w:val="Hyperlink"/>
@@ -10058,14 +10262,14 @@
         </w:r>
       </w:hyperlink>
     </w:p>
-    <w:bookmarkEnd w:id="90"/>
-    <w:bookmarkStart w:id="92" w:name="ref-bleser2019"/>
+    <w:bookmarkEnd w:id="94"/>
+    <w:bookmarkStart w:id="96" w:name="ref-bleser2019"/>
     <w:p>
       <w:pPr>
         <w:pStyle w:val="Bibliography"/>
       </w:pPr>
       <w:r>
-        <w:t xml:space="preserve">15.</w:t>
+        <w:t xml:space="preserve">17.</w:t>
       </w:r>
       <w:r>
         <w:t xml:space="preserve"> </w:t>
@@ -10089,7 +10293,7 @@
       <w:r>
         <w:t xml:space="preserve">. 2019;38(5):794-803. doi:</w:t>
       </w:r>
-      <w:hyperlink r:id="rId91">
+      <w:hyperlink r:id="rId95">
         <w:r>
           <w:rPr>
             <w:rStyle w:val="Hyperlink"/>
@@ -10098,14 +10302,14 @@
         </w:r>
       </w:hyperlink>
     </w:p>
-    <w:bookmarkEnd w:id="92"/>
-    <w:bookmarkStart w:id="94" w:name="ref-zhu2023"/>
+    <w:bookmarkEnd w:id="96"/>
+    <w:bookmarkStart w:id="98" w:name="ref-zhu2023"/>
     <w:p>
       <w:pPr>
         <w:pStyle w:val="Bibliography"/>
       </w:pPr>
       <w:r>
-        <w:t xml:space="preserve">16.</w:t>
+        <w:t xml:space="preserve">18.</w:t>
       </w:r>
       <w:r>
         <w:t xml:space="preserve"> </w:t>
@@ -10129,7 +10333,7 @@
       <w:r>
         <w:t xml:space="preserve">. 2023;39(1):302-308. doi:</w:t>
       </w:r>
-      <w:hyperlink r:id="rId93">
+      <w:hyperlink r:id="rId97">
         <w:r>
           <w:rPr>
             <w:rStyle w:val="Hyperlink"/>
@@ -10138,14 +10342,14 @@
         </w:r>
       </w:hyperlink>
     </w:p>
-    <w:bookmarkEnd w:id="94"/>
-    <w:bookmarkStart w:id="96" w:name="ref-ying2023"/>
+    <w:bookmarkEnd w:id="98"/>
+    <w:bookmarkStart w:id="100" w:name="ref-ying2023"/>
     <w:p>
       <w:pPr>
         <w:pStyle w:val="Bibliography"/>
       </w:pPr>
       <w:r>
-        <w:t xml:space="preserve">17.</w:t>
+        <w:t xml:space="preserve">19.</w:t>
       </w:r>
       <w:r>
         <w:t xml:space="preserve"> </w:t>
@@ -10169,7 +10373,7 @@
       <w:r>
         <w:t xml:space="preserve">. 2023;38(7):1780-1782. doi:</w:t>
       </w:r>
-      <w:hyperlink r:id="rId95">
+      <w:hyperlink r:id="rId99">
         <w:r>
           <w:rPr>
             <w:rStyle w:val="Hyperlink"/>
@@ -10178,14 +10382,14 @@
         </w:r>
       </w:hyperlink>
     </w:p>
-    <w:bookmarkEnd w:id="96"/>
-    <w:bookmarkStart w:id="98" w:name="ref-ying2024"/>
+    <w:bookmarkEnd w:id="100"/>
+    <w:bookmarkStart w:id="102" w:name="ref-ying2024"/>
     <w:p>
       <w:pPr>
         <w:pStyle w:val="Bibliography"/>
       </w:pPr>
       <w:r>
-        <w:t xml:space="preserve">18.</w:t>
+        <w:t xml:space="preserve">20.</w:t>
       </w:r>
       <w:r>
         <w:t xml:space="preserve"> </w:t>
@@ -10209,7 +10413,7 @@
       <w:r>
         <w:t xml:space="preserve">. 2024;2(1):qxad093. doi:</w:t>
       </w:r>
-      <w:hyperlink r:id="rId97">
+      <w:hyperlink r:id="rId101">
         <w:r>
           <w:rPr>
             <w:rStyle w:val="Hyperlink"/>
@@ -10218,14 +10422,14 @@
         </w:r>
       </w:hyperlink>
     </w:p>
-    <w:bookmarkEnd w:id="98"/>
-    <w:bookmarkStart w:id="100" w:name="ref-moloci2021"/>
+    <w:bookmarkEnd w:id="102"/>
+    <w:bookmarkStart w:id="104" w:name="ref-moloci2021"/>
     <w:p>
       <w:pPr>
         <w:pStyle w:val="Bibliography"/>
       </w:pPr>
       <w:r>
-        <w:t xml:space="preserve">19.</w:t>
+        <w:t xml:space="preserve">21.</w:t>
       </w:r>
       <w:r>
         <w:t xml:space="preserve"> </w:t>
@@ -10249,7 +10453,7 @@
       <w:r>
         <w:t xml:space="preserve">. 2021;36(8):2490-2491. doi:</w:t>
       </w:r>
-      <w:hyperlink r:id="rId99">
+      <w:hyperlink r:id="rId103">
         <w:r>
           <w:rPr>
             <w:rStyle w:val="Hyperlink"/>
@@ -10258,14 +10462,14 @@
         </w:r>
       </w:hyperlink>
     </w:p>
-    <w:bookmarkEnd w:id="100"/>
-    <w:bookmarkStart w:id="102" w:name="ref-trombley2022"/>
+    <w:bookmarkEnd w:id="104"/>
+    <w:bookmarkStart w:id="106" w:name="ref-trombley2022"/>
     <w:p>
       <w:pPr>
         <w:pStyle w:val="Bibliography"/>
       </w:pPr>
       <w:r>
-        <w:t xml:space="preserve">20.</w:t>
+        <w:t xml:space="preserve">22.</w:t>
       </w:r>
       <w:r>
         <w:t xml:space="preserve"> </w:t>
@@ -10289,7 +10493,7 @@
       <w:r>
         <w:t xml:space="preserve">. 2022;41(1):138-146. doi:</w:t>
       </w:r>
-      <w:hyperlink r:id="rId101">
+      <w:hyperlink r:id="rId105">
         <w:r>
           <w:rPr>
             <w:rStyle w:val="Hyperlink"/>
@@ -10298,14 +10502,14 @@
         </w:r>
       </w:hyperlink>
     </w:p>
-    <w:bookmarkEnd w:id="102"/>
-    <w:bookmarkStart w:id="104" w:name="ref-frpathways"/>
+    <w:bookmarkEnd w:id="106"/>
+    <w:bookmarkStart w:id="108" w:name="ref-frpathways"/>
     <w:p>
       <w:pPr>
         <w:pStyle w:val="Bibliography"/>
       </w:pPr>
       <w:r>
-        <w:t xml:space="preserve">21.</w:t>
+        <w:t xml:space="preserve">23.</w:t>
       </w:r>
       <w:r>
         <w:t xml:space="preserve"> </w:t>
@@ -10382,7 +10586,7 @@
       <w:r>
         <w:t xml:space="preserve"> </w:t>
       </w:r>
-      <w:hyperlink r:id="rId103">
+      <w:hyperlink r:id="rId107">
         <w:r>
           <w:rPr>
             <w:rStyle w:val="Hyperlink"/>
@@ -10391,14 +10595,14 @@
         </w:r>
       </w:hyperlink>
     </w:p>
-    <w:bookmarkEnd w:id="104"/>
-    <w:bookmarkStart w:id="106" w:name="ref-dataacos"/>
+    <w:bookmarkEnd w:id="108"/>
+    <w:bookmarkStart w:id="110" w:name="ref-dataacos"/>
     <w:p>
       <w:pPr>
         <w:pStyle w:val="Bibliography"/>
       </w:pPr>
       <w:r>
-        <w:t xml:space="preserve">22.</w:t>
+        <w:t xml:space="preserve">24.</w:t>
       </w:r>
       <w:r>
         <w:t xml:space="preserve"> </w:t>
@@ -10436,7 +10640,7 @@
       <w:r>
         <w:t xml:space="preserve"> </w:t>
       </w:r>
-      <w:hyperlink r:id="rId105">
+      <w:hyperlink r:id="rId109">
         <w:r>
           <w:rPr>
             <w:rStyle w:val="Hyperlink"/>
@@ -10445,14 +10649,14 @@
         </w:r>
       </w:hyperlink>
     </w:p>
-    <w:bookmarkEnd w:id="106"/>
-    <w:bookmarkStart w:id="108" w:name="ref-milliman2024"/>
+    <w:bookmarkEnd w:id="110"/>
+    <w:bookmarkStart w:id="112" w:name="ref-milliman2024"/>
     <w:p>
       <w:pPr>
         <w:pStyle w:val="Bibliography"/>
       </w:pPr>
       <w:r>
-        <w:t xml:space="preserve">23.</w:t>
+        <w:t xml:space="preserve">25.</w:t>
       </w:r>
       <w:r>
         <w:t xml:space="preserve"> </w:t>
@@ -10556,7 +10760,7 @@
       <w:r>
         <w:t xml:space="preserve"> </w:t>
       </w:r>
-      <w:hyperlink r:id="rId107">
+      <w:hyperlink r:id="rId111">
         <w:r>
           <w:rPr>
             <w:rStyle w:val="Hyperlink"/>
@@ -10565,14 +10769,14 @@
         </w:r>
       </w:hyperlink>
     </w:p>
-    <w:bookmarkEnd w:id="108"/>
-    <w:bookmarkStart w:id="110" w:name="ref-milliman2025"/>
+    <w:bookmarkEnd w:id="112"/>
+    <w:bookmarkStart w:id="114" w:name="ref-milliman2025"/>
     <w:p>
       <w:pPr>
         <w:pStyle w:val="Bibliography"/>
       </w:pPr>
       <w:r>
-        <w:t xml:space="preserve">24.</w:t>
+        <w:t xml:space="preserve">26.</w:t>
       </w:r>
       <w:r>
         <w:t xml:space="preserve"> </w:t>
@@ -10683,7 +10887,7 @@
       <w:r>
         <w:t xml:space="preserve"> </w:t>
       </w:r>
-      <w:hyperlink r:id="rId109">
+      <w:hyperlink r:id="rId113">
         <w:r>
           <w:rPr>
             <w:rStyle w:val="Hyperlink"/>
@@ -10692,14 +10896,14 @@
         </w:r>
       </w:hyperlink>
     </w:p>
-    <w:bookmarkEnd w:id="110"/>
-    <w:bookmarkStart w:id="111" w:name="ref-registration"/>
+    <w:bookmarkEnd w:id="114"/>
+    <w:bookmarkStart w:id="115" w:name="ref-registration"/>
     <w:p>
       <w:pPr>
         <w:pStyle w:val="Bibliography"/>
       </w:pPr>
       <w:r>
-        <w:t xml:space="preserve">25.</w:t>
+        <w:t xml:space="preserve">27.</w:t>
       </w:r>
       <w:r>
         <w:t xml:space="preserve"> </w:t>
@@ -10776,14 +10980,14 @@
         </w:r>
       </w:hyperlink>
     </w:p>
-    <w:bookmarkEnd w:id="111"/>
-    <w:bookmarkStart w:id="113" w:name="ref-vonelm2007"/>
+    <w:bookmarkEnd w:id="115"/>
+    <w:bookmarkStart w:id="117" w:name="ref-vonelm2007"/>
     <w:p>
       <w:pPr>
         <w:pStyle w:val="Bibliography"/>
       </w:pPr>
       <w:r>
-        <w:t xml:space="preserve">26.</w:t>
+        <w:t xml:space="preserve">28.</w:t>
       </w:r>
       <w:r>
         <w:t xml:space="preserve"> </w:t>
@@ -10807,7 +11011,7 @@
       <w:r>
         <w:t xml:space="preserve">. 2007;4(10):e296. doi:</w:t>
       </w:r>
-      <w:hyperlink r:id="rId112">
+      <w:hyperlink r:id="rId116">
         <w:r>
           <w:rPr>
             <w:rStyle w:val="Hyperlink"/>
@@ -10816,14 +11020,14 @@
         </w:r>
       </w:hyperlink>
     </w:p>
-    <w:bookmarkEnd w:id="113"/>
-    <w:bookmarkStart w:id="115" w:name="ref-code"/>
+    <w:bookmarkEnd w:id="117"/>
+    <w:bookmarkStart w:id="119" w:name="ref-code"/>
     <w:p>
       <w:pPr>
         <w:pStyle w:val="Bibliography"/>
       </w:pPr>
       <w:r>
-        <w:t xml:space="preserve">27.</w:t>
+        <w:t xml:space="preserve">29.</w:t>
       </w:r>
       <w:r>
         <w:t xml:space="preserve"> </w:t>
@@ -10855,7 +11059,7 @@
       <w:r>
         <w:t xml:space="preserve"> </w:t>
       </w:r>
-      <w:hyperlink r:id="rId114">
+      <w:hyperlink r:id="rId118">
         <w:r>
           <w:rPr>
             <w:rStyle w:val="Hyperlink"/>
@@ -10864,14 +11068,14 @@
         </w:r>
       </w:hyperlink>
     </w:p>
-    <w:bookmarkEnd w:id="115"/>
-    <w:bookmarkStart w:id="117" w:name="ref-dataresults"/>
+    <w:bookmarkEnd w:id="119"/>
+    <w:bookmarkStart w:id="121" w:name="ref-dataresults"/>
     <w:p>
       <w:pPr>
         <w:pStyle w:val="Bibliography"/>
       </w:pPr>
       <w:r>
-        <w:t xml:space="preserve">28.</w:t>
+        <w:t xml:space="preserve">30.</w:t>
       </w:r>
       <w:r>
         <w:t xml:space="preserve"> </w:t>
@@ -10885,7 +11089,7 @@
       <w:r>
         <w:t xml:space="preserve"> </w:t>
       </w:r>
-      <w:hyperlink r:id="rId116">
+      <w:hyperlink r:id="rId120">
         <w:r>
           <w:rPr>
             <w:rStyle w:val="Hyperlink"/>
@@ -10894,14 +11098,14 @@
         </w:r>
       </w:hyperlink>
     </w:p>
-    <w:bookmarkEnd w:id="117"/>
-    <w:bookmarkStart w:id="119" w:name="ref-datacounty"/>
+    <w:bookmarkEnd w:id="121"/>
+    <w:bookmarkStart w:id="123" w:name="ref-datacounty"/>
     <w:p>
       <w:pPr>
         <w:pStyle w:val="Bibliography"/>
       </w:pPr>
       <w:r>
-        <w:t xml:space="preserve">29.</w:t>
+        <w:t xml:space="preserve">31.</w:t>
       </w:r>
       <w:r>
         <w:t xml:space="preserve"> </w:t>
@@ -10915,7 +11119,7 @@
       <w:r>
         <w:t xml:space="preserve"> </w:t>
       </w:r>
-      <w:hyperlink r:id="rId118">
+      <w:hyperlink r:id="rId122">
         <w:r>
           <w:rPr>
             <w:rStyle w:val="Hyperlink"/>
@@ -10924,14 +11128,14 @@
         </w:r>
       </w:hyperlink>
     </w:p>
-    <w:bookmarkEnd w:id="119"/>
-    <w:bookmarkStart w:id="121" w:name="ref-dataassigned"/>
+    <w:bookmarkEnd w:id="123"/>
+    <w:bookmarkStart w:id="125" w:name="ref-dataassigned"/>
     <w:p>
       <w:pPr>
         <w:pStyle w:val="Bibliography"/>
       </w:pPr>
       <w:r>
-        <w:t xml:space="preserve">30.</w:t>
+        <w:t xml:space="preserve">32.</w:t>
       </w:r>
       <w:r>
         <w:t xml:space="preserve"> </w:t>
@@ -10945,7 +11149,7 @@
       <w:r>
         <w:t xml:space="preserve"> </w:t>
       </w:r>
-      <w:hyperlink r:id="rId120">
+      <w:hyperlink r:id="rId124">
         <w:r>
           <w:rPr>
             <w:rStyle w:val="Hyperlink"/>
@@ -10954,14 +11158,14 @@
         </w:r>
       </w:hyperlink>
     </w:p>
-    <w:bookmarkEnd w:id="121"/>
-    <w:bookmarkStart w:id="123" w:name="ref-osfproject"/>
+    <w:bookmarkEnd w:id="125"/>
+    <w:bookmarkStart w:id="127" w:name="ref-osfproject"/>
     <w:p>
       <w:pPr>
         <w:pStyle w:val="Bibliography"/>
       </w:pPr>
       <w:r>
-        <w:t xml:space="preserve">31.</w:t>
+        <w:t xml:space="preserve">33.</w:t>
       </w:r>
       <w:r>
         <w:t xml:space="preserve"> </w:t>
@@ -11014,7 +11218,7 @@
       <w:r>
         <w:t xml:space="preserve">data snapshot. Published online 2026. doi:</w:t>
       </w:r>
-      <w:hyperlink r:id="rId122">
+      <w:hyperlink r:id="rId126">
         <w:r>
           <w:rPr>
             <w:rStyle w:val="Hyperlink"/>
@@ -11023,14 +11227,14 @@
         </w:r>
       </w:hyperlink>
     </w:p>
-    <w:bookmarkEnd w:id="123"/>
-    <w:bookmarkStart w:id="125" w:name="ref-suppression"/>
+    <w:bookmarkEnd w:id="127"/>
+    <w:bookmarkStart w:id="129" w:name="ref-suppression"/>
     <w:p>
       <w:pPr>
         <w:pStyle w:val="Bibliography"/>
       </w:pPr>
       <w:r>
-        <w:t xml:space="preserve">32.</w:t>
+        <w:t xml:space="preserve">34.</w:t>
       </w:r>
       <w:r>
         <w:t xml:space="preserve"> </w:t>
@@ -11056,7 +11260,7 @@
       <w:r>
         <w:t xml:space="preserve"> </w:t>
       </w:r>
-      <w:hyperlink r:id="rId124">
+      <w:hyperlink r:id="rId128">
         <w:r>
           <w:rPr>
             <w:rStyle w:val="Hyperlink"/>
@@ -11065,14 +11269,14 @@
         </w:r>
       </w:hyperlink>
     </w:p>
-    <w:bookmarkEnd w:id="125"/>
-    <w:bookmarkStart w:id="127" w:name="ref-specv10"/>
+    <w:bookmarkEnd w:id="129"/>
+    <w:bookmarkStart w:id="131" w:name="ref-specv10"/>
     <w:p>
       <w:pPr>
         <w:pStyle w:val="Bibliography"/>
       </w:pPr>
       <w:r>
-        <w:t xml:space="preserve">33.</w:t>
+        <w:t xml:space="preserve">35.</w:t>
       </w:r>
       <w:r>
         <w:t xml:space="preserve"> </w:t>
@@ -11107,7 +11311,7 @@
       <w:r>
         <w:t xml:space="preserve"> </w:t>
       </w:r>
-      <w:hyperlink r:id="rId126">
+      <w:hyperlink r:id="rId130">
         <w:r>
           <w:rPr>
             <w:rStyle w:val="Hyperlink"/>
@@ -11116,14 +11320,14 @@
         </w:r>
       </w:hyperlink>
     </w:p>
-    <w:bookmarkEnd w:id="127"/>
-    <w:bookmarkStart w:id="129" w:name="ref-cfr425600"/>
+    <w:bookmarkEnd w:id="131"/>
+    <w:bookmarkStart w:id="133" w:name="ref-cfr425600"/>
     <w:p>
       <w:pPr>
         <w:pStyle w:val="Bibliography"/>
       </w:pPr>
       <w:r>
-        <w:t xml:space="preserve">34.</w:t>
+        <w:t xml:space="preserve">36.</w:t>
       </w:r>
       <w:r>
         <w:t xml:space="preserve"> </w:t>
@@ -11161,7 +11365,7 @@
       <w:r>
         <w:t xml:space="preserve"> </w:t>
       </w:r>
-      <w:hyperlink r:id="rId128">
+      <w:hyperlink r:id="rId132">
         <w:r>
           <w:rPr>
             <w:rStyle w:val="Hyperlink"/>
@@ -11170,14 +11374,14 @@
         </w:r>
       </w:hyperlink>
     </w:p>
-    <w:bookmarkEnd w:id="129"/>
-    <w:bookmarkStart w:id="131" w:name="ref-rubin1981"/>
+    <w:bookmarkEnd w:id="133"/>
+    <w:bookmarkStart w:id="135" w:name="ref-rubin1981"/>
     <w:p>
       <w:pPr>
         <w:pStyle w:val="Bibliography"/>
       </w:pPr>
       <w:r>
-        <w:t xml:space="preserve">35.</w:t>
+        <w:t xml:space="preserve">37.</w:t>
       </w:r>
       <w:r>
         <w:t xml:space="preserve"> </w:t>
@@ -11201,7 +11405,7 @@
       <w:r>
         <w:t xml:space="preserve">. 1981;9(1):130-134. doi:</w:t>
       </w:r>
-      <w:hyperlink r:id="rId130">
+      <w:hyperlink r:id="rId134">
         <w:r>
           <w:rPr>
             <w:rStyle w:val="Hyperlink"/>
@@ -11210,14 +11414,14 @@
         </w:r>
       </w:hyperlink>
     </w:p>
-    <w:bookmarkEnd w:id="131"/>
-    <w:bookmarkStart w:id="133" w:name="ref-phipson2010"/>
+    <w:bookmarkEnd w:id="135"/>
+    <w:bookmarkStart w:id="137" w:name="ref-phipson2010"/>
     <w:p>
       <w:pPr>
         <w:pStyle w:val="Bibliography"/>
       </w:pPr>
       <w:r>
-        <w:t xml:space="preserve">36.</w:t>
+        <w:t xml:space="preserve">38.</w:t>
       </w:r>
       <w:r>
         <w:t xml:space="preserve"> </w:t>
@@ -11241,7 +11445,7 @@
       <w:r>
         <w:t xml:space="preserve">. 2010;9(1):39. doi:</w:t>
       </w:r>
-      <w:hyperlink r:id="rId132">
+      <w:hyperlink r:id="rId136">
         <w:r>
           <w:rPr>
             <w:rStyle w:val="Hyperlink"/>
@@ -11250,14 +11454,14 @@
         </w:r>
       </w:hyperlink>
     </w:p>
-    <w:bookmarkEnd w:id="133"/>
-    <w:bookmarkStart w:id="135" w:name="ref-pymc2023"/>
+    <w:bookmarkEnd w:id="137"/>
+    <w:bookmarkStart w:id="139" w:name="ref-pymc2023"/>
     <w:p>
       <w:pPr>
         <w:pStyle w:val="Bibliography"/>
       </w:pPr>
       <w:r>
-        <w:t xml:space="preserve">37.</w:t>
+        <w:t xml:space="preserve">39.</w:t>
       </w:r>
       <w:r>
         <w:t xml:space="preserve"> </w:t>
@@ -11281,7 +11485,7 @@
       <w:r>
         <w:t xml:space="preserve">. 2023;9:e1516. doi:</w:t>
       </w:r>
-      <w:hyperlink r:id="rId134">
+      <w:hyperlink r:id="rId138">
         <w:r>
           <w:rPr>
             <w:rStyle w:val="Hyperlink"/>
@@ -11290,14 +11494,14 @@
         </w:r>
       </w:hyperlink>
     </w:p>
-    <w:bookmarkEnd w:id="135"/>
-    <w:bookmarkStart w:id="137" w:name="ref-hoffman2014"/>
+    <w:bookmarkEnd w:id="139"/>
+    <w:bookmarkStart w:id="141" w:name="ref-hoffman2014"/>
     <w:p>
       <w:pPr>
         <w:pStyle w:val="Bibliography"/>
       </w:pPr>
       <w:r>
-        <w:t xml:space="preserve">38.</w:t>
+        <w:t xml:space="preserve">40.</w:t>
       </w:r>
       <w:r>
         <w:t xml:space="preserve"> </w:t>
@@ -11357,7 +11561,7 @@
       <w:r>
         <w:t xml:space="preserve"> </w:t>
       </w:r>
-      <w:hyperlink r:id="rId136">
+      <w:hyperlink r:id="rId140">
         <w:r>
           <w:rPr>
             <w:rStyle w:val="Hyperlink"/>
@@ -11366,14 +11570,14 @@
         </w:r>
       </w:hyperlink>
     </w:p>
-    <w:bookmarkEnd w:id="137"/>
-    <w:bookmarkStart w:id="139" w:name="ref-gelman2008"/>
+    <w:bookmarkEnd w:id="141"/>
+    <w:bookmarkStart w:id="143" w:name="ref-gelman2008"/>
     <w:p>
       <w:pPr>
         <w:pStyle w:val="Bibliography"/>
       </w:pPr>
       <w:r>
-        <w:t xml:space="preserve">39.</w:t>
+        <w:t xml:space="preserve">41.</w:t>
       </w:r>
       <w:r>
         <w:t xml:space="preserve"> </w:t>
@@ -11397,7 +11601,7 @@
       <w:r>
         <w:t xml:space="preserve">. 2008;27(15):2865-2873. doi:</w:t>
       </w:r>
-      <w:hyperlink r:id="rId138">
+      <w:hyperlink r:id="rId142">
         <w:r>
           <w:rPr>
             <w:rStyle w:val="Hyperlink"/>
@@ -11406,14 +11610,14 @@
         </w:r>
       </w:hyperlink>
     </w:p>
-    <w:bookmarkEnd w:id="139"/>
-    <w:bookmarkStart w:id="141" w:name="ref-vehtari2021"/>
+    <w:bookmarkEnd w:id="143"/>
+    <w:bookmarkStart w:id="145" w:name="ref-vehtari2021"/>
     <w:p>
       <w:pPr>
         <w:pStyle w:val="Bibliography"/>
       </w:pPr>
       <w:r>
-        <w:t xml:space="preserve">40.</w:t>
+        <w:t xml:space="preserve">42.</w:t>
       </w:r>
       <w:r>
         <w:t xml:space="preserve"> </w:t>
@@ -11437,7 +11641,7 @@
       <w:r>
         <w:t xml:space="preserve">. 2021;16(2):667-718. doi:</w:t>
       </w:r>
-      <w:hyperlink r:id="rId140">
+      <w:hyperlink r:id="rId144">
         <w:r>
           <w:rPr>
             <w:rStyle w:val="Hyperlink"/>
@@ -11446,14 +11650,14 @@
         </w:r>
       </w:hyperlink>
     </w:p>
-    <w:bookmarkEnd w:id="141"/>
-    <w:bookmarkStart w:id="143" w:name="ref-firth1993"/>
+    <w:bookmarkEnd w:id="145"/>
+    <w:bookmarkStart w:id="147" w:name="ref-firth1993"/>
     <w:p>
       <w:pPr>
         <w:pStyle w:val="Bibliography"/>
       </w:pPr>
       <w:r>
-        <w:t xml:space="preserve">41.</w:t>
+        <w:t xml:space="preserve">43.</w:t>
       </w:r>
       <w:r>
         <w:t xml:space="preserve"> </w:t>
@@ -11477,7 +11681,7 @@
       <w:r>
         <w:t xml:space="preserve">. 1993;80(1):27-38. doi:</w:t>
       </w:r>
-      <w:hyperlink r:id="rId142">
+      <w:hyperlink r:id="rId146">
         <w:r>
           <w:rPr>
             <w:rStyle w:val="Hyperlink"/>
@@ -11486,14 +11690,14 @@
         </w:r>
       </w:hyperlink>
     </w:p>
-    <w:bookmarkEnd w:id="143"/>
-    <w:bookmarkStart w:id="145" w:name="ref-firthmodels"/>
+    <w:bookmarkEnd w:id="147"/>
+    <w:bookmarkStart w:id="149" w:name="ref-firthmodels"/>
     <w:p>
       <w:pPr>
         <w:pStyle w:val="Bibliography"/>
       </w:pPr>
       <w:r>
-        <w:t xml:space="preserve">42.</w:t>
+        <w:t xml:space="preserve">44.</w:t>
       </w:r>
       <w:r>
         <w:t xml:space="preserve"> </w:t>
@@ -11537,7 +11741,7 @@
       <w:r>
         <w:t xml:space="preserve"> </w:t>
       </w:r>
-      <w:hyperlink r:id="rId144">
+      <w:hyperlink r:id="rId148">
         <w:r>
           <w:rPr>
             <w:rStyle w:val="Hyperlink"/>
@@ -11546,14 +11750,14 @@
         </w:r>
       </w:hyperlink>
     </w:p>
-    <w:bookmarkEnd w:id="145"/>
-    <w:bookmarkStart w:id="147" w:name="ref-gelmanprior2008"/>
+    <w:bookmarkEnd w:id="149"/>
+    <w:bookmarkStart w:id="151" w:name="ref-gelmanprior2008"/>
     <w:p>
       <w:pPr>
         <w:pStyle w:val="Bibliography"/>
       </w:pPr>
       <w:r>
-        <w:t xml:space="preserve">43.</w:t>
+        <w:t xml:space="preserve">45.</w:t>
       </w:r>
       <w:r>
         <w:t xml:space="preserve"> </w:t>
@@ -11577,7 +11781,7 @@
       <w:r>
         <w:t xml:space="preserve">. 2008;2(4):1360-1383. doi:</w:t>
       </w:r>
-      <w:hyperlink r:id="rId146">
+      <w:hyperlink r:id="rId150">
         <w:r>
           <w:rPr>
             <w:rStyle w:val="Hyperlink"/>
@@ -11586,14 +11790,14 @@
         </w:r>
       </w:hyperlink>
     </w:p>
-    <w:bookmarkEnd w:id="147"/>
-    <w:bookmarkStart w:id="149" w:name="ref-callaway2021"/>
+    <w:bookmarkEnd w:id="151"/>
+    <w:bookmarkStart w:id="153" w:name="ref-callaway2021"/>
     <w:p>
       <w:pPr>
         <w:pStyle w:val="Bibliography"/>
       </w:pPr>
       <w:r>
-        <w:t xml:space="preserve">44.</w:t>
+        <w:t xml:space="preserve">46.</w:t>
       </w:r>
       <w:r>
         <w:t xml:space="preserve"> </w:t>
@@ -11617,7 +11821,7 @@
       <w:r>
         <w:t xml:space="preserve">. 2021;225(2):200-230. doi:</w:t>
       </w:r>
-      <w:hyperlink r:id="rId148">
+      <w:hyperlink r:id="rId152">
         <w:r>
           <w:rPr>
             <w:rStyle w:val="Hyperlink"/>
@@ -11626,14 +11830,14 @@
         </w:r>
       </w:hyperlink>
     </w:p>
-    <w:bookmarkEnd w:id="149"/>
-    <w:bookmarkStart w:id="151" w:name="ref-roth2022"/>
+    <w:bookmarkEnd w:id="153"/>
+    <w:bookmarkStart w:id="155" w:name="ref-roth2022"/>
     <w:p>
       <w:pPr>
         <w:pStyle w:val="Bibliography"/>
       </w:pPr>
       <w:r>
-        <w:t xml:space="preserve">45.</w:t>
+        <w:t xml:space="preserve">47.</w:t>
       </w:r>
       <w:r>
         <w:t xml:space="preserve"> </w:t>
@@ -11657,7 +11861,7 @@
       <w:r>
         <w:t xml:space="preserve">. 2022;4(3):305-322. doi:</w:t>
       </w:r>
-      <w:hyperlink r:id="rId150">
+      <w:hyperlink r:id="rId154">
         <w:r>
           <w:rPr>
             <w:rStyle w:val="Hyperlink"/>
@@ -11666,14 +11870,14 @@
         </w:r>
       </w:hyperlink>
     </w:p>
-    <w:bookmarkEnd w:id="151"/>
-    <w:bookmarkStart w:id="153" w:name="ref-lakens2017"/>
+    <w:bookmarkEnd w:id="155"/>
+    <w:bookmarkStart w:id="157" w:name="ref-lakens2017"/>
     <w:p>
       <w:pPr>
         <w:pStyle w:val="Bibliography"/>
       </w:pPr>
       <w:r>
-        <w:t xml:space="preserve">46.</w:t>
+        <w:t xml:space="preserve">48.</w:t>
       </w:r>
       <w:r>
         <w:t xml:space="preserve"> </w:t>
@@ -11697,7 +11901,7 @@
       <w:r>
         <w:t xml:space="preserve">. 2017;8(4):355-362. doi:</w:t>
       </w:r>
-      <w:hyperlink r:id="rId152">
+      <w:hyperlink r:id="rId156">
         <w:r>
           <w:rPr>
             <w:rStyle w:val="Hyperlink"/>
@@ -11706,14 +11910,14 @@
         </w:r>
       </w:hyperlink>
     </w:p>
-    <w:bookmarkEnd w:id="153"/>
-    <w:bookmarkStart w:id="155" w:name="ref-rambachan2023"/>
+    <w:bookmarkEnd w:id="157"/>
+    <w:bookmarkStart w:id="159" w:name="ref-rambachan2023"/>
     <w:p>
       <w:pPr>
         <w:pStyle w:val="Bibliography"/>
       </w:pPr>
       <w:r>
-        <w:t xml:space="preserve">47.</w:t>
+        <w:t xml:space="preserve">49.</w:t>
       </w:r>
       <w:r>
         <w:t xml:space="preserve"> </w:t>
@@ -11737,7 +11941,7 @@
       <w:r>
         <w:t xml:space="preserve">. 2023;90(5):2555-2591. doi:</w:t>
       </w:r>
-      <w:hyperlink r:id="rId154">
+      <w:hyperlink r:id="rId158">
         <w:r>
           <w:rPr>
             <w:rStyle w:val="Hyperlink"/>
@@ -11746,14 +11950,14 @@
         </w:r>
       </w:hyperlink>
     </w:p>
-    <w:bookmarkEnd w:id="155"/>
-    <w:bookmarkStart w:id="157" w:name="ref-rosenbaum1983"/>
+    <w:bookmarkEnd w:id="159"/>
+    <w:bookmarkStart w:id="161" w:name="ref-rosenbaum1983"/>
     <w:p>
       <w:pPr>
         <w:pStyle w:val="Bibliography"/>
       </w:pPr>
       <w:r>
-        <w:t xml:space="preserve">48.</w:t>
+        <w:t xml:space="preserve">50.</w:t>
       </w:r>
       <w:r>
         <w:t xml:space="preserve"> </w:t>
@@ -11777,7 +11981,7 @@
       <w:r>
         <w:t xml:space="preserve">. 1983;70(1):41-55. doi:</w:t>
       </w:r>
-      <w:hyperlink r:id="rId156">
+      <w:hyperlink r:id="rId160">
         <w:r>
           <w:rPr>
             <w:rStyle w:val="Hyperlink"/>
@@ -11786,14 +11990,14 @@
         </w:r>
       </w:hyperlink>
     </w:p>
-    <w:bookmarkEnd w:id="157"/>
-    <w:bookmarkStart w:id="159" w:name="ref-welch1947"/>
+    <w:bookmarkEnd w:id="161"/>
+    <w:bookmarkStart w:id="163" w:name="ref-welch1947"/>
     <w:p>
       <w:pPr>
         <w:pStyle w:val="Bibliography"/>
       </w:pPr>
       <w:r>
-        <w:t xml:space="preserve">49.</w:t>
+        <w:t xml:space="preserve">51.</w:t>
       </w:r>
       <w:r>
         <w:t xml:space="preserve"> </w:t>
@@ -11829,7 +12033,7 @@
       <w:r>
         <w:t xml:space="preserve">. 1947;34(1-2):28-35. doi:</w:t>
       </w:r>
-      <w:hyperlink r:id="rId158">
+      <w:hyperlink r:id="rId162">
         <w:r>
           <w:rPr>
             <w:rStyle w:val="Hyperlink"/>
@@ -11838,14 +12042,14 @@
         </w:r>
       </w:hyperlink>
     </w:p>
-    <w:bookmarkEnd w:id="159"/>
-    <w:bookmarkStart w:id="161" w:name="ref-mackinnon1985"/>
+    <w:bookmarkEnd w:id="163"/>
+    <w:bookmarkStart w:id="165" w:name="ref-mackinnon1985"/>
     <w:p>
       <w:pPr>
         <w:pStyle w:val="Bibliography"/>
       </w:pPr>
       <w:r>
-        <w:t xml:space="preserve">50.</w:t>
+        <w:t xml:space="preserve">52.</w:t>
       </w:r>
       <w:r>
         <w:t xml:space="preserve"> </w:t>
@@ -11869,7 +12073,7 @@
       <w:r>
         <w:t xml:space="preserve">. 1985;29(3):305-325. doi:</w:t>
       </w:r>
-      <w:hyperlink r:id="rId160">
+      <w:hyperlink r:id="rId164">
         <w:r>
           <w:rPr>
             <w:rStyle w:val="Hyperlink"/>
@@ -11878,14 +12082,14 @@
         </w:r>
       </w:hyperlink>
     </w:p>
-    <w:bookmarkEnd w:id="161"/>
-    <w:bookmarkStart w:id="163" w:name="ref-statsmodels2010"/>
+    <w:bookmarkEnd w:id="165"/>
+    <w:bookmarkStart w:id="167" w:name="ref-statsmodels2010"/>
     <w:p>
       <w:pPr>
         <w:pStyle w:val="Bibliography"/>
       </w:pPr>
       <w:r>
-        <w:t xml:space="preserve">51.</w:t>
+        <w:t xml:space="preserve">53.</w:t>
       </w:r>
       <w:r>
         <w:t xml:space="preserve"> </w:t>
@@ -11909,7 +12113,7 @@
       <w:r>
         <w:t xml:space="preserve">. Published online 2010:92-96. doi:</w:t>
       </w:r>
-      <w:hyperlink r:id="rId162">
+      <w:hyperlink r:id="rId166">
         <w:r>
           <w:rPr>
             <w:rStyle w:val="Hyperlink"/>
@@ -11918,14 +12122,14 @@
         </w:r>
       </w:hyperlink>
     </w:p>
-    <w:bookmarkEnd w:id="163"/>
-    <w:bookmarkStart w:id="165" w:name="ref-dbt"/>
+    <w:bookmarkEnd w:id="167"/>
+    <w:bookmarkStart w:id="169" w:name="ref-dbt"/>
     <w:p>
       <w:pPr>
         <w:pStyle w:val="Bibliography"/>
       </w:pPr>
       <w:r>
-        <w:t xml:space="preserve">52.</w:t>
+        <w:t xml:space="preserve">54.</w:t>
       </w:r>
       <w:r>
         <w:t xml:space="preserve"> </w:t>
@@ -11966,7 +12170,7 @@
       <w:r>
         <w:t xml:space="preserve"> </w:t>
       </w:r>
-      <w:hyperlink r:id="rId164">
+      <w:hyperlink r:id="rId168">
         <w:r>
           <w:rPr>
             <w:rStyle w:val="Hyperlink"/>
@@ -11975,14 +12179,14 @@
         </w:r>
       </w:hyperlink>
     </w:p>
-    <w:bookmarkEnd w:id="165"/>
-    <w:bookmarkStart w:id="167" w:name="ref-duckdb2019"/>
+    <w:bookmarkEnd w:id="169"/>
+    <w:bookmarkStart w:id="171" w:name="ref-duckdb2019"/>
     <w:p>
       <w:pPr>
         <w:pStyle w:val="Bibliography"/>
       </w:pPr>
       <w:r>
-        <w:t xml:space="preserve">53.</w:t>
+        <w:t xml:space="preserve">55.</w:t>
       </w:r>
       <w:r>
         <w:t xml:space="preserve"> </w:t>
@@ -12006,7 +12210,7 @@
       <w:r>
         <w:t xml:space="preserve">. Published online June 25, 2019:1981-1984. doi:</w:t>
       </w:r>
-      <w:hyperlink r:id="rId166">
+      <w:hyperlink r:id="rId170">
         <w:r>
           <w:rPr>
             <w:rStyle w:val="Hyperlink"/>
@@ -12015,14 +12219,14 @@
         </w:r>
       </w:hyperlink>
     </w:p>
-    <w:bookmarkEnd w:id="167"/>
-    <w:bookmarkStart w:id="169" w:name="ref-uv"/>
+    <w:bookmarkEnd w:id="171"/>
+    <w:bookmarkStart w:id="173" w:name="ref-uv"/>
     <w:p>
       <w:pPr>
         <w:pStyle w:val="Bibliography"/>
       </w:pPr>
       <w:r>
-        <w:t xml:space="preserve">54.</w:t>
+        <w:t xml:space="preserve">56.</w:t>
       </w:r>
       <w:r>
         <w:t xml:space="preserve"> </w:t>
@@ -12057,7 +12261,7 @@
       <w:r>
         <w:t xml:space="preserve"> </w:t>
       </w:r>
-      <w:hyperlink r:id="rId168">
+      <w:hyperlink r:id="rId172">
         <w:r>
           <w:rPr>
             <w:rStyle w:val="Hyperlink"/>
@@ -12066,14 +12270,14 @@
         </w:r>
       </w:hyperlink>
     </w:p>
-    <w:bookmarkEnd w:id="169"/>
-    <w:bookmarkStart w:id="171" w:name="ref-arviz2019"/>
+    <w:bookmarkEnd w:id="173"/>
+    <w:bookmarkStart w:id="175" w:name="ref-arviz2019"/>
     <w:p>
       <w:pPr>
         <w:pStyle w:val="Bibliography"/>
       </w:pPr>
       <w:r>
-        <w:t xml:space="preserve">55.</w:t>
+        <w:t xml:space="preserve">57.</w:t>
       </w:r>
       <w:r>
         <w:t xml:space="preserve"> </w:t>
@@ -12097,7 +12301,7 @@
       <w:r>
         <w:t xml:space="preserve">. 2019;4(33):1143. doi:</w:t>
       </w:r>
-      <w:hyperlink r:id="rId170">
+      <w:hyperlink r:id="rId174">
         <w:r>
           <w:rPr>
             <w:rStyle w:val="Hyperlink"/>
@@ -12106,14 +12310,14 @@
         </w:r>
       </w:hyperlink>
     </w:p>
-    <w:bookmarkEnd w:id="171"/>
-    <w:bookmarkStart w:id="173" w:name="ref-numpy2020"/>
+    <w:bookmarkEnd w:id="175"/>
+    <w:bookmarkStart w:id="177" w:name="ref-numpy2020"/>
     <w:p>
       <w:pPr>
         <w:pStyle w:val="Bibliography"/>
       </w:pPr>
       <w:r>
-        <w:t xml:space="preserve">56.</w:t>
+        <w:t xml:space="preserve">58.</w:t>
       </w:r>
       <w:r>
         <w:t xml:space="preserve"> </w:t>
@@ -12137,7 +12341,7 @@
       <w:r>
         <w:t xml:space="preserve">. 2020;585(7825):357-362. doi:</w:t>
       </w:r>
-      <w:hyperlink r:id="rId172">
+      <w:hyperlink r:id="rId176">
         <w:r>
           <w:rPr>
             <w:rStyle w:val="Hyperlink"/>
@@ -12146,14 +12350,14 @@
         </w:r>
       </w:hyperlink>
     </w:p>
-    <w:bookmarkEnd w:id="173"/>
-    <w:bookmarkStart w:id="175" w:name="ref-cfr46102"/>
+    <w:bookmarkEnd w:id="177"/>
+    <w:bookmarkStart w:id="179" w:name="ref-cfr46102"/>
     <w:p>
       <w:pPr>
         <w:pStyle w:val="Bibliography"/>
       </w:pPr>
       <w:r>
-        <w:t xml:space="preserve">57.</w:t>
+        <w:t xml:space="preserve">59.</w:t>
       </w:r>
       <w:r>
         <w:t xml:space="preserve"> </w:t>
@@ -12191,7 +12395,7 @@
       <w:r>
         <w:t xml:space="preserve"> </w:t>
       </w:r>
-      <w:hyperlink r:id="rId174">
+      <w:hyperlink r:id="rId178">
         <w:r>
           <w:rPr>
             <w:rStyle w:val="Hyperlink"/>
@@ -12200,14 +12404,14 @@
         </w:r>
       </w:hyperlink>
     </w:p>
-    <w:bookmarkEnd w:id="175"/>
-    <w:bookmarkStart w:id="177" w:name="ref-gelmancarlin2014"/>
+    <w:bookmarkEnd w:id="179"/>
+    <w:bookmarkStart w:id="181" w:name="ref-gelmancarlin2014"/>
     <w:p>
       <w:pPr>
         <w:pStyle w:val="Bibliography"/>
       </w:pPr>
       <w:r>
-        <w:t xml:space="preserve">58.</w:t>
+        <w:t xml:space="preserve">60.</w:t>
       </w:r>
       <w:r>
         <w:t xml:space="preserve"> </w:t>
@@ -12231,7 +12435,7 @@
       <w:r>
         <w:t xml:space="preserve">. 2014;9(6):641-651. doi:</w:t>
       </w:r>
-      <w:hyperlink r:id="rId176">
+      <w:hyperlink r:id="rId180">
         <w:r>
           <w:rPr>
             <w:rStyle w:val="Hyperlink"/>
@@ -12240,14 +12444,14 @@
         </w:r>
       </w:hyperlink>
     </w:p>
-    <w:bookmarkEnd w:id="177"/>
-    <w:bookmarkStart w:id="179" w:name="ref-cfr2024"/>
+    <w:bookmarkEnd w:id="181"/>
+    <w:bookmarkStart w:id="183" w:name="ref-cfr2024"/>
     <w:p>
       <w:pPr>
         <w:pStyle w:val="Bibliography"/>
       </w:pPr>
       <w:r>
-        <w:t xml:space="preserve">59.</w:t>
+        <w:t xml:space="preserve">61.</w:t>
       </w:r>
       <w:r>
         <w:t xml:space="preserve"> </w:t>
@@ -12285,7 +12489,7 @@
       <w:r>
         <w:t xml:space="preserve"> </w:t>
       </w:r>
-      <w:hyperlink r:id="rId178">
+      <w:hyperlink r:id="rId182">
         <w:r>
           <w:rPr>
             <w:rStyle w:val="Hyperlink"/>
@@ -12294,14 +12498,14 @@
         </w:r>
       </w:hyperlink>
     </w:p>
-    <w:bookmarkEnd w:id="179"/>
-    <w:bookmarkStart w:id="181" w:name="ref-aha2021"/>
+    <w:bookmarkEnd w:id="183"/>
+    <w:bookmarkStart w:id="185" w:name="ref-aha2021"/>
     <w:p>
       <w:pPr>
         <w:pStyle w:val="Bibliography"/>
       </w:pPr>
       <w:r>
-        <w:t xml:space="preserve">60.</w:t>
+        <w:t xml:space="preserve">62.</w:t>
       </w:r>
       <w:r>
         <w:t xml:space="preserve"> </w:t>
@@ -12345,7 +12549,7 @@
       <w:r>
         <w:t xml:space="preserve"> </w:t>
       </w:r>
-      <w:hyperlink r:id="rId180">
+      <w:hyperlink r:id="rId184">
         <w:r>
           <w:rPr>
             <w:rStyle w:val="Hyperlink"/>
@@ -12354,14 +12558,14 @@
         </w:r>
       </w:hyperlink>
     </w:p>
-    <w:bookmarkEnd w:id="181"/>
-    <w:bookmarkStart w:id="183" w:name="ref-paperrepo"/>
+    <w:bookmarkEnd w:id="185"/>
+    <w:bookmarkStart w:id="187" w:name="ref-paperrepo"/>
     <w:p>
       <w:pPr>
         <w:pStyle w:val="Bibliography"/>
       </w:pPr>
       <w:r>
-        <w:t xml:space="preserve">61.</w:t>
+        <w:t xml:space="preserve">63.</w:t>
       </w:r>
       <w:r>
         <w:t xml:space="preserve"> </w:t>
@@ -12387,7 +12591,7 @@
       <w:r>
         <w:t xml:space="preserve"> </w:t>
       </w:r>
-      <w:hyperlink r:id="rId182">
+      <w:hyperlink r:id="rId186">
         <w:r>
           <w:rPr>
             <w:rStyle w:val="Hyperlink"/>
@@ -12396,14 +12600,14 @@
         </w:r>
       </w:hyperlink>
     </w:p>
-    <w:bookmarkEnd w:id="183"/>
-    <w:bookmarkStart w:id="185" w:name="ref-post"/>
+    <w:bookmarkEnd w:id="187"/>
+    <w:bookmarkStart w:id="189" w:name="ref-post"/>
     <w:p>
       <w:pPr>
         <w:pStyle w:val="Bibliography"/>
       </w:pPr>
       <w:r>
-        <w:t xml:space="preserve">62.</w:t>
+        <w:t xml:space="preserve">64.</w:t>
       </w:r>
       <w:r>
         <w:t xml:space="preserve"> </w:t>
@@ -12447,7 +12651,7 @@
       <w:r>
         <w:t xml:space="preserve"> </w:t>
       </w:r>
-      <w:hyperlink r:id="rId184">
+      <w:hyperlink r:id="rId188">
         <w:r>
           <w:rPr>
             <w:rStyle w:val="Hyperlink"/>
@@ -12456,9 +12660,9 @@
         </w:r>
       </w:hyperlink>
     </w:p>
-    <w:bookmarkEnd w:id="185"/>
-    <w:bookmarkEnd w:id="186"/>
-    <w:bookmarkEnd w:id="187"/>
+    <w:bookmarkEnd w:id="189"/>
+    <w:bookmarkEnd w:id="190"/>
+    <w:bookmarkEnd w:id="191"/>
     <w:sectPr>
       <w:footnotePr>
         <w:numRestart w:val="eachSect"/>

</xml_diff>

<commit_message>
Manuscript: one coherent contribution after the cold read
The registered H2b wording is flagged as overstated once the decomposition is known; the introduction says what the
regional pull can show; CMS's 2018 rationale for barring BASIC-to-ENHANCED moves (83 FR 67859) frames early renewal
as the designed price of ENHANCED; the abstract reports 26 of 27 BASIC-track early renewers moving to ENHANCED;
the data are read, as interpretation, as fitting the sharing-rate motive better than the reset motive; the spending
result is stated as a bound; Implications are concrete for the 2024 rules; Einav et al. 2022 (selection on levels)
added; hypothesis labels replaced by plain names in the Discussion; repeated caveats cut. New post hoc check (not
registered): rank correlation of the pull with the PY2020 savings rate 0.45 (eTable 12; stharrold.github.io
7fa20c0). Checks pass: numbers, JMIR validator (abstract 445/450, 8,795 words), tests.

Co-Authored-By: Claude Opus 5.5 <noreply@anthropic.com>
</commit_message>
<xml_diff>
--- a/paper.docx
+++ b/paper.docx
@@ -224,13 +224,13 @@
         <w:t xml:space="preserve"> </w:t>
       </w:r>
       <w:r>
-        <w:t xml:space="preserve">2019 or January 1, 2020, using Centers for Medicare &amp; Medicaid Services (CMS) public use files (2016-2024). Plan,</w:t>
-      </w:r>
-      <w:r>
-        <w:t xml:space="preserve"> </w:t>
-      </w:r>
-      <w:r>
-        <w:t xml:space="preserve">decision rules and code were registered before any outcome data were read. The reset benchmark was rebuilt from 42</w:t>
+        <w:t xml:space="preserve">2019 or January 1, 2020, using Centers for Medicare &amp; Medicaid Services (CMS) public use files (2016-2024). The plan, decision rules and code were registered before</w:t>
+      </w:r>
+      <w:r>
+        <w:t xml:space="preserve"> </w:t>
+      </w:r>
+      <w:r>
+        <w:t xml:space="preserve">outcome data were read. The reset benchmark was rebuilt from 42</w:t>
       </w:r>
       <w:r>
         <w:t xml:space="preserve"> </w:t>
@@ -248,13 +248,13 @@
         <w:t xml:space="preserve"> </w:t>
       </w:r>
       <w:r>
-        <w:t xml:space="preserve">regional spending relative to the current benchmark); the own-spending component of a reset and the BASIC risk level</w:t>
-      </w:r>
-      <w:r>
-        <w:t xml:space="preserve"> </w:t>
-      </w:r>
-      <w:r>
-        <w:t xml:space="preserve">were also examined. Groups were compared by Bayesian bootstrap and permutation tests, and early renewal was modeled by</w:t>
+        <w:t xml:space="preserve">regional spending relative to the current benchmark); the own-spending component and</w:t>
+      </w:r>
+      <w:r>
+        <w:t xml:space="preserve"> </w:t>
+      </w:r>
+      <w:r>
+        <w:t xml:space="preserve">BASIC risk level were also examined. Groups were compared by Bayesian bootstrap and permutation tests, and early renewal was modeled by</w:t>
       </w:r>
       <w:r>
         <w:t xml:space="preserve"> </w:t>
@@ -333,13 +333,19 @@
         <w:t xml:space="preserve"> </w:t>
       </w:r>
       <w:r>
-        <w:t xml:space="preserve">and a higher, two-sided BASIC level (1.34; 95% CrI, 0.38 to 2.31). Spending growth did not differ detectably</w:t>
-      </w:r>
-      <w:r>
-        <w:t xml:space="preserve"> </w:t>
-      </w:r>
-      <w:r>
-        <w:t xml:space="preserve">(−0.4%; 95% CrI, −4.0% to 2.5%); the equivalence condition did not hold, so this is not read as an effect.</w:t>
+        <w:t xml:space="preserve">and a higher BASIC level (levels C-E; 1.34; 95% CrI, 0.38 to 2.31), and 26 of all 27 BASIC-track early renewers moved to</w:t>
+      </w:r>
+      <w:r>
+        <w:t xml:space="preserve"> </w:t>
+      </w:r>
+      <w:r>
+        <w:t xml:space="preserve">ENHANCED. Spending growth did not differ detectably</w:t>
+      </w:r>
+      <w:r>
+        <w:t xml:space="preserve"> </w:t>
+      </w:r>
+      <w:r>
+        <w:t xml:space="preserve">(−0.4%; 95% CrI, −4.0% to 2.5%), and a preregistered pre-trend condition did not hold.</w:t>
       </w:r>
     </w:p>
     <w:p>
@@ -357,25 +363,31 @@
         <w:t xml:space="preserve"> </w:t>
       </w:r>
       <w:r>
-        <w:t xml:space="preserve">ACOs that renewed early more often had regions that spent more relative to their</w:t>
-      </w:r>
-      <w:r>
-        <w:t xml:space="preserve"> </w:t>
-      </w:r>
-      <w:r>
-        <w:t xml:space="preserve">benchmarks and were more often at higher BASIC levels, for which renewal opened a 75% sharing rate; the reset did</w:t>
-      </w:r>
-      <w:r>
-        <w:t xml:space="preserve"> </w:t>
-      </w:r>
-      <w:r>
-        <w:t xml:space="preserve">not on average raise their benchmarks. These are associations under the 2022 rules; benchmarks set from 2024 credit prior savings. These findings extend</w:t>
-      </w:r>
-      <w:r>
-        <w:t xml:space="preserve"> </w:t>
-      </w:r>
-      <w:r>
-        <w:t xml:space="preserve">evidence that benchmark rules sort ACOs to the timing of resets.</w:t>
+        <w:t xml:space="preserve">Early renewers were already beating their benchmarks, had more room under their regions’ spending</w:t>
+      </w:r>
+      <w:r>
+        <w:t xml:space="preserve"> </w:t>
+      </w:r>
+      <w:r>
+        <w:t xml:space="preserve">and, in the BASIC track, were at higher risk levels; for almost all, renewal was the</w:t>
+      </w:r>
+      <w:r>
+        <w:t xml:space="preserve"> </w:t>
+      </w:r>
+      <w:r>
+        <w:t xml:space="preserve">route to a 75% sharing rate, and the reset did not on average raise their benchmarks. The pattern fits the</w:t>
+      </w:r>
+      <w:r>
+        <w:t xml:space="preserve"> </w:t>
+      </w:r>
+      <w:r>
+        <w:t xml:space="preserve">sharing-rate motive better than the reset motive, though the design cannot separate them. These are associations</w:t>
+      </w:r>
+      <w:r>
+        <w:t xml:space="preserve"> </w:t>
+      </w:r>
+      <w:r>
+        <w:t xml:space="preserve">under rules that changed in 2024.</w:t>
       </w:r>
     </w:p>
     <w:p>
@@ -1042,7 +1054,31 @@
         <w:t xml:space="preserve"> </w:t>
       </w:r>
       <w:r>
-        <w:t xml:space="preserve">agreement ended, because the 2018 rule bars moving from BASIC to ENHANCED within an agreement period;</w:t>
+        <w:t xml:space="preserve">agreement ended, because the 2018 rule bars moving from BASIC to ENHANCED within an agreement period. CMS imposed that bar to guard</w:t>
+      </w:r>
+      <w:r>
+        <w:t xml:space="preserve"> </w:t>
+      </w:r>
+      <w:r>
+        <w:t xml:space="preserve">against selective entry into its highest-reward track by an ACO</w:t>
+      </w:r>
+      <w:r>
+        <w:t xml:space="preserve"> </w:t>
+      </w:r>
+      <w:r>
+        <w:t xml:space="preserve">“very confident of its ability to generate savings”</w:t>
+      </w:r>
+      <w:r>
+        <w:t xml:space="preserve"> </w:t>
+      </w:r>
+      <w:r>
+        <w:t xml:space="preserve">against its current benchmark, and named early renewal, with its rebased benchmark, as the way to make the</w:t>
+      </w:r>
+      <w:r>
+        <w:t xml:space="preserve"> </w:t>
+      </w:r>
+      <w:r>
+        <w:t xml:space="preserve">move.</w:t>
       </w:r>
       <w:r>
         <w:t xml:space="preserve">[</w:t>
@@ -1224,19 +1260,19 @@
         <w:t xml:space="preserve">sharing-rate motive</w:t>
       </w:r>
       <w:r>
-        <w:t xml:space="preserve">, a BASIC-track ACO renews to reach ENHANCED. The savings rate cannot separate</w:t>
-      </w:r>
-      <w:r>
-        <w:t xml:space="preserve"> </w:t>
-      </w:r>
-      <w:r>
-        <w:t xml:space="preserve">them: an ACO beating its benchmark would lose on the own-spending part of a reset, yet may gain on the regional part</w:t>
-      </w:r>
-      <w:r>
-        <w:t xml:space="preserve"> </w:t>
-      </w:r>
-      <w:r>
-        <w:t xml:space="preserve">if its region spends more. This study therefore took as its primary test the</w:t>
+        <w:t xml:space="preserve">, a BASIC-track ACO renews to reach ENHANCED. The savings rate alone cannot show</w:t>
+      </w:r>
+      <w:r>
+        <w:t xml:space="preserve"> </w:t>
+      </w:r>
+      <w:r>
+        <w:t xml:space="preserve">whether a reset would pay: an ACO beating its benchmark would lose on the own-spending part of a reset, yet may gain</w:t>
+      </w:r>
+      <w:r>
+        <w:t xml:space="preserve"> </w:t>
+      </w:r>
+      <w:r>
+        <w:t xml:space="preserve">on the regional part if its region spends more. The primary measure was therefore the</w:t>
       </w:r>
       <w:r>
         <w:t xml:space="preserve"> </w:t>
@@ -1249,19 +1285,25 @@
         <w:t xml:space="preserve">regional pull</w:t>
       </w:r>
       <w:r>
-        <w:t xml:space="preserve">, a measure of how</w:t>
-      </w:r>
-      <w:r>
-        <w:t xml:space="preserve"> </w:t>
-      </w:r>
-      <w:r>
-        <w:t xml:space="preserve">far an ACO’s case-mix-adjusted regional spending sat above its current benchmark, which contains no term for the</w:t>
-      </w:r>
-      <w:r>
-        <w:t xml:space="preserve"> </w:t>
-      </w:r>
-      <w:r>
-        <w:t xml:space="preserve">ACO’s own benchmark-year spending. It asked whether early renewers stood to gain more from the regional part of a</w:t>
+        <w:t xml:space="preserve">, how far an</w:t>
+      </w:r>
+      <w:r>
+        <w:t xml:space="preserve"> </w:t>
+      </w:r>
+      <w:r>
+        <w:t xml:space="preserve">ACO’s case-mix-adjusted regional spending sat above its current benchmark. It shows whether early renewers had room</w:t>
+      </w:r>
+      <w:r>
+        <w:t xml:space="preserve"> </w:t>
+      </w:r>
+      <w:r>
+        <w:t xml:space="preserve">to gain on the regional side of a reset, which the savings rate does not capture; the own-spending component and the</w:t>
+      </w:r>
+      <w:r>
+        <w:t xml:space="preserve"> </w:t>
+      </w:r>
+      <w:r>
+        <w:t xml:space="preserve">total expected gain then show whether that room would have raised their benchmarks. It asked whether early renewers stood to gain more from the regional part of a</w:t>
       </w:r>
       <w:r>
         <w:t xml:space="preserve"> </w:t>
@@ -1311,13 +1353,13 @@
         <w:t xml:space="preserve"> </w:t>
       </w:r>
       <w:r>
-        <w:t xml:space="preserve">Associations with pre-decision characteristics bear on the motives but</w:t>
-      </w:r>
-      <w:r>
-        <w:t xml:space="preserve"> </w:t>
-      </w:r>
-      <w:r>
-        <w:t xml:space="preserve">cannot establish them, and no test here can separate the two motives.</w:t>
+        <w:t xml:space="preserve">These associations bear on the</w:t>
+      </w:r>
+      <w:r>
+        <w:t xml:space="preserve"> </w:t>
+      </w:r>
+      <w:r>
+        <w:t xml:space="preserve">motives but cannot establish which one drove the choice.</w:t>
       </w:r>
     </w:p>
     <w:bookmarkEnd w:id="13"/>
@@ -3739,13 +3781,7 @@
         <w:pStyle w:val="FirstParagraph"/>
       </w:pPr>
       <w:r>
-        <w:t xml:space="preserve">After all registered results had been read, and in response to critical review of the draft, two checks of the</w:t>
-      </w:r>
-      <w:r>
-        <w:t xml:space="preserve"> </w:t>
-      </w:r>
-      <w:r>
-        <w:t xml:space="preserve">expected gain were added (eTable 12 in Multimedia Appendix 1). They reuse the registered pipeline’s tables and estimator,</w:t>
+        <w:t xml:space="preserve">After all registered results had been read, and in response to critical review of the draft, 3 checks were added (eTable 12 in Multimedia Appendix 1). They reuse the registered pipeline’s tables and estimator,</w:t>
       </w:r>
       <w:r>
         <w:t xml:space="preserve"> </w:t>
@@ -3769,13 +3805,19 @@
         <w:t xml:space="preserve"> </w:t>
       </w:r>
       <w:r>
-        <w:t xml:space="preserve">with the rebuilt gain, and their PY2021-to-PY2022 change in updated benchmark was compared with stayers’ with the</w:t>
-      </w:r>
-      <w:r>
-        <w:t xml:space="preserve"> </w:t>
-      </w:r>
-      <w:r>
-        <w:t xml:space="preserve">group-comparison estimator above.</w:t>
+        <w:t xml:space="preserve">with the rebuilt gain, and their PY2021-to-PY2022 change in updated benchmark was compared with stayers’ with the group-comparison estimator above. Third, the rank correlation of the regional pull</w:t>
+      </w:r>
+      <w:r>
+        <w:t xml:space="preserve"> </w:t>
+      </w:r>
+      <w:r>
+        <w:t xml:space="preserve">with the PY2020 and PY2021 savings rates and the own-spending component was computed, to ask whether the pull</w:t>
+      </w:r>
+      <w:r>
+        <w:t xml:space="preserve"> </w:t>
+      </w:r>
+      <w:r>
+        <w:t xml:space="preserve">restates past savings.</w:t>
       </w:r>
     </w:p>
     <w:bookmarkEnd w:id="31"/>
@@ -5407,13 +5449,25 @@
         <w:t xml:space="preserve"> </w:t>
       </w:r>
       <w:r>
-        <w:t xml:space="preserve">slightly understated for the 26 vs 241 compared (Table 2 and Figure 2). By the registered rule, H2b was supported:</w:t>
-      </w:r>
-      <w:r>
-        <w:t xml:space="preserve"> </w:t>
-      </w:r>
-      <w:r>
-        <w:t xml:space="preserve">early renewers’ regions spent more relative to their current benchmarks, evidence for the reset motive beyond past savings. The decomposition qualifies that reading. Weighted by the phase-in</w:t>
+        <w:t xml:space="preserve">slightly understated for the 26 vs 241 compared (Table 2 and Figure 2). By the registered rule, H2b was supported, which the plan worded as</w:t>
+      </w:r>
+      <w:r>
+        <w:t xml:space="preserve"> </w:t>
+      </w:r>
+      <w:r>
+        <w:t xml:space="preserve">“evidence for the reset motive</w:t>
+      </w:r>
+      <w:r>
+        <w:t xml:space="preserve"> </w:t>
+      </w:r>
+      <w:r>
+        <w:t xml:space="preserve">beyond past savings.”</w:t>
+      </w:r>
+      <w:r>
+        <w:t xml:space="preserve"> </w:t>
+      </w:r>
+      <w:r>
+        <w:t xml:space="preserve">The decomposition shows that this wording overstates the result. Weighted by the phase-in</w:t>
       </w:r>
       <w:r>
         <w:t xml:space="preserve"> </w:t>
@@ -5437,7 +5491,13 @@
         <w:t xml:space="preserve"> </w:t>
       </w:r>
       <w:r>
-        <w:t xml:space="preserve">to gain a higher benchmark. At the median PY2021 benchmark of the study’s ACOs, $11,312 per beneficiary per year, the difference of 3.35</w:t>
+        <w:t xml:space="preserve">to gain a higher benchmark. The pull is related to past savings without restating it: post hoc, its rank correlation</w:t>
+      </w:r>
+      <w:r>
+        <w:t xml:space="preserve"> </w:t>
+      </w:r>
+      <w:r>
+        <w:t xml:space="preserve">with the PY2020 savings rate was 0.45 among the 267 compared ACOs (eTable 12 in Multimedia Appendix 1). At the median PY2021 benchmark of the study’s ACOs, $11,312 per beneficiary per year, the difference of 3.35</w:t>
       </w:r>
       <w:r>
         <w:t xml:space="preserve"> </w:t>
@@ -8289,43 +8349,43 @@
         <w:pStyle w:val="FirstParagraph"/>
       </w:pPr>
       <w:r>
-        <w:t xml:space="preserve">In this preregistered study of the 2019 and 2020 MSSP cohorts, ACOs that ended their agreements early to begin new</w:t>
-      </w:r>
-      <w:r>
-        <w:t xml:space="preserve"> </w:t>
-      </w:r>
-      <w:r>
-        <w:t xml:space="preserve">ones on average had regions that spent more relative to their current benchmarks, and, among BASIC-track ACOs, were</w:t>
-      </w:r>
-      <w:r>
-        <w:t xml:space="preserve"> </w:t>
-      </w:r>
-      <w:r>
-        <w:t xml:space="preserve">more often already at the higher, two-sided levels. They were also beating their benchmarks by more than ACOs that</w:t>
-      </w:r>
-      <w:r>
-        <w:t xml:space="preserve"> </w:t>
-      </w:r>
-      <w:r>
-        <w:t xml:space="preserve">stayed, so by the study’s approximation a reset would not on average have raised their benchmarks: the regional gain</w:t>
-      </w:r>
-      <w:r>
-        <w:t xml:space="preserve"> </w:t>
-      </w:r>
-      <w:r>
-        <w:t xml:space="preserve">and the own-spending loss roughly offset. CMS’s published 2022 benchmarks, examined post hoc, agree. Spending growth in the 3 years after renewal did not differ detectably from</w:t>
-      </w:r>
-      <w:r>
-        <w:t xml:space="preserve"> </w:t>
-      </w:r>
-      <w:r>
-        <w:t xml:space="preserve">that of ACOs not yet renewed, a result the design could not separate from a continuation of a pre-period difference in</w:t>
-      </w:r>
-      <w:r>
-        <w:t xml:space="preserve"> </w:t>
-      </w:r>
-      <w:r>
-        <w:t xml:space="preserve">trends.</w:t>
+        <w:t xml:space="preserve">In this preregistered study of the 2019 and 2020 MSSP cohorts, the ACOs that ended their agreements early were</w:t>
+      </w:r>
+      <w:r>
+        <w:t xml:space="preserve"> </w:t>
+      </w:r>
+      <w:r>
+        <w:t xml:space="preserve">already beating their benchmarks by more than ACOs that stayed, had more room under their regions’ spending, and,</w:t>
+      </w:r>
+      <w:r>
+        <w:t xml:space="preserve"> </w:t>
+      </w:r>
+      <w:r>
+        <w:t xml:space="preserve">in the BASIC track, were more often already bearing two-sided risk. For 26 of the 27 BASIC-track early renewers,</w:t>
+      </w:r>
+      <w:r>
+        <w:t xml:space="preserve"> </w:t>
+      </w:r>
+      <w:r>
+        <w:t xml:space="preserve">renewal was the move to ENHANCED’s 75% sharing rate. By the study’s approximation, a reset would not on average have</w:t>
+      </w:r>
+      <w:r>
+        <w:t xml:space="preserve"> </w:t>
+      </w:r>
+      <w:r>
+        <w:t xml:space="preserve">raised their benchmarks, because the regional gain and the own-spending loss roughly offset, and the benchmarks CMS</w:t>
+      </w:r>
+      <w:r>
+        <w:t xml:space="preserve"> </w:t>
+      </w:r>
+      <w:r>
+        <w:t xml:space="preserve">published for 2022, examined post hoc, agree. Spending growth in the 3 years after renewal did not differ detectably</w:t>
+      </w:r>
+      <w:r>
+        <w:t xml:space="preserve"> </w:t>
+      </w:r>
+      <w:r>
+        <w:t xml:space="preserve">from that of ACOs not yet renewed.</w:t>
       </w:r>
     </w:p>
     <w:p>
@@ -8339,19 +8399,37 @@
         <w:t xml:space="preserve"> </w:t>
       </w:r>
       <w:r>
-        <w:t xml:space="preserve">3 things to the literature on how benchmark rules sort ACOs: evidence that the sorting extends from whether ACOs join</w:t>
-      </w:r>
-      <w:r>
-        <w:t xml:space="preserve"> </w:t>
-      </w:r>
-      <w:r>
-        <w:t xml:space="preserve">or leave to when they reset; evidence against the intuitive account that ACOs renewed early to raise their</w:t>
-      </w:r>
-      <w:r>
-        <w:t xml:space="preserve"> </w:t>
-      </w:r>
-      <w:r>
-        <w:t xml:space="preserve">benchmarks; and a preregistered estimate of spending after renewal, under rules that have since changed.</w:t>
+        <w:t xml:space="preserve">3 things to the literature on how benchmark rules sort ACOs. First, the sorting on regional position and risk found</w:t>
+      </w:r>
+      <w:r>
+        <w:t xml:space="preserve"> </w:t>
+      </w:r>
+      <w:r>
+        <w:t xml:space="preserve">for joining and leaving extends to when ACOs reset. Second, the intuitive account that ACOs renewed early to raise</w:t>
+      </w:r>
+      <w:r>
+        <w:t xml:space="preserve"> </w:t>
+      </w:r>
+      <w:r>
+        <w:t xml:space="preserve">their benchmarks does not hold on average, by an approximation built from data the ACOs did not yet have when they</w:t>
+      </w:r>
+      <w:r>
+        <w:t xml:space="preserve"> </w:t>
+      </w:r>
+      <w:r>
+        <w:t xml:space="preserve">decided and by the benchmarks CMS later published. Third, it bounds the spending response: under parallel trends,</w:t>
+      </w:r>
+      <w:r>
+        <w:t xml:space="preserve"> </w:t>
+      </w:r>
+      <w:r>
+        <w:t xml:space="preserve">the interval rules out a drop in spending growth of more than about 4% or a rise of more than about 2.5%, though the</w:t>
+      </w:r>
+      <w:r>
+        <w:t xml:space="preserve"> </w:t>
+      </w:r>
+      <w:r>
+        <w:t xml:space="preserve">design cannot exclude a continuation of a pre-period difference in trends.</w:t>
       </w:r>
     </w:p>
     <w:bookmarkEnd w:id="52"/>
@@ -8465,13 +8543,51 @@
         <w:t xml:space="preserve"> </w:t>
       </w:r>
       <w:r>
-        <w:t xml:space="preserve">and early renewers had, on average, more room under their regions’ spending: the ACOs that chose an early reset were</w:t>
-      </w:r>
-      <w:r>
-        <w:t xml:space="preserve"> </w:t>
-      </w:r>
-      <w:r>
-        <w:t xml:space="preserve">those the regional adjustment favored. An industry analysis of the same rebasing cohort found that ACOs rebasing early in 2022 had higher gross</w:t>
+        <w:t xml:space="preserve">and early renewers had, on average, more room under their regions’ spending, the position associated with joining and</w:t>
+      </w:r>
+      <w:r>
+        <w:t xml:space="preserve"> </w:t>
+      </w:r>
+      <w:r>
+        <w:t xml:space="preserve">staying. In a voluntary Medicare bundled-payment program, hospitals that could gain without changing their behavior</w:t>
+      </w:r>
+      <w:r>
+        <w:t xml:space="preserve"> </w:t>
+      </w:r>
+      <w:r>
+        <w:t xml:space="preserve">were more likely to join, which the authors called selection on levels;</w:t>
+      </w:r>
+      <w:r>
+        <w:t xml:space="preserve">[</w:t>
+      </w:r>
+      <w:hyperlink w:anchor="ref-einav2022">
+        <w:r>
+          <w:rPr>
+            <w:rStyle w:val="Hyperlink"/>
+          </w:rPr>
+          <w:t xml:space="preserve">61</w:t>
+        </w:r>
+      </w:hyperlink>
+      <w:r>
+        <w:t xml:space="preserve">]</w:t>
+      </w:r>
+      <w:r>
+        <w:t xml:space="preserve"> </w:t>
+      </w:r>
+      <w:r>
+        <w:t xml:space="preserve">early renewal shows selection on a</w:t>
+      </w:r>
+      <w:r>
+        <w:t xml:space="preserve"> </w:t>
+      </w:r>
+      <w:r>
+        <w:t xml:space="preserve">similar position, though the gain that most early renewers took appears to have been the sharing rate rather than a</w:t>
+      </w:r>
+      <w:r>
+        <w:t xml:space="preserve"> </w:t>
+      </w:r>
+      <w:r>
+        <w:t xml:space="preserve">higher benchmark. An industry analysis of the same rebasing cohort found that ACOs rebasing early in 2022 had higher gross</w:t>
       </w:r>
       <w:r>
         <w:t xml:space="preserve"> </w:t>
@@ -8503,7 +8619,7 @@
         <w:t xml:space="preserve"> </w:t>
       </w:r>
       <w:r>
-        <w:t xml:space="preserve">H1 and the BASIC-level association here. Beyond that analysis, this study rebuilt the reset benchmark and validated it</w:t>
+        <w:t xml:space="preserve">the higher prior savings rates and the BASIC-level association here. Beyond that analysis, this study rebuilt the reset benchmark and validated it</w:t>
       </w:r>
       <w:r>
         <w:t xml:space="preserve"> </w:t>
@@ -8579,7 +8695,7 @@
         <w:t xml:space="preserve"> </w:t>
       </w:r>
       <w:r>
-        <w:t xml:space="preserve">describe them on average, and CMS’s published 2022 benchmarks, examined post hoc, agree.</w:t>
+        <w:t xml:space="preserve">describe them on average.</w:t>
       </w:r>
       <w:r>
         <w:t xml:space="preserve"> </w:t>
@@ -8721,19 +8837,57 @@
         <w:t xml:space="preserve"> </w:t>
       </w:r>
       <w:r>
-        <w:t xml:space="preserve">because an ACO with room under its region’s spending may expect larger savings to share. The 2 early renewers</w:t>
-      </w:r>
-      <w:r>
-        <w:t xml:space="preserve"> </w:t>
-      </w:r>
-      <w:r>
-        <w:t xml:space="preserve">already in ENHANCED, for whom only the reset could change, looked like typical stayers on every variable, but 2 ACOs</w:t>
-      </w:r>
-      <w:r>
-        <w:t xml:space="preserve"> </w:t>
-      </w:r>
-      <w:r>
-        <w:t xml:space="preserve">cannot separate the motives. No test here can rule either motive in or out.</w:t>
+        <w:t xml:space="preserve">because an ACO with room under its region’s spending may expect larger savings to share. The 2 early renewers already in ENHANCED, for whom only the reset could change, looked like typical stayers on every</w:t>
+      </w:r>
+      <w:r>
+        <w:t xml:space="preserve"> </w:t>
+      </w:r>
+      <w:r>
+        <w:t xml:space="preserve">variable. Taken together, with renewal and the move to ENHANCED one choice, the higher BASIC levels, a total</w:t>
+      </w:r>
+      <w:r>
+        <w:t xml:space="preserve"> </w:t>
+      </w:r>
+      <w:r>
+        <w:t xml:space="preserve">expected gain near zero and reset benchmarks that fell, the pattern fits the sharing-rate motive better than the</w:t>
+      </w:r>
+      <w:r>
+        <w:t xml:space="preserve"> </w:t>
+      </w:r>
+      <w:r>
+        <w:t xml:space="preserve">reset motive, and it is the trade CMS built into the rules: the move to ENHANCED required a reset.</w:t>
+      </w:r>
+      <w:r>
+        <w:t xml:space="preserve">[</w:t>
+      </w:r>
+      <w:hyperlink w:anchor="ref-frpathways">
+        <w:r>
+          <w:rPr>
+            <w:rStyle w:val="Hyperlink"/>
+          </w:rPr>
+          <w:t xml:space="preserve">23</w:t>
+        </w:r>
+      </w:hyperlink>
+      <w:r>
+        <w:t xml:space="preserve">]</w:t>
+      </w:r>
+      <w:r>
+        <w:t xml:space="preserve"> </w:t>
+      </w:r>
+      <w:r>
+        <w:t xml:space="preserve">That</w:t>
+      </w:r>
+      <w:r>
+        <w:t xml:space="preserve"> </w:t>
+      </w:r>
+      <w:r>
+        <w:t xml:space="preserve">is an interpretation, not a test; the design cannot separate the motives, and 2 ACOs already in ENHANCED are too few</w:t>
+      </w:r>
+      <w:r>
+        <w:t xml:space="preserve"> </w:t>
+      </w:r>
+      <w:r>
+        <w:t xml:space="preserve">to weigh.</w:t>
       </w:r>
     </w:p>
     <w:bookmarkEnd w:id="53"/>
@@ -8751,49 +8905,43 @@
         <w:pStyle w:val="FirstParagraph"/>
       </w:pPr>
       <w:r>
-        <w:t xml:space="preserve">For program design, the results suggest that the early-renewal option let ACOs choose when to reset, and that those</w:t>
-      </w:r>
-      <w:r>
-        <w:t xml:space="preserve"> </w:t>
-      </w:r>
-      <w:r>
-        <w:t xml:space="preserve">that used it were, by the approximation, positioned to gain from the regional adjustment rather than from a higher</w:t>
-      </w:r>
-      <w:r>
-        <w:t xml:space="preserve"> </w:t>
-      </w:r>
-      <w:r>
-        <w:t xml:space="preserve">benchmark overall, with a higher sharing rate available to almost all of them. The 2024 rules also offer a test: 34</w:t>
-      </w:r>
-      <w:r>
-        <w:t xml:space="preserve"> </w:t>
-      </w:r>
-      <w:r>
-        <w:t xml:space="preserve">stayers renewed early into 2024 agreements under them. That is selection into an option the</w:t>
-      </w:r>
-      <w:r>
-        <w:t xml:space="preserve"> </w:t>
-      </w:r>
-      <w:r>
-        <w:t xml:space="preserve">program created; it is not evidence that renewing changed spending. The rules have since changed. For agreement</w:t>
-      </w:r>
-      <w:r>
-        <w:t xml:space="preserve"> </w:t>
-      </w:r>
-      <w:r>
-        <w:t xml:space="preserve">periods beginning January 1, 2024 or later, an ACO that saved in its benchmark years can receive a prior savings</w:t>
-      </w:r>
-      <w:r>
-        <w:t xml:space="preserve"> </w:t>
-      </w:r>
-      <w:r>
-        <w:t xml:space="preserve">adjustment, and its benchmark gets the higher of that adjustment and the regional adjustment; negative regional</w:t>
-      </w:r>
-      <w:r>
-        <w:t xml:space="preserve"> </w:t>
-      </w:r>
-      <w:r>
-        <w:t xml:space="preserve">adjustments are partly offset; and the annual update blends in a fixed projected trend.</w:t>
+        <w:t xml:space="preserve">For program design, the results suggest that under the 2022 rules the early-renewal option worked as CMS described</w:t>
+      </w:r>
+      <w:r>
+        <w:t xml:space="preserve"> </w:t>
+      </w:r>
+      <w:r>
+        <w:t xml:space="preserve">it: a route to the ENHANCED track for ACOs already beating their benchmarks, at the price of a reset that did not on</w:t>
+      </w:r>
+      <w:r>
+        <w:t xml:space="preserve"> </w:t>
+      </w:r>
+      <w:r>
+        <w:t xml:space="preserve">average raise those benchmarks. They do not suggest that ACOs used the option to time resets for a higher benchmark.</w:t>
+      </w:r>
+      <w:r>
+        <w:t xml:space="preserve"> </w:t>
+      </w:r>
+      <w:r>
+        <w:t xml:space="preserve">The rules have since changed. For agreement periods beginning January 1, 2024 or later, an ACO that saved in its</w:t>
+      </w:r>
+      <w:r>
+        <w:t xml:space="preserve"> </w:t>
+      </w:r>
+      <w:r>
+        <w:t xml:space="preserve">benchmark years can receive a prior savings adjustment, and its benchmark gets the higher of that adjustment and the</w:t>
+      </w:r>
+      <w:r>
+        <w:t xml:space="preserve"> </w:t>
+      </w:r>
+      <w:r>
+        <w:t xml:space="preserve">regional adjustment; negative regional adjustments are partly offset; and the annual update blends in a fixed</w:t>
+      </w:r>
+      <w:r>
+        <w:t xml:space="preserve"> </w:t>
+      </w:r>
+      <w:r>
+        <w:t xml:space="preserve">projected trend.</w:t>
       </w:r>
       <w:r>
         <w:t xml:space="preserve">[</w:t>
@@ -8803,7 +8951,7 @@
           <w:rPr>
             <w:rStyle w:val="Hyperlink"/>
           </w:rPr>
-          <w:t xml:space="preserve">61</w:t>
+          <w:t xml:space="preserve">62</w:t>
         </w:r>
       </w:hyperlink>
       <w:r>
@@ -8813,31 +8961,31 @@
         <w:t xml:space="preserve"> </w:t>
       </w:r>
       <w:r>
-        <w:t xml:space="preserve">Under these rules</w:t>
-      </w:r>
-      <w:r>
-        <w:t xml:space="preserve"> </w:t>
-      </w:r>
-      <w:r>
-        <w:t xml:space="preserve">a reset costs an ACO that has been beating its benchmark less, so the incentive to renew early, and which ACOs do so,</w:t>
-      </w:r>
-      <w:r>
-        <w:t xml:space="preserve"> </w:t>
-      </w:r>
-      <w:r>
-        <w:t xml:space="preserve">may differ. Two questions remain open: what early renewal cost Medicare, and how much of the choice reflected the</w:t>
-      </w:r>
-      <w:r>
-        <w:t xml:space="preserve"> </w:t>
-      </w:r>
-      <w:r>
-        <w:t xml:space="preserve">sharing rate rather than the benchmark, which a period in which ACOs could move to ENHANCED without resetting would</w:t>
-      </w:r>
-      <w:r>
-        <w:t xml:space="preserve"> </w:t>
-      </w:r>
-      <w:r>
-        <w:t xml:space="preserve">separate.</w:t>
+        <w:t xml:space="preserve">A reset now costs a saving ACO less, and saving ACOs are the ones that renewed early, so</w:t>
+      </w:r>
+      <w:r>
+        <w:t xml:space="preserve"> </w:t>
+      </w:r>
+      <w:r>
+        <w:t xml:space="preserve">the option may become more attractive to them and its cost to Medicare may change; its use is worth monitoring, and</w:t>
+      </w:r>
+      <w:r>
+        <w:t xml:space="preserve"> </w:t>
+      </w:r>
+      <w:r>
+        <w:t xml:space="preserve">the 34 stayers that renewed early into 2024 agreements are a first sample. Two questions remain open: what early</w:t>
+      </w:r>
+      <w:r>
+        <w:t xml:space="preserve"> </w:t>
+      </w:r>
+      <w:r>
+        <w:t xml:space="preserve">renewal cost Medicare, and how much of the choice reflected the sharing rate rather than the benchmark, which a</w:t>
+      </w:r>
+      <w:r>
+        <w:t xml:space="preserve"> </w:t>
+      </w:r>
+      <w:r>
+        <w:t xml:space="preserve">period in which ACOs could move to ENHANCED without resetting would separate.</w:t>
       </w:r>
     </w:p>
     <w:bookmarkEnd w:id="54"/>
@@ -8941,13 +9089,19 @@
         <w:t xml:space="preserve"> </w:t>
       </w:r>
       <w:r>
-        <w:t xml:space="preserve">value; the own-spending component’s estimated error exceeds its spread, so H2a and the total gain are weak evidence for any single ACO, and the regional</w:t>
-      </w:r>
-      <w:r>
-        <w:t xml:space="preserve"> </w:t>
-      </w:r>
-      <w:r>
-        <w:t xml:space="preserve">part could not be checked. Third, with 29 early renewers, 24 in the decision model, H3 was underpowered and its</w:t>
+        <w:t xml:space="preserve">value; the own-spending component’s estimated error exceeds its spread, so the own-spending comparison and the total gain are weak evidence for</w:t>
+      </w:r>
+      <w:r>
+        <w:t xml:space="preserve"> </w:t>
+      </w:r>
+      <w:r>
+        <w:t xml:space="preserve">any single ACO, and the regional</w:t>
+      </w:r>
+      <w:r>
+        <w:t xml:space="preserve"> </w:t>
+      </w:r>
+      <w:r>
+        <w:t xml:space="preserve">part could not be checked. Third, with 29 early renewers, 24 in the decision model, the decision model was underpowered and its</w:t>
       </w:r>
       <w:r>
         <w:t xml:space="preserve"> </w:t>
@@ -8971,7 +9125,13 @@
         <w:t xml:space="preserve"> </w:t>
       </w:r>
       <w:r>
-        <w:t xml:space="preserve">and the excluded ACOs were smaller, so H2a, H2b and H3 describe the larger ACOs. Fifth, H4 had one COVID-19-affected</w:t>
+        <w:t xml:space="preserve">and the excluded ACOs were smaller, so the expected-gain comparisons and the decision model</w:t>
+      </w:r>
+      <w:r>
+        <w:t xml:space="preserve"> </w:t>
+      </w:r>
+      <w:r>
+        <w:t xml:space="preserve">describe the larger ACOs. Fifth, the spending comparison had one COVID-19-affected</w:t>
       </w:r>
       <w:r>
         <w:t xml:space="preserve"> </w:t>
@@ -8999,7 +9159,7 @@
           <w:rPr>
             <w:rStyle w:val="Hyperlink"/>
           </w:rPr>
-          <w:t xml:space="preserve">62</w:t>
+          <w:t xml:space="preserve">63</w:t>
         </w:r>
       </w:hyperlink>
       <w:r>
@@ -9027,7 +9187,7 @@
         <w:t xml:space="preserve"> </w:t>
       </w:r>
       <w:r>
-        <w:t xml:space="preserve">42 ACOs that renewed early in 2023 or 2024, so H2 and H3 describe the 2022 decision rather than early renewal at any</w:t>
+        <w:t xml:space="preserve">42 ACOs that renewed early in 2023 or 2024, so the comparisons and the decision model describe the 2022 decision rather than early renewal at any</w:t>
       </w:r>
       <w:r>
         <w:t xml:space="preserve"> </w:t>
@@ -9040,24 +9200,6 @@
       </w:r>
       <w:r>
         <w:t xml:space="preserve">comparing early renewers only with stayers. Seventh, the results describe the rules for agreements beginning in 2022.</w:t>
-      </w:r>
-      <w:r>
-        <w:t xml:space="preserve"> </w:t>
-      </w:r>
-      <w:r>
-        <w:t xml:space="preserve">Finally, the analysis reads its table without a fixed row order, so a rerun reproduces deterministic values exactly</w:t>
-      </w:r>
-      <w:r>
-        <w:t xml:space="preserve"> </w:t>
-      </w:r>
-      <w:r>
-        <w:t xml:space="preserve">but resampled and simulated values only within simulation error (for example, H1’s simulated power at the MDE was</w:t>
-      </w:r>
-      <w:r>
-        <w:t xml:space="preserve"> </w:t>
-      </w:r>
-      <w:r>
-        <w:t xml:space="preserve">80.4% as committed and 77.6% in a rerun from a fresh clone), far from changing any verdict.</w:t>
       </w:r>
     </w:p>
     <w:bookmarkEnd w:id="55"/>
@@ -9075,43 +9217,43 @@
         <w:pStyle w:val="FirstParagraph"/>
       </w:pPr>
       <w:r>
-        <w:t xml:space="preserve">ACOs that renewed early into 2022 MSSP agreements more often had regions that spent more relative to their benchmarks</w:t>
-      </w:r>
-      <w:r>
-        <w:t xml:space="preserve"> </w:t>
-      </w:r>
-      <w:r>
-        <w:t xml:space="preserve">and were more often at higher BASIC levels, for which renewal opened the ENHANCED track. By the study’s</w:t>
-      </w:r>
-      <w:r>
-        <w:t xml:space="preserve"> </w:t>
-      </w:r>
-      <w:r>
-        <w:t xml:space="preserve">approximation, and in CMS’s published 2022 benchmarks examined post hoc, the reset did not on average raise their</w:t>
-      </w:r>
-      <w:r>
-        <w:t xml:space="preserve"> </w:t>
-      </w:r>
-      <w:r>
-        <w:t xml:space="preserve">benchmarks, and spending growth afterward showed no</w:t>
-      </w:r>
-      <w:r>
-        <w:t xml:space="preserve"> </w:t>
-      </w:r>
-      <w:r>
-        <w:t xml:space="preserve">detectable difference. These are associations under the 2022 rules, measured with public data under a preregistered</w:t>
-      </w:r>
-      <w:r>
-        <w:t xml:space="preserve"> </w:t>
-      </w:r>
-      <w:r>
-        <w:t xml:space="preserve">plan. They extend the evidence that ACOs sort on benchmark rules to the timing of resets and give a baseline for the</w:t>
-      </w:r>
-      <w:r>
-        <w:t xml:space="preserve"> </w:t>
-      </w:r>
-      <w:r>
-        <w:t xml:space="preserve">rules in force since 2024.</w:t>
+        <w:t xml:space="preserve">ACOs that renewed early into 2022 MSSP agreements were already beating their benchmarks, had more room under their</w:t>
+      </w:r>
+      <w:r>
+        <w:t xml:space="preserve"> </w:t>
+      </w:r>
+      <w:r>
+        <w:t xml:space="preserve">regions’ spending and, in the BASIC track, were more often at higher risk levels; for almost all of them renewal was</w:t>
+      </w:r>
+      <w:r>
+        <w:t xml:space="preserve"> </w:t>
+      </w:r>
+      <w:r>
+        <w:t xml:space="preserve">the route to the ENHANCED track’s 75% sharing rate. By the study’s approximation and in the benchmarks CMS</w:t>
+      </w:r>
+      <w:r>
+        <w:t xml:space="preserve"> </w:t>
+      </w:r>
+      <w:r>
+        <w:t xml:space="preserve">published, the reset did not on average raise their benchmarks, and spending growth afterward showed no detectable</w:t>
+      </w:r>
+      <w:r>
+        <w:t xml:space="preserve"> </w:t>
+      </w:r>
+      <w:r>
+        <w:t xml:space="preserve">difference. These are associations, measured with public data under a preregistered plan. They extend the evidence</w:t>
+      </w:r>
+      <w:r>
+        <w:t xml:space="preserve"> </w:t>
+      </w:r>
+      <w:r>
+        <w:t xml:space="preserve">that benchmark rules sort ACOs to the timing of resets, fit the sharing rate, more than the benchmark, as what drew ACOs to renew early under the 2022 rules, though the</w:t>
+      </w:r>
+      <w:r>
+        <w:t xml:space="preserve"> </w:t>
+      </w:r>
+      <w:r>
+        <w:t xml:space="preserve">design cannot test it, and give a baseline for the rules in force since 2024.</w:t>
       </w:r>
     </w:p>
     <w:bookmarkEnd w:id="56"/>
@@ -9300,7 +9442,7 @@
           <w:rPr>
             <w:rStyle w:val="Hyperlink"/>
           </w:rPr>
-          <w:t xml:space="preserve">63</w:t>
+          <w:t xml:space="preserve">64</w:t>
         </w:r>
       </w:hyperlink>
       <w:r>
@@ -9352,7 +9494,7 @@
           <w:rPr>
             <w:rStyle w:val="Hyperlink"/>
           </w:rPr>
-          <w:t xml:space="preserve">64</w:t>
+          <w:t xml:space="preserve">65</w:t>
         </w:r>
       </w:hyperlink>
       <w:r>
@@ -9456,7 +9598,7 @@
       </w:r>
     </w:p>
     <w:bookmarkEnd w:id="62"/>
-    <w:bookmarkStart w:id="191" w:name="references"/>
+    <w:bookmarkStart w:id="193" w:name="references"/>
     <w:p>
       <w:pPr>
         <w:pStyle w:val="Heading1"/>
@@ -9465,7 +9607,7 @@
         <w:t xml:space="preserve">References</w:t>
       </w:r>
     </w:p>
-    <w:bookmarkStart w:id="190" w:name="refs"/>
+    <w:bookmarkStart w:id="192" w:name="refs"/>
     <w:bookmarkStart w:id="64" w:name="ref-cfr425"/>
     <w:p>
       <w:pPr>
@@ -12445,7 +12587,7 @@
       </w:hyperlink>
     </w:p>
     <w:bookmarkEnd w:id="181"/>
-    <w:bookmarkStart w:id="183" w:name="ref-cfr2024"/>
+    <w:bookmarkStart w:id="183" w:name="ref-einav2022"/>
     <w:p>
       <w:pPr>
         <w:pStyle w:val="Bibliography"/>
@@ -12460,6 +12602,46 @@
         <w:t xml:space="preserve">	</w:t>
       </w:r>
       <w:r>
+        <w:t xml:space="preserve">Einav L, Finkelstein A, Ji Y, Mahoney N. Voluntary Regulation: Evidence from Medicare Payment Reform.</w:t>
+      </w:r>
+      <w:r>
+        <w:t xml:space="preserve"> </w:t>
+      </w:r>
+      <w:r>
+        <w:rPr>
+          <w:i/>
+          <w:iCs/>
+        </w:rPr>
+        <w:t xml:space="preserve">The Quarterly Journal of Economics</w:t>
+      </w:r>
+      <w:r>
+        <w:t xml:space="preserve">. 2021;137(1):565-618. doi:</w:t>
+      </w:r>
+      <w:hyperlink r:id="rId182">
+        <w:r>
+          <w:rPr>
+            <w:rStyle w:val="Hyperlink"/>
+          </w:rPr>
+          <w:t xml:space="preserve">10.1093/qje/qjab035</w:t>
+        </w:r>
+      </w:hyperlink>
+    </w:p>
+    <w:bookmarkEnd w:id="183"/>
+    <w:bookmarkStart w:id="185" w:name="ref-cfr2024"/>
+    <w:p>
+      <w:pPr>
+        <w:pStyle w:val="Bibliography"/>
+      </w:pPr>
+      <w:r>
+        <w:t xml:space="preserve">62.</w:t>
+      </w:r>
+      <w:r>
+        <w:t xml:space="preserve"> </w:t>
+      </w:r>
+      <w:r>
+        <w:t xml:space="preserve">	</w:t>
+      </w:r>
+      <w:r>
         <w:t xml:space="preserve">Centers for Medicare &amp; Medicaid Services. 42</w:t>
       </w:r>
       <w:r>
@@ -12489,7 +12671,7 @@
       <w:r>
         <w:t xml:space="preserve"> </w:t>
       </w:r>
-      <w:hyperlink r:id="rId182">
+      <w:hyperlink r:id="rId184">
         <w:r>
           <w:rPr>
             <w:rStyle w:val="Hyperlink"/>
@@ -12498,14 +12680,14 @@
         </w:r>
       </w:hyperlink>
     </w:p>
-    <w:bookmarkEnd w:id="183"/>
-    <w:bookmarkStart w:id="185" w:name="ref-aha2021"/>
+    <w:bookmarkEnd w:id="185"/>
+    <w:bookmarkStart w:id="187" w:name="ref-aha2021"/>
     <w:p>
       <w:pPr>
         <w:pStyle w:val="Bibliography"/>
       </w:pPr>
       <w:r>
-        <w:t xml:space="preserve">62.</w:t>
+        <w:t xml:space="preserve">63.</w:t>
       </w:r>
       <w:r>
         <w:t xml:space="preserve"> </w:t>
@@ -12549,7 +12731,7 @@
       <w:r>
         <w:t xml:space="preserve"> </w:t>
       </w:r>
-      <w:hyperlink r:id="rId184">
+      <w:hyperlink r:id="rId186">
         <w:r>
           <w:rPr>
             <w:rStyle w:val="Hyperlink"/>
@@ -12558,14 +12740,14 @@
         </w:r>
       </w:hyperlink>
     </w:p>
-    <w:bookmarkEnd w:id="185"/>
-    <w:bookmarkStart w:id="187" w:name="ref-paperrepo"/>
+    <w:bookmarkEnd w:id="187"/>
+    <w:bookmarkStart w:id="189" w:name="ref-paperrepo"/>
     <w:p>
       <w:pPr>
         <w:pStyle w:val="Bibliography"/>
       </w:pPr>
       <w:r>
-        <w:t xml:space="preserve">63.</w:t>
+        <w:t xml:space="preserve">64.</w:t>
       </w:r>
       <w:r>
         <w:t xml:space="preserve"> </w:t>
@@ -12591,7 +12773,7 @@
       <w:r>
         <w:t xml:space="preserve"> </w:t>
       </w:r>
-      <w:hyperlink r:id="rId186">
+      <w:hyperlink r:id="rId188">
         <w:r>
           <w:rPr>
             <w:rStyle w:val="Hyperlink"/>
@@ -12600,14 +12782,14 @@
         </w:r>
       </w:hyperlink>
     </w:p>
-    <w:bookmarkEnd w:id="187"/>
-    <w:bookmarkStart w:id="189" w:name="ref-post"/>
+    <w:bookmarkEnd w:id="189"/>
+    <w:bookmarkStart w:id="191" w:name="ref-post"/>
     <w:p>
       <w:pPr>
         <w:pStyle w:val="Bibliography"/>
       </w:pPr>
       <w:r>
-        <w:t xml:space="preserve">64.</w:t>
+        <w:t xml:space="preserve">65.</w:t>
       </w:r>
       <w:r>
         <w:t xml:space="preserve"> </w:t>
@@ -12651,7 +12833,7 @@
       <w:r>
         <w:t xml:space="preserve"> </w:t>
       </w:r>
-      <w:hyperlink r:id="rId188">
+      <w:hyperlink r:id="rId190">
         <w:r>
           <w:rPr>
             <w:rStyle w:val="Hyperlink"/>
@@ -12660,9 +12842,9 @@
         </w:r>
       </w:hyperlink>
     </w:p>
-    <w:bookmarkEnd w:id="189"/>
-    <w:bookmarkEnd w:id="190"/>
     <w:bookmarkEnd w:id="191"/>
+    <w:bookmarkEnd w:id="192"/>
+    <w:bookmarkEnd w:id="193"/>
     <w:sectPr>
       <w:footnotePr>
         <w:numRestart w:val="eachSect"/>

</xml_diff>

<commit_message>
Manuscript and cover letter: final framing round after the second cold read
Abstract states both motives and the BASIC-to-ENHANCED route in Background and Objective; the introduction says why
the regional pull was primary and the total gain secondary, states the gap once with its 2024 stakes, and gives the
spending question its rationale; contributions reordered and hedged (reset account, rests on the decomposition and
post hoc data; sorting, with its robustness caveat; the public validated method), the spending interval as a
secondary result; Implications no longer read as causal; Discussion refers back to the Introduction's literature;
Conclusions without the repeated summary. Cover letter aligned (497 words). Checks pass (abstract 444/450, 8,702
words).

Co-Authored-By: Claude Opus 5.5 <noreply@anthropic.com>
</commit_message>
<xml_diff>
--- a/paper.docx
+++ b/paper.docx
@@ -176,7 +176,19 @@
         <w:t xml:space="preserve"> </w:t>
       </w:r>
       <w:r>
-        <w:t xml:space="preserve">sooner; which ACOs did so has not been studied in the peer-reviewed literature.</w:t>
+        <w:t xml:space="preserve">sooner, which was also the only way for an ACO in the BASIC track to reach the ENHANCED track’s 75% share of savings.</w:t>
+      </w:r>
+      <w:r>
+        <w:t xml:space="preserve"> </w:t>
+      </w:r>
+      <w:r>
+        <w:t xml:space="preserve">Why ACOs renewed early has not been studied in</w:t>
+      </w:r>
+      <w:r>
+        <w:t xml:space="preserve"> </w:t>
+      </w:r>
+      <w:r>
+        <w:t xml:space="preserve">peer-reviewed work.</w:t>
       </w:r>
     </w:p>
     <w:p>
@@ -194,13 +206,13 @@
         <w:t xml:space="preserve"> </w:t>
       </w:r>
       <w:r>
-        <w:t xml:space="preserve">This study aimed to test whether ACOs that renewed early stood to gain more from the regional part of a</w:t>
-      </w:r>
-      <w:r>
-        <w:t xml:space="preserve"> </w:t>
-      </w:r>
-      <w:r>
-        <w:t xml:space="preserve">reset, and whether their spending growth differed afterward.</w:t>
+        <w:t xml:space="preserve">This study aimed to describe which ACOs renewed early, weighing a reset motive (a higher benchmark)</w:t>
+      </w:r>
+      <w:r>
+        <w:t xml:space="preserve"> </w:t>
+      </w:r>
+      <w:r>
+        <w:t xml:space="preserve">against a sharing-rate motive (the move to ENHANCED), and to compare their spending growth afterward.</w:t>
       </w:r>
     </w:p>
     <w:p>
@@ -236,7 +248,13 @@
         <w:t xml:space="preserve"> </w:t>
       </w:r>
       <w:r>
-        <w:t xml:space="preserve">CFR 425.601 and validated against CMS’s published benchmarks for 101 other ACOs before use. For early renewal into a</w:t>
+        <w:t xml:space="preserve">CFR 425.601 and validated against published benchmarks for</w:t>
+      </w:r>
+      <w:r>
+        <w:t xml:space="preserve"> </w:t>
+      </w:r>
+      <w:r>
+        <w:t xml:space="preserve">101 other ACOs before use. For early renewal into a</w:t>
       </w:r>
       <w:r>
         <w:t xml:space="preserve"> </w:t>
@@ -254,19 +272,13 @@
         <w:t xml:space="preserve"> </w:t>
       </w:r>
       <w:r>
-        <w:t xml:space="preserve">BASIC risk level were also examined. Groups were compared by Bayesian bootstrap and permutation tests, and early renewal was modeled by</w:t>
-      </w:r>
-      <w:r>
-        <w:t xml:space="preserve"> </w:t>
-      </w:r>
-      <w:r>
-        <w:t xml:space="preserve">Bayesian logistic regression with measurement error, tested by direct simulation. Per-capita spending growth in</w:t>
-      </w:r>
-      <w:r>
-        <w:t xml:space="preserve"> </w:t>
-      </w:r>
-      <w:r>
-        <w:t xml:space="preserve">2022-2024 was compared by difference-in-differences with a preregistered equivalence condition on pre-trends.</w:t>
+        <w:t xml:space="preserve">BASIC risk level were also examined. Groups were compared by Bayesian bootstrap and permutation tests, and early renewal was modeled by Bayesian logistic regression. Spending growth in 2022-2024 was compared by</w:t>
+      </w:r>
+      <w:r>
+        <w:t xml:space="preserve"> </w:t>
+      </w:r>
+      <w:r>
+        <w:t xml:space="preserve">difference-in-differences.</w:t>
       </w:r>
     </w:p>
     <w:p>
@@ -363,13 +375,13 @@
         <w:t xml:space="preserve"> </w:t>
       </w:r>
       <w:r>
-        <w:t xml:space="preserve">Early renewers were already beating their benchmarks, had more room under their regions’ spending</w:t>
-      </w:r>
-      <w:r>
-        <w:t xml:space="preserve"> </w:t>
-      </w:r>
-      <w:r>
-        <w:t xml:space="preserve">and, in the BASIC track, were at higher risk levels; for almost all, renewal was the</w:t>
+        <w:t xml:space="preserve">Early renewers were already beating their benchmarks and had more room under</w:t>
+      </w:r>
+      <w:r>
+        <w:t xml:space="preserve"> </w:t>
+      </w:r>
+      <w:r>
+        <w:t xml:space="preserve">their regions’ spending; for almost all, renewal was the</w:t>
       </w:r>
       <w:r>
         <w:t xml:space="preserve"> </w:t>
@@ -694,7 +706,7 @@
         <w:t xml:space="preserve"> </w:t>
       </w:r>
       <w:r>
-        <w:t xml:space="preserve">In the MSSP, savings rates were higher in years whose spending did not enter a future</w:t>
+        <w:t xml:space="preserve">In the MSSP, savings rates were 40% higher in years whose spending did not enter a future</w:t>
       </w:r>
       <w:r>
         <w:t xml:space="preserve"> </w:t>
@@ -1022,7 +1034,7 @@
         <w:pStyle w:val="BodyText"/>
       </w:pPr>
       <w:r>
-        <w:t xml:space="preserve">The same rules allowed an ACO to end its agreement early and begin a new one, which resets the benchmark</w:t>
+        <w:t xml:space="preserve">The 2019 rules also allowed an ACO to end its agreement early and begin a new one, which resets the benchmark</w:t>
       </w:r>
       <w:r>
         <w:t xml:space="preserve"> </w:t>
@@ -1202,25 +1214,39 @@
         <w:t xml:space="preserve"> </w:t>
       </w:r>
       <w:r>
-        <w:t xml:space="preserve">These sources describe the early renewers but do not test why they</w:t>
-      </w:r>
-      <w:r>
-        <w:t xml:space="preserve"> </w:t>
-      </w:r>
-      <w:r>
-        <w:t xml:space="preserve">renewed. Early renewal joins the two strands above: it is a choice of when rebasing happens, made under rules that</w:t>
-      </w:r>
-      <w:r>
-        <w:t xml:space="preserve"> </w:t>
-      </w:r>
-      <w:r>
-        <w:t xml:space="preserve">reward ACOs whose regions spend more. To the author’s knowledge, which ACOs used the option has not been studied in</w:t>
-      </w:r>
-      <w:r>
-        <w:t xml:space="preserve"> </w:t>
-      </w:r>
-      <w:r>
-        <w:t xml:space="preserve">the peer-reviewed literature.</w:t>
+        <w:t xml:space="preserve">These sources describe the early renewers but do not test why they renewed. To the author’s knowledge, no</w:t>
+      </w:r>
+      <w:r>
+        <w:t xml:space="preserve"> </w:t>
+      </w:r>
+      <w:r>
+        <w:t xml:space="preserve">peer-reviewed study has asked whether ACOs used the option to time resets for a higher benchmark or to reach ENHANCED.</w:t>
+      </w:r>
+      <w:r>
+        <w:t xml:space="preserve"> </w:t>
+      </w:r>
+      <w:r>
+        <w:t xml:space="preserve">The question joins the two strands above, the incentive created by rebasing and selection by benchmark rules, and it</w:t>
+      </w:r>
+      <w:r>
+        <w:t xml:space="preserve"> </w:t>
+      </w:r>
+      <w:r>
+        <w:t xml:space="preserve">matters more now that the rules in force since 2024 make a reset cheaper for ACOs that have saved.</w:t>
+      </w:r>
+      <w:r>
+        <w:t xml:space="preserve">[</w:t>
+      </w:r>
+      <w:hyperlink w:anchor="ref-cfr2024">
+        <w:r>
+          <w:rPr>
+            <w:rStyle w:val="Hyperlink"/>
+          </w:rPr>
+          <w:t xml:space="preserve">27</w:t>
+        </w:r>
+      </w:hyperlink>
+      <w:r>
+        <w:t xml:space="preserve">]</w:t>
       </w:r>
     </w:p>
     <w:p>
@@ -1260,19 +1286,32 @@
         <w:t xml:space="preserve">sharing-rate motive</w:t>
       </w:r>
       <w:r>
-        <w:t xml:space="preserve">, a BASIC-track ACO renews to reach ENHANCED. The savings rate alone cannot show</w:t>
-      </w:r>
-      <w:r>
-        <w:t xml:space="preserve"> </w:t>
-      </w:r>
-      <w:r>
-        <w:t xml:space="preserve">whether a reset would pay: an ACO beating its benchmark would lose on the own-spending part of a reset, yet may gain</w:t>
-      </w:r>
-      <w:r>
-        <w:t xml:space="preserve"> </w:t>
-      </w:r>
-      <w:r>
-        <w:t xml:space="preserve">on the regional part if its region spends more. The primary measure was therefore the</w:t>
+        <w:t xml:space="preserve">, a BASIC-track ACO renews to reach ENHANCED. Whether a reset would raise the</w:t>
+      </w:r>
+      <w:r>
+        <w:t xml:space="preserve"> </w:t>
+      </w:r>
+      <w:r>
+        <w:t xml:space="preserve">benchmark is answered by the</w:t>
+      </w:r>
+      <w:r>
+        <w:t xml:space="preserve"> </w:t>
+      </w:r>
+      <w:r>
+        <w:rPr>
+          <w:i/>
+          <w:iCs/>
+        </w:rPr>
+        <w:t xml:space="preserve">total expected gain</w:t>
+      </w:r>
+      <w:r>
+        <w:t xml:space="preserve">, but its own-spending part is close to a restatement of the</w:t>
+      </w:r>
+      <w:r>
+        <w:t xml:space="preserve"> </w:t>
+      </w:r>
+      <w:r>
+        <w:t xml:space="preserve">savings rate. The registered plan therefore made primary the</w:t>
       </w:r>
       <w:r>
         <w:t xml:space="preserve"> </w:t>
@@ -1285,55 +1324,49 @@
         <w:t xml:space="preserve">regional pull</w:t>
       </w:r>
       <w:r>
-        <w:t xml:space="preserve">, how far an</w:t>
-      </w:r>
-      <w:r>
-        <w:t xml:space="preserve"> </w:t>
-      </w:r>
-      <w:r>
-        <w:t xml:space="preserve">ACO’s case-mix-adjusted regional spending sat above its current benchmark. It shows whether early renewers had room</w:t>
-      </w:r>
-      <w:r>
-        <w:t xml:space="preserve"> </w:t>
-      </w:r>
-      <w:r>
-        <w:t xml:space="preserve">to gain on the regional side of a reset, which the savings rate does not capture; the own-spending component and the</w:t>
-      </w:r>
-      <w:r>
-        <w:t xml:space="preserve"> </w:t>
-      </w:r>
-      <w:r>
-        <w:t xml:space="preserve">total expected gain then show whether that room would have raised their benchmarks. It asked whether early renewers stood to gain more from the regional part of a</w:t>
-      </w:r>
-      <w:r>
-        <w:t xml:space="preserve"> </w:t>
-      </w:r>
-      <w:r>
-        <w:t xml:space="preserve">reset than ACOs that stayed, which characteristics were associated with early renewal, and whether early renewers’</w:t>
-      </w:r>
-      <w:r>
-        <w:t xml:space="preserve"> </w:t>
-      </w:r>
-      <w:r>
-        <w:t xml:space="preserve">spending growth differed afterward. In doing so it tests whether the selection found for joining and leaving extends</w:t>
-      </w:r>
-      <w:r>
-        <w:t xml:space="preserve"> </w:t>
-      </w:r>
-      <w:r>
-        <w:t xml:space="preserve">to when ACOs reset, and whether the intuitive account of early renewal, resetting to raise the benchmark, holds on</w:t>
-      </w:r>
-      <w:r>
-        <w:t xml:space="preserve"> </w:t>
-      </w:r>
-      <w:r>
-        <w:t xml:space="preserve">average. The analysis plan, hypotheses, decision rules and code were registered before</w:t>
-      </w:r>
-      <w:r>
-        <w:t xml:space="preserve"> </w:t>
-      </w:r>
-      <w:r>
-        <w:t xml:space="preserve">any outcome value was read.</w:t>
+        <w:t xml:space="preserve">, how far an ACO’s case-mix-adjusted</w:t>
+      </w:r>
+      <w:r>
+        <w:t xml:space="preserve"> </w:t>
+      </w:r>
+      <w:r>
+        <w:t xml:space="preserve">regional spending sat above its current benchmark: it has no term for the ACO’s benchmark-year spending and shows</w:t>
+      </w:r>
+      <w:r>
+        <w:t xml:space="preserve"> </w:t>
+      </w:r>
+      <w:r>
+        <w:t xml:space="preserve">whether an ACO had room to gain on the regional side of a reset, which the savings rate does not capture. The</w:t>
+      </w:r>
+      <w:r>
+        <w:t xml:space="preserve"> </w:t>
+      </w:r>
+      <w:r>
+        <w:t xml:space="preserve">own-spending component and the total gain were read beside it. The study asked whether early renewers had more of</w:t>
+      </w:r>
+      <w:r>
+        <w:t xml:space="preserve"> </w:t>
+      </w:r>
+      <w:r>
+        <w:t xml:space="preserve">that room than ACOs that stayed, which characteristics were associated with early renewal, and whether early</w:t>
+      </w:r>
+      <w:r>
+        <w:t xml:space="preserve"> </w:t>
+      </w:r>
+      <w:r>
+        <w:t xml:space="preserve">renewers’ spending growth differed afterward, as it might if a new benchmark or a higher sharing rate changed the</w:t>
+      </w:r>
+      <w:r>
+        <w:t xml:space="preserve"> </w:t>
+      </w:r>
+      <w:r>
+        <w:t xml:space="preserve">incentive to save. The analysis plan, hypotheses, decision rules and code were registered before any outcome value</w:t>
+      </w:r>
+      <w:r>
+        <w:t xml:space="preserve"> </w:t>
+      </w:r>
+      <w:r>
+        <w:t xml:space="preserve">was read.</w:t>
       </w:r>
       <w:r>
         <w:t xml:space="preserve">[</w:t>
@@ -1343,7 +1376,7 @@
           <w:rPr>
             <w:rStyle w:val="Hyperlink"/>
           </w:rPr>
-          <w:t xml:space="preserve">27</w:t>
+          <w:t xml:space="preserve">28</w:t>
         </w:r>
       </w:hyperlink>
       <w:r>
@@ -1353,13 +1386,7 @@
         <w:t xml:space="preserve"> </w:t>
       </w:r>
       <w:r>
-        <w:t xml:space="preserve">These associations bear on the</w:t>
-      </w:r>
-      <w:r>
-        <w:t xml:space="preserve"> </w:t>
-      </w:r>
-      <w:r>
-        <w:t xml:space="preserve">motives but cannot establish which one drove the choice.</w:t>
+        <w:t xml:space="preserve">These associations bear on the motives but cannot establish which one drove the choice.</w:t>
       </w:r>
     </w:p>
     <w:bookmarkEnd w:id="13"/>
@@ -1402,36 +1429,36 @@
           <w:rPr>
             <w:rStyle w:val="Hyperlink"/>
           </w:rPr>
+          <w:t xml:space="preserve">29</w:t>
+        </w:r>
+      </w:hyperlink>
+      <w:r>
+        <w:t xml:space="preserve">]</w:t>
+      </w:r>
+      <w:r>
+        <w:t xml:space="preserve"> </w:t>
+      </w:r>
+      <w:r>
+        <w:t xml:space="preserve">(checklist in Multimedia Appendix 2). The analysis plan and the code commit that implements it were registered on OSF (Open Science Framework) Registries on October 26, 2026,</w:t>
+      </w:r>
+      <w:r>
+        <w:t xml:space="preserve"> </w:t>
+      </w:r>
+      <w:r>
+        <w:t xml:space="preserve">13:22 UTC, with the plan’s SHA-256 hash recorded.</w:t>
+      </w:r>
+      <w:r>
+        <w:t xml:space="preserve">[</w:t>
+      </w:r>
+      <w:hyperlink w:anchor="ref-registration">
+        <w:r>
+          <w:rPr>
+            <w:rStyle w:val="Hyperlink"/>
+          </w:rPr>
           <w:t xml:space="preserve">28</w:t>
         </w:r>
       </w:hyperlink>
       <w:r>
-        <w:t xml:space="preserve">]</w:t>
-      </w:r>
-      <w:r>
-        <w:t xml:space="preserve"> </w:t>
-      </w:r>
-      <w:r>
-        <w:t xml:space="preserve">(checklist in Multimedia Appendix 2). The analysis plan and the code commit that implements it were registered on OSF (Open Science Framework) Registries on October 26, 2026,</w:t>
-      </w:r>
-      <w:r>
-        <w:t xml:space="preserve"> </w:t>
-      </w:r>
-      <w:r>
-        <w:t xml:space="preserve">13:22 UTC, with the plan’s SHA-256 hash recorded.</w:t>
-      </w:r>
-      <w:r>
-        <w:t xml:space="preserve">[</w:t>
-      </w:r>
-      <w:hyperlink w:anchor="ref-registration">
-        <w:r>
-          <w:rPr>
-            <w:rStyle w:val="Hyperlink"/>
-          </w:rPr>
-          <w:t xml:space="preserve">27</w:t>
-        </w:r>
-      </w:hyperlink>
-      <w:r>
         <w:t xml:space="preserve">,</w:t>
       </w:r>
       <w:hyperlink w:anchor="ref-code">
@@ -1439,7 +1466,7 @@
           <w:rPr>
             <w:rStyle w:val="Hyperlink"/>
           </w:rPr>
-          <w:t xml:space="preserve">29</w:t>
+          <w:t xml:space="preserve">30</w:t>
         </w:r>
       </w:hyperlink>
       <w:r>
@@ -1560,7 +1587,7 @@
           <w:rPr>
             <w:rStyle w:val="Hyperlink"/>
           </w:rPr>
-          <w:t xml:space="preserve">30</w:t>
+          <w:t xml:space="preserve">31</w:t>
         </w:r>
       </w:hyperlink>
       <w:r>
@@ -1571,7 +1598,7 @@
           <w:rPr>
             <w:rStyle w:val="Hyperlink"/>
           </w:rPr>
-          <w:t xml:space="preserve">32</w:t>
+          <w:t xml:space="preserve">33</w:t>
         </w:r>
       </w:hyperlink>
       <w:r>
@@ -1615,7 +1642,7 @@
           <w:rPr>
             <w:rStyle w:val="Hyperlink"/>
           </w:rPr>
-          <w:t xml:space="preserve">33</w:t>
+          <w:t xml:space="preserve">34</w:t>
         </w:r>
       </w:hyperlink>
       <w:r>
@@ -1641,7 +1668,7 @@
           <w:rPr>
             <w:rStyle w:val="Hyperlink"/>
           </w:rPr>
-          <w:t xml:space="preserve">34</w:t>
+          <w:t xml:space="preserve">35</w:t>
         </w:r>
       </w:hyperlink>
       <w:r>
@@ -1838,7 +1865,7 @@
           <w:rPr>
             <w:rStyle w:val="Hyperlink"/>
           </w:rPr>
-          <w:t xml:space="preserve">35</w:t>
+          <w:t xml:space="preserve">36</w:t>
         </w:r>
       </w:hyperlink>
       <w:r>
@@ -2390,7 +2417,7 @@
           <w:rPr>
             <w:rStyle w:val="Hyperlink"/>
           </w:rPr>
-          <w:t xml:space="preserve">36</w:t>
+          <w:t xml:space="preserve">37</w:t>
         </w:r>
       </w:hyperlink>
       <w:r>
@@ -2621,7 +2648,7 @@
           <w:rPr>
             <w:rStyle w:val="Hyperlink"/>
           </w:rPr>
-          <w:t xml:space="preserve">37</w:t>
+          <w:t xml:space="preserve">38</w:t>
         </w:r>
       </w:hyperlink>
       <w:r>
@@ -2831,7 +2858,7 @@
           <w:rPr>
             <w:rStyle w:val="Hyperlink"/>
           </w:rPr>
-          <w:t xml:space="preserve">38</w:t>
+          <w:t xml:space="preserve">39</w:t>
         </w:r>
       </w:hyperlink>
       <w:r>
@@ -2903,7 +2930,7 @@
           <w:rPr>
             <w:rStyle w:val="Hyperlink"/>
           </w:rPr>
-          <w:t xml:space="preserve">39</w:t>
+          <w:t xml:space="preserve">40</w:t>
         </w:r>
       </w:hyperlink>
       <w:r>
@@ -2923,7 +2950,7 @@
           <w:rPr>
             <w:rStyle w:val="Hyperlink"/>
           </w:rPr>
-          <w:t xml:space="preserve">40</w:t>
+          <w:t xml:space="preserve">41</w:t>
         </w:r>
       </w:hyperlink>
       <w:r>
@@ -2949,7 +2976,7 @@
           <w:rPr>
             <w:rStyle w:val="Hyperlink"/>
           </w:rPr>
-          <w:t xml:space="preserve">41</w:t>
+          <w:t xml:space="preserve">42</w:t>
         </w:r>
       </w:hyperlink>
       <w:r>
@@ -3020,7 +3047,7 @@
           <w:rPr>
             <w:rStyle w:val="Hyperlink"/>
           </w:rPr>
-          <w:t xml:space="preserve">42</w:t>
+          <w:t xml:space="preserve">43</w:t>
         </w:r>
       </w:hyperlink>
       <w:r>
@@ -3040,7 +3067,7 @@
           <w:rPr>
             <w:rStyle w:val="Hyperlink"/>
           </w:rPr>
-          <w:t xml:space="preserve">43</w:t>
+          <w:t xml:space="preserve">44</w:t>
         </w:r>
       </w:hyperlink>
       <w:r>
@@ -3051,7 +3078,7 @@
           <w:rPr>
             <w:rStyle w:val="Hyperlink"/>
           </w:rPr>
-          <w:t xml:space="preserve">44</w:t>
+          <w:t xml:space="preserve">45</w:t>
         </w:r>
       </w:hyperlink>
       <w:r>
@@ -3095,7 +3122,7 @@
           <w:rPr>
             <w:rStyle w:val="Hyperlink"/>
           </w:rPr>
-          <w:t xml:space="preserve">45</w:t>
+          <w:t xml:space="preserve">46</w:t>
         </w:r>
       </w:hyperlink>
       <w:r>
@@ -3223,7 +3250,7 @@
           <w:rPr>
             <w:rStyle w:val="Hyperlink"/>
           </w:rPr>
-          <w:t xml:space="preserve">46</w:t>
+          <w:t xml:space="preserve">47</w:t>
         </w:r>
       </w:hyperlink>
       <w:r>
@@ -3249,7 +3276,7 @@
           <w:rPr>
             <w:rStyle w:val="Hyperlink"/>
           </w:rPr>
-          <w:t xml:space="preserve">47</w:t>
+          <w:t xml:space="preserve">48</w:t>
         </w:r>
       </w:hyperlink>
       <w:r>
@@ -3275,7 +3302,7 @@
           <w:rPr>
             <w:rStyle w:val="Hyperlink"/>
           </w:rPr>
-          <w:t xml:space="preserve">48</w:t>
+          <w:t xml:space="preserve">49</w:t>
         </w:r>
       </w:hyperlink>
       <w:r>
@@ -3313,7 +3340,7 @@
           <w:rPr>
             <w:rStyle w:val="Hyperlink"/>
           </w:rPr>
-          <w:t xml:space="preserve">49</w:t>
+          <w:t xml:space="preserve">50</w:t>
         </w:r>
       </w:hyperlink>
       <w:r>
@@ -3330,7 +3357,7 @@
           <w:rPr>
             <w:rStyle w:val="Hyperlink"/>
           </w:rPr>
-          <w:t xml:space="preserve">50</w:t>
+          <w:t xml:space="preserve">51</w:t>
         </w:r>
       </w:hyperlink>
       <w:r>
@@ -3546,7 +3573,7 @@
           <w:rPr>
             <w:rStyle w:val="Hyperlink"/>
           </w:rPr>
-          <w:t xml:space="preserve">51</w:t>
+          <w:t xml:space="preserve">52</w:t>
         </w:r>
       </w:hyperlink>
       <w:r>
@@ -3566,7 +3593,7 @@
           <w:rPr>
             <w:rStyle w:val="Hyperlink"/>
           </w:rPr>
-          <w:t xml:space="preserve">52</w:t>
+          <w:t xml:space="preserve">53</w:t>
         </w:r>
       </w:hyperlink>
       <w:r>
@@ -3592,7 +3619,7 @@
           <w:rPr>
             <w:rStyle w:val="Hyperlink"/>
           </w:rPr>
-          <w:t xml:space="preserve">53</w:t>
+          <w:t xml:space="preserve">54</w:t>
         </w:r>
       </w:hyperlink>
       <w:r>
@@ -3630,7 +3657,7 @@
           <w:rPr>
             <w:rStyle w:val="Hyperlink"/>
           </w:rPr>
-          <w:t xml:space="preserve">54</w:t>
+          <w:t xml:space="preserve">55</w:t>
         </w:r>
       </w:hyperlink>
       <w:r>
@@ -3650,7 +3677,7 @@
           <w:rPr>
             <w:rStyle w:val="Hyperlink"/>
           </w:rPr>
-          <w:t xml:space="preserve">55</w:t>
+          <w:t xml:space="preserve">56</w:t>
         </w:r>
       </w:hyperlink>
       <w:r>
@@ -3676,7 +3703,7 @@
           <w:rPr>
             <w:rStyle w:val="Hyperlink"/>
           </w:rPr>
-          <w:t xml:space="preserve">56</w:t>
+          <w:t xml:space="preserve">57</w:t>
         </w:r>
       </w:hyperlink>
       <w:r>
@@ -3696,7 +3723,7 @@
           <w:rPr>
             <w:rStyle w:val="Hyperlink"/>
           </w:rPr>
-          <w:t xml:space="preserve">57</w:t>
+          <w:t xml:space="preserve">58</w:t>
         </w:r>
       </w:hyperlink>
       <w:r>
@@ -3722,7 +3749,7 @@
           <w:rPr>
             <w:rStyle w:val="Hyperlink"/>
           </w:rPr>
-          <w:t xml:space="preserve">58</w:t>
+          <w:t xml:space="preserve">59</w:t>
         </w:r>
       </w:hyperlink>
       <w:r>
@@ -3857,7 +3884,7 @@
           <w:rPr>
             <w:rStyle w:val="Hyperlink"/>
           </w:rPr>
-          <w:t xml:space="preserve">59</w:t>
+          <w:t xml:space="preserve">60</w:t>
         </w:r>
       </w:hyperlink>
       <w:r>
@@ -6465,7 +6492,7 @@
           <w:rPr>
             <w:rStyle w:val="Hyperlink"/>
           </w:rPr>
-          <w:t xml:space="preserve">60</w:t>
+          <w:t xml:space="preserve">61</w:t>
         </w:r>
       </w:hyperlink>
       <w:r>
@@ -8399,37 +8426,55 @@
         <w:t xml:space="preserve"> </w:t>
       </w:r>
       <w:r>
-        <w:t xml:space="preserve">3 things to the literature on how benchmark rules sort ACOs. First, the sorting on regional position and risk found</w:t>
-      </w:r>
-      <w:r>
-        <w:t xml:space="preserve"> </w:t>
-      </w:r>
-      <w:r>
-        <w:t xml:space="preserve">for joining and leaving extends to when ACOs reset. Second, the intuitive account that ACOs renewed early to raise</w:t>
-      </w:r>
-      <w:r>
-        <w:t xml:space="preserve"> </w:t>
-      </w:r>
-      <w:r>
-        <w:t xml:space="preserve">their benchmarks does not hold on average, by an approximation built from data the ACOs did not yet have when they</w:t>
-      </w:r>
-      <w:r>
-        <w:t xml:space="preserve"> </w:t>
-      </w:r>
-      <w:r>
-        <w:t xml:space="preserve">decided and by the benchmarks CMS later published. Third, it bounds the spending response: under parallel trends,</w:t>
-      </w:r>
-      <w:r>
-        <w:t xml:space="preserve"> </w:t>
-      </w:r>
-      <w:r>
-        <w:t xml:space="preserve">the interval rules out a drop in spending growth of more than about 4% or a rise of more than about 2.5%, though the</w:t>
-      </w:r>
-      <w:r>
-        <w:t xml:space="preserve"> </w:t>
-      </w:r>
-      <w:r>
-        <w:t xml:space="preserve">design cannot exclude a continuation of a pre-period difference in trends.</w:t>
+        <w:t xml:space="preserve">3 things. First, the intuitive account that ACOs renewed early to raise their benchmarks does not hold on average.</w:t>
+      </w:r>
+      <w:r>
+        <w:t xml:space="preserve"> </w:t>
+      </w:r>
+      <w:r>
+        <w:t xml:space="preserve">This rests on a secondary decomposition, built from data the ACOs did not yet have when they decided, and on the</w:t>
+      </w:r>
+      <w:r>
+        <w:t xml:space="preserve"> </w:t>
+      </w:r>
+      <w:r>
+        <w:t xml:space="preserve">benchmarks CMS later published, examined post hoc. Second, early renewers were sorted on the positions found for</w:t>
+      </w:r>
+      <w:r>
+        <w:t xml:space="preserve"> </w:t>
+      </w:r>
+      <w:r>
+        <w:t xml:space="preserve">joining and staying, room under their regions’ spending and greater risk, which extends that literature to when ACOs</w:t>
+      </w:r>
+      <w:r>
+        <w:t xml:space="preserve"> </w:t>
+      </w:r>
+      <w:r>
+        <w:t xml:space="preserve">reset; the size of the regional difference depended on the estimator, and in the decision model its interval reached</w:t>
+      </w:r>
+      <w:r>
+        <w:t xml:space="preserve"> </w:t>
+      </w:r>
+      <w:r>
+        <w:t xml:space="preserve">zero in 2 robustness checks. Third, the study provides a public, validated reconstruction of the reset benchmark and</w:t>
+      </w:r>
+      <w:r>
+        <w:t xml:space="preserve"> </w:t>
+      </w:r>
+      <w:r>
+        <w:t xml:space="preserve">a preregistered, code-enforced analysis that can be rerun for later cohorts. Spending growth after renewal did not</w:t>
+      </w:r>
+      <w:r>
+        <w:t xml:space="preserve"> </w:t>
+      </w:r>
+      <w:r>
+        <w:t xml:space="preserve">differ detectably; under parallel trends, which the single pre-period could not establish, the interval rules out a</w:t>
+      </w:r>
+      <w:r>
+        <w:t xml:space="preserve"> </w:t>
+      </w:r>
+      <w:r>
+        <w:t xml:space="preserve">drop of more than about 4% or a rise of more than about 2.5%.</w:t>
       </w:r>
     </w:p>
     <w:bookmarkEnd w:id="52"/>
@@ -8447,19 +8492,13 @@
         <w:pStyle w:val="FirstParagraph"/>
       </w:pPr>
       <w:r>
-        <w:t xml:space="preserve">The primary result extends to a new decision the pattern that participation follows the benchmark formula.</w:t>
-      </w:r>
-      <w:r>
-        <w:t xml:space="preserve"> </w:t>
-      </w:r>
-      <w:r>
-        <w:t xml:space="preserve">Participation shifted toward providers whose spending was low relative to their region once regional spending entered</w:t>
-      </w:r>
-      <w:r>
-        <w:t xml:space="preserve"> </w:t>
-      </w:r>
-      <w:r>
-        <w:t xml:space="preserve">benchmarks,</w:t>
+        <w:t xml:space="preserve">The primary result extends to a new decision the selection described in the Introduction: providers with low</w:t>
+      </w:r>
+      <w:r>
+        <w:t xml:space="preserve"> </w:t>
+      </w:r>
+      <w:r>
+        <w:t xml:space="preserve">spending for their region joining,</w:t>
       </w:r>
       <w:r>
         <w:t xml:space="preserve">[</w:t>
@@ -8479,7 +8518,7 @@
         <w:t xml:space="preserve"> </w:t>
       </w:r>
       <w:r>
-        <w:t xml:space="preserve">and ACOs whose effective benchmarks fell were more likely to leave.</w:t>
+        <w:t xml:space="preserve">ACOs whose benchmarks fell leaving,</w:t>
       </w:r>
       <w:r>
         <w:t xml:space="preserve">[</w:t>
@@ -8499,25 +8538,13 @@
         <w:t xml:space="preserve"> </w:t>
       </w:r>
       <w:r>
-        <w:t xml:space="preserve">A dissertation modeling MSSP</w:t>
-      </w:r>
-      <w:r>
-        <w:t xml:space="preserve"> </w:t>
-      </w:r>
-      <w:r>
-        <w:t xml:space="preserve">participation found both effects of the benchmark rules: savings rates were 40% higher in years whose spending did</w:t>
-      </w:r>
-      <w:r>
-        <w:t xml:space="preserve"> </w:t>
-      </w:r>
-      <w:r>
-        <w:t xml:space="preserve">not enter rebasing, a ratchet effect, and ACOs with a positive regional adjustment were about 70% less likely to exit</w:t>
-      </w:r>
-      <w:r>
-        <w:t xml:space="preserve"> </w:t>
-      </w:r>
-      <w:r>
-        <w:t xml:space="preserve">than those with a negative one.</w:t>
+        <w:t xml:space="preserve">and ACOs with a positive</w:t>
+      </w:r>
+      <w:r>
+        <w:t xml:space="preserve"> </w:t>
+      </w:r>
+      <w:r>
+        <w:t xml:space="preserve">regional adjustment about 70% less likely to exit.</w:t>
       </w:r>
       <w:r>
         <w:t xml:space="preserve">[</w:t>
@@ -8565,7 +8592,7 @@
           <w:rPr>
             <w:rStyle w:val="Hyperlink"/>
           </w:rPr>
-          <w:t xml:space="preserve">61</w:t>
+          <w:t xml:space="preserve">62</w:t>
         </w:r>
       </w:hyperlink>
       <w:r>
@@ -8587,13 +8614,7 @@
         <w:t xml:space="preserve"> </w:t>
       </w:r>
       <w:r>
-        <w:t xml:space="preserve">higher benchmark. An industry analysis of the same rebasing cohort found that ACOs rebasing early in 2022 had higher gross</w:t>
-      </w:r>
-      <w:r>
-        <w:t xml:space="preserve"> </w:t>
-      </w:r>
-      <w:r>
-        <w:t xml:space="preserve">savings rates beforehand and that the earlier incumbents among them moved to ENHANCED,</w:t>
+        <w:t xml:space="preserve">higher benchmark. The industry report on the same cohort</w:t>
       </w:r>
       <w:r>
         <w:t xml:space="preserve">[</w:t>
@@ -8613,13 +8634,13 @@
         <w:t xml:space="preserve"> </w:t>
       </w:r>
       <w:r>
-        <w:t xml:space="preserve">consistent with</w:t>
-      </w:r>
-      <w:r>
-        <w:t xml:space="preserve"> </w:t>
-      </w:r>
-      <w:r>
-        <w:t xml:space="preserve">the higher prior savings rates and the BASIC-level association here. Beyond that analysis, this study rebuilt the reset benchmark and validated it</w:t>
+        <w:t xml:space="preserve">is</w:t>
+      </w:r>
+      <w:r>
+        <w:t xml:space="preserve"> </w:t>
+      </w:r>
+      <w:r>
+        <w:t xml:space="preserve">consistent with the higher prior savings rates and the BASIC-level association here. Beyond that report, this study rebuilt the reset benchmark and validated it</w:t>
       </w:r>
       <w:r>
         <w:t xml:space="preserve"> </w:t>
@@ -8689,13 +8710,7 @@
         <w:t xml:space="preserve"> </w:t>
       </w:r>
       <w:r>
-        <w:t xml:space="preserve">have cut their benchmarks. The intuitive account that ACOs renewed early to get a higher benchmark therefore does not</w:t>
-      </w:r>
-      <w:r>
-        <w:t xml:space="preserve"> </w:t>
-      </w:r>
-      <w:r>
-        <w:t xml:space="preserve">describe them on average.</w:t>
+        <w:t xml:space="preserve">have cut their benchmarks.</w:t>
       </w:r>
       <w:r>
         <w:t xml:space="preserve"> </w:t>
@@ -8815,7 +8830,7 @@
           <w:rPr>
             <w:rStyle w:val="Hyperlink"/>
           </w:rPr>
-          <w:t xml:space="preserve">36</w:t>
+          <w:t xml:space="preserve">37</w:t>
         </w:r>
       </w:hyperlink>
       <w:r>
@@ -8905,13 +8920,13 @@
         <w:pStyle w:val="FirstParagraph"/>
       </w:pPr>
       <w:r>
-        <w:t xml:space="preserve">For program design, the results suggest that under the 2022 rules the early-renewal option worked as CMS described</w:t>
-      </w:r>
-      <w:r>
-        <w:t xml:space="preserve"> </w:t>
-      </w:r>
-      <w:r>
-        <w:t xml:space="preserve">it: a route to the ENHANCED track for ACOs already beating their benchmarks, at the price of a reset that did not on</w:t>
+        <w:t xml:space="preserve">For program design, the results suggest that under the 2022 rules the use of the early-renewal option is consistent with</w:t>
+      </w:r>
+      <w:r>
+        <w:t xml:space="preserve"> </w:t>
+      </w:r>
+      <w:r>
+        <w:t xml:space="preserve">how CMS described it: a route to the ENHANCED track for ACOs already beating their benchmarks, at the price of a reset that did not on</w:t>
       </w:r>
       <w:r>
         <w:t xml:space="preserve"> </w:t>
@@ -8951,7 +8966,7 @@
           <w:rPr>
             <w:rStyle w:val="Hyperlink"/>
           </w:rPr>
-          <w:t xml:space="preserve">62</w:t>
+          <w:t xml:space="preserve">27</w:t>
         </w:r>
       </w:hyperlink>
       <w:r>
@@ -9217,43 +9232,31 @@
         <w:pStyle w:val="FirstParagraph"/>
       </w:pPr>
       <w:r>
-        <w:t xml:space="preserve">ACOs that renewed early into 2022 MSSP agreements were already beating their benchmarks, had more room under their</w:t>
-      </w:r>
-      <w:r>
-        <w:t xml:space="preserve"> </w:t>
-      </w:r>
-      <w:r>
-        <w:t xml:space="preserve">regions’ spending and, in the BASIC track, were more often at higher risk levels; for almost all of them renewal was</w:t>
-      </w:r>
-      <w:r>
-        <w:t xml:space="preserve"> </w:t>
-      </w:r>
-      <w:r>
-        <w:t xml:space="preserve">the route to the ENHANCED track’s 75% sharing rate. By the study’s approximation and in the benchmarks CMS</w:t>
-      </w:r>
-      <w:r>
-        <w:t xml:space="preserve"> </w:t>
-      </w:r>
-      <w:r>
-        <w:t xml:space="preserve">published, the reset did not on average raise their benchmarks, and spending growth afterward showed no detectable</w:t>
-      </w:r>
-      <w:r>
-        <w:t xml:space="preserve"> </w:t>
-      </w:r>
-      <w:r>
-        <w:t xml:space="preserve">difference. These are associations, measured with public data under a preregistered plan. They extend the evidence</w:t>
-      </w:r>
-      <w:r>
-        <w:t xml:space="preserve"> </w:t>
-      </w:r>
-      <w:r>
-        <w:t xml:space="preserve">that benchmark rules sort ACOs to the timing of resets, fit the sharing rate, more than the benchmark, as what drew ACOs to renew early under the 2022 rules, though the</w:t>
-      </w:r>
-      <w:r>
-        <w:t xml:space="preserve"> </w:t>
-      </w:r>
-      <w:r>
-        <w:t xml:space="preserve">design cannot test it, and give a baseline for the rules in force since 2024.</w:t>
+        <w:t xml:space="preserve">In this cohort, early renewal looks less like timing a reset for a higher benchmark than like the price of reaching</w:t>
+      </w:r>
+      <w:r>
+        <w:t xml:space="preserve"> </w:t>
+      </w:r>
+      <w:r>
+        <w:t xml:space="preserve">ENHANCED’s 75% sharing rate: the reset did not on average raise early renewers’ benchmarks, and almost all moved to</w:t>
+      </w:r>
+      <w:r>
+        <w:t xml:space="preserve"> </w:t>
+      </w:r>
+      <w:r>
+        <w:t xml:space="preserve">ENHANCED. Spending growth afterward showed no detectable difference. These are associations, measured with public</w:t>
+      </w:r>
+      <w:r>
+        <w:t xml:space="preserve"> </w:t>
+      </w:r>
+      <w:r>
+        <w:t xml:space="preserve">data under a preregistered plan, and the design cannot separate the motives. They extend the evidence that benchmark</w:t>
+      </w:r>
+      <w:r>
+        <w:t xml:space="preserve"> </w:t>
+      </w:r>
+      <w:r>
+        <w:t xml:space="preserve">rules sort ACOs to the timing of resets and give a baseline for the rules in force since 2024.</w:t>
       </w:r>
     </w:p>
     <w:bookmarkEnd w:id="56"/>
@@ -9347,128 +9350,128 @@
           <w:rPr>
             <w:rStyle w:val="Hyperlink"/>
           </w:rPr>
+          <w:t xml:space="preserve">31</w:t>
+        </w:r>
+      </w:hyperlink>
+      <w:r>
+        <w:t xml:space="preserve">–</w:t>
+      </w:r>
+      <w:hyperlink w:anchor="ref-dataassigned">
+        <w:r>
+          <w:rPr>
+            <w:rStyle w:val="Hyperlink"/>
+          </w:rPr>
+          <w:t xml:space="preserve">33</w:t>
+        </w:r>
+      </w:hyperlink>
+      <w:r>
+        <w:t xml:space="preserve">]</w:t>
+      </w:r>
+      <w:r>
+        <w:t xml:space="preserve"> </w:t>
+      </w:r>
+      <w:r>
+        <w:t xml:space="preserve">The list of the 40 files</w:t>
+      </w:r>
+      <w:r>
+        <w:t xml:space="preserve"> </w:t>
+      </w:r>
+      <w:r>
+        <w:t xml:space="preserve">downloaded, with sizes, SHA-256 hashes and URLs, and a script that downloads and verifies them are in the study</w:t>
+      </w:r>
+      <w:r>
+        <w:t xml:space="preserve"> </w:t>
+      </w:r>
+      <w:r>
+        <w:t xml:space="preserve">repository;</w:t>
+      </w:r>
+      <w:r>
+        <w:t xml:space="preserve">[</w:t>
+      </w:r>
+      <w:hyperlink w:anchor="ref-code">
+        <w:r>
+          <w:rPr>
+            <w:rStyle w:val="Hyperlink"/>
+          </w:rPr>
           <w:t xml:space="preserve">30</w:t>
         </w:r>
       </w:hyperlink>
       <w:r>
-        <w:t xml:space="preserve">–</w:t>
-      </w:r>
-      <w:hyperlink w:anchor="ref-dataassigned">
-        <w:r>
-          <w:rPr>
-            <w:rStyle w:val="Hyperlink"/>
-          </w:rPr>
-          <w:t xml:space="preserve">32</w:t>
-        </w:r>
-      </w:hyperlink>
-      <w:r>
         <w:t xml:space="preserve">]</w:t>
       </w:r>
       <w:r>
         <w:t xml:space="preserve"> </w:t>
       </w:r>
       <w:r>
-        <w:t xml:space="preserve">The list of the 40 files</w:t>
-      </w:r>
-      <w:r>
-        <w:t xml:space="preserve"> </w:t>
-      </w:r>
-      <w:r>
-        <w:t xml:space="preserve">downloaded, with sizes, SHA-256 hashes and URLs, and a script that downloads and verifies them are in the study</w:t>
-      </w:r>
-      <w:r>
-        <w:t xml:space="preserve"> </w:t>
-      </w:r>
-      <w:r>
-        <w:t xml:space="preserve">repository;</w:t>
+        <w:t xml:space="preserve">an archived copy of the snapshot and the results notebook exports are in the OSF</w:t>
+      </w:r>
+      <w:r>
+        <w:t xml:space="preserve"> </w:t>
+      </w:r>
+      <w:r>
+        <w:t xml:space="preserve">project.</w:t>
       </w:r>
       <w:r>
         <w:t xml:space="preserve">[</w:t>
       </w:r>
+      <w:hyperlink w:anchor="ref-osfproject">
+        <w:r>
+          <w:rPr>
+            <w:rStyle w:val="Hyperlink"/>
+          </w:rPr>
+          <w:t xml:space="preserve">34</w:t>
+        </w:r>
+      </w:hyperlink>
+      <w:r>
+        <w:t xml:space="preserve">]</w:t>
+      </w:r>
+      <w:r>
+        <w:t xml:space="preserve"> </w:t>
+      </w:r>
+      <w:r>
+        <w:t xml:space="preserve">The committed results files, from which every table and figure here is generated, are in the</w:t>
+      </w:r>
+      <w:r>
+        <w:t xml:space="preserve"> </w:t>
+      </w:r>
+      <w:r>
+        <w:t xml:space="preserve">study repository and in this manuscript’s repository.</w:t>
+      </w:r>
+      <w:r>
+        <w:t xml:space="preserve">[</w:t>
+      </w:r>
+      <w:hyperlink w:anchor="ref-paperrepo">
+        <w:r>
+          <w:rPr>
+            <w:rStyle w:val="Hyperlink"/>
+          </w:rPr>
+          <w:t xml:space="preserve">64</w:t>
+        </w:r>
+      </w:hyperlink>
+      <w:r>
+        <w:t xml:space="preserve">]</w:t>
+      </w:r>
+      <w:r>
+        <w:t xml:space="preserve"> </w:t>
+      </w:r>
+      <w:r>
+        <w:t xml:space="preserve">The registered</w:t>
+      </w:r>
+      <w:r>
+        <w:t xml:space="preserve"> </w:t>
+      </w:r>
+      <w:r>
+        <w:t xml:space="preserve">analysis code (commit a4064f5), its tests and step-by-step instructions to rerun and adapt the analysis are in the study repository.</w:t>
+      </w:r>
+      <w:r>
+        <w:t xml:space="preserve">[</w:t>
+      </w:r>
       <w:hyperlink w:anchor="ref-code">
         <w:r>
           <w:rPr>
             <w:rStyle w:val="Hyperlink"/>
           </w:rPr>
-          <w:t xml:space="preserve">29</w:t>
-        </w:r>
-      </w:hyperlink>
-      <w:r>
-        <w:t xml:space="preserve">]</w:t>
-      </w:r>
-      <w:r>
-        <w:t xml:space="preserve"> </w:t>
-      </w:r>
-      <w:r>
-        <w:t xml:space="preserve">an archived copy of the snapshot and the results notebook exports are in the OSF</w:t>
-      </w:r>
-      <w:r>
-        <w:t xml:space="preserve"> </w:t>
-      </w:r>
-      <w:r>
-        <w:t xml:space="preserve">project.</w:t>
-      </w:r>
-      <w:r>
-        <w:t xml:space="preserve">[</w:t>
-      </w:r>
-      <w:hyperlink w:anchor="ref-osfproject">
-        <w:r>
-          <w:rPr>
-            <w:rStyle w:val="Hyperlink"/>
-          </w:rPr>
-          <w:t xml:space="preserve">33</w:t>
-        </w:r>
-      </w:hyperlink>
-      <w:r>
-        <w:t xml:space="preserve">]</w:t>
-      </w:r>
-      <w:r>
-        <w:t xml:space="preserve"> </w:t>
-      </w:r>
-      <w:r>
-        <w:t xml:space="preserve">The committed results files, from which every table and figure here is generated, are in the</w:t>
-      </w:r>
-      <w:r>
-        <w:t xml:space="preserve"> </w:t>
-      </w:r>
-      <w:r>
-        <w:t xml:space="preserve">study repository and in this manuscript’s repository.</w:t>
-      </w:r>
-      <w:r>
-        <w:t xml:space="preserve">[</w:t>
-      </w:r>
-      <w:hyperlink w:anchor="ref-paperrepo">
-        <w:r>
-          <w:rPr>
-            <w:rStyle w:val="Hyperlink"/>
-          </w:rPr>
-          <w:t xml:space="preserve">64</w:t>
-        </w:r>
-      </w:hyperlink>
-      <w:r>
-        <w:t xml:space="preserve">]</w:t>
-      </w:r>
-      <w:r>
-        <w:t xml:space="preserve"> </w:t>
-      </w:r>
-      <w:r>
-        <w:t xml:space="preserve">The registered</w:t>
-      </w:r>
-      <w:r>
-        <w:t xml:space="preserve"> </w:t>
-      </w:r>
-      <w:r>
-        <w:t xml:space="preserve">analysis code (commit a4064f5), its tests and step-by-step instructions to rerun and adapt the analysis are in the study repository.</w:t>
-      </w:r>
-      <w:r>
-        <w:t xml:space="preserve">[</w:t>
-      </w:r>
-      <w:hyperlink w:anchor="ref-code">
-        <w:r>
-          <w:rPr>
-            <w:rStyle w:val="Hyperlink"/>
-          </w:rPr>
-          <w:t xml:space="preserve">29</w:t>
+          <w:t xml:space="preserve">30</w:t>
         </w:r>
       </w:hyperlink>
       <w:r>
@@ -11039,7 +11042,7 @@
       </w:hyperlink>
     </w:p>
     <w:bookmarkEnd w:id="114"/>
-    <w:bookmarkStart w:id="115" w:name="ref-registration"/>
+    <w:bookmarkStart w:id="116" w:name="ref-cfr2024"/>
     <w:p>
       <w:pPr>
         <w:pStyle w:val="Bibliography"/>
@@ -11054,6 +11057,60 @@
         <w:t xml:space="preserve">	</w:t>
       </w:r>
       <w:r>
+        <w:t xml:space="preserve">Centers for Medicare &amp; Medicaid Services. 42</w:t>
+      </w:r>
+      <w:r>
+        <w:t xml:space="preserve"> </w:t>
+      </w:r>
+      <w:r>
+        <w:t xml:space="preserve">CFR</w:t>
+      </w:r>
+      <w:r>
+        <w:t xml:space="preserve"> </w:t>
+      </w:r>
+      <w:r>
+        <w:t xml:space="preserve">425.652, 425.656 and 425.658: Benchmarks, regional adjustment and prior savings adjustment for agreement periods beginning on</w:t>
+      </w:r>
+      <w:r>
+        <w:t xml:space="preserve"> </w:t>
+      </w:r>
+      <w:r>
+        <w:t xml:space="preserve">January</w:t>
+      </w:r>
+      <w:r>
+        <w:t xml:space="preserve"> </w:t>
+      </w:r>
+      <w:r>
+        <w:t xml:space="preserve">1, 2024, and in subsequent years. Published online 2024.</w:t>
+      </w:r>
+      <w:r>
+        <w:t xml:space="preserve"> </w:t>
+      </w:r>
+      <w:hyperlink r:id="rId115">
+        <w:r>
+          <w:rPr>
+            <w:rStyle w:val="Hyperlink"/>
+          </w:rPr>
+          <w:t xml:space="preserve">https://www.ecfr.gov/on/2024-01-01/title-42/chapter-IV/subchapter-B/part-425/subpart-G/section-425.652</w:t>
+        </w:r>
+      </w:hyperlink>
+    </w:p>
+    <w:bookmarkEnd w:id="116"/>
+    <w:bookmarkStart w:id="117" w:name="ref-registration"/>
+    <w:p>
+      <w:pPr>
+        <w:pStyle w:val="Bibliography"/>
+      </w:pPr>
+      <w:r>
+        <w:t xml:space="preserve">28.</w:t>
+      </w:r>
+      <w:r>
+        <w:t xml:space="preserve"> </w:t>
+      </w:r>
+      <w:r>
+        <w:t xml:space="preserve">	</w:t>
+      </w:r>
+      <w:r>
         <w:t xml:space="preserve">Harrold ST. Why did</w:t>
       </w:r>
       <w:r>
@@ -11122,14 +11179,14 @@
         </w:r>
       </w:hyperlink>
     </w:p>
-    <w:bookmarkEnd w:id="115"/>
-    <w:bookmarkStart w:id="117" w:name="ref-vonelm2007"/>
+    <w:bookmarkEnd w:id="117"/>
+    <w:bookmarkStart w:id="119" w:name="ref-vonelm2007"/>
     <w:p>
       <w:pPr>
         <w:pStyle w:val="Bibliography"/>
       </w:pPr>
       <w:r>
-        <w:t xml:space="preserve">28.</w:t>
+        <w:t xml:space="preserve">29.</w:t>
       </w:r>
       <w:r>
         <w:t xml:space="preserve"> </w:t>
@@ -11153,7 +11210,7 @@
       <w:r>
         <w:t xml:space="preserve">. 2007;4(10):e296. doi:</w:t>
       </w:r>
-      <w:hyperlink r:id="rId116">
+      <w:hyperlink r:id="rId118">
         <w:r>
           <w:rPr>
             <w:rStyle w:val="Hyperlink"/>
@@ -11162,14 +11219,14 @@
         </w:r>
       </w:hyperlink>
     </w:p>
-    <w:bookmarkEnd w:id="117"/>
-    <w:bookmarkStart w:id="119" w:name="ref-code"/>
+    <w:bookmarkEnd w:id="119"/>
+    <w:bookmarkStart w:id="121" w:name="ref-code"/>
     <w:p>
       <w:pPr>
         <w:pStyle w:val="Bibliography"/>
       </w:pPr>
       <w:r>
-        <w:t xml:space="preserve">29.</w:t>
+        <w:t xml:space="preserve">30.</w:t>
       </w:r>
       <w:r>
         <w:t xml:space="preserve"> </w:t>
@@ -11201,7 +11258,7 @@
       <w:r>
         <w:t xml:space="preserve"> </w:t>
       </w:r>
-      <w:hyperlink r:id="rId118">
+      <w:hyperlink r:id="rId120">
         <w:r>
           <w:rPr>
             <w:rStyle w:val="Hyperlink"/>
@@ -11210,14 +11267,14 @@
         </w:r>
       </w:hyperlink>
     </w:p>
-    <w:bookmarkEnd w:id="119"/>
-    <w:bookmarkStart w:id="121" w:name="ref-dataresults"/>
+    <w:bookmarkEnd w:id="121"/>
+    <w:bookmarkStart w:id="123" w:name="ref-dataresults"/>
     <w:p>
       <w:pPr>
         <w:pStyle w:val="Bibliography"/>
       </w:pPr>
       <w:r>
-        <w:t xml:space="preserve">30.</w:t>
+        <w:t xml:space="preserve">31.</w:t>
       </w:r>
       <w:r>
         <w:t xml:space="preserve"> </w:t>
@@ -11231,7 +11288,7 @@
       <w:r>
         <w:t xml:space="preserve"> </w:t>
       </w:r>
-      <w:hyperlink r:id="rId120">
+      <w:hyperlink r:id="rId122">
         <w:r>
           <w:rPr>
             <w:rStyle w:val="Hyperlink"/>
@@ -11240,14 +11297,14 @@
         </w:r>
       </w:hyperlink>
     </w:p>
-    <w:bookmarkEnd w:id="121"/>
-    <w:bookmarkStart w:id="123" w:name="ref-datacounty"/>
+    <w:bookmarkEnd w:id="123"/>
+    <w:bookmarkStart w:id="125" w:name="ref-datacounty"/>
     <w:p>
       <w:pPr>
         <w:pStyle w:val="Bibliography"/>
       </w:pPr>
       <w:r>
-        <w:t xml:space="preserve">31.</w:t>
+        <w:t xml:space="preserve">32.</w:t>
       </w:r>
       <w:r>
         <w:t xml:space="preserve"> </w:t>
@@ -11261,7 +11318,7 @@
       <w:r>
         <w:t xml:space="preserve"> </w:t>
       </w:r>
-      <w:hyperlink r:id="rId122">
+      <w:hyperlink r:id="rId124">
         <w:r>
           <w:rPr>
             <w:rStyle w:val="Hyperlink"/>
@@ -11270,14 +11327,14 @@
         </w:r>
       </w:hyperlink>
     </w:p>
-    <w:bookmarkEnd w:id="123"/>
-    <w:bookmarkStart w:id="125" w:name="ref-dataassigned"/>
+    <w:bookmarkEnd w:id="125"/>
+    <w:bookmarkStart w:id="127" w:name="ref-dataassigned"/>
     <w:p>
       <w:pPr>
         <w:pStyle w:val="Bibliography"/>
       </w:pPr>
       <w:r>
-        <w:t xml:space="preserve">32.</w:t>
+        <w:t xml:space="preserve">33.</w:t>
       </w:r>
       <w:r>
         <w:t xml:space="preserve"> </w:t>
@@ -11291,7 +11348,7 @@
       <w:r>
         <w:t xml:space="preserve"> </w:t>
       </w:r>
-      <w:hyperlink r:id="rId124">
+      <w:hyperlink r:id="rId126">
         <w:r>
           <w:rPr>
             <w:rStyle w:val="Hyperlink"/>
@@ -11300,14 +11357,14 @@
         </w:r>
       </w:hyperlink>
     </w:p>
-    <w:bookmarkEnd w:id="125"/>
-    <w:bookmarkStart w:id="127" w:name="ref-osfproject"/>
+    <w:bookmarkEnd w:id="127"/>
+    <w:bookmarkStart w:id="129" w:name="ref-osfproject"/>
     <w:p>
       <w:pPr>
         <w:pStyle w:val="Bibliography"/>
       </w:pPr>
       <w:r>
-        <w:t xml:space="preserve">33.</w:t>
+        <w:t xml:space="preserve">34.</w:t>
       </w:r>
       <w:r>
         <w:t xml:space="preserve"> </w:t>
@@ -11360,7 +11417,7 @@
       <w:r>
         <w:t xml:space="preserve">data snapshot. Published online 2026. doi:</w:t>
       </w:r>
-      <w:hyperlink r:id="rId126">
+      <w:hyperlink r:id="rId128">
         <w:r>
           <w:rPr>
             <w:rStyle w:val="Hyperlink"/>
@@ -11369,14 +11426,14 @@
         </w:r>
       </w:hyperlink>
     </w:p>
-    <w:bookmarkEnd w:id="127"/>
-    <w:bookmarkStart w:id="129" w:name="ref-suppression"/>
+    <w:bookmarkEnd w:id="129"/>
+    <w:bookmarkStart w:id="131" w:name="ref-suppression"/>
     <w:p>
       <w:pPr>
         <w:pStyle w:val="Bibliography"/>
       </w:pPr>
       <w:r>
-        <w:t xml:space="preserve">34.</w:t>
+        <w:t xml:space="preserve">35.</w:t>
       </w:r>
       <w:r>
         <w:t xml:space="preserve"> </w:t>
@@ -11402,7 +11459,7 @@
       <w:r>
         <w:t xml:space="preserve"> </w:t>
       </w:r>
-      <w:hyperlink r:id="rId128">
+      <w:hyperlink r:id="rId130">
         <w:r>
           <w:rPr>
             <w:rStyle w:val="Hyperlink"/>
@@ -11411,14 +11468,14 @@
         </w:r>
       </w:hyperlink>
     </w:p>
-    <w:bookmarkEnd w:id="129"/>
-    <w:bookmarkStart w:id="131" w:name="ref-specv10"/>
+    <w:bookmarkEnd w:id="131"/>
+    <w:bookmarkStart w:id="133" w:name="ref-specv10"/>
     <w:p>
       <w:pPr>
         <w:pStyle w:val="Bibliography"/>
       </w:pPr>
       <w:r>
-        <w:t xml:space="preserve">35.</w:t>
+        <w:t xml:space="preserve">36.</w:t>
       </w:r>
       <w:r>
         <w:t xml:space="preserve"> </w:t>
@@ -11453,7 +11510,7 @@
       <w:r>
         <w:t xml:space="preserve"> </w:t>
       </w:r>
-      <w:hyperlink r:id="rId130">
+      <w:hyperlink r:id="rId132">
         <w:r>
           <w:rPr>
             <w:rStyle w:val="Hyperlink"/>
@@ -11462,14 +11519,14 @@
         </w:r>
       </w:hyperlink>
     </w:p>
-    <w:bookmarkEnd w:id="131"/>
-    <w:bookmarkStart w:id="133" w:name="ref-cfr425600"/>
+    <w:bookmarkEnd w:id="133"/>
+    <w:bookmarkStart w:id="135" w:name="ref-cfr425600"/>
     <w:p>
       <w:pPr>
         <w:pStyle w:val="Bibliography"/>
       </w:pPr>
       <w:r>
-        <w:t xml:space="preserve">36.</w:t>
+        <w:t xml:space="preserve">37.</w:t>
       </w:r>
       <w:r>
         <w:t xml:space="preserve"> </w:t>
@@ -11507,7 +11564,7 @@
       <w:r>
         <w:t xml:space="preserve"> </w:t>
       </w:r>
-      <w:hyperlink r:id="rId132">
+      <w:hyperlink r:id="rId134">
         <w:r>
           <w:rPr>
             <w:rStyle w:val="Hyperlink"/>
@@ -11516,14 +11573,14 @@
         </w:r>
       </w:hyperlink>
     </w:p>
-    <w:bookmarkEnd w:id="133"/>
-    <w:bookmarkStart w:id="135" w:name="ref-rubin1981"/>
+    <w:bookmarkEnd w:id="135"/>
+    <w:bookmarkStart w:id="137" w:name="ref-rubin1981"/>
     <w:p>
       <w:pPr>
         <w:pStyle w:val="Bibliography"/>
       </w:pPr>
       <w:r>
-        <w:t xml:space="preserve">37.</w:t>
+        <w:t xml:space="preserve">38.</w:t>
       </w:r>
       <w:r>
         <w:t xml:space="preserve"> </w:t>
@@ -11547,7 +11604,7 @@
       <w:r>
         <w:t xml:space="preserve">. 1981;9(1):130-134. doi:</w:t>
       </w:r>
-      <w:hyperlink r:id="rId134">
+      <w:hyperlink r:id="rId136">
         <w:r>
           <w:rPr>
             <w:rStyle w:val="Hyperlink"/>
@@ -11556,14 +11613,14 @@
         </w:r>
       </w:hyperlink>
     </w:p>
-    <w:bookmarkEnd w:id="135"/>
-    <w:bookmarkStart w:id="137" w:name="ref-phipson2010"/>
+    <w:bookmarkEnd w:id="137"/>
+    <w:bookmarkStart w:id="139" w:name="ref-phipson2010"/>
     <w:p>
       <w:pPr>
         <w:pStyle w:val="Bibliography"/>
       </w:pPr>
       <w:r>
-        <w:t xml:space="preserve">38.</w:t>
+        <w:t xml:space="preserve">39.</w:t>
       </w:r>
       <w:r>
         <w:t xml:space="preserve"> </w:t>
@@ -11587,7 +11644,7 @@
       <w:r>
         <w:t xml:space="preserve">. 2010;9(1):39. doi:</w:t>
       </w:r>
-      <w:hyperlink r:id="rId136">
+      <w:hyperlink r:id="rId138">
         <w:r>
           <w:rPr>
             <w:rStyle w:val="Hyperlink"/>
@@ -11596,14 +11653,14 @@
         </w:r>
       </w:hyperlink>
     </w:p>
-    <w:bookmarkEnd w:id="137"/>
-    <w:bookmarkStart w:id="139" w:name="ref-pymc2023"/>
+    <w:bookmarkEnd w:id="139"/>
+    <w:bookmarkStart w:id="141" w:name="ref-pymc2023"/>
     <w:p>
       <w:pPr>
         <w:pStyle w:val="Bibliography"/>
       </w:pPr>
       <w:r>
-        <w:t xml:space="preserve">39.</w:t>
+        <w:t xml:space="preserve">40.</w:t>
       </w:r>
       <w:r>
         <w:t xml:space="preserve"> </w:t>
@@ -11627,7 +11684,7 @@
       <w:r>
         <w:t xml:space="preserve">. 2023;9:e1516. doi:</w:t>
       </w:r>
-      <w:hyperlink r:id="rId138">
+      <w:hyperlink r:id="rId140">
         <w:r>
           <w:rPr>
             <w:rStyle w:val="Hyperlink"/>
@@ -11636,14 +11693,14 @@
         </w:r>
       </w:hyperlink>
     </w:p>
-    <w:bookmarkEnd w:id="139"/>
-    <w:bookmarkStart w:id="141" w:name="ref-hoffman2014"/>
+    <w:bookmarkEnd w:id="141"/>
+    <w:bookmarkStart w:id="143" w:name="ref-hoffman2014"/>
     <w:p>
       <w:pPr>
         <w:pStyle w:val="Bibliography"/>
       </w:pPr>
       <w:r>
-        <w:t xml:space="preserve">40.</w:t>
+        <w:t xml:space="preserve">41.</w:t>
       </w:r>
       <w:r>
         <w:t xml:space="preserve"> </w:t>
@@ -11703,7 +11760,7 @@
       <w:r>
         <w:t xml:space="preserve"> </w:t>
       </w:r>
-      <w:hyperlink r:id="rId140">
+      <w:hyperlink r:id="rId142">
         <w:r>
           <w:rPr>
             <w:rStyle w:val="Hyperlink"/>
@@ -11712,14 +11769,14 @@
         </w:r>
       </w:hyperlink>
     </w:p>
-    <w:bookmarkEnd w:id="141"/>
-    <w:bookmarkStart w:id="143" w:name="ref-gelman2008"/>
+    <w:bookmarkEnd w:id="143"/>
+    <w:bookmarkStart w:id="145" w:name="ref-gelman2008"/>
     <w:p>
       <w:pPr>
         <w:pStyle w:val="Bibliography"/>
       </w:pPr>
       <w:r>
-        <w:t xml:space="preserve">41.</w:t>
+        <w:t xml:space="preserve">42.</w:t>
       </w:r>
       <w:r>
         <w:t xml:space="preserve"> </w:t>
@@ -11743,7 +11800,7 @@
       <w:r>
         <w:t xml:space="preserve">. 2008;27(15):2865-2873. doi:</w:t>
       </w:r>
-      <w:hyperlink r:id="rId142">
+      <w:hyperlink r:id="rId144">
         <w:r>
           <w:rPr>
             <w:rStyle w:val="Hyperlink"/>
@@ -11752,14 +11809,14 @@
         </w:r>
       </w:hyperlink>
     </w:p>
-    <w:bookmarkEnd w:id="143"/>
-    <w:bookmarkStart w:id="145" w:name="ref-vehtari2021"/>
+    <w:bookmarkEnd w:id="145"/>
+    <w:bookmarkStart w:id="147" w:name="ref-vehtari2021"/>
     <w:p>
       <w:pPr>
         <w:pStyle w:val="Bibliography"/>
       </w:pPr>
       <w:r>
-        <w:t xml:space="preserve">42.</w:t>
+        <w:t xml:space="preserve">43.</w:t>
       </w:r>
       <w:r>
         <w:t xml:space="preserve"> </w:t>
@@ -11783,7 +11840,7 @@
       <w:r>
         <w:t xml:space="preserve">. 2021;16(2):667-718. doi:</w:t>
       </w:r>
-      <w:hyperlink r:id="rId144">
+      <w:hyperlink r:id="rId146">
         <w:r>
           <w:rPr>
             <w:rStyle w:val="Hyperlink"/>
@@ -11792,14 +11849,14 @@
         </w:r>
       </w:hyperlink>
     </w:p>
-    <w:bookmarkEnd w:id="145"/>
-    <w:bookmarkStart w:id="147" w:name="ref-firth1993"/>
+    <w:bookmarkEnd w:id="147"/>
+    <w:bookmarkStart w:id="149" w:name="ref-firth1993"/>
     <w:p>
       <w:pPr>
         <w:pStyle w:val="Bibliography"/>
       </w:pPr>
       <w:r>
-        <w:t xml:space="preserve">43.</w:t>
+        <w:t xml:space="preserve">44.</w:t>
       </w:r>
       <w:r>
         <w:t xml:space="preserve"> </w:t>
@@ -11823,7 +11880,7 @@
       <w:r>
         <w:t xml:space="preserve">. 1993;80(1):27-38. doi:</w:t>
       </w:r>
-      <w:hyperlink r:id="rId146">
+      <w:hyperlink r:id="rId148">
         <w:r>
           <w:rPr>
             <w:rStyle w:val="Hyperlink"/>
@@ -11832,14 +11889,14 @@
         </w:r>
       </w:hyperlink>
     </w:p>
-    <w:bookmarkEnd w:id="147"/>
-    <w:bookmarkStart w:id="149" w:name="ref-firthmodels"/>
+    <w:bookmarkEnd w:id="149"/>
+    <w:bookmarkStart w:id="151" w:name="ref-firthmodels"/>
     <w:p>
       <w:pPr>
         <w:pStyle w:val="Bibliography"/>
       </w:pPr>
       <w:r>
-        <w:t xml:space="preserve">44.</w:t>
+        <w:t xml:space="preserve">45.</w:t>
       </w:r>
       <w:r>
         <w:t xml:space="preserve"> </w:t>
@@ -11883,7 +11940,7 @@
       <w:r>
         <w:t xml:space="preserve"> </w:t>
       </w:r>
-      <w:hyperlink r:id="rId148">
+      <w:hyperlink r:id="rId150">
         <w:r>
           <w:rPr>
             <w:rStyle w:val="Hyperlink"/>
@@ -11892,14 +11949,14 @@
         </w:r>
       </w:hyperlink>
     </w:p>
-    <w:bookmarkEnd w:id="149"/>
-    <w:bookmarkStart w:id="151" w:name="ref-gelmanprior2008"/>
+    <w:bookmarkEnd w:id="151"/>
+    <w:bookmarkStart w:id="153" w:name="ref-gelmanprior2008"/>
     <w:p>
       <w:pPr>
         <w:pStyle w:val="Bibliography"/>
       </w:pPr>
       <w:r>
-        <w:t xml:space="preserve">45.</w:t>
+        <w:t xml:space="preserve">46.</w:t>
       </w:r>
       <w:r>
         <w:t xml:space="preserve"> </w:t>
@@ -11923,7 +11980,7 @@
       <w:r>
         <w:t xml:space="preserve">. 2008;2(4):1360-1383. doi:</w:t>
       </w:r>
-      <w:hyperlink r:id="rId150">
+      <w:hyperlink r:id="rId152">
         <w:r>
           <w:rPr>
             <w:rStyle w:val="Hyperlink"/>
@@ -11932,14 +11989,14 @@
         </w:r>
       </w:hyperlink>
     </w:p>
-    <w:bookmarkEnd w:id="151"/>
-    <w:bookmarkStart w:id="153" w:name="ref-callaway2021"/>
+    <w:bookmarkEnd w:id="153"/>
+    <w:bookmarkStart w:id="155" w:name="ref-callaway2021"/>
     <w:p>
       <w:pPr>
         <w:pStyle w:val="Bibliography"/>
       </w:pPr>
       <w:r>
-        <w:t xml:space="preserve">46.</w:t>
+        <w:t xml:space="preserve">47.</w:t>
       </w:r>
       <w:r>
         <w:t xml:space="preserve"> </w:t>
@@ -11963,7 +12020,7 @@
       <w:r>
         <w:t xml:space="preserve">. 2021;225(2):200-230. doi:</w:t>
       </w:r>
-      <w:hyperlink r:id="rId152">
+      <w:hyperlink r:id="rId154">
         <w:r>
           <w:rPr>
             <w:rStyle w:val="Hyperlink"/>
@@ -11972,14 +12029,14 @@
         </w:r>
       </w:hyperlink>
     </w:p>
-    <w:bookmarkEnd w:id="153"/>
-    <w:bookmarkStart w:id="155" w:name="ref-roth2022"/>
+    <w:bookmarkEnd w:id="155"/>
+    <w:bookmarkStart w:id="157" w:name="ref-roth2022"/>
     <w:p>
       <w:pPr>
         <w:pStyle w:val="Bibliography"/>
       </w:pPr>
       <w:r>
-        <w:t xml:space="preserve">47.</w:t>
+        <w:t xml:space="preserve">48.</w:t>
       </w:r>
       <w:r>
         <w:t xml:space="preserve"> </w:t>
@@ -12003,7 +12060,7 @@
       <w:r>
         <w:t xml:space="preserve">. 2022;4(3):305-322. doi:</w:t>
       </w:r>
-      <w:hyperlink r:id="rId154">
+      <w:hyperlink r:id="rId156">
         <w:r>
           <w:rPr>
             <w:rStyle w:val="Hyperlink"/>
@@ -12012,14 +12069,14 @@
         </w:r>
       </w:hyperlink>
     </w:p>
-    <w:bookmarkEnd w:id="155"/>
-    <w:bookmarkStart w:id="157" w:name="ref-lakens2017"/>
+    <w:bookmarkEnd w:id="157"/>
+    <w:bookmarkStart w:id="159" w:name="ref-lakens2017"/>
     <w:p>
       <w:pPr>
         <w:pStyle w:val="Bibliography"/>
       </w:pPr>
       <w:r>
-        <w:t xml:space="preserve">48.</w:t>
+        <w:t xml:space="preserve">49.</w:t>
       </w:r>
       <w:r>
         <w:t xml:space="preserve"> </w:t>
@@ -12043,7 +12100,7 @@
       <w:r>
         <w:t xml:space="preserve">. 2017;8(4):355-362. doi:</w:t>
       </w:r>
-      <w:hyperlink r:id="rId156">
+      <w:hyperlink r:id="rId158">
         <w:r>
           <w:rPr>
             <w:rStyle w:val="Hyperlink"/>
@@ -12052,14 +12109,14 @@
         </w:r>
       </w:hyperlink>
     </w:p>
-    <w:bookmarkEnd w:id="157"/>
-    <w:bookmarkStart w:id="159" w:name="ref-rambachan2023"/>
+    <w:bookmarkEnd w:id="159"/>
+    <w:bookmarkStart w:id="161" w:name="ref-rambachan2023"/>
     <w:p>
       <w:pPr>
         <w:pStyle w:val="Bibliography"/>
       </w:pPr>
       <w:r>
-        <w:t xml:space="preserve">49.</w:t>
+        <w:t xml:space="preserve">50.</w:t>
       </w:r>
       <w:r>
         <w:t xml:space="preserve"> </w:t>
@@ -12083,7 +12140,7 @@
       <w:r>
         <w:t xml:space="preserve">. 2023;90(5):2555-2591. doi:</w:t>
       </w:r>
-      <w:hyperlink r:id="rId158">
+      <w:hyperlink r:id="rId160">
         <w:r>
           <w:rPr>
             <w:rStyle w:val="Hyperlink"/>
@@ -12092,14 +12149,14 @@
         </w:r>
       </w:hyperlink>
     </w:p>
-    <w:bookmarkEnd w:id="159"/>
-    <w:bookmarkStart w:id="161" w:name="ref-rosenbaum1983"/>
+    <w:bookmarkEnd w:id="161"/>
+    <w:bookmarkStart w:id="163" w:name="ref-rosenbaum1983"/>
     <w:p>
       <w:pPr>
         <w:pStyle w:val="Bibliography"/>
       </w:pPr>
       <w:r>
-        <w:t xml:space="preserve">50.</w:t>
+        <w:t xml:space="preserve">51.</w:t>
       </w:r>
       <w:r>
         <w:t xml:space="preserve"> </w:t>
@@ -12123,7 +12180,7 @@
       <w:r>
         <w:t xml:space="preserve">. 1983;70(1):41-55. doi:</w:t>
       </w:r>
-      <w:hyperlink r:id="rId160">
+      <w:hyperlink r:id="rId162">
         <w:r>
           <w:rPr>
             <w:rStyle w:val="Hyperlink"/>
@@ -12132,14 +12189,14 @@
         </w:r>
       </w:hyperlink>
     </w:p>
-    <w:bookmarkEnd w:id="161"/>
-    <w:bookmarkStart w:id="163" w:name="ref-welch1947"/>
+    <w:bookmarkEnd w:id="163"/>
+    <w:bookmarkStart w:id="165" w:name="ref-welch1947"/>
     <w:p>
       <w:pPr>
         <w:pStyle w:val="Bibliography"/>
       </w:pPr>
       <w:r>
-        <w:t xml:space="preserve">51.</w:t>
+        <w:t xml:space="preserve">52.</w:t>
       </w:r>
       <w:r>
         <w:t xml:space="preserve"> </w:t>
@@ -12175,7 +12232,7 @@
       <w:r>
         <w:t xml:space="preserve">. 1947;34(1-2):28-35. doi:</w:t>
       </w:r>
-      <w:hyperlink r:id="rId162">
+      <w:hyperlink r:id="rId164">
         <w:r>
           <w:rPr>
             <w:rStyle w:val="Hyperlink"/>
@@ -12184,14 +12241,14 @@
         </w:r>
       </w:hyperlink>
     </w:p>
-    <w:bookmarkEnd w:id="163"/>
-    <w:bookmarkStart w:id="165" w:name="ref-mackinnon1985"/>
+    <w:bookmarkEnd w:id="165"/>
+    <w:bookmarkStart w:id="167" w:name="ref-mackinnon1985"/>
     <w:p>
       <w:pPr>
         <w:pStyle w:val="Bibliography"/>
       </w:pPr>
       <w:r>
-        <w:t xml:space="preserve">52.</w:t>
+        <w:t xml:space="preserve">53.</w:t>
       </w:r>
       <w:r>
         <w:t xml:space="preserve"> </w:t>
@@ -12215,7 +12272,7 @@
       <w:r>
         <w:t xml:space="preserve">. 1985;29(3):305-325. doi:</w:t>
       </w:r>
-      <w:hyperlink r:id="rId164">
+      <w:hyperlink r:id="rId166">
         <w:r>
           <w:rPr>
             <w:rStyle w:val="Hyperlink"/>
@@ -12224,14 +12281,14 @@
         </w:r>
       </w:hyperlink>
     </w:p>
-    <w:bookmarkEnd w:id="165"/>
-    <w:bookmarkStart w:id="167" w:name="ref-statsmodels2010"/>
+    <w:bookmarkEnd w:id="167"/>
+    <w:bookmarkStart w:id="169" w:name="ref-statsmodels2010"/>
     <w:p>
       <w:pPr>
         <w:pStyle w:val="Bibliography"/>
       </w:pPr>
       <w:r>
-        <w:t xml:space="preserve">53.</w:t>
+        <w:t xml:space="preserve">54.</w:t>
       </w:r>
       <w:r>
         <w:t xml:space="preserve"> </w:t>
@@ -12255,7 +12312,7 @@
       <w:r>
         <w:t xml:space="preserve">. Published online 2010:92-96. doi:</w:t>
       </w:r>
-      <w:hyperlink r:id="rId166">
+      <w:hyperlink r:id="rId168">
         <w:r>
           <w:rPr>
             <w:rStyle w:val="Hyperlink"/>
@@ -12264,14 +12321,14 @@
         </w:r>
       </w:hyperlink>
     </w:p>
-    <w:bookmarkEnd w:id="167"/>
-    <w:bookmarkStart w:id="169" w:name="ref-dbt"/>
+    <w:bookmarkEnd w:id="169"/>
+    <w:bookmarkStart w:id="171" w:name="ref-dbt"/>
     <w:p>
       <w:pPr>
         <w:pStyle w:val="Bibliography"/>
       </w:pPr>
       <w:r>
-        <w:t xml:space="preserve">54.</w:t>
+        <w:t xml:space="preserve">55.</w:t>
       </w:r>
       <w:r>
         <w:t xml:space="preserve"> </w:t>
@@ -12312,7 +12369,7 @@
       <w:r>
         <w:t xml:space="preserve"> </w:t>
       </w:r>
-      <w:hyperlink r:id="rId168">
+      <w:hyperlink r:id="rId170">
         <w:r>
           <w:rPr>
             <w:rStyle w:val="Hyperlink"/>
@@ -12321,14 +12378,14 @@
         </w:r>
       </w:hyperlink>
     </w:p>
-    <w:bookmarkEnd w:id="169"/>
-    <w:bookmarkStart w:id="171" w:name="ref-duckdb2019"/>
+    <w:bookmarkEnd w:id="171"/>
+    <w:bookmarkStart w:id="173" w:name="ref-duckdb2019"/>
     <w:p>
       <w:pPr>
         <w:pStyle w:val="Bibliography"/>
       </w:pPr>
       <w:r>
-        <w:t xml:space="preserve">55.</w:t>
+        <w:t xml:space="preserve">56.</w:t>
       </w:r>
       <w:r>
         <w:t xml:space="preserve"> </w:t>
@@ -12352,7 +12409,7 @@
       <w:r>
         <w:t xml:space="preserve">. Published online June 25, 2019:1981-1984. doi:</w:t>
       </w:r>
-      <w:hyperlink r:id="rId170">
+      <w:hyperlink r:id="rId172">
         <w:r>
           <w:rPr>
             <w:rStyle w:val="Hyperlink"/>
@@ -12361,14 +12418,14 @@
         </w:r>
       </w:hyperlink>
     </w:p>
-    <w:bookmarkEnd w:id="171"/>
-    <w:bookmarkStart w:id="173" w:name="ref-uv"/>
+    <w:bookmarkEnd w:id="173"/>
+    <w:bookmarkStart w:id="175" w:name="ref-uv"/>
     <w:p>
       <w:pPr>
         <w:pStyle w:val="Bibliography"/>
       </w:pPr>
       <w:r>
-        <w:t xml:space="preserve">56.</w:t>
+        <w:t xml:space="preserve">57.</w:t>
       </w:r>
       <w:r>
         <w:t xml:space="preserve"> </w:t>
@@ -12403,7 +12460,7 @@
       <w:r>
         <w:t xml:space="preserve"> </w:t>
       </w:r>
-      <w:hyperlink r:id="rId172">
+      <w:hyperlink r:id="rId174">
         <w:r>
           <w:rPr>
             <w:rStyle w:val="Hyperlink"/>
@@ -12412,14 +12469,14 @@
         </w:r>
       </w:hyperlink>
     </w:p>
-    <w:bookmarkEnd w:id="173"/>
-    <w:bookmarkStart w:id="175" w:name="ref-arviz2019"/>
+    <w:bookmarkEnd w:id="175"/>
+    <w:bookmarkStart w:id="177" w:name="ref-arviz2019"/>
     <w:p>
       <w:pPr>
         <w:pStyle w:val="Bibliography"/>
       </w:pPr>
       <w:r>
-        <w:t xml:space="preserve">57.</w:t>
+        <w:t xml:space="preserve">58.</w:t>
       </w:r>
       <w:r>
         <w:t xml:space="preserve"> </w:t>
@@ -12443,7 +12500,7 @@
       <w:r>
         <w:t xml:space="preserve">. 2019;4(33):1143. doi:</w:t>
       </w:r>
-      <w:hyperlink r:id="rId174">
+      <w:hyperlink r:id="rId176">
         <w:r>
           <w:rPr>
             <w:rStyle w:val="Hyperlink"/>
@@ -12452,14 +12509,14 @@
         </w:r>
       </w:hyperlink>
     </w:p>
-    <w:bookmarkEnd w:id="175"/>
-    <w:bookmarkStart w:id="177" w:name="ref-numpy2020"/>
+    <w:bookmarkEnd w:id="177"/>
+    <w:bookmarkStart w:id="179" w:name="ref-numpy2020"/>
     <w:p>
       <w:pPr>
         <w:pStyle w:val="Bibliography"/>
       </w:pPr>
       <w:r>
-        <w:t xml:space="preserve">58.</w:t>
+        <w:t xml:space="preserve">59.</w:t>
       </w:r>
       <w:r>
         <w:t xml:space="preserve"> </w:t>
@@ -12483,7 +12540,7 @@
       <w:r>
         <w:t xml:space="preserve">. 2020;585(7825):357-362. doi:</w:t>
       </w:r>
-      <w:hyperlink r:id="rId176">
+      <w:hyperlink r:id="rId178">
         <w:r>
           <w:rPr>
             <w:rStyle w:val="Hyperlink"/>
@@ -12492,14 +12549,14 @@
         </w:r>
       </w:hyperlink>
     </w:p>
-    <w:bookmarkEnd w:id="177"/>
-    <w:bookmarkStart w:id="179" w:name="ref-cfr46102"/>
+    <w:bookmarkEnd w:id="179"/>
+    <w:bookmarkStart w:id="181" w:name="ref-cfr46102"/>
     <w:p>
       <w:pPr>
         <w:pStyle w:val="Bibliography"/>
       </w:pPr>
       <w:r>
-        <w:t xml:space="preserve">59.</w:t>
+        <w:t xml:space="preserve">60.</w:t>
       </w:r>
       <w:r>
         <w:t xml:space="preserve"> </w:t>
@@ -12537,7 +12594,7 @@
       <w:r>
         <w:t xml:space="preserve"> </w:t>
       </w:r>
-      <w:hyperlink r:id="rId178">
+      <w:hyperlink r:id="rId180">
         <w:r>
           <w:rPr>
             <w:rStyle w:val="Hyperlink"/>
@@ -12546,14 +12603,14 @@
         </w:r>
       </w:hyperlink>
     </w:p>
-    <w:bookmarkEnd w:id="179"/>
-    <w:bookmarkStart w:id="181" w:name="ref-gelmancarlin2014"/>
+    <w:bookmarkEnd w:id="181"/>
+    <w:bookmarkStart w:id="183" w:name="ref-gelmancarlin2014"/>
     <w:p>
       <w:pPr>
         <w:pStyle w:val="Bibliography"/>
       </w:pPr>
       <w:r>
-        <w:t xml:space="preserve">60.</w:t>
+        <w:t xml:space="preserve">61.</w:t>
       </w:r>
       <w:r>
         <w:t xml:space="preserve"> </w:t>
@@ -12577,7 +12634,7 @@
       <w:r>
         <w:t xml:space="preserve">. 2014;9(6):641-651. doi:</w:t>
       </w:r>
-      <w:hyperlink r:id="rId180">
+      <w:hyperlink r:id="rId182">
         <w:r>
           <w:rPr>
             <w:rStyle w:val="Hyperlink"/>
@@ -12586,14 +12643,14 @@
         </w:r>
       </w:hyperlink>
     </w:p>
-    <w:bookmarkEnd w:id="181"/>
-    <w:bookmarkStart w:id="183" w:name="ref-einav2022"/>
+    <w:bookmarkEnd w:id="183"/>
+    <w:bookmarkStart w:id="185" w:name="ref-einav2022"/>
     <w:p>
       <w:pPr>
         <w:pStyle w:val="Bibliography"/>
       </w:pPr>
       <w:r>
-        <w:t xml:space="preserve">61.</w:t>
+        <w:t xml:space="preserve">62.</w:t>
       </w:r>
       <w:r>
         <w:t xml:space="preserve"> </w:t>
@@ -12617,66 +12674,12 @@
       <w:r>
         <w:t xml:space="preserve">. 2021;137(1):565-618. doi:</w:t>
       </w:r>
-      <w:hyperlink r:id="rId182">
+      <w:hyperlink r:id="rId184">
         <w:r>
           <w:rPr>
             <w:rStyle w:val="Hyperlink"/>
           </w:rPr>
           <w:t xml:space="preserve">10.1093/qje/qjab035</w:t>
-        </w:r>
-      </w:hyperlink>
-    </w:p>
-    <w:bookmarkEnd w:id="183"/>
-    <w:bookmarkStart w:id="185" w:name="ref-cfr2024"/>
-    <w:p>
-      <w:pPr>
-        <w:pStyle w:val="Bibliography"/>
-      </w:pPr>
-      <w:r>
-        <w:t xml:space="preserve">62.</w:t>
-      </w:r>
-      <w:r>
-        <w:t xml:space="preserve"> </w:t>
-      </w:r>
-      <w:r>
-        <w:t xml:space="preserve">	</w:t>
-      </w:r>
-      <w:r>
-        <w:t xml:space="preserve">Centers for Medicare &amp; Medicaid Services. 42</w:t>
-      </w:r>
-      <w:r>
-        <w:t xml:space="preserve"> </w:t>
-      </w:r>
-      <w:r>
-        <w:t xml:space="preserve">CFR</w:t>
-      </w:r>
-      <w:r>
-        <w:t xml:space="preserve"> </w:t>
-      </w:r>
-      <w:r>
-        <w:t xml:space="preserve">425.652, 425.656 and 425.658: Benchmarks, regional adjustment and prior savings adjustment for agreement periods beginning on</w:t>
-      </w:r>
-      <w:r>
-        <w:t xml:space="preserve"> </w:t>
-      </w:r>
-      <w:r>
-        <w:t xml:space="preserve">January</w:t>
-      </w:r>
-      <w:r>
-        <w:t xml:space="preserve"> </w:t>
-      </w:r>
-      <w:r>
-        <w:t xml:space="preserve">1, 2024, and in subsequent years. Published online 2024.</w:t>
-      </w:r>
-      <w:r>
-        <w:t xml:space="preserve"> </w:t>
-      </w:r>
-      <w:hyperlink r:id="rId184">
-        <w:r>
-          <w:rPr>
-            <w:rStyle w:val="Hyperlink"/>
-          </w:rPr>
-          <w:t xml:space="preserve">https://www.ecfr.gov/on/2024-01-01/title-42/chapter-IV/subchapter-B/part-425/subpart-G/section-425.652</w:t>
         </w:r>
       </w:hyperlink>
     </w:p>

</xml_diff>

<commit_message>
Data Availability cites the Zenodo archive (concept DOI 10.5281/zenodo.23737045); version 1.1.0
Co-Authored-By: Claude Opus 5.5 <noreply@anthropic.com>
</commit_message>
<xml_diff>
--- a/paper.docx
+++ b/paper.docx
@@ -9429,13 +9429,13 @@
         <w:t xml:space="preserve"> </w:t>
       </w:r>
       <w:r>
-        <w:t xml:space="preserve">The committed results files, from which every table and figure here is generated, are in the</w:t>
-      </w:r>
-      <w:r>
-        <w:t xml:space="preserve"> </w:t>
-      </w:r>
-      <w:r>
-        <w:t xml:space="preserve">study repository and in this manuscript’s repository.</w:t>
+        <w:t xml:space="preserve">The committed results files, from which every table and figure here is generated, are in the study repository and in this manuscript’s repository, archived on Zenodo with the post hoc</w:t>
+      </w:r>
+      <w:r>
+        <w:t xml:space="preserve"> </w:t>
+      </w:r>
+      <w:r>
+        <w:t xml:space="preserve">scripts.</w:t>
       </w:r>
       <w:r>
         <w:t xml:space="preserve">[</w:t>
@@ -12759,7 +12759,7 @@
         <w:t xml:space="preserve">	</w:t>
       </w:r>
       <w:r>
-        <w:t xml:space="preserve">Harrold ST. Manuscript repository for the</w:t>
+        <w:t xml:space="preserve">Harrold ST. Manuscript, data and code for the</w:t>
       </w:r>
       <w:r>
         <w:t xml:space="preserve"> </w:t>
@@ -12771,17 +12771,14 @@
         <w:t xml:space="preserve"> </w:t>
       </w:r>
       <w:r>
-        <w:t xml:space="preserve">early-renewal study: Text, generated tables and figures, and committed results files. Published online 2026.</w:t>
-      </w:r>
-      <w:r>
-        <w:t xml:space="preserve"> </w:t>
+        <w:t xml:space="preserve">early-renewal study: Text, generated tables and figures, committed results files and post hoc scripts. Published online 2026. doi:</w:t>
       </w:r>
       <w:hyperlink r:id="rId188">
         <w:r>
           <w:rPr>
             <w:rStyle w:val="Hyperlink"/>
           </w:rPr>
-          <w:t xml:space="preserve">https://github.com/stharrold/mssp-paper-2026</w:t>
+          <w:t xml:space="preserve">10.5281/zenodo.23737045</w:t>
         </w:r>
       </w:hyperlink>
     </w:p>

</xml_diff>

<commit_message>
JMIR standards pass: access dates on all URL references, no spaces around = with P and rho, numerals mid-sentence, Data Availability opens with JMIR's template sentence
Co-Authored-By: Claude Opus 5.5 <noreply@anthropic.com>
</commit_message>
<xml_diff>
--- a/paper.docx
+++ b/paper.docx
@@ -296,7 +296,7 @@
         <w:t xml:space="preserve"> </w:t>
       </w:r>
       <w:r>
-        <w:t xml:space="preserve">The rebuilt benchmark tracked CMS’s (Spearman ρ = 0.94). Relative to their current benchmarks,</w:t>
+        <w:t xml:space="preserve">The rebuilt benchmark tracked CMS’s (Spearman ρ=0.94). Relative to their current benchmarks,</w:t>
       </w:r>
       <w:r>
         <w:t xml:space="preserve"> </w:t>
@@ -1226,7 +1226,7 @@
         <w:t xml:space="preserve"> </w:t>
       </w:r>
       <w:r>
-        <w:t xml:space="preserve">The question joins the two strands above, the incentive created by rebasing and selection by benchmark rules, and it</w:t>
+        <w:t xml:space="preserve">The question joins the 2 strands above, the incentive created by rebasing and selection by benchmark rules, and it</w:t>
       </w:r>
       <w:r>
         <w:t xml:space="preserve"> </w:t>
@@ -5575,7 +5575,7 @@
         <w:t xml:space="preserve"> </w:t>
       </w:r>
       <w:r>
-        <w:t xml:space="preserve">0.2 to 3.1). The two parts of the gain offset: the regional component was larger for early renewers (1.6 points;</w:t>
+        <w:t xml:space="preserve">0.2 to 3.1). The 2 parts of the gain offset: the regional component was larger for early renewers (1.6 points;</w:t>
       </w:r>
       <w:r>
         <w:t xml:space="preserve"> </w:t>
@@ -9329,6 +9329,52 @@
         <w:pStyle w:val="FirstParagraph"/>
       </w:pPr>
       <w:r>
+        <w:t xml:space="preserve">The datasets generated or analyzed during this study are available in the Zenodo repository</w:t>
+      </w:r>
+      <w:r>
+        <w:t xml:space="preserve">[</w:t>
+      </w:r>
+      <w:hyperlink w:anchor="ref-paperrepo">
+        <w:r>
+          <w:rPr>
+            <w:rStyle w:val="Hyperlink"/>
+          </w:rPr>
+          <w:t xml:space="preserve">64</w:t>
+        </w:r>
+      </w:hyperlink>
+      <w:r>
+        <w:t xml:space="preserve">]</w:t>
+      </w:r>
+      <w:r>
+        <w:t xml:space="preserve"> </w:t>
+      </w:r>
+      <w:r>
+        <w:t xml:space="preserve">and the</w:t>
+      </w:r>
+      <w:r>
+        <w:t xml:space="preserve"> </w:t>
+      </w:r>
+      <w:r>
+        <w:t xml:space="preserve">OSF project.</w:t>
+      </w:r>
+      <w:r>
+        <w:t xml:space="preserve">[</w:t>
+      </w:r>
+      <w:hyperlink w:anchor="ref-osfproject">
+        <w:r>
+          <w:rPr>
+            <w:rStyle w:val="Hyperlink"/>
+          </w:rPr>
+          <w:t xml:space="preserve">34</w:t>
+        </w:r>
+      </w:hyperlink>
+      <w:r>
+        <w:t xml:space="preserve">]</w:t>
+      </w:r>
+      <w:r>
+        <w:t xml:space="preserve"> </w:t>
+      </w:r>
+      <w:r>
         <w:t xml:space="preserve">All data are public CMS files.</w:t>
       </w:r>
       <w:r>
@@ -9665,7 +9711,7 @@
         <w:t xml:space="preserve">Program</w:t>
       </w:r>
       <w:r>
-        <w:t xml:space="preserve">. Published online 2022.</w:t>
+        <w:t xml:space="preserve">. Published online 2022. Accessed October 28, 2026.</w:t>
       </w:r>
       <w:r>
         <w:t xml:space="preserve"> </w:t>
@@ -9725,7 +9771,7 @@
         <w:t xml:space="preserve"> </w:t>
       </w:r>
       <w:r>
-        <w:t xml:space="preserve">1, 2026. Published online 2026.</w:t>
+        <w:t xml:space="preserve">1, 2026. Published online 2026. Accessed October 28, 2026.</w:t>
       </w:r>
       <w:r>
         <w:t xml:space="preserve"> </w:t>
@@ -9788,7 +9834,7 @@
         <w:t xml:space="preserve"> </w:t>
       </w:r>
       <w:r>
-        <w:t xml:space="preserve">1, 2019, and in subsequent years. Published online 2022.</w:t>
+        <w:t xml:space="preserve">1, 2019, and in subsequent years. Published online 2022. Accessed October 28, 2026.</w:t>
       </w:r>
       <w:r>
         <w:t xml:space="preserve"> </w:t>
@@ -10233,7 +10279,7 @@
         <w:t xml:space="preserve">Economics</w:t>
       </w:r>
       <w:r>
-        <w:t xml:space="preserve">. PhD dissertation. Boston College; 2026.</w:t>
+        <w:t xml:space="preserve">. PhD dissertation. Boston College; 2026. Accessed October 28, 2026.</w:t>
       </w:r>
       <w:r>
         <w:t xml:space="preserve"> </w:t>
@@ -10726,7 +10772,7 @@
         <w:t xml:space="preserve"> </w:t>
       </w:r>
       <w:r>
-        <w:t xml:space="preserve">rule. Published online 2018.</w:t>
+        <w:t xml:space="preserve">rule. Published online 2018. Accessed October 28, 2026.</w:t>
       </w:r>
       <w:r>
         <w:t xml:space="preserve"> </w:t>
@@ -10900,7 +10946,7 @@
         <w:t xml:space="preserve">Financial Results for 2022</w:t>
       </w:r>
       <w:r>
-        <w:t xml:space="preserve">. Milliman; 2024.</w:t>
+        <w:t xml:space="preserve">. Milliman; 2024. Accessed October 28, 2026.</w:t>
       </w:r>
       <w:r>
         <w:t xml:space="preserve"> </w:t>
@@ -11027,7 +11073,7 @@
         <w:t xml:space="preserve">)</w:t>
       </w:r>
       <w:r>
-        <w:t xml:space="preserve">. Milliman; 2025.</w:t>
+        <w:t xml:space="preserve">. Milliman; 2025. Accessed October 28, 2026.</w:t>
       </w:r>
       <w:r>
         <w:t xml:space="preserve"> </w:t>
@@ -11081,7 +11127,7 @@
         <w:t xml:space="preserve"> </w:t>
       </w:r>
       <w:r>
-        <w:t xml:space="preserve">1, 2024, and in subsequent years. Published online 2024.</w:t>
+        <w:t xml:space="preserve">1, 2024, and in subsequent years. Published online 2024. Accessed October 28, 2026.</w:t>
       </w:r>
       <w:r>
         <w:t xml:space="preserve"> </w:t>
@@ -11253,7 +11299,7 @@
         <w:t xml:space="preserve">analysis/mssp-benchmark-ratchet</w:t>
       </w:r>
       <w:r>
-        <w:t xml:space="preserve">), commit a4064f5. Published online 2026.</w:t>
+        <w:t xml:space="preserve">), commit a4064f5. Published online 2026. Accessed October 28, 2026.</w:t>
       </w:r>
       <w:r>
         <w:t xml:space="preserve"> </w:t>
@@ -11454,7 +11500,7 @@
         <w:t xml:space="preserve"> </w:t>
       </w:r>
       <w:r>
-        <w:t xml:space="preserve">cell suppression policy. Published online 2020.</w:t>
+        <w:t xml:space="preserve">cell suppression policy. Published online 2020. Accessed October 28, 2026.</w:t>
       </w:r>
       <w:r>
         <w:t xml:space="preserve"> </w:t>
@@ -11505,7 +11551,7 @@
         <w:t xml:space="preserve">Program</w:t>
       </w:r>
       <w:r>
-        <w:t xml:space="preserve">: Shared savings and losses and assignment methodology specifications, version 10. Published online 2022.</w:t>
+        <w:t xml:space="preserve">: Shared savings and losses and assignment methodology specifications, version 10. Published online 2022. Accessed October 28, 2026.</w:t>
       </w:r>
       <w:r>
         <w:t xml:space="preserve"> </w:t>
@@ -11559,7 +11605,7 @@
         <w:t xml:space="preserve"> </w:t>
       </w:r>
       <w:r>
-        <w:t xml:space="preserve">of risk model. Published online 2022.</w:t>
+        <w:t xml:space="preserve">of risk model. Published online 2022. Accessed October 28, 2026.</w:t>
       </w:r>
       <w:r>
         <w:t xml:space="preserve"> </w:t>
@@ -11755,7 +11801,7 @@
         <w:t xml:space="preserve">Journal of Machine Learning Research</w:t>
       </w:r>
       <w:r>
-        <w:t xml:space="preserve">. 2014;15:1593-1623.</w:t>
+        <w:t xml:space="preserve">. 2014;15:1593-1623. Accessed October 28, 2026.</w:t>
       </w:r>
       <w:r>
         <w:t xml:space="preserve"> </w:t>
@@ -11935,7 +11981,7 @@
         <w:t xml:space="preserve">Python</w:t>
       </w:r>
       <w:r>
-        <w:t xml:space="preserve">. Published online 2026.</w:t>
+        <w:t xml:space="preserve">. Published online 2026. Accessed October 28, 2026.</w:t>
       </w:r>
       <w:r>
         <w:t xml:space="preserve"> </w:t>
@@ -12364,7 +12410,7 @@
         <w:t xml:space="preserve"> </w:t>
       </w:r>
       <w:r>
-        <w:t xml:space="preserve">1.11.0. Published online 2026.</w:t>
+        <w:t xml:space="preserve">1.11.0. Published online 2026. Accessed October 28, 2026.</w:t>
       </w:r>
       <w:r>
         <w:t xml:space="preserve"> </w:t>
@@ -12455,7 +12501,7 @@
         <w:t xml:space="preserve"> </w:t>
       </w:r>
       <w:r>
-        <w:t xml:space="preserve">package and project manager. Published online 2026.</w:t>
+        <w:t xml:space="preserve">package and project manager. Published online 2026. Accessed October 28, 2026.</w:t>
       </w:r>
       <w:r>
         <w:t xml:space="preserve"> </w:t>
@@ -12589,7 +12635,7 @@
         <w:t xml:space="preserve"> </w:t>
       </w:r>
       <w:r>
-        <w:t xml:space="preserve">for purposes of this policy. Published online 2026.</w:t>
+        <w:t xml:space="preserve">for purposes of this policy. Published online 2026. Accessed October 28, 2026.</w:t>
       </w:r>
       <w:r>
         <w:t xml:space="preserve"> </w:t>
@@ -12729,7 +12775,7 @@
         <w:t xml:space="preserve"> </w:t>
       </w:r>
       <w:r>
-        <w:t xml:space="preserve">an option to use pre-pandemic years to set benchmarks. Published online 2021.</w:t>
+        <w:t xml:space="preserve">an option to use pre-pandemic years to set benchmarks. Published online 2021. Accessed October 28, 2026.</w:t>
       </w:r>
       <w:r>
         <w:t xml:space="preserve"> </w:t>
@@ -12828,7 +12874,7 @@
         <w:t xml:space="preserve"> </w:t>
       </w:r>
       <w:r>
-        <w:t xml:space="preserve">pre-registered study. Published online 2026.</w:t>
+        <w:t xml:space="preserve">pre-registered study. Published online 2026. Accessed October 28, 2026.</w:t>
       </w:r>
       <w:r>
         <w:t xml:space="preserve"> </w:t>

</xml_diff>

<commit_message>
DOCX tables: content-based column widths, full text width, 10 pt single-spaced cells; STROBE item label and paragraph numbers
The Word build's columns were sized by the PDF build's widths and to pandoc's fixed 5.5 in text width, so short
values (<.001, >0.999, MDE) broke across lines and tables filled 85% of the line. include.lua now reserves each
column's longest word at 10 pt plus cell padding and shares the rest by content length; docx_tables.py rescales the
grids to the 6.5 in text width; reference.docx sets table cells (Compact) to 10 pt single spacing and declares the
Letter page with 1 in margins. Checked by exporting through Pages: the manuscript went from 55 to 45 pages and the
supplement from 32 to 14 with no value broken. PDF build unchanged. STROBE: item 8 label restored, introduction
paragraph numbers updated for the restructured introduction.

Co-Authored-By: Claude Opus 5.5 <noreply@anthropic.com>
</commit_message>
<xml_diff>
--- a/paper.docx
+++ b/paper.docx
@@ -4070,10 +4070,10 @@
         <w:tblCaption w:val="Table 1. Characteristics of the 334 ACOs in the 2019 and 2020 agreement cohorts, by group"/>
       </w:tblPr>
       <w:tblGrid>
-        <w:gridCol w:w="3529"/>
-        <w:gridCol w:w="1463"/>
-        <w:gridCol w:w="1463"/>
-        <w:gridCol w:w="1463"/>
+        <w:gridCol w:w="4343"/>
+        <w:gridCol w:w="1752"/>
+        <w:gridCol w:w="1396"/>
+        <w:gridCol w:w="1869"/>
       </w:tblGrid>
       <w:tr>
         <w:trPr>
@@ -5388,7 +5388,7 @@
       <w:r>
         <w:drawing>
           <wp:inline>
-            <wp:extent cx="5334000" cy="4174434"/>
+            <wp:extent cx="5943600" cy="4651513"/>
             <wp:effectExtent b="0" l="0" r="0" t="0"/>
             <wp:docPr descr="Figure 1. Flow of ACOs into each analysis. Counts are early renewers vs stayers. The reason for the expected-gain exclusions comes from a diagnostic query run after the results, outside the registered pipeline. ACO, accountable care organization; ESRD, end-stage renal disease; PY, performance year." title="" id="35" name="Picture"/>
             <a:graphic>
@@ -5409,7 +5409,7 @@
                   <pic:spPr bwMode="auto">
                     <a:xfrm>
                       <a:off x="0" y="0"/>
-                      <a:ext cx="5334000" cy="4174434"/>
+                      <a:ext cx="5943600" cy="4651513"/>
                     </a:xfrm>
                     <a:prstGeom prst="rect">
                       <a:avLst/>
@@ -5656,13 +5656,13 @@
         <w:tblCaption w:val="Table 2. Early renewers compared with stayers: regional pull (H2b), own-spending component (H2a), savings rates (H1) and the expected gain"/>
       </w:tblPr>
       <w:tblGrid>
-        <w:gridCol w:w="2556"/>
-        <w:gridCol w:w="1060"/>
-        <w:gridCol w:w="1559"/>
-        <w:gridCol w:w="561"/>
-        <w:gridCol w:w="561"/>
-        <w:gridCol w:w="561"/>
-        <w:gridCol w:w="1060"/>
+        <w:gridCol w:w="2020"/>
+        <w:gridCol w:w="1332"/>
+        <w:gridCol w:w="1586"/>
+        <w:gridCol w:w="1040"/>
+        <w:gridCol w:w="910"/>
+        <w:gridCol w:w="650"/>
+        <w:gridCol w:w="1822"/>
       </w:tblGrid>
       <w:tr>
         <w:trPr>
@@ -6293,7 +6293,7 @@
       <w:r>
         <w:drawing>
           <wp:inline>
-            <wp:extent cx="5334000" cy="2215692"/>
+            <wp:extent cx="5943600" cy="2468914"/>
             <wp:effectExtent b="0" l="0" r="0" t="0"/>
             <wp:docPr descr="Figure 2. Early renewers minus stayers. A, Expected-gain variables, in percentage points of the current benchmark. B, Savings rates, in percentage points. Points are posterior means and lines 95% credible intervals from the Bayesian bootstrap." title="" id="39" name="Picture"/>
             <a:graphic>
@@ -6314,7 +6314,7 @@
                   <pic:spPr bwMode="auto">
                     <a:xfrm>
                       <a:off x="0" y="0"/>
-                      <a:ext cx="5334000" cy="2215692"/>
+                      <a:ext cx="5943600" cy="2468914"/>
                     </a:xfrm>
                     <a:prstGeom prst="rect">
                       <a:avLst/>
@@ -6522,13 +6522,13 @@
         <w:tblCaption w:val="Table 3. Decision model of early renewal among BASIC-track ACOs (H3)"/>
       </w:tblPr>
       <w:tblGrid>
-        <w:gridCol w:w="1652"/>
-        <w:gridCol w:w="1424"/>
-        <w:gridCol w:w="512"/>
-        <w:gridCol w:w="512"/>
-        <w:gridCol w:w="968"/>
-        <w:gridCol w:w="1424"/>
-        <w:gridCol w:w="1424"/>
+        <w:gridCol w:w="1777"/>
+        <w:gridCol w:w="1303"/>
+        <w:gridCol w:w="948"/>
+        <w:gridCol w:w="711"/>
+        <w:gridCol w:w="1659"/>
+        <w:gridCol w:w="1303"/>
+        <w:gridCol w:w="1659"/>
       </w:tblGrid>
       <w:tr>
         <w:trPr>
@@ -7339,7 +7339,7 @@
       <w:r>
         <w:drawing>
           <wp:inline>
-            <wp:extent cx="5334000" cy="1942358"/>
+            <wp:extent cx="5943600" cy="2164342"/>
             <wp:effectExtent b="0" l="0" r="0" t="0"/>
             <wp:docPr descr="Figure 3. Decision model of early renewal among BASIC-track ACOs (H3). Points are posterior means and lines 95% credible intervals; the shaded band is the Normal(0, 1) prior’s central 95%. Bold labels mark the core predictors." title="" id="43" name="Picture"/>
             <a:graphic>
@@ -7360,7 +7360,7 @@
                   <pic:spPr bwMode="auto">
                     <a:xfrm>
                       <a:off x="0" y="0"/>
-                      <a:ext cx="5334000" cy="1942358"/>
+                      <a:ext cx="5943600" cy="2164342"/>
                     </a:xfrm>
                     <a:prstGeom prst="rect">
                       <a:avLst/>
@@ -7541,11 +7541,11 @@
         <w:tblCaption w:val="Table 4. Spending growth after early renewal (H4), with the pre-trend and robustness estimates"/>
       </w:tblPr>
       <w:tblGrid>
-        <w:gridCol w:w="3347"/>
-        <w:gridCol w:w="1388"/>
-        <w:gridCol w:w="1061"/>
-        <w:gridCol w:w="1388"/>
-        <w:gridCol w:w="734"/>
+        <w:gridCol w:w="3942"/>
+        <w:gridCol w:w="1963"/>
+        <w:gridCol w:w="1735"/>
+        <w:gridCol w:w="1069"/>
+        <w:gridCol w:w="651"/>
       </w:tblGrid>
       <w:tr>
         <w:trPr>
@@ -8148,7 +8148,7 @@
       <w:r>
         <w:drawing>
           <wp:inline>
-            <wp:extent cx="5334000" cy="2103848"/>
+            <wp:extent cx="5943600" cy="2344288"/>
             <wp:effectExtent b="0" l="0" r="0" t="0"/>
             <wp:docPr descr="Figure 4. Spending after early renewal. A, Event study from the conventional 2-way fixed-effects model, in log points relative to PY2021, with 95% CIs clustered by ACO. B, The registered H4 estimate and the robustness and conventional estimates, as the percent difference in spending growth with 95% intervals (the propensity-weighted estimate has no interval); sample sizes are in Table 4. TWFE, 2-way fixed effects." title="" id="47" name="Picture"/>
             <a:graphic>
@@ -8169,7 +8169,7 @@
                   <pic:spPr bwMode="auto">
                     <a:xfrm>
                       <a:off x="0" y="0"/>
-                      <a:ext cx="5334000" cy="2103848"/>
+                      <a:ext cx="5943600" cy="2344288"/>
                     </a:xfrm>
                     <a:prstGeom prst="rect">
                       <a:avLst/>
@@ -12895,6 +12895,8 @@
       <w:footnotePr>
         <w:numRestart w:val="eachSect"/>
       </w:footnotePr>
+      <w:pgSz w:h="15840" w:w="12240"/>
+      <w:pgMar w:bottom="1440" w:footer="720" w:gutter="0" w:header="720" w:left="1440" w:right="1440" w:top="1440"/>
     </w:sectPr>
   </w:body>
 </w:document>
@@ -13057,8 +13059,12 @@
     <w:basedOn w:val="BodyText"/>
     <w:qFormat/>
     <w:pPr>
-      <w:spacing w:after="36" w:before="36"/>
+      <w:spacing w:after="20" w:before="20" w:line="240" w:lineRule="auto"/>
     </w:pPr>
+    <w:rPr>
+      <w:sz w:val="20"/>
+      <w:szCs w:val="20"/>
+    </w:rPr>
   </w:style>
   <w:style w:styleId="Title" w:type="paragraph">
     <w:name w:val="Title"/>

</xml_diff>

<commit_message>
Move Table 4 (H4 spending estimates) to Multimedia Appendix 1 as eTable 8
Figure 4 already plots the same estimates with their values, and spending is a secondary, inconclusive result.
eTables 8-13 become 9-14 and every reference is updated (manuscript, supplement contents and eMethods, STROBE
checklist); the main text now has 3 tables. Checks pass (8,482 words).

Co-Authored-By: Claude Opus 5.5 <noreply@anthropic.com>
</commit_message>
<xml_diff>
--- a/paper.docx
+++ b/paper.docx
@@ -3808,7 +3808,7 @@
         <w:pStyle w:val="FirstParagraph"/>
       </w:pPr>
       <w:r>
-        <w:t xml:space="preserve">After all registered results had been read, and in response to critical review of the draft, 3 checks were added (eTable 12 in Multimedia Appendix 1). They reuse the registered pipeline’s tables and estimator,</w:t>
+        <w:t xml:space="preserve">After all registered results had been read, and in response to critical review of the draft, 3 checks were added (eTable 13 in Multimedia Appendix 1). They reuse the registered pipeline’s tables and estimator,</w:t>
       </w:r>
       <w:r>
         <w:t xml:space="preserve"> </w:t>
@@ -5500,7 +5500,7 @@
         <w:t xml:space="preserve"> </w:t>
       </w:r>
       <w:r>
-        <w:t xml:space="preserve">weight, the pull difference was 1.6 points (eTable 9), and the regional component differed by the same 1.6 points</w:t>
+        <w:t xml:space="preserve">weight, the pull difference was 1.6 points (eTable 10), and the regional component differed by the same 1.6 points</w:t>
       </w:r>
       <w:r>
         <w:t xml:space="preserve"> </w:t>
@@ -5524,7 +5524,7 @@
         <w:t xml:space="preserve"> </w:t>
       </w:r>
       <w:r>
-        <w:t xml:space="preserve">with the PY2020 savings rate was 0.45 among the 267 compared ACOs (eTable 12 in Multimedia Appendix 1). At the median PY2021 benchmark of the study’s ACOs, $11,312 per beneficiary per year, the difference of 3.35</w:t>
+        <w:t xml:space="preserve">with the PY2020 savings rate was 0.45 among the 267 compared ACOs (eTable 13 in Multimedia Appendix 1). At the median PY2021 benchmark of the study’s ACOs, $11,312 per beneficiary per year, the difference of 3.35</w:t>
       </w:r>
       <w:r>
         <w:t xml:space="preserve"> </w:t>
@@ -5636,7 +5636,7 @@
         <w:t xml:space="preserve"> </w:t>
       </w:r>
       <w:r>
-        <w:t xml:space="preserve">(eTable 12 in Multimedia Appendix 1).</w:t>
+        <w:t xml:space="preserve">(eTable 13 in Multimedia Appendix 1).</w:t>
       </w:r>
     </w:p>
     <w:p>
@@ -7421,13 +7421,7 @@
         <w:t xml:space="preserve">P</w:t>
       </w:r>
       <w:r>
-        <w:t xml:space="preserve">=.78; MDE 3.8 log points) (Table 4 and Figure</w:t>
-      </w:r>
-      <w:r>
-        <w:t xml:space="preserve"> </w:t>
-      </w:r>
-      <w:r>
-        <w:t xml:space="preserve">4). The pre-trend estimate was 0.7% (95% CrI, −2.3% to 4.9%;</w:t>
+        <w:t xml:space="preserve">=.78; MDE 3.8 log points) (Figure 4; eTable 8 in Multimedia Appendix 1). The pre-trend estimate was 0.7% (95% CrI, −2.3% to 4.9%;</w:t>
       </w:r>
       <w:r>
         <w:t xml:space="preserve"> </w:t>
@@ -7502,7 +7496,7 @@
         <w:t xml:space="preserve"> </w:t>
       </w:r>
       <w:r>
-        <w:t xml:space="preserve">and 1 had no spending value), against 4 of 29 early renewers (14%) (eTable 8 in Multimedia Appendix 1). The balanced panel of</w:t>
+        <w:t xml:space="preserve">and 1 had no spending value), against 4 of 29 early renewers (14%) (eTable 9 in Multimedia Appendix 1). The balanced panel of</w:t>
       </w:r>
       <w:r>
         <w:t xml:space="preserve"> </w:t>
@@ -7526,623 +7520,6 @@
     </w:p>
     <w:p>
       <w:pPr>
-        <w:pStyle w:val="TableCaption"/>
-      </w:pPr>
-      <w:r>
-        <w:t xml:space="preserve">Table 4. Spending growth after early renewal (H4), with the pre-trend and robustness estimates</w:t>
-      </w:r>
-    </w:p>
-    <w:tbl>
-      <w:tblPr>
-        <w:tblStyle w:val="Table"/>
-        <w:tblW w:type="pct" w:w="5000"/>
-        <w:tblLayout w:type="fixed"/>
-        <w:tblLook w:firstRow="1" w:lastRow="0" w:firstColumn="0" w:lastColumn="0" w:noHBand="0" w:noVBand="0" w:val="0020"/>
-        <w:tblCaption w:val="Table 4. Spending growth after early renewal (H4), with the pre-trend and robustness estimates"/>
-      </w:tblPr>
-      <w:tblGrid>
-        <w:gridCol w:w="3942"/>
-        <w:gridCol w:w="1963"/>
-        <w:gridCol w:w="1735"/>
-        <w:gridCol w:w="1069"/>
-        <w:gridCol w:w="651"/>
-      </w:tblGrid>
-      <w:tr>
-        <w:trPr>
-          <w:tblHeader w:val="on"/>
-        </w:trPr>
-        <w:tc>
-          <w:tcPr/>
-          <w:p>
-            <w:pPr>
-              <w:pStyle w:val="Compact"/>
-              <w:jc w:val="left"/>
-            </w:pPr>
-            <w:r>
-              <w:t xml:space="preserve">Estimate</w:t>
-            </w:r>
-          </w:p>
-        </w:tc>
-        <w:tc>
-          <w:tcPr/>
-          <w:p>
-            <w:pPr>
-              <w:pStyle w:val="Compact"/>
-              <w:jc w:val="right"/>
-            </w:pPr>
-            <w:r>
-              <w:t xml:space="preserve">Early / comparison, No.</w:t>
-            </w:r>
-          </w:p>
-        </w:tc>
-        <w:tc>
-          <w:tcPr/>
-          <w:p>
-            <w:pPr>
-              <w:pStyle w:val="Compact"/>
-              <w:jc w:val="right"/>
-            </w:pPr>
-            <w:r>
-              <w:t xml:space="preserve">Difference, %</w:t>
-            </w:r>
-          </w:p>
-        </w:tc>
-        <w:tc>
-          <w:tcPr/>
-          <w:p>
-            <w:pPr>
-              <w:pStyle w:val="Compact"/>
-              <w:jc w:val="right"/>
-            </w:pPr>
-            <w:r>
-              <w:t xml:space="preserve">95% CrI</w:t>
-            </w:r>
-          </w:p>
-        </w:tc>
-        <w:tc>
-          <w:tcPr/>
-          <w:p>
-            <w:pPr>
-              <w:pStyle w:val="Compact"/>
-              <w:jc w:val="right"/>
-            </w:pPr>
-            <w:r>
-              <w:rPr>
-                <w:i/>
-                <w:iCs/>
-              </w:rPr>
-              <w:t xml:space="preserve">P</w:t>
-            </w:r>
-          </w:p>
-        </w:tc>
-      </w:tr>
-      <w:tr>
-        <w:tc>
-          <w:tcPr/>
-          <w:p>
-            <w:pPr>
-              <w:pStyle w:val="Compact"/>
-              <w:jc w:val="left"/>
-            </w:pPr>
-            <w:r>
-              <w:rPr>
-                <w:b/>
-                <w:bCs/>
-              </w:rPr>
-              <w:t xml:space="preserve">H4, difference-in-differences</w:t>
-            </w:r>
-          </w:p>
-        </w:tc>
-        <w:tc>
-          <w:tcPr/>
-          <w:p>
-            <w:pPr>
-              <w:pStyle w:val="Compact"/>
-              <w:jc w:val="right"/>
-            </w:pPr>
-            <w:r>
-              <w:rPr>
-                <w:b/>
-                <w:bCs/>
-              </w:rPr>
-              <w:t xml:space="preserve">29 / 276</w:t>
-            </w:r>
-          </w:p>
-        </w:tc>
-        <w:tc>
-          <w:tcPr/>
-          <w:p>
-            <w:pPr>
-              <w:pStyle w:val="Compact"/>
-              <w:jc w:val="right"/>
-            </w:pPr>
-            <w:r>
-              <w:rPr>
-                <w:b/>
-                <w:bCs/>
-              </w:rPr>
-              <w:t xml:space="preserve">−0.4</w:t>
-            </w:r>
-          </w:p>
-        </w:tc>
-        <w:tc>
-          <w:tcPr/>
-          <w:p>
-            <w:pPr>
-              <w:pStyle w:val="Compact"/>
-              <w:jc w:val="right"/>
-            </w:pPr>
-            <w:r>
-              <w:rPr>
-                <w:b/>
-                <w:bCs/>
-              </w:rPr>
-              <w:t xml:space="preserve">−4.0 to 2.5</w:t>
-            </w:r>
-          </w:p>
-        </w:tc>
-        <w:tc>
-          <w:tcPr/>
-          <w:p>
-            <w:pPr>
-              <w:pStyle w:val="Compact"/>
-              <w:jc w:val="right"/>
-            </w:pPr>
-            <w:r>
-              <w:rPr>
-                <w:b/>
-                <w:bCs/>
-              </w:rPr>
-              <w:t xml:space="preserve">.78</w:t>
-            </w:r>
-          </w:p>
-        </w:tc>
-      </w:tr>
-      <w:tr>
-        <w:tc>
-          <w:tcPr/>
-          <w:p>
-            <w:pPr>
-              <w:pStyle w:val="Compact"/>
-              <w:jc w:val="left"/>
-            </w:pPr>
-            <w:r>
-              <w:t xml:space="preserve">Pre-trend, PY2020 to PY2021</w:t>
-            </w:r>
-          </w:p>
-        </w:tc>
-        <w:tc>
-          <w:tcPr/>
-          <w:p>
-            <w:pPr>
-              <w:pStyle w:val="Compact"/>
-              <w:jc w:val="right"/>
-            </w:pPr>
-            <w:r>
-              <w:t xml:space="preserve">29 / 276</w:t>
-            </w:r>
-          </w:p>
-        </w:tc>
-        <w:tc>
-          <w:tcPr/>
-          <w:p>
-            <w:pPr>
-              <w:pStyle w:val="Compact"/>
-              <w:jc w:val="right"/>
-            </w:pPr>
-            <w:r>
-              <w:t xml:space="preserve">+0.7</w:t>
-            </w:r>
-          </w:p>
-        </w:tc>
-        <w:tc>
-          <w:tcPr/>
-          <w:p>
-            <w:pPr>
-              <w:pStyle w:val="Compact"/>
-              <w:jc w:val="right"/>
-            </w:pPr>
-            <w:r>
-              <w:t xml:space="preserve">−2.3 to 4.9</w:t>
-            </w:r>
-          </w:p>
-        </w:tc>
-        <w:tc>
-          <w:tcPr/>
-          <w:p>
-            <w:pPr>
-              <w:pStyle w:val="Compact"/>
-              <w:jc w:val="right"/>
-            </w:pPr>
-            <w:r>
-              <w:t xml:space="preserve">.58</w:t>
-            </w:r>
-          </w:p>
-        </w:tc>
-      </w:tr>
-      <w:tr>
-        <w:tc>
-          <w:tcPr/>
-          <w:p>
-            <w:pPr>
-              <w:pStyle w:val="Compact"/>
-              <w:jc w:val="left"/>
-            </w:pPr>
-            <w:r>
-              <w:t xml:space="preserve">Trend-adjusted</w:t>
-            </w:r>
-          </w:p>
-        </w:tc>
-        <w:tc>
-          <w:tcPr/>
-          <w:p>
-            <w:pPr>
-              <w:pStyle w:val="Compact"/>
-              <w:jc w:val="right"/>
-            </w:pPr>
-            <w:r>
-              <w:t xml:space="preserve">29 / 276</w:t>
-            </w:r>
-          </w:p>
-        </w:tc>
-        <w:tc>
-          <w:tcPr/>
-          <w:p>
-            <w:pPr>
-              <w:pStyle w:val="Compact"/>
-              <w:jc w:val="right"/>
-            </w:pPr>
-            <w:r>
-              <w:t xml:space="preserve">−4.0</w:t>
-            </w:r>
-          </w:p>
-        </w:tc>
-        <w:tc>
-          <w:tcPr/>
-          <w:p>
-            <w:pPr>
-              <w:pStyle w:val="Compact"/>
-              <w:jc w:val="right"/>
-            </w:pPr>
-            <w:r>
-              <w:t xml:space="preserve">−12.0 to 2.7</w:t>
-            </w:r>
-          </w:p>
-        </w:tc>
-        <w:tc>
-          <w:tcPr/>
-          <w:p>
-            <w:pPr>
-              <w:pStyle w:val="Compact"/>
-              <w:jc w:val="right"/>
-            </w:pPr>
-            <w:r>
-              <w:t xml:space="preserve">.14</w:t>
-            </w:r>
-          </w:p>
-        </w:tc>
-      </w:tr>
-      <w:tr>
-        <w:tc>
-          <w:tcPr/>
-          <w:p>
-            <w:pPr>
-              <w:pStyle w:val="Compact"/>
-              <w:jc w:val="left"/>
-            </w:pPr>
-            <w:r>
-              <w:t xml:space="preserve">Risk-adjusted outcome</w:t>
-            </w:r>
-          </w:p>
-        </w:tc>
-        <w:tc>
-          <w:tcPr/>
-          <w:p>
-            <w:pPr>
-              <w:pStyle w:val="Compact"/>
-              <w:jc w:val="right"/>
-            </w:pPr>
-            <w:r>
-              <w:t xml:space="preserve">29 / 276</w:t>
-            </w:r>
-          </w:p>
-        </w:tc>
-        <w:tc>
-          <w:tcPr/>
-          <w:p>
-            <w:pPr>
-              <w:pStyle w:val="Compact"/>
-              <w:jc w:val="right"/>
-            </w:pPr>
-            <w:r>
-              <w:t xml:space="preserve">+0.3</w:t>
-            </w:r>
-          </w:p>
-        </w:tc>
-        <w:tc>
-          <w:tcPr/>
-          <w:p>
-            <w:pPr>
-              <w:pStyle w:val="Compact"/>
-              <w:jc w:val="right"/>
-            </w:pPr>
-            <w:r>
-              <w:t xml:space="preserve">−2.0 to 2.5</w:t>
-            </w:r>
-          </w:p>
-        </w:tc>
-        <w:tc>
-          <w:tcPr/>
-          <w:p>
-            <w:pPr>
-              <w:pStyle w:val="Compact"/>
-              <w:jc w:val="right"/>
-            </w:pPr>
-            <w:r>
-              <w:t xml:space="preserve">.85</w:t>
-            </w:r>
-          </w:p>
-        </w:tc>
-      </w:tr>
-      <w:tr>
-        <w:tc>
-          <w:tcPr/>
-          <w:p>
-            <w:pPr>
-              <w:pStyle w:val="Compact"/>
-              <w:jc w:val="left"/>
-            </w:pPr>
-            <w:r>
-              <w:t xml:space="preserve">Balanced panel (all 5 years)</w:t>
-            </w:r>
-          </w:p>
-        </w:tc>
-        <w:tc>
-          <w:tcPr/>
-          <w:p>
-            <w:pPr>
-              <w:pStyle w:val="Compact"/>
-              <w:jc w:val="right"/>
-            </w:pPr>
-            <w:r>
-              <w:t xml:space="preserve">25 / 162</w:t>
-            </w:r>
-          </w:p>
-        </w:tc>
-        <w:tc>
-          <w:tcPr/>
-          <w:p>
-            <w:pPr>
-              <w:pStyle w:val="Compact"/>
-              <w:jc w:val="right"/>
-            </w:pPr>
-            <w:r>
-              <w:t xml:space="preserve">−1.6</w:t>
-            </w:r>
-          </w:p>
-        </w:tc>
-        <w:tc>
-          <w:tcPr/>
-          <w:p>
-            <w:pPr>
-              <w:pStyle w:val="Compact"/>
-              <w:jc w:val="right"/>
-            </w:pPr>
-            <w:r>
-              <w:t xml:space="preserve">−5.6 to 1.6</w:t>
-            </w:r>
-          </w:p>
-        </w:tc>
-        <w:tc>
-          <w:tcPr/>
-          <w:p>
-            <w:pPr>
-              <w:pStyle w:val="Compact"/>
-              <w:jc w:val="right"/>
-            </w:pPr>
-            <w:r>
-              <w:t xml:space="preserve">.30</w:t>
-            </w:r>
-          </w:p>
-        </w:tc>
-      </w:tr>
-      <w:tr>
-        <w:tc>
-          <w:tcPr/>
-          <w:p>
-            <w:pPr>
-              <w:pStyle w:val="Compact"/>
-              <w:jc w:val="left"/>
-            </w:pPr>
-            <w:r>
-              <w:t xml:space="preserve">Propensity-weighted</w:t>
-            </w:r>
-          </w:p>
-        </w:tc>
-        <w:tc>
-          <w:tcPr/>
-          <w:p>
-            <w:pPr>
-              <w:pStyle w:val="Compact"/>
-              <w:jc w:val="right"/>
-            </w:pPr>
-            <w:r>
-              <w:t xml:space="preserve">305 total</w:t>
-            </w:r>
-          </w:p>
-        </w:tc>
-        <w:tc>
-          <w:tcPr/>
-          <w:p>
-            <w:pPr>
-              <w:pStyle w:val="Compact"/>
-              <w:jc w:val="right"/>
-            </w:pPr>
-            <w:r>
-              <w:t xml:space="preserve">−0.5</w:t>
-            </w:r>
-          </w:p>
-        </w:tc>
-        <w:tc>
-          <w:tcPr/>
-          <w:p>
-            <w:pPr>
-              <w:pStyle w:val="Compact"/>
-              <w:jc w:val="right"/>
-            </w:pPr>
-            <w:r>
-              <w:t xml:space="preserve">NA</w:t>
-            </w:r>
-          </w:p>
-        </w:tc>
-        <w:tc>
-          <w:tcPr/>
-          <w:p>
-            <w:pPr>
-              <w:pStyle w:val="Compact"/>
-              <w:jc w:val="right"/>
-            </w:pPr>
-            <w:r>
-              <w:t xml:space="preserve">.67</w:t>
-            </w:r>
-          </w:p>
-        </w:tc>
-      </w:tr>
-      <w:tr>
-        <w:tc>
-          <w:tcPr/>
-          <w:p>
-            <w:pPr>
-              <w:pStyle w:val="Compact"/>
-              <w:jc w:val="left"/>
-            </w:pPr>
-            <w:r>
-              <w:t xml:space="preserve">2020-01-01 cohort only</w:t>
-            </w:r>
-          </w:p>
-        </w:tc>
-        <w:tc>
-          <w:tcPr/>
-          <w:p>
-            <w:pPr>
-              <w:pStyle w:val="Compact"/>
-              <w:jc w:val="right"/>
-            </w:pPr>
-            <w:r>
-              <w:t xml:space="preserve">18 / 118</w:t>
-            </w:r>
-          </w:p>
-        </w:tc>
-        <w:tc>
-          <w:tcPr/>
-          <w:p>
-            <w:pPr>
-              <w:pStyle w:val="Compact"/>
-              <w:jc w:val="right"/>
-            </w:pPr>
-            <w:r>
-              <w:t xml:space="preserve">−2.9</w:t>
-            </w:r>
-          </w:p>
-        </w:tc>
-        <w:tc>
-          <w:tcPr/>
-          <w:p>
-            <w:pPr>
-              <w:pStyle w:val="Compact"/>
-              <w:jc w:val="right"/>
-            </w:pPr>
-            <w:r>
-              <w:t xml:space="preserve">−8.3 to 1.3</w:t>
-            </w:r>
-          </w:p>
-        </w:tc>
-        <w:tc>
-          <w:tcPr/>
-          <w:p>
-            <w:pPr>
-              <w:pStyle w:val="Compact"/>
-              <w:jc w:val="right"/>
-            </w:pPr>
-            <w:r>
-              <w:t xml:space="preserve">.13</w:t>
-            </w:r>
-          </w:p>
-        </w:tc>
-      </w:tr>
-      <w:tr>
-        <w:tc>
-          <w:tcPr/>
-          <w:p>
-            <w:pPr>
-              <w:pStyle w:val="Compact"/>
-              <w:jc w:val="left"/>
-            </w:pPr>
-            <w:r>
-              <w:t xml:space="preserve">Two-way fixed effects (conventional; 95% CI)</w:t>
-            </w:r>
-          </w:p>
-        </w:tc>
-        <w:tc>
-          <w:tcPr/>
-          <w:p>
-            <w:pPr>
-              <w:pStyle w:val="Compact"/>
-              <w:jc w:val="right"/>
-            </w:pPr>
-            <w:r>
-              <w:t xml:space="preserve">306 ACOs</w:t>
-            </w:r>
-          </w:p>
-        </w:tc>
-        <w:tc>
-          <w:tcPr/>
-          <w:p>
-            <w:pPr>
-              <w:pStyle w:val="Compact"/>
-              <w:jc w:val="right"/>
-            </w:pPr>
-            <w:r>
-              <w:t xml:space="preserve">−1.5</w:t>
-            </w:r>
-          </w:p>
-        </w:tc>
-        <w:tc>
-          <w:tcPr/>
-          <w:p>
-            <w:pPr>
-              <w:pStyle w:val="Compact"/>
-              <w:jc w:val="right"/>
-            </w:pPr>
-            <w:r>
-              <w:t xml:space="preserve">−5.4 to 2.4</w:t>
-            </w:r>
-          </w:p>
-        </w:tc>
-        <w:tc>
-          <w:tcPr/>
-          <w:p>
-            <w:pPr>
-              <w:pStyle w:val="Compact"/>
-              <w:jc w:val="right"/>
-            </w:pPr>
-            <w:r>
-              <w:t xml:space="preserve">.44</w:t>
-            </w:r>
-          </w:p>
-        </w:tc>
-      </w:tr>
-    </w:tbl>
-    <w:p>
-      <w:pPr>
-        <w:pStyle w:val="BodyText"/>
-      </w:pPr>
-      <w:r>
-        <w:t xml:space="preserve">Abbreviations: CrI, credible interval; NA, not available (the propensity-weighted estimate has a permutation P value but no interval; its largest weight is 0.83); PY, performance year. The outcome is the change in log per-capita spending from PY2020-PY2021 to PY2022-PY2024, shown as a percent difference in spending growth, early renewers minus ACOs not yet renewed. A stayer’s years after it renewed into a 2023 or 2024 agreement are excluded. Equivalence condition: the pre-trend bound scaled to the distance between period midpoints (2.41 years) is 11.5 log points, above the absolute H4 estimate of 0.4 log points (1 log point = 0.01 in log spending, about 1%), so the condition does not hold and H4 is not read as an effect. The two-way fixed-effects model has one more ACO: the stayer with no post-period spending value keeps its pre-period years.</w:t>
-      </w:r>
-    </w:p>
-    <w:p>
-      <w:pPr>
         <w:pStyle w:val="CaptionedFigure"/>
       </w:pPr>
       <w:r>
@@ -8150,7 +7527,7 @@
           <wp:inline>
             <wp:extent cx="5943600" cy="2344288"/>
             <wp:effectExtent b="0" l="0" r="0" t="0"/>
-            <wp:docPr descr="Figure 4. Spending after early renewal. A, Event study from the conventional 2-way fixed-effects model, in log points relative to PY2021, with 95% CIs clustered by ACO. B, The registered H4 estimate and the robustness and conventional estimates, as the percent difference in spending growth with 95% intervals (the propensity-weighted estimate has no interval); sample sizes are in Table 4. TWFE, 2-way fixed effects." title="" id="47" name="Picture"/>
+            <wp:docPr descr="Figure 4. Spending after early renewal. A, Event study from the conventional 2-way fixed-effects model, in log points relative to PY2021, with 95% CIs clustered by ACO. B, The registered H4 estimate and the robustness and conventional estimates, as the percent difference in spending growth with 95% intervals (the propensity-weighted estimate has no interval); sample sizes are in eTable 8 in Multimedia Appendix 1. TWFE, 2-way fixed effects." title="" id="47" name="Picture"/>
             <a:graphic>
               <a:graphicData uri="http://schemas.openxmlformats.org/drawingml/2006/picture">
                 <pic:pic>
@@ -8193,7 +7570,7 @@
         <w:pStyle w:val="ImageCaption"/>
       </w:pPr>
       <w:r>
-        <w:t xml:space="preserve">Figure 4. Spending after early renewal. A, Event study from the conventional 2-way fixed-effects model, in log points relative to PY2021, with 95% CIs clustered by ACO. B, The registered H4 estimate and the robustness and conventional estimates, as the percent difference in spending growth with 95% intervals (the propensity-weighted estimate has no interval); sample sizes are in Table 4. TWFE, 2-way fixed effects.</w:t>
+        <w:t xml:space="preserve">Figure 4. Spending after early renewal. A, Event study from the conventional 2-way fixed-effects model, in log points relative to PY2021, with 95% CIs clustered by ACO. B, The registered H4 estimate and the robustness and conventional estimates, as the percent difference in spending growth with 95% intervals (the propensity-weighted estimate has no interval); sample sizes are in eTable 8 in Multimedia Appendix 1. TWFE, 2-way fixed effects.</w:t>
       </w:r>
     </w:p>
     <w:bookmarkEnd w:id="49"/>
@@ -8324,7 +7701,7 @@
         <w:pStyle w:val="BodyText"/>
       </w:pPr>
       <w:r>
-        <w:t xml:space="preserve">Among the exploratory analyses (eTables 9-11 in Multimedia Appendix 1), the 28 ACOs that left after PY2021 had the lowest</w:t>
+        <w:t xml:space="preserve">Among the exploratory analyses (eTables 10-12 in Multimedia Appendix 1), the 28 ACOs that left after PY2021 had the lowest</w:t>
       </w:r>
       <w:r>
         <w:t xml:space="preserve"> </w:t>

</xml_diff>

<commit_message>
BMC package: abstract states the gap again (341 words), Background asks rather than tests, Table 2 legend explains bold, US spelling
Co-Authored-By: Claude Opus 5.5 <noreply@anthropic.com>
</commit_message>
<xml_diff>
--- a/paper.docx
+++ b/paper.docx
@@ -98,25 +98,25 @@
         <w:t xml:space="preserve"> </w:t>
       </w:r>
       <w:r>
-        <w:t xml:space="preserve">care organization’s (ACO’s) recent spending, adjusted toward its region. Ending an agreement early reset the benchmark sooner and</w:t>
-      </w:r>
-      <w:r>
-        <w:t xml:space="preserve"> </w:t>
-      </w:r>
-      <w:r>
-        <w:t xml:space="preserve">was the only way for a BASIC-track ACO to reach the ENHANCED track’s 75% share of savings. This study asked which ACOs</w:t>
-      </w:r>
-      <w:r>
-        <w:t xml:space="preserve"> </w:t>
-      </w:r>
-      <w:r>
-        <w:t xml:space="preserve">renewed early, weighing a reset motive (a higher benchmark) against a sharing-rate motive, and whether their spending</w:t>
-      </w:r>
-      <w:r>
-        <w:t xml:space="preserve"> </w:t>
-      </w:r>
-      <w:r>
-        <w:t xml:space="preserve">then changed.</w:t>
+        <w:t xml:space="preserve">care organization’s (ACO’s) recent spending, adjusted toward its region. Ending an agreement early reset the benchmark</w:t>
+      </w:r>
+      <w:r>
+        <w:t xml:space="preserve"> </w:t>
+      </w:r>
+      <w:r>
+        <w:t xml:space="preserve">sooner and was the only way for a BASIC-track ACO to reach the ENHANCED track’s 75% share of savings. No peer-reviewed</w:t>
+      </w:r>
+      <w:r>
+        <w:t xml:space="preserve"> </w:t>
+      </w:r>
+      <w:r>
+        <w:t xml:space="preserve">study has examined why. This study asked which ACOs renewed early, weighing a reset motive (a higher benchmark)</w:t>
+      </w:r>
+      <w:r>
+        <w:t xml:space="preserve"> </w:t>
+      </w:r>
+      <w:r>
+        <w:t xml:space="preserve">against a sharing-rate motive, and whether spending then changed.</w:t>
       </w:r>
     </w:p>
     <w:p>
@@ -146,25 +146,25 @@
         <w:t xml:space="preserve"> </w:t>
       </w:r>
       <w:r>
-        <w:t xml:space="preserve">data were read. The reset benchmark was rebuilt from the regulation and validated on 101 other ACOs. The 29 ACOs that</w:t>
-      </w:r>
-      <w:r>
-        <w:t xml:space="preserve"> </w:t>
-      </w:r>
-      <w:r>
-        <w:t xml:space="preserve">renewed early in January 2022 were compared with 277 that stayed on the regional pull (regional spending relative to</w:t>
-      </w:r>
-      <w:r>
-        <w:t xml:space="preserve"> </w:t>
-      </w:r>
-      <w:r>
-        <w:t xml:space="preserve">the current benchmark; primary), the own-spending component and BASIC risk level, by Bayesian bootstrap, permutation</w:t>
-      </w:r>
-      <w:r>
-        <w:t xml:space="preserve"> </w:t>
-      </w:r>
-      <w:r>
-        <w:t xml:space="preserve">tests and Bayesian logistic regression. Spending growth in 2022-2024 was compared by difference-in-differences.</w:t>
+        <w:t xml:space="preserve">data were read. The reset benchmark was rebuilt from the regulation and validated on 101 other ACOs. 29 ACOs renewing</w:t>
+      </w:r>
+      <w:r>
+        <w:t xml:space="preserve"> </w:t>
+      </w:r>
+      <w:r>
+        <w:t xml:space="preserve">early in January 2022 were compared with 277 stayers on the regional pull (primary), the own-spending component and</w:t>
+      </w:r>
+      <w:r>
+        <w:t xml:space="preserve"> </w:t>
+      </w:r>
+      <w:r>
+        <w:t xml:space="preserve">BASIC risk level, by Bayesian bootstrap, permutation tests and logistic regression. Spending growth in 2022-2024 was</w:t>
+      </w:r>
+      <w:r>
+        <w:t xml:space="preserve"> </w:t>
+      </w:r>
+      <w:r>
+        <w:t xml:space="preserve">compared by difference-in-differences.</w:t>
       </w:r>
     </w:p>
     <w:p>
@@ -182,13 +182,13 @@
         <w:t xml:space="preserve"> </w:t>
       </w:r>
       <w:r>
-        <w:t xml:space="preserve">The rebuilt benchmark tracked the published one (Spearman ρ=0.94). Early renewers’ regional pull was</w:t>
-      </w:r>
-      <w:r>
-        <w:t xml:space="preserve"> </w:t>
-      </w:r>
-      <w:r>
-        <w:t xml:space="preserve">3.4 percentage points higher than stayers’ (95% credible interval [CrI], 1.7 to 5.4;</w:t>
+        <w:t xml:space="preserve">The rebuilt benchmark tracked the published one (ρ=0.94). Early renewers’ regional pull was 3.4</w:t>
+      </w:r>
+      <w:r>
+        <w:t xml:space="preserve"> </w:t>
+      </w:r>
+      <w:r>
+        <w:t xml:space="preserve">percentage points higher than stayers’ (95% credible interval [CrI], 1.7 to 5.4;</w:t>
       </w:r>
       <w:r>
         <w:t xml:space="preserve"> </w:t>
@@ -201,37 +201,37 @@
         <w:t xml:space="preserve">P</w:t>
       </w:r>
       <w:r>
-        <w:t xml:space="preserve">&lt;.001), but they also beat</w:t>
-      </w:r>
-      <w:r>
-        <w:t xml:space="preserve"> </w:t>
-      </w:r>
-      <w:r>
-        <w:t xml:space="preserve">their benchmarks by more (own-spending component, −2.1 points; 95% CrI, −3.8 to −0.5), and the total expected gain did</w:t>
-      </w:r>
-      <w:r>
-        <w:t xml:space="preserve"> </w:t>
-      </w:r>
-      <w:r>
-        <w:t xml:space="preserve">not differ (−0.5 points; 95% CrI, −2.0 to 0.8). Post hoc, early renewers’ published 2022 benchmarks averaged 1.3%</w:t>
-      </w:r>
-      <w:r>
-        <w:t xml:space="preserve"> </w:t>
-      </w:r>
-      <w:r>
-        <w:t xml:space="preserve">below 2021. Among 206 BASIC-track ACOs, a higher regional pull and BASIC level were associated with early renewal; 26</w:t>
-      </w:r>
-      <w:r>
-        <w:t xml:space="preserve"> </w:t>
-      </w:r>
-      <w:r>
-        <w:t xml:space="preserve">of all 27 BASIC-track early renewers moved to ENHANCED. Spending growth did not differ detectably (−0.4%; 95% CrI,</w:t>
-      </w:r>
-      <w:r>
-        <w:t xml:space="preserve"> </w:t>
-      </w:r>
-      <w:r>
-        <w:t xml:space="preserve">−4.0% to 2.5%); a preregistered pre-trend condition failed.</w:t>
+        <w:t xml:space="preserve">&lt;.001), but they also beat their</w:t>
+      </w:r>
+      <w:r>
+        <w:t xml:space="preserve"> </w:t>
+      </w:r>
+      <w:r>
+        <w:t xml:space="preserve">benchmarks by more (own-spending component, −2.1 points; 95% CrI, −3.8 to −0.5), and the total expected gain did not</w:t>
+      </w:r>
+      <w:r>
+        <w:t xml:space="preserve"> </w:t>
+      </w:r>
+      <w:r>
+        <w:t xml:space="preserve">differ (−0.5 points; 95% CrI, −2.0 to 0.8). Post hoc, early renewers’ published 2022 benchmarks averaged 1.3% below</w:t>
+      </w:r>
+      <w:r>
+        <w:t xml:space="preserve"> </w:t>
+      </w:r>
+      <w:r>
+        <w:t xml:space="preserve">2021. Among 206 BASIC-track ACOs, a higher regional pull and BASIC level were associated with early renewal; 26 of all</w:t>
+      </w:r>
+      <w:r>
+        <w:t xml:space="preserve"> </w:t>
+      </w:r>
+      <w:r>
+        <w:t xml:space="preserve">27 BASIC-track early renewers moved to ENHANCED. Spending growth did not differ detectably (−0.4%; 95% CrI, −4.0% to</w:t>
+      </w:r>
+      <w:r>
+        <w:t xml:space="preserve"> </w:t>
+      </w:r>
+      <w:r>
+        <w:t xml:space="preserve">2.5%); a preregistered pre-trend condition failed.</w:t>
       </w:r>
     </w:p>
     <w:p>
@@ -255,13 +255,13 @@
         <w:t xml:space="preserve"> </w:t>
       </w:r>
       <w:r>
-        <w:t xml:space="preserve">sharing rate, and the reset did not on average raise their benchmarks. The pattern fits the sharing-rate motive</w:t>
-      </w:r>
-      <w:r>
-        <w:t xml:space="preserve"> </w:t>
-      </w:r>
-      <w:r>
-        <w:t xml:space="preserve">better, though the design cannot separate the motives; the rules changed in 2024.</w:t>
+        <w:t xml:space="preserve">sharing rate, and the reset did not on average raise benchmarks. This fits the sharing-rate motive better, though the</w:t>
+      </w:r>
+      <w:r>
+        <w:t xml:space="preserve"> </w:t>
+      </w:r>
+      <w:r>
+        <w:t xml:space="preserve">design cannot separate the motives; the rules changed in 2024.</w:t>
       </w:r>
     </w:p>
     <w:p>
@@ -538,577 +538,557 @@
         <w:t xml:space="preserve"> </w:t>
       </w:r>
       <w:r>
-        <w:t xml:space="preserve">in 2019, ending an agreement early to reset the benchmark sooner: an industry report has described the ACOs that did</w:t>
-      </w:r>
-      <w:r>
-        <w:t xml:space="preserve"> </w:t>
-      </w:r>
-      <w:r>
-        <w:t xml:space="preserve">so in 2022,</w:t>
+        <w:t xml:space="preserve">in 2019, ending an agreement early to reset the benchmark sooner, which no peer-reviewed study has examined: under a</w:t>
+      </w:r>
+      <w:r>
+        <w:t xml:space="preserve"> </w:t>
+      </w:r>
+      <w:r>
+        <w:t xml:space="preserve">preregistered plan and with a validated reconstruction of the reset benchmark, it asks which ACOs used the option and</w:t>
+      </w:r>
+      <w:r>
+        <w:t xml:space="preserve"> </w:t>
+      </w:r>
+      <w:r>
+        <w:t xml:space="preserve">what their choice suggests about why.</w:t>
+      </w:r>
+    </w:p>
+    <w:p>
+      <w:pPr>
+        <w:pStyle w:val="BodyText"/>
+      </w:pPr>
+      <w:r>
+        <w:t xml:space="preserve">Benchmarks shape the program through 2 channels. The first is the incentive to save. Rebasing to an ACO’s own</w:t>
+      </w:r>
+      <w:r>
+        <w:t xml:space="preserve"> </w:t>
+      </w:r>
+      <w:r>
+        <w:t xml:space="preserve">recent spending weakens its incentive to save, and under earlier weights it rewarded higher spending just before a</w:t>
+      </w:r>
+      <w:r>
+        <w:t xml:space="preserve"> </w:t>
+      </w:r>
+      <w:r>
+        <w:t xml:space="preserve">new agreement;</w:t>
       </w:r>
       <w:r>
         <w:t xml:space="preserve">[</w:t>
       </w:r>
+      <w:hyperlink w:anchor="ref-douven2015">
+        <w:r>
+          <w:rPr>
+            <w:rStyle w:val="Hyperlink"/>
+          </w:rPr>
+          <w:t xml:space="preserve">10</w:t>
+        </w:r>
+      </w:hyperlink>
+      <w:r>
+        <w:t xml:space="preserve">]</w:t>
+      </w:r>
+      <w:r>
+        <w:t xml:space="preserve"> </w:t>
+      </w:r>
+      <w:r>
+        <w:t xml:space="preserve">this is the ratchet effect that arises whenever targets are set from past</w:t>
+      </w:r>
+      <w:r>
+        <w:t xml:space="preserve"> </w:t>
+      </w:r>
+      <w:r>
+        <w:t xml:space="preserve">performance.</w:t>
+      </w:r>
+      <w:r>
+        <w:t xml:space="preserve">[</w:t>
+      </w:r>
+      <w:hyperlink w:anchor="ref-weitzman1980">
+        <w:r>
+          <w:rPr>
+            <w:rStyle w:val="Hyperlink"/>
+          </w:rPr>
+          <w:t xml:space="preserve">11</w:t>
+        </w:r>
+      </w:hyperlink>
+      <w:r>
+        <w:t xml:space="preserve">]</w:t>
+      </w:r>
+      <w:r>
+        <w:t xml:space="preserve"> </w:t>
+      </w:r>
+      <w:r>
+        <w:t xml:space="preserve">In the MSSP, savings rates were 40% higher in years whose spending did not enter a future</w:t>
+      </w:r>
+      <w:r>
+        <w:t xml:space="preserve"> </w:t>
+      </w:r>
+      <w:r>
+        <w:t xml:space="preserve">benchmark.</w:t>
+      </w:r>
+      <w:r>
+        <w:t xml:space="preserve">[</w:t>
+      </w:r>
+      <w:hyperlink w:anchor="ref-cappello2026">
+        <w:r>
+          <w:rPr>
+            <w:rStyle w:val="Hyperlink"/>
+          </w:rPr>
+          <w:t xml:space="preserve">12</w:t>
+        </w:r>
+      </w:hyperlink>
+      <w:r>
+        <w:t xml:space="preserve">]</w:t>
+      </w:r>
+    </w:p>
+    <w:p>
+      <w:pPr>
+        <w:pStyle w:val="BodyText"/>
+      </w:pPr>
+      <w:r>
+        <w:t xml:space="preserve">The second channel is selection: benchmark rules change which ACOs join, stay and take on risk. ACOs’ spending varies</w:t>
+      </w:r>
+      <w:r>
+        <w:t xml:space="preserve"> </w:t>
+      </w:r>
+      <w:r>
+        <w:t xml:space="preserve">widely relative to their regions even after risk adjustment, so moving benchmarks toward regional averages shifts them</w:t>
+      </w:r>
+      <w:r>
+        <w:t xml:space="preserve"> </w:t>
+      </w:r>
+      <w:r>
+        <w:t xml:space="preserve">unevenly.</w:t>
+      </w:r>
+      <w:r>
+        <w:t xml:space="preserve">[</w:t>
+      </w:r>
+      <w:hyperlink w:anchor="ref-rose2016">
+        <w:r>
+          <w:rPr>
+            <w:rStyle w:val="Hyperlink"/>
+          </w:rPr>
+          <w:t xml:space="preserve">13</w:t>
+        </w:r>
+      </w:hyperlink>
+      <w:r>
+        <w:t xml:space="preserve">]</w:t>
+      </w:r>
+      <w:r>
+        <w:t xml:space="preserve"> </w:t>
+      </w:r>
+      <w:r>
+        <w:t xml:space="preserve">After regional spending entered benchmarks in 2017, participation shifted toward</w:t>
+      </w:r>
+      <w:r>
+        <w:t xml:space="preserve"> </w:t>
+      </w:r>
+      <w:r>
+        <w:t xml:space="preserve">providers whose spending was low relative to their region,</w:t>
+      </w:r>
+      <w:r>
+        <w:t xml:space="preserve">[</w:t>
+      </w:r>
+      <w:hyperlink w:anchor="ref-lyu2023">
+        <w:r>
+          <w:rPr>
+            <w:rStyle w:val="Hyperlink"/>
+          </w:rPr>
+          <w:t xml:space="preserve">14</w:t>
+        </w:r>
+      </w:hyperlink>
+      <w:r>
+        <w:t xml:space="preserve">]</w:t>
+      </w:r>
+      <w:r>
+        <w:t xml:space="preserve"> </w:t>
+      </w:r>
+      <w:r>
+        <w:t xml:space="preserve">ACOs whose effective benchmarks fell became</w:t>
+      </w:r>
+      <w:r>
+        <w:t xml:space="preserve"> </w:t>
+      </w:r>
+      <w:r>
+        <w:t xml:space="preserve">more likely to leave,</w:t>
+      </w:r>
+      <w:r>
+        <w:t xml:space="preserve">[</w:t>
+      </w:r>
+      <w:hyperlink w:anchor="ref-chen2025">
+        <w:r>
+          <w:rPr>
+            <w:rStyle w:val="Hyperlink"/>
+          </w:rPr>
+          <w:t xml:space="preserve">15</w:t>
+        </w:r>
+      </w:hyperlink>
+      <w:r>
+        <w:t xml:space="preserve">]</w:t>
+      </w:r>
+      <w:r>
+        <w:t xml:space="preserve"> </w:t>
+      </w:r>
+      <w:r>
+        <w:t xml:space="preserve">ACOs with a positive regional adjustment were less likely to exit,</w:t>
+      </w:r>
+      <w:r>
+        <w:t xml:space="preserve">[</w:t>
+      </w:r>
+      <w:hyperlink w:anchor="ref-cappello2026">
+        <w:r>
+          <w:rPr>
+            <w:rStyle w:val="Hyperlink"/>
+          </w:rPr>
+          <w:t xml:space="preserve">12</w:t>
+        </w:r>
+      </w:hyperlink>
+      <w:r>
+        <w:t xml:space="preserve">]</w:t>
+      </w:r>
+      <w:r>
+        <w:t xml:space="preserve"> </w:t>
+      </w:r>
+      <w:r>
+        <w:t xml:space="preserve">and bonuses rose for ACOs across the efficiency spectrum.</w:t>
+      </w:r>
+      <w:r>
+        <w:t xml:space="preserve">[</w:t>
+      </w:r>
+      <w:hyperlink w:anchor="ref-srivastava2026">
+        <w:r>
+          <w:rPr>
+            <w:rStyle w:val="Hyperlink"/>
+          </w:rPr>
+          <w:t xml:space="preserve">16</w:t>
+        </w:r>
+      </w:hyperlink>
+      <w:r>
+        <w:t xml:space="preserve">]</w:t>
+      </w:r>
+      <w:r>
+        <w:t xml:space="preserve"> </w:t>
+      </w:r>
+      <w:r>
+        <w:t xml:space="preserve">Survival in</w:t>
+      </w:r>
+      <w:r>
+        <w:t xml:space="preserve"> </w:t>
+      </w:r>
+      <w:r>
+        <w:t xml:space="preserve">the program has been associated with earning bonuses, higher benchmarks and one-sided risk,</w:t>
+      </w:r>
+      <w:r>
+        <w:t xml:space="preserve">[</w:t>
+      </w:r>
+      <w:hyperlink w:anchor="ref-bleser2019">
+        <w:r>
+          <w:rPr>
+            <w:rStyle w:val="Hyperlink"/>
+          </w:rPr>
+          <w:t xml:space="preserve">17</w:t>
+        </w:r>
+      </w:hyperlink>
+      <w:r>
+        <w:t xml:space="preserve">]</w:t>
+      </w:r>
+      <w:r>
+        <w:t xml:space="preserve"> </w:t>
+      </w:r>
+      <w:r>
+        <w:t xml:space="preserve">and larger</w:t>
+      </w:r>
+      <w:r>
+        <w:t xml:space="preserve"> </w:t>
+      </w:r>
+      <w:r>
+        <w:t xml:space="preserve">ACOs, those with supporting organizations and better performers were more likely to switch to two-sided</w:t>
+      </w:r>
+      <w:r>
+        <w:t xml:space="preserve"> </w:t>
+      </w:r>
+      <w:r>
+        <w:t xml:space="preserve">risk.</w:t>
+      </w:r>
+      <w:r>
+        <w:t xml:space="preserve">[</w:t>
+      </w:r>
+      <w:hyperlink w:anchor="ref-zhu2023">
+        <w:r>
+          <w:rPr>
+            <w:rStyle w:val="Hyperlink"/>
+          </w:rPr>
+          <w:t xml:space="preserve">18</w:t>
+        </w:r>
+      </w:hyperlink>
+      <w:r>
+        <w:t xml:space="preserve">]</w:t>
+      </w:r>
+      <w:r>
+        <w:t xml:space="preserve"> </w:t>
+      </w:r>
+      <w:r>
+        <w:t xml:space="preserve">The 2019 Pathways to Success rules, which shortened the time ACOs could stay in one-sided risk, were</w:t>
+      </w:r>
+      <w:r>
+        <w:t xml:space="preserve"> </w:t>
+      </w:r>
+      <w:r>
+        <w:t xml:space="preserve">followed by more exits than entries,</w:t>
+      </w:r>
+      <w:r>
+        <w:t xml:space="preserve">[</w:t>
+      </w:r>
+      <w:hyperlink w:anchor="ref-ying2023">
+        <w:r>
+          <w:rPr>
+            <w:rStyle w:val="Hyperlink"/>
+          </w:rPr>
+          <w:t xml:space="preserve">19</w:t>
+        </w:r>
+      </w:hyperlink>
+      <w:r>
+        <w:t xml:space="preserve">]</w:t>
+      </w:r>
+      <w:r>
+        <w:t xml:space="preserve"> </w:t>
+      </w:r>
+      <w:r>
+        <w:t xml:space="preserve">by ACO leaders reassessing potential savings against</w:t>
+      </w:r>
+      <w:r>
+        <w:t xml:space="preserve"> </w:t>
+      </w:r>
+      <w:r>
+        <w:t xml:space="preserve">losses,</w:t>
+      </w:r>
+      <w:r>
+        <w:t xml:space="preserve">[</w:t>
+      </w:r>
+      <w:hyperlink w:anchor="ref-ying2024">
+        <w:r>
+          <w:rPr>
+            <w:rStyle w:val="Hyperlink"/>
+          </w:rPr>
+          <w:t xml:space="preserve">20</w:t>
+        </w:r>
+      </w:hyperlink>
+      <w:r>
+        <w:t xml:space="preserve">]</w:t>
+      </w:r>
+      <w:r>
+        <w:t xml:space="preserve"> </w:t>
+      </w:r>
+      <w:r>
+        <w:t xml:space="preserve">and by departures with projected costs to Medicare.</w:t>
+      </w:r>
+      <w:r>
+        <w:t xml:space="preserve">[</w:t>
+      </w:r>
+      <w:hyperlink w:anchor="ref-moloci2021">
+        <w:r>
+          <w:rPr>
+            <w:rStyle w:val="Hyperlink"/>
+          </w:rPr>
+          <w:t xml:space="preserve">21</w:t>
+        </w:r>
+      </w:hyperlink>
+      <w:r>
+        <w:t xml:space="preserve">]</w:t>
+      </w:r>
+      <w:r>
+        <w:t xml:space="preserve"> </w:t>
+      </w:r>
+      <w:r>
+        <w:t xml:space="preserve">In a related model, most ACO</w:t>
+      </w:r>
+      <w:r>
+        <w:t xml:space="preserve"> </w:t>
+      </w:r>
+      <w:r>
+        <w:t xml:space="preserve">Investment Model ACOs exited once downside risk was required.</w:t>
+      </w:r>
+      <w:r>
+        <w:t xml:space="preserve">[</w:t>
+      </w:r>
+      <w:hyperlink w:anchor="ref-trombley2022">
+        <w:r>
+          <w:rPr>
+            <w:rStyle w:val="Hyperlink"/>
+          </w:rPr>
+          <w:t xml:space="preserve">22</w:t>
+        </w:r>
+      </w:hyperlink>
+      <w:r>
+        <w:t xml:space="preserve">]</w:t>
+      </w:r>
+      <w:r>
+        <w:t xml:space="preserve"> </w:t>
+      </w:r>
+      <w:r>
+        <w:t xml:space="preserve">This literature describes how benchmark</w:t>
+      </w:r>
+      <w:r>
+        <w:t xml:space="preserve"> </w:t>
+      </w:r>
+      <w:r>
+        <w:t xml:space="preserve">rules sort ACOs into joining, staying, leaving and taking on risk, and how rebasing weakens the incentive to save</w:t>
+      </w:r>
+      <w:r>
+        <w:t xml:space="preserve"> </w:t>
+      </w:r>
+      <w:r>
+        <w:t xml:space="preserve">within an agreement; it has not examined when ACOs choose to reset.</w:t>
+      </w:r>
+    </w:p>
+    <w:p>
+      <w:pPr>
+        <w:pStyle w:val="BodyText"/>
+      </w:pPr>
+      <w:r>
+        <w:t xml:space="preserve">The 2019 rules also allowed an ACO to end its agreement early and begin a new one, which resets the benchmark</w:t>
+      </w:r>
+      <w:r>
+        <w:t xml:space="preserve"> </w:t>
+      </w:r>
+      <w:r>
+        <w:t xml:space="preserve">early.</w:t>
+      </w:r>
+      <w:r>
+        <w:t xml:space="preserve">[</w:t>
+      </w:r>
+      <w:hyperlink w:anchor="ref-cfr425">
+        <w:r>
+          <w:rPr>
+            <w:rStyle w:val="Hyperlink"/>
+          </w:rPr>
+          <w:t xml:space="preserve">1</w:t>
+        </w:r>
+      </w:hyperlink>
+      <w:r>
+        <w:t xml:space="preserve">]</w:t>
+      </w:r>
+      <w:r>
+        <w:t xml:space="preserve"> </w:t>
+      </w:r>
+      <w:r>
+        <w:t xml:space="preserve">For an ACO in the BASIC track, renewal was also the only way into the ENHANCED track before its</w:t>
+      </w:r>
+      <w:r>
+        <w:t xml:space="preserve"> </w:t>
+      </w:r>
+      <w:r>
+        <w:t xml:space="preserve">agreement ended, because the 2018 rule bars moving from BASIC to ENHANCED within an agreement period. CMS imposed that bar to guard</w:t>
+      </w:r>
+      <w:r>
+        <w:t xml:space="preserve"> </w:t>
+      </w:r>
+      <w:r>
+        <w:t xml:space="preserve">against selective entry into its highest-reward track by an ACO</w:t>
+      </w:r>
+      <w:r>
+        <w:t xml:space="preserve"> </w:t>
+      </w:r>
+      <w:r>
+        <w:t xml:space="preserve">“very confident of its ability to generate savings”</w:t>
+      </w:r>
+      <w:r>
+        <w:t xml:space="preserve"> </w:t>
+      </w:r>
+      <w:r>
+        <w:t xml:space="preserve">against its current benchmark, and named early renewal, with its rebased benchmark, as the way to make the</w:t>
+      </w:r>
+      <w:r>
+        <w:t xml:space="preserve"> </w:t>
+      </w:r>
+      <w:r>
+        <w:t xml:space="preserve">move.</w:t>
+      </w:r>
+      <w:r>
+        <w:t xml:space="preserve">[</w:t>
+      </w:r>
+      <w:hyperlink w:anchor="ref-frpathways">
+        <w:r>
+          <w:rPr>
+            <w:rStyle w:val="Hyperlink"/>
+          </w:rPr>
+          <w:t xml:space="preserve">23</w:t>
+        </w:r>
+      </w:hyperlink>
+      <w:r>
+        <w:t xml:space="preserve">]</w:t>
+      </w:r>
+      <w:r>
+        <w:t xml:space="preserve"> </w:t>
+      </w:r>
+      <w:r>
+        <w:t xml:space="preserve">ENHANCED shares 75% of savings, against at most 50% in BASIC.</w:t>
+      </w:r>
+      <w:r>
+        <w:t xml:space="preserve">[</w:t>
+      </w:r>
+      <w:hyperlink w:anchor="ref-cfr425">
+        <w:r>
+          <w:rPr>
+            <w:rStyle w:val="Hyperlink"/>
+          </w:rPr>
+          <w:t xml:space="preserve">1</w:t>
+        </w:r>
+      </w:hyperlink>
+      <w:r>
+        <w:t xml:space="preserve">]</w:t>
+      </w:r>
+      <w:r>
+        <w:t xml:space="preserve"> </w:t>
+      </w:r>
+      <w:r>
+        <w:t xml:space="preserve">Of the 334 ACOs whose agreements began July 1,</w:t>
+      </w:r>
+      <w:r>
+        <w:t xml:space="preserve"> </w:t>
+      </w:r>
+      <w:r>
+        <w:t xml:space="preserve">2019 or January 1, 2020, 29 ended them early and began new agreements on January 1, 2022.</w:t>
+      </w:r>
+      <w:r>
+        <w:t xml:space="preserve">[</w:t>
+      </w:r>
+      <w:hyperlink w:anchor="ref-dataacos">
+        <w:r>
+          <w:rPr>
+            <w:rStyle w:val="Hyperlink"/>
+          </w:rPr>
+          <w:t xml:space="preserve">24</w:t>
+        </w:r>
+      </w:hyperlink>
+      <w:r>
+        <w:t xml:space="preserve">]</w:t>
+      </w:r>
+      <w:r>
+        <w:t xml:space="preserve"> </w:t>
+      </w:r>
+      <w:r>
+        <w:t xml:space="preserve">An industry</w:t>
+      </w:r>
+      <w:r>
+        <w:t xml:space="preserve"> </w:t>
+      </w:r>
+      <w:r>
+        <w:t xml:space="preserve">report found that ACOs rebasing early in 2022 had higher gross savings rates beforehand than ACOs that did not, and</w:t>
+      </w:r>
+      <w:r>
+        <w:t xml:space="preserve"> </w:t>
+      </w:r>
+      <w:r>
+        <w:t xml:space="preserve">that the earlier incumbents among them moved from BASIC to ENHANCED,</w:t>
+      </w:r>
+      <w:r>
+        <w:t xml:space="preserve">[</w:t>
+      </w:r>
       <w:hyperlink w:anchor="ref-milliman2024">
         <w:r>
           <w:rPr>
             <w:rStyle w:val="Hyperlink"/>
           </w:rPr>
-          <w:t xml:space="preserve">10</w:t>
-        </w:r>
-      </w:hyperlink>
-      <w:r>
-        <w:t xml:space="preserve">]</w:t>
-      </w:r>
-      <w:r>
-        <w:t xml:space="preserve"> </w:t>
-      </w:r>
-      <w:r>
-        <w:t xml:space="preserve">and this study tests, under a preregistered plan and with a validated reconstruction of the</w:t>
-      </w:r>
-      <w:r>
-        <w:t xml:space="preserve"> </w:t>
-      </w:r>
-      <w:r>
-        <w:t xml:space="preserve">reset benchmark, why they renewed early.</w:t>
-      </w:r>
-    </w:p>
-    <w:p>
-      <w:pPr>
-        <w:pStyle w:val="BodyText"/>
-      </w:pPr>
-      <w:r>
-        <w:t xml:space="preserve">Benchmarks shape the program through 2 channels. The first is the incentive to save. Rebasing to an ACO’s own</w:t>
-      </w:r>
-      <w:r>
-        <w:t xml:space="preserve"> </w:t>
-      </w:r>
-      <w:r>
-        <w:t xml:space="preserve">recent spending weakens its incentive to save, and under earlier weights it rewarded higher spending just before a</w:t>
-      </w:r>
-      <w:r>
-        <w:t xml:space="preserve"> </w:t>
-      </w:r>
-      <w:r>
-        <w:t xml:space="preserve">new agreement;</w:t>
-      </w:r>
-      <w:r>
-        <w:t xml:space="preserve">[</w:t>
-      </w:r>
-      <w:hyperlink w:anchor="ref-douven2015">
-        <w:r>
-          <w:rPr>
-            <w:rStyle w:val="Hyperlink"/>
-          </w:rPr>
-          <w:t xml:space="preserve">11</w:t>
-        </w:r>
-      </w:hyperlink>
-      <w:r>
-        <w:t xml:space="preserve">]</w:t>
-      </w:r>
-      <w:r>
-        <w:t xml:space="preserve"> </w:t>
-      </w:r>
-      <w:r>
-        <w:t xml:space="preserve">this is the ratchet effect that arises whenever targets are set from past</w:t>
-      </w:r>
-      <w:r>
-        <w:t xml:space="preserve"> </w:t>
-      </w:r>
-      <w:r>
-        <w:t xml:space="preserve">performance.</w:t>
-      </w:r>
-      <w:r>
-        <w:t xml:space="preserve">[</w:t>
-      </w:r>
-      <w:hyperlink w:anchor="ref-weitzman1980">
-        <w:r>
-          <w:rPr>
-            <w:rStyle w:val="Hyperlink"/>
-          </w:rPr>
-          <w:t xml:space="preserve">12</w:t>
-        </w:r>
-      </w:hyperlink>
-      <w:r>
-        <w:t xml:space="preserve">]</w:t>
-      </w:r>
-      <w:r>
-        <w:t xml:space="preserve"> </w:t>
-      </w:r>
-      <w:r>
-        <w:t xml:space="preserve">In the MSSP, savings rates were 40% higher in years whose spending did not enter a future</w:t>
-      </w:r>
-      <w:r>
-        <w:t xml:space="preserve"> </w:t>
-      </w:r>
-      <w:r>
-        <w:t xml:space="preserve">benchmark.</w:t>
-      </w:r>
-      <w:r>
-        <w:t xml:space="preserve">[</w:t>
-      </w:r>
-      <w:hyperlink w:anchor="ref-cappello2026">
-        <w:r>
-          <w:rPr>
-            <w:rStyle w:val="Hyperlink"/>
-          </w:rPr>
-          <w:t xml:space="preserve">13</w:t>
-        </w:r>
-      </w:hyperlink>
-      <w:r>
-        <w:t xml:space="preserve">]</w:t>
-      </w:r>
-    </w:p>
-    <w:p>
-      <w:pPr>
-        <w:pStyle w:val="BodyText"/>
-      </w:pPr>
-      <w:r>
-        <w:t xml:space="preserve">The second channel is selection: benchmark rules change which ACOs join, stay and take on risk. ACOs’ spending varies</w:t>
-      </w:r>
-      <w:r>
-        <w:t xml:space="preserve"> </w:t>
-      </w:r>
-      <w:r>
-        <w:t xml:space="preserve">widely relative to their regions even after risk adjustment, so moving benchmarks toward regional averages shifts them</w:t>
-      </w:r>
-      <w:r>
-        <w:t xml:space="preserve"> </w:t>
-      </w:r>
-      <w:r>
-        <w:t xml:space="preserve">unevenly.</w:t>
-      </w:r>
-      <w:r>
-        <w:t xml:space="preserve">[</w:t>
-      </w:r>
-      <w:hyperlink w:anchor="ref-rose2016">
-        <w:r>
-          <w:rPr>
-            <w:rStyle w:val="Hyperlink"/>
-          </w:rPr>
-          <w:t xml:space="preserve">14</w:t>
-        </w:r>
-      </w:hyperlink>
-      <w:r>
-        <w:t xml:space="preserve">]</w:t>
-      </w:r>
-      <w:r>
-        <w:t xml:space="preserve"> </w:t>
-      </w:r>
-      <w:r>
-        <w:t xml:space="preserve">After regional spending entered benchmarks in 2017, participation shifted toward</w:t>
-      </w:r>
-      <w:r>
-        <w:t xml:space="preserve"> </w:t>
-      </w:r>
-      <w:r>
-        <w:t xml:space="preserve">providers whose spending was low relative to their region,</w:t>
-      </w:r>
-      <w:r>
-        <w:t xml:space="preserve">[</w:t>
-      </w:r>
-      <w:hyperlink w:anchor="ref-lyu2023">
-        <w:r>
-          <w:rPr>
-            <w:rStyle w:val="Hyperlink"/>
-          </w:rPr>
-          <w:t xml:space="preserve">15</w:t>
-        </w:r>
-      </w:hyperlink>
-      <w:r>
-        <w:t xml:space="preserve">]</w:t>
-      </w:r>
-      <w:r>
-        <w:t xml:space="preserve"> </w:t>
-      </w:r>
-      <w:r>
-        <w:t xml:space="preserve">ACOs whose effective benchmarks fell became</w:t>
-      </w:r>
-      <w:r>
-        <w:t xml:space="preserve"> </w:t>
-      </w:r>
-      <w:r>
-        <w:t xml:space="preserve">more likely to leave,</w:t>
-      </w:r>
-      <w:r>
-        <w:t xml:space="preserve">[</w:t>
-      </w:r>
-      <w:hyperlink w:anchor="ref-chen2025">
-        <w:r>
-          <w:rPr>
-            <w:rStyle w:val="Hyperlink"/>
-          </w:rPr>
-          <w:t xml:space="preserve">16</w:t>
-        </w:r>
-      </w:hyperlink>
-      <w:r>
-        <w:t xml:space="preserve">]</w:t>
-      </w:r>
-      <w:r>
-        <w:t xml:space="preserve"> </w:t>
-      </w:r>
-      <w:r>
-        <w:t xml:space="preserve">ACOs with a positive regional adjustment were less likely to exit,</w:t>
-      </w:r>
-      <w:r>
-        <w:t xml:space="preserve">[</w:t>
-      </w:r>
-      <w:hyperlink w:anchor="ref-cappello2026">
-        <w:r>
-          <w:rPr>
-            <w:rStyle w:val="Hyperlink"/>
-          </w:rPr>
-          <w:t xml:space="preserve">13</w:t>
-        </w:r>
-      </w:hyperlink>
-      <w:r>
-        <w:t xml:space="preserve">]</w:t>
-      </w:r>
-      <w:r>
-        <w:t xml:space="preserve"> </w:t>
-      </w:r>
-      <w:r>
-        <w:t xml:space="preserve">and bonuses rose for ACOs across the efficiency spectrum.</w:t>
-      </w:r>
-      <w:r>
-        <w:t xml:space="preserve">[</w:t>
-      </w:r>
-      <w:hyperlink w:anchor="ref-srivastava2026">
-        <w:r>
-          <w:rPr>
-            <w:rStyle w:val="Hyperlink"/>
-          </w:rPr>
-          <w:t xml:space="preserve">17</w:t>
-        </w:r>
-      </w:hyperlink>
-      <w:r>
-        <w:t xml:space="preserve">]</w:t>
-      </w:r>
-      <w:r>
-        <w:t xml:space="preserve"> </w:t>
-      </w:r>
-      <w:r>
-        <w:t xml:space="preserve">Survival in</w:t>
-      </w:r>
-      <w:r>
-        <w:t xml:space="preserve"> </w:t>
-      </w:r>
-      <w:r>
-        <w:t xml:space="preserve">the program has been associated with earning bonuses, higher benchmarks and one-sided risk,</w:t>
-      </w:r>
-      <w:r>
-        <w:t xml:space="preserve">[</w:t>
-      </w:r>
-      <w:hyperlink w:anchor="ref-bleser2019">
-        <w:r>
-          <w:rPr>
-            <w:rStyle w:val="Hyperlink"/>
-          </w:rPr>
-          <w:t xml:space="preserve">18</w:t>
-        </w:r>
-      </w:hyperlink>
-      <w:r>
-        <w:t xml:space="preserve">]</w:t>
-      </w:r>
-      <w:r>
-        <w:t xml:space="preserve"> </w:t>
-      </w:r>
-      <w:r>
-        <w:t xml:space="preserve">and larger</w:t>
-      </w:r>
-      <w:r>
-        <w:t xml:space="preserve"> </w:t>
-      </w:r>
-      <w:r>
-        <w:t xml:space="preserve">ACOs, those with supporting organizations and better performers were more likely to switch to two-sided</w:t>
-      </w:r>
-      <w:r>
-        <w:t xml:space="preserve"> </w:t>
-      </w:r>
-      <w:r>
-        <w:t xml:space="preserve">risk.</w:t>
-      </w:r>
-      <w:r>
-        <w:t xml:space="preserve">[</w:t>
-      </w:r>
-      <w:hyperlink w:anchor="ref-zhu2023">
-        <w:r>
-          <w:rPr>
-            <w:rStyle w:val="Hyperlink"/>
-          </w:rPr>
-          <w:t xml:space="preserve">19</w:t>
-        </w:r>
-      </w:hyperlink>
-      <w:r>
-        <w:t xml:space="preserve">]</w:t>
-      </w:r>
-      <w:r>
-        <w:t xml:space="preserve"> </w:t>
-      </w:r>
-      <w:r>
-        <w:t xml:space="preserve">The 2019 Pathways to Success rules, which shortened the time ACOs could stay in one-sided risk, were</w:t>
-      </w:r>
-      <w:r>
-        <w:t xml:space="preserve"> </w:t>
-      </w:r>
-      <w:r>
-        <w:t xml:space="preserve">followed by more exits than entries,</w:t>
-      </w:r>
-      <w:r>
-        <w:t xml:space="preserve">[</w:t>
-      </w:r>
-      <w:hyperlink w:anchor="ref-ying2023">
-        <w:r>
-          <w:rPr>
-            <w:rStyle w:val="Hyperlink"/>
-          </w:rPr>
-          <w:t xml:space="preserve">20</w:t>
-        </w:r>
-      </w:hyperlink>
-      <w:r>
-        <w:t xml:space="preserve">]</w:t>
-      </w:r>
-      <w:r>
-        <w:t xml:space="preserve"> </w:t>
-      </w:r>
-      <w:r>
-        <w:t xml:space="preserve">by ACO leaders reassessing potential savings against</w:t>
-      </w:r>
-      <w:r>
-        <w:t xml:space="preserve"> </w:t>
-      </w:r>
-      <w:r>
-        <w:t xml:space="preserve">losses,</w:t>
-      </w:r>
-      <w:r>
-        <w:t xml:space="preserve">[</w:t>
-      </w:r>
-      <w:hyperlink w:anchor="ref-ying2024">
-        <w:r>
-          <w:rPr>
-            <w:rStyle w:val="Hyperlink"/>
-          </w:rPr>
-          <w:t xml:space="preserve">21</w:t>
-        </w:r>
-      </w:hyperlink>
-      <w:r>
-        <w:t xml:space="preserve">]</w:t>
-      </w:r>
-      <w:r>
-        <w:t xml:space="preserve"> </w:t>
-      </w:r>
-      <w:r>
-        <w:t xml:space="preserve">and by departures with projected costs to Medicare.</w:t>
-      </w:r>
-      <w:r>
-        <w:t xml:space="preserve">[</w:t>
-      </w:r>
-      <w:hyperlink w:anchor="ref-moloci2021">
-        <w:r>
-          <w:rPr>
-            <w:rStyle w:val="Hyperlink"/>
-          </w:rPr>
-          <w:t xml:space="preserve">22</w:t>
-        </w:r>
-      </w:hyperlink>
-      <w:r>
-        <w:t xml:space="preserve">]</w:t>
-      </w:r>
-      <w:r>
-        <w:t xml:space="preserve"> </w:t>
-      </w:r>
-      <w:r>
-        <w:t xml:space="preserve">In a related model, most ACO</w:t>
-      </w:r>
-      <w:r>
-        <w:t xml:space="preserve"> </w:t>
-      </w:r>
-      <w:r>
-        <w:t xml:space="preserve">Investment Model ACOs exited once downside risk was required.</w:t>
-      </w:r>
-      <w:r>
-        <w:t xml:space="preserve">[</w:t>
-      </w:r>
-      <w:hyperlink w:anchor="ref-trombley2022">
-        <w:r>
-          <w:rPr>
-            <w:rStyle w:val="Hyperlink"/>
-          </w:rPr>
-          <w:t xml:space="preserve">23</w:t>
-        </w:r>
-      </w:hyperlink>
-      <w:r>
-        <w:t xml:space="preserve">]</w:t>
-      </w:r>
-      <w:r>
-        <w:t xml:space="preserve"> </w:t>
-      </w:r>
-      <w:r>
-        <w:t xml:space="preserve">This literature describes how benchmark</w:t>
-      </w:r>
-      <w:r>
-        <w:t xml:space="preserve"> </w:t>
-      </w:r>
-      <w:r>
-        <w:t xml:space="preserve">rules sort ACOs into joining, staying, leaving and taking on risk, and how rebasing weakens the incentive to save</w:t>
-      </w:r>
-      <w:r>
-        <w:t xml:space="preserve"> </w:t>
-      </w:r>
-      <w:r>
-        <w:t xml:space="preserve">within an agreement; it has not examined when ACOs choose to reset.</w:t>
-      </w:r>
-    </w:p>
-    <w:p>
-      <w:pPr>
-        <w:pStyle w:val="BodyText"/>
-      </w:pPr>
-      <w:r>
-        <w:t xml:space="preserve">The 2019 rules also allowed an ACO to end its agreement early and begin a new one, which resets the benchmark</w:t>
-      </w:r>
-      <w:r>
-        <w:t xml:space="preserve"> </w:t>
-      </w:r>
-      <w:r>
-        <w:t xml:space="preserve">early.</w:t>
-      </w:r>
-      <w:r>
-        <w:t xml:space="preserve">[</w:t>
-      </w:r>
-      <w:hyperlink w:anchor="ref-cfr425">
-        <w:r>
-          <w:rPr>
-            <w:rStyle w:val="Hyperlink"/>
-          </w:rPr>
-          <w:t xml:space="preserve">1</w:t>
-        </w:r>
-      </w:hyperlink>
-      <w:r>
-        <w:t xml:space="preserve">]</w:t>
-      </w:r>
-      <w:r>
-        <w:t xml:space="preserve"> </w:t>
-      </w:r>
-      <w:r>
-        <w:t xml:space="preserve">For an ACO in the BASIC track, renewal was also the only way into the ENHANCED track before its</w:t>
-      </w:r>
-      <w:r>
-        <w:t xml:space="preserve"> </w:t>
-      </w:r>
-      <w:r>
-        <w:t xml:space="preserve">agreement ended, because the 2018 rule bars moving from BASIC to ENHANCED within an agreement period. CMS imposed that bar to guard</w:t>
-      </w:r>
-      <w:r>
-        <w:t xml:space="preserve"> </w:t>
-      </w:r>
-      <w:r>
-        <w:t xml:space="preserve">against selective entry into its highest-reward track by an ACO</w:t>
-      </w:r>
-      <w:r>
-        <w:t xml:space="preserve"> </w:t>
-      </w:r>
-      <w:r>
-        <w:t xml:space="preserve">“very confident of its ability to generate savings”</w:t>
-      </w:r>
-      <w:r>
-        <w:t xml:space="preserve"> </w:t>
-      </w:r>
-      <w:r>
-        <w:t xml:space="preserve">against its current benchmark, and named early renewal, with its rebased benchmark, as the way to make the</w:t>
-      </w:r>
-      <w:r>
-        <w:t xml:space="preserve"> </w:t>
-      </w:r>
-      <w:r>
-        <w:t xml:space="preserve">move.</w:t>
-      </w:r>
-      <w:r>
-        <w:t xml:space="preserve">[</w:t>
-      </w:r>
-      <w:hyperlink w:anchor="ref-frpathways">
-        <w:r>
-          <w:rPr>
-            <w:rStyle w:val="Hyperlink"/>
-          </w:rPr>
-          <w:t xml:space="preserve">24</w:t>
-        </w:r>
-      </w:hyperlink>
-      <w:r>
-        <w:t xml:space="preserve">]</w:t>
-      </w:r>
-      <w:r>
-        <w:t xml:space="preserve"> </w:t>
-      </w:r>
-      <w:r>
-        <w:t xml:space="preserve">ENHANCED shares 75% of savings, against at most 50% in BASIC.</w:t>
-      </w:r>
-      <w:r>
-        <w:t xml:space="preserve">[</w:t>
-      </w:r>
-      <w:hyperlink w:anchor="ref-cfr425">
-        <w:r>
-          <w:rPr>
-            <w:rStyle w:val="Hyperlink"/>
-          </w:rPr>
-          <w:t xml:space="preserve">1</w:t>
-        </w:r>
-      </w:hyperlink>
-      <w:r>
-        <w:t xml:space="preserve">]</w:t>
-      </w:r>
-      <w:r>
-        <w:t xml:space="preserve"> </w:t>
-      </w:r>
-      <w:r>
-        <w:t xml:space="preserve">Of the 334 ACOs whose agreements began July 1,</w:t>
-      </w:r>
-      <w:r>
-        <w:t xml:space="preserve"> </w:t>
-      </w:r>
-      <w:r>
-        <w:t xml:space="preserve">2019 or January 1, 2020, 29 ended them early and began new agreements on January 1, 2022.</w:t>
-      </w:r>
-      <w:r>
-        <w:t xml:space="preserve">[</w:t>
-      </w:r>
-      <w:hyperlink w:anchor="ref-dataacos">
-        <w:r>
-          <w:rPr>
-            <w:rStyle w:val="Hyperlink"/>
-          </w:rPr>
           <w:t xml:space="preserve">25</w:t>
-        </w:r>
-      </w:hyperlink>
-      <w:r>
-        <w:t xml:space="preserve">]</w:t>
-      </w:r>
-      <w:r>
-        <w:t xml:space="preserve"> </w:t>
-      </w:r>
-      <w:r>
-        <w:t xml:space="preserve">An industry</w:t>
-      </w:r>
-      <w:r>
-        <w:t xml:space="preserve"> </w:t>
-      </w:r>
-      <w:r>
-        <w:t xml:space="preserve">report found that ACOs rebasing early in 2022 had higher gross savings rates beforehand than ACOs that did not, and</w:t>
-      </w:r>
-      <w:r>
-        <w:t xml:space="preserve"> </w:t>
-      </w:r>
-      <w:r>
-        <w:t xml:space="preserve">that the earlier incumbents among them moved from BASIC to ENHANCED,</w:t>
-      </w:r>
-      <w:r>
-        <w:t xml:space="preserve">[</w:t>
-      </w:r>
-      <w:hyperlink w:anchor="ref-milliman2024">
-        <w:r>
-          <w:rPr>
-            <w:rStyle w:val="Hyperlink"/>
-          </w:rPr>
-          <w:t xml:space="preserve">10</w:t>
         </w:r>
       </w:hyperlink>
       <w:r>
@@ -1509,7 +1489,7 @@
           <w:rPr>
             <w:rStyle w:val="Hyperlink"/>
           </w:rPr>
-          <w:t xml:space="preserve">25</w:t>
+          <w:t xml:space="preserve">24</w:t>
         </w:r>
       </w:hyperlink>
       <w:r>
@@ -6244,7 +6224,7 @@
         <w:pStyle w:val="BodyText"/>
       </w:pPr>
       <w:r>
-        <w:t xml:space="preserve">Abbreviations: CrI, credible interval; MDE, minimum detectable effect at 80% power, two-sided α = .05, computed before the tests for 29 vs 277 ACOs (for the 26 vs 241 compared on the expected-gain variables it is 2.6 for H2b and 1.9 for H2a); Pr(&gt;0), posterior probability that the difference is positive; pp, percentage points; PY, performance year. Differences are early renewers minus stayers within agreement cohort, averaged with weights proportional to early renewers per cohort. Posterior means and 95% equal-tailed CrIs are from a Bayesian bootstrap (10,000 draws); P values are from stratified permutation (10,000 shuffles within cohort). Expected-gain variables are in percentage points of the current benchmark; savings rates in percentage points. Verdicts follow the registered decision rules; H1 and the two descriptive rows carry none.</w:t>
+        <w:t xml:space="preserve">Abbreviations: CrI, credible interval; MDE, minimum detectable effect at 80% power, two-sided α = .05, computed before the tests for 29 vs 277 ACOs (for the 26 vs 241 compared on the expected-gain variables it is 2.6 for H2b and 1.9 for H2a); Pr(&gt;0), posterior probability that the difference is positive; pp, percentage points; PY, performance year. Differences are early renewers minus stayers within agreement cohort, averaged with weights proportional to early renewers per cohort. Posterior means and 95% equal-tailed CrIs are from a Bayesian bootstrap (10,000 draws); P values are from stratified permutation (10,000 shuffles within cohort). Expected-gain variables are in percentage points of the current benchmark; savings rates in percentage points. Verdicts follow the registered decision rules; H1 and the two descriptive rows carry none. Bold: the primary hypothesis.</w:t>
       </w:r>
     </w:p>
     <w:p>
@@ -7846,6 +7826,26 @@
           <w:rPr>
             <w:rStyle w:val="Hyperlink"/>
           </w:rPr>
+          <w:t xml:space="preserve">14</w:t>
+        </w:r>
+      </w:hyperlink>
+      <w:r>
+        <w:t xml:space="preserve">]</w:t>
+      </w:r>
+      <w:r>
+        <w:t xml:space="preserve"> </w:t>
+      </w:r>
+      <w:r>
+        <w:t xml:space="preserve">ACOs whose benchmarks fell leaving,</w:t>
+      </w:r>
+      <w:r>
+        <w:t xml:space="preserve">[</w:t>
+      </w:r>
+      <w:hyperlink w:anchor="ref-chen2025">
+        <w:r>
+          <w:rPr>
+            <w:rStyle w:val="Hyperlink"/>
+          </w:rPr>
           <w:t xml:space="preserve">15</w:t>
         </w:r>
       </w:hyperlink>
@@ -7856,17 +7856,23 @@
         <w:t xml:space="preserve"> </w:t>
       </w:r>
       <w:r>
-        <w:t xml:space="preserve">ACOs whose benchmarks fell leaving,</w:t>
+        <w:t xml:space="preserve">and ACOs with a positive</w:t>
+      </w:r>
+      <w:r>
+        <w:t xml:space="preserve"> </w:t>
+      </w:r>
+      <w:r>
+        <w:t xml:space="preserve">regional adjustment about 70% less likely to exit.</w:t>
       </w:r>
       <w:r>
         <w:t xml:space="preserve">[</w:t>
       </w:r>
-      <w:hyperlink w:anchor="ref-chen2025">
-        <w:r>
-          <w:rPr>
-            <w:rStyle w:val="Hyperlink"/>
-          </w:rPr>
-          <w:t xml:space="preserve">16</w:t>
+      <w:hyperlink w:anchor="ref-cappello2026">
+        <w:r>
+          <w:rPr>
+            <w:rStyle w:val="Hyperlink"/>
+          </w:rPr>
+          <w:t xml:space="preserve">12</w:t>
         </w:r>
       </w:hyperlink>
       <w:r>
@@ -7876,18 +7882,170 @@
         <w:t xml:space="preserve"> </w:t>
       </w:r>
       <w:r>
-        <w:t xml:space="preserve">and ACOs with a positive</w:t>
-      </w:r>
-      <w:r>
-        <w:t xml:space="preserve"> </w:t>
-      </w:r>
-      <w:r>
-        <w:t xml:space="preserve">regional adjustment about 70% less likely to exit.</w:t>
+        <w:t xml:space="preserve">Here the choice is when to reset rather than whether to join or leave,</w:t>
+      </w:r>
+      <w:r>
+        <w:t xml:space="preserve"> </w:t>
+      </w:r>
+      <w:r>
+        <w:t xml:space="preserve">and early renewers had, on average, more room under their regions’ spending, the position associated with joining and</w:t>
+      </w:r>
+      <w:r>
+        <w:t xml:space="preserve"> </w:t>
+      </w:r>
+      <w:r>
+        <w:t xml:space="preserve">staying. In a voluntary Medicare bundled-payment program, hospitals that could gain without changing their behavior</w:t>
+      </w:r>
+      <w:r>
+        <w:t xml:space="preserve"> </w:t>
+      </w:r>
+      <w:r>
+        <w:t xml:space="preserve">were more likely to join, which the authors called selection on levels;</w:t>
       </w:r>
       <w:r>
         <w:t xml:space="preserve">[</w:t>
       </w:r>
-      <w:hyperlink w:anchor="ref-cappello2026">
+      <w:hyperlink w:anchor="ref-einav2022">
+        <w:r>
+          <w:rPr>
+            <w:rStyle w:val="Hyperlink"/>
+          </w:rPr>
+          <w:t xml:space="preserve">61</w:t>
+        </w:r>
+      </w:hyperlink>
+      <w:r>
+        <w:t xml:space="preserve">]</w:t>
+      </w:r>
+      <w:r>
+        <w:t xml:space="preserve"> </w:t>
+      </w:r>
+      <w:r>
+        <w:t xml:space="preserve">early renewal shows selection on a</w:t>
+      </w:r>
+      <w:r>
+        <w:t xml:space="preserve"> </w:t>
+      </w:r>
+      <w:r>
+        <w:t xml:space="preserve">similar position, though the gain that most early renewers took appears to have been the sharing rate rather than a</w:t>
+      </w:r>
+      <w:r>
+        <w:t xml:space="preserve"> </w:t>
+      </w:r>
+      <w:r>
+        <w:t xml:space="preserve">higher benchmark. The industry report on the same cohort</w:t>
+      </w:r>
+      <w:r>
+        <w:t xml:space="preserve">[</w:t>
+      </w:r>
+      <w:hyperlink w:anchor="ref-milliman2024">
+        <w:r>
+          <w:rPr>
+            <w:rStyle w:val="Hyperlink"/>
+          </w:rPr>
+          <w:t xml:space="preserve">25</w:t>
+        </w:r>
+      </w:hyperlink>
+      <w:r>
+        <w:t xml:space="preserve">]</w:t>
+      </w:r>
+      <w:r>
+        <w:t xml:space="preserve"> </w:t>
+      </w:r>
+      <w:r>
+        <w:t xml:space="preserve">is</w:t>
+      </w:r>
+      <w:r>
+        <w:t xml:space="preserve"> </w:t>
+      </w:r>
+      <w:r>
+        <w:t xml:space="preserve">consistent with the higher prior savings rates and the BASIC-level association here. Beyond that report, this study rebuilt the reset benchmark and validated it</w:t>
+      </w:r>
+      <w:r>
+        <w:t xml:space="preserve"> </w:t>
+      </w:r>
+      <w:r>
+        <w:t xml:space="preserve">against CMS’s, separated its own-spending and regional parts, modeled the decision within the BASIC track and followed</w:t>
+      </w:r>
+      <w:r>
+        <w:t xml:space="preserve"> </w:t>
+      </w:r>
+      <w:r>
+        <w:t xml:space="preserve">spending afterward, under a preregistered plan. The finding that early renewers were savers also fits reports that ACOs earning bonuses survived longer in the</w:t>
+      </w:r>
+      <w:r>
+        <w:t xml:space="preserve"> </w:t>
+      </w:r>
+      <w:r>
+        <w:t xml:space="preserve">program</w:t>
+      </w:r>
+      <w:r>
+        <w:t xml:space="preserve">[</w:t>
+      </w:r>
+      <w:hyperlink w:anchor="ref-bleser2019">
+        <w:r>
+          <w:rPr>
+            <w:rStyle w:val="Hyperlink"/>
+          </w:rPr>
+          <w:t xml:space="preserve">17</w:t>
+        </w:r>
+      </w:hyperlink>
+      <w:r>
+        <w:t xml:space="preserve">]</w:t>
+      </w:r>
+      <w:r>
+        <w:t xml:space="preserve"> </w:t>
+      </w:r>
+      <w:r>
+        <w:t xml:space="preserve">and, with borderline precision, that ACOs that had achieved savings were more likely to stay</w:t>
+      </w:r>
+      <w:r>
+        <w:t xml:space="preserve"> </w:t>
+      </w:r>
+      <w:r>
+        <w:t xml:space="preserve">after the 2019 rules.</w:t>
+      </w:r>
+      <w:r>
+        <w:t xml:space="preserve">[</w:t>
+      </w:r>
+      <w:hyperlink w:anchor="ref-ying2023">
+        <w:r>
+          <w:rPr>
+            <w:rStyle w:val="Hyperlink"/>
+          </w:rPr>
+          <w:t xml:space="preserve">19</w:t>
+        </w:r>
+      </w:hyperlink>
+      <w:r>
+        <w:t xml:space="preserve">]</w:t>
+      </w:r>
+      <w:r>
+        <w:t xml:space="preserve"> </w:t>
+      </w:r>
+      <w:r>
+        <w:t xml:space="preserve">The same success, however, meant that the own-spending part of a reset would</w:t>
+      </w:r>
+      <w:r>
+        <w:t xml:space="preserve"> </w:t>
+      </w:r>
+      <w:r>
+        <w:t xml:space="preserve">have cut their benchmarks.</w:t>
+      </w:r>
+      <w:r>
+        <w:t xml:space="preserve"> </w:t>
+      </w:r>
+      <w:r>
+        <w:t xml:space="preserve">That the size of the regional difference doubled without case-mix adjustment is consistent with evidence that</w:t>
+      </w:r>
+      <w:r>
+        <w:t xml:space="preserve"> </w:t>
+      </w:r>
+      <w:r>
+        <w:t xml:space="preserve">comparisons of ACOs with their regions depend heavily on risk adjustment.</w:t>
+      </w:r>
+      <w:r>
+        <w:t xml:space="preserve">[</w:t>
+      </w:r>
+      <w:hyperlink w:anchor="ref-rose2016">
         <w:r>
           <w:rPr>
             <w:rStyle w:val="Hyperlink"/>
@@ -7902,35 +8060,23 @@
         <w:t xml:space="preserve"> </w:t>
       </w:r>
       <w:r>
-        <w:t xml:space="preserve">Here the choice is when to reset rather than whether to join or leave,</w:t>
-      </w:r>
-      <w:r>
-        <w:t xml:space="preserve"> </w:t>
-      </w:r>
-      <w:r>
-        <w:t xml:space="preserve">and early renewers had, on average, more room under their regions’ spending, the position associated with joining and</w:t>
-      </w:r>
-      <w:r>
-        <w:t xml:space="preserve"> </w:t>
-      </w:r>
-      <w:r>
-        <w:t xml:space="preserve">staying. In a voluntary Medicare bundled-payment program, hospitals that could gain without changing their behavior</w:t>
-      </w:r>
-      <w:r>
-        <w:t xml:space="preserve"> </w:t>
-      </w:r>
-      <w:r>
-        <w:t xml:space="preserve">were more likely to join, which the authors called selection on levels;</w:t>
+        <w:t xml:space="preserve">The concern that rebasing rewards</w:t>
+      </w:r>
+      <w:r>
+        <w:t xml:space="preserve"> </w:t>
+      </w:r>
+      <w:r>
+        <w:t xml:space="preserve">higher spending before a new agreement</w:t>
       </w:r>
       <w:r>
         <w:t xml:space="preserve">[</w:t>
       </w:r>
-      <w:hyperlink w:anchor="ref-einav2022">
-        <w:r>
-          <w:rPr>
-            <w:rStyle w:val="Hyperlink"/>
-          </w:rPr>
-          <w:t xml:space="preserve">61</w:t>
+      <w:hyperlink w:anchor="ref-douven2015">
+        <w:r>
+          <w:rPr>
+            <w:rStyle w:val="Hyperlink"/>
+          </w:rPr>
+          <w:t xml:space="preserve">10</w:t>
         </w:r>
       </w:hyperlink>
       <w:r>
@@ -7940,29 +8086,23 @@
         <w:t xml:space="preserve"> </w:t>
       </w:r>
       <w:r>
-        <w:t xml:space="preserve">early renewal shows selection on a</w:t>
-      </w:r>
-      <w:r>
-        <w:t xml:space="preserve"> </w:t>
-      </w:r>
-      <w:r>
-        <w:t xml:space="preserve">similar position, though the gain that most early renewers took appears to have been the sharing rate rather than a</w:t>
-      </w:r>
-      <w:r>
-        <w:t xml:space="preserve"> </w:t>
-      </w:r>
-      <w:r>
-        <w:t xml:space="preserve">higher benchmark. The industry report on the same cohort</w:t>
+        <w:t xml:space="preserve">could be neither confirmed nor excluded here, and the costs to</w:t>
+      </w:r>
+      <w:r>
+        <w:t xml:space="preserve"> </w:t>
+      </w:r>
+      <w:r>
+        <w:t xml:space="preserve">Medicare of early renewal, which earlier work estimated for departures,</w:t>
       </w:r>
       <w:r>
         <w:t xml:space="preserve">[</w:t>
       </w:r>
-      <w:hyperlink w:anchor="ref-milliman2024">
-        <w:r>
-          <w:rPr>
-            <w:rStyle w:val="Hyperlink"/>
-          </w:rPr>
-          <w:t xml:space="preserve">10</w:t>
+      <w:hyperlink w:anchor="ref-moloci2021">
+        <w:r>
+          <w:rPr>
+            <w:rStyle w:val="Hyperlink"/>
+          </w:rPr>
+          <w:t xml:space="preserve">21</w:t>
         </w:r>
       </w:hyperlink>
       <w:r>
@@ -7972,41 +8112,43 @@
         <w:t xml:space="preserve"> </w:t>
       </w:r>
       <w:r>
-        <w:t xml:space="preserve">is</w:t>
-      </w:r>
-      <w:r>
-        <w:t xml:space="preserve"> </w:t>
-      </w:r>
-      <w:r>
-        <w:t xml:space="preserve">consistent with the higher prior savings rates and the BASIC-level association here. Beyond that report, this study rebuilt the reset benchmark and validated it</w:t>
-      </w:r>
-      <w:r>
-        <w:t xml:space="preserve"> </w:t>
-      </w:r>
-      <w:r>
-        <w:t xml:space="preserve">against CMS’s, separated its own-spending and regional parts, modeled the decision within the BASIC track and followed</w:t>
-      </w:r>
-      <w:r>
-        <w:t xml:space="preserve"> </w:t>
-      </w:r>
-      <w:r>
-        <w:t xml:space="preserve">spending afterward, under a preregistered plan. The finding that early renewers were savers also fits reports that ACOs earning bonuses survived longer in the</w:t>
-      </w:r>
-      <w:r>
-        <w:t xml:space="preserve"> </w:t>
-      </w:r>
-      <w:r>
-        <w:t xml:space="preserve">program</w:t>
+        <w:t xml:space="preserve">were not estimated.</w:t>
+      </w:r>
+    </w:p>
+    <w:p>
+      <w:pPr>
+        <w:pStyle w:val="BodyText"/>
+      </w:pPr>
+      <w:r>
+        <w:t xml:space="preserve">The association with a higher BASIC level bears on the sharing-rate motive at least as much as on the reset motive.</w:t>
+      </w:r>
+      <w:r>
+        <w:t xml:space="preserve"> </w:t>
+      </w:r>
+      <w:r>
+        <w:t xml:space="preserve">In these data renewing early and moving to ENHANCED were one choice: 26 of the 27 BASIC-track early renewers moved to ENHANCED, and the rules let no stayer do so. ACOs already bearing two-sided risk at Level E faced a short step to ENHANCED’s 75%</w:t>
+      </w:r>
+      <w:r>
+        <w:t xml:space="preserve"> </w:t>
+      </w:r>
+      <w:r>
+        <w:t xml:space="preserve">sharing rate. Because ACOs partly choose their BASIC level, and ACOs experienced with performance-based risk could</w:t>
+      </w:r>
+      <w:r>
+        <w:t xml:space="preserve"> </w:t>
+      </w:r>
+      <w:r>
+        <w:t xml:space="preserve">enter only Level E or ENHANCED,</w:t>
       </w:r>
       <w:r>
         <w:t xml:space="preserve">[</w:t>
       </w:r>
-      <w:hyperlink w:anchor="ref-bleser2019">
-        <w:r>
-          <w:rPr>
-            <w:rStyle w:val="Hyperlink"/>
-          </w:rPr>
-          <w:t xml:space="preserve">18</w:t>
+      <w:hyperlink w:anchor="ref-cfr425600">
+        <w:r>
+          <w:rPr>
+            <w:rStyle w:val="Hyperlink"/>
+          </w:rPr>
+          <w:t xml:space="preserve">37</w:t>
         </w:r>
       </w:hyperlink>
       <w:r>
@@ -8016,209 +8158,47 @@
         <w:t xml:space="preserve"> </w:t>
       </w:r>
       <w:r>
-        <w:t xml:space="preserve">and, with borderline precision, that ACOs that had achieved savings were more likely to stay</w:t>
-      </w:r>
-      <w:r>
-        <w:t xml:space="preserve"> </w:t>
-      </w:r>
-      <w:r>
-        <w:t xml:space="preserve">after the 2019 rules.</w:t>
+        <w:t xml:space="preserve">the association may also reflect earlier risk experience or appetite rather</w:t>
+      </w:r>
+      <w:r>
+        <w:t xml:space="preserve"> </w:t>
+      </w:r>
+      <w:r>
+        <w:t xml:space="preserve">than only proximity to ENHANCED. A high regional pull is also a plausible reason to want the higher rate,</w:t>
+      </w:r>
+      <w:r>
+        <w:t xml:space="preserve"> </w:t>
+      </w:r>
+      <w:r>
+        <w:t xml:space="preserve">because an ACO with room under its region’s spending may expect larger savings to share. The 2 early renewers already in ENHANCED, for whom only the reset could change, looked like typical stayers on every</w:t>
+      </w:r>
+      <w:r>
+        <w:t xml:space="preserve"> </w:t>
+      </w:r>
+      <w:r>
+        <w:t xml:space="preserve">variable. Taken together, with renewal and the move to ENHANCED one choice, the higher BASIC levels, a total</w:t>
+      </w:r>
+      <w:r>
+        <w:t xml:space="preserve"> </w:t>
+      </w:r>
+      <w:r>
+        <w:t xml:space="preserve">expected gain near zero and reset benchmarks that fell, the pattern fits the sharing-rate motive better than the</w:t>
+      </w:r>
+      <w:r>
+        <w:t xml:space="preserve"> </w:t>
+      </w:r>
+      <w:r>
+        <w:t xml:space="preserve">reset motive, and it is the trade CMS built into the rules: the move to ENHANCED required a reset.</w:t>
       </w:r>
       <w:r>
         <w:t xml:space="preserve">[</w:t>
       </w:r>
-      <w:hyperlink w:anchor="ref-ying2023">
-        <w:r>
-          <w:rPr>
-            <w:rStyle w:val="Hyperlink"/>
-          </w:rPr>
-          <w:t xml:space="preserve">20</w:t>
-        </w:r>
-      </w:hyperlink>
-      <w:r>
-        <w:t xml:space="preserve">]</w:t>
-      </w:r>
-      <w:r>
-        <w:t xml:space="preserve"> </w:t>
-      </w:r>
-      <w:r>
-        <w:t xml:space="preserve">The same success, however, meant that the own-spending part of a reset would</w:t>
-      </w:r>
-      <w:r>
-        <w:t xml:space="preserve"> </w:t>
-      </w:r>
-      <w:r>
-        <w:t xml:space="preserve">have cut their benchmarks.</w:t>
-      </w:r>
-      <w:r>
-        <w:t xml:space="preserve"> </w:t>
-      </w:r>
-      <w:r>
-        <w:t xml:space="preserve">That the size of the regional difference doubled without case-mix adjustment is consistent with evidence that</w:t>
-      </w:r>
-      <w:r>
-        <w:t xml:space="preserve"> </w:t>
-      </w:r>
-      <w:r>
-        <w:t xml:space="preserve">comparisons of ACOs with their regions depend heavily on risk adjustment.</w:t>
-      </w:r>
-      <w:r>
-        <w:t xml:space="preserve">[</w:t>
-      </w:r>
-      <w:hyperlink w:anchor="ref-rose2016">
-        <w:r>
-          <w:rPr>
-            <w:rStyle w:val="Hyperlink"/>
-          </w:rPr>
-          <w:t xml:space="preserve">14</w:t>
-        </w:r>
-      </w:hyperlink>
-      <w:r>
-        <w:t xml:space="preserve">]</w:t>
-      </w:r>
-      <w:r>
-        <w:t xml:space="preserve"> </w:t>
-      </w:r>
-      <w:r>
-        <w:t xml:space="preserve">The concern that rebasing rewards</w:t>
-      </w:r>
-      <w:r>
-        <w:t xml:space="preserve"> </w:t>
-      </w:r>
-      <w:r>
-        <w:t xml:space="preserve">higher spending before a new agreement</w:t>
-      </w:r>
-      <w:r>
-        <w:t xml:space="preserve">[</w:t>
-      </w:r>
-      <w:hyperlink w:anchor="ref-douven2015">
-        <w:r>
-          <w:rPr>
-            <w:rStyle w:val="Hyperlink"/>
-          </w:rPr>
-          <w:t xml:space="preserve">11</w:t>
-        </w:r>
-      </w:hyperlink>
-      <w:r>
-        <w:t xml:space="preserve">]</w:t>
-      </w:r>
-      <w:r>
-        <w:t xml:space="preserve"> </w:t>
-      </w:r>
-      <w:r>
-        <w:t xml:space="preserve">could be neither confirmed nor excluded here, and the costs to</w:t>
-      </w:r>
-      <w:r>
-        <w:t xml:space="preserve"> </w:t>
-      </w:r>
-      <w:r>
-        <w:t xml:space="preserve">Medicare of early renewal, which earlier work estimated for departures,</w:t>
-      </w:r>
-      <w:r>
-        <w:t xml:space="preserve">[</w:t>
-      </w:r>
-      <w:hyperlink w:anchor="ref-moloci2021">
-        <w:r>
-          <w:rPr>
-            <w:rStyle w:val="Hyperlink"/>
-          </w:rPr>
-          <w:t xml:space="preserve">22</w:t>
-        </w:r>
-      </w:hyperlink>
-      <w:r>
-        <w:t xml:space="preserve">]</w:t>
-      </w:r>
-      <w:r>
-        <w:t xml:space="preserve"> </w:t>
-      </w:r>
-      <w:r>
-        <w:t xml:space="preserve">were not estimated.</w:t>
-      </w:r>
-    </w:p>
-    <w:p>
-      <w:pPr>
-        <w:pStyle w:val="BodyText"/>
-      </w:pPr>
-      <w:r>
-        <w:t xml:space="preserve">The association with a higher BASIC level bears on the sharing-rate motive at least as much as on the reset motive.</w:t>
-      </w:r>
-      <w:r>
-        <w:t xml:space="preserve"> </w:t>
-      </w:r>
-      <w:r>
-        <w:t xml:space="preserve">In these data renewing early and moving to ENHANCED were one choice: 26 of the 27 BASIC-track early renewers moved to ENHANCED, and the rules let no stayer do so. ACOs already bearing two-sided risk at Level E faced a short step to ENHANCED’s 75%</w:t>
-      </w:r>
-      <w:r>
-        <w:t xml:space="preserve"> </w:t>
-      </w:r>
-      <w:r>
-        <w:t xml:space="preserve">sharing rate. Because ACOs partly choose their BASIC level, and ACOs experienced with performance-based risk could</w:t>
-      </w:r>
-      <w:r>
-        <w:t xml:space="preserve"> </w:t>
-      </w:r>
-      <w:r>
-        <w:t xml:space="preserve">enter only Level E or ENHANCED,</w:t>
-      </w:r>
-      <w:r>
-        <w:t xml:space="preserve">[</w:t>
-      </w:r>
-      <w:hyperlink w:anchor="ref-cfr425600">
-        <w:r>
-          <w:rPr>
-            <w:rStyle w:val="Hyperlink"/>
-          </w:rPr>
-          <w:t xml:space="preserve">37</w:t>
-        </w:r>
-      </w:hyperlink>
-      <w:r>
-        <w:t xml:space="preserve">]</w:t>
-      </w:r>
-      <w:r>
-        <w:t xml:space="preserve"> </w:t>
-      </w:r>
-      <w:r>
-        <w:t xml:space="preserve">the association may also reflect earlier risk experience or appetite rather</w:t>
-      </w:r>
-      <w:r>
-        <w:t xml:space="preserve"> </w:t>
-      </w:r>
-      <w:r>
-        <w:t xml:space="preserve">than only proximity to ENHANCED. A high regional pull is also a plausible reason to want the higher rate,</w:t>
-      </w:r>
-      <w:r>
-        <w:t xml:space="preserve"> </w:t>
-      </w:r>
-      <w:r>
-        <w:t xml:space="preserve">because an ACO with room under its region’s spending may expect larger savings to share. The 2 early renewers already in ENHANCED, for whom only the reset could change, looked like typical stayers on every</w:t>
-      </w:r>
-      <w:r>
-        <w:t xml:space="preserve"> </w:t>
-      </w:r>
-      <w:r>
-        <w:t xml:space="preserve">variable. Taken together, with renewal and the move to ENHANCED one choice, the higher BASIC levels, a total</w:t>
-      </w:r>
-      <w:r>
-        <w:t xml:space="preserve"> </w:t>
-      </w:r>
-      <w:r>
-        <w:t xml:space="preserve">expected gain near zero and reset benchmarks that fell, the pattern fits the sharing-rate motive better than the</w:t>
-      </w:r>
-      <w:r>
-        <w:t xml:space="preserve"> </w:t>
-      </w:r>
-      <w:r>
-        <w:t xml:space="preserve">reset motive, and it is the trade CMS built into the rules: the move to ENHANCED required a reset.</w:t>
-      </w:r>
-      <w:r>
-        <w:t xml:space="preserve">[</w:t>
-      </w:r>
       <w:hyperlink w:anchor="ref-frpathways">
         <w:r>
           <w:rPr>
             <w:rStyle w:val="Hyperlink"/>
           </w:rPr>
-          <w:t xml:space="preserve">24</w:t>
+          <w:t xml:space="preserve">23</w:t>
         </w:r>
       </w:hyperlink>
       <w:r>
@@ -8762,7 +8742,7 @@
         <w:pStyle w:val="FirstParagraph"/>
       </w:pPr>
       <w:r>
-        <w:t xml:space="preserve">The datasets generated and analysed during the current study are available in the Zenodo repository</w:t>
+        <w:t xml:space="preserve">The datasets generated and analyzed during the current study are available in the Zenodo repository</w:t>
       </w:r>
       <w:r>
         <w:t xml:space="preserve">[</w:t>
@@ -8818,7 +8798,7 @@
           <w:rPr>
             <w:rStyle w:val="Hyperlink"/>
           </w:rPr>
-          <w:t xml:space="preserve">25</w:t>
+          <w:t xml:space="preserve">24</w:t>
         </w:r>
       </w:hyperlink>
       <w:r>
@@ -9158,7 +9138,46 @@
         <w:pStyle w:val="Bibliography"/>
       </w:pPr>
       <w:r>
-        <w:t xml:space="preserve">1. Centers for Medicare &amp; Medicaid Services.</w:t>
+        <w:t xml:space="preserve">1. Centers for Medicare &amp; Medicaid Services. 42</w:t>
+      </w:r>
+      <w:r>
+        <w:t xml:space="preserve"> </w:t>
+      </w:r>
+      <w:r>
+        <w:t xml:space="preserve">CFR</w:t>
+      </w:r>
+      <w:r>
+        <w:t xml:space="preserve"> </w:t>
+      </w:r>
+      <w:r>
+        <w:t xml:space="preserve">part 425:</w:t>
+      </w:r>
+      <w:r>
+        <w:t xml:space="preserve"> </w:t>
+      </w:r>
+      <w:r>
+        <w:t xml:space="preserve">Medicare</w:t>
+      </w:r>
+      <w:r>
+        <w:t xml:space="preserve"> </w:t>
+      </w:r>
+      <w:r>
+        <w:t xml:space="preserve">Shared</w:t>
+      </w:r>
+      <w:r>
+        <w:t xml:space="preserve"> </w:t>
+      </w:r>
+      <w:r>
+        <w:t xml:space="preserve">Savings</w:t>
+      </w:r>
+      <w:r>
+        <w:t xml:space="preserve"> </w:t>
+      </w:r>
+      <w:r>
+        <w:t xml:space="preserve">Program</w:t>
+      </w:r>
+      <w:r>
+        <w:t xml:space="preserve">. 2022.</w:t>
       </w:r>
       <w:r>
         <w:t xml:space="preserve"> </w:t>
@@ -9168,83 +9187,11 @@
           <w:rPr>
             <w:rStyle w:val="Hyperlink"/>
           </w:rPr>
-          <w:t xml:space="preserve">42</w:t>
-        </w:r>
-        <w:r>
-          <w:rPr>
-            <w:rStyle w:val="Hyperlink"/>
-          </w:rPr>
-          <w:t xml:space="preserve"> </w:t>
-        </w:r>
-        <w:r>
-          <w:rPr>
-            <w:rStyle w:val="Hyperlink"/>
-          </w:rPr>
-          <w:t xml:space="preserve">CFR</w:t>
-        </w:r>
-        <w:r>
-          <w:rPr>
-            <w:rStyle w:val="Hyperlink"/>
-          </w:rPr>
-          <w:t xml:space="preserve"> </w:t>
-        </w:r>
-        <w:r>
-          <w:rPr>
-            <w:rStyle w:val="Hyperlink"/>
-          </w:rPr>
-          <w:t xml:space="preserve">part 425:</w:t>
-        </w:r>
-        <w:r>
-          <w:rPr>
-            <w:rStyle w:val="Hyperlink"/>
-          </w:rPr>
-          <w:t xml:space="preserve"> </w:t>
-        </w:r>
-        <w:r>
-          <w:rPr>
-            <w:rStyle w:val="Hyperlink"/>
-          </w:rPr>
-          <w:t xml:space="preserve">Medicare</w:t>
-        </w:r>
-        <w:r>
-          <w:rPr>
-            <w:rStyle w:val="Hyperlink"/>
-          </w:rPr>
-          <w:t xml:space="preserve"> </w:t>
-        </w:r>
-        <w:r>
-          <w:rPr>
-            <w:rStyle w:val="Hyperlink"/>
-          </w:rPr>
-          <w:t xml:space="preserve">Shared</w:t>
-        </w:r>
-        <w:r>
-          <w:rPr>
-            <w:rStyle w:val="Hyperlink"/>
-          </w:rPr>
-          <w:t xml:space="preserve"> </w:t>
-        </w:r>
-        <w:r>
-          <w:rPr>
-            <w:rStyle w:val="Hyperlink"/>
-          </w:rPr>
-          <w:t xml:space="preserve">Savings</w:t>
-        </w:r>
-        <w:r>
-          <w:rPr>
-            <w:rStyle w:val="Hyperlink"/>
-          </w:rPr>
-          <w:t xml:space="preserve"> </w:t>
-        </w:r>
-        <w:r>
-          <w:rPr>
-            <w:rStyle w:val="Hyperlink"/>
-          </w:rPr>
-          <w:t xml:space="preserve">Program</w:t>
-        </w:r>
-      </w:hyperlink>
-      <w:r>
-        <w:t xml:space="preserve">. 2022.</w:t>
+          <w:t xml:space="preserve">https://www.ecfr.gov/on/2022-01-01/title-42/chapter-IV/subchapter-B/part-425</w:t>
+        </w:r>
+      </w:hyperlink>
+      <w:r>
+        <w:t xml:space="preserve">. Accessed 28 Oct 2026.</w:t>
       </w:r>
     </w:p>
     <w:bookmarkEnd w:id="68"/>
@@ -9254,7 +9201,37 @@
         <w:pStyle w:val="Bibliography"/>
       </w:pPr>
       <w:r>
-        <w:t xml:space="preserve">2. Centers for Medicare &amp; Medicaid Services.</w:t>
+        <w:t xml:space="preserve">2. Centers for Medicare &amp; Medicaid Services. Shared</w:t>
+      </w:r>
+      <w:r>
+        <w:t xml:space="preserve"> </w:t>
+      </w:r>
+      <w:r>
+        <w:t xml:space="preserve">Savings</w:t>
+      </w:r>
+      <w:r>
+        <w:t xml:space="preserve"> </w:t>
+      </w:r>
+      <w:r>
+        <w:t xml:space="preserve">Program</w:t>
+      </w:r>
+      <w:r>
+        <w:t xml:space="preserve"> </w:t>
+      </w:r>
+      <w:r>
+        <w:t xml:space="preserve">fast facts: As of</w:t>
+      </w:r>
+      <w:r>
+        <w:t xml:space="preserve"> </w:t>
+      </w:r>
+      <w:r>
+        <w:t xml:space="preserve">January</w:t>
+      </w:r>
+      <w:r>
+        <w:t xml:space="preserve"> </w:t>
+      </w:r>
+      <w:r>
+        <w:t xml:space="preserve">1, 2026. 2026.</w:t>
       </w:r>
       <w:r>
         <w:t xml:space="preserve"> </w:t>
@@ -9264,71 +9241,11 @@
           <w:rPr>
             <w:rStyle w:val="Hyperlink"/>
           </w:rPr>
-          <w:t xml:space="preserve">Shared</w:t>
-        </w:r>
-        <w:r>
-          <w:rPr>
-            <w:rStyle w:val="Hyperlink"/>
-          </w:rPr>
-          <w:t xml:space="preserve"> </w:t>
-        </w:r>
-        <w:r>
-          <w:rPr>
-            <w:rStyle w:val="Hyperlink"/>
-          </w:rPr>
-          <w:t xml:space="preserve">Savings</w:t>
-        </w:r>
-        <w:r>
-          <w:rPr>
-            <w:rStyle w:val="Hyperlink"/>
-          </w:rPr>
-          <w:t xml:space="preserve"> </w:t>
-        </w:r>
-        <w:r>
-          <w:rPr>
-            <w:rStyle w:val="Hyperlink"/>
-          </w:rPr>
-          <w:t xml:space="preserve">Program</w:t>
-        </w:r>
-        <w:r>
-          <w:rPr>
-            <w:rStyle w:val="Hyperlink"/>
-          </w:rPr>
-          <w:t xml:space="preserve"> </w:t>
-        </w:r>
-        <w:r>
-          <w:rPr>
-            <w:rStyle w:val="Hyperlink"/>
-          </w:rPr>
-          <w:t xml:space="preserve">fast facts: As of</w:t>
-        </w:r>
-        <w:r>
-          <w:rPr>
-            <w:rStyle w:val="Hyperlink"/>
-          </w:rPr>
-          <w:t xml:space="preserve"> </w:t>
-        </w:r>
-        <w:r>
-          <w:rPr>
-            <w:rStyle w:val="Hyperlink"/>
-          </w:rPr>
-          <w:t xml:space="preserve">January</w:t>
-        </w:r>
-        <w:r>
-          <w:rPr>
-            <w:rStyle w:val="Hyperlink"/>
-          </w:rPr>
-          <w:t xml:space="preserve"> </w:t>
-        </w:r>
-        <w:r>
-          <w:rPr>
-            <w:rStyle w:val="Hyperlink"/>
-          </w:rPr>
-          <w:t xml:space="preserve">1, 2026</w:t>
-        </w:r>
-      </w:hyperlink>
-      <w:r>
-        <w:t xml:space="preserve">. 2026.</w:t>
+          <w:t xml:space="preserve">https://www.cms.gov/files/document/2026-shared-savings-program-fast-facts.pdf</w:t>
+        </w:r>
+      </w:hyperlink>
+      <w:r>
+        <w:t xml:space="preserve">. Accessed 28 Oct 2026.</w:t>
       </w:r>
     </w:p>
     <w:bookmarkEnd w:id="70"/>
@@ -9338,7 +9255,40 @@
         <w:pStyle w:val="Bibliography"/>
       </w:pPr>
       <w:r>
-        <w:t xml:space="preserve">3. Centers for Medicare &amp; Medicaid Services.</w:t>
+        <w:t xml:space="preserve">3. Centers for Medicare &amp; Medicaid Services. 42</w:t>
+      </w:r>
+      <w:r>
+        <w:t xml:space="preserve"> </w:t>
+      </w:r>
+      <w:r>
+        <w:t xml:space="preserve">CFR</w:t>
+      </w:r>
+      <w:r>
+        <w:t xml:space="preserve"> </w:t>
+      </w:r>
+      <w:r>
+        <w:t xml:space="preserve">425.601:</w:t>
+      </w:r>
+      <w:r>
+        <w:t xml:space="preserve"> </w:t>
+      </w:r>
+      <w:r>
+        <w:t xml:space="preserve">Establishing</w:t>
+      </w:r>
+      <w:r>
+        <w:t xml:space="preserve">, adjusting, and updating the benchmark for agreement periods beginning on</w:t>
+      </w:r>
+      <w:r>
+        <w:t xml:space="preserve"> </w:t>
+      </w:r>
+      <w:r>
+        <w:t xml:space="preserve">July</w:t>
+      </w:r>
+      <w:r>
+        <w:t xml:space="preserve"> </w:t>
+      </w:r>
+      <w:r>
+        <w:t xml:space="preserve">1, 2019, and in subsequent years. 2022.</w:t>
       </w:r>
       <w:r>
         <w:t xml:space="preserve"> </w:t>
@@ -9348,77 +9298,11 @@
           <w:rPr>
             <w:rStyle w:val="Hyperlink"/>
           </w:rPr>
-          <w:t xml:space="preserve">42</w:t>
-        </w:r>
-        <w:r>
-          <w:rPr>
-            <w:rStyle w:val="Hyperlink"/>
-          </w:rPr>
-          <w:t xml:space="preserve"> </w:t>
-        </w:r>
-        <w:r>
-          <w:rPr>
-            <w:rStyle w:val="Hyperlink"/>
-          </w:rPr>
-          <w:t xml:space="preserve">CFR</w:t>
-        </w:r>
-        <w:r>
-          <w:rPr>
-            <w:rStyle w:val="Hyperlink"/>
-          </w:rPr>
-          <w:t xml:space="preserve"> </w:t>
-        </w:r>
-        <w:r>
-          <w:rPr>
-            <w:rStyle w:val="Hyperlink"/>
-          </w:rPr>
-          <w:t xml:space="preserve">425.601:</w:t>
-        </w:r>
-        <w:r>
-          <w:rPr>
-            <w:rStyle w:val="Hyperlink"/>
-          </w:rPr>
-          <w:t xml:space="preserve"> </w:t>
-        </w:r>
-        <w:r>
-          <w:rPr>
-            <w:rStyle w:val="Hyperlink"/>
-          </w:rPr>
-          <w:t xml:space="preserve">Establishing</w:t>
-        </w:r>
-        <w:r>
-          <w:rPr>
-            <w:rStyle w:val="Hyperlink"/>
-          </w:rPr>
-          <w:t xml:space="preserve">, adjusting, and updating the benchmark for agreement periods beginning on</w:t>
-        </w:r>
-        <w:r>
-          <w:rPr>
-            <w:rStyle w:val="Hyperlink"/>
-          </w:rPr>
-          <w:t xml:space="preserve"> </w:t>
-        </w:r>
-        <w:r>
-          <w:rPr>
-            <w:rStyle w:val="Hyperlink"/>
-          </w:rPr>
-          <w:t xml:space="preserve">July</w:t>
-        </w:r>
-        <w:r>
-          <w:rPr>
-            <w:rStyle w:val="Hyperlink"/>
-          </w:rPr>
-          <w:t xml:space="preserve"> </w:t>
-        </w:r>
-        <w:r>
-          <w:rPr>
-            <w:rStyle w:val="Hyperlink"/>
-          </w:rPr>
-          <w:t xml:space="preserve">1, 2019, and in subsequent years</w:t>
-        </w:r>
-      </w:hyperlink>
-      <w:r>
-        <w:t xml:space="preserve">. 2022.</w:t>
+          <w:t xml:space="preserve">https://www.ecfr.gov/on/2022-01-01/title-42/chapter-IV/subchapter-B/part-425/subpart-G/section-425.601</w:t>
+        </w:r>
+      </w:hyperlink>
+      <w:r>
+        <w:t xml:space="preserve">. Accessed 28 Oct 2026.</w:t>
       </w:r>
     </w:p>
     <w:bookmarkEnd w:id="72"/>
@@ -9566,13 +9450,13 @@
       </w:r>
     </w:p>
     <w:bookmarkEnd w:id="84"/>
-    <w:bookmarkStart w:id="86" w:name="ref-milliman2024"/>
+    <w:bookmarkStart w:id="86" w:name="ref-douven2015"/>
     <w:p>
       <w:pPr>
         <w:pStyle w:val="Bibliography"/>
       </w:pPr>
       <w:r>
-        <w:t xml:space="preserve">10. Smith M, Jensen B, Anderson J, Lockett K.</w:t>
+        <w:t xml:space="preserve">10. Douven R, McGuire TG, McWilliams JM. Avoiding Unintended Incentives In ACO Payment Models. Health Affairs. 2015;34:143–9.</w:t>
       </w:r>
       <w:r>
         <w:t xml:space="preserve"> </w:t>
@@ -9582,87 +9466,33 @@
           <w:rPr>
             <w:rStyle w:val="Hyperlink"/>
           </w:rPr>
-          <w:t xml:space="preserve">Medicare</w:t>
-        </w:r>
-        <w:r>
-          <w:rPr>
-            <w:rStyle w:val="Hyperlink"/>
-          </w:rPr>
-          <w:t xml:space="preserve"> </w:t>
-        </w:r>
-        <w:r>
-          <w:rPr>
-            <w:rStyle w:val="Hyperlink"/>
-          </w:rPr>
-          <w:t xml:space="preserve">Shared</w:t>
-        </w:r>
-        <w:r>
-          <w:rPr>
-            <w:rStyle w:val="Hyperlink"/>
-          </w:rPr>
-          <w:t xml:space="preserve"> </w:t>
-        </w:r>
-        <w:r>
-          <w:rPr>
-            <w:rStyle w:val="Hyperlink"/>
-          </w:rPr>
-          <w:t xml:space="preserve">Savings</w:t>
-        </w:r>
-        <w:r>
-          <w:rPr>
-            <w:rStyle w:val="Hyperlink"/>
-          </w:rPr>
-          <w:t xml:space="preserve"> </w:t>
-        </w:r>
-        <w:r>
-          <w:rPr>
-            <w:rStyle w:val="Hyperlink"/>
-          </w:rPr>
-          <w:t xml:space="preserve">Program</w:t>
-        </w:r>
-        <w:r>
-          <w:rPr>
-            <w:rStyle w:val="Hyperlink"/>
-          </w:rPr>
-          <w:t xml:space="preserve">:</w:t>
-        </w:r>
-        <w:r>
-          <w:rPr>
-            <w:rStyle w:val="Hyperlink"/>
-          </w:rPr>
-          <w:t xml:space="preserve"> </w:t>
-        </w:r>
-        <w:r>
-          <w:rPr>
-            <w:rStyle w:val="Hyperlink"/>
-          </w:rPr>
-          <w:t xml:space="preserve">ACO</w:t>
-        </w:r>
-        <w:r>
-          <w:rPr>
-            <w:rStyle w:val="Hyperlink"/>
-          </w:rPr>
-          <w:t xml:space="preserve"> </w:t>
-        </w:r>
-        <w:r>
-          <w:rPr>
-            <w:rStyle w:val="Hyperlink"/>
-          </w:rPr>
-          <w:t xml:space="preserve">financial results for 2022</w:t>
-        </w:r>
-      </w:hyperlink>
-      <w:r>
-        <w:t xml:space="preserve">. Milliman research report. Milliman; 2024.</w:t>
+          <w:t xml:space="preserve">https://doi.org/10.1377/hlthaff.2014.0444</w:t>
+        </w:r>
+      </w:hyperlink>
+      <w:r>
+        <w:t xml:space="preserve">.</w:t>
       </w:r>
     </w:p>
     <w:bookmarkEnd w:id="86"/>
-    <w:bookmarkStart w:id="88" w:name="ref-douven2015"/>
+    <w:bookmarkStart w:id="88" w:name="ref-weitzman1980"/>
     <w:p>
       <w:pPr>
         <w:pStyle w:val="Bibliography"/>
       </w:pPr>
       <w:r>
-        <w:t xml:space="preserve">11. Douven R, McGuire TG, McWilliams JM. Avoiding Unintended Incentives In ACO Payment Models. Health Affairs. 2015;34:143–9.</w:t>
+        <w:t xml:space="preserve">11. Weitzman ML. The</w:t>
+      </w:r>
+      <w:r>
+        <w:t xml:space="preserve"> </w:t>
+      </w:r>
+      <w:r>
+        <w:t xml:space="preserve">“Ratchet Principle”</w:t>
+      </w:r>
+      <w:r>
+        <w:t xml:space="preserve"> </w:t>
+      </w:r>
+      <w:r>
+        <w:t xml:space="preserve">and Performance Incentives. The Bell Journal of Economics. 1980;11:302.</w:t>
       </w:r>
       <w:r>
         <w:t xml:space="preserve"> </w:t>
@@ -9672,7 +9502,7 @@
           <w:rPr>
             <w:rStyle w:val="Hyperlink"/>
           </w:rPr>
-          <w:t xml:space="preserve">https://doi.org/10.1377/hlthaff.2014.0444</w:t>
+          <w:t xml:space="preserve">https://doi.org/10.2307/3003414</w:t>
         </w:r>
       </w:hyperlink>
       <w:r>
@@ -9680,25 +9510,46 @@
       </w:r>
     </w:p>
     <w:bookmarkEnd w:id="88"/>
-    <w:bookmarkStart w:id="90" w:name="ref-weitzman1980"/>
+    <w:bookmarkStart w:id="90" w:name="ref-cappello2026"/>
     <w:p>
       <w:pPr>
         <w:pStyle w:val="Bibliography"/>
       </w:pPr>
       <w:r>
-        <w:t xml:space="preserve">12. Weitzman ML. The</w:t>
-      </w:r>
-      <w:r>
-        <w:t xml:space="preserve"> </w:t>
-      </w:r>
-      <w:r>
-        <w:t xml:space="preserve">“Ratchet Principle”</w:t>
-      </w:r>
-      <w:r>
-        <w:t xml:space="preserve"> </w:t>
-      </w:r>
-      <w:r>
-        <w:t xml:space="preserve">and Performance Incentives. The Bell Journal of Economics. 1980;11:302.</w:t>
+        <w:t xml:space="preserve">12. Cappello A. Essays in</w:t>
+      </w:r>
+      <w:r>
+        <w:t xml:space="preserve"> </w:t>
+      </w:r>
+      <w:r>
+        <w:t xml:space="preserve">Industrial</w:t>
+      </w:r>
+      <w:r>
+        <w:t xml:space="preserve"> </w:t>
+      </w:r>
+      <w:r>
+        <w:t xml:space="preserve">Organization</w:t>
+      </w:r>
+      <w:r>
+        <w:t xml:space="preserve"> </w:t>
+      </w:r>
+      <w:r>
+        <w:t xml:space="preserve">and</w:t>
+      </w:r>
+      <w:r>
+        <w:t xml:space="preserve"> </w:t>
+      </w:r>
+      <w:r>
+        <w:t xml:space="preserve">Health</w:t>
+      </w:r>
+      <w:r>
+        <w:t xml:space="preserve"> </w:t>
+      </w:r>
+      <w:r>
+        <w:t xml:space="preserve">Economics</w:t>
+      </w:r>
+      <w:r>
+        <w:t xml:space="preserve">. PhD dissertation. Boston College; 2026.</w:t>
       </w:r>
       <w:r>
         <w:t xml:space="preserve"> </w:t>
@@ -9708,495 +9559,429 @@
           <w:rPr>
             <w:rStyle w:val="Hyperlink"/>
           </w:rPr>
-          <w:t xml:space="preserve">https://doi.org/10.2307/3003414</w:t>
+          <w:t xml:space="preserve">https://www.proquest.com/openview/92b6e8f86c7ba39e2ba879d91063898b/1</w:t>
+        </w:r>
+      </w:hyperlink>
+      <w:r>
+        <w:t xml:space="preserve">. Accessed 28 Oct 2026.</w:t>
+      </w:r>
+    </w:p>
+    <w:bookmarkEnd w:id="90"/>
+    <w:bookmarkStart w:id="92" w:name="ref-rose2016"/>
+    <w:p>
+      <w:pPr>
+        <w:pStyle w:val="Bibliography"/>
+      </w:pPr>
+      <w:r>
+        <w:t xml:space="preserve">13. Rose S, Zaslavsky AM, McWilliams JM. Variation In Accountable Care Organization Spending And Sensitivity To Risk Adjustment: Implications For Benchmarking. Health Affairs. 2016;35:440–8.</w:t>
+      </w:r>
+      <w:r>
+        <w:t xml:space="preserve"> </w:t>
+      </w:r>
+      <w:hyperlink r:id="rId91">
+        <w:r>
+          <w:rPr>
+            <w:rStyle w:val="Hyperlink"/>
+          </w:rPr>
+          <w:t xml:space="preserve">https://doi.org/10.1377/hlthaff.2015.1026</w:t>
         </w:r>
       </w:hyperlink>
       <w:r>
         <w:t xml:space="preserve">.</w:t>
       </w:r>
     </w:p>
-    <w:bookmarkEnd w:id="90"/>
-    <w:bookmarkStart w:id="92" w:name="ref-cappello2026"/>
+    <w:bookmarkEnd w:id="92"/>
+    <w:bookmarkStart w:id="94" w:name="ref-lyu2023"/>
     <w:p>
       <w:pPr>
         <w:pStyle w:val="Bibliography"/>
       </w:pPr>
       <w:r>
-        <w:t xml:space="preserve">13. Cappello A.</w:t>
-      </w:r>
-      <w:r>
-        <w:t xml:space="preserve"> </w:t>
-      </w:r>
-      <w:hyperlink r:id="rId91">
-        <w:r>
-          <w:rPr>
-            <w:rStyle w:val="Hyperlink"/>
-          </w:rPr>
-          <w:t xml:space="preserve">Essays in</w:t>
-        </w:r>
-        <w:r>
-          <w:rPr>
-            <w:rStyle w:val="Hyperlink"/>
-          </w:rPr>
-          <w:t xml:space="preserve"> </w:t>
-        </w:r>
-        <w:r>
-          <w:rPr>
-            <w:rStyle w:val="Hyperlink"/>
-          </w:rPr>
-          <w:t xml:space="preserve">Industrial</w:t>
-        </w:r>
-        <w:r>
-          <w:rPr>
-            <w:rStyle w:val="Hyperlink"/>
-          </w:rPr>
-          <w:t xml:space="preserve"> </w:t>
-        </w:r>
-        <w:r>
-          <w:rPr>
-            <w:rStyle w:val="Hyperlink"/>
-          </w:rPr>
-          <w:t xml:space="preserve">Organization</w:t>
-        </w:r>
-        <w:r>
-          <w:rPr>
-            <w:rStyle w:val="Hyperlink"/>
-          </w:rPr>
-          <w:t xml:space="preserve"> </w:t>
-        </w:r>
-        <w:r>
-          <w:rPr>
-            <w:rStyle w:val="Hyperlink"/>
-          </w:rPr>
-          <w:t xml:space="preserve">and</w:t>
-        </w:r>
-        <w:r>
-          <w:rPr>
-            <w:rStyle w:val="Hyperlink"/>
-          </w:rPr>
-          <w:t xml:space="preserve"> </w:t>
-        </w:r>
-        <w:r>
-          <w:rPr>
-            <w:rStyle w:val="Hyperlink"/>
-          </w:rPr>
-          <w:t xml:space="preserve">Health</w:t>
-        </w:r>
-        <w:r>
-          <w:rPr>
-            <w:rStyle w:val="Hyperlink"/>
-          </w:rPr>
-          <w:t xml:space="preserve"> </w:t>
-        </w:r>
-        <w:r>
-          <w:rPr>
-            <w:rStyle w:val="Hyperlink"/>
-          </w:rPr>
-          <w:t xml:space="preserve">Economics</w:t>
-        </w:r>
-      </w:hyperlink>
-      <w:r>
-        <w:t xml:space="preserve">. PhD dissertation. Boston College; 2026.</w:t>
-      </w:r>
-    </w:p>
-    <w:bookmarkEnd w:id="92"/>
-    <w:bookmarkStart w:id="94" w:name="ref-rose2016"/>
+        <w:t xml:space="preserve">14. Lyu PF, Chernew ME, McWilliams JM. Benchmarking Changes And Selective Participation In The Medicare Shared Savings Program. Health Affairs. 2023;42:622–31.</w:t>
+      </w:r>
+      <w:r>
+        <w:t xml:space="preserve"> </w:t>
+      </w:r>
+      <w:hyperlink r:id="rId93">
+        <w:r>
+          <w:rPr>
+            <w:rStyle w:val="Hyperlink"/>
+          </w:rPr>
+          <w:t xml:space="preserve">https://doi.org/10.1377/hlthaff.2022.01061</w:t>
+        </w:r>
+      </w:hyperlink>
+      <w:r>
+        <w:t xml:space="preserve">.</w:t>
+      </w:r>
+    </w:p>
+    <w:bookmarkEnd w:id="94"/>
+    <w:bookmarkStart w:id="96" w:name="ref-chen2025"/>
     <w:p>
       <w:pPr>
         <w:pStyle w:val="Bibliography"/>
       </w:pPr>
       <w:r>
-        <w:t xml:space="preserve">14. Rose S, Zaslavsky AM, McWilliams JM. Variation In Accountable Care Organization Spending And Sensitivity To Risk Adjustment: Implications For Benchmarking. Health Affairs. 2016;35:440–8.</w:t>
-      </w:r>
-      <w:r>
-        <w:t xml:space="preserve"> </w:t>
-      </w:r>
-      <w:hyperlink r:id="rId93">
-        <w:r>
-          <w:rPr>
-            <w:rStyle w:val="Hyperlink"/>
-          </w:rPr>
-          <w:t xml:space="preserve">https://doi.org/10.1377/hlthaff.2015.1026</w:t>
+        <w:t xml:space="preserve">15. Chen AJ, McWilliams JM. How Benchmark Changes Affect Participation in Accountable Care Organizations: Prospects for Voluntary Payment Models. American Journal of Health Economics. 2025;11:38–62.</w:t>
+      </w:r>
+      <w:r>
+        <w:t xml:space="preserve"> </w:t>
+      </w:r>
+      <w:hyperlink r:id="rId95">
+        <w:r>
+          <w:rPr>
+            <w:rStyle w:val="Hyperlink"/>
+          </w:rPr>
+          <w:t xml:space="preserve">https://doi.org/10.1086/726748</w:t>
         </w:r>
       </w:hyperlink>
       <w:r>
         <w:t xml:space="preserve">.</w:t>
       </w:r>
     </w:p>
-    <w:bookmarkEnd w:id="94"/>
-    <w:bookmarkStart w:id="96" w:name="ref-lyu2023"/>
+    <w:bookmarkEnd w:id="96"/>
+    <w:bookmarkStart w:id="98" w:name="ref-srivastava2026"/>
     <w:p>
       <w:pPr>
         <w:pStyle w:val="Bibliography"/>
       </w:pPr>
       <w:r>
-        <w:t xml:space="preserve">15. Lyu PF, Chernew ME, McWilliams JM. Benchmarking Changes And Selective Participation In The Medicare Shared Savings Program. Health Affairs. 2023;42:622–31.</w:t>
-      </w:r>
-      <w:r>
-        <w:t xml:space="preserve"> </w:t>
-      </w:r>
-      <w:hyperlink r:id="rId95">
-        <w:r>
-          <w:rPr>
-            <w:rStyle w:val="Hyperlink"/>
-          </w:rPr>
-          <w:t xml:space="preserve">https://doi.org/10.1377/hlthaff.2022.01061</w:t>
+        <w:t xml:space="preserve">16. Srivastava A, Shay A, Kaufman SR, Liu X, Maganty A, Oerline MK, et al. Accountable Care Organization Efficiency on Entry and Shared Savings Bonuses. JAMA Network Open. 2026;9:e260166.</w:t>
+      </w:r>
+      <w:r>
+        <w:t xml:space="preserve"> </w:t>
+      </w:r>
+      <w:hyperlink r:id="rId97">
+        <w:r>
+          <w:rPr>
+            <w:rStyle w:val="Hyperlink"/>
+          </w:rPr>
+          <w:t xml:space="preserve">https://doi.org/10.1001/jamanetworkopen.2026.0166</w:t>
         </w:r>
       </w:hyperlink>
       <w:r>
         <w:t xml:space="preserve">.</w:t>
       </w:r>
     </w:p>
-    <w:bookmarkEnd w:id="96"/>
-    <w:bookmarkStart w:id="98" w:name="ref-chen2025"/>
+    <w:bookmarkEnd w:id="98"/>
+    <w:bookmarkStart w:id="100" w:name="ref-bleser2019"/>
     <w:p>
       <w:pPr>
         <w:pStyle w:val="Bibliography"/>
       </w:pPr>
       <w:r>
-        <w:t xml:space="preserve">16. Chen AJ, McWilliams JM. How Benchmark Changes Affect Participation in Accountable Care Organizations: Prospects for Voluntary Payment Models. American Journal of Health Economics. 2025;11:38–62.</w:t>
-      </w:r>
-      <w:r>
-        <w:t xml:space="preserve"> </w:t>
-      </w:r>
-      <w:hyperlink r:id="rId97">
-        <w:r>
-          <w:rPr>
-            <w:rStyle w:val="Hyperlink"/>
-          </w:rPr>
-          <w:t xml:space="preserve">https://doi.org/10.1086/726748</w:t>
+        <w:t xml:space="preserve">17. Bleser WK, Saunders RS, Muhlestein DB, McClellan M. Why Do Accountable Care Organizations Leave The Medicare Shared Savings Program? Health Affairs. 2019;38:794–803.</w:t>
+      </w:r>
+      <w:r>
+        <w:t xml:space="preserve"> </w:t>
+      </w:r>
+      <w:hyperlink r:id="rId99">
+        <w:r>
+          <w:rPr>
+            <w:rStyle w:val="Hyperlink"/>
+          </w:rPr>
+          <w:t xml:space="preserve">https://doi.org/10.1377/hlthaff.2018.05097</w:t>
         </w:r>
       </w:hyperlink>
       <w:r>
         <w:t xml:space="preserve">.</w:t>
       </w:r>
     </w:p>
-    <w:bookmarkEnd w:id="98"/>
-    <w:bookmarkStart w:id="100" w:name="ref-srivastava2026"/>
+    <w:bookmarkEnd w:id="100"/>
+    <w:bookmarkStart w:id="102" w:name="ref-zhu2023"/>
     <w:p>
       <w:pPr>
         <w:pStyle w:val="Bibliography"/>
       </w:pPr>
       <w:r>
-        <w:t xml:space="preserve">17. Srivastava A, Shay A, Kaufman SR, Liu X, Maganty A, Oerline MK, et al. Accountable Care Organization Efficiency on Entry and Shared Savings Bonuses. JAMA Network Open. 2026;9:e260166.</w:t>
-      </w:r>
-      <w:r>
-        <w:t xml:space="preserve"> </w:t>
-      </w:r>
-      <w:hyperlink r:id="rId99">
-        <w:r>
-          <w:rPr>
-            <w:rStyle w:val="Hyperlink"/>
-          </w:rPr>
-          <w:t xml:space="preserve">https://doi.org/10.1001/jamanetworkopen.2026.0166</w:t>
+        <w:t xml:space="preserve">18. Zhu X, Huang H, MacKinney AC, Ullrich F, Mueller K. Medicare accountable care organization characteristics associated with participation in 2‐sided risk. The Journal of Rural Health. 2023;39:302–8.</w:t>
+      </w:r>
+      <w:r>
+        <w:t xml:space="preserve"> </w:t>
+      </w:r>
+      <w:hyperlink r:id="rId101">
+        <w:r>
+          <w:rPr>
+            <w:rStyle w:val="Hyperlink"/>
+          </w:rPr>
+          <w:t xml:space="preserve">https://doi.org/10.1111/jrh.12672</w:t>
         </w:r>
       </w:hyperlink>
       <w:r>
         <w:t xml:space="preserve">.</w:t>
       </w:r>
     </w:p>
-    <w:bookmarkEnd w:id="100"/>
-    <w:bookmarkStart w:id="102" w:name="ref-bleser2019"/>
+    <w:bookmarkEnd w:id="102"/>
+    <w:bookmarkStart w:id="104" w:name="ref-ying2023"/>
     <w:p>
       <w:pPr>
         <w:pStyle w:val="Bibliography"/>
       </w:pPr>
       <w:r>
-        <w:t xml:space="preserve">18. Bleser WK, Saunders RS, Muhlestein DB, McClellan M. Why Do Accountable Care Organizations Leave The Medicare Shared Savings Program? Health Affairs. 2019;38:794–803.</w:t>
-      </w:r>
-      <w:r>
-        <w:t xml:space="preserve"> </w:t>
-      </w:r>
-      <w:hyperlink r:id="rId101">
-        <w:r>
-          <w:rPr>
-            <w:rStyle w:val="Hyperlink"/>
-          </w:rPr>
-          <w:t xml:space="preserve">https://doi.org/10.1377/hlthaff.2018.05097</w:t>
+        <w:t xml:space="preserve">19. Ying M, Hirth RA, Yan P, Shay A, Murali S, Ryan A, et al. Changes in Shared Savings Program Participation After Launch of Pathways to Success. Journal of General Internal Medicine. 2023;38:1780–2.</w:t>
+      </w:r>
+      <w:r>
+        <w:t xml:space="preserve"> </w:t>
+      </w:r>
+      <w:hyperlink r:id="rId103">
+        <w:r>
+          <w:rPr>
+            <w:rStyle w:val="Hyperlink"/>
+          </w:rPr>
+          <w:t xml:space="preserve">https://doi.org/10.1007/s11606-022-07947-x</w:t>
         </w:r>
       </w:hyperlink>
       <w:r>
         <w:t xml:space="preserve">.</w:t>
       </w:r>
     </w:p>
-    <w:bookmarkEnd w:id="102"/>
-    <w:bookmarkStart w:id="104" w:name="ref-zhu2023"/>
+    <w:bookmarkEnd w:id="104"/>
+    <w:bookmarkStart w:id="106" w:name="ref-ying2024"/>
     <w:p>
       <w:pPr>
         <w:pStyle w:val="Bibliography"/>
       </w:pPr>
       <w:r>
-        <w:t xml:space="preserve">19. Zhu X, Huang H, MacKinney AC, Ullrich F, Mueller K. Medicare accountable care organization characteristics associated with participation in 2‐sided risk. The Journal of Rural Health. 2023;39:302–8.</w:t>
-      </w:r>
-      <w:r>
-        <w:t xml:space="preserve"> </w:t>
-      </w:r>
-      <w:hyperlink r:id="rId103">
-        <w:r>
-          <w:rPr>
-            <w:rStyle w:val="Hyperlink"/>
-          </w:rPr>
-          <w:t xml:space="preserve">https://doi.org/10.1111/jrh.12672</w:t>
+        <w:t xml:space="preserve">20. Ying M, Forman JH, Murali S, Gauntlett LE, Krein SL, Hollenbeck BK, et al. Factors affecting Accountable Care Organizations’ decisions to remain in or exit the Medicare Shared Savings Program following Pathways to Success. Health Affairs Scholar. 2024;2:qxad093.</w:t>
+      </w:r>
+      <w:r>
+        <w:t xml:space="preserve"> </w:t>
+      </w:r>
+      <w:hyperlink r:id="rId105">
+        <w:r>
+          <w:rPr>
+            <w:rStyle w:val="Hyperlink"/>
+          </w:rPr>
+          <w:t xml:space="preserve">https://doi.org/10.1093/haschl/qxad093</w:t>
         </w:r>
       </w:hyperlink>
       <w:r>
         <w:t xml:space="preserve">.</w:t>
       </w:r>
     </w:p>
-    <w:bookmarkEnd w:id="104"/>
-    <w:bookmarkStart w:id="106" w:name="ref-ying2023"/>
+    <w:bookmarkEnd w:id="106"/>
+    <w:bookmarkStart w:id="108" w:name="ref-moloci2021"/>
     <w:p>
       <w:pPr>
         <w:pStyle w:val="Bibliography"/>
       </w:pPr>
       <w:r>
-        <w:t xml:space="preserve">20. Ying M, Hirth RA, Yan P, Shay A, Murali S, Ryan A, et al. Changes in Shared Savings Program Participation After Launch of Pathways to Success. Journal of General Internal Medicine. 2023;38:1780–2.</w:t>
-      </w:r>
-      <w:r>
-        <w:t xml:space="preserve"> </w:t>
-      </w:r>
-      <w:hyperlink r:id="rId105">
-        <w:r>
-          <w:rPr>
-            <w:rStyle w:val="Hyperlink"/>
-          </w:rPr>
-          <w:t xml:space="preserve">https://doi.org/10.1007/s11606-022-07947-x</w:t>
+        <w:t xml:space="preserve">21. Moloci NM, Si Y, Norton EC, Ryan AM, Hollingsworth JM. Predicting Losses from Medicare Shared Savings Program Departures. Journal of General Internal Medicine. 2021;36:2490–1.</w:t>
+      </w:r>
+      <w:r>
+        <w:t xml:space="preserve"> </w:t>
+      </w:r>
+      <w:hyperlink r:id="rId107">
+        <w:r>
+          <w:rPr>
+            <w:rStyle w:val="Hyperlink"/>
+          </w:rPr>
+          <w:t xml:space="preserve">https://doi.org/10.1007/s11606-020-06424-7</w:t>
         </w:r>
       </w:hyperlink>
       <w:r>
         <w:t xml:space="preserve">.</w:t>
       </w:r>
     </w:p>
-    <w:bookmarkEnd w:id="106"/>
-    <w:bookmarkStart w:id="108" w:name="ref-ying2024"/>
+    <w:bookmarkEnd w:id="108"/>
+    <w:bookmarkStart w:id="110" w:name="ref-trombley2022"/>
     <w:p>
       <w:pPr>
         <w:pStyle w:val="Bibliography"/>
       </w:pPr>
       <w:r>
-        <w:t xml:space="preserve">21. Ying M, Forman JH, Murali S, Gauntlett LE, Krein SL, Hollenbeck BK, et al. Factors affecting Accountable Care Organizations’ decisions to remain in or exit the Medicare Shared Savings Program following Pathways to Success. Health Affairs Scholar. 2024;2:qxad093.</w:t>
-      </w:r>
-      <w:r>
-        <w:t xml:space="preserve"> </w:t>
-      </w:r>
-      <w:hyperlink r:id="rId107">
-        <w:r>
-          <w:rPr>
-            <w:rStyle w:val="Hyperlink"/>
-          </w:rPr>
-          <w:t xml:space="preserve">https://doi.org/10.1093/haschl/qxad093</w:t>
+        <w:t xml:space="preserve">22. Trombley MJ, McWilliams JM, Fout B, Morefield B. ACO Investment Model Produced Savings, But The Majority Of Participants Exited When Faced With Downside Risk. Health Affairs. 2022;41:138–46.</w:t>
+      </w:r>
+      <w:r>
+        <w:t xml:space="preserve"> </w:t>
+      </w:r>
+      <w:hyperlink r:id="rId109">
+        <w:r>
+          <w:rPr>
+            <w:rStyle w:val="Hyperlink"/>
+          </w:rPr>
+          <w:t xml:space="preserve">https://doi.org/10.1377/hlthaff.2020.01819</w:t>
         </w:r>
       </w:hyperlink>
       <w:r>
         <w:t xml:space="preserve">.</w:t>
       </w:r>
     </w:p>
-    <w:bookmarkEnd w:id="108"/>
-    <w:bookmarkStart w:id="110" w:name="ref-moloci2021"/>
+    <w:bookmarkEnd w:id="110"/>
+    <w:bookmarkStart w:id="112" w:name="ref-frpathways"/>
     <w:p>
       <w:pPr>
         <w:pStyle w:val="Bibliography"/>
       </w:pPr>
       <w:r>
-        <w:t xml:space="preserve">22. Moloci NM, Si Y, Norton EC, Ryan AM, Hollingsworth JM. Predicting Losses from Medicare Shared Savings Program Departures. Journal of General Internal Medicine. 2021;36:2490–1.</w:t>
-      </w:r>
-      <w:r>
-        <w:t xml:space="preserve"> </w:t>
-      </w:r>
-      <w:hyperlink r:id="rId109">
-        <w:r>
-          <w:rPr>
-            <w:rStyle w:val="Hyperlink"/>
-          </w:rPr>
-          <w:t xml:space="preserve">https://doi.org/10.1007/s11606-020-06424-7</w:t>
-        </w:r>
-      </w:hyperlink>
-      <w:r>
-        <w:t xml:space="preserve">.</w:t>
-      </w:r>
-    </w:p>
-    <w:bookmarkEnd w:id="110"/>
-    <w:bookmarkStart w:id="112" w:name="ref-trombley2022"/>
+        <w:t xml:space="preserve">23. Centers for Medicare &amp; Medicaid Services. Medicare program;</w:t>
+      </w:r>
+      <w:r>
+        <w:t xml:space="preserve"> </w:t>
+      </w:r>
+      <w:r>
+        <w:t xml:space="preserve">Medicare</w:t>
+      </w:r>
+      <w:r>
+        <w:t xml:space="preserve"> </w:t>
+      </w:r>
+      <w:r>
+        <w:t xml:space="preserve">Shared</w:t>
+      </w:r>
+      <w:r>
+        <w:t xml:space="preserve"> </w:t>
+      </w:r>
+      <w:r>
+        <w:t xml:space="preserve">Savings</w:t>
+      </w:r>
+      <w:r>
+        <w:t xml:space="preserve"> </w:t>
+      </w:r>
+      <w:r>
+        <w:t xml:space="preserve">Program</w:t>
+      </w:r>
+      <w:r>
+        <w:t xml:space="preserve">; accountable care organizations:</w:t>
+      </w:r>
+      <w:r>
+        <w:t xml:space="preserve"> </w:t>
+      </w:r>
+      <w:r>
+        <w:t xml:space="preserve">Pathways</w:t>
+      </w:r>
+      <w:r>
+        <w:t xml:space="preserve"> </w:t>
+      </w:r>
+      <w:r>
+        <w:t xml:space="preserve">to</w:t>
+      </w:r>
+      <w:r>
+        <w:t xml:space="preserve"> </w:t>
+      </w:r>
+      <w:r>
+        <w:t xml:space="preserve">Success</w:t>
+      </w:r>
+      <w:r>
+        <w:t xml:space="preserve"> </w:t>
+      </w:r>
+      <w:r>
+        <w:t xml:space="preserve">and extreme and uncontrollable circumstances policies for performance year 2017.</w:t>
+      </w:r>
+      <w:r>
+        <w:t xml:space="preserve"> </w:t>
+      </w:r>
+      <w:r>
+        <w:t xml:space="preserve">Final</w:t>
+      </w:r>
+      <w:r>
+        <w:t xml:space="preserve"> </w:t>
+      </w:r>
+      <w:r>
+        <w:t xml:space="preserve">rule. 2018.</w:t>
+      </w:r>
+      <w:r>
+        <w:t xml:space="preserve"> </w:t>
+      </w:r>
+      <w:hyperlink r:id="rId111">
+        <w:r>
+          <w:rPr>
+            <w:rStyle w:val="Hyperlink"/>
+          </w:rPr>
+          <w:t xml:space="preserve">https://www.federalregister.gov/documents/2018/12/31/2018-27981/medicare-program-medicare-shared-savings-program-accountable-care-organizations-pathways-to-success</w:t>
+        </w:r>
+      </w:hyperlink>
+      <w:r>
+        <w:t xml:space="preserve">. Accessed 28 Oct 2026.</w:t>
+      </w:r>
+    </w:p>
+    <w:bookmarkEnd w:id="112"/>
+    <w:bookmarkStart w:id="114" w:name="ref-dataacos"/>
     <w:p>
       <w:pPr>
         <w:pStyle w:val="Bibliography"/>
       </w:pPr>
       <w:r>
-        <w:t xml:space="preserve">23. Trombley MJ, McWilliams JM, Fout B, Morefield B. ACO Investment Model Produced Savings, But The Majority Of Participants Exited When Faced With Downside Risk. Health Affairs. 2022;41:138–46.</w:t>
-      </w:r>
-      <w:r>
-        <w:t xml:space="preserve"> </w:t>
-      </w:r>
-      <w:hyperlink r:id="rId111">
-        <w:r>
-          <w:rPr>
-            <w:rStyle w:val="Hyperlink"/>
-          </w:rPr>
-          <w:t xml:space="preserve">https://doi.org/10.1377/hlthaff.2020.01819</w:t>
-        </w:r>
-      </w:hyperlink>
-      <w:r>
-        <w:t xml:space="preserve">.</w:t>
-      </w:r>
-    </w:p>
-    <w:bookmarkEnd w:id="112"/>
-    <w:bookmarkStart w:id="114" w:name="ref-frpathways"/>
+        <w:t xml:space="preserve">24. Centers for Medicare &amp; Medicaid Services. Accountable care organizations:</w:t>
+      </w:r>
+      <w:r>
+        <w:t xml:space="preserve"> </w:t>
+      </w:r>
+      <w:r>
+        <w:t xml:space="preserve">Shared</w:t>
+      </w:r>
+      <w:r>
+        <w:t xml:space="preserve"> </w:t>
+      </w:r>
+      <w:r>
+        <w:t xml:space="preserve">Savings</w:t>
+      </w:r>
+      <w:r>
+        <w:t xml:space="preserve"> </w:t>
+      </w:r>
+      <w:r>
+        <w:t xml:space="preserve">Program</w:t>
+      </w:r>
+      <w:r>
+        <w:t xml:space="preserve"> </w:t>
+      </w:r>
+      <w:r>
+        <w:t xml:space="preserve">enrollment, performance years 2014-2026. 2026.</w:t>
+      </w:r>
+      <w:r>
+        <w:t xml:space="preserve"> </w:t>
+      </w:r>
+      <w:hyperlink r:id="rId113">
+        <w:r>
+          <w:rPr>
+            <w:rStyle w:val="Hyperlink"/>
+          </w:rPr>
+          <w:t xml:space="preserve">https://data.cms.gov/medicare-shared-savings-program/accountable-care-organizations</w:t>
+        </w:r>
+      </w:hyperlink>
+      <w:r>
+        <w:t xml:space="preserve">. Accessed 22 Oct 2026.</w:t>
+      </w:r>
+    </w:p>
+    <w:bookmarkEnd w:id="114"/>
+    <w:bookmarkStart w:id="116" w:name="ref-milliman2024"/>
     <w:p>
       <w:pPr>
         <w:pStyle w:val="Bibliography"/>
       </w:pPr>
       <w:r>
-        <w:t xml:space="preserve">24. Centers for Medicare &amp; Medicaid Services.</w:t>
-      </w:r>
-      <w:r>
-        <w:t xml:space="preserve"> </w:t>
-      </w:r>
-      <w:hyperlink r:id="rId113">
-        <w:r>
-          <w:rPr>
-            <w:rStyle w:val="Hyperlink"/>
-          </w:rPr>
-          <w:t xml:space="preserve">Medicare program;</w:t>
-        </w:r>
-        <w:r>
-          <w:rPr>
-            <w:rStyle w:val="Hyperlink"/>
-          </w:rPr>
-          <w:t xml:space="preserve"> </w:t>
-        </w:r>
-        <w:r>
-          <w:rPr>
-            <w:rStyle w:val="Hyperlink"/>
-          </w:rPr>
-          <w:t xml:space="preserve">Medicare</w:t>
-        </w:r>
-        <w:r>
-          <w:rPr>
-            <w:rStyle w:val="Hyperlink"/>
-          </w:rPr>
-          <w:t xml:space="preserve"> </w:t>
-        </w:r>
-        <w:r>
-          <w:rPr>
-            <w:rStyle w:val="Hyperlink"/>
-          </w:rPr>
-          <w:t xml:space="preserve">Shared</w:t>
-        </w:r>
-        <w:r>
-          <w:rPr>
-            <w:rStyle w:val="Hyperlink"/>
-          </w:rPr>
-          <w:t xml:space="preserve"> </w:t>
-        </w:r>
-        <w:r>
-          <w:rPr>
-            <w:rStyle w:val="Hyperlink"/>
-          </w:rPr>
-          <w:t xml:space="preserve">Savings</w:t>
-        </w:r>
-        <w:r>
-          <w:rPr>
-            <w:rStyle w:val="Hyperlink"/>
-          </w:rPr>
-          <w:t xml:space="preserve"> </w:t>
-        </w:r>
-        <w:r>
-          <w:rPr>
-            <w:rStyle w:val="Hyperlink"/>
-          </w:rPr>
-          <w:t xml:space="preserve">Program</w:t>
-        </w:r>
-        <w:r>
-          <w:rPr>
-            <w:rStyle w:val="Hyperlink"/>
-          </w:rPr>
-          <w:t xml:space="preserve">; accountable care organizations:</w:t>
-        </w:r>
-        <w:r>
-          <w:rPr>
-            <w:rStyle w:val="Hyperlink"/>
-          </w:rPr>
-          <w:t xml:space="preserve"> </w:t>
-        </w:r>
-        <w:r>
-          <w:rPr>
-            <w:rStyle w:val="Hyperlink"/>
-          </w:rPr>
-          <w:t xml:space="preserve">Pathways</w:t>
-        </w:r>
-        <w:r>
-          <w:rPr>
-            <w:rStyle w:val="Hyperlink"/>
-          </w:rPr>
-          <w:t xml:space="preserve"> </w:t>
-        </w:r>
-        <w:r>
-          <w:rPr>
-            <w:rStyle w:val="Hyperlink"/>
-          </w:rPr>
-          <w:t xml:space="preserve">to</w:t>
-        </w:r>
-        <w:r>
-          <w:rPr>
-            <w:rStyle w:val="Hyperlink"/>
-          </w:rPr>
-          <w:t xml:space="preserve"> </w:t>
-        </w:r>
-        <w:r>
-          <w:rPr>
-            <w:rStyle w:val="Hyperlink"/>
-          </w:rPr>
-          <w:t xml:space="preserve">Success</w:t>
-        </w:r>
-        <w:r>
-          <w:rPr>
-            <w:rStyle w:val="Hyperlink"/>
-          </w:rPr>
-          <w:t xml:space="preserve"> </w:t>
-        </w:r>
-        <w:r>
-          <w:rPr>
-            <w:rStyle w:val="Hyperlink"/>
-          </w:rPr>
-          <w:t xml:space="preserve">and extreme and uncontrollable circumstances policies for performance year 2017.</w:t>
-        </w:r>
-        <w:r>
-          <w:rPr>
-            <w:rStyle w:val="Hyperlink"/>
-          </w:rPr>
-          <w:t xml:space="preserve"> </w:t>
-        </w:r>
-        <w:r>
-          <w:rPr>
-            <w:rStyle w:val="Hyperlink"/>
-          </w:rPr>
-          <w:t xml:space="preserve">Final</w:t>
-        </w:r>
-        <w:r>
-          <w:rPr>
-            <w:rStyle w:val="Hyperlink"/>
-          </w:rPr>
-          <w:t xml:space="preserve"> </w:t>
-        </w:r>
-        <w:r>
-          <w:rPr>
-            <w:rStyle w:val="Hyperlink"/>
-          </w:rPr>
-          <w:t xml:space="preserve">rule</w:t>
-        </w:r>
-      </w:hyperlink>
-      <w:r>
-        <w:t xml:space="preserve">. 2018.</w:t>
-      </w:r>
-    </w:p>
-    <w:bookmarkEnd w:id="114"/>
-    <w:bookmarkStart w:id="116" w:name="ref-dataacos"/>
-    <w:p>
-      <w:pPr>
-        <w:pStyle w:val="Bibliography"/>
-      </w:pPr>
-      <w:r>
-        <w:t xml:space="preserve">25. Centers for Medicare &amp; Medicaid Services.</w:t>
+        <w:t xml:space="preserve">25. Smith M, Jensen B, Anderson J, Lockett K. Medicare</w:t>
+      </w:r>
+      <w:r>
+        <w:t xml:space="preserve"> </w:t>
+      </w:r>
+      <w:r>
+        <w:t xml:space="preserve">Shared</w:t>
+      </w:r>
+      <w:r>
+        <w:t xml:space="preserve"> </w:t>
+      </w:r>
+      <w:r>
+        <w:t xml:space="preserve">Savings</w:t>
+      </w:r>
+      <w:r>
+        <w:t xml:space="preserve"> </w:t>
+      </w:r>
+      <w:r>
+        <w:t xml:space="preserve">Program</w:t>
+      </w:r>
+      <w:r>
+        <w:t xml:space="preserve">:</w:t>
+      </w:r>
+      <w:r>
+        <w:t xml:space="preserve"> </w:t>
+      </w:r>
+      <w:r>
+        <w:t xml:space="preserve">ACO</w:t>
+      </w:r>
+      <w:r>
+        <w:t xml:space="preserve"> </w:t>
+      </w:r>
+      <w:r>
+        <w:t xml:space="preserve">financial results for 2022. Milliman research report. Milliman; 2024.</w:t>
       </w:r>
       <w:r>
         <w:t xml:space="preserve"> </w:t>
@@ -10206,59 +9991,11 @@
           <w:rPr>
             <w:rStyle w:val="Hyperlink"/>
           </w:rPr>
-          <w:t xml:space="preserve">Accountable care organizations:</w:t>
-        </w:r>
-        <w:r>
-          <w:rPr>
-            <w:rStyle w:val="Hyperlink"/>
-          </w:rPr>
-          <w:t xml:space="preserve"> </w:t>
-        </w:r>
-        <w:r>
-          <w:rPr>
-            <w:rStyle w:val="Hyperlink"/>
-          </w:rPr>
-          <w:t xml:space="preserve">Shared</w:t>
-        </w:r>
-        <w:r>
-          <w:rPr>
-            <w:rStyle w:val="Hyperlink"/>
-          </w:rPr>
-          <w:t xml:space="preserve"> </w:t>
-        </w:r>
-        <w:r>
-          <w:rPr>
-            <w:rStyle w:val="Hyperlink"/>
-          </w:rPr>
-          <w:t xml:space="preserve">Savings</w:t>
-        </w:r>
-        <w:r>
-          <w:rPr>
-            <w:rStyle w:val="Hyperlink"/>
-          </w:rPr>
-          <w:t xml:space="preserve"> </w:t>
-        </w:r>
-        <w:r>
-          <w:rPr>
-            <w:rStyle w:val="Hyperlink"/>
-          </w:rPr>
-          <w:t xml:space="preserve">Program</w:t>
-        </w:r>
-        <w:r>
-          <w:rPr>
-            <w:rStyle w:val="Hyperlink"/>
-          </w:rPr>
-          <w:t xml:space="preserve"> </w:t>
-        </w:r>
-        <w:r>
-          <w:rPr>
-            <w:rStyle w:val="Hyperlink"/>
-          </w:rPr>
-          <w:t xml:space="preserve">enrollment, performance years 2014-2026</w:t>
-        </w:r>
-      </w:hyperlink>
-      <w:r>
-        <w:t xml:space="preserve">. 2026.</w:t>
+          <w:t xml:space="preserve">https://www.milliman.com/-/media/milliman/pdfs/2024-articles/4-2-24_medicare_shared_savings_program_aco_financial_results_for_2022.ashx</w:t>
+        </w:r>
+      </w:hyperlink>
+      <w:r>
+        <w:t xml:space="preserve">. Accessed 28 Oct 2026.</w:t>
       </w:r>
     </w:p>
     <w:bookmarkEnd w:id="116"/>
@@ -10268,7 +10005,43 @@
         <w:pStyle w:val="Bibliography"/>
       </w:pPr>
       <w:r>
-        <w:t xml:space="preserve">26. Milliman.</w:t>
+        <w:t xml:space="preserve">26. Milliman. Annual renewal considerations in the</w:t>
+      </w:r>
+      <w:r>
+        <w:t xml:space="preserve"> </w:t>
+      </w:r>
+      <w:r>
+        <w:t xml:space="preserve">Medicare</w:t>
+      </w:r>
+      <w:r>
+        <w:t xml:space="preserve"> </w:t>
+      </w:r>
+      <w:r>
+        <w:t xml:space="preserve">Shared</w:t>
+      </w:r>
+      <w:r>
+        <w:t xml:space="preserve"> </w:t>
+      </w:r>
+      <w:r>
+        <w:t xml:space="preserve">Savings</w:t>
+      </w:r>
+      <w:r>
+        <w:t xml:space="preserve"> </w:t>
+      </w:r>
+      <w:r>
+        <w:t xml:space="preserve">Program</w:t>
+      </w:r>
+      <w:r>
+        <w:t xml:space="preserve"> </w:t>
+      </w:r>
+      <w:r>
+        <w:t xml:space="preserve">(</w:t>
+      </w:r>
+      <w:r>
+        <w:t xml:space="preserve">MSSP</w:t>
+      </w:r>
+      <w:r>
+        <w:t xml:space="preserve">). Case study. Milliman; 2025.</w:t>
       </w:r>
       <w:r>
         <w:t xml:space="preserve"> </w:t>
@@ -10278,83 +10051,11 @@
           <w:rPr>
             <w:rStyle w:val="Hyperlink"/>
           </w:rPr>
-          <w:t xml:space="preserve">Annual renewal considerations in the</w:t>
-        </w:r>
-        <w:r>
-          <w:rPr>
-            <w:rStyle w:val="Hyperlink"/>
-          </w:rPr>
-          <w:t xml:space="preserve"> </w:t>
-        </w:r>
-        <w:r>
-          <w:rPr>
-            <w:rStyle w:val="Hyperlink"/>
-          </w:rPr>
-          <w:t xml:space="preserve">Medicare</w:t>
-        </w:r>
-        <w:r>
-          <w:rPr>
-            <w:rStyle w:val="Hyperlink"/>
-          </w:rPr>
-          <w:t xml:space="preserve"> </w:t>
-        </w:r>
-        <w:r>
-          <w:rPr>
-            <w:rStyle w:val="Hyperlink"/>
-          </w:rPr>
-          <w:t xml:space="preserve">Shared</w:t>
-        </w:r>
-        <w:r>
-          <w:rPr>
-            <w:rStyle w:val="Hyperlink"/>
-          </w:rPr>
-          <w:t xml:space="preserve"> </w:t>
-        </w:r>
-        <w:r>
-          <w:rPr>
-            <w:rStyle w:val="Hyperlink"/>
-          </w:rPr>
-          <w:t xml:space="preserve">Savings</w:t>
-        </w:r>
-        <w:r>
-          <w:rPr>
-            <w:rStyle w:val="Hyperlink"/>
-          </w:rPr>
-          <w:t xml:space="preserve"> </w:t>
-        </w:r>
-        <w:r>
-          <w:rPr>
-            <w:rStyle w:val="Hyperlink"/>
-          </w:rPr>
-          <w:t xml:space="preserve">Program</w:t>
-        </w:r>
-        <w:r>
-          <w:rPr>
-            <w:rStyle w:val="Hyperlink"/>
-          </w:rPr>
-          <w:t xml:space="preserve"> </w:t>
-        </w:r>
-        <w:r>
-          <w:rPr>
-            <w:rStyle w:val="Hyperlink"/>
-          </w:rPr>
-          <w:t xml:space="preserve">(</w:t>
-        </w:r>
-        <w:r>
-          <w:rPr>
-            <w:rStyle w:val="Hyperlink"/>
-          </w:rPr>
-          <w:t xml:space="preserve">MSSP</w:t>
-        </w:r>
-        <w:r>
-          <w:rPr>
-            <w:rStyle w:val="Hyperlink"/>
-          </w:rPr>
-          <w:t xml:space="preserve">)</w:t>
-        </w:r>
-      </w:hyperlink>
-      <w:r>
-        <w:t xml:space="preserve">. Case study. Milliman; 2025.</w:t>
+          <w:t xml:space="preserve">https://edge.sitecorecloud.io/millimaninc5660-milliman6442-prod27d5-0001/media/Milliman/PDFs/2025-Articles/4-7-25_MSSP-annual-renewal-considerations.pdf</w:t>
+        </w:r>
+      </w:hyperlink>
+      <w:r>
+        <w:t xml:space="preserve">. Accessed 28 Oct 2026.</w:t>
       </w:r>
     </w:p>
     <w:bookmarkEnd w:id="118"/>
@@ -10364,7 +10065,31 @@
         <w:pStyle w:val="Bibliography"/>
       </w:pPr>
       <w:r>
-        <w:t xml:space="preserve">27. Centers for Medicare &amp; Medicaid Services.</w:t>
+        <w:t xml:space="preserve">27. Centers for Medicare &amp; Medicaid Services. 42</w:t>
+      </w:r>
+      <w:r>
+        <w:t xml:space="preserve"> </w:t>
+      </w:r>
+      <w:r>
+        <w:t xml:space="preserve">CFR</w:t>
+      </w:r>
+      <w:r>
+        <w:t xml:space="preserve"> </w:t>
+      </w:r>
+      <w:r>
+        <w:t xml:space="preserve">425.652, 425.656 and 425.658: Benchmarks, regional adjustment and prior savings adjustment for agreement periods beginning on</w:t>
+      </w:r>
+      <w:r>
+        <w:t xml:space="preserve"> </w:t>
+      </w:r>
+      <w:r>
+        <w:t xml:space="preserve">January</w:t>
+      </w:r>
+      <w:r>
+        <w:t xml:space="preserve"> </w:t>
+      </w:r>
+      <w:r>
+        <w:t xml:space="preserve">1, 2024, and in subsequent years. 2024.</w:t>
       </w:r>
       <w:r>
         <w:t xml:space="preserve"> </w:t>
@@ -10374,59 +10099,11 @@
           <w:rPr>
             <w:rStyle w:val="Hyperlink"/>
           </w:rPr>
-          <w:t xml:space="preserve">42</w:t>
-        </w:r>
-        <w:r>
-          <w:rPr>
-            <w:rStyle w:val="Hyperlink"/>
-          </w:rPr>
-          <w:t xml:space="preserve"> </w:t>
-        </w:r>
-        <w:r>
-          <w:rPr>
-            <w:rStyle w:val="Hyperlink"/>
-          </w:rPr>
-          <w:t xml:space="preserve">CFR</w:t>
-        </w:r>
-        <w:r>
-          <w:rPr>
-            <w:rStyle w:val="Hyperlink"/>
-          </w:rPr>
-          <w:t xml:space="preserve"> </w:t>
-        </w:r>
-        <w:r>
-          <w:rPr>
-            <w:rStyle w:val="Hyperlink"/>
-          </w:rPr>
-          <w:t xml:space="preserve">425.652, 425.656 and 425.658: Benchmarks, regional adjustment and prior savings adjustment for agreement periods beginning on</w:t>
-        </w:r>
-        <w:r>
-          <w:rPr>
-            <w:rStyle w:val="Hyperlink"/>
-          </w:rPr>
-          <w:t xml:space="preserve"> </w:t>
-        </w:r>
-        <w:r>
-          <w:rPr>
-            <w:rStyle w:val="Hyperlink"/>
-          </w:rPr>
-          <w:t xml:space="preserve">January</w:t>
-        </w:r>
-        <w:r>
-          <w:rPr>
-            <w:rStyle w:val="Hyperlink"/>
-          </w:rPr>
-          <w:t xml:space="preserve"> </w:t>
-        </w:r>
-        <w:r>
-          <w:rPr>
-            <w:rStyle w:val="Hyperlink"/>
-          </w:rPr>
-          <w:t xml:space="preserve">1, 2024, and in subsequent years</w:t>
-        </w:r>
-      </w:hyperlink>
-      <w:r>
-        <w:t xml:space="preserve">. 2024.</w:t>
+          <w:t xml:space="preserve">https://www.ecfr.gov/on/2024-01-01/title-42/chapter-IV/subchapter-B/part-425/subpart-G/section-425.652</w:t>
+        </w:r>
+      </w:hyperlink>
+      <w:r>
+        <w:t xml:space="preserve">. Accessed 28 Oct 2026.</w:t>
       </w:r>
     </w:p>
     <w:bookmarkEnd w:id="120"/>
@@ -10541,7 +10218,25 @@
         <w:pStyle w:val="Bibliography"/>
       </w:pPr>
       <w:r>
-        <w:t xml:space="preserve">30. Harrold ST.</w:t>
+        <w:t xml:space="preserve">30. Harrold ST. Registered analysis code for the</w:t>
+      </w:r>
+      <w:r>
+        <w:t xml:space="preserve"> </w:t>
+      </w:r>
+      <w:r>
+        <w:t xml:space="preserve">MSSP</w:t>
+      </w:r>
+      <w:r>
+        <w:t xml:space="preserve"> </w:t>
+      </w:r>
+      <w:r>
+        <w:t xml:space="preserve">early-renewal study (</w:t>
+      </w:r>
+      <w:r>
+        <w:t xml:space="preserve">analysis/mssp-benchmark-ratchet</w:t>
+      </w:r>
+      <w:r>
+        <w:t xml:space="preserve">), commit a4064f5. 2026.</w:t>
       </w:r>
       <w:r>
         <w:t xml:space="preserve"> </w:t>
@@ -10551,47 +10246,11 @@
           <w:rPr>
             <w:rStyle w:val="Hyperlink"/>
           </w:rPr>
-          <w:t xml:space="preserve">Registered analysis code for the</w:t>
-        </w:r>
-        <w:r>
-          <w:rPr>
-            <w:rStyle w:val="Hyperlink"/>
-          </w:rPr>
-          <w:t xml:space="preserve"> </w:t>
-        </w:r>
-        <w:r>
-          <w:rPr>
-            <w:rStyle w:val="Hyperlink"/>
-          </w:rPr>
-          <w:t xml:space="preserve">MSSP</w:t>
-        </w:r>
-        <w:r>
-          <w:rPr>
-            <w:rStyle w:val="Hyperlink"/>
-          </w:rPr>
-          <w:t xml:space="preserve"> </w:t>
-        </w:r>
-        <w:r>
-          <w:rPr>
-            <w:rStyle w:val="Hyperlink"/>
-          </w:rPr>
-          <w:t xml:space="preserve">early-renewal study (</w:t>
-        </w:r>
-        <w:r>
-          <w:rPr>
-            <w:rStyle w:val="Hyperlink"/>
-          </w:rPr>
-          <w:t xml:space="preserve">analysis/mssp-benchmark-ratchet</w:t>
-        </w:r>
-        <w:r>
-          <w:rPr>
-            <w:rStyle w:val="Hyperlink"/>
-          </w:rPr>
-          <w:t xml:space="preserve">), commit a4064f5</w:t>
-        </w:r>
-      </w:hyperlink>
-      <w:r>
-        <w:t xml:space="preserve">. 2026.</w:t>
+          <w:t xml:space="preserve">https://github.com/stharrold/stharrold.github.io/tree/a4064f592a492d971ce3c27e95afb3050e6bc01d/analysis/mssp-benchmark-ratchet</w:t>
+        </w:r>
+      </w:hyperlink>
+      <w:r>
+        <w:t xml:space="preserve">. Accessed 28 Oct 2026.</w:t>
       </w:r>
     </w:p>
     <w:bookmarkEnd w:id="126"/>
@@ -10601,7 +10260,7 @@
         <w:pStyle w:val="Bibliography"/>
       </w:pPr>
       <w:r>
-        <w:t xml:space="preserve">31. Centers for Medicare &amp; Medicaid Services.</w:t>
+        <w:t xml:space="preserve">31. Centers for Medicare &amp; Medicaid Services. Performance year financial and quality results, performance years 2013-2024. 2026.</w:t>
       </w:r>
       <w:r>
         <w:t xml:space="preserve"> </w:t>
@@ -10611,11 +10270,11 @@
           <w:rPr>
             <w:rStyle w:val="Hyperlink"/>
           </w:rPr>
-          <w:t xml:space="preserve">Performance year financial and quality results, performance years 2013-2024</w:t>
-        </w:r>
-      </w:hyperlink>
-      <w:r>
-        <w:t xml:space="preserve">. 2026.</w:t>
+          <w:t xml:space="preserve">https://data.cms.gov/medicare-shared-savings-program/performance-year-financial-and-quality-results</w:t>
+        </w:r>
+      </w:hyperlink>
+      <w:r>
+        <w:t xml:space="preserve">. Accessed 22 Oct 2026.</w:t>
       </w:r>
     </w:p>
     <w:bookmarkEnd w:id="128"/>
@@ -10625,7 +10284,7 @@
         <w:pStyle w:val="Bibliography"/>
       </w:pPr>
       <w:r>
-        <w:t xml:space="preserve">32. Centers for Medicare &amp; Medicaid Services.</w:t>
+        <w:t xml:space="preserve">32. Centers for Medicare &amp; Medicaid Services. County-level aggregate expenditure and risk score data on assignable beneficiaries. 2026.</w:t>
       </w:r>
       <w:r>
         <w:t xml:space="preserve"> </w:t>
@@ -10635,11 +10294,11 @@
           <w:rPr>
             <w:rStyle w:val="Hyperlink"/>
           </w:rPr>
-          <w:t xml:space="preserve">County-level aggregate expenditure and risk score data on assignable beneficiaries</w:t>
-        </w:r>
-      </w:hyperlink>
-      <w:r>
-        <w:t xml:space="preserve">. 2026.</w:t>
+          <w:t xml:space="preserve">https://data.cms.gov/medicare-shared-savings-program/county-level-aggregate-expenditure-and-risk-score-data-on-assignable-beneficiaries</w:t>
+        </w:r>
+      </w:hyperlink>
+      <w:r>
+        <w:t xml:space="preserve">. Accessed 22 Oct 2026.</w:t>
       </w:r>
     </w:p>
     <w:bookmarkEnd w:id="130"/>
@@ -10649,7 +10308,7 @@
         <w:pStyle w:val="Bibliography"/>
       </w:pPr>
       <w:r>
-        <w:t xml:space="preserve">33. Centers for Medicare &amp; Medicaid Services.</w:t>
+        <w:t xml:space="preserve">33. Centers for Medicare &amp; Medicaid Services. Number of accountable care organization assigned beneficiaries by county. 2026.</w:t>
       </w:r>
       <w:r>
         <w:t xml:space="preserve"> </w:t>
@@ -10659,11 +10318,11 @@
           <w:rPr>
             <w:rStyle w:val="Hyperlink"/>
           </w:rPr>
-          <w:t xml:space="preserve">Number of accountable care organization assigned beneficiaries by county</w:t>
-        </w:r>
-      </w:hyperlink>
-      <w:r>
-        <w:t xml:space="preserve">. 2026.</w:t>
+          <w:t xml:space="preserve">https://data.cms.gov/medicare-shared-savings-program/number-of-accountable-care-organization-assigned-beneficiaries-by-county</w:t>
+        </w:r>
+      </w:hyperlink>
+      <w:r>
+        <w:t xml:space="preserve">. Accessed 22 Oct 2026.</w:t>
       </w:r>
     </w:p>
     <w:bookmarkEnd w:id="132"/>
@@ -10744,28 +10403,28 @@
       <w:r>
         <w:t xml:space="preserve"> </w:t>
       </w:r>
+      <w:r>
+        <w:t xml:space="preserve">CMS</w:t>
+      </w:r>
+      <w:r>
+        <w:t xml:space="preserve"> </w:t>
+      </w:r>
+      <w:r>
+        <w:t xml:space="preserve">cell suppression policy. 2020.</w:t>
+      </w:r>
+      <w:r>
+        <w:t xml:space="preserve"> </w:t>
+      </w:r>
       <w:hyperlink r:id="rId135">
         <w:r>
           <w:rPr>
             <w:rStyle w:val="Hyperlink"/>
           </w:rPr>
-          <w:t xml:space="preserve">CMS</w:t>
-        </w:r>
-        <w:r>
-          <w:rPr>
-            <w:rStyle w:val="Hyperlink"/>
-          </w:rPr>
-          <w:t xml:space="preserve"> </w:t>
-        </w:r>
-        <w:r>
-          <w:rPr>
-            <w:rStyle w:val="Hyperlink"/>
-          </w:rPr>
-          <w:t xml:space="preserve">cell suppression policy</w:t>
-        </w:r>
-      </w:hyperlink>
-      <w:r>
-        <w:t xml:space="preserve">. 2020.</w:t>
+          <w:t xml:space="preserve">https://web.archive.org/web/20250516214605/https://www.hhs.gov/guidance/document/cms-cell-suppression-policy</w:t>
+        </w:r>
+      </w:hyperlink>
+      <w:r>
+        <w:t xml:space="preserve">. Accessed 28 Oct 2026.</w:t>
       </w:r>
     </w:p>
     <w:bookmarkEnd w:id="136"/>
@@ -10775,7 +10434,28 @@
         <w:pStyle w:val="Bibliography"/>
       </w:pPr>
       <w:r>
-        <w:t xml:space="preserve">36. Centers for Medicare &amp; Medicaid Services.</w:t>
+        <w:t xml:space="preserve">36. Centers for Medicare &amp; Medicaid Services. Medicare</w:t>
+      </w:r>
+      <w:r>
+        <w:t xml:space="preserve"> </w:t>
+      </w:r>
+      <w:r>
+        <w:t xml:space="preserve">Shared</w:t>
+      </w:r>
+      <w:r>
+        <w:t xml:space="preserve"> </w:t>
+      </w:r>
+      <w:r>
+        <w:t xml:space="preserve">Savings</w:t>
+      </w:r>
+      <w:r>
+        <w:t xml:space="preserve"> </w:t>
+      </w:r>
+      <w:r>
+        <w:t xml:space="preserve">Program</w:t>
+      </w:r>
+      <w:r>
+        <w:t xml:space="preserve">: Shared savings and losses and assignment methodology specifications, version 10. 2022.</w:t>
       </w:r>
       <w:r>
         <w:t xml:space="preserve"> </w:t>
@@ -10785,53 +10465,11 @@
           <w:rPr>
             <w:rStyle w:val="Hyperlink"/>
           </w:rPr>
-          <w:t xml:space="preserve">Medicare</w:t>
-        </w:r>
-        <w:r>
-          <w:rPr>
-            <w:rStyle w:val="Hyperlink"/>
-          </w:rPr>
-          <w:t xml:space="preserve"> </w:t>
-        </w:r>
-        <w:r>
-          <w:rPr>
-            <w:rStyle w:val="Hyperlink"/>
-          </w:rPr>
-          <w:t xml:space="preserve">Shared</w:t>
-        </w:r>
-        <w:r>
-          <w:rPr>
-            <w:rStyle w:val="Hyperlink"/>
-          </w:rPr>
-          <w:t xml:space="preserve"> </w:t>
-        </w:r>
-        <w:r>
-          <w:rPr>
-            <w:rStyle w:val="Hyperlink"/>
-          </w:rPr>
-          <w:t xml:space="preserve">Savings</w:t>
-        </w:r>
-        <w:r>
-          <w:rPr>
-            <w:rStyle w:val="Hyperlink"/>
-          </w:rPr>
-          <w:t xml:space="preserve"> </w:t>
-        </w:r>
-        <w:r>
-          <w:rPr>
-            <w:rStyle w:val="Hyperlink"/>
-          </w:rPr>
-          <w:t xml:space="preserve">Program</w:t>
-        </w:r>
-        <w:r>
-          <w:rPr>
-            <w:rStyle w:val="Hyperlink"/>
-          </w:rPr>
-          <w:t xml:space="preserve">: Shared savings and losses and assignment methodology specifications, version 10</w:t>
-        </w:r>
-      </w:hyperlink>
-      <w:r>
-        <w:t xml:space="preserve">. 2022.</w:t>
+          <w:t xml:space="preserve">https://www.cms.gov/files/document/medicare-shared-savings-program-shared-savings-and-losses-and-assignment-methodology-specifications.pdf-1</w:t>
+        </w:r>
+      </w:hyperlink>
+      <w:r>
+        <w:t xml:space="preserve">. Accessed 28 Oct 2026.</w:t>
       </w:r>
     </w:p>
     <w:bookmarkEnd w:id="138"/>
@@ -10841,7 +10479,31 @@
         <w:pStyle w:val="Bibliography"/>
       </w:pPr>
       <w:r>
-        <w:t xml:space="preserve">37. Centers for Medicare &amp; Medicaid Services.</w:t>
+        <w:t xml:space="preserve">37. Centers for Medicare &amp; Medicaid Services. 42</w:t>
+      </w:r>
+      <w:r>
+        <w:t xml:space="preserve"> </w:t>
+      </w:r>
+      <w:r>
+        <w:t xml:space="preserve">CFR</w:t>
+      </w:r>
+      <w:r>
+        <w:t xml:space="preserve"> </w:t>
+      </w:r>
+      <w:r>
+        <w:t xml:space="preserve">425.600:</w:t>
+      </w:r>
+      <w:r>
+        <w:t xml:space="preserve"> </w:t>
+      </w:r>
+      <w:r>
+        <w:t xml:space="preserve">Selection</w:t>
+      </w:r>
+      <w:r>
+        <w:t xml:space="preserve"> </w:t>
+      </w:r>
+      <w:r>
+        <w:t xml:space="preserve">of risk model. 2022.</w:t>
       </w:r>
       <w:r>
         <w:t xml:space="preserve"> </w:t>
@@ -10851,59 +10513,11 @@
           <w:rPr>
             <w:rStyle w:val="Hyperlink"/>
           </w:rPr>
-          <w:t xml:space="preserve">42</w:t>
-        </w:r>
-        <w:r>
-          <w:rPr>
-            <w:rStyle w:val="Hyperlink"/>
-          </w:rPr>
-          <w:t xml:space="preserve"> </w:t>
-        </w:r>
-        <w:r>
-          <w:rPr>
-            <w:rStyle w:val="Hyperlink"/>
-          </w:rPr>
-          <w:t xml:space="preserve">CFR</w:t>
-        </w:r>
-        <w:r>
-          <w:rPr>
-            <w:rStyle w:val="Hyperlink"/>
-          </w:rPr>
-          <w:t xml:space="preserve"> </w:t>
-        </w:r>
-        <w:r>
-          <w:rPr>
-            <w:rStyle w:val="Hyperlink"/>
-          </w:rPr>
-          <w:t xml:space="preserve">425.600:</w:t>
-        </w:r>
-        <w:r>
-          <w:rPr>
-            <w:rStyle w:val="Hyperlink"/>
-          </w:rPr>
-          <w:t xml:space="preserve"> </w:t>
-        </w:r>
-        <w:r>
-          <w:rPr>
-            <w:rStyle w:val="Hyperlink"/>
-          </w:rPr>
-          <w:t xml:space="preserve">Selection</w:t>
-        </w:r>
-        <w:r>
-          <w:rPr>
-            <w:rStyle w:val="Hyperlink"/>
-          </w:rPr>
-          <w:t xml:space="preserve"> </w:t>
-        </w:r>
-        <w:r>
-          <w:rPr>
-            <w:rStyle w:val="Hyperlink"/>
-          </w:rPr>
-          <w:t xml:space="preserve">of risk model</w:t>
-        </w:r>
-      </w:hyperlink>
-      <w:r>
-        <w:t xml:space="preserve">. 2022.</w:t>
+          <w:t xml:space="preserve">https://www.ecfr.gov/on/2022-01-01/title-42/chapter-IV/subchapter-B/part-425/subpart-G/section-425.600#p-425.600%28d%29</w:t>
+        </w:r>
+      </w:hyperlink>
+      <w:r>
+        <w:t xml:space="preserve">. Accessed 28 Oct 2026.</w:t>
       </w:r>
     </w:p>
     <w:bookmarkEnd w:id="140"/>
@@ -10985,7 +10599,40 @@
         <w:pStyle w:val="Bibliography"/>
       </w:pPr>
       <w:r>
-        <w:t xml:space="preserve">41. Hoffman MD, Gelman A.</w:t>
+        <w:t xml:space="preserve">41. Hoffman MD, Gelman A. The</w:t>
+      </w:r>
+      <w:r>
+        <w:t xml:space="preserve"> </w:t>
+      </w:r>
+      <w:r>
+        <w:t xml:space="preserve">No-U-Turn</w:t>
+      </w:r>
+      <w:r>
+        <w:t xml:space="preserve"> </w:t>
+      </w:r>
+      <w:r>
+        <w:t xml:space="preserve">sampler: Adaptively setting path lengths in</w:t>
+      </w:r>
+      <w:r>
+        <w:t xml:space="preserve"> </w:t>
+      </w:r>
+      <w:r>
+        <w:t xml:space="preserve">Hamiltonian</w:t>
+      </w:r>
+      <w:r>
+        <w:t xml:space="preserve"> </w:t>
+      </w:r>
+      <w:r>
+        <w:t xml:space="preserve">Monte</w:t>
+      </w:r>
+      <w:r>
+        <w:t xml:space="preserve"> </w:t>
+      </w:r>
+      <w:r>
+        <w:t xml:space="preserve">Carlo</w:t>
+      </w:r>
+      <w:r>
+        <w:t xml:space="preserve">. Journal of Machine Learning Research. 2014;15:1593–623.</w:t>
       </w:r>
       <w:r>
         <w:t xml:space="preserve"> </w:t>
@@ -10995,71 +10642,11 @@
           <w:rPr>
             <w:rStyle w:val="Hyperlink"/>
           </w:rPr>
-          <w:t xml:space="preserve">The</w:t>
-        </w:r>
-        <w:r>
-          <w:rPr>
-            <w:rStyle w:val="Hyperlink"/>
-          </w:rPr>
-          <w:t xml:space="preserve"> </w:t>
-        </w:r>
-        <w:r>
-          <w:rPr>
-            <w:rStyle w:val="Hyperlink"/>
-          </w:rPr>
-          <w:t xml:space="preserve">No-U-Turn</w:t>
-        </w:r>
-        <w:r>
-          <w:rPr>
-            <w:rStyle w:val="Hyperlink"/>
-          </w:rPr>
-          <w:t xml:space="preserve"> </w:t>
-        </w:r>
-        <w:r>
-          <w:rPr>
-            <w:rStyle w:val="Hyperlink"/>
-          </w:rPr>
-          <w:t xml:space="preserve">sampler: Adaptively setting path lengths in</w:t>
-        </w:r>
-        <w:r>
-          <w:rPr>
-            <w:rStyle w:val="Hyperlink"/>
-          </w:rPr>
-          <w:t xml:space="preserve"> </w:t>
-        </w:r>
-        <w:r>
-          <w:rPr>
-            <w:rStyle w:val="Hyperlink"/>
-          </w:rPr>
-          <w:t xml:space="preserve">Hamiltonian</w:t>
-        </w:r>
-        <w:r>
-          <w:rPr>
-            <w:rStyle w:val="Hyperlink"/>
-          </w:rPr>
-          <w:t xml:space="preserve"> </w:t>
-        </w:r>
-        <w:r>
-          <w:rPr>
-            <w:rStyle w:val="Hyperlink"/>
-          </w:rPr>
-          <w:t xml:space="preserve">Monte</w:t>
-        </w:r>
-        <w:r>
-          <w:rPr>
-            <w:rStyle w:val="Hyperlink"/>
-          </w:rPr>
-          <w:t xml:space="preserve"> </w:t>
-        </w:r>
-        <w:r>
-          <w:rPr>
-            <w:rStyle w:val="Hyperlink"/>
-          </w:rPr>
-          <w:t xml:space="preserve">Carlo</w:t>
-        </w:r>
-      </w:hyperlink>
-      <w:r>
-        <w:t xml:space="preserve">. Journal of Machine Learning Research. 2014;15:1593–623.</w:t>
+          <w:t xml:space="preserve">https://jmlr.org/papers/v15/hoffman14a.html</w:t>
+        </w:r>
+      </w:hyperlink>
+      <w:r>
+        <w:t xml:space="preserve">. Accessed 28 Oct 2026.</w:t>
       </w:r>
     </w:p>
     <w:bookmarkEnd w:id="148"/>
@@ -11146,58 +10733,46 @@
       <w:r>
         <w:t xml:space="preserve"> </w:t>
       </w:r>
+      <w:r>
+        <w:t xml:space="preserve">firthmodels</w:t>
+      </w:r>
+      <w:r>
+        <w:t xml:space="preserve"> </w:t>
+      </w:r>
+      <w:r>
+        <w:t xml:space="preserve">0.8.2:</w:t>
+      </w:r>
+      <w:r>
+        <w:t xml:space="preserve"> </w:t>
+      </w:r>
+      <w:r>
+        <w:t xml:space="preserve">Firth</w:t>
+      </w:r>
+      <w:r>
+        <w:t xml:space="preserve">-penalized models in</w:t>
+      </w:r>
+      <w:r>
+        <w:t xml:space="preserve"> </w:t>
+      </w:r>
+      <w:r>
+        <w:t xml:space="preserve">Python</w:t>
+      </w:r>
+      <w:r>
+        <w:t xml:space="preserve">. 2026.</w:t>
+      </w:r>
+      <w:r>
+        <w:t xml:space="preserve"> </w:t>
+      </w:r>
       <w:hyperlink r:id="rId155">
         <w:r>
           <w:rPr>
             <w:rStyle w:val="Hyperlink"/>
           </w:rPr>
-          <w:t xml:space="preserve">firthmodels</w:t>
-        </w:r>
-        <w:r>
-          <w:rPr>
-            <w:rStyle w:val="Hyperlink"/>
-          </w:rPr>
-          <w:t xml:space="preserve"> </w:t>
-        </w:r>
-        <w:r>
-          <w:rPr>
-            <w:rStyle w:val="Hyperlink"/>
-          </w:rPr>
-          <w:t xml:space="preserve">0.8.2:</w:t>
-        </w:r>
-        <w:r>
-          <w:rPr>
-            <w:rStyle w:val="Hyperlink"/>
-          </w:rPr>
-          <w:t xml:space="preserve"> </w:t>
-        </w:r>
-        <w:r>
-          <w:rPr>
-            <w:rStyle w:val="Hyperlink"/>
-          </w:rPr>
-          <w:t xml:space="preserve">Firth</w:t>
-        </w:r>
-        <w:r>
-          <w:rPr>
-            <w:rStyle w:val="Hyperlink"/>
-          </w:rPr>
-          <w:t xml:space="preserve">-penalized models in</w:t>
-        </w:r>
-        <w:r>
-          <w:rPr>
-            <w:rStyle w:val="Hyperlink"/>
-          </w:rPr>
-          <w:t xml:space="preserve"> </w:t>
-        </w:r>
-        <w:r>
-          <w:rPr>
-            <w:rStyle w:val="Hyperlink"/>
-          </w:rPr>
-          <w:t xml:space="preserve">Python</w:t>
-        </w:r>
-      </w:hyperlink>
-      <w:r>
-        <w:t xml:space="preserve">. 2026.</w:t>
+          <w:t xml:space="preserve">https://github.com/jzluo/firthmodels</w:t>
+        </w:r>
+      </w:hyperlink>
+      <w:r>
+        <w:t xml:space="preserve">. Accessed 28 Oct 2026.</w:t>
       </w:r>
     </w:p>
     <w:bookmarkEnd w:id="156"/>
@@ -11449,52 +11024,40 @@
       <w:r>
         <w:t xml:space="preserve"> </w:t>
       </w:r>
+      <w:r>
+        <w:t xml:space="preserve">dbt-core</w:t>
+      </w:r>
+      <w:r>
+        <w:t xml:space="preserve"> </w:t>
+      </w:r>
+      <w:r>
+        <w:t xml:space="preserve">1.12.6 and</w:t>
+      </w:r>
+      <w:r>
+        <w:t xml:space="preserve"> </w:t>
+      </w:r>
+      <w:r>
+        <w:t xml:space="preserve">dbt-duckdb</w:t>
+      </w:r>
+      <w:r>
+        <w:t xml:space="preserve"> </w:t>
+      </w:r>
+      <w:r>
+        <w:t xml:space="preserve">1.11.0. 2026.</w:t>
+      </w:r>
+      <w:r>
+        <w:t xml:space="preserve"> </w:t>
+      </w:r>
       <w:hyperlink r:id="rId175">
         <w:r>
           <w:rPr>
             <w:rStyle w:val="Hyperlink"/>
           </w:rPr>
-          <w:t xml:space="preserve">dbt-core</w:t>
-        </w:r>
-        <w:r>
-          <w:rPr>
-            <w:rStyle w:val="Hyperlink"/>
-          </w:rPr>
-          <w:t xml:space="preserve"> </w:t>
-        </w:r>
-        <w:r>
-          <w:rPr>
-            <w:rStyle w:val="Hyperlink"/>
-          </w:rPr>
-          <w:t xml:space="preserve">1.12.6 and</w:t>
-        </w:r>
-        <w:r>
-          <w:rPr>
-            <w:rStyle w:val="Hyperlink"/>
-          </w:rPr>
-          <w:t xml:space="preserve"> </w:t>
-        </w:r>
-        <w:r>
-          <w:rPr>
-            <w:rStyle w:val="Hyperlink"/>
-          </w:rPr>
-          <w:t xml:space="preserve">dbt-duckdb</w:t>
-        </w:r>
-        <w:r>
-          <w:rPr>
-            <w:rStyle w:val="Hyperlink"/>
-          </w:rPr>
-          <w:t xml:space="preserve"> </w:t>
-        </w:r>
-        <w:r>
-          <w:rPr>
-            <w:rStyle w:val="Hyperlink"/>
-          </w:rPr>
-          <w:t xml:space="preserve">1.11.0</w:t>
-        </w:r>
-      </w:hyperlink>
-      <w:r>
-        <w:t xml:space="preserve">. 2026.</w:t>
+          <w:t xml:space="preserve">https://github.com/dbt-labs/dbt-core</w:t>
+        </w:r>
+      </w:hyperlink>
+      <w:r>
+        <w:t xml:space="preserve">. Accessed 28 Oct 2026.</w:t>
       </w:r>
     </w:p>
     <w:bookmarkEnd w:id="176"/>
@@ -11533,46 +11096,37 @@
       <w:r>
         <w:t xml:space="preserve"> </w:t>
       </w:r>
+      <w:r>
+        <w:t xml:space="preserve">uv</w:t>
+      </w:r>
+      <w:r>
+        <w:t xml:space="preserve">: An extremely fast</w:t>
+      </w:r>
+      <w:r>
+        <w:t xml:space="preserve"> </w:t>
+      </w:r>
+      <w:r>
+        <w:t xml:space="preserve">Python</w:t>
+      </w:r>
+      <w:r>
+        <w:t xml:space="preserve"> </w:t>
+      </w:r>
+      <w:r>
+        <w:t xml:space="preserve">package and project manager. 2026.</w:t>
+      </w:r>
+      <w:r>
+        <w:t xml:space="preserve"> </w:t>
+      </w:r>
       <w:hyperlink r:id="rId179">
         <w:r>
           <w:rPr>
             <w:rStyle w:val="Hyperlink"/>
           </w:rPr>
-          <w:t xml:space="preserve">uv</w:t>
-        </w:r>
-        <w:r>
-          <w:rPr>
-            <w:rStyle w:val="Hyperlink"/>
-          </w:rPr>
-          <w:t xml:space="preserve">: An extremely fast</w:t>
-        </w:r>
-        <w:r>
-          <w:rPr>
-            <w:rStyle w:val="Hyperlink"/>
-          </w:rPr>
-          <w:t xml:space="preserve"> </w:t>
-        </w:r>
-        <w:r>
-          <w:rPr>
-            <w:rStyle w:val="Hyperlink"/>
-          </w:rPr>
-          <w:t xml:space="preserve">Python</w:t>
-        </w:r>
-        <w:r>
-          <w:rPr>
-            <w:rStyle w:val="Hyperlink"/>
-          </w:rPr>
-          <w:t xml:space="preserve"> </w:t>
-        </w:r>
-        <w:r>
-          <w:rPr>
-            <w:rStyle w:val="Hyperlink"/>
-          </w:rPr>
-          <w:t xml:space="preserve">package and project manager</w:t>
-        </w:r>
-      </w:hyperlink>
-      <w:r>
-        <w:t xml:space="preserve">. 2026.</w:t>
+          <w:t xml:space="preserve">https://github.com/astral-sh/uv</w:t>
+        </w:r>
+      </w:hyperlink>
+      <w:r>
+        <w:t xml:space="preserve">. Accessed 28 Oct 2026.</w:t>
       </w:r>
     </w:p>
     <w:bookmarkEnd w:id="180"/>
@@ -11687,6 +11241,36 @@
         <w:t xml:space="preserve">American Hospital Association, National Association of ACOs, et al.</w:t>
       </w:r>
       <w:r>
+        <w:t xml:space="preserve"> Letter to</w:t>
+      </w:r>
+      <w:r>
+        <w:t xml:space="preserve"> </w:t>
+      </w:r>
+      <w:r>
+        <w:t xml:space="preserve">CMS</w:t>
+      </w:r>
+      <w:r>
+        <w:t xml:space="preserve">: Request to provide</w:t>
+      </w:r>
+      <w:r>
+        <w:t xml:space="preserve"> </w:t>
+      </w:r>
+      <w:r>
+        <w:t xml:space="preserve">MSSP</w:t>
+      </w:r>
+      <w:r>
+        <w:t xml:space="preserve"> </w:t>
+      </w:r>
+      <w:r>
+        <w:t xml:space="preserve">ACOs</w:t>
+      </w:r>
+      <w:r>
+        <w:t xml:space="preserve"> </w:t>
+      </w:r>
+      <w:r>
+        <w:t xml:space="preserve">an option to use pre-pandemic years to set benchmarks. 2021.</w:t>
+      </w:r>
+      <w:r>
         <w:t xml:space="preserve"> </w:t>
       </w:r>
       <w:hyperlink r:id="rId189">
@@ -11694,65 +11278,11 @@
           <w:rPr>
             <w:rStyle w:val="Hyperlink"/>
           </w:rPr>
-          <w:t xml:space="preserve">Letter to</w:t>
-        </w:r>
-        <w:r>
-          <w:rPr>
-            <w:rStyle w:val="Hyperlink"/>
-          </w:rPr>
-          <w:t xml:space="preserve"> </w:t>
-        </w:r>
-        <w:r>
-          <w:rPr>
-            <w:rStyle w:val="Hyperlink"/>
-          </w:rPr>
-          <w:t xml:space="preserve">CMS</w:t>
-        </w:r>
-        <w:r>
-          <w:rPr>
-            <w:rStyle w:val="Hyperlink"/>
-          </w:rPr>
-          <w:t xml:space="preserve">: Request to provide</w:t>
-        </w:r>
-        <w:r>
-          <w:rPr>
-            <w:rStyle w:val="Hyperlink"/>
-          </w:rPr>
-          <w:t xml:space="preserve"> </w:t>
-        </w:r>
-        <w:r>
-          <w:rPr>
-            <w:rStyle w:val="Hyperlink"/>
-          </w:rPr>
-          <w:t xml:space="preserve">MSSP</w:t>
-        </w:r>
-        <w:r>
-          <w:rPr>
-            <w:rStyle w:val="Hyperlink"/>
-          </w:rPr>
-          <w:t xml:space="preserve"> </w:t>
-        </w:r>
-        <w:r>
-          <w:rPr>
-            <w:rStyle w:val="Hyperlink"/>
-          </w:rPr>
-          <w:t xml:space="preserve">ACOs</w:t>
-        </w:r>
-        <w:r>
-          <w:rPr>
-            <w:rStyle w:val="Hyperlink"/>
-          </w:rPr>
-          <w:t xml:space="preserve"> </w:t>
-        </w:r>
-        <w:r>
-          <w:rPr>
-            <w:rStyle w:val="Hyperlink"/>
-          </w:rPr>
-          <w:t xml:space="preserve">an option to use pre-pandemic years to set benchmarks</w:t>
-        </w:r>
-      </w:hyperlink>
-      <w:r>
-        <w:t xml:space="preserve">. 2021.</w:t>
+          <w:t xml:space="preserve">https://www.aha.org/lettercomment/2021-10-14-aha-others-cms-re-request-provide-mssp-acos-option-use-pre-pandemic-years</w:t>
+        </w:r>
+      </w:hyperlink>
+      <w:r>
+        <w:t xml:space="preserve">. Accessed 28 Oct 2026.</w:t>
       </w:r>
     </w:p>
     <w:bookmarkEnd w:id="190"/>
@@ -11762,7 +11292,31 @@
         <w:pStyle w:val="Bibliography"/>
       </w:pPr>
       <w:r>
-        <w:t xml:space="preserve">63. US Department of Health and Human Services.</w:t>
+        <w:t xml:space="preserve">63. US Department of Health and Human Services. 45</w:t>
+      </w:r>
+      <w:r>
+        <w:t xml:space="preserve"> </w:t>
+      </w:r>
+      <w:r>
+        <w:t xml:space="preserve">CFR</w:t>
+      </w:r>
+      <w:r>
+        <w:t xml:space="preserve"> </w:t>
+      </w:r>
+      <w:r>
+        <w:t xml:space="preserve">46.102:</w:t>
+      </w:r>
+      <w:r>
+        <w:t xml:space="preserve"> </w:t>
+      </w:r>
+      <w:r>
+        <w:t xml:space="preserve">Definitions</w:t>
+      </w:r>
+      <w:r>
+        <w:t xml:space="preserve"> </w:t>
+      </w:r>
+      <w:r>
+        <w:t xml:space="preserve">for purposes of this policy. 2026.</w:t>
       </w:r>
       <w:r>
         <w:t xml:space="preserve"> </w:t>
@@ -11772,59 +11326,11 @@
           <w:rPr>
             <w:rStyle w:val="Hyperlink"/>
           </w:rPr>
-          <w:t xml:space="preserve">45</w:t>
-        </w:r>
-        <w:r>
-          <w:rPr>
-            <w:rStyle w:val="Hyperlink"/>
-          </w:rPr>
-          <w:t xml:space="preserve"> </w:t>
-        </w:r>
-        <w:r>
-          <w:rPr>
-            <w:rStyle w:val="Hyperlink"/>
-          </w:rPr>
-          <w:t xml:space="preserve">CFR</w:t>
-        </w:r>
-        <w:r>
-          <w:rPr>
-            <w:rStyle w:val="Hyperlink"/>
-          </w:rPr>
-          <w:t xml:space="preserve"> </w:t>
-        </w:r>
-        <w:r>
-          <w:rPr>
-            <w:rStyle w:val="Hyperlink"/>
-          </w:rPr>
-          <w:t xml:space="preserve">46.102:</w:t>
-        </w:r>
-        <w:r>
-          <w:rPr>
-            <w:rStyle w:val="Hyperlink"/>
-          </w:rPr>
-          <w:t xml:space="preserve"> </w:t>
-        </w:r>
-        <w:r>
-          <w:rPr>
-            <w:rStyle w:val="Hyperlink"/>
-          </w:rPr>
-          <w:t xml:space="preserve">Definitions</w:t>
-        </w:r>
-        <w:r>
-          <w:rPr>
-            <w:rStyle w:val="Hyperlink"/>
-          </w:rPr>
-          <w:t xml:space="preserve"> </w:t>
-        </w:r>
-        <w:r>
-          <w:rPr>
-            <w:rStyle w:val="Hyperlink"/>
-          </w:rPr>
-          <w:t xml:space="preserve">for purposes of this policy</w:t>
-        </w:r>
-      </w:hyperlink>
-      <w:r>
-        <w:t xml:space="preserve">. 2026.</w:t>
+          <w:t xml:space="preserve">https://www.ecfr.gov/on/2026-10-01/title-45/subtitle-A/subchapter-A/part-46/subpart-A/section-46.102#p-46.102%28e%29%281%29</w:t>
+        </w:r>
+      </w:hyperlink>
+      <w:r>
+        <w:t xml:space="preserve">. Accessed 28 Oct 2026.</w:t>
       </w:r>
     </w:p>
     <w:bookmarkEnd w:id="192"/>
@@ -11870,7 +11376,37 @@
         <w:pStyle w:val="Bibliography"/>
       </w:pPr>
       <w:r>
-        <w:t xml:space="preserve">65. Harrold ST.</w:t>
+        <w:t xml:space="preserve">65. Harrold ST. Why did</w:t>
+      </w:r>
+      <w:r>
+        <w:t xml:space="preserve"> </w:t>
+      </w:r>
+      <w:r>
+        <w:t xml:space="preserve">Medicare</w:t>
+      </w:r>
+      <w:r>
+        <w:t xml:space="preserve"> </w:t>
+      </w:r>
+      <w:r>
+        <w:t xml:space="preserve">ACOs</w:t>
+      </w:r>
+      <w:r>
+        <w:t xml:space="preserve"> </w:t>
+      </w:r>
+      <w:r>
+        <w:t xml:space="preserve">reset their benchmarks early?</w:t>
+      </w:r>
+      <w:r>
+        <w:t xml:space="preserve"> </w:t>
+      </w:r>
+      <w:r>
+        <w:t xml:space="preserve">A</w:t>
+      </w:r>
+      <w:r>
+        <w:t xml:space="preserve"> </w:t>
+      </w:r>
+      <w:r>
+        <w:t xml:space="preserve">pre-registered study. 2026.</w:t>
       </w:r>
       <w:r>
         <w:t xml:space="preserve"> </w:t>
@@ -11880,71 +11416,11 @@
           <w:rPr>
             <w:rStyle w:val="Hyperlink"/>
           </w:rPr>
-          <w:t xml:space="preserve">Why did</w:t>
-        </w:r>
-        <w:r>
-          <w:rPr>
-            <w:rStyle w:val="Hyperlink"/>
-          </w:rPr>
-          <w:t xml:space="preserve"> </w:t>
-        </w:r>
-        <w:r>
-          <w:rPr>
-            <w:rStyle w:val="Hyperlink"/>
-          </w:rPr>
-          <w:t xml:space="preserve">Medicare</w:t>
-        </w:r>
-        <w:r>
-          <w:rPr>
-            <w:rStyle w:val="Hyperlink"/>
-          </w:rPr>
-          <w:t xml:space="preserve"> </w:t>
-        </w:r>
-        <w:r>
-          <w:rPr>
-            <w:rStyle w:val="Hyperlink"/>
-          </w:rPr>
-          <w:t xml:space="preserve">ACOs</w:t>
-        </w:r>
-        <w:r>
-          <w:rPr>
-            <w:rStyle w:val="Hyperlink"/>
-          </w:rPr>
-          <w:t xml:space="preserve"> </w:t>
-        </w:r>
-        <w:r>
-          <w:rPr>
-            <w:rStyle w:val="Hyperlink"/>
-          </w:rPr>
-          <w:t xml:space="preserve">reset their benchmarks early?</w:t>
-        </w:r>
-        <w:r>
-          <w:rPr>
-            <w:rStyle w:val="Hyperlink"/>
-          </w:rPr>
-          <w:t xml:space="preserve"> </w:t>
-        </w:r>
-        <w:r>
-          <w:rPr>
-            <w:rStyle w:val="Hyperlink"/>
-          </w:rPr>
-          <w:t xml:space="preserve">A</w:t>
-        </w:r>
-        <w:r>
-          <w:rPr>
-            <w:rStyle w:val="Hyperlink"/>
-          </w:rPr>
-          <w:t xml:space="preserve"> </w:t>
-        </w:r>
-        <w:r>
-          <w:rPr>
-            <w:rStyle w:val="Hyperlink"/>
-          </w:rPr>
-          <w:t xml:space="preserve">pre-registered study</w:t>
-        </w:r>
-      </w:hyperlink>
-      <w:r>
-        <w:t xml:space="preserve">. 2026.</w:t>
+          <w:t xml:space="preserve">https://stharrold.github.io/20261027-preregistered-mssp-early-renewal.html</w:t>
+        </w:r>
+      </w:hyperlink>
+      <w:r>
+        <w:t xml:space="preserve">. Accessed 28 Oct 2026.</w:t>
       </w:r>
     </w:p>
     <w:bookmarkEnd w:id="196"/>

</xml_diff>

<commit_message>
BMC package: address the collection's call, follow the full guidelines and AI policy
Cover letter: a paragraph tied to the call's wording, stating what organizations did rather than
why; prior dissemination with licence; LLM drafting stated plainly.
Paper: model named in the LLM subsection; AI disclosure in the figure legends, as Springer Nature's
AI policy asks. Table legends without commas in numbers; figure uploads closely cropped.
Validator: table commas, page breaks and shading.
standards/bmc-hsr: scripts/import_standards.py converts pages saved from the browser into local
copies, kept out of git as the publishers' text; SOURCES.md lists them and summarizes the AI policy.

Co-Authored-By: Claude Opus 5.5 <noreply@anthropic.com>
</commit_message>
<xml_diff>
--- a/paper.docx
+++ b/paper.docx
@@ -3781,7 +3781,7 @@
         <w:pStyle w:val="FirstParagraph"/>
       </w:pPr>
       <w:r>
-        <w:t xml:space="preserve">Claude Code (Anthropic), a large language model tool, was used from October 2026. It proposed the topic and drafted</w:t>
+        <w:t xml:space="preserve">Claude Code (Anthropic; model Claude Opus 5.5), a large language model tool, was used from October 2026. It proposed the topic and drafted</w:t>
       </w:r>
       <w:r>
         <w:t xml:space="preserve"> </w:t>
@@ -5331,7 +5331,7 @@
           <wp:inline>
             <wp:extent cx="5943600" cy="4651513"/>
             <wp:effectExtent b="0" l="0" r="0" t="0"/>
-            <wp:docPr descr="Figure 1. Flow of ACOs into each analysis. Counts are early renewers vs stayers. The reason for the expected-gain exclusions comes from a diagnostic query run after the results, outside the registered pipeline. ACO, accountable care organization; ESRD, end-stage renal disease; PY, performance year." title="" id="34" name="Picture"/>
+            <wp:docPr descr="Figure 1. Flow of ACOs into each analysis. Counts are early renewers vs stayers. The reason for the expected-gain exclusions comes from a diagnostic query run after the results, outside the registered pipeline. ACO, accountable care organization; ESRD, end-stage renal disease; PY, performance year. Drawn from the results files by code drafted with Claude Code (see Use of Large Language Models)." title="" id="34" name="Picture"/>
             <a:graphic>
               <a:graphicData uri="http://schemas.openxmlformats.org/drawingml/2006/picture">
                 <pic:pic>
@@ -5374,7 +5374,7 @@
         <w:pStyle w:val="ImageCaption"/>
       </w:pPr>
       <w:r>
-        <w:t xml:space="preserve">Figure 1. Flow of ACOs into each analysis. Counts are early renewers vs stayers. The reason for the expected-gain exclusions comes from a diagnostic query run after the results, outside the registered pipeline. ACO, accountable care organization; ESRD, end-stage renal disease; PY, performance year.</w:t>
+        <w:t xml:space="preserve">Figure 1. Flow of ACOs into each analysis. Counts are early renewers vs stayers. The reason for the expected-gain exclusions comes from a diagnostic query run after the results, outside the registered pipeline. ACO, accountable care organization; ESRD, end-stage renal disease; PY, performance year. Drawn from the results files by code drafted with Claude Code (see Use of Large Language Models).</w:t>
       </w:r>
     </w:p>
     <w:bookmarkEnd w:id="36"/>
@@ -6224,7 +6224,7 @@
         <w:pStyle w:val="BodyText"/>
       </w:pPr>
       <w:r>
-        <w:t xml:space="preserve">Abbreviations: CrI, credible interval; MDE, minimum detectable effect at 80% power, two-sided α = .05, computed before the tests for 29 vs 277 ACOs (for the 26 vs 241 compared on the expected-gain variables it is 2.6 for H2b and 1.9 for H2a); Pr(&gt;0), posterior probability that the difference is positive; pp, percentage points; PY, performance year. Differences are early renewers minus stayers within agreement cohort, averaged with weights proportional to early renewers per cohort. Posterior means and 95% equal-tailed CrIs are from a Bayesian bootstrap (10,000 draws); P values are from stratified permutation (10,000 shuffles within cohort). Expected-gain variables are in percentage points of the current benchmark; savings rates in percentage points. Verdicts follow the registered decision rules; H1 and the two descriptive rows carry none. Bold: the primary hypothesis.</w:t>
+        <w:t xml:space="preserve">Abbreviations: CrI, credible interval; MDE, minimum detectable effect at 80% power, two-sided α = .05, computed before the tests for 29 vs 277 ACOs (for the 26 vs 241 compared on the expected-gain variables it is 2.6 for H2b and 1.9 for H2a); Pr(&gt;0), posterior probability that the difference is positive; pp, percentage points; PY, performance year. Differences are early renewers minus stayers within agreement cohort, averaged with weights proportional to early renewers per cohort. Posterior means and 95% equal-tailed CrIs are from a Bayesian bootstrap (10000 draws); P values are from stratified permutation (10000 shuffles within cohort). Expected-gain variables are in percentage points of the current benchmark; savings rates in percentage points. Verdicts follow the registered decision rules; H1 and the two descriptive rows carry none. Bold: the primary hypothesis.</w:t>
       </w:r>
     </w:p>
     <w:p>
@@ -6236,7 +6236,7 @@
           <wp:inline>
             <wp:extent cx="5943600" cy="2468914"/>
             <wp:effectExtent b="0" l="0" r="0" t="0"/>
-            <wp:docPr descr="Figure 2. Early renewers minus stayers. A, Expected-gain variables, in percentage points of the current benchmark. B, Savings rates, in percentage points. Points are posterior means and lines 95% credible intervals from the Bayesian bootstrap." title="" id="38" name="Picture"/>
+            <wp:docPr descr="Figure 2. Early renewers minus stayers. A, Expected-gain variables, in percentage points of the current benchmark. B, Savings rates, in percentage points. Points are posterior means and lines 95% credible intervals from the Bayesian bootstrap. Drawn from the results files by code drafted with Claude Code (see Use of Large Language Models)." title="" id="38" name="Picture"/>
             <a:graphic>
               <a:graphicData uri="http://schemas.openxmlformats.org/drawingml/2006/picture">
                 <pic:pic>
@@ -6279,7 +6279,7 @@
         <w:pStyle w:val="ImageCaption"/>
       </w:pPr>
       <w:r>
-        <w:t xml:space="preserve">Figure 2. Early renewers minus stayers. A, Expected-gain variables, in percentage points of the current benchmark. B, Savings rates, in percentage points. Points are posterior means and lines 95% credible intervals from the Bayesian bootstrap.</w:t>
+        <w:t xml:space="preserve">Figure 2. Early renewers minus stayers. A, Expected-gain variables, in percentage points of the current benchmark. B, Savings rates, in percentage points. Points are posterior means and lines 95% credible intervals from the Bayesian bootstrap. Drawn from the results files by code drafted with Claude Code (see Use of Large Language Models).</w:t>
       </w:r>
     </w:p>
     <w:bookmarkEnd w:id="40"/>
@@ -7250,7 +7250,7 @@
         <w:pStyle w:val="BodyText"/>
       </w:pPr>
       <w:r>
-        <w:t xml:space="preserve">Abbreviations: CrI, credible interval; OR, odds ratio; Pr(&gt;0), posterior probability that the coefficient is positive. Bayesian logistic regression of early renewal among 206 BASIC-track ACOs (24 early renewers; 3 early renewers and 27 stayers excluded for a missing predictor). Continuous predictors are centered and divided by 2 SD, so their coefficients are log-odds differences per 2 SD; binary predictors are centered, so theirs are per category (the BASIC level compares levels C-E with A-B). Core predictors (bold) are tested by direct simulation under the reduced model (10,000 simulated datasets); adjustment factors are estimates only. The own-spending component enters with a measurement-error model (</w:t>
+        <w:t xml:space="preserve">Abbreviations: CrI, credible interval; OR, odds ratio; Pr(&gt;0), posterior probability that the coefficient is positive. Bayesian logistic regression of early renewal among 206 BASIC-track ACOs (24 early renewers; 3 early renewers and 27 stayers excluded for a missing predictor). Continuous predictors are centered and divided by 2 SD, so their coefficients are log-odds differences per 2 SD; binary predictors are centered, so theirs are per category (the BASIC level compares levels C-E with A-B). Core predictors (bold) are tested by direct simulation under the reduced model (10000 simulated datasets); adjustment factors are estimates only. The own-spending component enters with a measurement-error model (</w:t>
       </w:r>
       <m:oMath>
         <m:sSub>
@@ -7282,7 +7282,7 @@
           <wp:inline>
             <wp:extent cx="5943600" cy="2164342"/>
             <wp:effectExtent b="0" l="0" r="0" t="0"/>
-            <wp:docPr descr="Figure 3. Decision model of early renewal among BASIC-track ACOs (H3). Points are posterior means and lines 95% credible intervals; the shaded band is the Normal(0, 1) prior’s central 95%. Bold labels mark the core predictors." title="" id="42" name="Picture"/>
+            <wp:docPr descr="Figure 3. Decision model of early renewal among BASIC-track ACOs (H3). Points are posterior means and lines 95% credible intervals; the shaded band is the Normal(0, 1) prior’s central 95%. Bold labels mark the core predictors. Drawn from the results files by code drafted with Claude Code (see Use of Large Language Models)." title="" id="42" name="Picture"/>
             <a:graphic>
               <a:graphicData uri="http://schemas.openxmlformats.org/drawingml/2006/picture">
                 <pic:pic>
@@ -7325,7 +7325,7 @@
         <w:pStyle w:val="ImageCaption"/>
       </w:pPr>
       <w:r>
-        <w:t xml:space="preserve">Figure 3. Decision model of early renewal among BASIC-track ACOs (H3). Points are posterior means and lines 95% credible intervals; the shaded band is the Normal(0, 1) prior’s central 95%. Bold labels mark the core predictors.</w:t>
+        <w:t xml:space="preserve">Figure 3. Decision model of early renewal among BASIC-track ACOs (H3). Points are posterior means and lines 95% credible intervals; the shaded band is the Normal(0, 1) prior’s central 95%. Bold labels mark the core predictors. Drawn from the results files by code drafted with Claude Code (see Use of Large Language Models).</w:t>
       </w:r>
     </w:p>
     <w:bookmarkEnd w:id="44"/>
@@ -7468,7 +7468,7 @@
           <wp:inline>
             <wp:extent cx="5943600" cy="2344288"/>
             <wp:effectExtent b="0" l="0" r="0" t="0"/>
-            <wp:docPr descr="Figure 4. Spending after early renewal. A, Event study from the conventional 2-way fixed-effects model, in log points relative to PY2021, with 95% CIs clustered by ACO. B, The registered H4 estimate and the robustness and conventional estimates, as the percent difference in spending growth with 95% intervals (the propensity-weighted estimate has no interval); sample sizes are in eTable 8 in Additional file 2. TWFE, 2-way fixed effects." title="" id="46" name="Picture"/>
+            <wp:docPr descr="Figure 4. Spending after early renewal. A, Event study from the conventional 2-way fixed-effects model, in log points relative to PY2021, with 95% CIs clustered by ACO. B, The registered H4 estimate and the robustness and conventional estimates, as the percent difference in spending growth with 95% intervals (the propensity-weighted estimate has no interval); sample sizes are in eTable 8 in Additional file 2. TWFE, 2-way fixed effects. Drawn from the results files by code drafted with Claude Code (see Use of Large Language Models)." title="" id="46" name="Picture"/>
             <a:graphic>
               <a:graphicData uri="http://schemas.openxmlformats.org/drawingml/2006/picture">
                 <pic:pic>
@@ -7511,7 +7511,7 @@
         <w:pStyle w:val="ImageCaption"/>
       </w:pPr>
       <w:r>
-        <w:t xml:space="preserve">Figure 4. Spending after early renewal. A, Event study from the conventional 2-way fixed-effects model, in log points relative to PY2021, with 95% CIs clustered by ACO. B, The registered H4 estimate and the robustness and conventional estimates, as the percent difference in spending growth with 95% intervals (the propensity-weighted estimate has no interval); sample sizes are in eTable 8 in Additional file 2. TWFE, 2-way fixed effects.</w:t>
+        <w:t xml:space="preserve">Figure 4. Spending after early renewal. A, Event study from the conventional 2-way fixed-effects model, in log points relative to PY2021, with 95% CIs clustered by ACO. B, The registered H4 estimate and the robustness and conventional estimates, as the percent difference in spending growth with 95% intervals (the propensity-weighted estimate has no interval); sample sizes are in eTable 8 in Additional file 2. TWFE, 2-way fixed effects. Drawn from the results files by code drafted with Claude Code (see Use of Large Language Models).</w:t>
       </w:r>
     </w:p>
     <w:bookmarkEnd w:id="48"/>

</xml_diff>

<commit_message>
BMC package: keep thousands separators; check tables for decimal commas only
BMC's rule on commas in numbers does not say which commas it means, and the text and the
additional files use thousands separators, so the table legends match them again.

Co-Authored-By: Claude Opus 5.5 <noreply@anthropic.com>
</commit_message>
<xml_diff>
--- a/paper.docx
+++ b/paper.docx
@@ -6224,7 +6224,7 @@
         <w:pStyle w:val="BodyText"/>
       </w:pPr>
       <w:r>
-        <w:t xml:space="preserve">Abbreviations: CrI, credible interval; MDE, minimum detectable effect at 80% power, two-sided α = .05, computed before the tests for 29 vs 277 ACOs (for the 26 vs 241 compared on the expected-gain variables it is 2.6 for H2b and 1.9 for H2a); Pr(&gt;0), posterior probability that the difference is positive; pp, percentage points; PY, performance year. Differences are early renewers minus stayers within agreement cohort, averaged with weights proportional to early renewers per cohort. Posterior means and 95% equal-tailed CrIs are from a Bayesian bootstrap (10000 draws); P values are from stratified permutation (10000 shuffles within cohort). Expected-gain variables are in percentage points of the current benchmark; savings rates in percentage points. Verdicts follow the registered decision rules; H1 and the two descriptive rows carry none. Bold: the primary hypothesis.</w:t>
+        <w:t xml:space="preserve">Abbreviations: CrI, credible interval; MDE, minimum detectable effect at 80% power, two-sided α = .05, computed before the tests for 29 vs 277 ACOs (for the 26 vs 241 compared on the expected-gain variables it is 2.6 for H2b and 1.9 for H2a); Pr(&gt;0), posterior probability that the difference is positive; pp, percentage points; PY, performance year. Differences are early renewers minus stayers within agreement cohort, averaged with weights proportional to early renewers per cohort. Posterior means and 95% equal-tailed CrIs are from a Bayesian bootstrap (10,000 draws); P values are from stratified permutation (10,000 shuffles within cohort). Expected-gain variables are in percentage points of the current benchmark; savings rates in percentage points. Verdicts follow the registered decision rules; H1 and the two descriptive rows carry none. Bold: the primary hypothesis.</w:t>
       </w:r>
     </w:p>
     <w:p>
@@ -7250,7 +7250,7 @@
         <w:pStyle w:val="BodyText"/>
       </w:pPr>
       <w:r>
-        <w:t xml:space="preserve">Abbreviations: CrI, credible interval; OR, odds ratio; Pr(&gt;0), posterior probability that the coefficient is positive. Bayesian logistic regression of early renewal among 206 BASIC-track ACOs (24 early renewers; 3 early renewers and 27 stayers excluded for a missing predictor). Continuous predictors are centered and divided by 2 SD, so their coefficients are log-odds differences per 2 SD; binary predictors are centered, so theirs are per category (the BASIC level compares levels C-E with A-B). Core predictors (bold) are tested by direct simulation under the reduced model (10000 simulated datasets); adjustment factors are estimates only. The own-spending component enters with a measurement-error model (</w:t>
+        <w:t xml:space="preserve">Abbreviations: CrI, credible interval; OR, odds ratio; Pr(&gt;0), posterior probability that the coefficient is positive. Bayesian logistic regression of early renewal among 206 BASIC-track ACOs (24 early renewers; 3 early renewers and 27 stayers excluded for a missing predictor). Continuous predictors are centered and divided by 2 SD, so their coefficients are log-odds differences per 2 SD; binary predictors are centered, so theirs are per category (the BASIC level compares levels C-E with A-B). Core predictors (bold) are tested by direct simulation under the reduced model (10,000 simulated datasets); adjustment factors are estimates only. The own-spending component enters with a measurement-error model (</w:t>
       </w:r>
       <m:oMath>
         <m:sSub>

</xml_diff>